<commit_message>
docs: atualizar a documentação do banco para a migração de 08/10
Regenera o script SQL e o diagrama a partir da migração
20261008T1833_init, descreve no README o banco da equipe, os comandos do
Prisma e as regras garantidas pelo banco, e registra no AI_CONTEXT a
regra de finalização, troca de operação e baixa, que constava como
pendência.

Atualiza no TCC o capítulo 5, a Figura 9 e o requisito de finalização da
execução.

Co-Authored-By: Claude Opus 5.5 <noreply@anthropic.com>
</commit_message>
<xml_diff>
--- a/docs/tcc/TCC_Nivelamento_de_Processos.docx
+++ b/docs/tcc/TCC_Nivelamento_de_Processos.docx
@@ -1706,7 +1706,7 @@
       <w:r>
         <w:fldChar w:fldCharType="separate"/>
       </w:r>
-      <w:hyperlink w:anchor="_Toc242193213" w:history="1">
+      <w:hyperlink w:anchor="_Toc242389643" w:history="1">
         <w:r>
           <w:rPr>
             <w:rStyle w:val="Hyperlink"/>
@@ -1733,7 +1733,7 @@
             <w:noProof/>
             <w:webHidden/>
           </w:rPr>
-          <w:instrText xml:space="preserve"> PAGEREF _Toc242193213 \h </w:instrText>
+          <w:instrText xml:space="preserve"> PAGEREF _Toc242389643 \h </w:instrText>
         </w:r>
         <w:r>
           <w:rPr>
@@ -1778,7 +1778,7 @@
           <w14:ligatures w14:val="standardContextual"/>
         </w:rPr>
       </w:pPr>
-      <w:hyperlink w:anchor="_Toc242193214" w:history="1">
+      <w:hyperlink w:anchor="_Toc242389644" w:history="1">
         <w:r>
           <w:rPr>
             <w:rStyle w:val="Hyperlink"/>
@@ -1805,7 +1805,7 @@
             <w:noProof/>
             <w:webHidden/>
           </w:rPr>
-          <w:instrText xml:space="preserve"> PAGEREF _Toc242193214 \h </w:instrText>
+          <w:instrText xml:space="preserve"> PAGEREF _Toc242389644 \h </w:instrText>
         </w:r>
         <w:r>
           <w:rPr>
@@ -1850,7 +1850,7 @@
           <w14:ligatures w14:val="standardContextual"/>
         </w:rPr>
       </w:pPr>
-      <w:hyperlink w:anchor="_Toc242193215" w:history="1">
+      <w:hyperlink w:anchor="_Toc242389645" w:history="1">
         <w:r>
           <w:rPr>
             <w:rStyle w:val="Hyperlink"/>
@@ -1877,7 +1877,7 @@
             <w:noProof/>
             <w:webHidden/>
           </w:rPr>
-          <w:instrText xml:space="preserve"> PAGEREF _Toc242193215 \h </w:instrText>
+          <w:instrText xml:space="preserve"> PAGEREF _Toc242389645 \h </w:instrText>
         </w:r>
         <w:r>
           <w:rPr>
@@ -1922,7 +1922,7 @@
           <w14:ligatures w14:val="standardContextual"/>
         </w:rPr>
       </w:pPr>
-      <w:hyperlink w:anchor="_Toc242193216" w:history="1">
+      <w:hyperlink w:anchor="_Toc242389646" w:history="1">
         <w:r>
           <w:rPr>
             <w:rStyle w:val="Hyperlink"/>
@@ -1949,7 +1949,7 @@
             <w:noProof/>
             <w:webHidden/>
           </w:rPr>
-          <w:instrText xml:space="preserve"> PAGEREF _Toc242193216 \h </w:instrText>
+          <w:instrText xml:space="preserve"> PAGEREF _Toc242389646 \h </w:instrText>
         </w:r>
         <w:r>
           <w:rPr>
@@ -1994,7 +1994,7 @@
           <w14:ligatures w14:val="standardContextual"/>
         </w:rPr>
       </w:pPr>
-      <w:hyperlink w:anchor="_Toc242193217" w:history="1">
+      <w:hyperlink w:anchor="_Toc242389647" w:history="1">
         <w:r>
           <w:rPr>
             <w:rStyle w:val="Hyperlink"/>
@@ -2021,7 +2021,7 @@
             <w:noProof/>
             <w:webHidden/>
           </w:rPr>
-          <w:instrText xml:space="preserve"> PAGEREF _Toc242193217 \h </w:instrText>
+          <w:instrText xml:space="preserve"> PAGEREF _Toc242389647 \h </w:instrText>
         </w:r>
         <w:r>
           <w:rPr>
@@ -2066,7 +2066,7 @@
           <w14:ligatures w14:val="standardContextual"/>
         </w:rPr>
       </w:pPr>
-      <w:hyperlink w:anchor="_Toc242193218" w:history="1">
+      <w:hyperlink w:anchor="_Toc242389648" w:history="1">
         <w:r>
           <w:rPr>
             <w:rStyle w:val="Hyperlink"/>
@@ -2093,7 +2093,7 @@
             <w:noProof/>
             <w:webHidden/>
           </w:rPr>
-          <w:instrText xml:space="preserve"> PAGEREF _Toc242193218 \h </w:instrText>
+          <w:instrText xml:space="preserve"> PAGEREF _Toc242389648 \h </w:instrText>
         </w:r>
         <w:r>
           <w:rPr>
@@ -2138,7 +2138,7 @@
           <w14:ligatures w14:val="standardContextual"/>
         </w:rPr>
       </w:pPr>
-      <w:hyperlink w:anchor="_Toc242193219" w:history="1">
+      <w:hyperlink w:anchor="_Toc242389649" w:history="1">
         <w:r>
           <w:rPr>
             <w:rStyle w:val="Hyperlink"/>
@@ -2165,7 +2165,7 @@
             <w:noProof/>
             <w:webHidden/>
           </w:rPr>
-          <w:instrText xml:space="preserve"> PAGEREF _Toc242193219 \h </w:instrText>
+          <w:instrText xml:space="preserve"> PAGEREF _Toc242389649 \h </w:instrText>
         </w:r>
         <w:r>
           <w:rPr>
@@ -2210,7 +2210,7 @@
           <w14:ligatures w14:val="standardContextual"/>
         </w:rPr>
       </w:pPr>
-      <w:hyperlink w:anchor="_Toc242193220" w:history="1">
+      <w:hyperlink w:anchor="_Toc242389650" w:history="1">
         <w:r>
           <w:rPr>
             <w:rStyle w:val="Hyperlink"/>
@@ -2237,7 +2237,7 @@
             <w:noProof/>
             <w:webHidden/>
           </w:rPr>
-          <w:instrText xml:space="preserve"> PAGEREF _Toc242193220 \h </w:instrText>
+          <w:instrText xml:space="preserve"> PAGEREF _Toc242389650 \h </w:instrText>
         </w:r>
         <w:r>
           <w:rPr>
@@ -2282,7 +2282,7 @@
           <w14:ligatures w14:val="standardContextual"/>
         </w:rPr>
       </w:pPr>
-      <w:hyperlink w:anchor="_Toc242193221" w:history="1">
+      <w:hyperlink w:anchor="_Toc242389651" w:history="1">
         <w:r>
           <w:rPr>
             <w:rStyle w:val="Hyperlink"/>
@@ -2309,7 +2309,7 @@
             <w:noProof/>
             <w:webHidden/>
           </w:rPr>
-          <w:instrText xml:space="preserve"> PAGEREF _Toc242193221 \h </w:instrText>
+          <w:instrText xml:space="preserve"> PAGEREF _Toc242389651 \h </w:instrText>
         </w:r>
         <w:r>
           <w:rPr>
@@ -2397,7 +2397,7 @@
       <w:r>
         <w:fldChar w:fldCharType="separate"/>
       </w:r>
-      <w:hyperlink w:anchor="_Toc242193222" w:history="1">
+      <w:hyperlink w:anchor="_Toc242389652" w:history="1">
         <w:r>
           <w:rPr>
             <w:rStyle w:val="Hyperlink"/>
@@ -2424,7 +2424,7 @@
             <w:noProof/>
             <w:webHidden/>
           </w:rPr>
-          <w:instrText xml:space="preserve"> PAGEREF _Toc242193222 \h </w:instrText>
+          <w:instrText xml:space="preserve"> PAGEREF _Toc242389652 \h </w:instrText>
         </w:r>
         <w:r>
           <w:rPr>
@@ -2469,7 +2469,7 @@
           <w14:ligatures w14:val="standardContextual"/>
         </w:rPr>
       </w:pPr>
-      <w:hyperlink w:anchor="_Toc242193223" w:history="1">
+      <w:hyperlink w:anchor="_Toc242389653" w:history="1">
         <w:r>
           <w:rPr>
             <w:rStyle w:val="Hyperlink"/>
@@ -2496,7 +2496,7 @@
             <w:noProof/>
             <w:webHidden/>
           </w:rPr>
-          <w:instrText xml:space="preserve"> PAGEREF _Toc242193223 \h </w:instrText>
+          <w:instrText xml:space="preserve"> PAGEREF _Toc242389653 \h </w:instrText>
         </w:r>
         <w:r>
           <w:rPr>
@@ -2541,7 +2541,7 @@
           <w14:ligatures w14:val="standardContextual"/>
         </w:rPr>
       </w:pPr>
-      <w:hyperlink w:anchor="_Toc242193224" w:history="1">
+      <w:hyperlink w:anchor="_Toc242389654" w:history="1">
         <w:r>
           <w:rPr>
             <w:rStyle w:val="Hyperlink"/>
@@ -2568,7 +2568,7 @@
             <w:noProof/>
             <w:webHidden/>
           </w:rPr>
-          <w:instrText xml:space="preserve"> PAGEREF _Toc242193224 \h </w:instrText>
+          <w:instrText xml:space="preserve"> PAGEREF _Toc242389654 \h </w:instrText>
         </w:r>
         <w:r>
           <w:rPr>
@@ -2613,7 +2613,7 @@
           <w14:ligatures w14:val="standardContextual"/>
         </w:rPr>
       </w:pPr>
-      <w:hyperlink w:anchor="_Toc242193225" w:history="1">
+      <w:hyperlink w:anchor="_Toc242389655" w:history="1">
         <w:r>
           <w:rPr>
             <w:rStyle w:val="Hyperlink"/>
@@ -2640,7 +2640,7 @@
             <w:noProof/>
             <w:webHidden/>
           </w:rPr>
-          <w:instrText xml:space="preserve"> PAGEREF _Toc242193225 \h </w:instrText>
+          <w:instrText xml:space="preserve"> PAGEREF _Toc242389655 \h </w:instrText>
         </w:r>
         <w:r>
           <w:rPr>
@@ -2685,7 +2685,7 @@
           <w14:ligatures w14:val="standardContextual"/>
         </w:rPr>
       </w:pPr>
-      <w:hyperlink w:anchor="_Toc242193226" w:history="1">
+      <w:hyperlink w:anchor="_Toc242389656" w:history="1">
         <w:r>
           <w:rPr>
             <w:rStyle w:val="Hyperlink"/>
@@ -2712,7 +2712,7 @@
             <w:noProof/>
             <w:webHidden/>
           </w:rPr>
-          <w:instrText xml:space="preserve"> PAGEREF _Toc242193226 \h </w:instrText>
+          <w:instrText xml:space="preserve"> PAGEREF _Toc242389656 \h </w:instrText>
         </w:r>
         <w:r>
           <w:rPr>
@@ -2757,7 +2757,7 @@
           <w14:ligatures w14:val="standardContextual"/>
         </w:rPr>
       </w:pPr>
-      <w:hyperlink w:anchor="_Toc242193227" w:history="1">
+      <w:hyperlink w:anchor="_Toc242389657" w:history="1">
         <w:r>
           <w:rPr>
             <w:rStyle w:val="Hyperlink"/>
@@ -2784,7 +2784,7 @@
             <w:noProof/>
             <w:webHidden/>
           </w:rPr>
-          <w:instrText xml:space="preserve"> PAGEREF _Toc242193227 \h </w:instrText>
+          <w:instrText xml:space="preserve"> PAGEREF _Toc242389657 \h </w:instrText>
         </w:r>
         <w:r>
           <w:rPr>
@@ -2829,7 +2829,7 @@
           <w14:ligatures w14:val="standardContextual"/>
         </w:rPr>
       </w:pPr>
-      <w:hyperlink w:anchor="_Toc242193228" w:history="1">
+      <w:hyperlink w:anchor="_Toc242389658" w:history="1">
         <w:r>
           <w:rPr>
             <w:rStyle w:val="Hyperlink"/>
@@ -2856,7 +2856,7 @@
             <w:noProof/>
             <w:webHidden/>
           </w:rPr>
-          <w:instrText xml:space="preserve"> PAGEREF _Toc242193228 \h </w:instrText>
+          <w:instrText xml:space="preserve"> PAGEREF _Toc242389658 \h </w:instrText>
         </w:r>
         <w:r>
           <w:rPr>
@@ -2901,7 +2901,7 @@
           <w14:ligatures w14:val="standardContextual"/>
         </w:rPr>
       </w:pPr>
-      <w:hyperlink w:anchor="_Toc242193229" w:history="1">
+      <w:hyperlink w:anchor="_Toc242389659" w:history="1">
         <w:r>
           <w:rPr>
             <w:rStyle w:val="Hyperlink"/>
@@ -2928,7 +2928,7 @@
             <w:noProof/>
             <w:webHidden/>
           </w:rPr>
-          <w:instrText xml:space="preserve"> PAGEREF _Toc242193229 \h </w:instrText>
+          <w:instrText xml:space="preserve"> PAGEREF _Toc242389659 \h </w:instrText>
         </w:r>
         <w:r>
           <w:rPr>
@@ -3484,7 +3484,7 @@
             </w:rPr>
             <w:fldChar w:fldCharType="separate"/>
           </w:r>
-          <w:hyperlink w:anchor="_Toc242193230" w:history="1">
+          <w:hyperlink w:anchor="_Toc242389660" w:history="1">
             <w:r>
               <w:rPr>
                 <w:rStyle w:val="Hyperlink"/>
@@ -3507,7 +3507,7 @@
               <w:rPr>
                 <w:webHidden/>
               </w:rPr>
-              <w:instrText xml:space="preserve"> PAGEREF _Toc242193230 \h </w:instrText>
+              <w:instrText xml:space="preserve"> PAGEREF _Toc242389660 \h </w:instrText>
             </w:r>
             <w:r>
               <w:rPr>
@@ -3550,7 +3550,7 @@
               <w14:ligatures w14:val="standardContextual"/>
             </w:rPr>
           </w:pPr>
-          <w:hyperlink w:anchor="_Toc242193231" w:history="1">
+          <w:hyperlink w:anchor="_Toc242389661" w:history="1">
             <w:r>
               <w:rPr>
                 <w:rStyle w:val="Hyperlink"/>
@@ -3578,7 +3578,7 @@
                 <w:noProof/>
                 <w:webHidden/>
               </w:rPr>
-              <w:instrText xml:space="preserve"> PAGEREF _Toc242193231 \h </w:instrText>
+              <w:instrText xml:space="preserve"> PAGEREF _Toc242389661 \h </w:instrText>
             </w:r>
             <w:r>
               <w:rPr>
@@ -3625,7 +3625,7 @@
               <w14:ligatures w14:val="standardContextual"/>
             </w:rPr>
           </w:pPr>
-          <w:hyperlink w:anchor="_Toc242193232" w:history="1">
+          <w:hyperlink w:anchor="_Toc242389662" w:history="1">
             <w:r>
               <w:rPr>
                 <w:rStyle w:val="Hyperlink"/>
@@ -3653,7 +3653,7 @@
                 <w:noProof/>
                 <w:webHidden/>
               </w:rPr>
-              <w:instrText xml:space="preserve"> PAGEREF _Toc242193232 \h </w:instrText>
+              <w:instrText xml:space="preserve"> PAGEREF _Toc242389662 \h </w:instrText>
             </w:r>
             <w:r>
               <w:rPr>
@@ -3700,7 +3700,7 @@
               <w14:ligatures w14:val="standardContextual"/>
             </w:rPr>
           </w:pPr>
-          <w:hyperlink w:anchor="_Toc242193233" w:history="1">
+          <w:hyperlink w:anchor="_Toc242389663" w:history="1">
             <w:r>
               <w:rPr>
                 <w:rStyle w:val="Hyperlink"/>
@@ -3728,7 +3728,7 @@
                 <w:noProof/>
                 <w:webHidden/>
               </w:rPr>
-              <w:instrText xml:space="preserve"> PAGEREF _Toc242193233 \h </w:instrText>
+              <w:instrText xml:space="preserve"> PAGEREF _Toc242389663 \h </w:instrText>
             </w:r>
             <w:r>
               <w:rPr>
@@ -3775,7 +3775,7 @@
               <w14:ligatures w14:val="standardContextual"/>
             </w:rPr>
           </w:pPr>
-          <w:hyperlink w:anchor="_Toc242193234" w:history="1">
+          <w:hyperlink w:anchor="_Toc242389664" w:history="1">
             <w:r>
               <w:rPr>
                 <w:rStyle w:val="Hyperlink"/>
@@ -3802,7 +3802,7 @@
                 <w:noProof/>
                 <w:webHidden/>
               </w:rPr>
-              <w:instrText xml:space="preserve"> PAGEREF _Toc242193234 \h </w:instrText>
+              <w:instrText xml:space="preserve"> PAGEREF _Toc242389664 \h </w:instrText>
             </w:r>
             <w:r>
               <w:rPr>
@@ -3849,7 +3849,7 @@
               <w14:ligatures w14:val="standardContextual"/>
             </w:rPr>
           </w:pPr>
-          <w:hyperlink w:anchor="_Toc242193235" w:history="1">
+          <w:hyperlink w:anchor="_Toc242389665" w:history="1">
             <w:r>
               <w:rPr>
                 <w:rStyle w:val="Hyperlink"/>
@@ -3876,7 +3876,7 @@
                 <w:noProof/>
                 <w:webHidden/>
               </w:rPr>
-              <w:instrText xml:space="preserve"> PAGEREF _Toc242193235 \h </w:instrText>
+              <w:instrText xml:space="preserve"> PAGEREF _Toc242389665 \h </w:instrText>
             </w:r>
             <w:r>
               <w:rPr>
@@ -3923,7 +3923,7 @@
               <w14:ligatures w14:val="standardContextual"/>
             </w:rPr>
           </w:pPr>
-          <w:hyperlink w:anchor="_Toc242193236" w:history="1">
+          <w:hyperlink w:anchor="_Toc242389666" w:history="1">
             <w:r>
               <w:rPr>
                 <w:rStyle w:val="Hyperlink"/>
@@ -3951,7 +3951,7 @@
                 <w:noProof/>
                 <w:webHidden/>
               </w:rPr>
-              <w:instrText xml:space="preserve"> PAGEREF _Toc242193236 \h </w:instrText>
+              <w:instrText xml:space="preserve"> PAGEREF _Toc242389666 \h </w:instrText>
             </w:r>
             <w:r>
               <w:rPr>
@@ -3998,7 +3998,7 @@
               <w14:ligatures w14:val="standardContextual"/>
             </w:rPr>
           </w:pPr>
-          <w:hyperlink w:anchor="_Toc242193237" w:history="1">
+          <w:hyperlink w:anchor="_Toc242389667" w:history="1">
             <w:r>
               <w:rPr>
                 <w:rStyle w:val="Hyperlink"/>
@@ -4026,7 +4026,7 @@
                 <w:noProof/>
                 <w:webHidden/>
               </w:rPr>
-              <w:instrText xml:space="preserve"> PAGEREF _Toc242193237 \h </w:instrText>
+              <w:instrText xml:space="preserve"> PAGEREF _Toc242389667 \h </w:instrText>
             </w:r>
             <w:r>
               <w:rPr>
@@ -4070,7 +4070,7 @@
               <w14:ligatures w14:val="standardContextual"/>
             </w:rPr>
           </w:pPr>
-          <w:hyperlink w:anchor="_Toc242193238" w:history="1">
+          <w:hyperlink w:anchor="_Toc242389668" w:history="1">
             <w:r>
               <w:rPr>
                 <w:rStyle w:val="Hyperlink"/>
@@ -4093,7 +4093,7 @@
               <w:rPr>
                 <w:webHidden/>
               </w:rPr>
-              <w:instrText xml:space="preserve"> PAGEREF _Toc242193238 \h </w:instrText>
+              <w:instrText xml:space="preserve"> PAGEREF _Toc242389668 \h </w:instrText>
             </w:r>
             <w:r>
               <w:rPr>
@@ -4136,7 +4136,7 @@
               <w14:ligatures w14:val="standardContextual"/>
             </w:rPr>
           </w:pPr>
-          <w:hyperlink w:anchor="_Toc242193239" w:history="1">
+          <w:hyperlink w:anchor="_Toc242389669" w:history="1">
             <w:r>
               <w:rPr>
                 <w:rStyle w:val="Hyperlink"/>
@@ -4164,7 +4164,7 @@
                 <w:noProof/>
                 <w:webHidden/>
               </w:rPr>
-              <w:instrText xml:space="preserve"> PAGEREF _Toc242193239 \h </w:instrText>
+              <w:instrText xml:space="preserve"> PAGEREF _Toc242389669 \h </w:instrText>
             </w:r>
             <w:r>
               <w:rPr>
@@ -4211,7 +4211,7 @@
               <w14:ligatures w14:val="standardContextual"/>
             </w:rPr>
           </w:pPr>
-          <w:hyperlink w:anchor="_Toc242193240" w:history="1">
+          <w:hyperlink w:anchor="_Toc242389670" w:history="1">
             <w:r>
               <w:rPr>
                 <w:rStyle w:val="Hyperlink"/>
@@ -4239,7 +4239,7 @@
                 <w:noProof/>
                 <w:webHidden/>
               </w:rPr>
-              <w:instrText xml:space="preserve"> PAGEREF _Toc242193240 \h </w:instrText>
+              <w:instrText xml:space="preserve"> PAGEREF _Toc242389670 \h </w:instrText>
             </w:r>
             <w:r>
               <w:rPr>
@@ -4286,7 +4286,7 @@
               <w14:ligatures w14:val="standardContextual"/>
             </w:rPr>
           </w:pPr>
-          <w:hyperlink w:anchor="_Toc242193241" w:history="1">
+          <w:hyperlink w:anchor="_Toc242389671" w:history="1">
             <w:r>
               <w:rPr>
                 <w:rStyle w:val="Hyperlink"/>
@@ -4314,7 +4314,7 @@
                 <w:noProof/>
                 <w:webHidden/>
               </w:rPr>
-              <w:instrText xml:space="preserve"> PAGEREF _Toc242193241 \h </w:instrText>
+              <w:instrText xml:space="preserve"> PAGEREF _Toc242389671 \h </w:instrText>
             </w:r>
             <w:r>
               <w:rPr>
@@ -4361,7 +4361,7 @@
               <w14:ligatures w14:val="standardContextual"/>
             </w:rPr>
           </w:pPr>
-          <w:hyperlink w:anchor="_Toc242193242" w:history="1">
+          <w:hyperlink w:anchor="_Toc242389672" w:history="1">
             <w:r>
               <w:rPr>
                 <w:rStyle w:val="Hyperlink"/>
@@ -4389,7 +4389,7 @@
                 <w:noProof/>
                 <w:webHidden/>
               </w:rPr>
-              <w:instrText xml:space="preserve"> PAGEREF _Toc242193242 \h </w:instrText>
+              <w:instrText xml:space="preserve"> PAGEREF _Toc242389672 \h </w:instrText>
             </w:r>
             <w:r>
               <w:rPr>
@@ -4436,7 +4436,7 @@
               <w14:ligatures w14:val="standardContextual"/>
             </w:rPr>
           </w:pPr>
-          <w:hyperlink w:anchor="_Toc242193243" w:history="1">
+          <w:hyperlink w:anchor="_Toc242389673" w:history="1">
             <w:r>
               <w:rPr>
                 <w:rStyle w:val="Hyperlink"/>
@@ -4465,7 +4465,7 @@
                 <w:noProof/>
                 <w:webHidden/>
               </w:rPr>
-              <w:instrText xml:space="preserve"> PAGEREF _Toc242193243 \h </w:instrText>
+              <w:instrText xml:space="preserve"> PAGEREF _Toc242389673 \h </w:instrText>
             </w:r>
             <w:r>
               <w:rPr>
@@ -4512,7 +4512,7 @@
               <w14:ligatures w14:val="standardContextual"/>
             </w:rPr>
           </w:pPr>
-          <w:hyperlink w:anchor="_Toc242193244" w:history="1">
+          <w:hyperlink w:anchor="_Toc242389674" w:history="1">
             <w:r>
               <w:rPr>
                 <w:rStyle w:val="Hyperlink"/>
@@ -4540,7 +4540,7 @@
                 <w:noProof/>
                 <w:webHidden/>
               </w:rPr>
-              <w:instrText xml:space="preserve"> PAGEREF _Toc242193244 \h </w:instrText>
+              <w:instrText xml:space="preserve"> PAGEREF _Toc242389674 \h </w:instrText>
             </w:r>
             <w:r>
               <w:rPr>
@@ -4587,7 +4587,7 @@
               <w14:ligatures w14:val="standardContextual"/>
             </w:rPr>
           </w:pPr>
-          <w:hyperlink w:anchor="_Toc242193245" w:history="1">
+          <w:hyperlink w:anchor="_Toc242389675" w:history="1">
             <w:r>
               <w:rPr>
                 <w:rStyle w:val="Hyperlink"/>
@@ -4615,7 +4615,7 @@
                 <w:noProof/>
                 <w:webHidden/>
               </w:rPr>
-              <w:instrText xml:space="preserve"> PAGEREF _Toc242193245 \h </w:instrText>
+              <w:instrText xml:space="preserve"> PAGEREF _Toc242389675 \h </w:instrText>
             </w:r>
             <w:r>
               <w:rPr>
@@ -4662,7 +4662,7 @@
               <w14:ligatures w14:val="standardContextual"/>
             </w:rPr>
           </w:pPr>
-          <w:hyperlink w:anchor="_Toc242193246" w:history="1">
+          <w:hyperlink w:anchor="_Toc242389676" w:history="1">
             <w:r>
               <w:rPr>
                 <w:rStyle w:val="Hyperlink"/>
@@ -4690,7 +4690,7 @@
                 <w:noProof/>
                 <w:webHidden/>
               </w:rPr>
-              <w:instrText xml:space="preserve"> PAGEREF _Toc242193246 \h </w:instrText>
+              <w:instrText xml:space="preserve"> PAGEREF _Toc242389676 \h </w:instrText>
             </w:r>
             <w:r>
               <w:rPr>
@@ -4737,7 +4737,7 @@
               <w14:ligatures w14:val="standardContextual"/>
             </w:rPr>
           </w:pPr>
-          <w:hyperlink w:anchor="_Toc242193247" w:history="1">
+          <w:hyperlink w:anchor="_Toc242389677" w:history="1">
             <w:r>
               <w:rPr>
                 <w:rStyle w:val="Hyperlink"/>
@@ -4764,7 +4764,7 @@
                 <w:noProof/>
                 <w:webHidden/>
               </w:rPr>
-              <w:instrText xml:space="preserve"> PAGEREF _Toc242193247 \h </w:instrText>
+              <w:instrText xml:space="preserve"> PAGEREF _Toc242389677 \h </w:instrText>
             </w:r>
             <w:r>
               <w:rPr>
@@ -4808,7 +4808,7 @@
               <w14:ligatures w14:val="standardContextual"/>
             </w:rPr>
           </w:pPr>
-          <w:hyperlink w:anchor="_Toc242193248" w:history="1">
+          <w:hyperlink w:anchor="_Toc242389678" w:history="1">
             <w:r>
               <w:rPr>
                 <w:rStyle w:val="Hyperlink"/>
@@ -4831,7 +4831,7 @@
               <w:rPr>
                 <w:webHidden/>
               </w:rPr>
-              <w:instrText xml:space="preserve"> PAGEREF _Toc242193248 \h </w:instrText>
+              <w:instrText xml:space="preserve"> PAGEREF _Toc242389678 \h </w:instrText>
             </w:r>
             <w:r>
               <w:rPr>
@@ -4874,7 +4874,7 @@
               <w14:ligatures w14:val="standardContextual"/>
             </w:rPr>
           </w:pPr>
-          <w:hyperlink w:anchor="_Toc242193249" w:history="1">
+          <w:hyperlink w:anchor="_Toc242389679" w:history="1">
             <w:r>
               <w:rPr>
                 <w:rStyle w:val="Hyperlink"/>
@@ -4902,7 +4902,7 @@
                 <w:noProof/>
                 <w:webHidden/>
               </w:rPr>
-              <w:instrText xml:space="preserve"> PAGEREF _Toc242193249 \h </w:instrText>
+              <w:instrText xml:space="preserve"> PAGEREF _Toc242389679 \h </w:instrText>
             </w:r>
             <w:r>
               <w:rPr>
@@ -4949,7 +4949,7 @@
               <w14:ligatures w14:val="standardContextual"/>
             </w:rPr>
           </w:pPr>
-          <w:hyperlink w:anchor="_Toc242193250" w:history="1">
+          <w:hyperlink w:anchor="_Toc242389680" w:history="1">
             <w:r>
               <w:rPr>
                 <w:rStyle w:val="Hyperlink"/>
@@ -4976,7 +4976,7 @@
                 <w:noProof/>
                 <w:webHidden/>
               </w:rPr>
-              <w:instrText xml:space="preserve"> PAGEREF _Toc242193250 \h </w:instrText>
+              <w:instrText xml:space="preserve"> PAGEREF _Toc242389680 \h </w:instrText>
             </w:r>
             <w:r>
               <w:rPr>
@@ -5023,7 +5023,7 @@
               <w14:ligatures w14:val="standardContextual"/>
             </w:rPr>
           </w:pPr>
-          <w:hyperlink w:anchor="_Toc242193251" w:history="1">
+          <w:hyperlink w:anchor="_Toc242389681" w:history="1">
             <w:r>
               <w:rPr>
                 <w:rStyle w:val="Hyperlink"/>
@@ -5050,7 +5050,7 @@
                 <w:noProof/>
                 <w:webHidden/>
               </w:rPr>
-              <w:instrText xml:space="preserve"> PAGEREF _Toc242193251 \h </w:instrText>
+              <w:instrText xml:space="preserve"> PAGEREF _Toc242389681 \h </w:instrText>
             </w:r>
             <w:r>
               <w:rPr>
@@ -5097,7 +5097,7 @@
               <w14:ligatures w14:val="standardContextual"/>
             </w:rPr>
           </w:pPr>
-          <w:hyperlink w:anchor="_Toc242193252" w:history="1">
+          <w:hyperlink w:anchor="_Toc242389682" w:history="1">
             <w:r>
               <w:rPr>
                 <w:rStyle w:val="Hyperlink"/>
@@ -5124,7 +5124,7 @@
                 <w:noProof/>
                 <w:webHidden/>
               </w:rPr>
-              <w:instrText xml:space="preserve"> PAGEREF _Toc242193252 \h </w:instrText>
+              <w:instrText xml:space="preserve"> PAGEREF _Toc242389682 \h </w:instrText>
             </w:r>
             <w:r>
               <w:rPr>
@@ -5171,7 +5171,7 @@
               <w14:ligatures w14:val="standardContextual"/>
             </w:rPr>
           </w:pPr>
-          <w:hyperlink w:anchor="_Toc242193253" w:history="1">
+          <w:hyperlink w:anchor="_Toc242389683" w:history="1">
             <w:r>
               <w:rPr>
                 <w:rStyle w:val="Hyperlink"/>
@@ -5198,7 +5198,7 @@
                 <w:noProof/>
                 <w:webHidden/>
               </w:rPr>
-              <w:instrText xml:space="preserve"> PAGEREF _Toc242193253 \h </w:instrText>
+              <w:instrText xml:space="preserve"> PAGEREF _Toc242389683 \h </w:instrText>
             </w:r>
             <w:r>
               <w:rPr>
@@ -5245,7 +5245,7 @@
               <w14:ligatures w14:val="standardContextual"/>
             </w:rPr>
           </w:pPr>
-          <w:hyperlink w:anchor="_Toc242193254" w:history="1">
+          <w:hyperlink w:anchor="_Toc242389684" w:history="1">
             <w:r>
               <w:rPr>
                 <w:rStyle w:val="Hyperlink"/>
@@ -5272,7 +5272,7 @@
                 <w:noProof/>
                 <w:webHidden/>
               </w:rPr>
-              <w:instrText xml:space="preserve"> PAGEREF _Toc242193254 \h </w:instrText>
+              <w:instrText xml:space="preserve"> PAGEREF _Toc242389684 \h </w:instrText>
             </w:r>
             <w:r>
               <w:rPr>
@@ -5319,7 +5319,7 @@
               <w14:ligatures w14:val="standardContextual"/>
             </w:rPr>
           </w:pPr>
-          <w:hyperlink w:anchor="_Toc242193255" w:history="1">
+          <w:hyperlink w:anchor="_Toc242389685" w:history="1">
             <w:r>
               <w:rPr>
                 <w:rStyle w:val="Hyperlink"/>
@@ -5346,7 +5346,7 @@
                 <w:noProof/>
                 <w:webHidden/>
               </w:rPr>
-              <w:instrText xml:space="preserve"> PAGEREF _Toc242193255 \h </w:instrText>
+              <w:instrText xml:space="preserve"> PAGEREF _Toc242389685 \h </w:instrText>
             </w:r>
             <w:r>
               <w:rPr>
@@ -5390,7 +5390,7 @@
               <w14:ligatures w14:val="standardContextual"/>
             </w:rPr>
           </w:pPr>
-          <w:hyperlink w:anchor="_Toc242193256" w:history="1">
+          <w:hyperlink w:anchor="_Toc242389686" w:history="1">
             <w:r>
               <w:rPr>
                 <w:rStyle w:val="Hyperlink"/>
@@ -5413,7 +5413,7 @@
               <w:rPr>
                 <w:webHidden/>
               </w:rPr>
-              <w:instrText xml:space="preserve"> PAGEREF _Toc242193256 \h </w:instrText>
+              <w:instrText xml:space="preserve"> PAGEREF _Toc242389686 \h </w:instrText>
             </w:r>
             <w:r>
               <w:rPr>
@@ -5456,7 +5456,7 @@
               <w14:ligatures w14:val="standardContextual"/>
             </w:rPr>
           </w:pPr>
-          <w:hyperlink w:anchor="_Toc242193257" w:history="1">
+          <w:hyperlink w:anchor="_Toc242389687" w:history="1">
             <w:r>
               <w:rPr>
                 <w:rStyle w:val="Hyperlink"/>
@@ -5483,7 +5483,7 @@
                 <w:noProof/>
                 <w:webHidden/>
               </w:rPr>
-              <w:instrText xml:space="preserve"> PAGEREF _Toc242193257 \h </w:instrText>
+              <w:instrText xml:space="preserve"> PAGEREF _Toc242389687 \h </w:instrText>
             </w:r>
             <w:r>
               <w:rPr>
@@ -5530,7 +5530,7 @@
               <w14:ligatures w14:val="standardContextual"/>
             </w:rPr>
           </w:pPr>
-          <w:hyperlink w:anchor="_Toc242193258" w:history="1">
+          <w:hyperlink w:anchor="_Toc242389688" w:history="1">
             <w:r>
               <w:rPr>
                 <w:rStyle w:val="Hyperlink"/>
@@ -5557,7 +5557,7 @@
                 <w:noProof/>
                 <w:webHidden/>
               </w:rPr>
-              <w:instrText xml:space="preserve"> PAGEREF _Toc242193258 \h </w:instrText>
+              <w:instrText xml:space="preserve"> PAGEREF _Toc242389688 \h </w:instrText>
             </w:r>
             <w:r>
               <w:rPr>
@@ -5604,7 +5604,7 @@
               <w14:ligatures w14:val="standardContextual"/>
             </w:rPr>
           </w:pPr>
-          <w:hyperlink w:anchor="_Toc242193259" w:history="1">
+          <w:hyperlink w:anchor="_Toc242389689" w:history="1">
             <w:r>
               <w:rPr>
                 <w:rStyle w:val="Hyperlink"/>
@@ -5631,7 +5631,7 @@
                 <w:noProof/>
                 <w:webHidden/>
               </w:rPr>
-              <w:instrText xml:space="preserve"> PAGEREF _Toc242193259 \h </w:instrText>
+              <w:instrText xml:space="preserve"> PAGEREF _Toc242389689 \h </w:instrText>
             </w:r>
             <w:r>
               <w:rPr>
@@ -5678,7 +5678,7 @@
               <w14:ligatures w14:val="standardContextual"/>
             </w:rPr>
           </w:pPr>
-          <w:hyperlink w:anchor="_Toc242193260" w:history="1">
+          <w:hyperlink w:anchor="_Toc242389690" w:history="1">
             <w:r>
               <w:rPr>
                 <w:rStyle w:val="Hyperlink"/>
@@ -5705,7 +5705,7 @@
                 <w:noProof/>
                 <w:webHidden/>
               </w:rPr>
-              <w:instrText xml:space="preserve"> PAGEREF _Toc242193260 \h </w:instrText>
+              <w:instrText xml:space="preserve"> PAGEREF _Toc242389690 \h </w:instrText>
             </w:r>
             <w:r>
               <w:rPr>
@@ -5752,7 +5752,7 @@
               <w14:ligatures w14:val="standardContextual"/>
             </w:rPr>
           </w:pPr>
-          <w:hyperlink w:anchor="_Toc242193261" w:history="1">
+          <w:hyperlink w:anchor="_Toc242389691" w:history="1">
             <w:r>
               <w:rPr>
                 <w:rStyle w:val="Hyperlink"/>
@@ -5779,7 +5779,7 @@
                 <w:noProof/>
                 <w:webHidden/>
               </w:rPr>
-              <w:instrText xml:space="preserve"> PAGEREF _Toc242193261 \h </w:instrText>
+              <w:instrText xml:space="preserve"> PAGEREF _Toc242389691 \h </w:instrText>
             </w:r>
             <w:r>
               <w:rPr>
@@ -5826,7 +5826,7 @@
               <w14:ligatures w14:val="standardContextual"/>
             </w:rPr>
           </w:pPr>
-          <w:hyperlink w:anchor="_Toc242193262" w:history="1">
+          <w:hyperlink w:anchor="_Toc242389692" w:history="1">
             <w:r>
               <w:rPr>
                 <w:rStyle w:val="Hyperlink"/>
@@ -5853,7 +5853,7 @@
                 <w:noProof/>
                 <w:webHidden/>
               </w:rPr>
-              <w:instrText xml:space="preserve"> PAGEREF _Toc242193262 \h </w:instrText>
+              <w:instrText xml:space="preserve"> PAGEREF _Toc242389692 \h </w:instrText>
             </w:r>
             <w:r>
               <w:rPr>
@@ -5900,7 +5900,7 @@
               <w14:ligatures w14:val="standardContextual"/>
             </w:rPr>
           </w:pPr>
-          <w:hyperlink w:anchor="_Toc242193263" w:history="1">
+          <w:hyperlink w:anchor="_Toc242389693" w:history="1">
             <w:r>
               <w:rPr>
                 <w:rStyle w:val="Hyperlink"/>
@@ -5927,7 +5927,7 @@
                 <w:noProof/>
                 <w:webHidden/>
               </w:rPr>
-              <w:instrText xml:space="preserve"> PAGEREF _Toc242193263 \h </w:instrText>
+              <w:instrText xml:space="preserve"> PAGEREF _Toc242389693 \h </w:instrText>
             </w:r>
             <w:r>
               <w:rPr>
@@ -5974,7 +5974,7 @@
               <w14:ligatures w14:val="standardContextual"/>
             </w:rPr>
           </w:pPr>
-          <w:hyperlink w:anchor="_Toc242193264" w:history="1">
+          <w:hyperlink w:anchor="_Toc242389694" w:history="1">
             <w:r>
               <w:rPr>
                 <w:rStyle w:val="Hyperlink"/>
@@ -6001,7 +6001,7 @@
                 <w:noProof/>
                 <w:webHidden/>
               </w:rPr>
-              <w:instrText xml:space="preserve"> PAGEREF _Toc242193264 \h </w:instrText>
+              <w:instrText xml:space="preserve"> PAGEREF _Toc242389694 \h </w:instrText>
             </w:r>
             <w:r>
               <w:rPr>
@@ -6048,7 +6048,7 @@
               <w14:ligatures w14:val="standardContextual"/>
             </w:rPr>
           </w:pPr>
-          <w:hyperlink w:anchor="_Toc242193265" w:history="1">
+          <w:hyperlink w:anchor="_Toc242389695" w:history="1">
             <w:r>
               <w:rPr>
                 <w:rStyle w:val="Hyperlink"/>
@@ -6075,7 +6075,7 @@
                 <w:noProof/>
                 <w:webHidden/>
               </w:rPr>
-              <w:instrText xml:space="preserve"> PAGEREF _Toc242193265 \h </w:instrText>
+              <w:instrText xml:space="preserve"> PAGEREF _Toc242389695 \h </w:instrText>
             </w:r>
             <w:r>
               <w:rPr>
@@ -6122,7 +6122,7 @@
               <w14:ligatures w14:val="standardContextual"/>
             </w:rPr>
           </w:pPr>
-          <w:hyperlink w:anchor="_Toc242193266" w:history="1">
+          <w:hyperlink w:anchor="_Toc242389696" w:history="1">
             <w:r>
               <w:rPr>
                 <w:rStyle w:val="Hyperlink"/>
@@ -6149,7 +6149,7 @@
                 <w:noProof/>
                 <w:webHidden/>
               </w:rPr>
-              <w:instrText xml:space="preserve"> PAGEREF _Toc242193266 \h </w:instrText>
+              <w:instrText xml:space="preserve"> PAGEREF _Toc242389696 \h </w:instrText>
             </w:r>
             <w:r>
               <w:rPr>
@@ -6196,7 +6196,7 @@
               <w14:ligatures w14:val="standardContextual"/>
             </w:rPr>
           </w:pPr>
-          <w:hyperlink w:anchor="_Toc242193267" w:history="1">
+          <w:hyperlink w:anchor="_Toc242389697" w:history="1">
             <w:r>
               <w:rPr>
                 <w:rStyle w:val="Hyperlink"/>
@@ -6223,7 +6223,7 @@
                 <w:noProof/>
                 <w:webHidden/>
               </w:rPr>
-              <w:instrText xml:space="preserve"> PAGEREF _Toc242193267 \h </w:instrText>
+              <w:instrText xml:space="preserve"> PAGEREF _Toc242389697 \h </w:instrText>
             </w:r>
             <w:r>
               <w:rPr>
@@ -6270,7 +6270,7 @@
               <w14:ligatures w14:val="standardContextual"/>
             </w:rPr>
           </w:pPr>
-          <w:hyperlink w:anchor="_Toc242193268" w:history="1">
+          <w:hyperlink w:anchor="_Toc242389698" w:history="1">
             <w:r>
               <w:rPr>
                 <w:rStyle w:val="Hyperlink"/>
@@ -6297,7 +6297,7 @@
                 <w:noProof/>
                 <w:webHidden/>
               </w:rPr>
-              <w:instrText xml:space="preserve"> PAGEREF _Toc242193268 \h </w:instrText>
+              <w:instrText xml:space="preserve"> PAGEREF _Toc242389698 \h </w:instrText>
             </w:r>
             <w:r>
               <w:rPr>
@@ -6344,7 +6344,7 @@
               <w14:ligatures w14:val="standardContextual"/>
             </w:rPr>
           </w:pPr>
-          <w:hyperlink w:anchor="_Toc242193269" w:history="1">
+          <w:hyperlink w:anchor="_Toc242389699" w:history="1">
             <w:r>
               <w:rPr>
                 <w:rStyle w:val="Hyperlink"/>
@@ -6371,7 +6371,7 @@
                 <w:noProof/>
                 <w:webHidden/>
               </w:rPr>
-              <w:instrText xml:space="preserve"> PAGEREF _Toc242193269 \h </w:instrText>
+              <w:instrText xml:space="preserve"> PAGEREF _Toc242389699 \h </w:instrText>
             </w:r>
             <w:r>
               <w:rPr>
@@ -6415,7 +6415,7 @@
               <w14:ligatures w14:val="standardContextual"/>
             </w:rPr>
           </w:pPr>
-          <w:hyperlink w:anchor="_Toc242193270" w:history="1">
+          <w:hyperlink w:anchor="_Toc242389700" w:history="1">
             <w:r>
               <w:rPr>
                 <w:rStyle w:val="Hyperlink"/>
@@ -6438,7 +6438,7 @@
               <w:rPr>
                 <w:webHidden/>
               </w:rPr>
-              <w:instrText xml:space="preserve"> PAGEREF _Toc242193270 \h </w:instrText>
+              <w:instrText xml:space="preserve"> PAGEREF _Toc242389700 \h </w:instrText>
             </w:r>
             <w:r>
               <w:rPr>
@@ -6481,7 +6481,7 @@
               <w14:ligatures w14:val="standardContextual"/>
             </w:rPr>
           </w:pPr>
-          <w:hyperlink w:anchor="_Toc242193271" w:history="1">
+          <w:hyperlink w:anchor="_Toc242389701" w:history="1">
             <w:r>
               <w:rPr>
                 <w:rStyle w:val="Hyperlink"/>
@@ -6508,7 +6508,7 @@
                 <w:noProof/>
                 <w:webHidden/>
               </w:rPr>
-              <w:instrText xml:space="preserve"> PAGEREF _Toc242193271 \h </w:instrText>
+              <w:instrText xml:space="preserve"> PAGEREF _Toc242389701 \h </w:instrText>
             </w:r>
             <w:r>
               <w:rPr>
@@ -6552,7 +6552,7 @@
               <w14:ligatures w14:val="standardContextual"/>
             </w:rPr>
           </w:pPr>
-          <w:hyperlink w:anchor="_Toc242193272" w:history="1">
+          <w:hyperlink w:anchor="_Toc242389702" w:history="1">
             <w:r>
               <w:rPr>
                 <w:rStyle w:val="Hyperlink"/>
@@ -6575,7 +6575,7 @@
               <w:rPr>
                 <w:webHidden/>
               </w:rPr>
-              <w:instrText xml:space="preserve"> PAGEREF _Toc242193272 \h </w:instrText>
+              <w:instrText xml:space="preserve"> PAGEREF _Toc242389702 \h </w:instrText>
             </w:r>
             <w:r>
               <w:rPr>
@@ -6639,7 +6639,7 @@
         <w:pStyle w:val="Ttulo1"/>
         <w:spacing w:after="100" w:afterAutospacing="1" w:line="360" w:lineRule="auto"/>
       </w:pPr>
-      <w:bookmarkStart w:id="0" w:name="_Toc242193230"/>
+      <w:bookmarkStart w:id="0" w:name="_Toc242389660"/>
       <w:r>
         <w:rPr>
           <w:sz w:val="24"/>
@@ -6657,7 +6657,7 @@
           <w:rFonts w:cs="Arial"/>
         </w:rPr>
       </w:pPr>
-      <w:bookmarkStart w:id="1" w:name="_Toc242193231"/>
+      <w:bookmarkStart w:id="1" w:name="_Toc242389661"/>
       <w:r>
         <w:rPr>
           <w:rFonts w:cs="Arial"/>
@@ -6755,7 +6755,7 @@
           <w:rFonts w:cs="Arial"/>
         </w:rPr>
       </w:pPr>
-      <w:bookmarkStart w:id="2" w:name="_Toc242193232"/>
+      <w:bookmarkStart w:id="2" w:name="_Toc242389662"/>
       <w:r>
         <w:rPr>
           <w:rFonts w:cs="Arial"/>
@@ -6793,7 +6793,7 @@
           <w:rFonts w:cs="Arial"/>
         </w:rPr>
       </w:pPr>
-      <w:bookmarkStart w:id="3" w:name="_Toc242193233"/>
+      <w:bookmarkStart w:id="3" w:name="_Toc242389663"/>
       <w:r>
         <w:rPr>
           <w:rFonts w:cs="Arial"/>
@@ -6808,7 +6808,7 @@
         <w:pStyle w:val="Ttulo3"/>
         <w:spacing w:before="100" w:beforeAutospacing="1" w:after="100" w:afterAutospacing="1" w:line="360" w:lineRule="auto"/>
       </w:pPr>
-      <w:bookmarkStart w:id="4" w:name="_Toc242193234"/>
+      <w:bookmarkStart w:id="4" w:name="_Toc242389664"/>
       <w:r>
         <w:t>1.3.1 Objetivo Geral</w:t>
       </w:r>
@@ -6843,7 +6843,7 @@
           <w:i/>
         </w:rPr>
       </w:pPr>
-      <w:bookmarkStart w:id="5" w:name="_Toc242193235"/>
+      <w:bookmarkStart w:id="5" w:name="_Toc242389665"/>
       <w:r>
         <w:t>1.3.2 Objetivos Específicos</w:t>
       </w:r>
@@ -7049,7 +7049,7 @@
           <w:rFonts w:cs="Arial"/>
         </w:rPr>
       </w:pPr>
-      <w:bookmarkStart w:id="6" w:name="_Toc242193236"/>
+      <w:bookmarkStart w:id="6" w:name="_Toc242389666"/>
       <w:r>
         <w:rPr>
           <w:rFonts w:cs="Arial"/>
@@ -7126,7 +7126,7 @@
           <w:rFonts w:cs="Arial"/>
         </w:rPr>
       </w:pPr>
-      <w:bookmarkStart w:id="7" w:name="_Toc242193237"/>
+      <w:bookmarkStart w:id="7" w:name="_Toc242389667"/>
       <w:r>
         <w:rPr>
           <w:rFonts w:cs="Arial"/>
@@ -7278,7 +7278,7 @@
           <w:sz w:val="24"/>
         </w:rPr>
       </w:pPr>
-      <w:bookmarkStart w:id="8" w:name="_Toc242193238"/>
+      <w:bookmarkStart w:id="8" w:name="_Toc242389668"/>
       <w:r>
         <w:rPr>
           <w:sz w:val="24"/>
@@ -7296,7 +7296,7 @@
           <w:rFonts w:cs="Arial"/>
         </w:rPr>
       </w:pPr>
-      <w:bookmarkStart w:id="9" w:name="_Toc242193239"/>
+      <w:bookmarkStart w:id="9" w:name="_Toc242389669"/>
       <w:r>
         <w:rPr>
           <w:rFonts w:cs="Arial"/>
@@ -7406,7 +7406,7 @@
           <w:rFonts w:cs="Arial"/>
         </w:rPr>
       </w:pPr>
-      <w:bookmarkStart w:id="10" w:name="_Toc242193240"/>
+      <w:bookmarkStart w:id="10" w:name="_Toc242389670"/>
       <w:r>
         <w:rPr>
           <w:rFonts w:cs="Arial"/>
@@ -7542,7 +7542,7 @@
         <w:pStyle w:val="Legenda"/>
         <w:keepNext/>
       </w:pPr>
-      <w:bookmarkStart w:id="11" w:name="_Toc242193213"/>
+      <w:bookmarkStart w:id="11" w:name="_Toc242389643"/>
       <w:r>
         <w:lastRenderedPageBreak/>
         <w:t xml:space="preserve">Figura </w:t>
@@ -7583,7 +7583,7 @@
           <w:noProof/>
         </w:rPr>
         <w:drawing>
-          <wp:inline distT="0" distB="0" distL="0" distR="0" wp14:anchorId="0E542B42" wp14:editId="4E0C2897">
+          <wp:inline distT="0" distB="0" distL="0" distR="0" wp14:anchorId="22737AEE" wp14:editId="433FBBC7">
             <wp:extent cx="5486400" cy="2022437"/>
             <wp:effectExtent l="0" t="0" r="0" b="0"/>
             <wp:docPr id="101" name="fig_gargalo"/>
@@ -7655,7 +7655,7 @@
           <w:rFonts w:cs="Arial"/>
         </w:rPr>
       </w:pPr>
-      <w:bookmarkStart w:id="12" w:name="_Toc242193241"/>
+      <w:bookmarkStart w:id="12" w:name="_Toc242389671"/>
       <w:r>
         <w:rPr>
           <w:rFonts w:cs="Arial"/>
@@ -7771,7 +7771,7 @@
         <w:pStyle w:val="Legenda"/>
         <w:keepNext/>
       </w:pPr>
-      <w:bookmarkStart w:id="13" w:name="_Toc242193214"/>
+      <w:bookmarkStart w:id="13" w:name="_Toc242389644"/>
       <w:r>
         <w:t xml:space="preserve">Figura </w:t>
       </w:r>
@@ -7811,7 +7811,7 @@
           <w:noProof/>
         </w:rPr>
         <w:drawing>
-          <wp:inline distT="0" distB="0" distL="0" distR="0" wp14:anchorId="437E09BD" wp14:editId="55486C2E">
+          <wp:inline distT="0" distB="0" distL="0" distR="0" wp14:anchorId="7F13876C" wp14:editId="2B3F3B0A">
             <wp:extent cx="5486400" cy="2051249"/>
             <wp:effectExtent l="0" t="0" r="0" b="0"/>
             <wp:docPr id="102" name="fig_nivelamento"/>
@@ -7879,7 +7879,7 @@
           <w:rFonts w:cs="Arial"/>
         </w:rPr>
       </w:pPr>
-      <w:bookmarkStart w:id="14" w:name="_Toc242193242"/>
+      <w:bookmarkStart w:id="14" w:name="_Toc242389672"/>
       <w:r>
         <w:rPr>
           <w:rFonts w:cs="Arial"/>
@@ -8000,7 +8000,7 @@
           <w:lang w:val="en-US"/>
         </w:rPr>
       </w:pPr>
-      <w:bookmarkStart w:id="15" w:name="_Toc242193243"/>
+      <w:bookmarkStart w:id="15" w:name="_Toc242389673"/>
       <w:r>
         <w:rPr>
           <w:rFonts w:cs="Arial"/>
@@ -8210,7 +8210,7 @@
         <w:pStyle w:val="Legenda"/>
         <w:keepNext/>
       </w:pPr>
-      <w:bookmarkStart w:id="16" w:name="_Toc242193215"/>
+      <w:bookmarkStart w:id="16" w:name="_Toc242389645"/>
       <w:r>
         <w:t xml:space="preserve">Figura </w:t>
       </w:r>
@@ -8250,7 +8250,7 @@
           <w:noProof/>
         </w:rPr>
         <w:drawing>
-          <wp:inline distT="0" distB="0" distL="0" distR="0" wp14:anchorId="566AF65A" wp14:editId="6079CC23">
+          <wp:inline distT="0" distB="0" distL="0" distR="0" wp14:anchorId="33C8AB67" wp14:editId="34644DCF">
             <wp:extent cx="5486400" cy="3543069"/>
             <wp:effectExtent l="0" t="0" r="0" b="0"/>
             <wp:docPr id="103" name="fig_mes"/>
@@ -8318,7 +8318,7 @@
           <w:rFonts w:cs="Arial"/>
         </w:rPr>
       </w:pPr>
-      <w:bookmarkStart w:id="17" w:name="_Toc242193244"/>
+      <w:bookmarkStart w:id="17" w:name="_Toc242389674"/>
       <w:r>
         <w:rPr>
           <w:rFonts w:cs="Arial"/>
@@ -8508,7 +8508,7 @@
           <w:rFonts w:cs="Arial"/>
         </w:rPr>
       </w:pPr>
-      <w:bookmarkStart w:id="18" w:name="_Toc242193245"/>
+      <w:bookmarkStart w:id="18" w:name="_Toc242389675"/>
       <w:r>
         <w:rPr>
           <w:rFonts w:cs="Arial"/>
@@ -8709,7 +8709,7 @@
         <w:pStyle w:val="Legenda"/>
         <w:keepNext/>
       </w:pPr>
-      <w:bookmarkStart w:id="19" w:name="_Toc242193216"/>
+      <w:bookmarkStart w:id="19" w:name="_Toc242389646"/>
       <w:r>
         <w:t xml:space="preserve">Figura </w:t>
       </w:r>
@@ -8749,7 +8749,7 @@
           <w:noProof/>
         </w:rPr>
         <w:drawing>
-          <wp:inline distT="0" distB="0" distL="0" distR="0" wp14:anchorId="3B9934B4" wp14:editId="7F87BCFF">
+          <wp:inline distT="0" distB="0" distL="0" distR="0" wp14:anchorId="0709CB4E" wp14:editId="1DC91F4B">
             <wp:extent cx="5486400" cy="1791916"/>
             <wp:effectExtent l="0" t="0" r="0" b="0"/>
             <wp:docPr id="104" name="fig_arq"/>
@@ -8818,7 +8818,7 @@
           <w:u w:val="single"/>
         </w:rPr>
       </w:pPr>
-      <w:bookmarkStart w:id="20" w:name="_Toc242193246"/>
+      <w:bookmarkStart w:id="20" w:name="_Toc242389676"/>
       <w:r>
         <w:rPr>
           <w:rFonts w:cs="Arial"/>
@@ -8932,7 +8932,7 @@
         <w:pStyle w:val="Ttulo2"/>
         <w:spacing w:line="360" w:lineRule="auto"/>
       </w:pPr>
-      <w:bookmarkStart w:id="21" w:name="_Toc242193247"/>
+      <w:bookmarkStart w:id="21" w:name="_Toc242389677"/>
       <w:r>
         <w:t>2.9 Considerações sobre a Utilização de Sistemas para Nivelamento de Processos</w:t>
       </w:r>
@@ -9070,7 +9070,7 @@
           <w:sz w:val="24"/>
         </w:rPr>
       </w:pPr>
-      <w:bookmarkStart w:id="22" w:name="_Toc242193248"/>
+      <w:bookmarkStart w:id="22" w:name="_Toc242389678"/>
       <w:r>
         <w:rPr>
           <w:sz w:val="24"/>
@@ -9089,7 +9089,7 @@
           <w:szCs w:val="24"/>
         </w:rPr>
       </w:pPr>
-      <w:bookmarkStart w:id="23" w:name="_Toc242193249"/>
+      <w:bookmarkStart w:id="23" w:name="_Toc242389679"/>
       <w:r>
         <w:rPr>
           <w:rFonts w:cs="Arial"/>
@@ -9195,7 +9195,7 @@
         <w:pStyle w:val="Ttulo2"/>
         <w:spacing w:line="360" w:lineRule="auto"/>
       </w:pPr>
-      <w:bookmarkStart w:id="24" w:name="_Toc242193250"/>
+      <w:bookmarkStart w:id="24" w:name="_Toc242389680"/>
       <w:r>
         <w:t>3.2 Métodos Utilizados</w:t>
       </w:r>
@@ -9465,7 +9465,7 @@
         <w:pStyle w:val="Ttulo2"/>
         <w:spacing w:before="100" w:beforeAutospacing="1" w:after="100" w:afterAutospacing="1" w:line="360" w:lineRule="auto"/>
       </w:pPr>
-      <w:bookmarkStart w:id="25" w:name="_Toc242193251"/>
+      <w:bookmarkStart w:id="25" w:name="_Toc242389681"/>
       <w:r>
         <w:t>3.3 Ferramentas e Tecnologias Utilizadas</w:t>
       </w:r>
@@ -9476,7 +9476,7 @@
         <w:pStyle w:val="Ttulo3"/>
         <w:spacing w:before="100" w:beforeAutospacing="1" w:after="100" w:afterAutospacing="1" w:line="360" w:lineRule="auto"/>
       </w:pPr>
-      <w:bookmarkStart w:id="26" w:name="_Toc242193252"/>
+      <w:bookmarkStart w:id="26" w:name="_Toc242389682"/>
       <w:r>
         <w:t>3.3.1 Linguagens de Programação</w:t>
       </w:r>
@@ -9699,7 +9699,7 @@
         <w:pStyle w:val="Ttulo3"/>
         <w:spacing w:line="360" w:lineRule="auto"/>
       </w:pPr>
-      <w:bookmarkStart w:id="27" w:name="_Toc242193253"/>
+      <w:bookmarkStart w:id="27" w:name="_Toc242389683"/>
       <w:r>
         <w:lastRenderedPageBreak/>
         <w:t>3.3.2 Framework</w:t>
@@ -9876,7 +9876,7 @@
         <w:pStyle w:val="Ttulo3"/>
         <w:spacing w:line="360" w:lineRule="auto"/>
       </w:pPr>
-      <w:bookmarkStart w:id="28" w:name="_Toc242193254"/>
+      <w:bookmarkStart w:id="28" w:name="_Toc242389684"/>
       <w:r>
         <w:t>3.3.3 Banco de Dados</w:t>
       </w:r>
@@ -9966,7 +9966,7 @@
       <w:pPr>
         <w:pStyle w:val="Ttulo2"/>
       </w:pPr>
-      <w:bookmarkStart w:id="29" w:name="_Toc242193255"/>
+      <w:bookmarkStart w:id="29" w:name="_Toc242389685"/>
       <w:r>
         <w:lastRenderedPageBreak/>
         <w:t>3.4 Etapas do Desenvolvimento</w:t>
@@ -10293,7 +10293,7 @@
           <w:sz w:val="24"/>
         </w:rPr>
       </w:pPr>
-      <w:bookmarkStart w:id="30" w:name="_Toc242193256"/>
+      <w:bookmarkStart w:id="30" w:name="_Toc242389686"/>
       <w:r>
         <w:rPr>
           <w:sz w:val="24"/>
@@ -10307,7 +10307,7 @@
       <w:pPr>
         <w:pStyle w:val="Ttulo2"/>
       </w:pPr>
-      <w:bookmarkStart w:id="31" w:name="_Toc242193257"/>
+      <w:bookmarkStart w:id="31" w:name="_Toc242389687"/>
       <w:r>
         <w:t>4.1 Descrição do Problema</w:t>
       </w:r>
@@ -10418,7 +10418,7 @@
         <w:pStyle w:val="Ttulo2"/>
         <w:spacing w:line="360" w:lineRule="auto"/>
       </w:pPr>
-      <w:bookmarkStart w:id="32" w:name="_Toc242193258"/>
+      <w:bookmarkStart w:id="32" w:name="_Toc242389688"/>
       <w:r>
         <w:lastRenderedPageBreak/>
         <w:t>4.2 Requisitos Funcionais</w:t>
@@ -10430,7 +10430,7 @@
         <w:pStyle w:val="Ttulo3"/>
         <w:spacing w:line="360" w:lineRule="auto"/>
       </w:pPr>
-      <w:bookmarkStart w:id="33" w:name="_Toc242193259"/>
+      <w:bookmarkStart w:id="33" w:name="_Toc242389689"/>
       <w:r>
         <w:t>4.2.1 Requisitos Funcionais da Tela de Login</w:t>
       </w:r>
@@ -10461,7 +10461,7 @@
         <w:pStyle w:val="Legenda"/>
         <w:keepNext/>
       </w:pPr>
-      <w:bookmarkStart w:id="34" w:name="_Toc242193222"/>
+      <w:bookmarkStart w:id="34" w:name="_Toc242389652"/>
       <w:r>
         <w:t xml:space="preserve">Tabela </w:t>
       </w:r>
@@ -11151,7 +11151,7 @@
         <w:pStyle w:val="Ttulo3"/>
         <w:spacing w:line="360" w:lineRule="auto"/>
       </w:pPr>
-      <w:bookmarkStart w:id="35" w:name="_Toc242193260"/>
+      <w:bookmarkStart w:id="35" w:name="_Toc242389690"/>
       <w:r>
         <w:lastRenderedPageBreak/>
         <w:t>4.2.2 Requisitos Funcionais da Tela de Cadastro de Setores</w:t>
@@ -11183,7 +11183,7 @@
         <w:pStyle w:val="Legenda"/>
         <w:keepNext/>
       </w:pPr>
-      <w:bookmarkStart w:id="36" w:name="_Toc242193223"/>
+      <w:bookmarkStart w:id="36" w:name="_Toc242389653"/>
       <w:r>
         <w:t xml:space="preserve">Tabela </w:t>
       </w:r>
@@ -11989,7 +11989,7 @@
         <w:pStyle w:val="Ttulo3"/>
         <w:spacing w:line="360" w:lineRule="auto"/>
       </w:pPr>
-      <w:bookmarkStart w:id="37" w:name="_Toc242193261"/>
+      <w:bookmarkStart w:id="37" w:name="_Toc242389691"/>
       <w:r>
         <w:lastRenderedPageBreak/>
         <w:t xml:space="preserve">4.2.3 Requisitos Funcionais da Tela de Cadastro de </w:t>
@@ -12024,7 +12024,7 @@
         <w:pStyle w:val="Legenda"/>
         <w:keepNext/>
       </w:pPr>
-      <w:bookmarkStart w:id="38" w:name="_Toc242193224"/>
+      <w:bookmarkStart w:id="38" w:name="_Toc242389654"/>
       <w:r>
         <w:t xml:space="preserve">Tabela </w:t>
       </w:r>
@@ -12830,7 +12830,7 @@
         <w:pStyle w:val="Ttulo3"/>
         <w:spacing w:line="360" w:lineRule="auto"/>
       </w:pPr>
-      <w:bookmarkStart w:id="39" w:name="_Toc242193262"/>
+      <w:bookmarkStart w:id="39" w:name="_Toc242389692"/>
       <w:r>
         <w:lastRenderedPageBreak/>
         <w:t>4.2.4 Requisitos Funcionais da Tela de Cadastro de Tarefas</w:t>
@@ -12862,7 +12862,7 @@
         <w:pStyle w:val="Legenda"/>
         <w:keepNext/>
       </w:pPr>
-      <w:bookmarkStart w:id="40" w:name="_Toc242193225"/>
+      <w:bookmarkStart w:id="40" w:name="_Toc242389655"/>
       <w:r>
         <w:t xml:space="preserve">Tabela </w:t>
       </w:r>
@@ -13784,7 +13784,7 @@
         <w:pStyle w:val="Ttulo3"/>
         <w:spacing w:line="360" w:lineRule="auto"/>
       </w:pPr>
-      <w:bookmarkStart w:id="41" w:name="_Toc242193263"/>
+      <w:bookmarkStart w:id="41" w:name="_Toc242389693"/>
       <w:r>
         <w:lastRenderedPageBreak/>
         <w:t>4.2.5 Requisitos Funcionais da Tela de Produtos e Ordens de Produção</w:t>
@@ -13816,7 +13816,7 @@
         <w:pStyle w:val="Legenda"/>
         <w:keepNext/>
       </w:pPr>
-      <w:bookmarkStart w:id="42" w:name="_Toc242193226"/>
+      <w:bookmarkStart w:id="42" w:name="_Toc242389656"/>
       <w:r>
         <w:t xml:space="preserve">Tabela </w:t>
       </w:r>
@@ -14622,7 +14622,7 @@
         <w:pStyle w:val="Ttulo3"/>
         <w:spacing w:line="360" w:lineRule="auto"/>
       </w:pPr>
-      <w:bookmarkStart w:id="43" w:name="_Toc242193264"/>
+      <w:bookmarkStart w:id="43" w:name="_Toc242389694"/>
       <w:r>
         <w:lastRenderedPageBreak/>
         <w:t>4.2.6 Requisitos Funcionais da Tela de Apontamento da Produção</w:t>
@@ -14654,7 +14654,7 @@
         <w:pStyle w:val="Legenda"/>
         <w:keepNext/>
       </w:pPr>
-      <w:bookmarkStart w:id="44" w:name="_Toc242193227"/>
+      <w:bookmarkStart w:id="44" w:name="_Toc242389657"/>
       <w:r>
         <w:t xml:space="preserve">Tabela </w:t>
       </w:r>
@@ -15284,7 +15284,7 @@
                 <w:sz w:val="24"/>
                 <w:szCs w:val="24"/>
               </w:rPr>
-              <w:t>O sistema deve permitir finalizar a execução, registrando a baixa da ordem de produção naquela etapa.</w:t>
+              <w:t>O sistema deve permitir finalizar a execução por troca de operação, quando a etapa não foi concluída, ou por baixa da ordem de produção naquela etapa.</w:t>
             </w:r>
           </w:p>
         </w:tc>
@@ -15576,7 +15576,7 @@
         <w:pStyle w:val="Ttulo3"/>
         <w:spacing w:line="360" w:lineRule="auto"/>
       </w:pPr>
-      <w:bookmarkStart w:id="45" w:name="_Toc242193265"/>
+      <w:bookmarkStart w:id="45" w:name="_Toc242389695"/>
       <w:r>
         <w:lastRenderedPageBreak/>
         <w:t>4.2.7 Requisitos Funcionais da Tela de Monitoramento da Produção</w:t>
@@ -15608,7 +15608,7 @@
         <w:pStyle w:val="Legenda"/>
         <w:keepNext/>
       </w:pPr>
-      <w:bookmarkStart w:id="46" w:name="_Toc242193228"/>
+      <w:bookmarkStart w:id="46" w:name="_Toc242389658"/>
       <w:r>
         <w:t xml:space="preserve">Tabela </w:t>
       </w:r>
@@ -16413,7 +16413,7 @@
       <w:pPr>
         <w:pStyle w:val="Ttulo2"/>
       </w:pPr>
-      <w:bookmarkStart w:id="47" w:name="_Toc242193266"/>
+      <w:bookmarkStart w:id="47" w:name="_Toc242389696"/>
       <w:r>
         <w:lastRenderedPageBreak/>
         <w:t>4.3 Requisitos Não Funcionais</w:t>
@@ -16444,7 +16444,7 @@
       <w:pPr>
         <w:pStyle w:val="Ttulo3"/>
       </w:pPr>
-      <w:bookmarkStart w:id="48" w:name="_Toc242193267"/>
+      <w:bookmarkStart w:id="48" w:name="_Toc242389697"/>
       <w:r>
         <w:t>4.3.1 Requisitos Não Funcionais do Sistema</w:t>
       </w:r>
@@ -16475,7 +16475,7 @@
         <w:pStyle w:val="Legenda"/>
         <w:keepNext/>
       </w:pPr>
-      <w:bookmarkStart w:id="49" w:name="_Toc242193229"/>
+      <w:bookmarkStart w:id="49" w:name="_Toc242389659"/>
       <w:r>
         <w:t xml:space="preserve">Tabela </w:t>
       </w:r>
@@ -17651,7 +17651,7 @@
       <w:pPr>
         <w:pStyle w:val="Ttulo2"/>
       </w:pPr>
-      <w:bookmarkStart w:id="50" w:name="_Toc242193268"/>
+      <w:bookmarkStart w:id="50" w:name="_Toc242389698"/>
       <w:r>
         <w:lastRenderedPageBreak/>
         <w:t>4.4 Prototipagem</w:t>
@@ -17960,7 +17960,7 @@
         <w:pStyle w:val="Legenda"/>
         <w:keepNext/>
       </w:pPr>
-      <w:bookmarkStart w:id="51" w:name="_Toc242193217"/>
+      <w:bookmarkStart w:id="51" w:name="_Toc242389647"/>
       <w:r>
         <w:lastRenderedPageBreak/>
         <w:t xml:space="preserve">Figura </w:t>
@@ -17999,7 +17999,7 @@
           <w:noProof/>
         </w:rPr>
         <w:drawing>
-          <wp:inline distT="0" distB="0" distL="0" distR="0" wp14:anchorId="156A7A26" wp14:editId="30DCD2DB">
+          <wp:inline distT="0" distB="0" distL="0" distR="0" wp14:anchorId="47C23D50" wp14:editId="01B70154">
             <wp:extent cx="5669280" cy="2894876"/>
             <wp:effectExtent l="0" t="0" r="0" b="0"/>
             <wp:docPr id="2" name="Picture 2"/>
@@ -18066,7 +18066,7 @@
         <w:pStyle w:val="Legenda"/>
         <w:keepNext/>
       </w:pPr>
-      <w:bookmarkStart w:id="52" w:name="_Toc242193218"/>
+      <w:bookmarkStart w:id="52" w:name="_Toc242389648"/>
       <w:r>
         <w:t xml:space="preserve">Figura </w:t>
       </w:r>
@@ -18110,7 +18110,7 @@
           <w:szCs w:val="18"/>
         </w:rPr>
         <w:drawing>
-          <wp:inline distT="0" distB="0" distL="0" distR="0" wp14:anchorId="2291E73D" wp14:editId="5260D42B">
+          <wp:inline distT="0" distB="0" distL="0" distR="0" wp14:anchorId="64BAB021" wp14:editId="6903E02B">
             <wp:extent cx="5669280" cy="2894876"/>
             <wp:effectExtent l="0" t="0" r="0" b="0"/>
             <wp:docPr id="1" name="Picture 3"/>
@@ -18203,7 +18203,7 @@
         <w:pStyle w:val="Legenda"/>
         <w:keepNext/>
       </w:pPr>
-      <w:bookmarkStart w:id="53" w:name="_Toc242193219"/>
+      <w:bookmarkStart w:id="53" w:name="_Toc242389649"/>
       <w:r>
         <w:t xml:space="preserve">Figura </w:t>
       </w:r>
@@ -18241,7 +18241,7 @@
           <w:noProof/>
         </w:rPr>
         <w:drawing>
-          <wp:inline distT="0" distB="0" distL="0" distR="0" wp14:anchorId="67B85A9F" wp14:editId="26798045">
+          <wp:inline distT="0" distB="0" distL="0" distR="0" wp14:anchorId="54BBBDF7" wp14:editId="41739F99">
             <wp:extent cx="5669280" cy="2894876"/>
             <wp:effectExtent l="0" t="0" r="0" b="0"/>
             <wp:docPr id="201" name="Imagem 201"/>
@@ -18308,7 +18308,7 @@
         <w:pStyle w:val="Legenda"/>
         <w:keepNext/>
       </w:pPr>
-      <w:bookmarkStart w:id="54" w:name="_Toc242193220"/>
+      <w:bookmarkStart w:id="54" w:name="_Toc242389650"/>
       <w:r>
         <w:t xml:space="preserve">Figura </w:t>
       </w:r>
@@ -18346,7 +18346,7 @@
           <w:noProof/>
         </w:rPr>
         <w:drawing>
-          <wp:inline distT="0" distB="0" distL="0" distR="0" wp14:anchorId="1E3AB03C" wp14:editId="4C87A71E">
+          <wp:inline distT="0" distB="0" distL="0" distR="0" wp14:anchorId="0BBE7585" wp14:editId="24AF26FD">
             <wp:extent cx="5669280" cy="2894876"/>
             <wp:effectExtent l="0" t="0" r="0" b="0"/>
             <wp:docPr id="202" name="Imagem 202"/>
@@ -18422,7 +18422,7 @@
       <w:pPr>
         <w:pStyle w:val="Ttulo2"/>
       </w:pPr>
-      <w:bookmarkStart w:id="55" w:name="_Toc242193269"/>
+      <w:bookmarkStart w:id="55" w:name="_Toc242389699"/>
       <w:r>
         <w:lastRenderedPageBreak/>
         <w:t>4.5 Possível Estrutura do Sistema</w:t>
@@ -18708,7 +18708,7 @@
           <w:sz w:val="24"/>
         </w:rPr>
       </w:pPr>
-      <w:bookmarkStart w:id="56" w:name="_Toc242193270"/>
+      <w:bookmarkStart w:id="56" w:name="_Toc242389700"/>
       <w:r>
         <w:rPr>
           <w:sz w:val="24"/>
@@ -18722,7 +18722,7 @@
       <w:pPr>
         <w:pStyle w:val="Ttulo2"/>
       </w:pPr>
-      <w:bookmarkStart w:id="57" w:name="_Toc242193271"/>
+      <w:bookmarkStart w:id="57" w:name="_Toc242389701"/>
       <w:r>
         <w:t xml:space="preserve">5.1 </w:t>
       </w:r>
@@ -19089,7 +19089,7 @@
           <w:sz w:val="24"/>
           <w:szCs w:val="24"/>
         </w:rPr>
-        <w:t>Na finalização da execução ocorre a baixa da ordem de produção naquela etapa. A baixa é realizada uma única vez e considera toda a quantidade da ordem, não havendo baixa parcial. O resultado é registrado nos campos de quantidade boa, de retrabalho e de refugo, cuja soma deve ser igual à quantidade da ordem de produção.</w:t>
+        <w:t>A execução pode ser finalizada por troca de operação, sem concluir a etapa, ou por baixa, que a conclui. A baixa ocorre uma única vez por etapa e considera toda a quantidade da ordem, sem baixa parcial. Somente nela são registradas as quantidades boa, de retrabalho e de refugo, cuja soma é igual à quantidade da ordem.</w:t>
       </w:r>
     </w:p>
     <w:p>
@@ -19157,7 +19157,7 @@
           <w:sz w:val="24"/>
           <w:szCs w:val="24"/>
         </w:rPr>
-        <w:t>Todas as tabelas utilizam identificadores do tipo UUID como chave primária, e a maior parte delas registra as datas de criação e de atualização dos dados. As tabelas de usuários e de permissões de acesso não fazem parte deste diagrama, pois serão definidas em conjunto com a solução de autenticação adotada no projeto.</w:t>
+        <w:t>Todas as tabelas utilizam identificadores do tipo UUID como chave primária, e a maior parte delas registra as datas de criação e de atualização dos dados. O próprio banco de dados garante algumas regras, como a baixa única por etapa de cada ordem e o motivo obrigatório em toda pausa. As tabelas de usuários e de permissões de acesso não fazem parte deste diagrama, pois serão definidas em conjunto com a solução de autenticação adotada no projeto.</w:t>
       </w:r>
     </w:p>
     <w:p>
@@ -19183,7 +19183,7 @@
         <w:pStyle w:val="Legenda"/>
         <w:keepNext/>
       </w:pPr>
-      <w:bookmarkStart w:id="58" w:name="_Toc242193221"/>
+      <w:bookmarkStart w:id="58" w:name="_Toc242389651"/>
       <w:r>
         <w:t xml:space="preserve">Figura </w:t>
       </w:r>
@@ -19220,8 +19220,8 @@
           <w:noProof/>
         </w:rPr>
         <w:drawing>
-          <wp:inline distT="0" distB="0" distL="0" distR="0" wp14:anchorId="0B230205" wp14:editId="60B0AD4D">
-            <wp:extent cx="5730167" cy="6815634"/>
+          <wp:inline distT="0" distB="0" distL="0" distR="0" wp14:anchorId="6E77902C" wp14:editId="55254D81">
+            <wp:extent cx="5730167" cy="6811702"/>
             <wp:effectExtent l="0" t="0" r="4445" b="1905"/>
             <wp:docPr id="4" name="Imagem 4"/>
             <wp:cNvGraphicFramePr>
@@ -19252,7 +19252,7 @@
                   <pic:spPr bwMode="auto">
                     <a:xfrm>
                       <a:off x="0" y="0"/>
-                      <a:ext cx="5730167" cy="6815634"/>
+                      <a:ext cx="5730167" cy="6811702"/>
                     </a:xfrm>
                     <a:prstGeom prst="rect">
                       <a:avLst/>
@@ -19319,7 +19319,7 @@
         <w:spacing w:after="100" w:afterAutospacing="1"/>
         <w:jc w:val="center"/>
       </w:pPr>
-      <w:bookmarkStart w:id="59" w:name="_Toc242193272"/>
+      <w:bookmarkStart w:id="59" w:name="_Toc242389702"/>
       <w:r>
         <w:lastRenderedPageBreak/>
         <w:t>REFERÊNCIAS</w:t>
@@ -20027,7 +20027,7 @@
         <w:lang w:eastAsia="pt-BR"/>
       </w:rPr>
       <w:drawing>
-        <wp:inline distT="0" distB="0" distL="0" distR="0" wp14:anchorId="64E67A71" wp14:editId="78F42C6B">
+        <wp:inline distT="0" distB="0" distL="0" distR="0" wp14:anchorId="63850E0E" wp14:editId="027914B1">
           <wp:extent cx="1619048" cy="647619"/>
           <wp:effectExtent l="0" t="0" r="0" b="0"/>
           <wp:docPr id="5" name="Imagem 5" descr="Logotipo  O conteúdo gerado por IA pode estar incorreto."/>

</xml_diff>

<commit_message>
docs: adicionar o diagrama de classes e atualizar o TCC
Inclui o diagrama de classes UML do domínio em docs/domain, em PNG
editável no draw.io (Arquivo > Abrir de > Dispositivo).

No TCC: nova seção 5.2 com o diagrama de classes (Figura 10), tabela
Usuario no diagrama do banco (Figura 9) e requisitos da tela de login
ajustados para matrícula e senha.

Co-Authored-By: Claude Opus 5.5 <noreply@anthropic.com>
</commit_message>
<xml_diff>
--- a/docs/tcc/TCC_Nivelamento_de_Processos.docx
+++ b/docs/tcc/TCC_Nivelamento_de_Processos.docx
@@ -1706,7 +1706,7 @@
       <w:r>
         <w:fldChar w:fldCharType="separate"/>
       </w:r>
-      <w:hyperlink w:anchor="_Toc242389643" w:history="1">
+      <w:hyperlink w:anchor="_Toc242797203" w:history="1">
         <w:r>
           <w:rPr>
             <w:rStyle w:val="Hyperlink"/>
@@ -1733,7 +1733,7 @@
             <w:noProof/>
             <w:webHidden/>
           </w:rPr>
-          <w:instrText xml:space="preserve"> PAGEREF _Toc242389643 \h </w:instrText>
+          <w:instrText xml:space="preserve"> PAGEREF _Toc242797203 \h </w:instrText>
         </w:r>
         <w:r>
           <w:rPr>
@@ -1778,7 +1778,7 @@
           <w14:ligatures w14:val="standardContextual"/>
         </w:rPr>
       </w:pPr>
-      <w:hyperlink w:anchor="_Toc242389644" w:history="1">
+      <w:hyperlink w:anchor="_Toc242797204" w:history="1">
         <w:r>
           <w:rPr>
             <w:rStyle w:val="Hyperlink"/>
@@ -1805,7 +1805,7 @@
             <w:noProof/>
             <w:webHidden/>
           </w:rPr>
-          <w:instrText xml:space="preserve"> PAGEREF _Toc242389644 \h </w:instrText>
+          <w:instrText xml:space="preserve"> PAGEREF _Toc242797204 \h </w:instrText>
         </w:r>
         <w:r>
           <w:rPr>
@@ -1850,7 +1850,7 @@
           <w14:ligatures w14:val="standardContextual"/>
         </w:rPr>
       </w:pPr>
-      <w:hyperlink w:anchor="_Toc242389645" w:history="1">
+      <w:hyperlink w:anchor="_Toc242797205" w:history="1">
         <w:r>
           <w:rPr>
             <w:rStyle w:val="Hyperlink"/>
@@ -1877,7 +1877,7 @@
             <w:noProof/>
             <w:webHidden/>
           </w:rPr>
-          <w:instrText xml:space="preserve"> PAGEREF _Toc242389645 \h </w:instrText>
+          <w:instrText xml:space="preserve"> PAGEREF _Toc242797205 \h </w:instrText>
         </w:r>
         <w:r>
           <w:rPr>
@@ -1922,7 +1922,7 @@
           <w14:ligatures w14:val="standardContextual"/>
         </w:rPr>
       </w:pPr>
-      <w:hyperlink w:anchor="_Toc242389646" w:history="1">
+      <w:hyperlink w:anchor="_Toc242797206" w:history="1">
         <w:r>
           <w:rPr>
             <w:rStyle w:val="Hyperlink"/>
@@ -1949,7 +1949,7 @@
             <w:noProof/>
             <w:webHidden/>
           </w:rPr>
-          <w:instrText xml:space="preserve"> PAGEREF _Toc242389646 \h </w:instrText>
+          <w:instrText xml:space="preserve"> PAGEREF _Toc242797206 \h </w:instrText>
         </w:r>
         <w:r>
           <w:rPr>
@@ -1994,7 +1994,7 @@
           <w14:ligatures w14:val="standardContextual"/>
         </w:rPr>
       </w:pPr>
-      <w:hyperlink w:anchor="_Toc242389647" w:history="1">
+      <w:hyperlink w:anchor="_Toc242797207" w:history="1">
         <w:r>
           <w:rPr>
             <w:rStyle w:val="Hyperlink"/>
@@ -2021,7 +2021,7 @@
             <w:noProof/>
             <w:webHidden/>
           </w:rPr>
-          <w:instrText xml:space="preserve"> PAGEREF _Toc242389647 \h </w:instrText>
+          <w:instrText xml:space="preserve"> PAGEREF _Toc242797207 \h </w:instrText>
         </w:r>
         <w:r>
           <w:rPr>
@@ -2066,7 +2066,7 @@
           <w14:ligatures w14:val="standardContextual"/>
         </w:rPr>
       </w:pPr>
-      <w:hyperlink w:anchor="_Toc242389648" w:history="1">
+      <w:hyperlink w:anchor="_Toc242797208" w:history="1">
         <w:r>
           <w:rPr>
             <w:rStyle w:val="Hyperlink"/>
@@ -2093,7 +2093,7 @@
             <w:noProof/>
             <w:webHidden/>
           </w:rPr>
-          <w:instrText xml:space="preserve"> PAGEREF _Toc242389648 \h </w:instrText>
+          <w:instrText xml:space="preserve"> PAGEREF _Toc242797208 \h </w:instrText>
         </w:r>
         <w:r>
           <w:rPr>
@@ -2138,7 +2138,7 @@
           <w14:ligatures w14:val="standardContextual"/>
         </w:rPr>
       </w:pPr>
-      <w:hyperlink w:anchor="_Toc242389649" w:history="1">
+      <w:hyperlink w:anchor="_Toc242797209" w:history="1">
         <w:r>
           <w:rPr>
             <w:rStyle w:val="Hyperlink"/>
@@ -2165,7 +2165,7 @@
             <w:noProof/>
             <w:webHidden/>
           </w:rPr>
-          <w:instrText xml:space="preserve"> PAGEREF _Toc242389649 \h </w:instrText>
+          <w:instrText xml:space="preserve"> PAGEREF _Toc242797209 \h </w:instrText>
         </w:r>
         <w:r>
           <w:rPr>
@@ -2210,7 +2210,7 @@
           <w14:ligatures w14:val="standardContextual"/>
         </w:rPr>
       </w:pPr>
-      <w:hyperlink w:anchor="_Toc242389650" w:history="1">
+      <w:hyperlink w:anchor="_Toc242797210" w:history="1">
         <w:r>
           <w:rPr>
             <w:rStyle w:val="Hyperlink"/>
@@ -2237,7 +2237,7 @@
             <w:noProof/>
             <w:webHidden/>
           </w:rPr>
-          <w:instrText xml:space="preserve"> PAGEREF _Toc242389650 \h </w:instrText>
+          <w:instrText xml:space="preserve"> PAGEREF _Toc242797210 \h </w:instrText>
         </w:r>
         <w:r>
           <w:rPr>
@@ -2282,7 +2282,7 @@
           <w14:ligatures w14:val="standardContextual"/>
         </w:rPr>
       </w:pPr>
-      <w:hyperlink w:anchor="_Toc242389651" w:history="1">
+      <w:hyperlink w:anchor="_Toc242797211" w:history="1">
         <w:r>
           <w:rPr>
             <w:rStyle w:val="Hyperlink"/>
@@ -2309,7 +2309,7 @@
             <w:noProof/>
             <w:webHidden/>
           </w:rPr>
-          <w:instrText xml:space="preserve"> PAGEREF _Toc242389651 \h </w:instrText>
+          <w:instrText xml:space="preserve"> PAGEREF _Toc242797211 \h </w:instrText>
         </w:r>
         <w:r>
           <w:rPr>
@@ -2346,40 +2346,6 @@
         <w:tabs>
           <w:tab w:val="right" w:leader="dot" w:pos="9061"/>
         </w:tabs>
-      </w:pPr>
-      <w:r>
-        <w:fldChar w:fldCharType="end"/>
-      </w:r>
-    </w:p>
-    <w:p>
-      <w:pPr>
-        <w:pageBreakBefore/>
-        <w:spacing w:line="360" w:lineRule="auto"/>
-        <w:jc w:val="center"/>
-        <w:rPr>
-          <w:rFonts w:cs="Arial"/>
-          <w:b/>
-          <w:sz w:val="24"/>
-          <w:szCs w:val="24"/>
-        </w:rPr>
-      </w:pPr>
-      <w:r>
-        <w:rPr>
-          <w:rFonts w:cs="Arial"/>
-          <w:b/>
-          <w:sz w:val="24"/>
-          <w:szCs w:val="24"/>
-        </w:rPr>
-        <w:lastRenderedPageBreak/>
-        <w:t>LISTA DE TABELAS</w:t>
-      </w:r>
-    </w:p>
-    <w:p>
-      <w:pPr>
-        <w:pStyle w:val="ndicedeilustraes"/>
-        <w:tabs>
-          <w:tab w:val="right" w:leader="dot" w:pos="9061"/>
-        </w:tabs>
         <w:rPr>
           <w:rFonts w:asciiTheme="minorHAnsi" w:eastAsiaTheme="minorEastAsia" w:hAnsiTheme="minorHAnsi"/>
           <w:noProof/>
@@ -2388,6 +2354,112 @@
           <w14:ligatures w14:val="standardContextual"/>
         </w:rPr>
       </w:pPr>
+      <w:hyperlink w:anchor="_Toc242797212" w:history="1">
+        <w:r>
+          <w:rPr>
+            <w:rStyle w:val="Hyperlink"/>
+            <w:noProof/>
+          </w:rPr>
+          <w:t>Figura 10 – Diagrama de Classes do Sistema</w:t>
+        </w:r>
+        <w:r>
+          <w:rPr>
+            <w:noProof/>
+            <w:webHidden/>
+          </w:rPr>
+          <w:tab/>
+        </w:r>
+        <w:r>
+          <w:rPr>
+            <w:noProof/>
+            <w:webHidden/>
+          </w:rPr>
+          <w:fldChar w:fldCharType="begin"/>
+        </w:r>
+        <w:r>
+          <w:rPr>
+            <w:noProof/>
+            <w:webHidden/>
+          </w:rPr>
+          <w:instrText xml:space="preserve"> PAGEREF _Toc242797212 \h </w:instrText>
+        </w:r>
+        <w:r>
+          <w:rPr>
+            <w:noProof/>
+            <w:webHidden/>
+          </w:rPr>
+        </w:r>
+        <w:r>
+          <w:rPr>
+            <w:noProof/>
+            <w:webHidden/>
+          </w:rPr>
+          <w:fldChar w:fldCharType="separate"/>
+        </w:r>
+        <w:r>
+          <w:rPr>
+            <w:noProof/>
+            <w:webHidden/>
+          </w:rPr>
+          <w:t>46</w:t>
+        </w:r>
+        <w:r>
+          <w:rPr>
+            <w:noProof/>
+            <w:webHidden/>
+          </w:rPr>
+          <w:fldChar w:fldCharType="end"/>
+        </w:r>
+      </w:hyperlink>
+    </w:p>
+    <w:p>
+      <w:pPr>
+        <w:pStyle w:val="ndicedeilustraes"/>
+        <w:tabs>
+          <w:tab w:val="right" w:leader="dot" w:pos="9061"/>
+        </w:tabs>
+      </w:pPr>
+      <w:r>
+        <w:fldChar w:fldCharType="end"/>
+      </w:r>
+    </w:p>
+    <w:p>
+      <w:pPr>
+        <w:pageBreakBefore/>
+        <w:spacing w:line="360" w:lineRule="auto"/>
+        <w:jc w:val="center"/>
+        <w:rPr>
+          <w:rFonts w:cs="Arial"/>
+          <w:b/>
+          <w:sz w:val="24"/>
+          <w:szCs w:val="24"/>
+        </w:rPr>
+      </w:pPr>
+      <w:r>
+        <w:rPr>
+          <w:rFonts w:cs="Arial"/>
+          <w:b/>
+          <w:sz w:val="24"/>
+          <w:szCs w:val="24"/>
+        </w:rPr>
+        <w:lastRenderedPageBreak/>
+        <w:t>LISTA DE TABELAS</w:t>
+      </w:r>
+    </w:p>
+    <w:p>
+      <w:pPr>
+        <w:pStyle w:val="ndicedeilustraes"/>
+        <w:tabs>
+          <w:tab w:val="right" w:leader="dot" w:pos="9061"/>
+        </w:tabs>
+        <w:rPr>
+          <w:rFonts w:asciiTheme="minorHAnsi" w:eastAsiaTheme="minorEastAsia" w:hAnsiTheme="minorHAnsi"/>
+          <w:noProof/>
+          <w:kern w:val="2"/>
+          <w:lang w:eastAsia="pt-BR"/>
+          <w14:ligatures w14:val="standardContextual"/>
+        </w:rPr>
+      </w:pPr>
       <w:r>
         <w:fldChar w:fldCharType="begin"/>
       </w:r>
@@ -2397,7 +2469,7 @@
       <w:r>
         <w:fldChar w:fldCharType="separate"/>
       </w:r>
-      <w:hyperlink w:anchor="_Toc242389652" w:history="1">
+      <w:hyperlink w:anchor="_Toc242797213" w:history="1">
         <w:r>
           <w:rPr>
             <w:rStyle w:val="Hyperlink"/>
@@ -2424,7 +2496,7 @@
             <w:noProof/>
             <w:webHidden/>
           </w:rPr>
-          <w:instrText xml:space="preserve"> PAGEREF _Toc242389652 \h </w:instrText>
+          <w:instrText xml:space="preserve"> PAGEREF _Toc242797213 \h </w:instrText>
         </w:r>
         <w:r>
           <w:rPr>
@@ -2469,7 +2541,7 @@
           <w14:ligatures w14:val="standardContextual"/>
         </w:rPr>
       </w:pPr>
-      <w:hyperlink w:anchor="_Toc242389653" w:history="1">
+      <w:hyperlink w:anchor="_Toc242797214" w:history="1">
         <w:r>
           <w:rPr>
             <w:rStyle w:val="Hyperlink"/>
@@ -2496,7 +2568,7 @@
             <w:noProof/>
             <w:webHidden/>
           </w:rPr>
-          <w:instrText xml:space="preserve"> PAGEREF _Toc242389653 \h </w:instrText>
+          <w:instrText xml:space="preserve"> PAGEREF _Toc242797214 \h </w:instrText>
         </w:r>
         <w:r>
           <w:rPr>
@@ -2541,7 +2613,7 @@
           <w14:ligatures w14:val="standardContextual"/>
         </w:rPr>
       </w:pPr>
-      <w:hyperlink w:anchor="_Toc242389654" w:history="1">
+      <w:hyperlink w:anchor="_Toc242797215" w:history="1">
         <w:r>
           <w:rPr>
             <w:rStyle w:val="Hyperlink"/>
@@ -2568,7 +2640,7 @@
             <w:noProof/>
             <w:webHidden/>
           </w:rPr>
-          <w:instrText xml:space="preserve"> PAGEREF _Toc242389654 \h </w:instrText>
+          <w:instrText xml:space="preserve"> PAGEREF _Toc242797215 \h </w:instrText>
         </w:r>
         <w:r>
           <w:rPr>
@@ -2613,7 +2685,7 @@
           <w14:ligatures w14:val="standardContextual"/>
         </w:rPr>
       </w:pPr>
-      <w:hyperlink w:anchor="_Toc242389655" w:history="1">
+      <w:hyperlink w:anchor="_Toc242797216" w:history="1">
         <w:r>
           <w:rPr>
             <w:rStyle w:val="Hyperlink"/>
@@ -2640,7 +2712,7 @@
             <w:noProof/>
             <w:webHidden/>
           </w:rPr>
-          <w:instrText xml:space="preserve"> PAGEREF _Toc242389655 \h </w:instrText>
+          <w:instrText xml:space="preserve"> PAGEREF _Toc242797216 \h </w:instrText>
         </w:r>
         <w:r>
           <w:rPr>
@@ -2685,7 +2757,7 @@
           <w14:ligatures w14:val="standardContextual"/>
         </w:rPr>
       </w:pPr>
-      <w:hyperlink w:anchor="_Toc242389656" w:history="1">
+      <w:hyperlink w:anchor="_Toc242797217" w:history="1">
         <w:r>
           <w:rPr>
             <w:rStyle w:val="Hyperlink"/>
@@ -2712,7 +2784,7 @@
             <w:noProof/>
             <w:webHidden/>
           </w:rPr>
-          <w:instrText xml:space="preserve"> PAGEREF _Toc242389656 \h </w:instrText>
+          <w:instrText xml:space="preserve"> PAGEREF _Toc242797217 \h </w:instrText>
         </w:r>
         <w:r>
           <w:rPr>
@@ -2757,7 +2829,7 @@
           <w14:ligatures w14:val="standardContextual"/>
         </w:rPr>
       </w:pPr>
-      <w:hyperlink w:anchor="_Toc242389657" w:history="1">
+      <w:hyperlink w:anchor="_Toc242797218" w:history="1">
         <w:r>
           <w:rPr>
             <w:rStyle w:val="Hyperlink"/>
@@ -2784,7 +2856,7 @@
             <w:noProof/>
             <w:webHidden/>
           </w:rPr>
-          <w:instrText xml:space="preserve"> PAGEREF _Toc242389657 \h </w:instrText>
+          <w:instrText xml:space="preserve"> PAGEREF _Toc242797218 \h </w:instrText>
         </w:r>
         <w:r>
           <w:rPr>
@@ -2829,7 +2901,7 @@
           <w14:ligatures w14:val="standardContextual"/>
         </w:rPr>
       </w:pPr>
-      <w:hyperlink w:anchor="_Toc242389658" w:history="1">
+      <w:hyperlink w:anchor="_Toc242797219" w:history="1">
         <w:r>
           <w:rPr>
             <w:rStyle w:val="Hyperlink"/>
@@ -2856,7 +2928,7 @@
             <w:noProof/>
             <w:webHidden/>
           </w:rPr>
-          <w:instrText xml:space="preserve"> PAGEREF _Toc242389658 \h </w:instrText>
+          <w:instrText xml:space="preserve"> PAGEREF _Toc242797219 \h </w:instrText>
         </w:r>
         <w:r>
           <w:rPr>
@@ -2901,7 +2973,7 @@
           <w14:ligatures w14:val="standardContextual"/>
         </w:rPr>
       </w:pPr>
-      <w:hyperlink w:anchor="_Toc242389659" w:history="1">
+      <w:hyperlink w:anchor="_Toc242797220" w:history="1">
         <w:r>
           <w:rPr>
             <w:rStyle w:val="Hyperlink"/>
@@ -2928,7 +3000,7 @@
             <w:noProof/>
             <w:webHidden/>
           </w:rPr>
-          <w:instrText xml:space="preserve"> PAGEREF _Toc242389659 \h </w:instrText>
+          <w:instrText xml:space="preserve"> PAGEREF _Toc242797220 \h </w:instrText>
         </w:r>
         <w:r>
           <w:rPr>
@@ -3484,7 +3556,7 @@
             </w:rPr>
             <w:fldChar w:fldCharType="separate"/>
           </w:r>
-          <w:hyperlink w:anchor="_Toc242389660" w:history="1">
+          <w:hyperlink w:anchor="_Toc242797221" w:history="1">
             <w:r>
               <w:rPr>
                 <w:rStyle w:val="Hyperlink"/>
@@ -3507,7 +3579,7 @@
               <w:rPr>
                 <w:webHidden/>
               </w:rPr>
-              <w:instrText xml:space="preserve"> PAGEREF _Toc242389660 \h </w:instrText>
+              <w:instrText xml:space="preserve"> PAGEREF _Toc242797221 \h </w:instrText>
             </w:r>
             <w:r>
               <w:rPr>
@@ -3550,7 +3622,7 @@
               <w14:ligatures w14:val="standardContextual"/>
             </w:rPr>
           </w:pPr>
-          <w:hyperlink w:anchor="_Toc242389661" w:history="1">
+          <w:hyperlink w:anchor="_Toc242797222" w:history="1">
             <w:r>
               <w:rPr>
                 <w:rStyle w:val="Hyperlink"/>
@@ -3578,7 +3650,7 @@
                 <w:noProof/>
                 <w:webHidden/>
               </w:rPr>
-              <w:instrText xml:space="preserve"> PAGEREF _Toc242389661 \h </w:instrText>
+              <w:instrText xml:space="preserve"> PAGEREF _Toc242797222 \h </w:instrText>
             </w:r>
             <w:r>
               <w:rPr>
@@ -3625,7 +3697,7 @@
               <w14:ligatures w14:val="standardContextual"/>
             </w:rPr>
           </w:pPr>
-          <w:hyperlink w:anchor="_Toc242389662" w:history="1">
+          <w:hyperlink w:anchor="_Toc242797223" w:history="1">
             <w:r>
               <w:rPr>
                 <w:rStyle w:val="Hyperlink"/>
@@ -3653,7 +3725,7 @@
                 <w:noProof/>
                 <w:webHidden/>
               </w:rPr>
-              <w:instrText xml:space="preserve"> PAGEREF _Toc242389662 \h </w:instrText>
+              <w:instrText xml:space="preserve"> PAGEREF _Toc242797223 \h </w:instrText>
             </w:r>
             <w:r>
               <w:rPr>
@@ -3700,7 +3772,7 @@
               <w14:ligatures w14:val="standardContextual"/>
             </w:rPr>
           </w:pPr>
-          <w:hyperlink w:anchor="_Toc242389663" w:history="1">
+          <w:hyperlink w:anchor="_Toc242797224" w:history="1">
             <w:r>
               <w:rPr>
                 <w:rStyle w:val="Hyperlink"/>
@@ -3728,7 +3800,7 @@
                 <w:noProof/>
                 <w:webHidden/>
               </w:rPr>
-              <w:instrText xml:space="preserve"> PAGEREF _Toc242389663 \h </w:instrText>
+              <w:instrText xml:space="preserve"> PAGEREF _Toc242797224 \h </w:instrText>
             </w:r>
             <w:r>
               <w:rPr>
@@ -3775,7 +3847,7 @@
               <w14:ligatures w14:val="standardContextual"/>
             </w:rPr>
           </w:pPr>
-          <w:hyperlink w:anchor="_Toc242389664" w:history="1">
+          <w:hyperlink w:anchor="_Toc242797225" w:history="1">
             <w:r>
               <w:rPr>
                 <w:rStyle w:val="Hyperlink"/>
@@ -3802,7 +3874,7 @@
                 <w:noProof/>
                 <w:webHidden/>
               </w:rPr>
-              <w:instrText xml:space="preserve"> PAGEREF _Toc242389664 \h </w:instrText>
+              <w:instrText xml:space="preserve"> PAGEREF _Toc242797225 \h </w:instrText>
             </w:r>
             <w:r>
               <w:rPr>
@@ -3849,7 +3921,7 @@
               <w14:ligatures w14:val="standardContextual"/>
             </w:rPr>
           </w:pPr>
-          <w:hyperlink w:anchor="_Toc242389665" w:history="1">
+          <w:hyperlink w:anchor="_Toc242797226" w:history="1">
             <w:r>
               <w:rPr>
                 <w:rStyle w:val="Hyperlink"/>
@@ -3876,7 +3948,7 @@
                 <w:noProof/>
                 <w:webHidden/>
               </w:rPr>
-              <w:instrText xml:space="preserve"> PAGEREF _Toc242389665 \h </w:instrText>
+              <w:instrText xml:space="preserve"> PAGEREF _Toc242797226 \h </w:instrText>
             </w:r>
             <w:r>
               <w:rPr>
@@ -3923,7 +3995,7 @@
               <w14:ligatures w14:val="standardContextual"/>
             </w:rPr>
           </w:pPr>
-          <w:hyperlink w:anchor="_Toc242389666" w:history="1">
+          <w:hyperlink w:anchor="_Toc242797227" w:history="1">
             <w:r>
               <w:rPr>
                 <w:rStyle w:val="Hyperlink"/>
@@ -3951,7 +4023,7 @@
                 <w:noProof/>
                 <w:webHidden/>
               </w:rPr>
-              <w:instrText xml:space="preserve"> PAGEREF _Toc242389666 \h </w:instrText>
+              <w:instrText xml:space="preserve"> PAGEREF _Toc242797227 \h </w:instrText>
             </w:r>
             <w:r>
               <w:rPr>
@@ -3998,7 +4070,7 @@
               <w14:ligatures w14:val="standardContextual"/>
             </w:rPr>
           </w:pPr>
-          <w:hyperlink w:anchor="_Toc242389667" w:history="1">
+          <w:hyperlink w:anchor="_Toc242797228" w:history="1">
             <w:r>
               <w:rPr>
                 <w:rStyle w:val="Hyperlink"/>
@@ -4026,7 +4098,7 @@
                 <w:noProof/>
                 <w:webHidden/>
               </w:rPr>
-              <w:instrText xml:space="preserve"> PAGEREF _Toc242389667 \h </w:instrText>
+              <w:instrText xml:space="preserve"> PAGEREF _Toc242797228 \h </w:instrText>
             </w:r>
             <w:r>
               <w:rPr>
@@ -4070,7 +4142,7 @@
               <w14:ligatures w14:val="standardContextual"/>
             </w:rPr>
           </w:pPr>
-          <w:hyperlink w:anchor="_Toc242389668" w:history="1">
+          <w:hyperlink w:anchor="_Toc242797229" w:history="1">
             <w:r>
               <w:rPr>
                 <w:rStyle w:val="Hyperlink"/>
@@ -4093,7 +4165,7 @@
               <w:rPr>
                 <w:webHidden/>
               </w:rPr>
-              <w:instrText xml:space="preserve"> PAGEREF _Toc242389668 \h </w:instrText>
+              <w:instrText xml:space="preserve"> PAGEREF _Toc242797229 \h </w:instrText>
             </w:r>
             <w:r>
               <w:rPr>
@@ -4136,7 +4208,7 @@
               <w14:ligatures w14:val="standardContextual"/>
             </w:rPr>
           </w:pPr>
-          <w:hyperlink w:anchor="_Toc242389669" w:history="1">
+          <w:hyperlink w:anchor="_Toc242797230" w:history="1">
             <w:r>
               <w:rPr>
                 <w:rStyle w:val="Hyperlink"/>
@@ -4164,7 +4236,7 @@
                 <w:noProof/>
                 <w:webHidden/>
               </w:rPr>
-              <w:instrText xml:space="preserve"> PAGEREF _Toc242389669 \h </w:instrText>
+              <w:instrText xml:space="preserve"> PAGEREF _Toc242797230 \h </w:instrText>
             </w:r>
             <w:r>
               <w:rPr>
@@ -4211,7 +4283,7 @@
               <w14:ligatures w14:val="standardContextual"/>
             </w:rPr>
           </w:pPr>
-          <w:hyperlink w:anchor="_Toc242389670" w:history="1">
+          <w:hyperlink w:anchor="_Toc242797231" w:history="1">
             <w:r>
               <w:rPr>
                 <w:rStyle w:val="Hyperlink"/>
@@ -4239,7 +4311,7 @@
                 <w:noProof/>
                 <w:webHidden/>
               </w:rPr>
-              <w:instrText xml:space="preserve"> PAGEREF _Toc242389670 \h </w:instrText>
+              <w:instrText xml:space="preserve"> PAGEREF _Toc242797231 \h </w:instrText>
             </w:r>
             <w:r>
               <w:rPr>
@@ -4286,7 +4358,7 @@
               <w14:ligatures w14:val="standardContextual"/>
             </w:rPr>
           </w:pPr>
-          <w:hyperlink w:anchor="_Toc242389671" w:history="1">
+          <w:hyperlink w:anchor="_Toc242797232" w:history="1">
             <w:r>
               <w:rPr>
                 <w:rStyle w:val="Hyperlink"/>
@@ -4314,7 +4386,7 @@
                 <w:noProof/>
                 <w:webHidden/>
               </w:rPr>
-              <w:instrText xml:space="preserve"> PAGEREF _Toc242389671 \h </w:instrText>
+              <w:instrText xml:space="preserve"> PAGEREF _Toc242797232 \h </w:instrText>
             </w:r>
             <w:r>
               <w:rPr>
@@ -4361,7 +4433,7 @@
               <w14:ligatures w14:val="standardContextual"/>
             </w:rPr>
           </w:pPr>
-          <w:hyperlink w:anchor="_Toc242389672" w:history="1">
+          <w:hyperlink w:anchor="_Toc242797233" w:history="1">
             <w:r>
               <w:rPr>
                 <w:rStyle w:val="Hyperlink"/>
@@ -4389,7 +4461,7 @@
                 <w:noProof/>
                 <w:webHidden/>
               </w:rPr>
-              <w:instrText xml:space="preserve"> PAGEREF _Toc242389672 \h </w:instrText>
+              <w:instrText xml:space="preserve"> PAGEREF _Toc242797233 \h </w:instrText>
             </w:r>
             <w:r>
               <w:rPr>
@@ -4436,7 +4508,7 @@
               <w14:ligatures w14:val="standardContextual"/>
             </w:rPr>
           </w:pPr>
-          <w:hyperlink w:anchor="_Toc242389673" w:history="1">
+          <w:hyperlink w:anchor="_Toc242797234" w:history="1">
             <w:r>
               <w:rPr>
                 <w:rStyle w:val="Hyperlink"/>
@@ -4465,7 +4537,7 @@
                 <w:noProof/>
                 <w:webHidden/>
               </w:rPr>
-              <w:instrText xml:space="preserve"> PAGEREF _Toc242389673 \h </w:instrText>
+              <w:instrText xml:space="preserve"> PAGEREF _Toc242797234 \h </w:instrText>
             </w:r>
             <w:r>
               <w:rPr>
@@ -4512,7 +4584,7 @@
               <w14:ligatures w14:val="standardContextual"/>
             </w:rPr>
           </w:pPr>
-          <w:hyperlink w:anchor="_Toc242389674" w:history="1">
+          <w:hyperlink w:anchor="_Toc242797235" w:history="1">
             <w:r>
               <w:rPr>
                 <w:rStyle w:val="Hyperlink"/>
@@ -4540,7 +4612,7 @@
                 <w:noProof/>
                 <w:webHidden/>
               </w:rPr>
-              <w:instrText xml:space="preserve"> PAGEREF _Toc242389674 \h </w:instrText>
+              <w:instrText xml:space="preserve"> PAGEREF _Toc242797235 \h </w:instrText>
             </w:r>
             <w:r>
               <w:rPr>
@@ -4587,7 +4659,7 @@
               <w14:ligatures w14:val="standardContextual"/>
             </w:rPr>
           </w:pPr>
-          <w:hyperlink w:anchor="_Toc242389675" w:history="1">
+          <w:hyperlink w:anchor="_Toc242797236" w:history="1">
             <w:r>
               <w:rPr>
                 <w:rStyle w:val="Hyperlink"/>
@@ -4615,7 +4687,7 @@
                 <w:noProof/>
                 <w:webHidden/>
               </w:rPr>
-              <w:instrText xml:space="preserve"> PAGEREF _Toc242389675 \h </w:instrText>
+              <w:instrText xml:space="preserve"> PAGEREF _Toc242797236 \h </w:instrText>
             </w:r>
             <w:r>
               <w:rPr>
@@ -4662,7 +4734,7 @@
               <w14:ligatures w14:val="standardContextual"/>
             </w:rPr>
           </w:pPr>
-          <w:hyperlink w:anchor="_Toc242389676" w:history="1">
+          <w:hyperlink w:anchor="_Toc242797237" w:history="1">
             <w:r>
               <w:rPr>
                 <w:rStyle w:val="Hyperlink"/>
@@ -4690,7 +4762,7 @@
                 <w:noProof/>
                 <w:webHidden/>
               </w:rPr>
-              <w:instrText xml:space="preserve"> PAGEREF _Toc242389676 \h </w:instrText>
+              <w:instrText xml:space="preserve"> PAGEREF _Toc242797237 \h </w:instrText>
             </w:r>
             <w:r>
               <w:rPr>
@@ -4737,7 +4809,7 @@
               <w14:ligatures w14:val="standardContextual"/>
             </w:rPr>
           </w:pPr>
-          <w:hyperlink w:anchor="_Toc242389677" w:history="1">
+          <w:hyperlink w:anchor="_Toc242797238" w:history="1">
             <w:r>
               <w:rPr>
                 <w:rStyle w:val="Hyperlink"/>
@@ -4764,7 +4836,7 @@
                 <w:noProof/>
                 <w:webHidden/>
               </w:rPr>
-              <w:instrText xml:space="preserve"> PAGEREF _Toc242389677 \h </w:instrText>
+              <w:instrText xml:space="preserve"> PAGEREF _Toc242797238 \h </w:instrText>
             </w:r>
             <w:r>
               <w:rPr>
@@ -4808,7 +4880,7 @@
               <w14:ligatures w14:val="standardContextual"/>
             </w:rPr>
           </w:pPr>
-          <w:hyperlink w:anchor="_Toc242389678" w:history="1">
+          <w:hyperlink w:anchor="_Toc242797239" w:history="1">
             <w:r>
               <w:rPr>
                 <w:rStyle w:val="Hyperlink"/>
@@ -4831,7 +4903,7 @@
               <w:rPr>
                 <w:webHidden/>
               </w:rPr>
-              <w:instrText xml:space="preserve"> PAGEREF _Toc242389678 \h </w:instrText>
+              <w:instrText xml:space="preserve"> PAGEREF _Toc242797239 \h </w:instrText>
             </w:r>
             <w:r>
               <w:rPr>
@@ -4874,7 +4946,7 @@
               <w14:ligatures w14:val="standardContextual"/>
             </w:rPr>
           </w:pPr>
-          <w:hyperlink w:anchor="_Toc242389679" w:history="1">
+          <w:hyperlink w:anchor="_Toc242797240" w:history="1">
             <w:r>
               <w:rPr>
                 <w:rStyle w:val="Hyperlink"/>
@@ -4902,7 +4974,7 @@
                 <w:noProof/>
                 <w:webHidden/>
               </w:rPr>
-              <w:instrText xml:space="preserve"> PAGEREF _Toc242389679 \h </w:instrText>
+              <w:instrText xml:space="preserve"> PAGEREF _Toc242797240 \h </w:instrText>
             </w:r>
             <w:r>
               <w:rPr>
@@ -4949,7 +5021,7 @@
               <w14:ligatures w14:val="standardContextual"/>
             </w:rPr>
           </w:pPr>
-          <w:hyperlink w:anchor="_Toc242389680" w:history="1">
+          <w:hyperlink w:anchor="_Toc242797241" w:history="1">
             <w:r>
               <w:rPr>
                 <w:rStyle w:val="Hyperlink"/>
@@ -4976,7 +5048,7 @@
                 <w:noProof/>
                 <w:webHidden/>
               </w:rPr>
-              <w:instrText xml:space="preserve"> PAGEREF _Toc242389680 \h </w:instrText>
+              <w:instrText xml:space="preserve"> PAGEREF _Toc242797241 \h </w:instrText>
             </w:r>
             <w:r>
               <w:rPr>
@@ -5023,7 +5095,7 @@
               <w14:ligatures w14:val="standardContextual"/>
             </w:rPr>
           </w:pPr>
-          <w:hyperlink w:anchor="_Toc242389681" w:history="1">
+          <w:hyperlink w:anchor="_Toc242797242" w:history="1">
             <w:r>
               <w:rPr>
                 <w:rStyle w:val="Hyperlink"/>
@@ -5050,7 +5122,7 @@
                 <w:noProof/>
                 <w:webHidden/>
               </w:rPr>
-              <w:instrText xml:space="preserve"> PAGEREF _Toc242389681 \h </w:instrText>
+              <w:instrText xml:space="preserve"> PAGEREF _Toc242797242 \h </w:instrText>
             </w:r>
             <w:r>
               <w:rPr>
@@ -5097,7 +5169,7 @@
               <w14:ligatures w14:val="standardContextual"/>
             </w:rPr>
           </w:pPr>
-          <w:hyperlink w:anchor="_Toc242389682" w:history="1">
+          <w:hyperlink w:anchor="_Toc242797243" w:history="1">
             <w:r>
               <w:rPr>
                 <w:rStyle w:val="Hyperlink"/>
@@ -5124,7 +5196,7 @@
                 <w:noProof/>
                 <w:webHidden/>
               </w:rPr>
-              <w:instrText xml:space="preserve"> PAGEREF _Toc242389682 \h </w:instrText>
+              <w:instrText xml:space="preserve"> PAGEREF _Toc242797243 \h </w:instrText>
             </w:r>
             <w:r>
               <w:rPr>
@@ -5171,7 +5243,7 @@
               <w14:ligatures w14:val="standardContextual"/>
             </w:rPr>
           </w:pPr>
-          <w:hyperlink w:anchor="_Toc242389683" w:history="1">
+          <w:hyperlink w:anchor="_Toc242797244" w:history="1">
             <w:r>
               <w:rPr>
                 <w:rStyle w:val="Hyperlink"/>
@@ -5198,7 +5270,7 @@
                 <w:noProof/>
                 <w:webHidden/>
               </w:rPr>
-              <w:instrText xml:space="preserve"> PAGEREF _Toc242389683 \h </w:instrText>
+              <w:instrText xml:space="preserve"> PAGEREF _Toc242797244 \h </w:instrText>
             </w:r>
             <w:r>
               <w:rPr>
@@ -5245,7 +5317,7 @@
               <w14:ligatures w14:val="standardContextual"/>
             </w:rPr>
           </w:pPr>
-          <w:hyperlink w:anchor="_Toc242389684" w:history="1">
+          <w:hyperlink w:anchor="_Toc242797245" w:history="1">
             <w:r>
               <w:rPr>
                 <w:rStyle w:val="Hyperlink"/>
@@ -5272,7 +5344,7 @@
                 <w:noProof/>
                 <w:webHidden/>
               </w:rPr>
-              <w:instrText xml:space="preserve"> PAGEREF _Toc242389684 \h </w:instrText>
+              <w:instrText xml:space="preserve"> PAGEREF _Toc242797245 \h </w:instrText>
             </w:r>
             <w:r>
               <w:rPr>
@@ -5319,7 +5391,7 @@
               <w14:ligatures w14:val="standardContextual"/>
             </w:rPr>
           </w:pPr>
-          <w:hyperlink w:anchor="_Toc242389685" w:history="1">
+          <w:hyperlink w:anchor="_Toc242797246" w:history="1">
             <w:r>
               <w:rPr>
                 <w:rStyle w:val="Hyperlink"/>
@@ -5346,7 +5418,7 @@
                 <w:noProof/>
                 <w:webHidden/>
               </w:rPr>
-              <w:instrText xml:space="preserve"> PAGEREF _Toc242389685 \h </w:instrText>
+              <w:instrText xml:space="preserve"> PAGEREF _Toc242797246 \h </w:instrText>
             </w:r>
             <w:r>
               <w:rPr>
@@ -5390,7 +5462,7 @@
               <w14:ligatures w14:val="standardContextual"/>
             </w:rPr>
           </w:pPr>
-          <w:hyperlink w:anchor="_Toc242389686" w:history="1">
+          <w:hyperlink w:anchor="_Toc242797247" w:history="1">
             <w:r>
               <w:rPr>
                 <w:rStyle w:val="Hyperlink"/>
@@ -5413,7 +5485,7 @@
               <w:rPr>
                 <w:webHidden/>
               </w:rPr>
-              <w:instrText xml:space="preserve"> PAGEREF _Toc242389686 \h </w:instrText>
+              <w:instrText xml:space="preserve"> PAGEREF _Toc242797247 \h </w:instrText>
             </w:r>
             <w:r>
               <w:rPr>
@@ -5456,7 +5528,7 @@
               <w14:ligatures w14:val="standardContextual"/>
             </w:rPr>
           </w:pPr>
-          <w:hyperlink w:anchor="_Toc242389687" w:history="1">
+          <w:hyperlink w:anchor="_Toc242797248" w:history="1">
             <w:r>
               <w:rPr>
                 <w:rStyle w:val="Hyperlink"/>
@@ -5483,7 +5555,7 @@
                 <w:noProof/>
                 <w:webHidden/>
               </w:rPr>
-              <w:instrText xml:space="preserve"> PAGEREF _Toc242389687 \h </w:instrText>
+              <w:instrText xml:space="preserve"> PAGEREF _Toc242797248 \h </w:instrText>
             </w:r>
             <w:r>
               <w:rPr>
@@ -5530,7 +5602,7 @@
               <w14:ligatures w14:val="standardContextual"/>
             </w:rPr>
           </w:pPr>
-          <w:hyperlink w:anchor="_Toc242389688" w:history="1">
+          <w:hyperlink w:anchor="_Toc242797249" w:history="1">
             <w:r>
               <w:rPr>
                 <w:rStyle w:val="Hyperlink"/>
@@ -5557,7 +5629,7 @@
                 <w:noProof/>
                 <w:webHidden/>
               </w:rPr>
-              <w:instrText xml:space="preserve"> PAGEREF _Toc242389688 \h </w:instrText>
+              <w:instrText xml:space="preserve"> PAGEREF _Toc242797249 \h </w:instrText>
             </w:r>
             <w:r>
               <w:rPr>
@@ -5604,7 +5676,7 @@
               <w14:ligatures w14:val="standardContextual"/>
             </w:rPr>
           </w:pPr>
-          <w:hyperlink w:anchor="_Toc242389689" w:history="1">
+          <w:hyperlink w:anchor="_Toc242797250" w:history="1">
             <w:r>
               <w:rPr>
                 <w:rStyle w:val="Hyperlink"/>
@@ -5631,7 +5703,7 @@
                 <w:noProof/>
                 <w:webHidden/>
               </w:rPr>
-              <w:instrText xml:space="preserve"> PAGEREF _Toc242389689 \h </w:instrText>
+              <w:instrText xml:space="preserve"> PAGEREF _Toc242797250 \h </w:instrText>
             </w:r>
             <w:r>
               <w:rPr>
@@ -5678,7 +5750,7 @@
               <w14:ligatures w14:val="standardContextual"/>
             </w:rPr>
           </w:pPr>
-          <w:hyperlink w:anchor="_Toc242389690" w:history="1">
+          <w:hyperlink w:anchor="_Toc242797251" w:history="1">
             <w:r>
               <w:rPr>
                 <w:rStyle w:val="Hyperlink"/>
@@ -5705,7 +5777,7 @@
                 <w:noProof/>
                 <w:webHidden/>
               </w:rPr>
-              <w:instrText xml:space="preserve"> PAGEREF _Toc242389690 \h </w:instrText>
+              <w:instrText xml:space="preserve"> PAGEREF _Toc242797251 \h </w:instrText>
             </w:r>
             <w:r>
               <w:rPr>
@@ -5752,7 +5824,7 @@
               <w14:ligatures w14:val="standardContextual"/>
             </w:rPr>
           </w:pPr>
-          <w:hyperlink w:anchor="_Toc242389691" w:history="1">
+          <w:hyperlink w:anchor="_Toc242797252" w:history="1">
             <w:r>
               <w:rPr>
                 <w:rStyle w:val="Hyperlink"/>
@@ -5779,7 +5851,7 @@
                 <w:noProof/>
                 <w:webHidden/>
               </w:rPr>
-              <w:instrText xml:space="preserve"> PAGEREF _Toc242389691 \h </w:instrText>
+              <w:instrText xml:space="preserve"> PAGEREF _Toc242797252 \h </w:instrText>
             </w:r>
             <w:r>
               <w:rPr>
@@ -5826,7 +5898,7 @@
               <w14:ligatures w14:val="standardContextual"/>
             </w:rPr>
           </w:pPr>
-          <w:hyperlink w:anchor="_Toc242389692" w:history="1">
+          <w:hyperlink w:anchor="_Toc242797253" w:history="1">
             <w:r>
               <w:rPr>
                 <w:rStyle w:val="Hyperlink"/>
@@ -5853,7 +5925,7 @@
                 <w:noProof/>
                 <w:webHidden/>
               </w:rPr>
-              <w:instrText xml:space="preserve"> PAGEREF _Toc242389692 \h </w:instrText>
+              <w:instrText xml:space="preserve"> PAGEREF _Toc242797253 \h </w:instrText>
             </w:r>
             <w:r>
               <w:rPr>
@@ -5900,7 +5972,7 @@
               <w14:ligatures w14:val="standardContextual"/>
             </w:rPr>
           </w:pPr>
-          <w:hyperlink w:anchor="_Toc242389693" w:history="1">
+          <w:hyperlink w:anchor="_Toc242797254" w:history="1">
             <w:r>
               <w:rPr>
                 <w:rStyle w:val="Hyperlink"/>
@@ -5927,7 +5999,7 @@
                 <w:noProof/>
                 <w:webHidden/>
               </w:rPr>
-              <w:instrText xml:space="preserve"> PAGEREF _Toc242389693 \h </w:instrText>
+              <w:instrText xml:space="preserve"> PAGEREF _Toc242797254 \h </w:instrText>
             </w:r>
             <w:r>
               <w:rPr>
@@ -5974,7 +6046,7 @@
               <w14:ligatures w14:val="standardContextual"/>
             </w:rPr>
           </w:pPr>
-          <w:hyperlink w:anchor="_Toc242389694" w:history="1">
+          <w:hyperlink w:anchor="_Toc242797255" w:history="1">
             <w:r>
               <w:rPr>
                 <w:rStyle w:val="Hyperlink"/>
@@ -6001,7 +6073,7 @@
                 <w:noProof/>
                 <w:webHidden/>
               </w:rPr>
-              <w:instrText xml:space="preserve"> PAGEREF _Toc242389694 \h </w:instrText>
+              <w:instrText xml:space="preserve"> PAGEREF _Toc242797255 \h </w:instrText>
             </w:r>
             <w:r>
               <w:rPr>
@@ -6048,7 +6120,7 @@
               <w14:ligatures w14:val="standardContextual"/>
             </w:rPr>
           </w:pPr>
-          <w:hyperlink w:anchor="_Toc242389695" w:history="1">
+          <w:hyperlink w:anchor="_Toc242797256" w:history="1">
             <w:r>
               <w:rPr>
                 <w:rStyle w:val="Hyperlink"/>
@@ -6075,7 +6147,7 @@
                 <w:noProof/>
                 <w:webHidden/>
               </w:rPr>
-              <w:instrText xml:space="preserve"> PAGEREF _Toc242389695 \h </w:instrText>
+              <w:instrText xml:space="preserve"> PAGEREF _Toc242797256 \h </w:instrText>
             </w:r>
             <w:r>
               <w:rPr>
@@ -6122,7 +6194,7 @@
               <w14:ligatures w14:val="standardContextual"/>
             </w:rPr>
           </w:pPr>
-          <w:hyperlink w:anchor="_Toc242389696" w:history="1">
+          <w:hyperlink w:anchor="_Toc242797257" w:history="1">
             <w:r>
               <w:rPr>
                 <w:rStyle w:val="Hyperlink"/>
@@ -6149,7 +6221,7 @@
                 <w:noProof/>
                 <w:webHidden/>
               </w:rPr>
-              <w:instrText xml:space="preserve"> PAGEREF _Toc242389696 \h </w:instrText>
+              <w:instrText xml:space="preserve"> PAGEREF _Toc242797257 \h </w:instrText>
             </w:r>
             <w:r>
               <w:rPr>
@@ -6196,7 +6268,7 @@
               <w14:ligatures w14:val="standardContextual"/>
             </w:rPr>
           </w:pPr>
-          <w:hyperlink w:anchor="_Toc242389697" w:history="1">
+          <w:hyperlink w:anchor="_Toc242797258" w:history="1">
             <w:r>
               <w:rPr>
                 <w:rStyle w:val="Hyperlink"/>
@@ -6223,7 +6295,7 @@
                 <w:noProof/>
                 <w:webHidden/>
               </w:rPr>
-              <w:instrText xml:space="preserve"> PAGEREF _Toc242389697 \h </w:instrText>
+              <w:instrText xml:space="preserve"> PAGEREF _Toc242797258 \h </w:instrText>
             </w:r>
             <w:r>
               <w:rPr>
@@ -6270,7 +6342,7 @@
               <w14:ligatures w14:val="standardContextual"/>
             </w:rPr>
           </w:pPr>
-          <w:hyperlink w:anchor="_Toc242389698" w:history="1">
+          <w:hyperlink w:anchor="_Toc242797259" w:history="1">
             <w:r>
               <w:rPr>
                 <w:rStyle w:val="Hyperlink"/>
@@ -6297,7 +6369,7 @@
                 <w:noProof/>
                 <w:webHidden/>
               </w:rPr>
-              <w:instrText xml:space="preserve"> PAGEREF _Toc242389698 \h </w:instrText>
+              <w:instrText xml:space="preserve"> PAGEREF _Toc242797259 \h </w:instrText>
             </w:r>
             <w:r>
               <w:rPr>
@@ -6344,7 +6416,7 @@
               <w14:ligatures w14:val="standardContextual"/>
             </w:rPr>
           </w:pPr>
-          <w:hyperlink w:anchor="_Toc242389699" w:history="1">
+          <w:hyperlink w:anchor="_Toc242797260" w:history="1">
             <w:r>
               <w:rPr>
                 <w:rStyle w:val="Hyperlink"/>
@@ -6371,7 +6443,7 @@
                 <w:noProof/>
                 <w:webHidden/>
               </w:rPr>
-              <w:instrText xml:space="preserve"> PAGEREF _Toc242389699 \h </w:instrText>
+              <w:instrText xml:space="preserve"> PAGEREF _Toc242797260 \h </w:instrText>
             </w:r>
             <w:r>
               <w:rPr>
@@ -6415,7 +6487,7 @@
               <w14:ligatures w14:val="standardContextual"/>
             </w:rPr>
           </w:pPr>
-          <w:hyperlink w:anchor="_Toc242389700" w:history="1">
+          <w:hyperlink w:anchor="_Toc242797261" w:history="1">
             <w:r>
               <w:rPr>
                 <w:rStyle w:val="Hyperlink"/>
@@ -6438,7 +6510,7 @@
               <w:rPr>
                 <w:webHidden/>
               </w:rPr>
-              <w:instrText xml:space="preserve"> PAGEREF _Toc242389700 \h </w:instrText>
+              <w:instrText xml:space="preserve"> PAGEREF _Toc242797261 \h </w:instrText>
             </w:r>
             <w:r>
               <w:rPr>
@@ -6481,7 +6553,7 @@
               <w14:ligatures w14:val="standardContextual"/>
             </w:rPr>
           </w:pPr>
-          <w:hyperlink w:anchor="_Toc242389701" w:history="1">
+          <w:hyperlink w:anchor="_Toc242797262" w:history="1">
             <w:r>
               <w:rPr>
                 <w:rStyle w:val="Hyperlink"/>
@@ -6508,7 +6580,7 @@
                 <w:noProof/>
                 <w:webHidden/>
               </w:rPr>
-              <w:instrText xml:space="preserve"> PAGEREF _Toc242389701 \h </w:instrText>
+              <w:instrText xml:space="preserve"> PAGEREF _Toc242797262 \h </w:instrText>
             </w:r>
             <w:r>
               <w:rPr>
@@ -6529,6 +6601,80 @@
                 <w:webHidden/>
               </w:rPr>
               <w:t>42</w:t>
+            </w:r>
+            <w:r>
+              <w:rPr>
+                <w:noProof/>
+                <w:webHidden/>
+              </w:rPr>
+              <w:fldChar w:fldCharType="end"/>
+            </w:r>
+          </w:hyperlink>
+        </w:p>
+        <w:p>
+          <w:pPr>
+            <w:pStyle w:val="Sumrio2"/>
+            <w:tabs>
+              <w:tab w:val="right" w:leader="dot" w:pos="9061"/>
+            </w:tabs>
+            <w:rPr>
+              <w:rFonts w:asciiTheme="minorHAnsi" w:eastAsiaTheme="minorEastAsia" w:hAnsiTheme="minorHAnsi"/>
+              <w:noProof/>
+              <w:kern w:val="2"/>
+              <w:sz w:val="24"/>
+              <w:szCs w:val="24"/>
+              <w:lang w:eastAsia="pt-BR"/>
+              <w14:ligatures w14:val="standardContextual"/>
+            </w:rPr>
+          </w:pPr>
+          <w:hyperlink w:anchor="_Toc242797263" w:history="1">
+            <w:r>
+              <w:rPr>
+                <w:rStyle w:val="Hyperlink"/>
+                <w:noProof/>
+              </w:rPr>
+              <w:t>5.2 Diagrama de Classes</w:t>
+            </w:r>
+            <w:r>
+              <w:rPr>
+                <w:noProof/>
+                <w:webHidden/>
+              </w:rPr>
+              <w:tab/>
+            </w:r>
+            <w:r>
+              <w:rPr>
+                <w:noProof/>
+                <w:webHidden/>
+              </w:rPr>
+              <w:fldChar w:fldCharType="begin"/>
+            </w:r>
+            <w:r>
+              <w:rPr>
+                <w:noProof/>
+                <w:webHidden/>
+              </w:rPr>
+              <w:instrText xml:space="preserve"> PAGEREF _Toc242797263 \h </w:instrText>
+            </w:r>
+            <w:r>
+              <w:rPr>
+                <w:noProof/>
+                <w:webHidden/>
+              </w:rPr>
+            </w:r>
+            <w:r>
+              <w:rPr>
+                <w:noProof/>
+                <w:webHidden/>
+              </w:rPr>
+              <w:fldChar w:fldCharType="separate"/>
+            </w:r>
+            <w:r>
+              <w:rPr>
+                <w:noProof/>
+                <w:webHidden/>
+              </w:rPr>
+              <w:t>45</w:t>
             </w:r>
             <w:r>
               <w:rPr>
@@ -6552,7 +6698,7 @@
               <w14:ligatures w14:val="standardContextual"/>
             </w:rPr>
           </w:pPr>
-          <w:hyperlink w:anchor="_Toc242389702" w:history="1">
+          <w:hyperlink w:anchor="_Toc242797264" w:history="1">
             <w:r>
               <w:rPr>
                 <w:rStyle w:val="Hyperlink"/>
@@ -6575,7 +6721,7 @@
               <w:rPr>
                 <w:webHidden/>
               </w:rPr>
-              <w:instrText xml:space="preserve"> PAGEREF _Toc242389702 \h </w:instrText>
+              <w:instrText xml:space="preserve"> PAGEREF _Toc242797264 \h </w:instrText>
             </w:r>
             <w:r>
               <w:rPr>
@@ -6592,7 +6738,7 @@
               <w:rPr>
                 <w:webHidden/>
               </w:rPr>
-              <w:t>45</w:t>
+              <w:t>47</w:t>
             </w:r>
             <w:r>
               <w:rPr>
@@ -6639,7 +6785,7 @@
         <w:pStyle w:val="Ttulo1"/>
         <w:spacing w:after="100" w:afterAutospacing="1" w:line="360" w:lineRule="auto"/>
       </w:pPr>
-      <w:bookmarkStart w:id="0" w:name="_Toc242389660"/>
+      <w:bookmarkStart w:id="0" w:name="_Toc242797221"/>
       <w:r>
         <w:rPr>
           <w:sz w:val="24"/>
@@ -6657,7 +6803,7 @@
           <w:rFonts w:cs="Arial"/>
         </w:rPr>
       </w:pPr>
-      <w:bookmarkStart w:id="1" w:name="_Toc242389661"/>
+      <w:bookmarkStart w:id="1" w:name="_Toc242797222"/>
       <w:r>
         <w:rPr>
           <w:rFonts w:cs="Arial"/>
@@ -6755,7 +6901,7 @@
           <w:rFonts w:cs="Arial"/>
         </w:rPr>
       </w:pPr>
-      <w:bookmarkStart w:id="2" w:name="_Toc242389662"/>
+      <w:bookmarkStart w:id="2" w:name="_Toc242797223"/>
       <w:r>
         <w:rPr>
           <w:rFonts w:cs="Arial"/>
@@ -6793,7 +6939,7 @@
           <w:rFonts w:cs="Arial"/>
         </w:rPr>
       </w:pPr>
-      <w:bookmarkStart w:id="3" w:name="_Toc242389663"/>
+      <w:bookmarkStart w:id="3" w:name="_Toc242797224"/>
       <w:r>
         <w:rPr>
           <w:rFonts w:cs="Arial"/>
@@ -6808,7 +6954,7 @@
         <w:pStyle w:val="Ttulo3"/>
         <w:spacing w:before="100" w:beforeAutospacing="1" w:after="100" w:afterAutospacing="1" w:line="360" w:lineRule="auto"/>
       </w:pPr>
-      <w:bookmarkStart w:id="4" w:name="_Toc242389664"/>
+      <w:bookmarkStart w:id="4" w:name="_Toc242797225"/>
       <w:r>
         <w:t>1.3.1 Objetivo Geral</w:t>
       </w:r>
@@ -6843,7 +6989,7 @@
           <w:i/>
         </w:rPr>
       </w:pPr>
-      <w:bookmarkStart w:id="5" w:name="_Toc242389665"/>
+      <w:bookmarkStart w:id="5" w:name="_Toc242797226"/>
       <w:r>
         <w:t>1.3.2 Objetivos Específicos</w:t>
       </w:r>
@@ -7049,7 +7195,7 @@
           <w:rFonts w:cs="Arial"/>
         </w:rPr>
       </w:pPr>
-      <w:bookmarkStart w:id="6" w:name="_Toc242389666"/>
+      <w:bookmarkStart w:id="6" w:name="_Toc242797227"/>
       <w:r>
         <w:rPr>
           <w:rFonts w:cs="Arial"/>
@@ -7126,7 +7272,7 @@
           <w:rFonts w:cs="Arial"/>
         </w:rPr>
       </w:pPr>
-      <w:bookmarkStart w:id="7" w:name="_Toc242389667"/>
+      <w:bookmarkStart w:id="7" w:name="_Toc242797228"/>
       <w:r>
         <w:rPr>
           <w:rFonts w:cs="Arial"/>
@@ -7278,7 +7424,7 @@
           <w:sz w:val="24"/>
         </w:rPr>
       </w:pPr>
-      <w:bookmarkStart w:id="8" w:name="_Toc242389668"/>
+      <w:bookmarkStart w:id="8" w:name="_Toc242797229"/>
       <w:r>
         <w:rPr>
           <w:sz w:val="24"/>
@@ -7296,7 +7442,7 @@
           <w:rFonts w:cs="Arial"/>
         </w:rPr>
       </w:pPr>
-      <w:bookmarkStart w:id="9" w:name="_Toc242389669"/>
+      <w:bookmarkStart w:id="9" w:name="_Toc242797230"/>
       <w:r>
         <w:rPr>
           <w:rFonts w:cs="Arial"/>
@@ -7406,7 +7552,7 @@
           <w:rFonts w:cs="Arial"/>
         </w:rPr>
       </w:pPr>
-      <w:bookmarkStart w:id="10" w:name="_Toc242389670"/>
+      <w:bookmarkStart w:id="10" w:name="_Toc242797231"/>
       <w:r>
         <w:rPr>
           <w:rFonts w:cs="Arial"/>
@@ -7542,7 +7688,7 @@
         <w:pStyle w:val="Legenda"/>
         <w:keepNext/>
       </w:pPr>
-      <w:bookmarkStart w:id="11" w:name="_Toc242389643"/>
+      <w:bookmarkStart w:id="11" w:name="_Toc242797203"/>
       <w:r>
         <w:lastRenderedPageBreak/>
         <w:t xml:space="preserve">Figura </w:t>
@@ -7583,7 +7729,7 @@
           <w:noProof/>
         </w:rPr>
         <w:drawing>
-          <wp:inline distT="0" distB="0" distL="0" distR="0" wp14:anchorId="22737AEE" wp14:editId="433FBBC7">
+          <wp:inline distT="0" distB="0" distL="0" distR="0" wp14:anchorId="7978F728" wp14:editId="30AEA8F3">
             <wp:extent cx="5486400" cy="2022437"/>
             <wp:effectExtent l="0" t="0" r="0" b="0"/>
             <wp:docPr id="101" name="fig_gargalo"/>
@@ -7655,7 +7801,7 @@
           <w:rFonts w:cs="Arial"/>
         </w:rPr>
       </w:pPr>
-      <w:bookmarkStart w:id="12" w:name="_Toc242389671"/>
+      <w:bookmarkStart w:id="12" w:name="_Toc242797232"/>
       <w:r>
         <w:rPr>
           <w:rFonts w:cs="Arial"/>
@@ -7771,7 +7917,7 @@
         <w:pStyle w:val="Legenda"/>
         <w:keepNext/>
       </w:pPr>
-      <w:bookmarkStart w:id="13" w:name="_Toc242389644"/>
+      <w:bookmarkStart w:id="13" w:name="_Toc242797204"/>
       <w:r>
         <w:t xml:space="preserve">Figura </w:t>
       </w:r>
@@ -7811,7 +7957,7 @@
           <w:noProof/>
         </w:rPr>
         <w:drawing>
-          <wp:inline distT="0" distB="0" distL="0" distR="0" wp14:anchorId="7F13876C" wp14:editId="2B3F3B0A">
+          <wp:inline distT="0" distB="0" distL="0" distR="0" wp14:anchorId="37945003" wp14:editId="4FCE65D8">
             <wp:extent cx="5486400" cy="2051249"/>
             <wp:effectExtent l="0" t="0" r="0" b="0"/>
             <wp:docPr id="102" name="fig_nivelamento"/>
@@ -7879,7 +8025,7 @@
           <w:rFonts w:cs="Arial"/>
         </w:rPr>
       </w:pPr>
-      <w:bookmarkStart w:id="14" w:name="_Toc242389672"/>
+      <w:bookmarkStart w:id="14" w:name="_Toc242797233"/>
       <w:r>
         <w:rPr>
           <w:rFonts w:cs="Arial"/>
@@ -8000,7 +8146,7 @@
           <w:lang w:val="en-US"/>
         </w:rPr>
       </w:pPr>
-      <w:bookmarkStart w:id="15" w:name="_Toc242389673"/>
+      <w:bookmarkStart w:id="15" w:name="_Toc242797234"/>
       <w:r>
         <w:rPr>
           <w:rFonts w:cs="Arial"/>
@@ -8210,7 +8356,7 @@
         <w:pStyle w:val="Legenda"/>
         <w:keepNext/>
       </w:pPr>
-      <w:bookmarkStart w:id="16" w:name="_Toc242389645"/>
+      <w:bookmarkStart w:id="16" w:name="_Toc242797205"/>
       <w:r>
         <w:t xml:space="preserve">Figura </w:t>
       </w:r>
@@ -8250,7 +8396,7 @@
           <w:noProof/>
         </w:rPr>
         <w:drawing>
-          <wp:inline distT="0" distB="0" distL="0" distR="0" wp14:anchorId="33C8AB67" wp14:editId="34644DCF">
+          <wp:inline distT="0" distB="0" distL="0" distR="0" wp14:anchorId="3C25F8BE" wp14:editId="17C472BC">
             <wp:extent cx="5486400" cy="3543069"/>
             <wp:effectExtent l="0" t="0" r="0" b="0"/>
             <wp:docPr id="103" name="fig_mes"/>
@@ -8318,7 +8464,7 @@
           <w:rFonts w:cs="Arial"/>
         </w:rPr>
       </w:pPr>
-      <w:bookmarkStart w:id="17" w:name="_Toc242389674"/>
+      <w:bookmarkStart w:id="17" w:name="_Toc242797235"/>
       <w:r>
         <w:rPr>
           <w:rFonts w:cs="Arial"/>
@@ -8508,7 +8654,7 @@
           <w:rFonts w:cs="Arial"/>
         </w:rPr>
       </w:pPr>
-      <w:bookmarkStart w:id="18" w:name="_Toc242389675"/>
+      <w:bookmarkStart w:id="18" w:name="_Toc242797236"/>
       <w:r>
         <w:rPr>
           <w:rFonts w:cs="Arial"/>
@@ -8709,7 +8855,7 @@
         <w:pStyle w:val="Legenda"/>
         <w:keepNext/>
       </w:pPr>
-      <w:bookmarkStart w:id="19" w:name="_Toc242389646"/>
+      <w:bookmarkStart w:id="19" w:name="_Toc242797206"/>
       <w:r>
         <w:t xml:space="preserve">Figura </w:t>
       </w:r>
@@ -8749,7 +8895,7 @@
           <w:noProof/>
         </w:rPr>
         <w:drawing>
-          <wp:inline distT="0" distB="0" distL="0" distR="0" wp14:anchorId="0709CB4E" wp14:editId="1DC91F4B">
+          <wp:inline distT="0" distB="0" distL="0" distR="0" wp14:anchorId="66724460" wp14:editId="48B60BEA">
             <wp:extent cx="5486400" cy="1791916"/>
             <wp:effectExtent l="0" t="0" r="0" b="0"/>
             <wp:docPr id="104" name="fig_arq"/>
@@ -8818,7 +8964,7 @@
           <w:u w:val="single"/>
         </w:rPr>
       </w:pPr>
-      <w:bookmarkStart w:id="20" w:name="_Toc242389676"/>
+      <w:bookmarkStart w:id="20" w:name="_Toc242797237"/>
       <w:r>
         <w:rPr>
           <w:rFonts w:cs="Arial"/>
@@ -8932,7 +9078,7 @@
         <w:pStyle w:val="Ttulo2"/>
         <w:spacing w:line="360" w:lineRule="auto"/>
       </w:pPr>
-      <w:bookmarkStart w:id="21" w:name="_Toc242389677"/>
+      <w:bookmarkStart w:id="21" w:name="_Toc242797238"/>
       <w:r>
         <w:t>2.9 Considerações sobre a Utilização de Sistemas para Nivelamento de Processos</w:t>
       </w:r>
@@ -9070,7 +9216,7 @@
           <w:sz w:val="24"/>
         </w:rPr>
       </w:pPr>
-      <w:bookmarkStart w:id="22" w:name="_Toc242389678"/>
+      <w:bookmarkStart w:id="22" w:name="_Toc242797239"/>
       <w:r>
         <w:rPr>
           <w:sz w:val="24"/>
@@ -9089,7 +9235,7 @@
           <w:szCs w:val="24"/>
         </w:rPr>
       </w:pPr>
-      <w:bookmarkStart w:id="23" w:name="_Toc242389679"/>
+      <w:bookmarkStart w:id="23" w:name="_Toc242797240"/>
       <w:r>
         <w:rPr>
           <w:rFonts w:cs="Arial"/>
@@ -9195,7 +9341,7 @@
         <w:pStyle w:val="Ttulo2"/>
         <w:spacing w:line="360" w:lineRule="auto"/>
       </w:pPr>
-      <w:bookmarkStart w:id="24" w:name="_Toc242389680"/>
+      <w:bookmarkStart w:id="24" w:name="_Toc242797241"/>
       <w:r>
         <w:t>3.2 Métodos Utilizados</w:t>
       </w:r>
@@ -9465,7 +9611,7 @@
         <w:pStyle w:val="Ttulo2"/>
         <w:spacing w:before="100" w:beforeAutospacing="1" w:after="100" w:afterAutospacing="1" w:line="360" w:lineRule="auto"/>
       </w:pPr>
-      <w:bookmarkStart w:id="25" w:name="_Toc242389681"/>
+      <w:bookmarkStart w:id="25" w:name="_Toc242797242"/>
       <w:r>
         <w:t>3.3 Ferramentas e Tecnologias Utilizadas</w:t>
       </w:r>
@@ -9476,7 +9622,7 @@
         <w:pStyle w:val="Ttulo3"/>
         <w:spacing w:before="100" w:beforeAutospacing="1" w:after="100" w:afterAutospacing="1" w:line="360" w:lineRule="auto"/>
       </w:pPr>
-      <w:bookmarkStart w:id="26" w:name="_Toc242389682"/>
+      <w:bookmarkStart w:id="26" w:name="_Toc242797243"/>
       <w:r>
         <w:t>3.3.1 Linguagens de Programação</w:t>
       </w:r>
@@ -9699,7 +9845,7 @@
         <w:pStyle w:val="Ttulo3"/>
         <w:spacing w:line="360" w:lineRule="auto"/>
       </w:pPr>
-      <w:bookmarkStart w:id="27" w:name="_Toc242389683"/>
+      <w:bookmarkStart w:id="27" w:name="_Toc242797244"/>
       <w:r>
         <w:lastRenderedPageBreak/>
         <w:t>3.3.2 Framework</w:t>
@@ -9876,7 +10022,7 @@
         <w:pStyle w:val="Ttulo3"/>
         <w:spacing w:line="360" w:lineRule="auto"/>
       </w:pPr>
-      <w:bookmarkStart w:id="28" w:name="_Toc242389684"/>
+      <w:bookmarkStart w:id="28" w:name="_Toc242797245"/>
       <w:r>
         <w:t>3.3.3 Banco de Dados</w:t>
       </w:r>
@@ -9966,7 +10112,7 @@
       <w:pPr>
         <w:pStyle w:val="Ttulo2"/>
       </w:pPr>
-      <w:bookmarkStart w:id="29" w:name="_Toc242389685"/>
+      <w:bookmarkStart w:id="29" w:name="_Toc242797246"/>
       <w:r>
         <w:lastRenderedPageBreak/>
         <w:t>3.4 Etapas do Desenvolvimento</w:t>
@@ -10293,7 +10439,7 @@
           <w:sz w:val="24"/>
         </w:rPr>
       </w:pPr>
-      <w:bookmarkStart w:id="30" w:name="_Toc242389686"/>
+      <w:bookmarkStart w:id="30" w:name="_Toc242797247"/>
       <w:r>
         <w:rPr>
           <w:sz w:val="24"/>
@@ -10307,7 +10453,7 @@
       <w:pPr>
         <w:pStyle w:val="Ttulo2"/>
       </w:pPr>
-      <w:bookmarkStart w:id="31" w:name="_Toc242389687"/>
+      <w:bookmarkStart w:id="31" w:name="_Toc242797248"/>
       <w:r>
         <w:t>4.1 Descrição do Problema</w:t>
       </w:r>
@@ -10418,7 +10564,7 @@
         <w:pStyle w:val="Ttulo2"/>
         <w:spacing w:line="360" w:lineRule="auto"/>
       </w:pPr>
-      <w:bookmarkStart w:id="32" w:name="_Toc242389688"/>
+      <w:bookmarkStart w:id="32" w:name="_Toc242797249"/>
       <w:r>
         <w:lastRenderedPageBreak/>
         <w:t>4.2 Requisitos Funcionais</w:t>
@@ -10430,7 +10576,7 @@
         <w:pStyle w:val="Ttulo3"/>
         <w:spacing w:line="360" w:lineRule="auto"/>
       </w:pPr>
-      <w:bookmarkStart w:id="33" w:name="_Toc242389689"/>
+      <w:bookmarkStart w:id="33" w:name="_Toc242797250"/>
       <w:r>
         <w:t>4.2.1 Requisitos Funcionais da Tela de Login</w:t>
       </w:r>
@@ -10461,7 +10607,7 @@
         <w:pStyle w:val="Legenda"/>
         <w:keepNext/>
       </w:pPr>
-      <w:bookmarkStart w:id="34" w:name="_Toc242389652"/>
+      <w:bookmarkStart w:id="34" w:name="_Toc242797213"/>
       <w:r>
         <w:t xml:space="preserve">Tabela </w:t>
       </w:r>
@@ -10743,7 +10889,7 @@
                 <w:sz w:val="24"/>
                 <w:szCs w:val="24"/>
               </w:rPr>
-              <w:t>O sistema deve permitir que usuários realizem login utilizando e-mail e senha.</w:t>
+              <w:t>O sistema deve permitir que usuários realizem login utilizando matrícula e senha.</w:t>
             </w:r>
           </w:p>
         </w:tc>
@@ -10939,7 +11085,7 @@
                 <w:sz w:val="24"/>
                 <w:szCs w:val="24"/>
               </w:rPr>
-              <w:t>Recuperar Senha</w:t>
+              <w:t>Alterar Senha</w:t>
             </w:r>
           </w:p>
         </w:tc>
@@ -10975,7 +11121,7 @@
                 <w:sz w:val="24"/>
                 <w:szCs w:val="24"/>
               </w:rPr>
-              <w:t>O sistema deve permitir a recuperação de senha do usuário cadastrado.</w:t>
+              <w:t>O sistema deve permitir que o usuário altere a própria senha e que um administrador a redefina.</w:t>
             </w:r>
           </w:p>
         </w:tc>
@@ -11151,7 +11297,7 @@
         <w:pStyle w:val="Ttulo3"/>
         <w:spacing w:line="360" w:lineRule="auto"/>
       </w:pPr>
-      <w:bookmarkStart w:id="35" w:name="_Toc242389690"/>
+      <w:bookmarkStart w:id="35" w:name="_Toc242797251"/>
       <w:r>
         <w:lastRenderedPageBreak/>
         <w:t>4.2.2 Requisitos Funcionais da Tela de Cadastro de Setores</w:t>
@@ -11183,7 +11329,7 @@
         <w:pStyle w:val="Legenda"/>
         <w:keepNext/>
       </w:pPr>
-      <w:bookmarkStart w:id="36" w:name="_Toc242389653"/>
+      <w:bookmarkStart w:id="36" w:name="_Toc242797214"/>
       <w:r>
         <w:t xml:space="preserve">Tabela </w:t>
       </w:r>
@@ -11989,7 +12135,7 @@
         <w:pStyle w:val="Ttulo3"/>
         <w:spacing w:line="360" w:lineRule="auto"/>
       </w:pPr>
-      <w:bookmarkStart w:id="37" w:name="_Toc242389691"/>
+      <w:bookmarkStart w:id="37" w:name="_Toc242797252"/>
       <w:r>
         <w:lastRenderedPageBreak/>
         <w:t xml:space="preserve">4.2.3 Requisitos Funcionais da Tela de Cadastro de </w:t>
@@ -12024,7 +12170,7 @@
         <w:pStyle w:val="Legenda"/>
         <w:keepNext/>
       </w:pPr>
-      <w:bookmarkStart w:id="38" w:name="_Toc242389654"/>
+      <w:bookmarkStart w:id="38" w:name="_Toc242797215"/>
       <w:r>
         <w:t xml:space="preserve">Tabela </w:t>
       </w:r>
@@ -12830,7 +12976,7 @@
         <w:pStyle w:val="Ttulo3"/>
         <w:spacing w:line="360" w:lineRule="auto"/>
       </w:pPr>
-      <w:bookmarkStart w:id="39" w:name="_Toc242389692"/>
+      <w:bookmarkStart w:id="39" w:name="_Toc242797253"/>
       <w:r>
         <w:lastRenderedPageBreak/>
         <w:t>4.2.4 Requisitos Funcionais da Tela de Cadastro de Tarefas</w:t>
@@ -12862,7 +13008,7 @@
         <w:pStyle w:val="Legenda"/>
         <w:keepNext/>
       </w:pPr>
-      <w:bookmarkStart w:id="40" w:name="_Toc242389655"/>
+      <w:bookmarkStart w:id="40" w:name="_Toc242797216"/>
       <w:r>
         <w:t xml:space="preserve">Tabela </w:t>
       </w:r>
@@ -13784,7 +13930,7 @@
         <w:pStyle w:val="Ttulo3"/>
         <w:spacing w:line="360" w:lineRule="auto"/>
       </w:pPr>
-      <w:bookmarkStart w:id="41" w:name="_Toc242389693"/>
+      <w:bookmarkStart w:id="41" w:name="_Toc242797254"/>
       <w:r>
         <w:lastRenderedPageBreak/>
         <w:t>4.2.5 Requisitos Funcionais da Tela de Produtos e Ordens de Produção</w:t>
@@ -13816,7 +13962,7 @@
         <w:pStyle w:val="Legenda"/>
         <w:keepNext/>
       </w:pPr>
-      <w:bookmarkStart w:id="42" w:name="_Toc242389656"/>
+      <w:bookmarkStart w:id="42" w:name="_Toc242797217"/>
       <w:r>
         <w:t xml:space="preserve">Tabela </w:t>
       </w:r>
@@ -14622,7 +14768,7 @@
         <w:pStyle w:val="Ttulo3"/>
         <w:spacing w:line="360" w:lineRule="auto"/>
       </w:pPr>
-      <w:bookmarkStart w:id="43" w:name="_Toc242389694"/>
+      <w:bookmarkStart w:id="43" w:name="_Toc242797255"/>
       <w:r>
         <w:lastRenderedPageBreak/>
         <w:t>4.2.6 Requisitos Funcionais da Tela de Apontamento da Produção</w:t>
@@ -14654,7 +14800,7 @@
         <w:pStyle w:val="Legenda"/>
         <w:keepNext/>
       </w:pPr>
-      <w:bookmarkStart w:id="44" w:name="_Toc242389657"/>
+      <w:bookmarkStart w:id="44" w:name="_Toc242797218"/>
       <w:r>
         <w:t xml:space="preserve">Tabela </w:t>
       </w:r>
@@ -15576,7 +15722,7 @@
         <w:pStyle w:val="Ttulo3"/>
         <w:spacing w:line="360" w:lineRule="auto"/>
       </w:pPr>
-      <w:bookmarkStart w:id="45" w:name="_Toc242389695"/>
+      <w:bookmarkStart w:id="45" w:name="_Toc242797256"/>
       <w:r>
         <w:lastRenderedPageBreak/>
         <w:t>4.2.7 Requisitos Funcionais da Tela de Monitoramento da Produção</w:t>
@@ -15608,7 +15754,7 @@
         <w:pStyle w:val="Legenda"/>
         <w:keepNext/>
       </w:pPr>
-      <w:bookmarkStart w:id="46" w:name="_Toc242389658"/>
+      <w:bookmarkStart w:id="46" w:name="_Toc242797219"/>
       <w:r>
         <w:t xml:space="preserve">Tabela </w:t>
       </w:r>
@@ -16413,7 +16559,7 @@
       <w:pPr>
         <w:pStyle w:val="Ttulo2"/>
       </w:pPr>
-      <w:bookmarkStart w:id="47" w:name="_Toc242389696"/>
+      <w:bookmarkStart w:id="47" w:name="_Toc242797257"/>
       <w:r>
         <w:lastRenderedPageBreak/>
         <w:t>4.3 Requisitos Não Funcionais</w:t>
@@ -16444,7 +16590,7 @@
       <w:pPr>
         <w:pStyle w:val="Ttulo3"/>
       </w:pPr>
-      <w:bookmarkStart w:id="48" w:name="_Toc242389697"/>
+      <w:bookmarkStart w:id="48" w:name="_Toc242797258"/>
       <w:r>
         <w:t>4.3.1 Requisitos Não Funcionais do Sistema</w:t>
       </w:r>
@@ -16475,7 +16621,7 @@
         <w:pStyle w:val="Legenda"/>
         <w:keepNext/>
       </w:pPr>
-      <w:bookmarkStart w:id="49" w:name="_Toc242389659"/>
+      <w:bookmarkStart w:id="49" w:name="_Toc242797220"/>
       <w:r>
         <w:t xml:space="preserve">Tabela </w:t>
       </w:r>
@@ -17651,7 +17797,7 @@
       <w:pPr>
         <w:pStyle w:val="Ttulo2"/>
       </w:pPr>
-      <w:bookmarkStart w:id="50" w:name="_Toc242389698"/>
+      <w:bookmarkStart w:id="50" w:name="_Toc242797259"/>
       <w:r>
         <w:lastRenderedPageBreak/>
         <w:t>4.4 Prototipagem</w:t>
@@ -17960,7 +18106,7 @@
         <w:pStyle w:val="Legenda"/>
         <w:keepNext/>
       </w:pPr>
-      <w:bookmarkStart w:id="51" w:name="_Toc242389647"/>
+      <w:bookmarkStart w:id="51" w:name="_Toc242797207"/>
       <w:r>
         <w:lastRenderedPageBreak/>
         <w:t xml:space="preserve">Figura </w:t>
@@ -17999,7 +18145,7 @@
           <w:noProof/>
         </w:rPr>
         <w:drawing>
-          <wp:inline distT="0" distB="0" distL="0" distR="0" wp14:anchorId="47C23D50" wp14:editId="01B70154">
+          <wp:inline distT="0" distB="0" distL="0" distR="0" wp14:anchorId="0AF3DF36" wp14:editId="48C6CDDE">
             <wp:extent cx="5669280" cy="2894876"/>
             <wp:effectExtent l="0" t="0" r="0" b="0"/>
             <wp:docPr id="2" name="Picture 2"/>
@@ -18066,7 +18212,7 @@
         <w:pStyle w:val="Legenda"/>
         <w:keepNext/>
       </w:pPr>
-      <w:bookmarkStart w:id="52" w:name="_Toc242389648"/>
+      <w:bookmarkStart w:id="52" w:name="_Toc242797208"/>
       <w:r>
         <w:t xml:space="preserve">Figura </w:t>
       </w:r>
@@ -18110,7 +18256,7 @@
           <w:szCs w:val="18"/>
         </w:rPr>
         <w:drawing>
-          <wp:inline distT="0" distB="0" distL="0" distR="0" wp14:anchorId="64BAB021" wp14:editId="6903E02B">
+          <wp:inline distT="0" distB="0" distL="0" distR="0" wp14:anchorId="0DD4A0C8" wp14:editId="3128D80C">
             <wp:extent cx="5669280" cy="2894876"/>
             <wp:effectExtent l="0" t="0" r="0" b="0"/>
             <wp:docPr id="1" name="Picture 3"/>
@@ -18203,7 +18349,7 @@
         <w:pStyle w:val="Legenda"/>
         <w:keepNext/>
       </w:pPr>
-      <w:bookmarkStart w:id="53" w:name="_Toc242389649"/>
+      <w:bookmarkStart w:id="53" w:name="_Toc242797209"/>
       <w:r>
         <w:t xml:space="preserve">Figura </w:t>
       </w:r>
@@ -18241,7 +18387,7 @@
           <w:noProof/>
         </w:rPr>
         <w:drawing>
-          <wp:inline distT="0" distB="0" distL="0" distR="0" wp14:anchorId="54BBBDF7" wp14:editId="41739F99">
+          <wp:inline distT="0" distB="0" distL="0" distR="0" wp14:anchorId="06F51177" wp14:editId="02ABB230">
             <wp:extent cx="5669280" cy="2894876"/>
             <wp:effectExtent l="0" t="0" r="0" b="0"/>
             <wp:docPr id="201" name="Imagem 201"/>
@@ -18308,7 +18454,7 @@
         <w:pStyle w:val="Legenda"/>
         <w:keepNext/>
       </w:pPr>
-      <w:bookmarkStart w:id="54" w:name="_Toc242389650"/>
+      <w:bookmarkStart w:id="54" w:name="_Toc242797210"/>
       <w:r>
         <w:t xml:space="preserve">Figura </w:t>
       </w:r>
@@ -18346,7 +18492,7 @@
           <w:noProof/>
         </w:rPr>
         <w:drawing>
-          <wp:inline distT="0" distB="0" distL="0" distR="0" wp14:anchorId="0BBE7585" wp14:editId="24AF26FD">
+          <wp:inline distT="0" distB="0" distL="0" distR="0" wp14:anchorId="0FDF9882" wp14:editId="0FEA6822">
             <wp:extent cx="5669280" cy="2894876"/>
             <wp:effectExtent l="0" t="0" r="0" b="0"/>
             <wp:docPr id="202" name="Imagem 202"/>
@@ -18422,7 +18568,7 @@
       <w:pPr>
         <w:pStyle w:val="Ttulo2"/>
       </w:pPr>
-      <w:bookmarkStart w:id="55" w:name="_Toc242389699"/>
+      <w:bookmarkStart w:id="55" w:name="_Toc242797260"/>
       <w:r>
         <w:lastRenderedPageBreak/>
         <w:t>4.5 Possível Estrutura do Sistema</w:t>
@@ -18708,7 +18854,7 @@
           <w:sz w:val="24"/>
         </w:rPr>
       </w:pPr>
-      <w:bookmarkStart w:id="56" w:name="_Toc242389700"/>
+      <w:bookmarkStart w:id="56" w:name="_Toc242797261"/>
       <w:r>
         <w:rPr>
           <w:sz w:val="24"/>
@@ -18722,7 +18868,7 @@
       <w:pPr>
         <w:pStyle w:val="Ttulo2"/>
       </w:pPr>
-      <w:bookmarkStart w:id="57" w:name="_Toc242389701"/>
+      <w:bookmarkStart w:id="57" w:name="_Toc242797262"/>
       <w:r>
         <w:t xml:space="preserve">5.1 </w:t>
       </w:r>
@@ -19157,7 +19303,39 @@
           <w:sz w:val="24"/>
           <w:szCs w:val="24"/>
         </w:rPr>
-        <w:t>Todas as tabelas utilizam identificadores do tipo UUID como chave primária, e a maior parte delas registra as datas de criação e de atualização dos dados. O próprio banco de dados garante algumas regras, como a baixa única por etapa de cada ordem e o motivo obrigatório em toda pausa. As tabelas de usuários e de permissões de acesso não fazem parte deste diagrama, pois serão definidas em conjunto com a solução de autenticação adotada no projeto.</w:t>
+        <w:t xml:space="preserve">Todas as tabelas utilizam identificadores do tipo UUID como chave primária, e a maior parte delas registra as datas de criação e de atualização dos dados. O próprio banco de dados garante algumas regras, como a baixa única por etapa de cada ordem e o motivo obrigatório em toda pausa. A tabela </w:t>
+      </w:r>
+      <w:r>
+        <w:rPr>
+          <w:b/>
+          <w:bCs/>
+          <w:sz w:val="24"/>
+          <w:szCs w:val="24"/>
+        </w:rPr>
+        <w:t>USUARIO</w:t>
+      </w:r>
+      <w:r>
+        <w:rPr>
+          <w:sz w:val="24"/>
+          <w:szCs w:val="24"/>
+        </w:rPr>
+        <w:t xml:space="preserve"> armazena as contas de acesso ao sistema e é separada da entidade </w:t>
+      </w:r>
+      <w:r>
+        <w:rPr>
+          <w:b/>
+          <w:bCs/>
+          <w:sz w:val="24"/>
+          <w:szCs w:val="24"/>
+        </w:rPr>
+        <w:t>OPERADOR</w:t>
+      </w:r>
+      <w:r>
+        <w:rPr>
+          <w:sz w:val="24"/>
+          <w:szCs w:val="24"/>
+        </w:rPr>
+        <w:t>, pois quem acessa o sistema não é necessariamente quem realiza o apontamento.</w:t>
       </w:r>
     </w:p>
     <w:p>
@@ -19183,7 +19361,7 @@
         <w:pStyle w:val="Legenda"/>
         <w:keepNext/>
       </w:pPr>
-      <w:bookmarkStart w:id="58" w:name="_Toc242389651"/>
+      <w:bookmarkStart w:id="58" w:name="_Toc242797211"/>
       <w:r>
         <w:t xml:space="preserve">Figura </w:t>
       </w:r>
@@ -19220,8 +19398,8 @@
           <w:noProof/>
         </w:rPr>
         <w:drawing>
-          <wp:inline distT="0" distB="0" distL="0" distR="0" wp14:anchorId="6E77902C" wp14:editId="55254D81">
-            <wp:extent cx="5730167" cy="6811702"/>
+          <wp:inline distT="0" distB="0" distL="0" distR="0" wp14:anchorId="2EA98D9C" wp14:editId="6A6B02C3">
+            <wp:extent cx="5281879" cy="6811702"/>
             <wp:effectExtent l="0" t="0" r="4445" b="1905"/>
             <wp:docPr id="4" name="Imagem 4"/>
             <wp:cNvGraphicFramePr>
@@ -19252,7 +19430,7 @@
                   <pic:spPr bwMode="auto">
                     <a:xfrm>
                       <a:off x="0" y="0"/>
-                      <a:ext cx="5730167" cy="6811702"/>
+                      <a:ext cx="5281879" cy="6811702"/>
                     </a:xfrm>
                     <a:prstGeom prst="rect">
                       <a:avLst/>
@@ -19315,16 +19493,280 @@
     </w:p>
     <w:p>
       <w:pPr>
+        <w:pStyle w:val="Ttulo2"/>
+      </w:pPr>
+      <w:bookmarkStart w:id="59" w:name="_Toc242797263"/>
+      <w:r>
+        <w:lastRenderedPageBreak/>
+        <w:t>5.2 Diagrama de Classes</w:t>
+      </w:r>
+      <w:bookmarkEnd w:id="59"/>
+    </w:p>
+    <w:p>
+      <w:pPr>
+        <w:spacing w:before="100" w:beforeAutospacing="1" w:after="100" w:afterAutospacing="1" w:line="360" w:lineRule="auto"/>
+        <w:ind w:firstLine="708"/>
+        <w:jc w:val="both"/>
+        <w:rPr>
+          <w:rFonts w:cs="Arial"/>
+          <w:sz w:val="24"/>
+          <w:szCs w:val="24"/>
+        </w:rPr>
+      </w:pPr>
+      <w:r>
+        <w:rPr>
+          <w:sz w:val="24"/>
+          <w:szCs w:val="24"/>
+        </w:rPr>
+        <w:t xml:space="preserve">O diagrama de classes apresentado na Figura 10 representa as classes do sistema, com seus atributos, suas principais operações e os relacionamentos entre elas. Ele foi elaborado na notação UML e segue a mesma organização do banco de dados, de modo que as classes correspondem às tabelas apresentadas na seção anterior. A única exceção é a tabela </w:t>
+      </w:r>
+      <w:r>
+        <w:rPr>
+          <w:b/>
+          <w:bCs/>
+          <w:sz w:val="24"/>
+          <w:szCs w:val="24"/>
+        </w:rPr>
+        <w:t>ETAPA_POSTO</w:t>
+      </w:r>
+      <w:r>
+        <w:rPr>
+          <w:sz w:val="24"/>
+          <w:szCs w:val="24"/>
+        </w:rPr>
+        <w:t>, que não possui dados próprios e aparece no diagrama apenas como o relacionamento entre a etapa do roteiro e o posto de trabalho.</w:t>
+      </w:r>
+    </w:p>
+    <w:p>
+      <w:pPr>
+        <w:spacing w:line="360" w:lineRule="auto"/>
+        <w:ind w:firstLine="708"/>
+        <w:jc w:val="both"/>
+        <w:rPr>
+          <w:sz w:val="24"/>
+          <w:szCs w:val="24"/>
+        </w:rPr>
+      </w:pPr>
+      <w:r>
+        <w:rPr>
+          <w:sz w:val="24"/>
+          <w:szCs w:val="24"/>
+        </w:rPr>
+        <w:t>Os relacionamentos indicam a quantidade de objetos envolvidos em cada lado. Uma ordem de produção, por exemplo, pertence a um único produto, enquanto um produto pode ter várias ordens. A composição, representada pelo losango preenchido, foi utilizada nos casos em que a parte não existe sem o todo, como as etapas em relação ao roteiro e os eventos de tempo em relação à execução. Já a agregação, representada pelo losango vazio, indica apenas um agrupamento, como ocorre entre o plano de produção e suas ordens e entre o setor e seus postos de trabalho.</w:t>
+      </w:r>
+    </w:p>
+    <w:p>
+      <w:pPr>
+        <w:spacing w:line="360" w:lineRule="auto"/>
+        <w:ind w:firstLine="708"/>
+        <w:jc w:val="both"/>
+        <w:rPr>
+          <w:sz w:val="24"/>
+          <w:szCs w:val="24"/>
+        </w:rPr>
+      </w:pPr>
+      <w:r>
+        <w:rPr>
+          <w:sz w:val="24"/>
+          <w:szCs w:val="24"/>
+        </w:rPr>
+        <w:t>As enumerações representam listas fixas de valores, como a situação da execução, o tipo de finalização, o tipo de evento de tempo e o papel do usuário. Os atributos opcionais estão indicados com a multiplicidade [0..1], a exemplo das quantidades da execução, que só são preenchidas quando ocorre a baixa.</w:t>
+      </w:r>
+    </w:p>
+    <w:p>
+      <w:pPr>
+        <w:spacing w:line="360" w:lineRule="auto"/>
+        <w:ind w:firstLine="708"/>
+        <w:jc w:val="both"/>
+        <w:rPr>
+          <w:sz w:val="24"/>
+          <w:szCs w:val="24"/>
+        </w:rPr>
+      </w:pPr>
+      <w:r>
+        <w:rPr>
+          <w:sz w:val="24"/>
+          <w:szCs w:val="24"/>
+        </w:rPr>
+        <w:t xml:space="preserve">As operações mostram o comportamento principal de cada classe. A classe </w:t>
+      </w:r>
+      <w:r>
+        <w:rPr>
+          <w:b/>
+          <w:bCs/>
+          <w:sz w:val="24"/>
+          <w:szCs w:val="24"/>
+        </w:rPr>
+        <w:t>Execucao</w:t>
+      </w:r>
+      <w:r>
+        <w:rPr>
+          <w:sz w:val="24"/>
+          <w:szCs w:val="24"/>
+        </w:rPr>
+        <w:t xml:space="preserve"> concentra as ações do apontamento, que são pausar, retomar, trocar de operação e dar baixa, além do cálculo do tempo produtivo e do tempo de pausa a partir dos eventos registrados. A classe </w:t>
+      </w:r>
+      <w:r>
+        <w:rPr>
+          <w:b/>
+          <w:bCs/>
+          <w:sz w:val="24"/>
+          <w:szCs w:val="24"/>
+        </w:rPr>
+        <w:t>OrdemProducao</w:t>
+      </w:r>
+      <w:r>
+        <w:rPr>
+          <w:sz w:val="24"/>
+          <w:szCs w:val="24"/>
+        </w:rPr>
+        <w:t xml:space="preserve"> informa em qual etapa a ordem se encontra e se ela já foi concluída, enquanto a classe </w:t>
+      </w:r>
+      <w:r>
+        <w:rPr>
+          <w:b/>
+          <w:bCs/>
+          <w:sz w:val="24"/>
+          <w:szCs w:val="24"/>
+        </w:rPr>
+        <w:t>Usuario</w:t>
+      </w:r>
+      <w:r>
+        <w:rPr>
+          <w:sz w:val="24"/>
+          <w:szCs w:val="24"/>
+        </w:rPr>
+        <w:t xml:space="preserve"> permite alterar a senha e ativar ou desativar a conta. Para facilitar a leitura, os identificadores e as datas de criação e de atualização não foram representados no diagrama.</w:t>
+      </w:r>
+    </w:p>
+    <w:p>
+      <w:pPr>
+        <w:pStyle w:val="Legenda"/>
+        <w:keepNext/>
+      </w:pPr>
+      <w:bookmarkStart w:id="60" w:name="_Toc242797212"/>
+      <w:r>
+        <w:lastRenderedPageBreak/>
+        <w:t xml:space="preserve">Figura </w:t>
+      </w:r>
+      <w:r>
+        <w:fldChar w:fldCharType="begin"/>
+      </w:r>
+      <w:r>
+        <w:instrText xml:space="preserve"> SEQ Figura \* ARABIC </w:instrText>
+      </w:r>
+      <w:r>
+        <w:fldChar w:fldCharType="separate"/>
+      </w:r>
+      <w:r>
+        <w:rPr>
+          <w:noProof/>
+        </w:rPr>
+        <w:t>10</w:t>
+      </w:r>
+      <w:r>
+        <w:fldChar w:fldCharType="end"/>
+      </w:r>
+      <w:r>
+        <w:t xml:space="preserve"> – Diagrama de Classes do Sistema</w:t>
+      </w:r>
+      <w:bookmarkEnd w:id="60"/>
+    </w:p>
+    <w:p>
+      <w:pPr>
+        <w:keepNext/>
+        <w:spacing w:line="360" w:lineRule="auto"/>
+        <w:jc w:val="center"/>
+      </w:pPr>
+      <w:r>
+        <w:rPr>
+          <w:noProof/>
+        </w:rPr>
+        <w:drawing>
+          <wp:inline distT="0" distB="0" distL="0" distR="0" wp14:anchorId="5974CD67" wp14:editId="70F8BDE9">
+            <wp:extent cx="5730167" cy="7070453"/>
+            <wp:effectExtent l="0" t="0" r="0" b="0"/>
+            <wp:docPr id="203" name="Imagem 203"/>
+            <wp:cNvGraphicFramePr>
+              <a:graphicFrameLocks xmlns:a="http://schemas.openxmlformats.org/drawingml/2006/main" noChangeAspect="1"/>
+            </wp:cNvGraphicFramePr>
+            <a:graphic xmlns:a="http://schemas.openxmlformats.org/drawingml/2006/main">
+              <a:graphicData uri="http://schemas.openxmlformats.org/drawingml/2006/picture">
+                <pic:pic xmlns:pic="http://schemas.openxmlformats.org/drawingml/2006/picture">
+                  <pic:nvPicPr>
+                    <pic:cNvPr id="203" name="Imagem 203"/>
+                    <pic:cNvPicPr/>
+                  </pic:nvPicPr>
+                  <pic:blipFill>
+                    <a:blip r:embed="rId23"/>
+                    <a:stretch>
+                      <a:fillRect/>
+                    </a:stretch>
+                  </pic:blipFill>
+                  <pic:spPr>
+                    <a:xfrm>
+                      <a:off x="0" y="0"/>
+                      <a:ext cx="5730167" cy="7070453"/>
+                    </a:xfrm>
+                    <a:prstGeom prst="rect">
+                      <a:avLst/>
+                    </a:prstGeom>
+                  </pic:spPr>
+                </pic:pic>
+              </a:graphicData>
+            </a:graphic>
+          </wp:inline>
+        </w:drawing>
+      </w:r>
+    </w:p>
+    <w:p>
+      <w:pPr>
+        <w:jc w:val="center"/>
+        <w:rPr>
+          <w:sz w:val="20"/>
+          <w:szCs w:val="20"/>
+        </w:rPr>
+      </w:pPr>
+      <w:r>
+        <w:rPr>
+          <w:sz w:val="20"/>
+          <w:szCs w:val="20"/>
+        </w:rPr>
+        <w:t>Fonte: Próprio autor, acessado em 13 de outubro de 2026.</w:t>
+      </w:r>
+    </w:p>
+    <w:p>
+      <w:pPr>
+        <w:spacing w:after="100" w:afterAutospacing="1"/>
+        <w:rPr>
+          <w:rFonts w:ascii="Times New Roman" w:hAnsi="Times New Roman" w:cs="Times New Roman"/>
+          <w:b/>
+          <w:sz w:val="24"/>
+          <w:szCs w:val="24"/>
+        </w:rPr>
+      </w:pPr>
+      <w:r>
+        <w:rPr>
+          <w:rFonts w:ascii="Times New Roman" w:hAnsi="Times New Roman" w:cs="Times New Roman"/>
+          <w:b/>
+          <w:sz w:val="24"/>
+          <w:szCs w:val="24"/>
+        </w:rPr>
+        <w:br w:type="page"/>
+      </w:r>
+    </w:p>
+    <w:p>
+      <w:pPr>
         <w:pStyle w:val="Ttulo1"/>
         <w:spacing w:after="100" w:afterAutospacing="1"/>
         <w:jc w:val="center"/>
       </w:pPr>
-      <w:bookmarkStart w:id="59" w:name="_Toc242389702"/>
+      <w:bookmarkStart w:id="61" w:name="_Toc242797264"/>
       <w:r>
         <w:lastRenderedPageBreak/>
         <w:t>REFERÊNCIAS</w:t>
       </w:r>
-      <w:bookmarkEnd w:id="59"/>
+      <w:bookmarkEnd w:id="61"/>
     </w:p>
     <w:p/>
     <w:p>
@@ -19912,7 +20354,7 @@
       </w:r>
     </w:p>
     <w:sectPr>
-      <w:headerReference w:type="default" r:id="rId23"/>
+      <w:headerReference w:type="default" r:id="rId24"/>
       <w:pgSz w:w="11906" w:h="16838" w:code="9"/>
       <w:pgMar w:top="1701" w:right="1134" w:bottom="1134" w:left="1701" w:header="709" w:footer="709" w:gutter="0"/>
       <w:pgNumType w:start="11"/>
@@ -20027,7 +20469,7 @@
         <w:lang w:eastAsia="pt-BR"/>
       </w:rPr>
       <w:drawing>
-        <wp:inline distT="0" distB="0" distL="0" distR="0" wp14:anchorId="63850E0E" wp14:editId="027914B1">
+        <wp:inline distT="0" distB="0" distL="0" distR="0" wp14:anchorId="462E20D2" wp14:editId="72ADE90F">
           <wp:extent cx="1619048" cy="647619"/>
           <wp:effectExtent l="0" t="0" r="0" b="0"/>
           <wp:docPr id="5" name="Imagem 5" descr="Logotipo  O conteúdo gerado por IA pode estar incorreto."/>

</xml_diff>

<commit_message>
docs: adiciona o diagrama de casos de uso ao TCC
</commit_message>
<xml_diff>
--- a/docs/tcc/TCC_Nivelamento_de_Processos.docx
+++ b/docs/tcc/TCC_Nivelamento_de_Processos.docx
@@ -1706,7 +1706,7 @@
       <w:r>
         <w:fldChar w:fldCharType="separate"/>
       </w:r>
-      <w:hyperlink w:anchor="_Toc242797203" w:history="1">
+      <w:hyperlink w:anchor="_Toc242906292" w:history="1">
         <w:r>
           <w:rPr>
             <w:rStyle w:val="Hyperlink"/>
@@ -1733,7 +1733,7 @@
             <w:noProof/>
             <w:webHidden/>
           </w:rPr>
-          <w:instrText xml:space="preserve"> PAGEREF _Toc242797203 \h </w:instrText>
+          <w:instrText xml:space="preserve"> PAGEREF _Toc242906292 \h </w:instrText>
         </w:r>
         <w:r>
           <w:rPr>
@@ -1778,7 +1778,7 @@
           <w14:ligatures w14:val="standardContextual"/>
         </w:rPr>
       </w:pPr>
-      <w:hyperlink w:anchor="_Toc242797204" w:history="1">
+      <w:hyperlink w:anchor="_Toc242906293" w:history="1">
         <w:r>
           <w:rPr>
             <w:rStyle w:val="Hyperlink"/>
@@ -1805,7 +1805,7 @@
             <w:noProof/>
             <w:webHidden/>
           </w:rPr>
-          <w:instrText xml:space="preserve"> PAGEREF _Toc242797204 \h </w:instrText>
+          <w:instrText xml:space="preserve"> PAGEREF _Toc242906293 \h </w:instrText>
         </w:r>
         <w:r>
           <w:rPr>
@@ -1850,7 +1850,7 @@
           <w14:ligatures w14:val="standardContextual"/>
         </w:rPr>
       </w:pPr>
-      <w:hyperlink w:anchor="_Toc242797205" w:history="1">
+      <w:hyperlink w:anchor="_Toc242906294" w:history="1">
         <w:r>
           <w:rPr>
             <w:rStyle w:val="Hyperlink"/>
@@ -1877,7 +1877,7 @@
             <w:noProof/>
             <w:webHidden/>
           </w:rPr>
-          <w:instrText xml:space="preserve"> PAGEREF _Toc242797205 \h </w:instrText>
+          <w:instrText xml:space="preserve"> PAGEREF _Toc242906294 \h </w:instrText>
         </w:r>
         <w:r>
           <w:rPr>
@@ -1922,7 +1922,7 @@
           <w14:ligatures w14:val="standardContextual"/>
         </w:rPr>
       </w:pPr>
-      <w:hyperlink w:anchor="_Toc242797206" w:history="1">
+      <w:hyperlink w:anchor="_Toc242906295" w:history="1">
         <w:r>
           <w:rPr>
             <w:rStyle w:val="Hyperlink"/>
@@ -1949,7 +1949,7 @@
             <w:noProof/>
             <w:webHidden/>
           </w:rPr>
-          <w:instrText xml:space="preserve"> PAGEREF _Toc242797206 \h </w:instrText>
+          <w:instrText xml:space="preserve"> PAGEREF _Toc242906295 \h </w:instrText>
         </w:r>
         <w:r>
           <w:rPr>
@@ -1994,7 +1994,7 @@
           <w14:ligatures w14:val="standardContextual"/>
         </w:rPr>
       </w:pPr>
-      <w:hyperlink w:anchor="_Toc242797207" w:history="1">
+      <w:hyperlink w:anchor="_Toc242906296" w:history="1">
         <w:r>
           <w:rPr>
             <w:rStyle w:val="Hyperlink"/>
@@ -2021,7 +2021,7 @@
             <w:noProof/>
             <w:webHidden/>
           </w:rPr>
-          <w:instrText xml:space="preserve"> PAGEREF _Toc242797207 \h </w:instrText>
+          <w:instrText xml:space="preserve"> PAGEREF _Toc242906296 \h </w:instrText>
         </w:r>
         <w:r>
           <w:rPr>
@@ -2041,7 +2041,7 @@
             <w:noProof/>
             <w:webHidden/>
           </w:rPr>
-          <w:t>39</w:t>
+          <w:t>41</w:t>
         </w:r>
         <w:r>
           <w:rPr>
@@ -2066,7 +2066,7 @@
           <w14:ligatures w14:val="standardContextual"/>
         </w:rPr>
       </w:pPr>
-      <w:hyperlink w:anchor="_Toc242797208" w:history="1">
+      <w:hyperlink w:anchor="_Toc242906297" w:history="1">
         <w:r>
           <w:rPr>
             <w:rStyle w:val="Hyperlink"/>
@@ -2093,7 +2093,7 @@
             <w:noProof/>
             <w:webHidden/>
           </w:rPr>
-          <w:instrText xml:space="preserve"> PAGEREF _Toc242797208 \h </w:instrText>
+          <w:instrText xml:space="preserve"> PAGEREF _Toc242906297 \h </w:instrText>
         </w:r>
         <w:r>
           <w:rPr>
@@ -2113,7 +2113,7 @@
             <w:noProof/>
             <w:webHidden/>
           </w:rPr>
-          <w:t>39</w:t>
+          <w:t>41</w:t>
         </w:r>
         <w:r>
           <w:rPr>
@@ -2138,7 +2138,7 @@
           <w14:ligatures w14:val="standardContextual"/>
         </w:rPr>
       </w:pPr>
-      <w:hyperlink w:anchor="_Toc242797209" w:history="1">
+      <w:hyperlink w:anchor="_Toc242906298" w:history="1">
         <w:r>
           <w:rPr>
             <w:rStyle w:val="Hyperlink"/>
@@ -2165,7 +2165,7 @@
             <w:noProof/>
             <w:webHidden/>
           </w:rPr>
-          <w:instrText xml:space="preserve"> PAGEREF _Toc242797209 \h </w:instrText>
+          <w:instrText xml:space="preserve"> PAGEREF _Toc242906298 \h </w:instrText>
         </w:r>
         <w:r>
           <w:rPr>
@@ -2185,7 +2185,7 @@
             <w:noProof/>
             <w:webHidden/>
           </w:rPr>
-          <w:t>40</w:t>
+          <w:t>42</w:t>
         </w:r>
         <w:r>
           <w:rPr>
@@ -2210,7 +2210,7 @@
           <w14:ligatures w14:val="standardContextual"/>
         </w:rPr>
       </w:pPr>
-      <w:hyperlink w:anchor="_Toc242797210" w:history="1">
+      <w:hyperlink w:anchor="_Toc242906299" w:history="1">
         <w:r>
           <w:rPr>
             <w:rStyle w:val="Hyperlink"/>
@@ -2237,7 +2237,7 @@
             <w:noProof/>
             <w:webHidden/>
           </w:rPr>
-          <w:instrText xml:space="preserve"> PAGEREF _Toc242797210 \h </w:instrText>
+          <w:instrText xml:space="preserve"> PAGEREF _Toc242906299 \h </w:instrText>
         </w:r>
         <w:r>
           <w:rPr>
@@ -2257,7 +2257,7 @@
             <w:noProof/>
             <w:webHidden/>
           </w:rPr>
-          <w:t>40</w:t>
+          <w:t>42</w:t>
         </w:r>
         <w:r>
           <w:rPr>
@@ -2282,7 +2282,7 @@
           <w14:ligatures w14:val="standardContextual"/>
         </w:rPr>
       </w:pPr>
-      <w:hyperlink w:anchor="_Toc242797211" w:history="1">
+      <w:hyperlink w:anchor="_Toc242906300" w:history="1">
         <w:r>
           <w:rPr>
             <w:rStyle w:val="Hyperlink"/>
@@ -2309,79 +2309,7 @@
             <w:noProof/>
             <w:webHidden/>
           </w:rPr>
-          <w:instrText xml:space="preserve"> PAGEREF _Toc242797211 \h </w:instrText>
-        </w:r>
-        <w:r>
-          <w:rPr>
-            <w:noProof/>
-            <w:webHidden/>
-          </w:rPr>
-        </w:r>
-        <w:r>
-          <w:rPr>
-            <w:noProof/>
-            <w:webHidden/>
-          </w:rPr>
-          <w:fldChar w:fldCharType="separate"/>
-        </w:r>
-        <w:r>
-          <w:rPr>
-            <w:noProof/>
-            <w:webHidden/>
-          </w:rPr>
-          <w:t>44</w:t>
-        </w:r>
-        <w:r>
-          <w:rPr>
-            <w:noProof/>
-            <w:webHidden/>
-          </w:rPr>
-          <w:fldChar w:fldCharType="end"/>
-        </w:r>
-      </w:hyperlink>
-    </w:p>
-    <w:p>
-      <w:pPr>
-        <w:pStyle w:val="ndicedeilustraes"/>
-        <w:tabs>
-          <w:tab w:val="right" w:leader="dot" w:pos="9061"/>
-        </w:tabs>
-        <w:rPr>
-          <w:rFonts w:asciiTheme="minorHAnsi" w:eastAsiaTheme="minorEastAsia" w:hAnsiTheme="minorHAnsi"/>
-          <w:noProof/>
-          <w:kern w:val="2"/>
-          <w:lang w:eastAsia="pt-BR"/>
-          <w14:ligatures w14:val="standardContextual"/>
-        </w:rPr>
-      </w:pPr>
-      <w:hyperlink w:anchor="_Toc242797212" w:history="1">
-        <w:r>
-          <w:rPr>
-            <w:rStyle w:val="Hyperlink"/>
-            <w:noProof/>
-          </w:rPr>
-          <w:t>Figura 10 – Diagrama de Classes do Sistema</w:t>
-        </w:r>
-        <w:r>
-          <w:rPr>
-            <w:noProof/>
-            <w:webHidden/>
-          </w:rPr>
-          <w:tab/>
-        </w:r>
-        <w:r>
-          <w:rPr>
-            <w:noProof/>
-            <w:webHidden/>
-          </w:rPr>
-          <w:fldChar w:fldCharType="begin"/>
-        </w:r>
-        <w:r>
-          <w:rPr>
-            <w:noProof/>
-            <w:webHidden/>
-          </w:rPr>
-          <w:instrText xml:space="preserve"> PAGEREF _Toc242797212 \h </w:instrText>
+          <w:instrText xml:space="preserve"> PAGEREF _Toc242906300 \h </w:instrText>
         </w:r>
         <w:r>
           <w:rPr>
@@ -2418,40 +2346,6 @@
         <w:tabs>
           <w:tab w:val="right" w:leader="dot" w:pos="9061"/>
         </w:tabs>
-      </w:pPr>
-      <w:r>
-        <w:fldChar w:fldCharType="end"/>
-      </w:r>
-    </w:p>
-    <w:p>
-      <w:pPr>
-        <w:pageBreakBefore/>
-        <w:spacing w:line="360" w:lineRule="auto"/>
-        <w:jc w:val="center"/>
-        <w:rPr>
-          <w:rFonts w:cs="Arial"/>
-          <w:b/>
-          <w:sz w:val="24"/>
-          <w:szCs w:val="24"/>
-        </w:rPr>
-      </w:pPr>
-      <w:r>
-        <w:rPr>
-          <w:rFonts w:cs="Arial"/>
-          <w:b/>
-          <w:sz w:val="24"/>
-          <w:szCs w:val="24"/>
-        </w:rPr>
-        <w:lastRenderedPageBreak/>
-        <w:t>LISTA DE TABELAS</w:t>
-      </w:r>
-    </w:p>
-    <w:p>
-      <w:pPr>
-        <w:pStyle w:val="ndicedeilustraes"/>
-        <w:tabs>
-          <w:tab w:val="right" w:leader="dot" w:pos="9061"/>
-        </w:tabs>
         <w:rPr>
           <w:rFonts w:asciiTheme="minorHAnsi" w:eastAsiaTheme="minorEastAsia" w:hAnsiTheme="minorHAnsi"/>
           <w:noProof/>
@@ -2460,6 +2354,184 @@
           <w14:ligatures w14:val="standardContextual"/>
         </w:rPr>
       </w:pPr>
+      <w:hyperlink w:anchor="_Toc242906301" w:history="1">
+        <w:r>
+          <w:rPr>
+            <w:rStyle w:val="Hyperlink"/>
+            <w:noProof/>
+          </w:rPr>
+          <w:t>Figura 10 – Diagrama de Classes do Sistema</w:t>
+        </w:r>
+        <w:r>
+          <w:rPr>
+            <w:noProof/>
+            <w:webHidden/>
+          </w:rPr>
+          <w:tab/>
+        </w:r>
+        <w:r>
+          <w:rPr>
+            <w:noProof/>
+            <w:webHidden/>
+          </w:rPr>
+          <w:fldChar w:fldCharType="begin"/>
+        </w:r>
+        <w:r>
+          <w:rPr>
+            <w:noProof/>
+            <w:webHidden/>
+          </w:rPr>
+          <w:instrText xml:space="preserve"> PAGEREF _Toc242906301 \h </w:instrText>
+        </w:r>
+        <w:r>
+          <w:rPr>
+            <w:noProof/>
+            <w:webHidden/>
+          </w:rPr>
+        </w:r>
+        <w:r>
+          <w:rPr>
+            <w:noProof/>
+            <w:webHidden/>
+          </w:rPr>
+          <w:fldChar w:fldCharType="separate"/>
+        </w:r>
+        <w:r>
+          <w:rPr>
+            <w:noProof/>
+            <w:webHidden/>
+          </w:rPr>
+          <w:t>48</w:t>
+        </w:r>
+        <w:r>
+          <w:rPr>
+            <w:noProof/>
+            <w:webHidden/>
+          </w:rPr>
+          <w:fldChar w:fldCharType="end"/>
+        </w:r>
+      </w:hyperlink>
+    </w:p>
+    <w:p>
+      <w:pPr>
+        <w:pStyle w:val="ndicedeilustraes"/>
+        <w:tabs>
+          <w:tab w:val="right" w:leader="dot" w:pos="9061"/>
+        </w:tabs>
+        <w:rPr>
+          <w:rFonts w:asciiTheme="minorHAnsi" w:eastAsiaTheme="minorEastAsia" w:hAnsiTheme="minorHAnsi"/>
+          <w:noProof/>
+          <w:kern w:val="2"/>
+          <w:lang w:eastAsia="pt-BR"/>
+          <w14:ligatures w14:val="standardContextual"/>
+        </w:rPr>
+      </w:pPr>
+      <w:hyperlink w:anchor="_Toc242906302" w:history="1">
+        <w:r>
+          <w:rPr>
+            <w:rStyle w:val="Hyperlink"/>
+            <w:noProof/>
+          </w:rPr>
+          <w:t>Figura 11 – Diagrama de Casos de Uso do Sistema</w:t>
+        </w:r>
+        <w:r>
+          <w:rPr>
+            <w:noProof/>
+            <w:webHidden/>
+          </w:rPr>
+          <w:tab/>
+        </w:r>
+        <w:r>
+          <w:rPr>
+            <w:noProof/>
+            <w:webHidden/>
+          </w:rPr>
+          <w:fldChar w:fldCharType="begin"/>
+        </w:r>
+        <w:r>
+          <w:rPr>
+            <w:noProof/>
+            <w:webHidden/>
+          </w:rPr>
+          <w:instrText xml:space="preserve"> PAGEREF _Toc242906302 \h </w:instrText>
+        </w:r>
+        <w:r>
+          <w:rPr>
+            <w:noProof/>
+            <w:webHidden/>
+          </w:rPr>
+        </w:r>
+        <w:r>
+          <w:rPr>
+            <w:noProof/>
+            <w:webHidden/>
+          </w:rPr>
+          <w:fldChar w:fldCharType="separate"/>
+        </w:r>
+        <w:r>
+          <w:rPr>
+            <w:noProof/>
+            <w:webHidden/>
+          </w:rPr>
+          <w:t>50</w:t>
+        </w:r>
+        <w:r>
+          <w:rPr>
+            <w:noProof/>
+            <w:webHidden/>
+          </w:rPr>
+          <w:fldChar w:fldCharType="end"/>
+        </w:r>
+      </w:hyperlink>
+    </w:p>
+    <w:p>
+      <w:pPr>
+        <w:pStyle w:val="ndicedeilustraes"/>
+        <w:tabs>
+          <w:tab w:val="right" w:leader="dot" w:pos="9061"/>
+        </w:tabs>
+      </w:pPr>
+      <w:r>
+        <w:fldChar w:fldCharType="end"/>
+      </w:r>
+    </w:p>
+    <w:p>
+      <w:pPr>
+        <w:pageBreakBefore/>
+        <w:spacing w:line="360" w:lineRule="auto"/>
+        <w:jc w:val="center"/>
+        <w:rPr>
+          <w:rFonts w:cs="Arial"/>
+          <w:b/>
+          <w:sz w:val="24"/>
+          <w:szCs w:val="24"/>
+        </w:rPr>
+      </w:pPr>
+      <w:r>
+        <w:rPr>
+          <w:rFonts w:cs="Arial"/>
+          <w:b/>
+          <w:sz w:val="24"/>
+          <w:szCs w:val="24"/>
+        </w:rPr>
+        <w:lastRenderedPageBreak/>
+        <w:t>LISTA DE TABELAS</w:t>
+      </w:r>
+    </w:p>
+    <w:p>
+      <w:pPr>
+        <w:pStyle w:val="ndicedeilustraes"/>
+        <w:tabs>
+          <w:tab w:val="right" w:leader="dot" w:pos="9061"/>
+        </w:tabs>
+        <w:rPr>
+          <w:rFonts w:asciiTheme="minorHAnsi" w:eastAsiaTheme="minorEastAsia" w:hAnsiTheme="minorHAnsi"/>
+          <w:noProof/>
+          <w:kern w:val="2"/>
+          <w:lang w:eastAsia="pt-BR"/>
+          <w14:ligatures w14:val="standardContextual"/>
+        </w:rPr>
+      </w:pPr>
       <w:r>
         <w:fldChar w:fldCharType="begin"/>
       </w:r>
@@ -2469,7 +2541,7 @@
       <w:r>
         <w:fldChar w:fldCharType="separate"/>
       </w:r>
-      <w:hyperlink w:anchor="_Toc242797213" w:history="1">
+      <w:hyperlink w:anchor="_Toc242906303" w:history="1">
         <w:r>
           <w:rPr>
             <w:rStyle w:val="Hyperlink"/>
@@ -2496,7 +2568,7 @@
             <w:noProof/>
             <w:webHidden/>
           </w:rPr>
-          <w:instrText xml:space="preserve"> PAGEREF _Toc242797213 \h </w:instrText>
+          <w:instrText xml:space="preserve"> PAGEREF _Toc242906303 \h </w:instrText>
         </w:r>
         <w:r>
           <w:rPr>
@@ -2541,7 +2613,7 @@
           <w14:ligatures w14:val="standardContextual"/>
         </w:rPr>
       </w:pPr>
-      <w:hyperlink w:anchor="_Toc242797214" w:history="1">
+      <w:hyperlink w:anchor="_Toc242906304" w:history="1">
         <w:r>
           <w:rPr>
             <w:rStyle w:val="Hyperlink"/>
@@ -2568,7 +2640,7 @@
             <w:noProof/>
             <w:webHidden/>
           </w:rPr>
-          <w:instrText xml:space="preserve"> PAGEREF _Toc242797214 \h </w:instrText>
+          <w:instrText xml:space="preserve"> PAGEREF _Toc242906304 \h </w:instrText>
         </w:r>
         <w:r>
           <w:rPr>
@@ -2613,7 +2685,7 @@
           <w14:ligatures w14:val="standardContextual"/>
         </w:rPr>
       </w:pPr>
-      <w:hyperlink w:anchor="_Toc242797215" w:history="1">
+      <w:hyperlink w:anchor="_Toc242906305" w:history="1">
         <w:r>
           <w:rPr>
             <w:rStyle w:val="Hyperlink"/>
@@ -2640,7 +2712,7 @@
             <w:noProof/>
             <w:webHidden/>
           </w:rPr>
-          <w:instrText xml:space="preserve"> PAGEREF _Toc242797215 \h </w:instrText>
+          <w:instrText xml:space="preserve"> PAGEREF _Toc242906305 \h </w:instrText>
         </w:r>
         <w:r>
           <w:rPr>
@@ -2685,7 +2757,7 @@
           <w14:ligatures w14:val="standardContextual"/>
         </w:rPr>
       </w:pPr>
-      <w:hyperlink w:anchor="_Toc242797216" w:history="1">
+      <w:hyperlink w:anchor="_Toc242906306" w:history="1">
         <w:r>
           <w:rPr>
             <w:rStyle w:val="Hyperlink"/>
@@ -2712,7 +2784,7 @@
             <w:noProof/>
             <w:webHidden/>
           </w:rPr>
-          <w:instrText xml:space="preserve"> PAGEREF _Toc242797216 \h </w:instrText>
+          <w:instrText xml:space="preserve"> PAGEREF _Toc242906306 \h </w:instrText>
         </w:r>
         <w:r>
           <w:rPr>
@@ -2757,7 +2829,7 @@
           <w14:ligatures w14:val="standardContextual"/>
         </w:rPr>
       </w:pPr>
-      <w:hyperlink w:anchor="_Toc242797217" w:history="1">
+      <w:hyperlink w:anchor="_Toc242906307" w:history="1">
         <w:r>
           <w:rPr>
             <w:rStyle w:val="Hyperlink"/>
@@ -2784,7 +2856,7 @@
             <w:noProof/>
             <w:webHidden/>
           </w:rPr>
-          <w:instrText xml:space="preserve"> PAGEREF _Toc242797217 \h </w:instrText>
+          <w:instrText xml:space="preserve"> PAGEREF _Toc242906307 \h </w:instrText>
         </w:r>
         <w:r>
           <w:rPr>
@@ -2829,7 +2901,7 @@
           <w14:ligatures w14:val="standardContextual"/>
         </w:rPr>
       </w:pPr>
-      <w:hyperlink w:anchor="_Toc242797218" w:history="1">
+      <w:hyperlink w:anchor="_Toc242906308" w:history="1">
         <w:r>
           <w:rPr>
             <w:rStyle w:val="Hyperlink"/>
@@ -2856,7 +2928,7 @@
             <w:noProof/>
             <w:webHidden/>
           </w:rPr>
-          <w:instrText xml:space="preserve"> PAGEREF _Toc242797218 \h </w:instrText>
+          <w:instrText xml:space="preserve"> PAGEREF _Toc242906308 \h </w:instrText>
         </w:r>
         <w:r>
           <w:rPr>
@@ -2901,7 +2973,7 @@
           <w14:ligatures w14:val="standardContextual"/>
         </w:rPr>
       </w:pPr>
-      <w:hyperlink w:anchor="_Toc242797219" w:history="1">
+      <w:hyperlink w:anchor="_Toc242906309" w:history="1">
         <w:r>
           <w:rPr>
             <w:rStyle w:val="Hyperlink"/>
@@ -2928,7 +3000,7 @@
             <w:noProof/>
             <w:webHidden/>
           </w:rPr>
-          <w:instrText xml:space="preserve"> PAGEREF _Toc242797219 \h </w:instrText>
+          <w:instrText xml:space="preserve"> PAGEREF _Toc242906309 \h </w:instrText>
         </w:r>
         <w:r>
           <w:rPr>
@@ -2973,13 +3045,13 @@
           <w14:ligatures w14:val="standardContextual"/>
         </w:rPr>
       </w:pPr>
-      <w:hyperlink w:anchor="_Toc242797220" w:history="1">
+      <w:hyperlink w:anchor="_Toc242906310" w:history="1">
         <w:r>
           <w:rPr>
             <w:rStyle w:val="Hyperlink"/>
             <w:noProof/>
           </w:rPr>
-          <w:t>Tabela 8 – Requisitos Não Funcionais do Sistema</w:t>
+          <w:t>Tabela 8 – Requisitos da Tela de Cadastro de Operadores</w:t>
         </w:r>
         <w:r>
           <w:rPr>
@@ -3000,7 +3072,7 @@
             <w:noProof/>
             <w:webHidden/>
           </w:rPr>
-          <w:instrText xml:space="preserve"> PAGEREF _Toc242797220 \h </w:instrText>
+          <w:instrText xml:space="preserve"> PAGEREF _Toc242906310 \h </w:instrText>
         </w:r>
         <w:r>
           <w:rPr>
@@ -3021,6 +3093,150 @@
             <w:webHidden/>
           </w:rPr>
           <w:t>36</w:t>
+        </w:r>
+        <w:r>
+          <w:rPr>
+            <w:noProof/>
+            <w:webHidden/>
+          </w:rPr>
+          <w:fldChar w:fldCharType="end"/>
+        </w:r>
+      </w:hyperlink>
+    </w:p>
+    <w:p>
+      <w:pPr>
+        <w:pStyle w:val="ndicedeilustraes"/>
+        <w:tabs>
+          <w:tab w:val="right" w:leader="dot" w:pos="9061"/>
+        </w:tabs>
+        <w:rPr>
+          <w:rFonts w:asciiTheme="minorHAnsi" w:eastAsiaTheme="minorEastAsia" w:hAnsiTheme="minorHAnsi"/>
+          <w:noProof/>
+          <w:kern w:val="2"/>
+          <w:lang w:eastAsia="pt-BR"/>
+          <w14:ligatures w14:val="standardContextual"/>
+        </w:rPr>
+      </w:pPr>
+      <w:hyperlink w:anchor="_Toc242906311" w:history="1">
+        <w:r>
+          <w:rPr>
+            <w:rStyle w:val="Hyperlink"/>
+            <w:noProof/>
+          </w:rPr>
+          <w:t>Tabela 9 – Requisitos da Tela de Cadastro de Motivos de Pausa</w:t>
+        </w:r>
+        <w:r>
+          <w:rPr>
+            <w:noProof/>
+            <w:webHidden/>
+          </w:rPr>
+          <w:tab/>
+        </w:r>
+        <w:r>
+          <w:rPr>
+            <w:noProof/>
+            <w:webHidden/>
+          </w:rPr>
+          <w:fldChar w:fldCharType="begin"/>
+        </w:r>
+        <w:r>
+          <w:rPr>
+            <w:noProof/>
+            <w:webHidden/>
+          </w:rPr>
+          <w:instrText xml:space="preserve"> PAGEREF _Toc242906311 \h </w:instrText>
+        </w:r>
+        <w:r>
+          <w:rPr>
+            <w:noProof/>
+            <w:webHidden/>
+          </w:rPr>
+        </w:r>
+        <w:r>
+          <w:rPr>
+            <w:noProof/>
+            <w:webHidden/>
+          </w:rPr>
+          <w:fldChar w:fldCharType="separate"/>
+        </w:r>
+        <w:r>
+          <w:rPr>
+            <w:noProof/>
+            <w:webHidden/>
+          </w:rPr>
+          <w:t>37</w:t>
+        </w:r>
+        <w:r>
+          <w:rPr>
+            <w:noProof/>
+            <w:webHidden/>
+          </w:rPr>
+          <w:fldChar w:fldCharType="end"/>
+        </w:r>
+      </w:hyperlink>
+    </w:p>
+    <w:p>
+      <w:pPr>
+        <w:pStyle w:val="ndicedeilustraes"/>
+        <w:tabs>
+          <w:tab w:val="right" w:leader="dot" w:pos="9061"/>
+        </w:tabs>
+        <w:rPr>
+          <w:rFonts w:asciiTheme="minorHAnsi" w:eastAsiaTheme="minorEastAsia" w:hAnsiTheme="minorHAnsi"/>
+          <w:noProof/>
+          <w:kern w:val="2"/>
+          <w:lang w:eastAsia="pt-BR"/>
+          <w14:ligatures w14:val="standardContextual"/>
+        </w:rPr>
+      </w:pPr>
+      <w:hyperlink w:anchor="_Toc242906312" w:history="1">
+        <w:r>
+          <w:rPr>
+            <w:rStyle w:val="Hyperlink"/>
+            <w:noProof/>
+          </w:rPr>
+          <w:t>Tabela 10 – Requisitos Não Funcionais do Sistema</w:t>
+        </w:r>
+        <w:r>
+          <w:rPr>
+            <w:noProof/>
+            <w:webHidden/>
+          </w:rPr>
+          <w:tab/>
+        </w:r>
+        <w:r>
+          <w:rPr>
+            <w:noProof/>
+            <w:webHidden/>
+          </w:rPr>
+          <w:fldChar w:fldCharType="begin"/>
+        </w:r>
+        <w:r>
+          <w:rPr>
+            <w:noProof/>
+            <w:webHidden/>
+          </w:rPr>
+          <w:instrText xml:space="preserve"> PAGEREF _Toc242906312 \h </w:instrText>
+        </w:r>
+        <w:r>
+          <w:rPr>
+            <w:noProof/>
+            <w:webHidden/>
+          </w:rPr>
+        </w:r>
+        <w:r>
+          <w:rPr>
+            <w:noProof/>
+            <w:webHidden/>
+          </w:rPr>
+          <w:fldChar w:fldCharType="separate"/>
+        </w:r>
+        <w:r>
+          <w:rPr>
+            <w:noProof/>
+            <w:webHidden/>
+          </w:rPr>
+          <w:t>38</w:t>
         </w:r>
         <w:r>
           <w:rPr>
@@ -3556,7 +3772,7 @@
             </w:rPr>
             <w:fldChar w:fldCharType="separate"/>
           </w:r>
-          <w:hyperlink w:anchor="_Toc242797221" w:history="1">
+          <w:hyperlink w:anchor="_Toc242906245" w:history="1">
             <w:r>
               <w:rPr>
                 <w:rStyle w:val="Hyperlink"/>
@@ -3579,7 +3795,7 @@
               <w:rPr>
                 <w:webHidden/>
               </w:rPr>
-              <w:instrText xml:space="preserve"> PAGEREF _Toc242797221 \h </w:instrText>
+              <w:instrText xml:space="preserve"> PAGEREF _Toc242906245 \h </w:instrText>
             </w:r>
             <w:r>
               <w:rPr>
@@ -3622,7 +3838,7 @@
               <w14:ligatures w14:val="standardContextual"/>
             </w:rPr>
           </w:pPr>
-          <w:hyperlink w:anchor="_Toc242797222" w:history="1">
+          <w:hyperlink w:anchor="_Toc242906246" w:history="1">
             <w:r>
               <w:rPr>
                 <w:rStyle w:val="Hyperlink"/>
@@ -3650,7 +3866,7 @@
                 <w:noProof/>
                 <w:webHidden/>
               </w:rPr>
-              <w:instrText xml:space="preserve"> PAGEREF _Toc242797222 \h </w:instrText>
+              <w:instrText xml:space="preserve"> PAGEREF _Toc242906246 \h </w:instrText>
             </w:r>
             <w:r>
               <w:rPr>
@@ -3697,7 +3913,7 @@
               <w14:ligatures w14:val="standardContextual"/>
             </w:rPr>
           </w:pPr>
-          <w:hyperlink w:anchor="_Toc242797223" w:history="1">
+          <w:hyperlink w:anchor="_Toc242906247" w:history="1">
             <w:r>
               <w:rPr>
                 <w:rStyle w:val="Hyperlink"/>
@@ -3725,7 +3941,7 @@
                 <w:noProof/>
                 <w:webHidden/>
               </w:rPr>
-              <w:instrText xml:space="preserve"> PAGEREF _Toc242797223 \h </w:instrText>
+              <w:instrText xml:space="preserve"> PAGEREF _Toc242906247 \h </w:instrText>
             </w:r>
             <w:r>
               <w:rPr>
@@ -3772,7 +3988,7 @@
               <w14:ligatures w14:val="standardContextual"/>
             </w:rPr>
           </w:pPr>
-          <w:hyperlink w:anchor="_Toc242797224" w:history="1">
+          <w:hyperlink w:anchor="_Toc242906248" w:history="1">
             <w:r>
               <w:rPr>
                 <w:rStyle w:val="Hyperlink"/>
@@ -3800,7 +4016,7 @@
                 <w:noProof/>
                 <w:webHidden/>
               </w:rPr>
-              <w:instrText xml:space="preserve"> PAGEREF _Toc242797224 \h </w:instrText>
+              <w:instrText xml:space="preserve"> PAGEREF _Toc242906248 \h </w:instrText>
             </w:r>
             <w:r>
               <w:rPr>
@@ -3847,7 +4063,7 @@
               <w14:ligatures w14:val="standardContextual"/>
             </w:rPr>
           </w:pPr>
-          <w:hyperlink w:anchor="_Toc242797225" w:history="1">
+          <w:hyperlink w:anchor="_Toc242906249" w:history="1">
             <w:r>
               <w:rPr>
                 <w:rStyle w:val="Hyperlink"/>
@@ -3874,7 +4090,7 @@
                 <w:noProof/>
                 <w:webHidden/>
               </w:rPr>
-              <w:instrText xml:space="preserve"> PAGEREF _Toc242797225 \h </w:instrText>
+              <w:instrText xml:space="preserve"> PAGEREF _Toc242906249 \h </w:instrText>
             </w:r>
             <w:r>
               <w:rPr>
@@ -3921,7 +4137,7 @@
               <w14:ligatures w14:val="standardContextual"/>
             </w:rPr>
           </w:pPr>
-          <w:hyperlink w:anchor="_Toc242797226" w:history="1">
+          <w:hyperlink w:anchor="_Toc242906250" w:history="1">
             <w:r>
               <w:rPr>
                 <w:rStyle w:val="Hyperlink"/>
@@ -3948,7 +4164,7 @@
                 <w:noProof/>
                 <w:webHidden/>
               </w:rPr>
-              <w:instrText xml:space="preserve"> PAGEREF _Toc242797226 \h </w:instrText>
+              <w:instrText xml:space="preserve"> PAGEREF _Toc242906250 \h </w:instrText>
             </w:r>
             <w:r>
               <w:rPr>
@@ -3995,7 +4211,7 @@
               <w14:ligatures w14:val="standardContextual"/>
             </w:rPr>
           </w:pPr>
-          <w:hyperlink w:anchor="_Toc242797227" w:history="1">
+          <w:hyperlink w:anchor="_Toc242906251" w:history="1">
             <w:r>
               <w:rPr>
                 <w:rStyle w:val="Hyperlink"/>
@@ -4023,7 +4239,7 @@
                 <w:noProof/>
                 <w:webHidden/>
               </w:rPr>
-              <w:instrText xml:space="preserve"> PAGEREF _Toc242797227 \h </w:instrText>
+              <w:instrText xml:space="preserve"> PAGEREF _Toc242906251 \h </w:instrText>
             </w:r>
             <w:r>
               <w:rPr>
@@ -4070,7 +4286,7 @@
               <w14:ligatures w14:val="standardContextual"/>
             </w:rPr>
           </w:pPr>
-          <w:hyperlink w:anchor="_Toc242797228" w:history="1">
+          <w:hyperlink w:anchor="_Toc242906252" w:history="1">
             <w:r>
               <w:rPr>
                 <w:rStyle w:val="Hyperlink"/>
@@ -4098,7 +4314,7 @@
                 <w:noProof/>
                 <w:webHidden/>
               </w:rPr>
-              <w:instrText xml:space="preserve"> PAGEREF _Toc242797228 \h </w:instrText>
+              <w:instrText xml:space="preserve"> PAGEREF _Toc242906252 \h </w:instrText>
             </w:r>
             <w:r>
               <w:rPr>
@@ -4142,7 +4358,7 @@
               <w14:ligatures w14:val="standardContextual"/>
             </w:rPr>
           </w:pPr>
-          <w:hyperlink w:anchor="_Toc242797229" w:history="1">
+          <w:hyperlink w:anchor="_Toc242906253" w:history="1">
             <w:r>
               <w:rPr>
                 <w:rStyle w:val="Hyperlink"/>
@@ -4165,7 +4381,7 @@
               <w:rPr>
                 <w:webHidden/>
               </w:rPr>
-              <w:instrText xml:space="preserve"> PAGEREF _Toc242797229 \h </w:instrText>
+              <w:instrText xml:space="preserve"> PAGEREF _Toc242906253 \h </w:instrText>
             </w:r>
             <w:r>
               <w:rPr>
@@ -4208,7 +4424,7 @@
               <w14:ligatures w14:val="standardContextual"/>
             </w:rPr>
           </w:pPr>
-          <w:hyperlink w:anchor="_Toc242797230" w:history="1">
+          <w:hyperlink w:anchor="_Toc242906254" w:history="1">
             <w:r>
               <w:rPr>
                 <w:rStyle w:val="Hyperlink"/>
@@ -4236,7 +4452,7 @@
                 <w:noProof/>
                 <w:webHidden/>
               </w:rPr>
-              <w:instrText xml:space="preserve"> PAGEREF _Toc242797230 \h </w:instrText>
+              <w:instrText xml:space="preserve"> PAGEREF _Toc242906254 \h </w:instrText>
             </w:r>
             <w:r>
               <w:rPr>
@@ -4283,7 +4499,7 @@
               <w14:ligatures w14:val="standardContextual"/>
             </w:rPr>
           </w:pPr>
-          <w:hyperlink w:anchor="_Toc242797231" w:history="1">
+          <w:hyperlink w:anchor="_Toc242906255" w:history="1">
             <w:r>
               <w:rPr>
                 <w:rStyle w:val="Hyperlink"/>
@@ -4311,7 +4527,7 @@
                 <w:noProof/>
                 <w:webHidden/>
               </w:rPr>
-              <w:instrText xml:space="preserve"> PAGEREF _Toc242797231 \h </w:instrText>
+              <w:instrText xml:space="preserve"> PAGEREF _Toc242906255 \h </w:instrText>
             </w:r>
             <w:r>
               <w:rPr>
@@ -4358,7 +4574,7 @@
               <w14:ligatures w14:val="standardContextual"/>
             </w:rPr>
           </w:pPr>
-          <w:hyperlink w:anchor="_Toc242797232" w:history="1">
+          <w:hyperlink w:anchor="_Toc242906256" w:history="1">
             <w:r>
               <w:rPr>
                 <w:rStyle w:val="Hyperlink"/>
@@ -4386,7 +4602,7 @@
                 <w:noProof/>
                 <w:webHidden/>
               </w:rPr>
-              <w:instrText xml:space="preserve"> PAGEREF _Toc242797232 \h </w:instrText>
+              <w:instrText xml:space="preserve"> PAGEREF _Toc242906256 \h </w:instrText>
             </w:r>
             <w:r>
               <w:rPr>
@@ -4433,7 +4649,7 @@
               <w14:ligatures w14:val="standardContextual"/>
             </w:rPr>
           </w:pPr>
-          <w:hyperlink w:anchor="_Toc242797233" w:history="1">
+          <w:hyperlink w:anchor="_Toc242906257" w:history="1">
             <w:r>
               <w:rPr>
                 <w:rStyle w:val="Hyperlink"/>
@@ -4461,7 +4677,7 @@
                 <w:noProof/>
                 <w:webHidden/>
               </w:rPr>
-              <w:instrText xml:space="preserve"> PAGEREF _Toc242797233 \h </w:instrText>
+              <w:instrText xml:space="preserve"> PAGEREF _Toc242906257 \h </w:instrText>
             </w:r>
             <w:r>
               <w:rPr>
@@ -4508,7 +4724,7 @@
               <w14:ligatures w14:val="standardContextual"/>
             </w:rPr>
           </w:pPr>
-          <w:hyperlink w:anchor="_Toc242797234" w:history="1">
+          <w:hyperlink w:anchor="_Toc242906258" w:history="1">
             <w:r>
               <w:rPr>
                 <w:rStyle w:val="Hyperlink"/>
@@ -4537,7 +4753,7 @@
                 <w:noProof/>
                 <w:webHidden/>
               </w:rPr>
-              <w:instrText xml:space="preserve"> PAGEREF _Toc242797234 \h </w:instrText>
+              <w:instrText xml:space="preserve"> PAGEREF _Toc242906258 \h </w:instrText>
             </w:r>
             <w:r>
               <w:rPr>
@@ -4584,7 +4800,7 @@
               <w14:ligatures w14:val="standardContextual"/>
             </w:rPr>
           </w:pPr>
-          <w:hyperlink w:anchor="_Toc242797235" w:history="1">
+          <w:hyperlink w:anchor="_Toc242906259" w:history="1">
             <w:r>
               <w:rPr>
                 <w:rStyle w:val="Hyperlink"/>
@@ -4612,7 +4828,7 @@
                 <w:noProof/>
                 <w:webHidden/>
               </w:rPr>
-              <w:instrText xml:space="preserve"> PAGEREF _Toc242797235 \h </w:instrText>
+              <w:instrText xml:space="preserve"> PAGEREF _Toc242906259 \h </w:instrText>
             </w:r>
             <w:r>
               <w:rPr>
@@ -4659,7 +4875,7 @@
               <w14:ligatures w14:val="standardContextual"/>
             </w:rPr>
           </w:pPr>
-          <w:hyperlink w:anchor="_Toc242797236" w:history="1">
+          <w:hyperlink w:anchor="_Toc242906260" w:history="1">
             <w:r>
               <w:rPr>
                 <w:rStyle w:val="Hyperlink"/>
@@ -4687,7 +4903,7 @@
                 <w:noProof/>
                 <w:webHidden/>
               </w:rPr>
-              <w:instrText xml:space="preserve"> PAGEREF _Toc242797236 \h </w:instrText>
+              <w:instrText xml:space="preserve"> PAGEREF _Toc242906260 \h </w:instrText>
             </w:r>
             <w:r>
               <w:rPr>
@@ -4734,7 +4950,7 @@
               <w14:ligatures w14:val="standardContextual"/>
             </w:rPr>
           </w:pPr>
-          <w:hyperlink w:anchor="_Toc242797237" w:history="1">
+          <w:hyperlink w:anchor="_Toc242906261" w:history="1">
             <w:r>
               <w:rPr>
                 <w:rStyle w:val="Hyperlink"/>
@@ -4762,7 +4978,7 @@
                 <w:noProof/>
                 <w:webHidden/>
               </w:rPr>
-              <w:instrText xml:space="preserve"> PAGEREF _Toc242797237 \h </w:instrText>
+              <w:instrText xml:space="preserve"> PAGEREF _Toc242906261 \h </w:instrText>
             </w:r>
             <w:r>
               <w:rPr>
@@ -4809,7 +5025,7 @@
               <w14:ligatures w14:val="standardContextual"/>
             </w:rPr>
           </w:pPr>
-          <w:hyperlink w:anchor="_Toc242797238" w:history="1">
+          <w:hyperlink w:anchor="_Toc242906262" w:history="1">
             <w:r>
               <w:rPr>
                 <w:rStyle w:val="Hyperlink"/>
@@ -4836,7 +5052,7 @@
                 <w:noProof/>
                 <w:webHidden/>
               </w:rPr>
-              <w:instrText xml:space="preserve"> PAGEREF _Toc242797238 \h </w:instrText>
+              <w:instrText xml:space="preserve"> PAGEREF _Toc242906262 \h </w:instrText>
             </w:r>
             <w:r>
               <w:rPr>
@@ -4880,7 +5096,7 @@
               <w14:ligatures w14:val="standardContextual"/>
             </w:rPr>
           </w:pPr>
-          <w:hyperlink w:anchor="_Toc242797239" w:history="1">
+          <w:hyperlink w:anchor="_Toc242906263" w:history="1">
             <w:r>
               <w:rPr>
                 <w:rStyle w:val="Hyperlink"/>
@@ -4903,7 +5119,7 @@
               <w:rPr>
                 <w:webHidden/>
               </w:rPr>
-              <w:instrText xml:space="preserve"> PAGEREF _Toc242797239 \h </w:instrText>
+              <w:instrText xml:space="preserve"> PAGEREF _Toc242906263 \h </w:instrText>
             </w:r>
             <w:r>
               <w:rPr>
@@ -4946,7 +5162,7 @@
               <w14:ligatures w14:val="standardContextual"/>
             </w:rPr>
           </w:pPr>
-          <w:hyperlink w:anchor="_Toc242797240" w:history="1">
+          <w:hyperlink w:anchor="_Toc242906264" w:history="1">
             <w:r>
               <w:rPr>
                 <w:rStyle w:val="Hyperlink"/>
@@ -4974,7 +5190,7 @@
                 <w:noProof/>
                 <w:webHidden/>
               </w:rPr>
-              <w:instrText xml:space="preserve"> PAGEREF _Toc242797240 \h </w:instrText>
+              <w:instrText xml:space="preserve"> PAGEREF _Toc242906264 \h </w:instrText>
             </w:r>
             <w:r>
               <w:rPr>
@@ -5021,7 +5237,7 @@
               <w14:ligatures w14:val="standardContextual"/>
             </w:rPr>
           </w:pPr>
-          <w:hyperlink w:anchor="_Toc242797241" w:history="1">
+          <w:hyperlink w:anchor="_Toc242906265" w:history="1">
             <w:r>
               <w:rPr>
                 <w:rStyle w:val="Hyperlink"/>
@@ -5048,7 +5264,7 @@
                 <w:noProof/>
                 <w:webHidden/>
               </w:rPr>
-              <w:instrText xml:space="preserve"> PAGEREF _Toc242797241 \h </w:instrText>
+              <w:instrText xml:space="preserve"> PAGEREF _Toc242906265 \h </w:instrText>
             </w:r>
             <w:r>
               <w:rPr>
@@ -5095,7 +5311,7 @@
               <w14:ligatures w14:val="standardContextual"/>
             </w:rPr>
           </w:pPr>
-          <w:hyperlink w:anchor="_Toc242797242" w:history="1">
+          <w:hyperlink w:anchor="_Toc242906266" w:history="1">
             <w:r>
               <w:rPr>
                 <w:rStyle w:val="Hyperlink"/>
@@ -5122,7 +5338,7 @@
                 <w:noProof/>
                 <w:webHidden/>
               </w:rPr>
-              <w:instrText xml:space="preserve"> PAGEREF _Toc242797242 \h </w:instrText>
+              <w:instrText xml:space="preserve"> PAGEREF _Toc242906266 \h </w:instrText>
             </w:r>
             <w:r>
               <w:rPr>
@@ -5169,7 +5385,7 @@
               <w14:ligatures w14:val="standardContextual"/>
             </w:rPr>
           </w:pPr>
-          <w:hyperlink w:anchor="_Toc242797243" w:history="1">
+          <w:hyperlink w:anchor="_Toc242906267" w:history="1">
             <w:r>
               <w:rPr>
                 <w:rStyle w:val="Hyperlink"/>
@@ -5196,7 +5412,7 @@
                 <w:noProof/>
                 <w:webHidden/>
               </w:rPr>
-              <w:instrText xml:space="preserve"> PAGEREF _Toc242797243 \h </w:instrText>
+              <w:instrText xml:space="preserve"> PAGEREF _Toc242906267 \h </w:instrText>
             </w:r>
             <w:r>
               <w:rPr>
@@ -5243,7 +5459,7 @@
               <w14:ligatures w14:val="standardContextual"/>
             </w:rPr>
           </w:pPr>
-          <w:hyperlink w:anchor="_Toc242797244" w:history="1">
+          <w:hyperlink w:anchor="_Toc242906268" w:history="1">
             <w:r>
               <w:rPr>
                 <w:rStyle w:val="Hyperlink"/>
@@ -5270,7 +5486,7 @@
                 <w:noProof/>
                 <w:webHidden/>
               </w:rPr>
-              <w:instrText xml:space="preserve"> PAGEREF _Toc242797244 \h </w:instrText>
+              <w:instrText xml:space="preserve"> PAGEREF _Toc242906268 \h </w:instrText>
             </w:r>
             <w:r>
               <w:rPr>
@@ -5317,7 +5533,7 @@
               <w14:ligatures w14:val="standardContextual"/>
             </w:rPr>
           </w:pPr>
-          <w:hyperlink w:anchor="_Toc242797245" w:history="1">
+          <w:hyperlink w:anchor="_Toc242906269" w:history="1">
             <w:r>
               <w:rPr>
                 <w:rStyle w:val="Hyperlink"/>
@@ -5344,7 +5560,7 @@
                 <w:noProof/>
                 <w:webHidden/>
               </w:rPr>
-              <w:instrText xml:space="preserve"> PAGEREF _Toc242797245 \h </w:instrText>
+              <w:instrText xml:space="preserve"> PAGEREF _Toc242906269 \h </w:instrText>
             </w:r>
             <w:r>
               <w:rPr>
@@ -5391,7 +5607,7 @@
               <w14:ligatures w14:val="standardContextual"/>
             </w:rPr>
           </w:pPr>
-          <w:hyperlink w:anchor="_Toc242797246" w:history="1">
+          <w:hyperlink w:anchor="_Toc242906270" w:history="1">
             <w:r>
               <w:rPr>
                 <w:rStyle w:val="Hyperlink"/>
@@ -5418,7 +5634,7 @@
                 <w:noProof/>
                 <w:webHidden/>
               </w:rPr>
-              <w:instrText xml:space="preserve"> PAGEREF _Toc242797246 \h </w:instrText>
+              <w:instrText xml:space="preserve"> PAGEREF _Toc242906270 \h </w:instrText>
             </w:r>
             <w:r>
               <w:rPr>
@@ -5462,7 +5678,7 @@
               <w14:ligatures w14:val="standardContextual"/>
             </w:rPr>
           </w:pPr>
-          <w:hyperlink w:anchor="_Toc242797247" w:history="1">
+          <w:hyperlink w:anchor="_Toc242906271" w:history="1">
             <w:r>
               <w:rPr>
                 <w:rStyle w:val="Hyperlink"/>
@@ -5485,7 +5701,7 @@
               <w:rPr>
                 <w:webHidden/>
               </w:rPr>
-              <w:instrText xml:space="preserve"> PAGEREF _Toc242797247 \h </w:instrText>
+              <w:instrText xml:space="preserve"> PAGEREF _Toc242906271 \h </w:instrText>
             </w:r>
             <w:r>
               <w:rPr>
@@ -5528,7 +5744,7 @@
               <w14:ligatures w14:val="standardContextual"/>
             </w:rPr>
           </w:pPr>
-          <w:hyperlink w:anchor="_Toc242797248" w:history="1">
+          <w:hyperlink w:anchor="_Toc242906272" w:history="1">
             <w:r>
               <w:rPr>
                 <w:rStyle w:val="Hyperlink"/>
@@ -5555,7 +5771,7 @@
                 <w:noProof/>
                 <w:webHidden/>
               </w:rPr>
-              <w:instrText xml:space="preserve"> PAGEREF _Toc242797248 \h </w:instrText>
+              <w:instrText xml:space="preserve"> PAGEREF _Toc242906272 \h </w:instrText>
             </w:r>
             <w:r>
               <w:rPr>
@@ -5602,7 +5818,7 @@
               <w14:ligatures w14:val="standardContextual"/>
             </w:rPr>
           </w:pPr>
-          <w:hyperlink w:anchor="_Toc242797249" w:history="1">
+          <w:hyperlink w:anchor="_Toc242906273" w:history="1">
             <w:r>
               <w:rPr>
                 <w:rStyle w:val="Hyperlink"/>
@@ -5629,7 +5845,7 @@
                 <w:noProof/>
                 <w:webHidden/>
               </w:rPr>
-              <w:instrText xml:space="preserve"> PAGEREF _Toc242797249 \h </w:instrText>
+              <w:instrText xml:space="preserve"> PAGEREF _Toc242906273 \h </w:instrText>
             </w:r>
             <w:r>
               <w:rPr>
@@ -5676,7 +5892,7 @@
               <w14:ligatures w14:val="standardContextual"/>
             </w:rPr>
           </w:pPr>
-          <w:hyperlink w:anchor="_Toc242797250" w:history="1">
+          <w:hyperlink w:anchor="_Toc242906274" w:history="1">
             <w:r>
               <w:rPr>
                 <w:rStyle w:val="Hyperlink"/>
@@ -5703,7 +5919,7 @@
                 <w:noProof/>
                 <w:webHidden/>
               </w:rPr>
-              <w:instrText xml:space="preserve"> PAGEREF _Toc242797250 \h </w:instrText>
+              <w:instrText xml:space="preserve"> PAGEREF _Toc242906274 \h </w:instrText>
             </w:r>
             <w:r>
               <w:rPr>
@@ -5750,7 +5966,7 @@
               <w14:ligatures w14:val="standardContextual"/>
             </w:rPr>
           </w:pPr>
-          <w:hyperlink w:anchor="_Toc242797251" w:history="1">
+          <w:hyperlink w:anchor="_Toc242906275" w:history="1">
             <w:r>
               <w:rPr>
                 <w:rStyle w:val="Hyperlink"/>
@@ -5777,7 +5993,7 @@
                 <w:noProof/>
                 <w:webHidden/>
               </w:rPr>
-              <w:instrText xml:space="preserve"> PAGEREF _Toc242797251 \h </w:instrText>
+              <w:instrText xml:space="preserve"> PAGEREF _Toc242906275 \h </w:instrText>
             </w:r>
             <w:r>
               <w:rPr>
@@ -5824,7 +6040,7 @@
               <w14:ligatures w14:val="standardContextual"/>
             </w:rPr>
           </w:pPr>
-          <w:hyperlink w:anchor="_Toc242797252" w:history="1">
+          <w:hyperlink w:anchor="_Toc242906276" w:history="1">
             <w:r>
               <w:rPr>
                 <w:rStyle w:val="Hyperlink"/>
@@ -5851,7 +6067,7 @@
                 <w:noProof/>
                 <w:webHidden/>
               </w:rPr>
-              <w:instrText xml:space="preserve"> PAGEREF _Toc242797252 \h </w:instrText>
+              <w:instrText xml:space="preserve"> PAGEREF _Toc242906276 \h </w:instrText>
             </w:r>
             <w:r>
               <w:rPr>
@@ -5898,7 +6114,7 @@
               <w14:ligatures w14:val="standardContextual"/>
             </w:rPr>
           </w:pPr>
-          <w:hyperlink w:anchor="_Toc242797253" w:history="1">
+          <w:hyperlink w:anchor="_Toc242906277" w:history="1">
             <w:r>
               <w:rPr>
                 <w:rStyle w:val="Hyperlink"/>
@@ -5925,7 +6141,7 @@
                 <w:noProof/>
                 <w:webHidden/>
               </w:rPr>
-              <w:instrText xml:space="preserve"> PAGEREF _Toc242797253 \h </w:instrText>
+              <w:instrText xml:space="preserve"> PAGEREF _Toc242906277 \h </w:instrText>
             </w:r>
             <w:r>
               <w:rPr>
@@ -5972,7 +6188,7 @@
               <w14:ligatures w14:val="standardContextual"/>
             </w:rPr>
           </w:pPr>
-          <w:hyperlink w:anchor="_Toc242797254" w:history="1">
+          <w:hyperlink w:anchor="_Toc242906278" w:history="1">
             <w:r>
               <w:rPr>
                 <w:rStyle w:val="Hyperlink"/>
@@ -5999,7 +6215,7 @@
                 <w:noProof/>
                 <w:webHidden/>
               </w:rPr>
-              <w:instrText xml:space="preserve"> PAGEREF _Toc242797254 \h </w:instrText>
+              <w:instrText xml:space="preserve"> PAGEREF _Toc242906278 \h </w:instrText>
             </w:r>
             <w:r>
               <w:rPr>
@@ -6046,7 +6262,7 @@
               <w14:ligatures w14:val="standardContextual"/>
             </w:rPr>
           </w:pPr>
-          <w:hyperlink w:anchor="_Toc242797255" w:history="1">
+          <w:hyperlink w:anchor="_Toc242906279" w:history="1">
             <w:r>
               <w:rPr>
                 <w:rStyle w:val="Hyperlink"/>
@@ -6073,7 +6289,7 @@
                 <w:noProof/>
                 <w:webHidden/>
               </w:rPr>
-              <w:instrText xml:space="preserve"> PAGEREF _Toc242797255 \h </w:instrText>
+              <w:instrText xml:space="preserve"> PAGEREF _Toc242906279 \h </w:instrText>
             </w:r>
             <w:r>
               <w:rPr>
@@ -6120,7 +6336,7 @@
               <w14:ligatures w14:val="standardContextual"/>
             </w:rPr>
           </w:pPr>
-          <w:hyperlink w:anchor="_Toc242797256" w:history="1">
+          <w:hyperlink w:anchor="_Toc242906280" w:history="1">
             <w:r>
               <w:rPr>
                 <w:rStyle w:val="Hyperlink"/>
@@ -6147,7 +6363,7 @@
                 <w:noProof/>
                 <w:webHidden/>
               </w:rPr>
-              <w:instrText xml:space="preserve"> PAGEREF _Toc242797256 \h </w:instrText>
+              <w:instrText xml:space="preserve"> PAGEREF _Toc242906280 \h </w:instrText>
             </w:r>
             <w:r>
               <w:rPr>
@@ -6168,6 +6384,154 @@
                 <w:webHidden/>
               </w:rPr>
               <w:t>35</w:t>
+            </w:r>
+            <w:r>
+              <w:rPr>
+                <w:noProof/>
+                <w:webHidden/>
+              </w:rPr>
+              <w:fldChar w:fldCharType="end"/>
+            </w:r>
+          </w:hyperlink>
+        </w:p>
+        <w:p>
+          <w:pPr>
+            <w:pStyle w:val="Sumrio3"/>
+            <w:tabs>
+              <w:tab w:val="right" w:leader="dot" w:pos="9061"/>
+            </w:tabs>
+            <w:rPr>
+              <w:rFonts w:asciiTheme="minorHAnsi" w:eastAsiaTheme="minorEastAsia" w:hAnsiTheme="minorHAnsi"/>
+              <w:noProof/>
+              <w:kern w:val="2"/>
+              <w:sz w:val="24"/>
+              <w:szCs w:val="24"/>
+              <w:lang w:eastAsia="pt-BR"/>
+              <w14:ligatures w14:val="standardContextual"/>
+            </w:rPr>
+          </w:pPr>
+          <w:hyperlink w:anchor="_Toc242906281" w:history="1">
+            <w:r>
+              <w:rPr>
+                <w:rStyle w:val="Hyperlink"/>
+                <w:noProof/>
+              </w:rPr>
+              <w:t>4.2.8 Requisitos Funcionais dos Operadores</w:t>
+            </w:r>
+            <w:r>
+              <w:rPr>
+                <w:noProof/>
+                <w:webHidden/>
+              </w:rPr>
+              <w:tab/>
+            </w:r>
+            <w:r>
+              <w:rPr>
+                <w:noProof/>
+                <w:webHidden/>
+              </w:rPr>
+              <w:fldChar w:fldCharType="begin"/>
+            </w:r>
+            <w:r>
+              <w:rPr>
+                <w:noProof/>
+                <w:webHidden/>
+              </w:rPr>
+              <w:instrText xml:space="preserve"> PAGEREF _Toc242906281 \h </w:instrText>
+            </w:r>
+            <w:r>
+              <w:rPr>
+                <w:noProof/>
+                <w:webHidden/>
+              </w:rPr>
+            </w:r>
+            <w:r>
+              <w:rPr>
+                <w:noProof/>
+                <w:webHidden/>
+              </w:rPr>
+              <w:fldChar w:fldCharType="separate"/>
+            </w:r>
+            <w:r>
+              <w:rPr>
+                <w:noProof/>
+                <w:webHidden/>
+              </w:rPr>
+              <w:t>36</w:t>
+            </w:r>
+            <w:r>
+              <w:rPr>
+                <w:noProof/>
+                <w:webHidden/>
+              </w:rPr>
+              <w:fldChar w:fldCharType="end"/>
+            </w:r>
+          </w:hyperlink>
+        </w:p>
+        <w:p>
+          <w:pPr>
+            <w:pStyle w:val="Sumrio3"/>
+            <w:tabs>
+              <w:tab w:val="right" w:leader="dot" w:pos="9061"/>
+            </w:tabs>
+            <w:rPr>
+              <w:rFonts w:asciiTheme="minorHAnsi" w:eastAsiaTheme="minorEastAsia" w:hAnsiTheme="minorHAnsi"/>
+              <w:noProof/>
+              <w:kern w:val="2"/>
+              <w:sz w:val="24"/>
+              <w:szCs w:val="24"/>
+              <w:lang w:eastAsia="pt-BR"/>
+              <w14:ligatures w14:val="standardContextual"/>
+            </w:rPr>
+          </w:pPr>
+          <w:hyperlink w:anchor="_Toc242906282" w:history="1">
+            <w:r>
+              <w:rPr>
+                <w:rStyle w:val="Hyperlink"/>
+                <w:noProof/>
+              </w:rPr>
+              <w:t>4.2.9 Requisitos Funcionais dos Motivos de Pausa</w:t>
+            </w:r>
+            <w:r>
+              <w:rPr>
+                <w:noProof/>
+                <w:webHidden/>
+              </w:rPr>
+              <w:tab/>
+            </w:r>
+            <w:r>
+              <w:rPr>
+                <w:noProof/>
+                <w:webHidden/>
+              </w:rPr>
+              <w:fldChar w:fldCharType="begin"/>
+            </w:r>
+            <w:r>
+              <w:rPr>
+                <w:noProof/>
+                <w:webHidden/>
+              </w:rPr>
+              <w:instrText xml:space="preserve"> PAGEREF _Toc242906282 \h </w:instrText>
+            </w:r>
+            <w:r>
+              <w:rPr>
+                <w:noProof/>
+                <w:webHidden/>
+              </w:rPr>
+            </w:r>
+            <w:r>
+              <w:rPr>
+                <w:noProof/>
+                <w:webHidden/>
+              </w:rPr>
+              <w:fldChar w:fldCharType="separate"/>
+            </w:r>
+            <w:r>
+              <w:rPr>
+                <w:noProof/>
+                <w:webHidden/>
+              </w:rPr>
+              <w:t>37</w:t>
             </w:r>
             <w:r>
               <w:rPr>
@@ -6194,7 +6558,7 @@
               <w14:ligatures w14:val="standardContextual"/>
             </w:rPr>
           </w:pPr>
-          <w:hyperlink w:anchor="_Toc242797257" w:history="1">
+          <w:hyperlink w:anchor="_Toc242906283" w:history="1">
             <w:r>
               <w:rPr>
                 <w:rStyle w:val="Hyperlink"/>
@@ -6221,7 +6585,7 @@
                 <w:noProof/>
                 <w:webHidden/>
               </w:rPr>
-              <w:instrText xml:space="preserve"> PAGEREF _Toc242797257 \h </w:instrText>
+              <w:instrText xml:space="preserve"> PAGEREF _Toc242906283 \h </w:instrText>
             </w:r>
             <w:r>
               <w:rPr>
@@ -6241,7 +6605,7 @@
                 <w:noProof/>
                 <w:webHidden/>
               </w:rPr>
-              <w:t>36</w:t>
+              <w:t>38</w:t>
             </w:r>
             <w:r>
               <w:rPr>
@@ -6268,7 +6632,7 @@
               <w14:ligatures w14:val="standardContextual"/>
             </w:rPr>
           </w:pPr>
-          <w:hyperlink w:anchor="_Toc242797258" w:history="1">
+          <w:hyperlink w:anchor="_Toc242906284" w:history="1">
             <w:r>
               <w:rPr>
                 <w:rStyle w:val="Hyperlink"/>
@@ -6295,7 +6659,7 @@
                 <w:noProof/>
                 <w:webHidden/>
               </w:rPr>
-              <w:instrText xml:space="preserve"> PAGEREF _Toc242797258 \h </w:instrText>
+              <w:instrText xml:space="preserve"> PAGEREF _Toc242906284 \h </w:instrText>
             </w:r>
             <w:r>
               <w:rPr>
@@ -6315,7 +6679,7 @@
                 <w:noProof/>
                 <w:webHidden/>
               </w:rPr>
-              <w:t>36</w:t>
+              <w:t>38</w:t>
             </w:r>
             <w:r>
               <w:rPr>
@@ -6342,7 +6706,7 @@
               <w14:ligatures w14:val="standardContextual"/>
             </w:rPr>
           </w:pPr>
-          <w:hyperlink w:anchor="_Toc242797259" w:history="1">
+          <w:hyperlink w:anchor="_Toc242906285" w:history="1">
             <w:r>
               <w:rPr>
                 <w:rStyle w:val="Hyperlink"/>
@@ -6369,7 +6733,7 @@
                 <w:noProof/>
                 <w:webHidden/>
               </w:rPr>
-              <w:instrText xml:space="preserve"> PAGEREF _Toc242797259 \h </w:instrText>
+              <w:instrText xml:space="preserve"> PAGEREF _Toc242906285 \h </w:instrText>
             </w:r>
             <w:r>
               <w:rPr>
@@ -6389,7 +6753,7 @@
                 <w:noProof/>
                 <w:webHidden/>
               </w:rPr>
-              <w:t>38</w:t>
+              <w:t>40</w:t>
             </w:r>
             <w:r>
               <w:rPr>
@@ -6416,7 +6780,7 @@
               <w14:ligatures w14:val="standardContextual"/>
             </w:rPr>
           </w:pPr>
-          <w:hyperlink w:anchor="_Toc242797260" w:history="1">
+          <w:hyperlink w:anchor="_Toc242906286" w:history="1">
             <w:r>
               <w:rPr>
                 <w:rStyle w:val="Hyperlink"/>
@@ -6443,7 +6807,7 @@
                 <w:noProof/>
                 <w:webHidden/>
               </w:rPr>
-              <w:instrText xml:space="preserve"> PAGEREF _Toc242797260 \h </w:instrText>
+              <w:instrText xml:space="preserve"> PAGEREF _Toc242906286 \h </w:instrText>
             </w:r>
             <w:r>
               <w:rPr>
@@ -6463,7 +6827,7 @@
                 <w:noProof/>
                 <w:webHidden/>
               </w:rPr>
-              <w:t>41</w:t>
+              <w:t>43</w:t>
             </w:r>
             <w:r>
               <w:rPr>
@@ -6487,12 +6851,12 @@
               <w14:ligatures w14:val="standardContextual"/>
             </w:rPr>
           </w:pPr>
-          <w:hyperlink w:anchor="_Toc242797261" w:history="1">
+          <w:hyperlink w:anchor="_Toc242906287" w:history="1">
             <w:r>
               <w:rPr>
                 <w:rStyle w:val="Hyperlink"/>
               </w:rPr>
-              <w:t>5. DIAGRAMA DE BANCO DE DADOS</w:t>
+              <w:t>5. MODELAGEM DO SISTEMA</w:t>
             </w:r>
             <w:r>
               <w:rPr>
@@ -6510,7 +6874,7 @@
               <w:rPr>
                 <w:webHidden/>
               </w:rPr>
-              <w:instrText xml:space="preserve"> PAGEREF _Toc242797261 \h </w:instrText>
+              <w:instrText xml:space="preserve"> PAGEREF _Toc242906287 \h </w:instrText>
             </w:r>
             <w:r>
               <w:rPr>
@@ -6527,7 +6891,7 @@
               <w:rPr>
                 <w:webHidden/>
               </w:rPr>
-              <w:t>42</w:t>
+              <w:t>44</w:t>
             </w:r>
             <w:r>
               <w:rPr>
@@ -6553,7 +6917,7 @@
               <w14:ligatures w14:val="standardContextual"/>
             </w:rPr>
           </w:pPr>
-          <w:hyperlink w:anchor="_Toc242797262" w:history="1">
+          <w:hyperlink w:anchor="_Toc242906288" w:history="1">
             <w:r>
               <w:rPr>
                 <w:rStyle w:val="Hyperlink"/>
@@ -6580,7 +6944,7 @@
                 <w:noProof/>
                 <w:webHidden/>
               </w:rPr>
-              <w:instrText xml:space="preserve"> PAGEREF _Toc242797262 \h </w:instrText>
+              <w:instrText xml:space="preserve"> PAGEREF _Toc242906288 \h </w:instrText>
             </w:r>
             <w:r>
               <w:rPr>
@@ -6600,7 +6964,7 @@
                 <w:noProof/>
                 <w:webHidden/>
               </w:rPr>
-              <w:t>42</w:t>
+              <w:t>44</w:t>
             </w:r>
             <w:r>
               <w:rPr>
@@ -6627,7 +6991,7 @@
               <w14:ligatures w14:val="standardContextual"/>
             </w:rPr>
           </w:pPr>
-          <w:hyperlink w:anchor="_Toc242797263" w:history="1">
+          <w:hyperlink w:anchor="_Toc242906289" w:history="1">
             <w:r>
               <w:rPr>
                 <w:rStyle w:val="Hyperlink"/>
@@ -6654,7 +7018,7 @@
                 <w:noProof/>
                 <w:webHidden/>
               </w:rPr>
-              <w:instrText xml:space="preserve"> PAGEREF _Toc242797263 \h </w:instrText>
+              <w:instrText xml:space="preserve"> PAGEREF _Toc242906289 \h </w:instrText>
             </w:r>
             <w:r>
               <w:rPr>
@@ -6674,7 +7038,81 @@
                 <w:noProof/>
                 <w:webHidden/>
               </w:rPr>
-              <w:t>45</w:t>
+              <w:t>47</w:t>
+            </w:r>
+            <w:r>
+              <w:rPr>
+                <w:noProof/>
+                <w:webHidden/>
+              </w:rPr>
+              <w:fldChar w:fldCharType="end"/>
+            </w:r>
+          </w:hyperlink>
+        </w:p>
+        <w:p>
+          <w:pPr>
+            <w:pStyle w:val="Sumrio2"/>
+            <w:tabs>
+              <w:tab w:val="right" w:leader="dot" w:pos="9061"/>
+            </w:tabs>
+            <w:rPr>
+              <w:rFonts w:asciiTheme="minorHAnsi" w:eastAsiaTheme="minorEastAsia" w:hAnsiTheme="minorHAnsi"/>
+              <w:noProof/>
+              <w:kern w:val="2"/>
+              <w:sz w:val="24"/>
+              <w:szCs w:val="24"/>
+              <w:lang w:eastAsia="pt-BR"/>
+              <w14:ligatures w14:val="standardContextual"/>
+            </w:rPr>
+          </w:pPr>
+          <w:hyperlink w:anchor="_Toc242906290" w:history="1">
+            <w:r>
+              <w:rPr>
+                <w:rStyle w:val="Hyperlink"/>
+                <w:noProof/>
+              </w:rPr>
+              <w:t>5.3 Diagrama de Casos de Uso</w:t>
+            </w:r>
+            <w:r>
+              <w:rPr>
+                <w:noProof/>
+                <w:webHidden/>
+              </w:rPr>
+              <w:tab/>
+            </w:r>
+            <w:r>
+              <w:rPr>
+                <w:noProof/>
+                <w:webHidden/>
+              </w:rPr>
+              <w:fldChar w:fldCharType="begin"/>
+            </w:r>
+            <w:r>
+              <w:rPr>
+                <w:noProof/>
+                <w:webHidden/>
+              </w:rPr>
+              <w:instrText xml:space="preserve"> PAGEREF _Toc242906290 \h </w:instrText>
+            </w:r>
+            <w:r>
+              <w:rPr>
+                <w:noProof/>
+                <w:webHidden/>
+              </w:rPr>
+            </w:r>
+            <w:r>
+              <w:rPr>
+                <w:noProof/>
+                <w:webHidden/>
+              </w:rPr>
+              <w:fldChar w:fldCharType="separate"/>
+            </w:r>
+            <w:r>
+              <w:rPr>
+                <w:noProof/>
+                <w:webHidden/>
+              </w:rPr>
+              <w:t>49</w:t>
             </w:r>
             <w:r>
               <w:rPr>
@@ -6698,7 +7136,7 @@
               <w14:ligatures w14:val="standardContextual"/>
             </w:rPr>
           </w:pPr>
-          <w:hyperlink w:anchor="_Toc242797264" w:history="1">
+          <w:hyperlink w:anchor="_Toc242906291" w:history="1">
             <w:r>
               <w:rPr>
                 <w:rStyle w:val="Hyperlink"/>
@@ -6721,7 +7159,7 @@
               <w:rPr>
                 <w:webHidden/>
               </w:rPr>
-              <w:instrText xml:space="preserve"> PAGEREF _Toc242797264 \h </w:instrText>
+              <w:instrText xml:space="preserve"> PAGEREF _Toc242906291 \h </w:instrText>
             </w:r>
             <w:r>
               <w:rPr>
@@ -6738,7 +7176,7 @@
               <w:rPr>
                 <w:webHidden/>
               </w:rPr>
-              <w:t>47</w:t>
+              <w:t>51</w:t>
             </w:r>
             <w:r>
               <w:rPr>
@@ -6785,7 +7223,7 @@
         <w:pStyle w:val="Ttulo1"/>
         <w:spacing w:after="100" w:afterAutospacing="1" w:line="360" w:lineRule="auto"/>
       </w:pPr>
-      <w:bookmarkStart w:id="0" w:name="_Toc242797221"/>
+      <w:bookmarkStart w:id="0" w:name="_Toc242906245"/>
       <w:r>
         <w:rPr>
           <w:sz w:val="24"/>
@@ -6803,7 +7241,7 @@
           <w:rFonts w:cs="Arial"/>
         </w:rPr>
       </w:pPr>
-      <w:bookmarkStart w:id="1" w:name="_Toc242797222"/>
+      <w:bookmarkStart w:id="1" w:name="_Toc242906246"/>
       <w:r>
         <w:rPr>
           <w:rFonts w:cs="Arial"/>
@@ -6901,7 +7339,7 @@
           <w:rFonts w:cs="Arial"/>
         </w:rPr>
       </w:pPr>
-      <w:bookmarkStart w:id="2" w:name="_Toc242797223"/>
+      <w:bookmarkStart w:id="2" w:name="_Toc242906247"/>
       <w:r>
         <w:rPr>
           <w:rFonts w:cs="Arial"/>
@@ -6939,7 +7377,7 @@
           <w:rFonts w:cs="Arial"/>
         </w:rPr>
       </w:pPr>
-      <w:bookmarkStart w:id="3" w:name="_Toc242797224"/>
+      <w:bookmarkStart w:id="3" w:name="_Toc242906248"/>
       <w:r>
         <w:rPr>
           <w:rFonts w:cs="Arial"/>
@@ -6954,7 +7392,7 @@
         <w:pStyle w:val="Ttulo3"/>
         <w:spacing w:before="100" w:beforeAutospacing="1" w:after="100" w:afterAutospacing="1" w:line="360" w:lineRule="auto"/>
       </w:pPr>
-      <w:bookmarkStart w:id="4" w:name="_Toc242797225"/>
+      <w:bookmarkStart w:id="4" w:name="_Toc242906249"/>
       <w:r>
         <w:t>1.3.1 Objetivo Geral</w:t>
       </w:r>
@@ -6989,7 +7427,7 @@
           <w:i/>
         </w:rPr>
       </w:pPr>
-      <w:bookmarkStart w:id="5" w:name="_Toc242797226"/>
+      <w:bookmarkStart w:id="5" w:name="_Toc242906250"/>
       <w:r>
         <w:t>1.3.2 Objetivos Específicos</w:t>
       </w:r>
@@ -7195,7 +7633,7 @@
           <w:rFonts w:cs="Arial"/>
         </w:rPr>
       </w:pPr>
-      <w:bookmarkStart w:id="6" w:name="_Toc242797227"/>
+      <w:bookmarkStart w:id="6" w:name="_Toc242906251"/>
       <w:r>
         <w:rPr>
           <w:rFonts w:cs="Arial"/>
@@ -7272,7 +7710,7 @@
           <w:rFonts w:cs="Arial"/>
         </w:rPr>
       </w:pPr>
-      <w:bookmarkStart w:id="7" w:name="_Toc242797228"/>
+      <w:bookmarkStart w:id="7" w:name="_Toc242906252"/>
       <w:r>
         <w:rPr>
           <w:rFonts w:cs="Arial"/>
@@ -7424,7 +7862,7 @@
           <w:sz w:val="24"/>
         </w:rPr>
       </w:pPr>
-      <w:bookmarkStart w:id="8" w:name="_Toc242797229"/>
+      <w:bookmarkStart w:id="8" w:name="_Toc242906253"/>
       <w:r>
         <w:rPr>
           <w:sz w:val="24"/>
@@ -7442,7 +7880,7 @@
           <w:rFonts w:cs="Arial"/>
         </w:rPr>
       </w:pPr>
-      <w:bookmarkStart w:id="9" w:name="_Toc242797230"/>
+      <w:bookmarkStart w:id="9" w:name="_Toc242906254"/>
       <w:r>
         <w:rPr>
           <w:rFonts w:cs="Arial"/>
@@ -7552,7 +7990,7 @@
           <w:rFonts w:cs="Arial"/>
         </w:rPr>
       </w:pPr>
-      <w:bookmarkStart w:id="10" w:name="_Toc242797231"/>
+      <w:bookmarkStart w:id="10" w:name="_Toc242906255"/>
       <w:r>
         <w:rPr>
           <w:rFonts w:cs="Arial"/>
@@ -7688,7 +8126,7 @@
         <w:pStyle w:val="Legenda"/>
         <w:keepNext/>
       </w:pPr>
-      <w:bookmarkStart w:id="11" w:name="_Toc242797203"/>
+      <w:bookmarkStart w:id="11" w:name="_Toc242906292"/>
       <w:r>
         <w:lastRenderedPageBreak/>
         <w:t xml:space="preserve">Figura </w:t>
@@ -7729,7 +8167,7 @@
           <w:noProof/>
         </w:rPr>
         <w:drawing>
-          <wp:inline distT="0" distB="0" distL="0" distR="0" wp14:anchorId="7978F728" wp14:editId="30AEA8F3">
+          <wp:inline distT="0" distB="0" distL="0" distR="0" wp14:anchorId="057D97C3" wp14:editId="3E33C25F">
             <wp:extent cx="5486400" cy="2022437"/>
             <wp:effectExtent l="0" t="0" r="0" b="0"/>
             <wp:docPr id="101" name="fig_gargalo"/>
@@ -7801,7 +8239,7 @@
           <w:rFonts w:cs="Arial"/>
         </w:rPr>
       </w:pPr>
-      <w:bookmarkStart w:id="12" w:name="_Toc242797232"/>
+      <w:bookmarkStart w:id="12" w:name="_Toc242906256"/>
       <w:r>
         <w:rPr>
           <w:rFonts w:cs="Arial"/>
@@ -7917,7 +8355,7 @@
         <w:pStyle w:val="Legenda"/>
         <w:keepNext/>
       </w:pPr>
-      <w:bookmarkStart w:id="13" w:name="_Toc242797204"/>
+      <w:bookmarkStart w:id="13" w:name="_Toc242906293"/>
       <w:r>
         <w:t xml:space="preserve">Figura </w:t>
       </w:r>
@@ -7957,7 +8395,7 @@
           <w:noProof/>
         </w:rPr>
         <w:drawing>
-          <wp:inline distT="0" distB="0" distL="0" distR="0" wp14:anchorId="37945003" wp14:editId="4FCE65D8">
+          <wp:inline distT="0" distB="0" distL="0" distR="0" wp14:anchorId="62B488A2" wp14:editId="42EA8BB0">
             <wp:extent cx="5486400" cy="2051249"/>
             <wp:effectExtent l="0" t="0" r="0" b="0"/>
             <wp:docPr id="102" name="fig_nivelamento"/>
@@ -8025,7 +8463,7 @@
           <w:rFonts w:cs="Arial"/>
         </w:rPr>
       </w:pPr>
-      <w:bookmarkStart w:id="14" w:name="_Toc242797233"/>
+      <w:bookmarkStart w:id="14" w:name="_Toc242906257"/>
       <w:r>
         <w:rPr>
           <w:rFonts w:cs="Arial"/>
@@ -8146,7 +8584,7 @@
           <w:lang w:val="en-US"/>
         </w:rPr>
       </w:pPr>
-      <w:bookmarkStart w:id="15" w:name="_Toc242797234"/>
+      <w:bookmarkStart w:id="15" w:name="_Toc242906258"/>
       <w:r>
         <w:rPr>
           <w:rFonts w:cs="Arial"/>
@@ -8356,7 +8794,7 @@
         <w:pStyle w:val="Legenda"/>
         <w:keepNext/>
       </w:pPr>
-      <w:bookmarkStart w:id="16" w:name="_Toc242797205"/>
+      <w:bookmarkStart w:id="16" w:name="_Toc242906294"/>
       <w:r>
         <w:t xml:space="preserve">Figura </w:t>
       </w:r>
@@ -8396,7 +8834,7 @@
           <w:noProof/>
         </w:rPr>
         <w:drawing>
-          <wp:inline distT="0" distB="0" distL="0" distR="0" wp14:anchorId="3C25F8BE" wp14:editId="17C472BC">
+          <wp:inline distT="0" distB="0" distL="0" distR="0" wp14:anchorId="3AFDBACD" wp14:editId="32F41879">
             <wp:extent cx="5486400" cy="3543069"/>
             <wp:effectExtent l="0" t="0" r="0" b="0"/>
             <wp:docPr id="103" name="fig_mes"/>
@@ -8464,7 +8902,7 @@
           <w:rFonts w:cs="Arial"/>
         </w:rPr>
       </w:pPr>
-      <w:bookmarkStart w:id="17" w:name="_Toc242797235"/>
+      <w:bookmarkStart w:id="17" w:name="_Toc242906259"/>
       <w:r>
         <w:rPr>
           <w:rFonts w:cs="Arial"/>
@@ -8654,7 +9092,7 @@
           <w:rFonts w:cs="Arial"/>
         </w:rPr>
       </w:pPr>
-      <w:bookmarkStart w:id="18" w:name="_Toc242797236"/>
+      <w:bookmarkStart w:id="18" w:name="_Toc242906260"/>
       <w:r>
         <w:rPr>
           <w:rFonts w:cs="Arial"/>
@@ -8855,7 +9293,7 @@
         <w:pStyle w:val="Legenda"/>
         <w:keepNext/>
       </w:pPr>
-      <w:bookmarkStart w:id="19" w:name="_Toc242797206"/>
+      <w:bookmarkStart w:id="19" w:name="_Toc242906295"/>
       <w:r>
         <w:t xml:space="preserve">Figura </w:t>
       </w:r>
@@ -8895,7 +9333,7 @@
           <w:noProof/>
         </w:rPr>
         <w:drawing>
-          <wp:inline distT="0" distB="0" distL="0" distR="0" wp14:anchorId="66724460" wp14:editId="48B60BEA">
+          <wp:inline distT="0" distB="0" distL="0" distR="0" wp14:anchorId="595BB72B" wp14:editId="2E8EC4F7">
             <wp:extent cx="5486400" cy="1791916"/>
             <wp:effectExtent l="0" t="0" r="0" b="0"/>
             <wp:docPr id="104" name="fig_arq"/>
@@ -8964,7 +9402,7 @@
           <w:u w:val="single"/>
         </w:rPr>
       </w:pPr>
-      <w:bookmarkStart w:id="20" w:name="_Toc242797237"/>
+      <w:bookmarkStart w:id="20" w:name="_Toc242906261"/>
       <w:r>
         <w:rPr>
           <w:rFonts w:cs="Arial"/>
@@ -9078,7 +9516,7 @@
         <w:pStyle w:val="Ttulo2"/>
         <w:spacing w:line="360" w:lineRule="auto"/>
       </w:pPr>
-      <w:bookmarkStart w:id="21" w:name="_Toc242797238"/>
+      <w:bookmarkStart w:id="21" w:name="_Toc242906262"/>
       <w:r>
         <w:t>2.9 Considerações sobre a Utilização de Sistemas para Nivelamento de Processos</w:t>
       </w:r>
@@ -9216,7 +9654,7 @@
           <w:sz w:val="24"/>
         </w:rPr>
       </w:pPr>
-      <w:bookmarkStart w:id="22" w:name="_Toc242797239"/>
+      <w:bookmarkStart w:id="22" w:name="_Toc242906263"/>
       <w:r>
         <w:rPr>
           <w:sz w:val="24"/>
@@ -9235,7 +9673,7 @@
           <w:szCs w:val="24"/>
         </w:rPr>
       </w:pPr>
-      <w:bookmarkStart w:id="23" w:name="_Toc242797240"/>
+      <w:bookmarkStart w:id="23" w:name="_Toc242906264"/>
       <w:r>
         <w:rPr>
           <w:rFonts w:cs="Arial"/>
@@ -9341,7 +9779,7 @@
         <w:pStyle w:val="Ttulo2"/>
         <w:spacing w:line="360" w:lineRule="auto"/>
       </w:pPr>
-      <w:bookmarkStart w:id="24" w:name="_Toc242797241"/>
+      <w:bookmarkStart w:id="24" w:name="_Toc242906265"/>
       <w:r>
         <w:t>3.2 Métodos Utilizados</w:t>
       </w:r>
@@ -9611,7 +10049,7 @@
         <w:pStyle w:val="Ttulo2"/>
         <w:spacing w:before="100" w:beforeAutospacing="1" w:after="100" w:afterAutospacing="1" w:line="360" w:lineRule="auto"/>
       </w:pPr>
-      <w:bookmarkStart w:id="25" w:name="_Toc242797242"/>
+      <w:bookmarkStart w:id="25" w:name="_Toc242906266"/>
       <w:r>
         <w:t>3.3 Ferramentas e Tecnologias Utilizadas</w:t>
       </w:r>
@@ -9622,7 +10060,7 @@
         <w:pStyle w:val="Ttulo3"/>
         <w:spacing w:before="100" w:beforeAutospacing="1" w:after="100" w:afterAutospacing="1" w:line="360" w:lineRule="auto"/>
       </w:pPr>
-      <w:bookmarkStart w:id="26" w:name="_Toc242797243"/>
+      <w:bookmarkStart w:id="26" w:name="_Toc242906267"/>
       <w:r>
         <w:t>3.3.1 Linguagens de Programação</w:t>
       </w:r>
@@ -9845,7 +10283,7 @@
         <w:pStyle w:val="Ttulo3"/>
         <w:spacing w:line="360" w:lineRule="auto"/>
       </w:pPr>
-      <w:bookmarkStart w:id="27" w:name="_Toc242797244"/>
+      <w:bookmarkStart w:id="27" w:name="_Toc242906268"/>
       <w:r>
         <w:lastRenderedPageBreak/>
         <w:t>3.3.2 Framework</w:t>
@@ -10022,7 +10460,7 @@
         <w:pStyle w:val="Ttulo3"/>
         <w:spacing w:line="360" w:lineRule="auto"/>
       </w:pPr>
-      <w:bookmarkStart w:id="28" w:name="_Toc242797245"/>
+      <w:bookmarkStart w:id="28" w:name="_Toc242906269"/>
       <w:r>
         <w:t>3.3.3 Banco de Dados</w:t>
       </w:r>
@@ -10112,7 +10550,7 @@
       <w:pPr>
         <w:pStyle w:val="Ttulo2"/>
       </w:pPr>
-      <w:bookmarkStart w:id="29" w:name="_Toc242797246"/>
+      <w:bookmarkStart w:id="29" w:name="_Toc242906270"/>
       <w:r>
         <w:lastRenderedPageBreak/>
         <w:t>3.4 Etapas do Desenvolvimento</w:t>
@@ -10439,7 +10877,7 @@
           <w:sz w:val="24"/>
         </w:rPr>
       </w:pPr>
-      <w:bookmarkStart w:id="30" w:name="_Toc242797247"/>
+      <w:bookmarkStart w:id="30" w:name="_Toc242906271"/>
       <w:r>
         <w:rPr>
           <w:sz w:val="24"/>
@@ -10453,7 +10891,7 @@
       <w:pPr>
         <w:pStyle w:val="Ttulo2"/>
       </w:pPr>
-      <w:bookmarkStart w:id="31" w:name="_Toc242797248"/>
+      <w:bookmarkStart w:id="31" w:name="_Toc242906272"/>
       <w:r>
         <w:t>4.1 Descrição do Problema</w:t>
       </w:r>
@@ -10564,7 +11002,7 @@
         <w:pStyle w:val="Ttulo2"/>
         <w:spacing w:line="360" w:lineRule="auto"/>
       </w:pPr>
-      <w:bookmarkStart w:id="32" w:name="_Toc242797249"/>
+      <w:bookmarkStart w:id="32" w:name="_Toc242906273"/>
       <w:r>
         <w:lastRenderedPageBreak/>
         <w:t>4.2 Requisitos Funcionais</w:t>
@@ -10576,7 +11014,7 @@
         <w:pStyle w:val="Ttulo3"/>
         <w:spacing w:line="360" w:lineRule="auto"/>
       </w:pPr>
-      <w:bookmarkStart w:id="33" w:name="_Toc242797250"/>
+      <w:bookmarkStart w:id="33" w:name="_Toc242906274"/>
       <w:r>
         <w:t>4.2.1 Requisitos Funcionais da Tela de Login</w:t>
       </w:r>
@@ -10607,7 +11045,7 @@
         <w:pStyle w:val="Legenda"/>
         <w:keepNext/>
       </w:pPr>
-      <w:bookmarkStart w:id="34" w:name="_Toc242797213"/>
+      <w:bookmarkStart w:id="34" w:name="_Toc242906303"/>
       <w:r>
         <w:t xml:space="preserve">Tabela </w:t>
       </w:r>
@@ -11297,7 +11735,7 @@
         <w:pStyle w:val="Ttulo3"/>
         <w:spacing w:line="360" w:lineRule="auto"/>
       </w:pPr>
-      <w:bookmarkStart w:id="35" w:name="_Toc242797251"/>
+      <w:bookmarkStart w:id="35" w:name="_Toc242906275"/>
       <w:r>
         <w:lastRenderedPageBreak/>
         <w:t>4.2.2 Requisitos Funcionais da Tela de Cadastro de Setores</w:t>
@@ -11329,7 +11767,7 @@
         <w:pStyle w:val="Legenda"/>
         <w:keepNext/>
       </w:pPr>
-      <w:bookmarkStart w:id="36" w:name="_Toc242797214"/>
+      <w:bookmarkStart w:id="36" w:name="_Toc242906304"/>
       <w:r>
         <w:t xml:space="preserve">Tabela </w:t>
       </w:r>
@@ -12135,7 +12573,7 @@
         <w:pStyle w:val="Ttulo3"/>
         <w:spacing w:line="360" w:lineRule="auto"/>
       </w:pPr>
-      <w:bookmarkStart w:id="37" w:name="_Toc242797252"/>
+      <w:bookmarkStart w:id="37" w:name="_Toc242906276"/>
       <w:r>
         <w:lastRenderedPageBreak/>
         <w:t xml:space="preserve">4.2.3 Requisitos Funcionais da Tela de Cadastro de </w:t>
@@ -12170,7 +12608,7 @@
         <w:pStyle w:val="Legenda"/>
         <w:keepNext/>
       </w:pPr>
-      <w:bookmarkStart w:id="38" w:name="_Toc242797215"/>
+      <w:bookmarkStart w:id="38" w:name="_Toc242906305"/>
       <w:r>
         <w:t xml:space="preserve">Tabela </w:t>
       </w:r>
@@ -12976,7 +13414,7 @@
         <w:pStyle w:val="Ttulo3"/>
         <w:spacing w:line="360" w:lineRule="auto"/>
       </w:pPr>
-      <w:bookmarkStart w:id="39" w:name="_Toc242797253"/>
+      <w:bookmarkStart w:id="39" w:name="_Toc242906277"/>
       <w:r>
         <w:lastRenderedPageBreak/>
         <w:t>4.2.4 Requisitos Funcionais da Tela de Cadastro de Tarefas</w:t>
@@ -13008,7 +13446,7 @@
         <w:pStyle w:val="Legenda"/>
         <w:keepNext/>
       </w:pPr>
-      <w:bookmarkStart w:id="40" w:name="_Toc242797216"/>
+      <w:bookmarkStart w:id="40" w:name="_Toc242906306"/>
       <w:r>
         <w:t xml:space="preserve">Tabela </w:t>
       </w:r>
@@ -13930,7 +14368,7 @@
         <w:pStyle w:val="Ttulo3"/>
         <w:spacing w:line="360" w:lineRule="auto"/>
       </w:pPr>
-      <w:bookmarkStart w:id="41" w:name="_Toc242797254"/>
+      <w:bookmarkStart w:id="41" w:name="_Toc242906278"/>
       <w:r>
         <w:lastRenderedPageBreak/>
         <w:t>4.2.5 Requisitos Funcionais da Tela de Produtos e Ordens de Produção</w:t>
@@ -13962,7 +14400,7 @@
         <w:pStyle w:val="Legenda"/>
         <w:keepNext/>
       </w:pPr>
-      <w:bookmarkStart w:id="42" w:name="_Toc242797217"/>
+      <w:bookmarkStart w:id="42" w:name="_Toc242906307"/>
       <w:r>
         <w:t xml:space="preserve">Tabela </w:t>
       </w:r>
@@ -14768,7 +15206,7 @@
         <w:pStyle w:val="Ttulo3"/>
         <w:spacing w:line="360" w:lineRule="auto"/>
       </w:pPr>
-      <w:bookmarkStart w:id="43" w:name="_Toc242797255"/>
+      <w:bookmarkStart w:id="43" w:name="_Toc242906279"/>
       <w:r>
         <w:lastRenderedPageBreak/>
         <w:t>4.2.6 Requisitos Funcionais da Tela de Apontamento da Produção</w:t>
@@ -14800,7 +15238,7 @@
         <w:pStyle w:val="Legenda"/>
         <w:keepNext/>
       </w:pPr>
-      <w:bookmarkStart w:id="44" w:name="_Toc242797218"/>
+      <w:bookmarkStart w:id="44" w:name="_Toc242906308"/>
       <w:r>
         <w:t xml:space="preserve">Tabela </w:t>
       </w:r>
@@ -15722,7 +16160,7 @@
         <w:pStyle w:val="Ttulo3"/>
         <w:spacing w:line="360" w:lineRule="auto"/>
       </w:pPr>
-      <w:bookmarkStart w:id="45" w:name="_Toc242797256"/>
+      <w:bookmarkStart w:id="45" w:name="_Toc242906280"/>
       <w:r>
         <w:lastRenderedPageBreak/>
         <w:t>4.2.7 Requisitos Funcionais da Tela de Monitoramento da Produção</w:t>
@@ -15754,7 +16192,7 @@
         <w:pStyle w:val="Legenda"/>
         <w:keepNext/>
       </w:pPr>
-      <w:bookmarkStart w:id="46" w:name="_Toc242797219"/>
+      <w:bookmarkStart w:id="46" w:name="_Toc242906309"/>
       <w:r>
         <w:t xml:space="preserve">Tabela </w:t>
       </w:r>
@@ -16557,12 +16995,13 @@
     </w:p>
     <w:p>
       <w:pPr>
-        <w:pStyle w:val="Ttulo2"/>
-      </w:pPr>
-      <w:bookmarkStart w:id="47" w:name="_Toc242797257"/>
+        <w:pStyle w:val="Ttulo3"/>
+        <w:spacing w:line="360" w:lineRule="auto"/>
+      </w:pPr>
+      <w:bookmarkStart w:id="47" w:name="_Toc242906281"/>
       <w:r>
         <w:lastRenderedPageBreak/>
-        <w:t>4.3 Requisitos Não Funcionais</w:t>
+        <w:t>4.2.8 Requisitos Funcionais dos Operadores</w:t>
       </w:r>
       <w:bookmarkEnd w:id="47"/>
     </w:p>
@@ -16583,18 +17022,826 @@
           <w:sz w:val="24"/>
           <w:szCs w:val="24"/>
         </w:rPr>
-        <w:t>Os requisitos não funcionais estão relacionados às características de qualidade, desempenho, segurança e usabilidade do sistema. Esses requisitos definem padrões e restrições que a aplicação deverá atender para garantir seu funcionamento adequado, proporcionando maior confiabilidade, eficiência e melhor experiência aos usuários.</w:t>
+        <w:t>A tabela abaixo apresenta os requisitos funcionais relacionados ao cadastro dos operadores, que são os colaboradores responsáveis pelos apontamentos da produção.</w:t>
+      </w:r>
+    </w:p>
+    <w:p>
+      <w:pPr>
+        <w:pStyle w:val="Legenda"/>
+        <w:keepNext/>
+      </w:pPr>
+      <w:bookmarkStart w:id="48" w:name="_Toc242906310"/>
+      <w:r>
+        <w:t xml:space="preserve">Tabela </w:t>
+      </w:r>
+      <w:r>
+        <w:fldChar w:fldCharType="begin"/>
+      </w:r>
+      <w:r>
+        <w:instrText xml:space="preserve"> SEQ Tabela \* ARABIC </w:instrText>
+      </w:r>
+      <w:r>
+        <w:fldChar w:fldCharType="separate"/>
+      </w:r>
+      <w:r>
+        <w:rPr>
+          <w:noProof/>
+        </w:rPr>
+        <w:t>8</w:t>
+      </w:r>
+      <w:r>
+        <w:fldChar w:fldCharType="end"/>
+      </w:r>
+      <w:r>
+        <w:t xml:space="preserve"> – Requisitos da Tela de Cadastro de Operadores</w:t>
+      </w:r>
+      <w:bookmarkEnd w:id="48"/>
+    </w:p>
+    <w:tbl>
+      <w:tblPr>
+        <w:tblW w:w="9055" w:type="dxa"/>
+        <w:tblLayout w:type="fixed"/>
+        <w:tblCellMar>
+          <w:top w:w="15" w:type="dxa"/>
+          <w:left w:w="15" w:type="dxa"/>
+          <w:bottom w:w="15" w:type="dxa"/>
+          <w:right w:w="15" w:type="dxa"/>
+        </w:tblCellMar>
+        <w:tblLook w:val="04A0" w:firstRow="1" w:lastRow="0" w:firstColumn="1" w:lastColumn="0" w:noHBand="0" w:noVBand="1"/>
+      </w:tblPr>
+      <w:tblGrid>
+        <w:gridCol w:w="1027"/>
+        <w:gridCol w:w="2364"/>
+        <w:gridCol w:w="5664"/>
+      </w:tblGrid>
+      <w:tr>
+        <w:trPr>
+          <w:cantSplit/>
+        </w:trPr>
+        <w:tc>
+          <w:tcPr>
+            <w:tcW w:w="1027" w:type="dxa"/>
+            <w:tcBorders>
+              <w:top w:val="single" w:sz="6" w:space="0" w:color="000000"/>
+              <w:left w:val="single" w:sz="6" w:space="0" w:color="000000"/>
+              <w:bottom w:val="single" w:sz="6" w:space="0" w:color="000000"/>
+              <w:right w:val="single" w:sz="6" w:space="0" w:color="000000"/>
+            </w:tcBorders>
+            <w:shd w:val="clear" w:color="auto" w:fill="D9D9D9"/>
+            <w:tcMar>
+              <w:top w:w="0" w:type="dxa"/>
+              <w:left w:w="100" w:type="dxa"/>
+              <w:bottom w:w="0" w:type="dxa"/>
+              <w:right w:w="100" w:type="dxa"/>
+            </w:tcMar>
+          </w:tcPr>
+          <w:p>
+            <w:pPr>
+              <w:spacing w:before="100" w:beforeAutospacing="1" w:after="100" w:afterAutospacing="1" w:line="360" w:lineRule="auto"/>
+              <w:jc w:val="both"/>
+              <w:rPr>
+                <w:rFonts w:cs="Arial"/>
+                <w:b/>
+                <w:bCs/>
+                <w:sz w:val="24"/>
+                <w:szCs w:val="24"/>
+              </w:rPr>
+            </w:pPr>
+            <w:r>
+              <w:rPr>
+                <w:rFonts w:cs="Arial"/>
+                <w:b/>
+                <w:bCs/>
+                <w:sz w:val="24"/>
+                <w:szCs w:val="24"/>
+              </w:rPr>
+              <w:t>Código</w:t>
+            </w:r>
+          </w:p>
+        </w:tc>
+        <w:tc>
+          <w:tcPr>
+            <w:tcW w:w="2364" w:type="dxa"/>
+            <w:tcBorders>
+              <w:top w:val="single" w:sz="6" w:space="0" w:color="000000"/>
+              <w:left w:val="single" w:sz="6" w:space="0" w:color="000000"/>
+              <w:bottom w:val="single" w:sz="6" w:space="0" w:color="000000"/>
+              <w:right w:val="single" w:sz="6" w:space="0" w:color="000000"/>
+            </w:tcBorders>
+            <w:shd w:val="clear" w:color="auto" w:fill="D9D9D9"/>
+            <w:tcMar>
+              <w:top w:w="0" w:type="dxa"/>
+              <w:left w:w="100" w:type="dxa"/>
+              <w:bottom w:w="0" w:type="dxa"/>
+              <w:right w:w="100" w:type="dxa"/>
+            </w:tcMar>
+          </w:tcPr>
+          <w:p>
+            <w:pPr>
+              <w:spacing w:before="100" w:beforeAutospacing="1" w:after="100" w:afterAutospacing="1" w:line="360" w:lineRule="auto"/>
+              <w:rPr>
+                <w:rFonts w:cs="Arial"/>
+                <w:b/>
+                <w:bCs/>
+                <w:sz w:val="24"/>
+                <w:szCs w:val="24"/>
+              </w:rPr>
+            </w:pPr>
+            <w:r>
+              <w:rPr>
+                <w:rFonts w:cs="Arial"/>
+                <w:b/>
+                <w:bCs/>
+                <w:sz w:val="24"/>
+                <w:szCs w:val="24"/>
+              </w:rPr>
+              <w:t>Requisito Funcional</w:t>
+            </w:r>
+          </w:p>
+        </w:tc>
+        <w:tc>
+          <w:tcPr>
+            <w:tcW w:w="5664" w:type="dxa"/>
+            <w:tcBorders>
+              <w:top w:val="single" w:sz="6" w:space="0" w:color="000000"/>
+              <w:left w:val="single" w:sz="6" w:space="0" w:color="000000"/>
+              <w:bottom w:val="single" w:sz="6" w:space="0" w:color="000000"/>
+              <w:right w:val="single" w:sz="6" w:space="0" w:color="000000"/>
+            </w:tcBorders>
+            <w:shd w:val="clear" w:color="auto" w:fill="D9D9D9"/>
+            <w:tcMar>
+              <w:top w:w="0" w:type="dxa"/>
+              <w:left w:w="100" w:type="dxa"/>
+              <w:bottom w:w="0" w:type="dxa"/>
+              <w:right w:w="100" w:type="dxa"/>
+            </w:tcMar>
+          </w:tcPr>
+          <w:p>
+            <w:pPr>
+              <w:spacing w:before="100" w:beforeAutospacing="1" w:after="100" w:afterAutospacing="1" w:line="360" w:lineRule="auto"/>
+              <w:jc w:val="both"/>
+              <w:rPr>
+                <w:rFonts w:cs="Arial"/>
+                <w:b/>
+                <w:bCs/>
+                <w:sz w:val="24"/>
+                <w:szCs w:val="24"/>
+              </w:rPr>
+            </w:pPr>
+            <w:r>
+              <w:rPr>
+                <w:rFonts w:cs="Arial"/>
+                <w:b/>
+                <w:bCs/>
+                <w:sz w:val="24"/>
+                <w:szCs w:val="24"/>
+              </w:rPr>
+              <w:t>Descrição</w:t>
+            </w:r>
+          </w:p>
+        </w:tc>
+      </w:tr>
+      <w:tr>
+        <w:trPr>
+          <w:cantSplit/>
+        </w:trPr>
+        <w:tc>
+          <w:tcPr>
+            <w:tcW w:w="1027" w:type="dxa"/>
+            <w:tcBorders>
+              <w:top w:val="single" w:sz="6" w:space="0" w:color="000000"/>
+              <w:left w:val="single" w:sz="6" w:space="0" w:color="000000"/>
+              <w:bottom w:val="single" w:sz="6" w:space="0" w:color="000000"/>
+              <w:right w:val="single" w:sz="6" w:space="0" w:color="000000"/>
+            </w:tcBorders>
+            <w:tcMar>
+              <w:top w:w="0" w:type="dxa"/>
+              <w:left w:w="100" w:type="dxa"/>
+              <w:bottom w:w="0" w:type="dxa"/>
+              <w:right w:w="100" w:type="dxa"/>
+            </w:tcMar>
+          </w:tcPr>
+          <w:p>
+            <w:pPr>
+              <w:spacing w:before="100" w:beforeAutospacing="1" w:after="100" w:afterAutospacing="1" w:line="360" w:lineRule="auto"/>
+              <w:jc w:val="both"/>
+              <w:rPr>
+                <w:rFonts w:cs="Arial"/>
+                <w:b/>
+                <w:bCs/>
+                <w:sz w:val="24"/>
+                <w:szCs w:val="24"/>
+              </w:rPr>
+            </w:pPr>
+            <w:r>
+              <w:rPr>
+                <w:rFonts w:cs="Arial"/>
+                <w:b/>
+                <w:bCs/>
+                <w:sz w:val="24"/>
+                <w:szCs w:val="24"/>
+              </w:rPr>
+              <w:t>RF-01</w:t>
+            </w:r>
+          </w:p>
+        </w:tc>
+        <w:tc>
+          <w:tcPr>
+            <w:tcW w:w="2364" w:type="dxa"/>
+            <w:tcBorders>
+              <w:top w:val="single" w:sz="6" w:space="0" w:color="000000"/>
+              <w:left w:val="single" w:sz="6" w:space="0" w:color="000000"/>
+              <w:bottom w:val="single" w:sz="6" w:space="0" w:color="000000"/>
+              <w:right w:val="single" w:sz="6" w:space="0" w:color="000000"/>
+            </w:tcBorders>
+            <w:tcMar>
+              <w:top w:w="0" w:type="dxa"/>
+              <w:left w:w="100" w:type="dxa"/>
+              <w:bottom w:w="0" w:type="dxa"/>
+              <w:right w:w="100" w:type="dxa"/>
+            </w:tcMar>
+          </w:tcPr>
+          <w:p>
+            <w:pPr>
+              <w:spacing w:before="100" w:beforeAutospacing="1" w:after="100" w:afterAutospacing="1" w:line="360" w:lineRule="auto"/>
+              <w:rPr>
+                <w:rFonts w:cs="Arial"/>
+                <w:sz w:val="24"/>
+                <w:szCs w:val="24"/>
+              </w:rPr>
+            </w:pPr>
+            <w:r>
+              <w:rPr>
+                <w:rFonts w:cs="Arial"/>
+                <w:sz w:val="24"/>
+                <w:szCs w:val="24"/>
+              </w:rPr>
+              <w:t>Cadastrar Operador</w:t>
+            </w:r>
+          </w:p>
+        </w:tc>
+        <w:tc>
+          <w:tcPr>
+            <w:tcW w:w="5664" w:type="dxa"/>
+            <w:tcBorders>
+              <w:top w:val="single" w:sz="6" w:space="0" w:color="000000"/>
+              <w:left w:val="single" w:sz="6" w:space="0" w:color="000000"/>
+              <w:bottom w:val="single" w:sz="6" w:space="0" w:color="000000"/>
+              <w:right w:val="single" w:sz="6" w:space="0" w:color="000000"/>
+            </w:tcBorders>
+            <w:tcMar>
+              <w:top w:w="0" w:type="dxa"/>
+              <w:left w:w="100" w:type="dxa"/>
+              <w:bottom w:w="0" w:type="dxa"/>
+              <w:right w:w="100" w:type="dxa"/>
+            </w:tcMar>
+          </w:tcPr>
+          <w:p>
+            <w:pPr>
+              <w:spacing w:before="100" w:beforeAutospacing="1" w:after="100" w:afterAutospacing="1" w:line="360" w:lineRule="auto"/>
+              <w:jc w:val="both"/>
+              <w:rPr>
+                <w:rFonts w:cs="Arial"/>
+                <w:sz w:val="24"/>
+                <w:szCs w:val="24"/>
+              </w:rPr>
+            </w:pPr>
+            <w:r>
+              <w:rPr>
+                <w:rFonts w:cs="Arial"/>
+                <w:sz w:val="24"/>
+                <w:szCs w:val="24"/>
+              </w:rPr>
+              <w:t>O sistema deve permitir cadastrar operadores informando nome e matrícula.</w:t>
+            </w:r>
+          </w:p>
+        </w:tc>
+      </w:tr>
+      <w:tr>
+        <w:trPr>
+          <w:cantSplit/>
+        </w:trPr>
+        <w:tc>
+          <w:tcPr>
+            <w:tcW w:w="1027" w:type="dxa"/>
+            <w:tcBorders>
+              <w:top w:val="single" w:sz="6" w:space="0" w:color="000000"/>
+              <w:left w:val="single" w:sz="6" w:space="0" w:color="000000"/>
+              <w:bottom w:val="single" w:sz="6" w:space="0" w:color="000000"/>
+              <w:right w:val="single" w:sz="6" w:space="0" w:color="000000"/>
+            </w:tcBorders>
+            <w:tcMar>
+              <w:top w:w="0" w:type="dxa"/>
+              <w:left w:w="100" w:type="dxa"/>
+              <w:bottom w:w="0" w:type="dxa"/>
+              <w:right w:w="100" w:type="dxa"/>
+            </w:tcMar>
+          </w:tcPr>
+          <w:p>
+            <w:pPr>
+              <w:spacing w:before="100" w:beforeAutospacing="1" w:after="100" w:afterAutospacing="1" w:line="360" w:lineRule="auto"/>
+              <w:jc w:val="both"/>
+              <w:rPr>
+                <w:rFonts w:cs="Arial"/>
+                <w:b/>
+                <w:bCs/>
+                <w:sz w:val="24"/>
+                <w:szCs w:val="24"/>
+              </w:rPr>
+            </w:pPr>
+            <w:r>
+              <w:rPr>
+                <w:rFonts w:cs="Arial"/>
+                <w:b/>
+                <w:bCs/>
+                <w:sz w:val="24"/>
+                <w:szCs w:val="24"/>
+              </w:rPr>
+              <w:t>RF-02</w:t>
+            </w:r>
+          </w:p>
+        </w:tc>
+        <w:tc>
+          <w:tcPr>
+            <w:tcW w:w="2364" w:type="dxa"/>
+            <w:tcBorders>
+              <w:top w:val="single" w:sz="6" w:space="0" w:color="000000"/>
+              <w:left w:val="single" w:sz="6" w:space="0" w:color="000000"/>
+              <w:bottom w:val="single" w:sz="6" w:space="0" w:color="000000"/>
+              <w:right w:val="single" w:sz="6" w:space="0" w:color="000000"/>
+            </w:tcBorders>
+            <w:tcMar>
+              <w:top w:w="0" w:type="dxa"/>
+              <w:left w:w="100" w:type="dxa"/>
+              <w:bottom w:w="0" w:type="dxa"/>
+              <w:right w:w="100" w:type="dxa"/>
+            </w:tcMar>
+          </w:tcPr>
+          <w:p>
+            <w:pPr>
+              <w:spacing w:before="100" w:beforeAutospacing="1" w:after="100" w:afterAutospacing="1" w:line="360" w:lineRule="auto"/>
+              <w:rPr>
+                <w:rFonts w:cs="Arial"/>
+                <w:sz w:val="24"/>
+                <w:szCs w:val="24"/>
+              </w:rPr>
+            </w:pPr>
+            <w:r>
+              <w:rPr>
+                <w:rFonts w:cs="Arial"/>
+                <w:sz w:val="24"/>
+                <w:szCs w:val="24"/>
+              </w:rPr>
+              <w:t>Consultar Operador</w:t>
+            </w:r>
+          </w:p>
+        </w:tc>
+        <w:tc>
+          <w:tcPr>
+            <w:tcW w:w="5664" w:type="dxa"/>
+            <w:tcBorders>
+              <w:top w:val="single" w:sz="6" w:space="0" w:color="000000"/>
+              <w:left w:val="single" w:sz="6" w:space="0" w:color="000000"/>
+              <w:bottom w:val="single" w:sz="6" w:space="0" w:color="000000"/>
+              <w:right w:val="single" w:sz="6" w:space="0" w:color="000000"/>
+            </w:tcBorders>
+            <w:tcMar>
+              <w:top w:w="0" w:type="dxa"/>
+              <w:left w:w="100" w:type="dxa"/>
+              <w:bottom w:w="0" w:type="dxa"/>
+              <w:right w:w="100" w:type="dxa"/>
+            </w:tcMar>
+          </w:tcPr>
+          <w:p>
+            <w:pPr>
+              <w:spacing w:before="100" w:beforeAutospacing="1" w:after="100" w:afterAutospacing="1" w:line="360" w:lineRule="auto"/>
+              <w:jc w:val="both"/>
+              <w:rPr>
+                <w:rFonts w:cs="Arial"/>
+                <w:sz w:val="24"/>
+                <w:szCs w:val="24"/>
+              </w:rPr>
+            </w:pPr>
+            <w:r>
+              <w:rPr>
+                <w:rFonts w:cs="Arial"/>
+                <w:sz w:val="24"/>
+                <w:szCs w:val="24"/>
+              </w:rPr>
+              <w:t>O sistema deve permitir visualizar os operadores cadastrados e pesquisá-los por nome ou matrícula.</w:t>
+            </w:r>
+          </w:p>
+        </w:tc>
+      </w:tr>
+      <w:tr>
+        <w:trPr>
+          <w:cantSplit/>
+        </w:trPr>
+        <w:tc>
+          <w:tcPr>
+            <w:tcW w:w="1027" w:type="dxa"/>
+            <w:tcBorders>
+              <w:top w:val="single" w:sz="6" w:space="0" w:color="000000"/>
+              <w:left w:val="single" w:sz="6" w:space="0" w:color="000000"/>
+              <w:bottom w:val="single" w:sz="6" w:space="0" w:color="000000"/>
+              <w:right w:val="single" w:sz="6" w:space="0" w:color="000000"/>
+            </w:tcBorders>
+            <w:tcMar>
+              <w:top w:w="0" w:type="dxa"/>
+              <w:left w:w="100" w:type="dxa"/>
+              <w:bottom w:w="0" w:type="dxa"/>
+              <w:right w:w="100" w:type="dxa"/>
+            </w:tcMar>
+          </w:tcPr>
+          <w:p>
+            <w:pPr>
+              <w:spacing w:before="100" w:beforeAutospacing="1" w:after="100" w:afterAutospacing="1" w:line="360" w:lineRule="auto"/>
+              <w:jc w:val="both"/>
+              <w:rPr>
+                <w:rFonts w:cs="Arial"/>
+                <w:b/>
+                <w:bCs/>
+                <w:sz w:val="24"/>
+                <w:szCs w:val="24"/>
+              </w:rPr>
+            </w:pPr>
+            <w:r>
+              <w:rPr>
+                <w:rFonts w:cs="Arial"/>
+                <w:b/>
+                <w:bCs/>
+                <w:sz w:val="24"/>
+                <w:szCs w:val="24"/>
+              </w:rPr>
+              <w:t>RF-03</w:t>
+            </w:r>
+          </w:p>
+        </w:tc>
+        <w:tc>
+          <w:tcPr>
+            <w:tcW w:w="2364" w:type="dxa"/>
+            <w:tcBorders>
+              <w:top w:val="single" w:sz="6" w:space="0" w:color="000000"/>
+              <w:left w:val="single" w:sz="6" w:space="0" w:color="000000"/>
+              <w:bottom w:val="single" w:sz="6" w:space="0" w:color="000000"/>
+              <w:right w:val="single" w:sz="6" w:space="0" w:color="000000"/>
+            </w:tcBorders>
+            <w:tcMar>
+              <w:top w:w="0" w:type="dxa"/>
+              <w:left w:w="100" w:type="dxa"/>
+              <w:bottom w:w="0" w:type="dxa"/>
+              <w:right w:w="100" w:type="dxa"/>
+            </w:tcMar>
+          </w:tcPr>
+          <w:p>
+            <w:pPr>
+              <w:spacing w:before="100" w:beforeAutospacing="1" w:after="100" w:afterAutospacing="1" w:line="360" w:lineRule="auto"/>
+              <w:rPr>
+                <w:rFonts w:cs="Arial"/>
+                <w:sz w:val="24"/>
+                <w:szCs w:val="24"/>
+              </w:rPr>
+            </w:pPr>
+            <w:r>
+              <w:rPr>
+                <w:rFonts w:cs="Arial"/>
+                <w:sz w:val="24"/>
+                <w:szCs w:val="24"/>
+              </w:rPr>
+              <w:t>Editar Operador</w:t>
+            </w:r>
+          </w:p>
+        </w:tc>
+        <w:tc>
+          <w:tcPr>
+            <w:tcW w:w="5664" w:type="dxa"/>
+            <w:tcBorders>
+              <w:top w:val="single" w:sz="6" w:space="0" w:color="000000"/>
+              <w:left w:val="single" w:sz="6" w:space="0" w:color="000000"/>
+              <w:bottom w:val="single" w:sz="6" w:space="0" w:color="000000"/>
+              <w:right w:val="single" w:sz="6" w:space="0" w:color="000000"/>
+            </w:tcBorders>
+            <w:tcMar>
+              <w:top w:w="0" w:type="dxa"/>
+              <w:left w:w="100" w:type="dxa"/>
+              <w:bottom w:w="0" w:type="dxa"/>
+              <w:right w:w="100" w:type="dxa"/>
+            </w:tcMar>
+          </w:tcPr>
+          <w:p>
+            <w:pPr>
+              <w:spacing w:before="100" w:beforeAutospacing="1" w:after="100" w:afterAutospacing="1" w:line="360" w:lineRule="auto"/>
+              <w:jc w:val="both"/>
+              <w:rPr>
+                <w:rFonts w:cs="Arial"/>
+                <w:sz w:val="24"/>
+                <w:szCs w:val="24"/>
+              </w:rPr>
+            </w:pPr>
+            <w:r>
+              <w:rPr>
+                <w:rFonts w:cs="Arial"/>
+                <w:sz w:val="24"/>
+                <w:szCs w:val="24"/>
+              </w:rPr>
+              <w:t>O sistema deve permitir alterar as informações dos operadores cadastrados.</w:t>
+            </w:r>
+          </w:p>
+        </w:tc>
+      </w:tr>
+      <w:tr>
+        <w:trPr>
+          <w:cantSplit/>
+        </w:trPr>
+        <w:tc>
+          <w:tcPr>
+            <w:tcW w:w="1027" w:type="dxa"/>
+            <w:tcBorders>
+              <w:top w:val="single" w:sz="6" w:space="0" w:color="000000"/>
+              <w:left w:val="single" w:sz="6" w:space="0" w:color="000000"/>
+              <w:bottom w:val="single" w:sz="6" w:space="0" w:color="000000"/>
+              <w:right w:val="single" w:sz="6" w:space="0" w:color="000000"/>
+            </w:tcBorders>
+            <w:tcMar>
+              <w:top w:w="0" w:type="dxa"/>
+              <w:left w:w="100" w:type="dxa"/>
+              <w:bottom w:w="0" w:type="dxa"/>
+              <w:right w:w="100" w:type="dxa"/>
+            </w:tcMar>
+          </w:tcPr>
+          <w:p>
+            <w:pPr>
+              <w:spacing w:before="100" w:beforeAutospacing="1" w:after="100" w:afterAutospacing="1" w:line="360" w:lineRule="auto"/>
+              <w:jc w:val="both"/>
+              <w:rPr>
+                <w:rFonts w:cs="Arial"/>
+                <w:b/>
+                <w:bCs/>
+                <w:sz w:val="24"/>
+                <w:szCs w:val="24"/>
+              </w:rPr>
+            </w:pPr>
+            <w:r>
+              <w:rPr>
+                <w:rFonts w:cs="Arial"/>
+                <w:b/>
+                <w:bCs/>
+                <w:sz w:val="24"/>
+                <w:szCs w:val="24"/>
+              </w:rPr>
+              <w:t>RF-04</w:t>
+            </w:r>
+          </w:p>
+        </w:tc>
+        <w:tc>
+          <w:tcPr>
+            <w:tcW w:w="2364" w:type="dxa"/>
+            <w:tcBorders>
+              <w:top w:val="single" w:sz="6" w:space="0" w:color="000000"/>
+              <w:left w:val="single" w:sz="6" w:space="0" w:color="000000"/>
+              <w:bottom w:val="single" w:sz="6" w:space="0" w:color="000000"/>
+              <w:right w:val="single" w:sz="6" w:space="0" w:color="000000"/>
+            </w:tcBorders>
+            <w:tcMar>
+              <w:top w:w="0" w:type="dxa"/>
+              <w:left w:w="100" w:type="dxa"/>
+              <w:bottom w:w="0" w:type="dxa"/>
+              <w:right w:w="100" w:type="dxa"/>
+            </w:tcMar>
+          </w:tcPr>
+          <w:p>
+            <w:pPr>
+              <w:spacing w:before="100" w:beforeAutospacing="1" w:after="100" w:afterAutospacing="1" w:line="360" w:lineRule="auto"/>
+              <w:rPr>
+                <w:rFonts w:cs="Arial"/>
+                <w:sz w:val="24"/>
+                <w:szCs w:val="24"/>
+              </w:rPr>
+            </w:pPr>
+            <w:r>
+              <w:rPr>
+                <w:rFonts w:cs="Arial"/>
+                <w:sz w:val="24"/>
+                <w:szCs w:val="24"/>
+              </w:rPr>
+              <w:t>Inativar Operador</w:t>
+            </w:r>
+          </w:p>
+        </w:tc>
+        <w:tc>
+          <w:tcPr>
+            <w:tcW w:w="5664" w:type="dxa"/>
+            <w:tcBorders>
+              <w:top w:val="single" w:sz="6" w:space="0" w:color="000000"/>
+              <w:left w:val="single" w:sz="6" w:space="0" w:color="000000"/>
+              <w:bottom w:val="single" w:sz="6" w:space="0" w:color="000000"/>
+              <w:right w:val="single" w:sz="6" w:space="0" w:color="000000"/>
+            </w:tcBorders>
+            <w:tcMar>
+              <w:top w:w="0" w:type="dxa"/>
+              <w:left w:w="100" w:type="dxa"/>
+              <w:bottom w:w="0" w:type="dxa"/>
+              <w:right w:w="100" w:type="dxa"/>
+            </w:tcMar>
+          </w:tcPr>
+          <w:p>
+            <w:pPr>
+              <w:spacing w:before="100" w:beforeAutospacing="1" w:after="100" w:afterAutospacing="1" w:line="360" w:lineRule="auto"/>
+              <w:jc w:val="both"/>
+              <w:rPr>
+                <w:rFonts w:cs="Arial"/>
+                <w:sz w:val="24"/>
+                <w:szCs w:val="24"/>
+              </w:rPr>
+            </w:pPr>
+            <w:r>
+              <w:rPr>
+                <w:rFonts w:cs="Arial"/>
+                <w:sz w:val="24"/>
+                <w:szCs w:val="24"/>
+              </w:rPr>
+              <w:t>O sistema deve permitir inativar operadores, mantendo o histórico dos apontamentos já realizados.</w:t>
+            </w:r>
+          </w:p>
+        </w:tc>
+      </w:tr>
+      <w:tr>
+        <w:trPr>
+          <w:cantSplit/>
+        </w:trPr>
+        <w:tc>
+          <w:tcPr>
+            <w:tcW w:w="1027" w:type="dxa"/>
+            <w:tcBorders>
+              <w:top w:val="single" w:sz="6" w:space="0" w:color="000000"/>
+              <w:left w:val="single" w:sz="6" w:space="0" w:color="000000"/>
+              <w:bottom w:val="single" w:sz="6" w:space="0" w:color="000000"/>
+              <w:right w:val="single" w:sz="6" w:space="0" w:color="000000"/>
+            </w:tcBorders>
+            <w:tcMar>
+              <w:top w:w="0" w:type="dxa"/>
+              <w:left w:w="100" w:type="dxa"/>
+              <w:bottom w:w="0" w:type="dxa"/>
+              <w:right w:w="100" w:type="dxa"/>
+            </w:tcMar>
+          </w:tcPr>
+          <w:p>
+            <w:pPr>
+              <w:spacing w:before="100" w:beforeAutospacing="1" w:after="100" w:afterAutospacing="1" w:line="360" w:lineRule="auto"/>
+              <w:jc w:val="both"/>
+              <w:rPr>
+                <w:rFonts w:cs="Arial"/>
+                <w:b/>
+                <w:bCs/>
+                <w:sz w:val="24"/>
+                <w:szCs w:val="24"/>
+              </w:rPr>
+            </w:pPr>
+            <w:r>
+              <w:rPr>
+                <w:rFonts w:cs="Arial"/>
+                <w:b/>
+                <w:bCs/>
+                <w:sz w:val="24"/>
+                <w:szCs w:val="24"/>
+              </w:rPr>
+              <w:t>RF-05</w:t>
+            </w:r>
+          </w:p>
+        </w:tc>
+        <w:tc>
+          <w:tcPr>
+            <w:tcW w:w="2364" w:type="dxa"/>
+            <w:tcBorders>
+              <w:top w:val="single" w:sz="6" w:space="0" w:color="000000"/>
+              <w:left w:val="single" w:sz="6" w:space="0" w:color="000000"/>
+              <w:bottom w:val="single" w:sz="6" w:space="0" w:color="000000"/>
+              <w:right w:val="single" w:sz="6" w:space="0" w:color="000000"/>
+            </w:tcBorders>
+            <w:tcMar>
+              <w:top w:w="0" w:type="dxa"/>
+              <w:left w:w="100" w:type="dxa"/>
+              <w:bottom w:w="0" w:type="dxa"/>
+              <w:right w:w="100" w:type="dxa"/>
+            </w:tcMar>
+          </w:tcPr>
+          <w:p>
+            <w:pPr>
+              <w:spacing w:before="100" w:beforeAutospacing="1" w:after="100" w:afterAutospacing="1" w:line="360" w:lineRule="auto"/>
+              <w:rPr>
+                <w:rFonts w:cs="Arial"/>
+                <w:sz w:val="24"/>
+                <w:szCs w:val="24"/>
+              </w:rPr>
+            </w:pPr>
+            <w:r>
+              <w:rPr>
+                <w:rFonts w:cs="Arial"/>
+                <w:sz w:val="24"/>
+                <w:szCs w:val="24"/>
+              </w:rPr>
+              <w:t>Validar Matrícula</w:t>
+            </w:r>
+          </w:p>
+        </w:tc>
+        <w:tc>
+          <w:tcPr>
+            <w:tcW w:w="5664" w:type="dxa"/>
+            <w:tcBorders>
+              <w:top w:val="single" w:sz="6" w:space="0" w:color="000000"/>
+              <w:left w:val="single" w:sz="6" w:space="0" w:color="000000"/>
+              <w:bottom w:val="single" w:sz="6" w:space="0" w:color="000000"/>
+              <w:right w:val="single" w:sz="6" w:space="0" w:color="000000"/>
+            </w:tcBorders>
+            <w:tcMar>
+              <w:top w:w="0" w:type="dxa"/>
+              <w:left w:w="100" w:type="dxa"/>
+              <w:bottom w:w="0" w:type="dxa"/>
+              <w:right w:w="100" w:type="dxa"/>
+            </w:tcMar>
+          </w:tcPr>
+          <w:p>
+            <w:pPr>
+              <w:spacing w:before="100" w:beforeAutospacing="1" w:after="100" w:afterAutospacing="1" w:line="360" w:lineRule="auto"/>
+              <w:jc w:val="both"/>
+              <w:rPr>
+                <w:rFonts w:cs="Arial"/>
+                <w:sz w:val="24"/>
+                <w:szCs w:val="24"/>
+              </w:rPr>
+            </w:pPr>
+            <w:r>
+              <w:rPr>
+                <w:rFonts w:cs="Arial"/>
+                <w:sz w:val="24"/>
+                <w:szCs w:val="24"/>
+              </w:rPr>
+              <w:t>O sistema não deve permitir que dois operadores utilizem a mesma matrícula.</w:t>
+            </w:r>
+          </w:p>
+        </w:tc>
+      </w:tr>
+    </w:tbl>
+    <w:p>
+      <w:pPr>
+        <w:spacing w:before="100" w:beforeAutospacing="1" w:after="100" w:afterAutospacing="1" w:line="360" w:lineRule="auto"/>
+        <w:jc w:val="both"/>
+        <w:rPr>
+          <w:rFonts w:cs="Arial"/>
+          <w:sz w:val="20"/>
+          <w:szCs w:val="20"/>
+        </w:rPr>
+      </w:pPr>
+      <w:r>
+        <w:rPr>
+          <w:rFonts w:cs="Arial"/>
+          <w:b/>
+          <w:bCs/>
+          <w:sz w:val="20"/>
+          <w:szCs w:val="20"/>
+        </w:rPr>
+        <w:t xml:space="preserve">Fonte: </w:t>
+      </w:r>
+      <w:r>
+        <w:rPr>
+          <w:rFonts w:cs="Arial"/>
+          <w:sz w:val="20"/>
+          <w:szCs w:val="20"/>
+        </w:rPr>
+        <w:t>Próprio autor, acessado em 14 de outubro de 2026.</w:t>
+      </w:r>
+    </w:p>
+    <w:p>
+      <w:pPr>
+        <w:spacing w:after="100" w:afterAutospacing="1"/>
+        <w:rPr>
+          <w:rFonts w:ascii="Times New Roman" w:hAnsi="Times New Roman" w:cs="Times New Roman"/>
+          <w:b/>
+          <w:sz w:val="24"/>
+          <w:szCs w:val="24"/>
+        </w:rPr>
+      </w:pPr>
+      <w:r>
+        <w:rPr>
+          <w:rFonts w:ascii="Times New Roman" w:hAnsi="Times New Roman" w:cs="Times New Roman"/>
+          <w:b/>
+          <w:sz w:val="24"/>
+          <w:szCs w:val="24"/>
+        </w:rPr>
+        <w:br w:type="page"/>
       </w:r>
     </w:p>
     <w:p>
       <w:pPr>
         <w:pStyle w:val="Ttulo3"/>
-      </w:pPr>
-      <w:bookmarkStart w:id="48" w:name="_Toc242797258"/>
-      <w:r>
-        <w:t>4.3.1 Requisitos Não Funcionais do Sistema</w:t>
-      </w:r>
-      <w:bookmarkEnd w:id="48"/>
+        <w:spacing w:line="360" w:lineRule="auto"/>
+      </w:pPr>
+      <w:bookmarkStart w:id="49" w:name="_Toc242906282"/>
+      <w:r>
+        <w:lastRenderedPageBreak/>
+        <w:t>4.2.9 Requisitos Funcionais dos Motivos de Pausa</w:t>
+      </w:r>
+      <w:bookmarkEnd w:id="49"/>
     </w:p>
     <w:p>
       <w:pPr>
@@ -16613,7 +17860,7 @@
           <w:sz w:val="24"/>
           <w:szCs w:val="24"/>
         </w:rPr>
-        <w:t>A tabela apresentada abaixo contém os principais requisitos não funcionais definidos para o sistema de gerenciamento de nivelamento de processos em linhas de produção.</w:t>
+        <w:t>A tabela abaixo apresenta os requisitos funcionais relacionados aos motivos de pausa, utilizados para classificar as interrupções registradas durante a execução das etapas.</w:t>
       </w:r>
     </w:p>
     <w:p>
@@ -16621,7 +17868,7 @@
         <w:pStyle w:val="Legenda"/>
         <w:keepNext/>
       </w:pPr>
-      <w:bookmarkStart w:id="49" w:name="_Toc242797220"/>
+      <w:bookmarkStart w:id="50" w:name="_Toc242906311"/>
       <w:r>
         <w:t xml:space="preserve">Tabela </w:t>
       </w:r>
@@ -16638,15 +17885,766 @@
         <w:rPr>
           <w:noProof/>
         </w:rPr>
-        <w:t>8</w:t>
+        <w:t>9</w:t>
       </w:r>
       <w:r>
         <w:fldChar w:fldCharType="end"/>
       </w:r>
       <w:r>
+        <w:t xml:space="preserve"> – Requisitos da Tela de Cadastro de Motivos de Pausa</w:t>
+      </w:r>
+      <w:bookmarkEnd w:id="50"/>
+    </w:p>
+    <w:tbl>
+      <w:tblPr>
+        <w:tblW w:w="9055" w:type="dxa"/>
+        <w:tblLayout w:type="fixed"/>
+        <w:tblCellMar>
+          <w:top w:w="15" w:type="dxa"/>
+          <w:left w:w="15" w:type="dxa"/>
+          <w:bottom w:w="15" w:type="dxa"/>
+          <w:right w:w="15" w:type="dxa"/>
+        </w:tblCellMar>
+        <w:tblLook w:val="04A0" w:firstRow="1" w:lastRow="0" w:firstColumn="1" w:lastColumn="0" w:noHBand="0" w:noVBand="1"/>
+      </w:tblPr>
+      <w:tblGrid>
+        <w:gridCol w:w="1027"/>
+        <w:gridCol w:w="2364"/>
+        <w:gridCol w:w="5664"/>
+      </w:tblGrid>
+      <w:tr>
+        <w:trPr>
+          <w:cantSplit/>
+        </w:trPr>
+        <w:tc>
+          <w:tcPr>
+            <w:tcW w:w="1027" w:type="dxa"/>
+            <w:tcBorders>
+              <w:top w:val="single" w:sz="6" w:space="0" w:color="000000"/>
+              <w:left w:val="single" w:sz="6" w:space="0" w:color="000000"/>
+              <w:bottom w:val="single" w:sz="6" w:space="0" w:color="000000"/>
+              <w:right w:val="single" w:sz="6" w:space="0" w:color="000000"/>
+            </w:tcBorders>
+            <w:shd w:val="clear" w:color="auto" w:fill="D9D9D9"/>
+            <w:tcMar>
+              <w:top w:w="0" w:type="dxa"/>
+              <w:left w:w="100" w:type="dxa"/>
+              <w:bottom w:w="0" w:type="dxa"/>
+              <w:right w:w="100" w:type="dxa"/>
+            </w:tcMar>
+          </w:tcPr>
+          <w:p>
+            <w:pPr>
+              <w:spacing w:before="100" w:beforeAutospacing="1" w:after="100" w:afterAutospacing="1" w:line="360" w:lineRule="auto"/>
+              <w:jc w:val="both"/>
+              <w:rPr>
+                <w:rFonts w:cs="Arial"/>
+                <w:b/>
+                <w:bCs/>
+                <w:sz w:val="24"/>
+                <w:szCs w:val="24"/>
+              </w:rPr>
+            </w:pPr>
+            <w:r>
+              <w:rPr>
+                <w:rFonts w:cs="Arial"/>
+                <w:b/>
+                <w:bCs/>
+                <w:sz w:val="24"/>
+                <w:szCs w:val="24"/>
+              </w:rPr>
+              <w:t>Código</w:t>
+            </w:r>
+          </w:p>
+        </w:tc>
+        <w:tc>
+          <w:tcPr>
+            <w:tcW w:w="2364" w:type="dxa"/>
+            <w:tcBorders>
+              <w:top w:val="single" w:sz="6" w:space="0" w:color="000000"/>
+              <w:left w:val="single" w:sz="6" w:space="0" w:color="000000"/>
+              <w:bottom w:val="single" w:sz="6" w:space="0" w:color="000000"/>
+              <w:right w:val="single" w:sz="6" w:space="0" w:color="000000"/>
+            </w:tcBorders>
+            <w:shd w:val="clear" w:color="auto" w:fill="D9D9D9"/>
+            <w:tcMar>
+              <w:top w:w="0" w:type="dxa"/>
+              <w:left w:w="100" w:type="dxa"/>
+              <w:bottom w:w="0" w:type="dxa"/>
+              <w:right w:w="100" w:type="dxa"/>
+            </w:tcMar>
+          </w:tcPr>
+          <w:p>
+            <w:pPr>
+              <w:spacing w:before="100" w:beforeAutospacing="1" w:after="100" w:afterAutospacing="1" w:line="360" w:lineRule="auto"/>
+              <w:rPr>
+                <w:rFonts w:cs="Arial"/>
+                <w:b/>
+                <w:bCs/>
+                <w:sz w:val="24"/>
+                <w:szCs w:val="24"/>
+              </w:rPr>
+            </w:pPr>
+            <w:r>
+              <w:rPr>
+                <w:rFonts w:cs="Arial"/>
+                <w:b/>
+                <w:bCs/>
+                <w:sz w:val="24"/>
+                <w:szCs w:val="24"/>
+              </w:rPr>
+              <w:t>Requisito Funcional</w:t>
+            </w:r>
+          </w:p>
+        </w:tc>
+        <w:tc>
+          <w:tcPr>
+            <w:tcW w:w="5664" w:type="dxa"/>
+            <w:tcBorders>
+              <w:top w:val="single" w:sz="6" w:space="0" w:color="000000"/>
+              <w:left w:val="single" w:sz="6" w:space="0" w:color="000000"/>
+              <w:bottom w:val="single" w:sz="6" w:space="0" w:color="000000"/>
+              <w:right w:val="single" w:sz="6" w:space="0" w:color="000000"/>
+            </w:tcBorders>
+            <w:shd w:val="clear" w:color="auto" w:fill="D9D9D9"/>
+            <w:tcMar>
+              <w:top w:w="0" w:type="dxa"/>
+              <w:left w:w="100" w:type="dxa"/>
+              <w:bottom w:w="0" w:type="dxa"/>
+              <w:right w:w="100" w:type="dxa"/>
+            </w:tcMar>
+          </w:tcPr>
+          <w:p>
+            <w:pPr>
+              <w:spacing w:before="100" w:beforeAutospacing="1" w:after="100" w:afterAutospacing="1" w:line="360" w:lineRule="auto"/>
+              <w:jc w:val="both"/>
+              <w:rPr>
+                <w:rFonts w:cs="Arial"/>
+                <w:b/>
+                <w:bCs/>
+                <w:sz w:val="24"/>
+                <w:szCs w:val="24"/>
+              </w:rPr>
+            </w:pPr>
+            <w:r>
+              <w:rPr>
+                <w:rFonts w:cs="Arial"/>
+                <w:b/>
+                <w:bCs/>
+                <w:sz w:val="24"/>
+                <w:szCs w:val="24"/>
+              </w:rPr>
+              <w:t>Descrição</w:t>
+            </w:r>
+          </w:p>
+        </w:tc>
+      </w:tr>
+      <w:tr>
+        <w:trPr>
+          <w:cantSplit/>
+        </w:trPr>
+        <w:tc>
+          <w:tcPr>
+            <w:tcW w:w="1027" w:type="dxa"/>
+            <w:tcBorders>
+              <w:top w:val="single" w:sz="6" w:space="0" w:color="000000"/>
+              <w:left w:val="single" w:sz="6" w:space="0" w:color="000000"/>
+              <w:bottom w:val="single" w:sz="6" w:space="0" w:color="000000"/>
+              <w:right w:val="single" w:sz="6" w:space="0" w:color="000000"/>
+            </w:tcBorders>
+            <w:tcMar>
+              <w:top w:w="0" w:type="dxa"/>
+              <w:left w:w="100" w:type="dxa"/>
+              <w:bottom w:w="0" w:type="dxa"/>
+              <w:right w:w="100" w:type="dxa"/>
+            </w:tcMar>
+          </w:tcPr>
+          <w:p>
+            <w:pPr>
+              <w:spacing w:before="100" w:beforeAutospacing="1" w:after="100" w:afterAutospacing="1" w:line="360" w:lineRule="auto"/>
+              <w:jc w:val="both"/>
+              <w:rPr>
+                <w:rFonts w:cs="Arial"/>
+                <w:b/>
+                <w:bCs/>
+                <w:sz w:val="24"/>
+                <w:szCs w:val="24"/>
+              </w:rPr>
+            </w:pPr>
+            <w:r>
+              <w:rPr>
+                <w:rFonts w:cs="Arial"/>
+                <w:b/>
+                <w:bCs/>
+                <w:sz w:val="24"/>
+                <w:szCs w:val="24"/>
+              </w:rPr>
+              <w:t>RF-01</w:t>
+            </w:r>
+          </w:p>
+        </w:tc>
+        <w:tc>
+          <w:tcPr>
+            <w:tcW w:w="2364" w:type="dxa"/>
+            <w:tcBorders>
+              <w:top w:val="single" w:sz="6" w:space="0" w:color="000000"/>
+              <w:left w:val="single" w:sz="6" w:space="0" w:color="000000"/>
+              <w:bottom w:val="single" w:sz="6" w:space="0" w:color="000000"/>
+              <w:right w:val="single" w:sz="6" w:space="0" w:color="000000"/>
+            </w:tcBorders>
+            <w:tcMar>
+              <w:top w:w="0" w:type="dxa"/>
+              <w:left w:w="100" w:type="dxa"/>
+              <w:bottom w:w="0" w:type="dxa"/>
+              <w:right w:w="100" w:type="dxa"/>
+            </w:tcMar>
+          </w:tcPr>
+          <w:p>
+            <w:pPr>
+              <w:spacing w:before="100" w:beforeAutospacing="1" w:after="100" w:afterAutospacing="1" w:line="360" w:lineRule="auto"/>
+              <w:rPr>
+                <w:rFonts w:cs="Arial"/>
+                <w:sz w:val="24"/>
+                <w:szCs w:val="24"/>
+              </w:rPr>
+            </w:pPr>
+            <w:r>
+              <w:rPr>
+                <w:rFonts w:cs="Arial"/>
+                <w:sz w:val="24"/>
+                <w:szCs w:val="24"/>
+              </w:rPr>
+              <w:t>Cadastrar Motivo de Pausa</w:t>
+            </w:r>
+          </w:p>
+        </w:tc>
+        <w:tc>
+          <w:tcPr>
+            <w:tcW w:w="5664" w:type="dxa"/>
+            <w:tcBorders>
+              <w:top w:val="single" w:sz="6" w:space="0" w:color="000000"/>
+              <w:left w:val="single" w:sz="6" w:space="0" w:color="000000"/>
+              <w:bottom w:val="single" w:sz="6" w:space="0" w:color="000000"/>
+              <w:right w:val="single" w:sz="6" w:space="0" w:color="000000"/>
+            </w:tcBorders>
+            <w:tcMar>
+              <w:top w:w="0" w:type="dxa"/>
+              <w:left w:w="100" w:type="dxa"/>
+              <w:bottom w:w="0" w:type="dxa"/>
+              <w:right w:w="100" w:type="dxa"/>
+            </w:tcMar>
+          </w:tcPr>
+          <w:p>
+            <w:pPr>
+              <w:spacing w:before="100" w:beforeAutospacing="1" w:after="100" w:afterAutospacing="1" w:line="360" w:lineRule="auto"/>
+              <w:jc w:val="both"/>
+              <w:rPr>
+                <w:rFonts w:cs="Arial"/>
+                <w:sz w:val="24"/>
+                <w:szCs w:val="24"/>
+              </w:rPr>
+            </w:pPr>
+            <w:r>
+              <w:rPr>
+                <w:rFonts w:cs="Arial"/>
+                <w:sz w:val="24"/>
+                <w:szCs w:val="24"/>
+              </w:rPr>
+              <w:t>O sistema deve permitir cadastrar os motivos utilizados para classificar as pausas.</w:t>
+            </w:r>
+          </w:p>
+        </w:tc>
+      </w:tr>
+      <w:tr>
+        <w:trPr>
+          <w:cantSplit/>
+        </w:trPr>
+        <w:tc>
+          <w:tcPr>
+            <w:tcW w:w="1027" w:type="dxa"/>
+            <w:tcBorders>
+              <w:top w:val="single" w:sz="6" w:space="0" w:color="000000"/>
+              <w:left w:val="single" w:sz="6" w:space="0" w:color="000000"/>
+              <w:bottom w:val="single" w:sz="6" w:space="0" w:color="000000"/>
+              <w:right w:val="single" w:sz="6" w:space="0" w:color="000000"/>
+            </w:tcBorders>
+            <w:tcMar>
+              <w:top w:w="0" w:type="dxa"/>
+              <w:left w:w="100" w:type="dxa"/>
+              <w:bottom w:w="0" w:type="dxa"/>
+              <w:right w:w="100" w:type="dxa"/>
+            </w:tcMar>
+          </w:tcPr>
+          <w:p>
+            <w:pPr>
+              <w:spacing w:before="100" w:beforeAutospacing="1" w:after="100" w:afterAutospacing="1" w:line="360" w:lineRule="auto"/>
+              <w:jc w:val="both"/>
+              <w:rPr>
+                <w:rFonts w:cs="Arial"/>
+                <w:b/>
+                <w:bCs/>
+                <w:sz w:val="24"/>
+                <w:szCs w:val="24"/>
+              </w:rPr>
+            </w:pPr>
+            <w:r>
+              <w:rPr>
+                <w:rFonts w:cs="Arial"/>
+                <w:b/>
+                <w:bCs/>
+                <w:sz w:val="24"/>
+                <w:szCs w:val="24"/>
+              </w:rPr>
+              <w:t>RF-02</w:t>
+            </w:r>
+          </w:p>
+        </w:tc>
+        <w:tc>
+          <w:tcPr>
+            <w:tcW w:w="2364" w:type="dxa"/>
+            <w:tcBorders>
+              <w:top w:val="single" w:sz="6" w:space="0" w:color="000000"/>
+              <w:left w:val="single" w:sz="6" w:space="0" w:color="000000"/>
+              <w:bottom w:val="single" w:sz="6" w:space="0" w:color="000000"/>
+              <w:right w:val="single" w:sz="6" w:space="0" w:color="000000"/>
+            </w:tcBorders>
+            <w:tcMar>
+              <w:top w:w="0" w:type="dxa"/>
+              <w:left w:w="100" w:type="dxa"/>
+              <w:bottom w:w="0" w:type="dxa"/>
+              <w:right w:w="100" w:type="dxa"/>
+            </w:tcMar>
+          </w:tcPr>
+          <w:p>
+            <w:pPr>
+              <w:spacing w:before="100" w:beforeAutospacing="1" w:after="100" w:afterAutospacing="1" w:line="360" w:lineRule="auto"/>
+              <w:rPr>
+                <w:rFonts w:cs="Arial"/>
+                <w:sz w:val="24"/>
+                <w:szCs w:val="24"/>
+              </w:rPr>
+            </w:pPr>
+            <w:r>
+              <w:rPr>
+                <w:rFonts w:cs="Arial"/>
+                <w:sz w:val="24"/>
+                <w:szCs w:val="24"/>
+              </w:rPr>
+              <w:t>Consultar Motivo de Pausa</w:t>
+            </w:r>
+          </w:p>
+        </w:tc>
+        <w:tc>
+          <w:tcPr>
+            <w:tcW w:w="5664" w:type="dxa"/>
+            <w:tcBorders>
+              <w:top w:val="single" w:sz="6" w:space="0" w:color="000000"/>
+              <w:left w:val="single" w:sz="6" w:space="0" w:color="000000"/>
+              <w:bottom w:val="single" w:sz="6" w:space="0" w:color="000000"/>
+              <w:right w:val="single" w:sz="6" w:space="0" w:color="000000"/>
+            </w:tcBorders>
+            <w:tcMar>
+              <w:top w:w="0" w:type="dxa"/>
+              <w:left w:w="100" w:type="dxa"/>
+              <w:bottom w:w="0" w:type="dxa"/>
+              <w:right w:w="100" w:type="dxa"/>
+            </w:tcMar>
+          </w:tcPr>
+          <w:p>
+            <w:pPr>
+              <w:spacing w:before="100" w:beforeAutospacing="1" w:after="100" w:afterAutospacing="1" w:line="360" w:lineRule="auto"/>
+              <w:jc w:val="both"/>
+              <w:rPr>
+                <w:rFonts w:cs="Arial"/>
+                <w:sz w:val="24"/>
+                <w:szCs w:val="24"/>
+              </w:rPr>
+            </w:pPr>
+            <w:r>
+              <w:rPr>
+                <w:rFonts w:cs="Arial"/>
+                <w:sz w:val="24"/>
+                <w:szCs w:val="24"/>
+              </w:rPr>
+              <w:t>O sistema deve permitir visualizar os motivos de pausa cadastrados.</w:t>
+            </w:r>
+          </w:p>
+        </w:tc>
+      </w:tr>
+      <w:tr>
+        <w:trPr>
+          <w:cantSplit/>
+        </w:trPr>
+        <w:tc>
+          <w:tcPr>
+            <w:tcW w:w="1027" w:type="dxa"/>
+            <w:tcBorders>
+              <w:top w:val="single" w:sz="6" w:space="0" w:color="000000"/>
+              <w:left w:val="single" w:sz="6" w:space="0" w:color="000000"/>
+              <w:bottom w:val="single" w:sz="6" w:space="0" w:color="000000"/>
+              <w:right w:val="single" w:sz="6" w:space="0" w:color="000000"/>
+            </w:tcBorders>
+            <w:tcMar>
+              <w:top w:w="0" w:type="dxa"/>
+              <w:left w:w="100" w:type="dxa"/>
+              <w:bottom w:w="0" w:type="dxa"/>
+              <w:right w:w="100" w:type="dxa"/>
+            </w:tcMar>
+          </w:tcPr>
+          <w:p>
+            <w:pPr>
+              <w:spacing w:before="100" w:beforeAutospacing="1" w:after="100" w:afterAutospacing="1" w:line="360" w:lineRule="auto"/>
+              <w:jc w:val="both"/>
+              <w:rPr>
+                <w:rFonts w:cs="Arial"/>
+                <w:b/>
+                <w:bCs/>
+                <w:sz w:val="24"/>
+                <w:szCs w:val="24"/>
+              </w:rPr>
+            </w:pPr>
+            <w:r>
+              <w:rPr>
+                <w:rFonts w:cs="Arial"/>
+                <w:b/>
+                <w:bCs/>
+                <w:sz w:val="24"/>
+                <w:szCs w:val="24"/>
+              </w:rPr>
+              <w:t>RF-03</w:t>
+            </w:r>
+          </w:p>
+        </w:tc>
+        <w:tc>
+          <w:tcPr>
+            <w:tcW w:w="2364" w:type="dxa"/>
+            <w:tcBorders>
+              <w:top w:val="single" w:sz="6" w:space="0" w:color="000000"/>
+              <w:left w:val="single" w:sz="6" w:space="0" w:color="000000"/>
+              <w:bottom w:val="single" w:sz="6" w:space="0" w:color="000000"/>
+              <w:right w:val="single" w:sz="6" w:space="0" w:color="000000"/>
+            </w:tcBorders>
+            <w:tcMar>
+              <w:top w:w="0" w:type="dxa"/>
+              <w:left w:w="100" w:type="dxa"/>
+              <w:bottom w:w="0" w:type="dxa"/>
+              <w:right w:w="100" w:type="dxa"/>
+            </w:tcMar>
+          </w:tcPr>
+          <w:p>
+            <w:pPr>
+              <w:spacing w:before="100" w:beforeAutospacing="1" w:after="100" w:afterAutospacing="1" w:line="360" w:lineRule="auto"/>
+              <w:rPr>
+                <w:rFonts w:cs="Arial"/>
+                <w:sz w:val="24"/>
+                <w:szCs w:val="24"/>
+              </w:rPr>
+            </w:pPr>
+            <w:r>
+              <w:rPr>
+                <w:rFonts w:cs="Arial"/>
+                <w:sz w:val="24"/>
+                <w:szCs w:val="24"/>
+              </w:rPr>
+              <w:t>Editar Motivo de Pausa</w:t>
+            </w:r>
+          </w:p>
+        </w:tc>
+        <w:tc>
+          <w:tcPr>
+            <w:tcW w:w="5664" w:type="dxa"/>
+            <w:tcBorders>
+              <w:top w:val="single" w:sz="6" w:space="0" w:color="000000"/>
+              <w:left w:val="single" w:sz="6" w:space="0" w:color="000000"/>
+              <w:bottom w:val="single" w:sz="6" w:space="0" w:color="000000"/>
+              <w:right w:val="single" w:sz="6" w:space="0" w:color="000000"/>
+            </w:tcBorders>
+            <w:tcMar>
+              <w:top w:w="0" w:type="dxa"/>
+              <w:left w:w="100" w:type="dxa"/>
+              <w:bottom w:w="0" w:type="dxa"/>
+              <w:right w:w="100" w:type="dxa"/>
+            </w:tcMar>
+          </w:tcPr>
+          <w:p>
+            <w:pPr>
+              <w:spacing w:before="100" w:beforeAutospacing="1" w:after="100" w:afterAutospacing="1" w:line="360" w:lineRule="auto"/>
+              <w:jc w:val="both"/>
+              <w:rPr>
+                <w:rFonts w:cs="Arial"/>
+                <w:sz w:val="24"/>
+                <w:szCs w:val="24"/>
+              </w:rPr>
+            </w:pPr>
+            <w:r>
+              <w:rPr>
+                <w:rFonts w:cs="Arial"/>
+                <w:sz w:val="24"/>
+                <w:szCs w:val="24"/>
+              </w:rPr>
+              <w:t>O sistema deve permitir alterar as informações dos motivos de pausa.</w:t>
+            </w:r>
+          </w:p>
+        </w:tc>
+      </w:tr>
+      <w:tr>
+        <w:trPr>
+          <w:cantSplit/>
+        </w:trPr>
+        <w:tc>
+          <w:tcPr>
+            <w:tcW w:w="1027" w:type="dxa"/>
+            <w:tcBorders>
+              <w:top w:val="single" w:sz="6" w:space="0" w:color="000000"/>
+              <w:left w:val="single" w:sz="6" w:space="0" w:color="000000"/>
+              <w:bottom w:val="single" w:sz="6" w:space="0" w:color="000000"/>
+              <w:right w:val="single" w:sz="6" w:space="0" w:color="000000"/>
+            </w:tcBorders>
+            <w:tcMar>
+              <w:top w:w="0" w:type="dxa"/>
+              <w:left w:w="100" w:type="dxa"/>
+              <w:bottom w:w="0" w:type="dxa"/>
+              <w:right w:w="100" w:type="dxa"/>
+            </w:tcMar>
+          </w:tcPr>
+          <w:p>
+            <w:pPr>
+              <w:spacing w:before="100" w:beforeAutospacing="1" w:after="100" w:afterAutospacing="1" w:line="360" w:lineRule="auto"/>
+              <w:jc w:val="both"/>
+              <w:rPr>
+                <w:rFonts w:cs="Arial"/>
+                <w:b/>
+                <w:bCs/>
+                <w:sz w:val="24"/>
+                <w:szCs w:val="24"/>
+              </w:rPr>
+            </w:pPr>
+            <w:r>
+              <w:rPr>
+                <w:rFonts w:cs="Arial"/>
+                <w:b/>
+                <w:bCs/>
+                <w:sz w:val="24"/>
+                <w:szCs w:val="24"/>
+              </w:rPr>
+              <w:t>RF-04</w:t>
+            </w:r>
+          </w:p>
+        </w:tc>
+        <w:tc>
+          <w:tcPr>
+            <w:tcW w:w="2364" w:type="dxa"/>
+            <w:tcBorders>
+              <w:top w:val="single" w:sz="6" w:space="0" w:color="000000"/>
+              <w:left w:val="single" w:sz="6" w:space="0" w:color="000000"/>
+              <w:bottom w:val="single" w:sz="6" w:space="0" w:color="000000"/>
+              <w:right w:val="single" w:sz="6" w:space="0" w:color="000000"/>
+            </w:tcBorders>
+            <w:tcMar>
+              <w:top w:w="0" w:type="dxa"/>
+              <w:left w:w="100" w:type="dxa"/>
+              <w:bottom w:w="0" w:type="dxa"/>
+              <w:right w:w="100" w:type="dxa"/>
+            </w:tcMar>
+          </w:tcPr>
+          <w:p>
+            <w:pPr>
+              <w:spacing w:before="100" w:beforeAutospacing="1" w:after="100" w:afterAutospacing="1" w:line="360" w:lineRule="auto"/>
+              <w:rPr>
+                <w:rFonts w:cs="Arial"/>
+                <w:sz w:val="24"/>
+                <w:szCs w:val="24"/>
+              </w:rPr>
+            </w:pPr>
+            <w:r>
+              <w:rPr>
+                <w:rFonts w:cs="Arial"/>
+                <w:sz w:val="24"/>
+                <w:szCs w:val="24"/>
+              </w:rPr>
+              <w:t>Inativar Motivo de Pausa</w:t>
+            </w:r>
+          </w:p>
+        </w:tc>
+        <w:tc>
+          <w:tcPr>
+            <w:tcW w:w="5664" w:type="dxa"/>
+            <w:tcBorders>
+              <w:top w:val="single" w:sz="6" w:space="0" w:color="000000"/>
+              <w:left w:val="single" w:sz="6" w:space="0" w:color="000000"/>
+              <w:bottom w:val="single" w:sz="6" w:space="0" w:color="000000"/>
+              <w:right w:val="single" w:sz="6" w:space="0" w:color="000000"/>
+            </w:tcBorders>
+            <w:tcMar>
+              <w:top w:w="0" w:type="dxa"/>
+              <w:left w:w="100" w:type="dxa"/>
+              <w:bottom w:w="0" w:type="dxa"/>
+              <w:right w:w="100" w:type="dxa"/>
+            </w:tcMar>
+          </w:tcPr>
+          <w:p>
+            <w:pPr>
+              <w:spacing w:before="100" w:beforeAutospacing="1" w:after="100" w:afterAutospacing="1" w:line="360" w:lineRule="auto"/>
+              <w:jc w:val="both"/>
+              <w:rPr>
+                <w:rFonts w:cs="Arial"/>
+                <w:sz w:val="24"/>
+                <w:szCs w:val="24"/>
+              </w:rPr>
+            </w:pPr>
+            <w:r>
+              <w:rPr>
+                <w:rFonts w:cs="Arial"/>
+                <w:sz w:val="24"/>
+                <w:szCs w:val="24"/>
+              </w:rPr>
+              <w:t>O sistema deve permitir inativar motivos de pausa que não serão mais utilizados, mantendo o histórico das pausas já registradas.</w:t>
+            </w:r>
+          </w:p>
+        </w:tc>
+      </w:tr>
+    </w:tbl>
+    <w:p>
+      <w:pPr>
+        <w:spacing w:before="100" w:beforeAutospacing="1" w:after="100" w:afterAutospacing="1" w:line="360" w:lineRule="auto"/>
+        <w:jc w:val="both"/>
+        <w:rPr>
+          <w:rFonts w:cs="Arial"/>
+          <w:sz w:val="20"/>
+          <w:szCs w:val="20"/>
+        </w:rPr>
+      </w:pPr>
+      <w:r>
+        <w:rPr>
+          <w:rFonts w:cs="Arial"/>
+          <w:b/>
+          <w:bCs/>
+          <w:sz w:val="20"/>
+          <w:szCs w:val="20"/>
+        </w:rPr>
+        <w:t xml:space="preserve">Fonte: </w:t>
+      </w:r>
+      <w:r>
+        <w:rPr>
+          <w:rFonts w:cs="Arial"/>
+          <w:sz w:val="20"/>
+          <w:szCs w:val="20"/>
+        </w:rPr>
+        <w:t>Próprio autor, acessado em 14 de outubro de 2026.</w:t>
+      </w:r>
+    </w:p>
+    <w:p>
+      <w:pPr>
+        <w:spacing w:after="100" w:afterAutospacing="1"/>
+        <w:rPr>
+          <w:rFonts w:ascii="Times New Roman" w:hAnsi="Times New Roman" w:cs="Times New Roman"/>
+          <w:b/>
+          <w:sz w:val="24"/>
+          <w:szCs w:val="24"/>
+        </w:rPr>
+      </w:pPr>
+      <w:r>
+        <w:rPr>
+          <w:rFonts w:ascii="Times New Roman" w:hAnsi="Times New Roman" w:cs="Times New Roman"/>
+          <w:b/>
+          <w:sz w:val="24"/>
+          <w:szCs w:val="24"/>
+        </w:rPr>
+        <w:br w:type="page"/>
+      </w:r>
+    </w:p>
+    <w:p>
+      <w:pPr>
+        <w:pStyle w:val="Ttulo2"/>
+      </w:pPr>
+      <w:bookmarkStart w:id="51" w:name="_Toc242906283"/>
+      <w:r>
+        <w:lastRenderedPageBreak/>
+        <w:t>4.3 Requisitos Não Funcionais</w:t>
+      </w:r>
+      <w:bookmarkEnd w:id="51"/>
+    </w:p>
+    <w:p>
+      <w:pPr>
+        <w:spacing w:before="100" w:beforeAutospacing="1" w:after="100" w:afterAutospacing="1" w:line="360" w:lineRule="auto"/>
+        <w:ind w:firstLine="708"/>
+        <w:jc w:val="both"/>
+        <w:rPr>
+          <w:rFonts w:cs="Arial"/>
+          <w:sz w:val="24"/>
+          <w:szCs w:val="24"/>
+        </w:rPr>
+      </w:pPr>
+      <w:r>
+        <w:rPr>
+          <w:rFonts w:cs="Arial"/>
+          <w:sz w:val="24"/>
+          <w:szCs w:val="24"/>
+        </w:rPr>
+        <w:t>Os requisitos não funcionais estão relacionados às características de qualidade, desempenho, segurança e usabilidade do sistema. Esses requisitos definem padrões e restrições que a aplicação deverá atender para garantir seu funcionamento adequado, proporcionando maior confiabilidade, eficiência e melhor experiência aos usuários.</w:t>
+      </w:r>
+    </w:p>
+    <w:p>
+      <w:pPr>
+        <w:pStyle w:val="Ttulo3"/>
+      </w:pPr>
+      <w:bookmarkStart w:id="52" w:name="_Toc242906284"/>
+      <w:r>
+        <w:t>4.3.1 Requisitos Não Funcionais do Sistema</w:t>
+      </w:r>
+      <w:bookmarkEnd w:id="52"/>
+    </w:p>
+    <w:p>
+      <w:pPr>
+        <w:spacing w:before="100" w:beforeAutospacing="1" w:after="100" w:afterAutospacing="1" w:line="360" w:lineRule="auto"/>
+        <w:ind w:firstLine="708"/>
+        <w:jc w:val="both"/>
+        <w:rPr>
+          <w:rFonts w:cs="Arial"/>
+          <w:sz w:val="24"/>
+          <w:szCs w:val="24"/>
+        </w:rPr>
+      </w:pPr>
+      <w:r>
+        <w:rPr>
+          <w:rFonts w:cs="Arial"/>
+          <w:sz w:val="24"/>
+          <w:szCs w:val="24"/>
+        </w:rPr>
+        <w:t>A tabela apresentada abaixo contém os principais requisitos não funcionais definidos para o sistema de gerenciamento de nivelamento de processos em linhas de produção.</w:t>
+      </w:r>
+    </w:p>
+    <w:p>
+      <w:pPr>
+        <w:pStyle w:val="Legenda"/>
+        <w:keepNext/>
+      </w:pPr>
+      <w:bookmarkStart w:id="53" w:name="_Toc242906312"/>
+      <w:r>
+        <w:t xml:space="preserve">Tabela </w:t>
+      </w:r>
+      <w:r>
+        <w:fldChar w:fldCharType="begin"/>
+      </w:r>
+      <w:r>
+        <w:instrText xml:space="preserve"> SEQ Tabela \* ARABIC </w:instrText>
+      </w:r>
+      <w:r>
+        <w:fldChar w:fldCharType="separate"/>
+      </w:r>
+      <w:r>
+        <w:rPr>
+          <w:noProof/>
+        </w:rPr>
+        <w:t>10</w:t>
+      </w:r>
+      <w:r>
+        <w:fldChar w:fldCharType="end"/>
+      </w:r>
+      <w:r>
         <w:t xml:space="preserve"> – Requisitos Não Funcionais do Sistema</w:t>
       </w:r>
-      <w:bookmarkEnd w:id="49"/>
+      <w:bookmarkEnd w:id="53"/>
     </w:p>
     <w:tbl>
       <w:tblPr>
@@ -17797,12 +19795,12 @@
       <w:pPr>
         <w:pStyle w:val="Ttulo2"/>
       </w:pPr>
-      <w:bookmarkStart w:id="50" w:name="_Toc242797259"/>
+      <w:bookmarkStart w:id="54" w:name="_Toc242906285"/>
       <w:r>
         <w:lastRenderedPageBreak/>
         <w:t>4.4 Prototipagem</w:t>
       </w:r>
-      <w:bookmarkEnd w:id="50"/>
+      <w:bookmarkEnd w:id="54"/>
     </w:p>
     <w:p>
       <w:pPr>
@@ -18106,7 +20104,7 @@
         <w:pStyle w:val="Legenda"/>
         <w:keepNext/>
       </w:pPr>
-      <w:bookmarkStart w:id="51" w:name="_Toc242797207"/>
+      <w:bookmarkStart w:id="55" w:name="_Toc242906296"/>
       <w:r>
         <w:lastRenderedPageBreak/>
         <w:t xml:space="preserve">Figura </w:t>
@@ -18132,7 +20130,7 @@
       <w:r>
         <w:t xml:space="preserve"> – Protótipo do Dashboard Analítico do Sistema</w:t>
       </w:r>
-      <w:bookmarkEnd w:id="51"/>
+      <w:bookmarkEnd w:id="55"/>
     </w:p>
     <w:p>
       <w:pPr>
@@ -18145,7 +20143,7 @@
           <w:noProof/>
         </w:rPr>
         <w:drawing>
-          <wp:inline distT="0" distB="0" distL="0" distR="0" wp14:anchorId="0AF3DF36" wp14:editId="48C6CDDE">
+          <wp:inline distT="0" distB="0" distL="0" distR="0" wp14:anchorId="3626F120" wp14:editId="0EFD37B6">
             <wp:extent cx="5669280" cy="2894876"/>
             <wp:effectExtent l="0" t="0" r="0" b="0"/>
             <wp:docPr id="2" name="Picture 2"/>
@@ -18212,7 +20210,7 @@
         <w:pStyle w:val="Legenda"/>
         <w:keepNext/>
       </w:pPr>
-      <w:bookmarkStart w:id="52" w:name="_Toc242797208"/>
+      <w:bookmarkStart w:id="56" w:name="_Toc242906297"/>
       <w:r>
         <w:t xml:space="preserve">Figura </w:t>
       </w:r>
@@ -18237,7 +20235,7 @@
       <w:r>
         <w:t xml:space="preserve"> – Protótipo da Tela Inicial do Sistema</w:t>
       </w:r>
-      <w:bookmarkEnd w:id="52"/>
+      <w:bookmarkEnd w:id="56"/>
     </w:p>
     <w:p>
       <w:pPr>
@@ -18256,7 +20254,7 @@
           <w:szCs w:val="18"/>
         </w:rPr>
         <w:drawing>
-          <wp:inline distT="0" distB="0" distL="0" distR="0" wp14:anchorId="0DD4A0C8" wp14:editId="3128D80C">
+          <wp:inline distT="0" distB="0" distL="0" distR="0" wp14:anchorId="234F07DA" wp14:editId="29ECFBA8">
             <wp:extent cx="5669280" cy="2894876"/>
             <wp:effectExtent l="0" t="0" r="0" b="0"/>
             <wp:docPr id="1" name="Picture 3"/>
@@ -18349,7 +20347,7 @@
         <w:pStyle w:val="Legenda"/>
         <w:keepNext/>
       </w:pPr>
-      <w:bookmarkStart w:id="53" w:name="_Toc242797209"/>
+      <w:bookmarkStart w:id="57" w:name="_Toc242906298"/>
       <w:r>
         <w:t xml:space="preserve">Figura </w:t>
       </w:r>
@@ -18374,7 +20372,7 @@
       <w:r>
         <w:t xml:space="preserve"> – Protótipo da Tela de Apontamento da Produção</w:t>
       </w:r>
-      <w:bookmarkEnd w:id="53"/>
+      <w:bookmarkEnd w:id="57"/>
     </w:p>
     <w:p>
       <w:pPr>
@@ -18387,7 +20385,7 @@
           <w:noProof/>
         </w:rPr>
         <w:drawing>
-          <wp:inline distT="0" distB="0" distL="0" distR="0" wp14:anchorId="06F51177" wp14:editId="02ABB230">
+          <wp:inline distT="0" distB="0" distL="0" distR="0" wp14:anchorId="037F1E1F" wp14:editId="3EB346AE">
             <wp:extent cx="5669280" cy="2894876"/>
             <wp:effectExtent l="0" t="0" r="0" b="0"/>
             <wp:docPr id="201" name="Imagem 201"/>
@@ -18454,7 +20452,7 @@
         <w:pStyle w:val="Legenda"/>
         <w:keepNext/>
       </w:pPr>
-      <w:bookmarkStart w:id="54" w:name="_Toc242797210"/>
+      <w:bookmarkStart w:id="58" w:name="_Toc242906299"/>
       <w:r>
         <w:t xml:space="preserve">Figura </w:t>
       </w:r>
@@ -18479,7 +20477,7 @@
       <w:r>
         <w:t xml:space="preserve"> – Protótipo da Tela de Ordens de Produção</w:t>
       </w:r>
-      <w:bookmarkEnd w:id="54"/>
+      <w:bookmarkEnd w:id="58"/>
     </w:p>
     <w:p>
       <w:pPr>
@@ -18492,7 +20490,7 @@
           <w:noProof/>
         </w:rPr>
         <w:drawing>
-          <wp:inline distT="0" distB="0" distL="0" distR="0" wp14:anchorId="0FDF9882" wp14:editId="0FEA6822">
+          <wp:inline distT="0" distB="0" distL="0" distR="0" wp14:anchorId="7EAB5C9F" wp14:editId="0F0D30AF">
             <wp:extent cx="5669280" cy="2894876"/>
             <wp:effectExtent l="0" t="0" r="0" b="0"/>
             <wp:docPr id="202" name="Imagem 202"/>
@@ -18568,12 +20566,12 @@
       <w:pPr>
         <w:pStyle w:val="Ttulo2"/>
       </w:pPr>
-      <w:bookmarkStart w:id="55" w:name="_Toc242797260"/>
+      <w:bookmarkStart w:id="59" w:name="_Toc242906286"/>
       <w:r>
         <w:lastRenderedPageBreak/>
         <w:t>4.5 Possível Estrutura do Sistema</w:t>
       </w:r>
-      <w:bookmarkEnd w:id="55"/>
+      <w:bookmarkEnd w:id="59"/>
     </w:p>
     <w:p>
       <w:pPr>
@@ -18854,28 +20852,28 @@
           <w:sz w:val="24"/>
         </w:rPr>
       </w:pPr>
-      <w:bookmarkStart w:id="56" w:name="_Toc242797261"/>
+      <w:bookmarkStart w:id="60" w:name="_Toc242906287"/>
       <w:r>
         <w:rPr>
           <w:sz w:val="24"/>
         </w:rPr>
         <w:lastRenderedPageBreak/>
-        <w:t>5. DIAGRAMA DE BANCO DE DADOS</w:t>
-      </w:r>
-      <w:bookmarkEnd w:id="56"/>
+        <w:t>5. MODELAGEM DO SISTEMA</w:t>
+      </w:r>
+      <w:bookmarkEnd w:id="60"/>
     </w:p>
     <w:p>
       <w:pPr>
         <w:pStyle w:val="Ttulo2"/>
       </w:pPr>
-      <w:bookmarkStart w:id="57" w:name="_Toc242797262"/>
+      <w:bookmarkStart w:id="61" w:name="_Toc242906288"/>
       <w:r>
         <w:t xml:space="preserve">5.1 </w:t>
       </w:r>
       <w:r>
         <w:t>Modelagem do Banco de Dados</w:t>
       </w:r>
-      <w:bookmarkEnd w:id="57"/>
+      <w:bookmarkEnd w:id="61"/>
     </w:p>
     <w:p>
       <w:pPr>
@@ -19361,7 +21359,7 @@
         <w:pStyle w:val="Legenda"/>
         <w:keepNext/>
       </w:pPr>
-      <w:bookmarkStart w:id="58" w:name="_Toc242797211"/>
+      <w:bookmarkStart w:id="62" w:name="_Toc242906300"/>
       <w:r>
         <w:t xml:space="preserve">Figura </w:t>
       </w:r>
@@ -19386,7 +21384,7 @@
       <w:r>
         <w:t xml:space="preserve"> – Diagrama Entidade-Relacionamento do Banco de Dados</w:t>
       </w:r>
-      <w:bookmarkEnd w:id="58"/>
+      <w:bookmarkEnd w:id="62"/>
     </w:p>
     <w:p>
       <w:pPr>
@@ -19398,7 +21396,7 @@
           <w:noProof/>
         </w:rPr>
         <w:drawing>
-          <wp:inline distT="0" distB="0" distL="0" distR="0" wp14:anchorId="2EA98D9C" wp14:editId="6A6B02C3">
+          <wp:inline distT="0" distB="0" distL="0" distR="0" wp14:anchorId="081152DD" wp14:editId="1BA49EFC">
             <wp:extent cx="5281879" cy="6811702"/>
             <wp:effectExtent l="0" t="0" r="4445" b="1905"/>
             <wp:docPr id="4" name="Imagem 4"/>
@@ -19495,12 +21493,12 @@
       <w:pPr>
         <w:pStyle w:val="Ttulo2"/>
       </w:pPr>
-      <w:bookmarkStart w:id="59" w:name="_Toc242797263"/>
+      <w:bookmarkStart w:id="63" w:name="_Toc242906289"/>
       <w:r>
         <w:lastRenderedPageBreak/>
         <w:t>5.2 Diagrama de Classes</w:t>
       </w:r>
-      <w:bookmarkEnd w:id="59"/>
+      <w:bookmarkEnd w:id="63"/>
     </w:p>
     <w:p>
       <w:pPr>
@@ -19644,7 +21642,7 @@
         <w:pStyle w:val="Legenda"/>
         <w:keepNext/>
       </w:pPr>
-      <w:bookmarkStart w:id="60" w:name="_Toc242797212"/>
+      <w:bookmarkStart w:id="64" w:name="_Toc242906301"/>
       <w:r>
         <w:lastRenderedPageBreak/>
         <w:t xml:space="preserve">Figura </w:t>
@@ -19670,7 +21668,7 @@
       <w:r>
         <w:t xml:space="preserve"> – Diagrama de Classes do Sistema</w:t>
       </w:r>
-      <w:bookmarkEnd w:id="60"/>
+      <w:bookmarkEnd w:id="64"/>
     </w:p>
     <w:p>
       <w:pPr>
@@ -19683,7 +21681,7 @@
           <w:noProof/>
         </w:rPr>
         <w:drawing>
-          <wp:inline distT="0" distB="0" distL="0" distR="0" wp14:anchorId="5974CD67" wp14:editId="70F8BDE9">
+          <wp:inline distT="0" distB="0" distL="0" distR="0" wp14:anchorId="1573F3F4" wp14:editId="1C629948">
             <wp:extent cx="5730167" cy="7070453"/>
             <wp:effectExtent l="0" t="0" r="0" b="0"/>
             <wp:docPr id="203" name="Imagem 203"/>
@@ -19757,16 +21755,328 @@
     </w:p>
     <w:p>
       <w:pPr>
+        <w:pStyle w:val="Ttulo2"/>
+      </w:pPr>
+      <w:bookmarkStart w:id="65" w:name="_Toc242906290"/>
+      <w:r>
+        <w:lastRenderedPageBreak/>
+        <w:t>5.3 Diagrama de Casos de Uso</w:t>
+      </w:r>
+      <w:bookmarkEnd w:id="65"/>
+    </w:p>
+    <w:p>
+      <w:pPr>
+        <w:spacing w:before="100" w:beforeAutospacing="1" w:after="100" w:afterAutospacing="1" w:line="360" w:lineRule="auto"/>
+        <w:ind w:firstLine="708"/>
+        <w:jc w:val="both"/>
+        <w:rPr>
+          <w:rFonts w:cs="Arial"/>
+          <w:sz w:val="24"/>
+          <w:szCs w:val="24"/>
+        </w:rPr>
+      </w:pPr>
+      <w:r>
+        <w:rPr>
+          <w:sz w:val="24"/>
+          <w:szCs w:val="24"/>
+        </w:rPr>
+        <w:t>O diagrama de casos de uso apresentado na Figura 11 representa as funcionalidades do sistema e os atores que interagem com elas. Ele foi elaborado na notação UML a partir dos requisitos funcionais apresentados no capítulo 4, de modo que cada caso de uso corresponde a um ou mais desses requisitos.</w:t>
+      </w:r>
+    </w:p>
+    <w:p>
+      <w:pPr>
+        <w:spacing w:line="360" w:lineRule="auto"/>
+        <w:ind w:firstLine="708"/>
+        <w:jc w:val="both"/>
+        <w:rPr>
+          <w:sz w:val="24"/>
+          <w:szCs w:val="24"/>
+        </w:rPr>
+      </w:pPr>
+      <w:r>
+        <w:rPr>
+          <w:sz w:val="24"/>
+          <w:szCs w:val="24"/>
+        </w:rPr>
+        <w:t xml:space="preserve">O sistema possui dois atores. O </w:t>
+      </w:r>
+      <w:r>
+        <w:rPr>
+          <w:b/>
+          <w:bCs/>
+          <w:sz w:val="24"/>
+          <w:szCs w:val="24"/>
+        </w:rPr>
+        <w:t>Administrador</w:t>
+      </w:r>
+      <w:r>
+        <w:rPr>
+          <w:sz w:val="24"/>
+          <w:szCs w:val="24"/>
+        </w:rPr>
+        <w:t xml:space="preserve"> é o usuário que acessa a área administrativa com matrícula e senha e é responsável pelos cadastros, pelo planejamento da produção e pelo acompanhamento dos resultados. O </w:t>
+      </w:r>
+      <w:r>
+        <w:rPr>
+          <w:b/>
+          <w:bCs/>
+          <w:sz w:val="24"/>
+          <w:szCs w:val="24"/>
+        </w:rPr>
+        <w:t>Operador</w:t>
+      </w:r>
+      <w:r>
+        <w:rPr>
+          <w:sz w:val="24"/>
+          <w:szCs w:val="24"/>
+        </w:rPr>
+        <w:t xml:space="preserve"> é o colaborador que registra o apontamento da produção no posto de trabalho. Ele é identificado pela matrícula, digitada ou lida por um leitor de código, e essa identificação serve apenas para associar o apontamento a quem o realizou, sem dar acesso à área administrativa.</w:t>
+      </w:r>
+    </w:p>
+    <w:p>
+      <w:pPr>
+        <w:spacing w:line="360" w:lineRule="auto"/>
+        <w:ind w:firstLine="708"/>
+        <w:jc w:val="both"/>
+        <w:rPr>
+          <w:sz w:val="24"/>
+          <w:szCs w:val="24"/>
+        </w:rPr>
+      </w:pPr>
+      <w:r>
+        <w:rPr>
+          <w:sz w:val="24"/>
+          <w:szCs w:val="24"/>
+        </w:rPr>
+        <w:t xml:space="preserve">Os casos de uso iniciados por </w:t>
+      </w:r>
+      <w:r>
+        <w:rPr>
+          <w:b/>
+          <w:bCs/>
+          <w:sz w:val="24"/>
+          <w:szCs w:val="24"/>
+        </w:rPr>
+        <w:t>Manter</w:t>
+      </w:r>
+      <w:r>
+        <w:rPr>
+          <w:sz w:val="24"/>
+          <w:szCs w:val="24"/>
+        </w:rPr>
+        <w:t xml:space="preserve"> reúnem as operações de cadastro, consulta, edição e exclusão ou inativação do registro correspondente. Todos os casos de uso do Administrador exigem que ele esteja autenticado no sistema.</w:t>
+      </w:r>
+    </w:p>
+    <w:p>
+      <w:pPr>
+        <w:spacing w:line="360" w:lineRule="auto"/>
+        <w:ind w:firstLine="708"/>
+        <w:jc w:val="both"/>
+        <w:rPr>
+          <w:sz w:val="24"/>
+          <w:szCs w:val="24"/>
+        </w:rPr>
+      </w:pPr>
+      <w:r>
+        <w:rPr>
+          <w:sz w:val="24"/>
+          <w:szCs w:val="24"/>
+        </w:rPr>
+        <w:t xml:space="preserve">No apontamento, o caso de uso </w:t>
+      </w:r>
+      <w:r>
+        <w:rPr>
+          <w:b/>
+          <w:bCs/>
+          <w:sz w:val="24"/>
+          <w:szCs w:val="24"/>
+        </w:rPr>
+        <w:t>Iniciar execução</w:t>
+      </w:r>
+      <w:r>
+        <w:rPr>
+          <w:sz w:val="24"/>
+          <w:szCs w:val="24"/>
+        </w:rPr>
+        <w:t xml:space="preserve"> inclui o caso </w:t>
+      </w:r>
+      <w:r>
+        <w:rPr>
+          <w:b/>
+          <w:bCs/>
+          <w:sz w:val="24"/>
+          <w:szCs w:val="24"/>
+        </w:rPr>
+        <w:t>Identificar operador e ordem</w:t>
+      </w:r>
+      <w:r>
+        <w:rPr>
+          <w:sz w:val="24"/>
+          <w:szCs w:val="24"/>
+        </w:rPr>
+        <w:t xml:space="preserve">, representado pelo relacionamento «include», pois toda execução começa pela identificação do operador e da ordem de produção. Já o caso </w:t>
+      </w:r>
+      <w:r>
+        <w:rPr>
+          <w:b/>
+          <w:bCs/>
+          <w:sz w:val="24"/>
+          <w:szCs w:val="24"/>
+        </w:rPr>
+        <w:t>Registrar quantidades da baixa</w:t>
+      </w:r>
+      <w:r>
+        <w:rPr>
+          <w:sz w:val="24"/>
+          <w:szCs w:val="24"/>
+        </w:rPr>
+        <w:t xml:space="preserve"> estende o caso </w:t>
+      </w:r>
+      <w:r>
+        <w:rPr>
+          <w:b/>
+          <w:bCs/>
+          <w:sz w:val="24"/>
+          <w:szCs w:val="24"/>
+        </w:rPr>
+        <w:t>Finalizar execução</w:t>
+      </w:r>
+      <w:r>
+        <w:rPr>
+          <w:sz w:val="24"/>
+          <w:szCs w:val="24"/>
+        </w:rPr>
+        <w:t>, conforme o relacionamento «extend», porque as quantidades boa, de retrabalho e de refugo só são informadas quando a finalização ocorre por baixa, e não na troca de operação.</w:t>
+      </w:r>
+    </w:p>
+    <w:p>
+      <w:pPr>
+        <w:pStyle w:val="Legenda"/>
+        <w:keepNext/>
+      </w:pPr>
+      <w:bookmarkStart w:id="66" w:name="_Toc242906302"/>
+      <w:r>
+        <w:lastRenderedPageBreak/>
+        <w:t xml:space="preserve">Figura </w:t>
+      </w:r>
+      <w:r>
+        <w:fldChar w:fldCharType="begin"/>
+      </w:r>
+      <w:r>
+        <w:instrText xml:space="preserve"> SEQ Figura \* ARABIC </w:instrText>
+      </w:r>
+      <w:r>
+        <w:fldChar w:fldCharType="separate"/>
+      </w:r>
+      <w:r>
+        <w:rPr>
+          <w:noProof/>
+        </w:rPr>
+        <w:t>11</w:t>
+      </w:r>
+      <w:r>
+        <w:fldChar w:fldCharType="end"/>
+      </w:r>
+      <w:r>
+        <w:t xml:space="preserve"> – Diagrama de Casos de Uso do Sistema</w:t>
+      </w:r>
+      <w:bookmarkEnd w:id="66"/>
+    </w:p>
+    <w:p>
+      <w:pPr>
+        <w:keepNext/>
+        <w:spacing w:line="360" w:lineRule="auto"/>
+        <w:jc w:val="center"/>
+      </w:pPr>
+      <w:r>
+        <w:rPr>
+          <w:noProof/>
+        </w:rPr>
+        <w:drawing>
+          <wp:inline distT="0" distB="0" distL="0" distR="0" wp14:anchorId="0D9F1722" wp14:editId="2B471AC4">
+            <wp:extent cx="5730167" cy="5203986"/>
+            <wp:effectExtent l="0" t="0" r="0" b="0"/>
+            <wp:docPr id="204" name="Imagem 204"/>
+            <wp:cNvGraphicFramePr>
+              <a:graphicFrameLocks xmlns:a="http://schemas.openxmlformats.org/drawingml/2006/main" noChangeAspect="1"/>
+            </wp:cNvGraphicFramePr>
+            <a:graphic xmlns:a="http://schemas.openxmlformats.org/drawingml/2006/main">
+              <a:graphicData uri="http://schemas.openxmlformats.org/drawingml/2006/picture">
+                <pic:pic xmlns:pic="http://schemas.openxmlformats.org/drawingml/2006/picture">
+                  <pic:nvPicPr>
+                    <pic:cNvPr id="204" name="Imagem 204"/>
+                    <pic:cNvPicPr/>
+                  </pic:nvPicPr>
+                  <pic:blipFill>
+                    <a:blip r:embed="rId24"/>
+                    <a:stretch>
+                      <a:fillRect/>
+                    </a:stretch>
+                  </pic:blipFill>
+                  <pic:spPr>
+                    <a:xfrm>
+                      <a:off x="0" y="0"/>
+                      <a:ext cx="5730167" cy="5203986"/>
+                    </a:xfrm>
+                    <a:prstGeom prst="rect">
+                      <a:avLst/>
+                    </a:prstGeom>
+                  </pic:spPr>
+                </pic:pic>
+              </a:graphicData>
+            </a:graphic>
+          </wp:inline>
+        </w:drawing>
+      </w:r>
+    </w:p>
+    <w:p>
+      <w:pPr>
+        <w:jc w:val="center"/>
+        <w:rPr>
+          <w:sz w:val="20"/>
+          <w:szCs w:val="20"/>
+        </w:rPr>
+      </w:pPr>
+      <w:r>
+        <w:rPr>
+          <w:sz w:val="20"/>
+          <w:szCs w:val="20"/>
+        </w:rPr>
+        <w:t>Fonte: Próprio autor, acessado em 14 de outubro de 2026.</w:t>
+      </w:r>
+    </w:p>
+    <w:p>
+      <w:pPr>
+        <w:spacing w:after="100" w:afterAutospacing="1"/>
+        <w:rPr>
+          <w:rFonts w:ascii="Times New Roman" w:hAnsi="Times New Roman" w:cs="Times New Roman"/>
+          <w:b/>
+          <w:sz w:val="24"/>
+          <w:szCs w:val="24"/>
+        </w:rPr>
+      </w:pPr>
+      <w:r>
+        <w:rPr>
+          <w:rFonts w:ascii="Times New Roman" w:hAnsi="Times New Roman" w:cs="Times New Roman"/>
+          <w:b/>
+          <w:sz w:val="24"/>
+          <w:szCs w:val="24"/>
+        </w:rPr>
+        <w:br w:type="page"/>
+      </w:r>
+    </w:p>
+    <w:p>
+      <w:pPr>
         <w:pStyle w:val="Ttulo1"/>
         <w:spacing w:after="100" w:afterAutospacing="1"/>
         <w:jc w:val="center"/>
       </w:pPr>
-      <w:bookmarkStart w:id="61" w:name="_Toc242797264"/>
+      <w:bookmarkStart w:id="67" w:name="_Toc242906291"/>
       <w:r>
         <w:lastRenderedPageBreak/>
         <w:t>REFERÊNCIAS</w:t>
       </w:r>
-      <w:bookmarkEnd w:id="61"/>
+      <w:bookmarkEnd w:id="67"/>
     </w:p>
     <w:p/>
     <w:p>
@@ -20354,7 +22664,7 @@
       </w:r>
     </w:p>
     <w:sectPr>
-      <w:headerReference w:type="default" r:id="rId24"/>
+      <w:headerReference w:type="default" r:id="rId25"/>
       <w:pgSz w:w="11906" w:h="16838" w:code="9"/>
       <w:pgMar w:top="1701" w:right="1134" w:bottom="1134" w:left="1701" w:header="709" w:footer="709" w:gutter="0"/>
       <w:pgNumType w:start="11"/>
@@ -20469,7 +22779,7 @@
         <w:lang w:eastAsia="pt-BR"/>
       </w:rPr>
       <w:drawing>
-        <wp:inline distT="0" distB="0" distL="0" distR="0" wp14:anchorId="462E20D2" wp14:editId="72ADE90F">
+        <wp:inline distT="0" distB="0" distL="0" distR="0" wp14:anchorId="42991E72" wp14:editId="0731E225">
           <wp:extent cx="1619048" cy="647619"/>
           <wp:effectExtent l="0" t="0" r="0" b="0"/>
           <wp:docPr id="5" name="Imagem 5" descr="Logotipo  O conteúdo gerado por IA pode estar incorreto."/>

</xml_diff>

<commit_message>
docs: adiciona o capítulo de implementação ao TCC
</commit_message>
<xml_diff>
--- a/docs/tcc/TCC_Nivelamento_de_Processos.docx
+++ b/docs/tcc/TCC_Nivelamento_de_Processos.docx
@@ -1706,7 +1706,7 @@
       <w:r>
         <w:fldChar w:fldCharType="separate"/>
       </w:r>
-      <w:hyperlink w:anchor="_Toc242906292" w:history="1">
+      <w:hyperlink w:anchor="_Toc242908896" w:history="1">
         <w:r>
           <w:rPr>
             <w:rStyle w:val="Hyperlink"/>
@@ -1733,7 +1733,7 @@
             <w:noProof/>
             <w:webHidden/>
           </w:rPr>
-          <w:instrText xml:space="preserve"> PAGEREF _Toc242906292 \h </w:instrText>
+          <w:instrText xml:space="preserve"> PAGEREF _Toc242908896 \h </w:instrText>
         </w:r>
         <w:r>
           <w:rPr>
@@ -1778,7 +1778,7 @@
           <w14:ligatures w14:val="standardContextual"/>
         </w:rPr>
       </w:pPr>
-      <w:hyperlink w:anchor="_Toc242906293" w:history="1">
+      <w:hyperlink w:anchor="_Toc242908897" w:history="1">
         <w:r>
           <w:rPr>
             <w:rStyle w:val="Hyperlink"/>
@@ -1805,7 +1805,7 @@
             <w:noProof/>
             <w:webHidden/>
           </w:rPr>
-          <w:instrText xml:space="preserve"> PAGEREF _Toc242906293 \h </w:instrText>
+          <w:instrText xml:space="preserve"> PAGEREF _Toc242908897 \h </w:instrText>
         </w:r>
         <w:r>
           <w:rPr>
@@ -1850,7 +1850,7 @@
           <w14:ligatures w14:val="standardContextual"/>
         </w:rPr>
       </w:pPr>
-      <w:hyperlink w:anchor="_Toc242906294" w:history="1">
+      <w:hyperlink w:anchor="_Toc242908898" w:history="1">
         <w:r>
           <w:rPr>
             <w:rStyle w:val="Hyperlink"/>
@@ -1877,7 +1877,7 @@
             <w:noProof/>
             <w:webHidden/>
           </w:rPr>
-          <w:instrText xml:space="preserve"> PAGEREF _Toc242906294 \h </w:instrText>
+          <w:instrText xml:space="preserve"> PAGEREF _Toc242908898 \h </w:instrText>
         </w:r>
         <w:r>
           <w:rPr>
@@ -1922,7 +1922,7 @@
           <w14:ligatures w14:val="standardContextual"/>
         </w:rPr>
       </w:pPr>
-      <w:hyperlink w:anchor="_Toc242906295" w:history="1">
+      <w:hyperlink w:anchor="_Toc242908899" w:history="1">
         <w:r>
           <w:rPr>
             <w:rStyle w:val="Hyperlink"/>
@@ -1949,7 +1949,7 @@
             <w:noProof/>
             <w:webHidden/>
           </w:rPr>
-          <w:instrText xml:space="preserve"> PAGEREF _Toc242906295 \h </w:instrText>
+          <w:instrText xml:space="preserve"> PAGEREF _Toc242908899 \h </w:instrText>
         </w:r>
         <w:r>
           <w:rPr>
@@ -1994,7 +1994,7 @@
           <w14:ligatures w14:val="standardContextual"/>
         </w:rPr>
       </w:pPr>
-      <w:hyperlink w:anchor="_Toc242906296" w:history="1">
+      <w:hyperlink w:anchor="_Toc242908900" w:history="1">
         <w:r>
           <w:rPr>
             <w:rStyle w:val="Hyperlink"/>
@@ -2021,7 +2021,7 @@
             <w:noProof/>
             <w:webHidden/>
           </w:rPr>
-          <w:instrText xml:space="preserve"> PAGEREF _Toc242906296 \h </w:instrText>
+          <w:instrText xml:space="preserve"> PAGEREF _Toc242908900 \h </w:instrText>
         </w:r>
         <w:r>
           <w:rPr>
@@ -2066,7 +2066,7 @@
           <w14:ligatures w14:val="standardContextual"/>
         </w:rPr>
       </w:pPr>
-      <w:hyperlink w:anchor="_Toc242906297" w:history="1">
+      <w:hyperlink w:anchor="_Toc242908901" w:history="1">
         <w:r>
           <w:rPr>
             <w:rStyle w:val="Hyperlink"/>
@@ -2093,7 +2093,7 @@
             <w:noProof/>
             <w:webHidden/>
           </w:rPr>
-          <w:instrText xml:space="preserve"> PAGEREF _Toc242906297 \h </w:instrText>
+          <w:instrText xml:space="preserve"> PAGEREF _Toc242908901 \h </w:instrText>
         </w:r>
         <w:r>
           <w:rPr>
@@ -2138,7 +2138,7 @@
           <w14:ligatures w14:val="standardContextual"/>
         </w:rPr>
       </w:pPr>
-      <w:hyperlink w:anchor="_Toc242906298" w:history="1">
+      <w:hyperlink w:anchor="_Toc242908902" w:history="1">
         <w:r>
           <w:rPr>
             <w:rStyle w:val="Hyperlink"/>
@@ -2165,7 +2165,7 @@
             <w:noProof/>
             <w:webHidden/>
           </w:rPr>
-          <w:instrText xml:space="preserve"> PAGEREF _Toc242906298 \h </w:instrText>
+          <w:instrText xml:space="preserve"> PAGEREF _Toc242908902 \h </w:instrText>
         </w:r>
         <w:r>
           <w:rPr>
@@ -2210,7 +2210,7 @@
           <w14:ligatures w14:val="standardContextual"/>
         </w:rPr>
       </w:pPr>
-      <w:hyperlink w:anchor="_Toc242906299" w:history="1">
+      <w:hyperlink w:anchor="_Toc242908903" w:history="1">
         <w:r>
           <w:rPr>
             <w:rStyle w:val="Hyperlink"/>
@@ -2237,7 +2237,7 @@
             <w:noProof/>
             <w:webHidden/>
           </w:rPr>
-          <w:instrText xml:space="preserve"> PAGEREF _Toc242906299 \h </w:instrText>
+          <w:instrText xml:space="preserve"> PAGEREF _Toc242908903 \h </w:instrText>
         </w:r>
         <w:r>
           <w:rPr>
@@ -2282,7 +2282,7 @@
           <w14:ligatures w14:val="standardContextual"/>
         </w:rPr>
       </w:pPr>
-      <w:hyperlink w:anchor="_Toc242906300" w:history="1">
+      <w:hyperlink w:anchor="_Toc242908904" w:history="1">
         <w:r>
           <w:rPr>
             <w:rStyle w:val="Hyperlink"/>
@@ -2309,7 +2309,7 @@
             <w:noProof/>
             <w:webHidden/>
           </w:rPr>
-          <w:instrText xml:space="preserve"> PAGEREF _Toc242906300 \h </w:instrText>
+          <w:instrText xml:space="preserve"> PAGEREF _Toc242908904 \h </w:instrText>
         </w:r>
         <w:r>
           <w:rPr>
@@ -2354,7 +2354,7 @@
           <w14:ligatures w14:val="standardContextual"/>
         </w:rPr>
       </w:pPr>
-      <w:hyperlink w:anchor="_Toc242906301" w:history="1">
+      <w:hyperlink w:anchor="_Toc242908905" w:history="1">
         <w:r>
           <w:rPr>
             <w:rStyle w:val="Hyperlink"/>
@@ -2381,7 +2381,7 @@
             <w:noProof/>
             <w:webHidden/>
           </w:rPr>
-          <w:instrText xml:space="preserve"> PAGEREF _Toc242906301 \h </w:instrText>
+          <w:instrText xml:space="preserve"> PAGEREF _Toc242908905 \h </w:instrText>
         </w:r>
         <w:r>
           <w:rPr>
@@ -2426,7 +2426,7 @@
           <w14:ligatures w14:val="standardContextual"/>
         </w:rPr>
       </w:pPr>
-      <w:hyperlink w:anchor="_Toc242906302" w:history="1">
+      <w:hyperlink w:anchor="_Toc242908906" w:history="1">
         <w:r>
           <w:rPr>
             <w:rStyle w:val="Hyperlink"/>
@@ -2453,7 +2453,7 @@
             <w:noProof/>
             <w:webHidden/>
           </w:rPr>
-          <w:instrText xml:space="preserve"> PAGEREF _Toc242906302 \h </w:instrText>
+          <w:instrText xml:space="preserve"> PAGEREF _Toc242908906 \h </w:instrText>
         </w:r>
         <w:r>
           <w:rPr>
@@ -2490,40 +2490,6 @@
         <w:tabs>
           <w:tab w:val="right" w:leader="dot" w:pos="9061"/>
         </w:tabs>
-      </w:pPr>
-      <w:r>
-        <w:fldChar w:fldCharType="end"/>
-      </w:r>
-    </w:p>
-    <w:p>
-      <w:pPr>
-        <w:pageBreakBefore/>
-        <w:spacing w:line="360" w:lineRule="auto"/>
-        <w:jc w:val="center"/>
-        <w:rPr>
-          <w:rFonts w:cs="Arial"/>
-          <w:b/>
-          <w:sz w:val="24"/>
-          <w:szCs w:val="24"/>
-        </w:rPr>
-      </w:pPr>
-      <w:r>
-        <w:rPr>
-          <w:rFonts w:cs="Arial"/>
-          <w:b/>
-          <w:sz w:val="24"/>
-          <w:szCs w:val="24"/>
-        </w:rPr>
-        <w:lastRenderedPageBreak/>
-        <w:t>LISTA DE TABELAS</w:t>
-      </w:r>
-    </w:p>
-    <w:p>
-      <w:pPr>
-        <w:pStyle w:val="ndicedeilustraes"/>
-        <w:tabs>
-          <w:tab w:val="right" w:leader="dot" w:pos="9061"/>
-        </w:tabs>
         <w:rPr>
           <w:rFonts w:asciiTheme="minorHAnsi" w:eastAsiaTheme="minorEastAsia" w:hAnsiTheme="minorHAnsi"/>
           <w:noProof/>
@@ -2532,6 +2498,184 @@
           <w14:ligatures w14:val="standardContextual"/>
         </w:rPr>
       </w:pPr>
+      <w:hyperlink w:anchor="_Toc242908907" w:history="1">
+        <w:r>
+          <w:rPr>
+            <w:rStyle w:val="Hyperlink"/>
+            <w:noProof/>
+          </w:rPr>
+          <w:t>Figura 12 – Painel Administrativo com o Menu Lateral</w:t>
+        </w:r>
+        <w:r>
+          <w:rPr>
+            <w:noProof/>
+            <w:webHidden/>
+          </w:rPr>
+          <w:tab/>
+        </w:r>
+        <w:r>
+          <w:rPr>
+            <w:noProof/>
+            <w:webHidden/>
+          </w:rPr>
+          <w:fldChar w:fldCharType="begin"/>
+        </w:r>
+        <w:r>
+          <w:rPr>
+            <w:noProof/>
+            <w:webHidden/>
+          </w:rPr>
+          <w:instrText xml:space="preserve"> PAGEREF _Toc242908907 \h </w:instrText>
+        </w:r>
+        <w:r>
+          <w:rPr>
+            <w:noProof/>
+            <w:webHidden/>
+          </w:rPr>
+        </w:r>
+        <w:r>
+          <w:rPr>
+            <w:noProof/>
+            <w:webHidden/>
+          </w:rPr>
+          <w:fldChar w:fldCharType="separate"/>
+        </w:r>
+        <w:r>
+          <w:rPr>
+            <w:noProof/>
+            <w:webHidden/>
+          </w:rPr>
+          <w:t>53</w:t>
+        </w:r>
+        <w:r>
+          <w:rPr>
+            <w:noProof/>
+            <w:webHidden/>
+          </w:rPr>
+          <w:fldChar w:fldCharType="end"/>
+        </w:r>
+      </w:hyperlink>
+    </w:p>
+    <w:p>
+      <w:pPr>
+        <w:pStyle w:val="ndicedeilustraes"/>
+        <w:tabs>
+          <w:tab w:val="right" w:leader="dot" w:pos="9061"/>
+        </w:tabs>
+        <w:rPr>
+          <w:rFonts w:asciiTheme="minorHAnsi" w:eastAsiaTheme="minorEastAsia" w:hAnsiTheme="minorHAnsi"/>
+          <w:noProof/>
+          <w:kern w:val="2"/>
+          <w:lang w:eastAsia="pt-BR"/>
+          <w14:ligatures w14:val="standardContextual"/>
+        </w:rPr>
+      </w:pPr>
+      <w:hyperlink w:anchor="_Toc242908908" w:history="1">
+        <w:r>
+          <w:rPr>
+            <w:rStyle w:val="Hyperlink"/>
+            <w:noProof/>
+          </w:rPr>
+          <w:t>Figura 13 – Tela de Cadastro de Operadores</w:t>
+        </w:r>
+        <w:r>
+          <w:rPr>
+            <w:noProof/>
+            <w:webHidden/>
+          </w:rPr>
+          <w:tab/>
+        </w:r>
+        <w:r>
+          <w:rPr>
+            <w:noProof/>
+            <w:webHidden/>
+          </w:rPr>
+          <w:fldChar w:fldCharType="begin"/>
+        </w:r>
+        <w:r>
+          <w:rPr>
+            <w:noProof/>
+            <w:webHidden/>
+          </w:rPr>
+          <w:instrText xml:space="preserve"> PAGEREF _Toc242908908 \h </w:instrText>
+        </w:r>
+        <w:r>
+          <w:rPr>
+            <w:noProof/>
+            <w:webHidden/>
+          </w:rPr>
+        </w:r>
+        <w:r>
+          <w:rPr>
+            <w:noProof/>
+            <w:webHidden/>
+          </w:rPr>
+          <w:fldChar w:fldCharType="separate"/>
+        </w:r>
+        <w:r>
+          <w:rPr>
+            <w:noProof/>
+            <w:webHidden/>
+          </w:rPr>
+          <w:t>54</w:t>
+        </w:r>
+        <w:r>
+          <w:rPr>
+            <w:noProof/>
+            <w:webHidden/>
+          </w:rPr>
+          <w:fldChar w:fldCharType="end"/>
+        </w:r>
+      </w:hyperlink>
+    </w:p>
+    <w:p>
+      <w:pPr>
+        <w:pStyle w:val="ndicedeilustraes"/>
+        <w:tabs>
+          <w:tab w:val="right" w:leader="dot" w:pos="9061"/>
+        </w:tabs>
+      </w:pPr>
+      <w:r>
+        <w:fldChar w:fldCharType="end"/>
+      </w:r>
+    </w:p>
+    <w:p>
+      <w:pPr>
+        <w:pageBreakBefore/>
+        <w:spacing w:line="360" w:lineRule="auto"/>
+        <w:jc w:val="center"/>
+        <w:rPr>
+          <w:rFonts w:cs="Arial"/>
+          <w:b/>
+          <w:sz w:val="24"/>
+          <w:szCs w:val="24"/>
+        </w:rPr>
+      </w:pPr>
+      <w:r>
+        <w:rPr>
+          <w:rFonts w:cs="Arial"/>
+          <w:b/>
+          <w:sz w:val="24"/>
+          <w:szCs w:val="24"/>
+        </w:rPr>
+        <w:lastRenderedPageBreak/>
+        <w:t>LISTA DE TABELAS</w:t>
+      </w:r>
+    </w:p>
+    <w:p>
+      <w:pPr>
+        <w:pStyle w:val="ndicedeilustraes"/>
+        <w:tabs>
+          <w:tab w:val="right" w:leader="dot" w:pos="9061"/>
+        </w:tabs>
+        <w:rPr>
+          <w:rFonts w:asciiTheme="minorHAnsi" w:eastAsiaTheme="minorEastAsia" w:hAnsiTheme="minorHAnsi"/>
+          <w:noProof/>
+          <w:kern w:val="2"/>
+          <w:lang w:eastAsia="pt-BR"/>
+          <w14:ligatures w14:val="standardContextual"/>
+        </w:rPr>
+      </w:pPr>
       <w:r>
         <w:fldChar w:fldCharType="begin"/>
       </w:r>
@@ -2541,7 +2685,7 @@
       <w:r>
         <w:fldChar w:fldCharType="separate"/>
       </w:r>
-      <w:hyperlink w:anchor="_Toc242906303" w:history="1">
+      <w:hyperlink w:anchor="_Toc242908909" w:history="1">
         <w:r>
           <w:rPr>
             <w:rStyle w:val="Hyperlink"/>
@@ -2568,7 +2712,7 @@
             <w:noProof/>
             <w:webHidden/>
           </w:rPr>
-          <w:instrText xml:space="preserve"> PAGEREF _Toc242906303 \h </w:instrText>
+          <w:instrText xml:space="preserve"> PAGEREF _Toc242908909 \h </w:instrText>
         </w:r>
         <w:r>
           <w:rPr>
@@ -2613,7 +2757,7 @@
           <w14:ligatures w14:val="standardContextual"/>
         </w:rPr>
       </w:pPr>
-      <w:hyperlink w:anchor="_Toc242906304" w:history="1">
+      <w:hyperlink w:anchor="_Toc242908910" w:history="1">
         <w:r>
           <w:rPr>
             <w:rStyle w:val="Hyperlink"/>
@@ -2640,7 +2784,7 @@
             <w:noProof/>
             <w:webHidden/>
           </w:rPr>
-          <w:instrText xml:space="preserve"> PAGEREF _Toc242906304 \h </w:instrText>
+          <w:instrText xml:space="preserve"> PAGEREF _Toc242908910 \h </w:instrText>
         </w:r>
         <w:r>
           <w:rPr>
@@ -2685,7 +2829,7 @@
           <w14:ligatures w14:val="standardContextual"/>
         </w:rPr>
       </w:pPr>
-      <w:hyperlink w:anchor="_Toc242906305" w:history="1">
+      <w:hyperlink w:anchor="_Toc242908911" w:history="1">
         <w:r>
           <w:rPr>
             <w:rStyle w:val="Hyperlink"/>
@@ -2712,7 +2856,7 @@
             <w:noProof/>
             <w:webHidden/>
           </w:rPr>
-          <w:instrText xml:space="preserve"> PAGEREF _Toc242906305 \h </w:instrText>
+          <w:instrText xml:space="preserve"> PAGEREF _Toc242908911 \h </w:instrText>
         </w:r>
         <w:r>
           <w:rPr>
@@ -2757,7 +2901,7 @@
           <w14:ligatures w14:val="standardContextual"/>
         </w:rPr>
       </w:pPr>
-      <w:hyperlink w:anchor="_Toc242906306" w:history="1">
+      <w:hyperlink w:anchor="_Toc242908912" w:history="1">
         <w:r>
           <w:rPr>
             <w:rStyle w:val="Hyperlink"/>
@@ -2784,7 +2928,7 @@
             <w:noProof/>
             <w:webHidden/>
           </w:rPr>
-          <w:instrText xml:space="preserve"> PAGEREF _Toc242906306 \h </w:instrText>
+          <w:instrText xml:space="preserve"> PAGEREF _Toc242908912 \h </w:instrText>
         </w:r>
         <w:r>
           <w:rPr>
@@ -2829,7 +2973,7 @@
           <w14:ligatures w14:val="standardContextual"/>
         </w:rPr>
       </w:pPr>
-      <w:hyperlink w:anchor="_Toc242906307" w:history="1">
+      <w:hyperlink w:anchor="_Toc242908913" w:history="1">
         <w:r>
           <w:rPr>
             <w:rStyle w:val="Hyperlink"/>
@@ -2856,7 +3000,7 @@
             <w:noProof/>
             <w:webHidden/>
           </w:rPr>
-          <w:instrText xml:space="preserve"> PAGEREF _Toc242906307 \h </w:instrText>
+          <w:instrText xml:space="preserve"> PAGEREF _Toc242908913 \h </w:instrText>
         </w:r>
         <w:r>
           <w:rPr>
@@ -2901,7 +3045,7 @@
           <w14:ligatures w14:val="standardContextual"/>
         </w:rPr>
       </w:pPr>
-      <w:hyperlink w:anchor="_Toc242906308" w:history="1">
+      <w:hyperlink w:anchor="_Toc242908914" w:history="1">
         <w:r>
           <w:rPr>
             <w:rStyle w:val="Hyperlink"/>
@@ -2928,7 +3072,7 @@
             <w:noProof/>
             <w:webHidden/>
           </w:rPr>
-          <w:instrText xml:space="preserve"> PAGEREF _Toc242906308 \h </w:instrText>
+          <w:instrText xml:space="preserve"> PAGEREF _Toc242908914 \h </w:instrText>
         </w:r>
         <w:r>
           <w:rPr>
@@ -2973,7 +3117,7 @@
           <w14:ligatures w14:val="standardContextual"/>
         </w:rPr>
       </w:pPr>
-      <w:hyperlink w:anchor="_Toc242906309" w:history="1">
+      <w:hyperlink w:anchor="_Toc242908915" w:history="1">
         <w:r>
           <w:rPr>
             <w:rStyle w:val="Hyperlink"/>
@@ -3000,7 +3144,7 @@
             <w:noProof/>
             <w:webHidden/>
           </w:rPr>
-          <w:instrText xml:space="preserve"> PAGEREF _Toc242906309 \h </w:instrText>
+          <w:instrText xml:space="preserve"> PAGEREF _Toc242908915 \h </w:instrText>
         </w:r>
         <w:r>
           <w:rPr>
@@ -3045,7 +3189,7 @@
           <w14:ligatures w14:val="standardContextual"/>
         </w:rPr>
       </w:pPr>
-      <w:hyperlink w:anchor="_Toc242906310" w:history="1">
+      <w:hyperlink w:anchor="_Toc242908916" w:history="1">
         <w:r>
           <w:rPr>
             <w:rStyle w:val="Hyperlink"/>
@@ -3072,7 +3216,7 @@
             <w:noProof/>
             <w:webHidden/>
           </w:rPr>
-          <w:instrText xml:space="preserve"> PAGEREF _Toc242906310 \h </w:instrText>
+          <w:instrText xml:space="preserve"> PAGEREF _Toc242908916 \h </w:instrText>
         </w:r>
         <w:r>
           <w:rPr>
@@ -3117,7 +3261,7 @@
           <w14:ligatures w14:val="standardContextual"/>
         </w:rPr>
       </w:pPr>
-      <w:hyperlink w:anchor="_Toc242906311" w:history="1">
+      <w:hyperlink w:anchor="_Toc242908917" w:history="1">
         <w:r>
           <w:rPr>
             <w:rStyle w:val="Hyperlink"/>
@@ -3144,7 +3288,7 @@
             <w:noProof/>
             <w:webHidden/>
           </w:rPr>
-          <w:instrText xml:space="preserve"> PAGEREF _Toc242906311 \h </w:instrText>
+          <w:instrText xml:space="preserve"> PAGEREF _Toc242908917 \h </w:instrText>
         </w:r>
         <w:r>
           <w:rPr>
@@ -3189,7 +3333,7 @@
           <w14:ligatures w14:val="standardContextual"/>
         </w:rPr>
       </w:pPr>
-      <w:hyperlink w:anchor="_Toc242906312" w:history="1">
+      <w:hyperlink w:anchor="_Toc242908918" w:history="1">
         <w:r>
           <w:rPr>
             <w:rStyle w:val="Hyperlink"/>
@@ -3216,7 +3360,7 @@
             <w:noProof/>
             <w:webHidden/>
           </w:rPr>
-          <w:instrText xml:space="preserve"> PAGEREF _Toc242906312 \h </w:instrText>
+          <w:instrText xml:space="preserve"> PAGEREF _Toc242908918 \h </w:instrText>
         </w:r>
         <w:r>
           <w:rPr>
@@ -3772,7 +3916,7 @@
             </w:rPr>
             <w:fldChar w:fldCharType="separate"/>
           </w:r>
-          <w:hyperlink w:anchor="_Toc242906245" w:history="1">
+          <w:hyperlink w:anchor="_Toc242908841" w:history="1">
             <w:r>
               <w:rPr>
                 <w:rStyle w:val="Hyperlink"/>
@@ -3795,7 +3939,7 @@
               <w:rPr>
                 <w:webHidden/>
               </w:rPr>
-              <w:instrText xml:space="preserve"> PAGEREF _Toc242906245 \h </w:instrText>
+              <w:instrText xml:space="preserve"> PAGEREF _Toc242908841 \h </w:instrText>
             </w:r>
             <w:r>
               <w:rPr>
@@ -3838,7 +3982,7 @@
               <w14:ligatures w14:val="standardContextual"/>
             </w:rPr>
           </w:pPr>
-          <w:hyperlink w:anchor="_Toc242906246" w:history="1">
+          <w:hyperlink w:anchor="_Toc242908842" w:history="1">
             <w:r>
               <w:rPr>
                 <w:rStyle w:val="Hyperlink"/>
@@ -3866,7 +4010,7 @@
                 <w:noProof/>
                 <w:webHidden/>
               </w:rPr>
-              <w:instrText xml:space="preserve"> PAGEREF _Toc242906246 \h </w:instrText>
+              <w:instrText xml:space="preserve"> PAGEREF _Toc242908842 \h </w:instrText>
             </w:r>
             <w:r>
               <w:rPr>
@@ -3913,7 +4057,7 @@
               <w14:ligatures w14:val="standardContextual"/>
             </w:rPr>
           </w:pPr>
-          <w:hyperlink w:anchor="_Toc242906247" w:history="1">
+          <w:hyperlink w:anchor="_Toc242908843" w:history="1">
             <w:r>
               <w:rPr>
                 <w:rStyle w:val="Hyperlink"/>
@@ -3941,7 +4085,7 @@
                 <w:noProof/>
                 <w:webHidden/>
               </w:rPr>
-              <w:instrText xml:space="preserve"> PAGEREF _Toc242906247 \h </w:instrText>
+              <w:instrText xml:space="preserve"> PAGEREF _Toc242908843 \h </w:instrText>
             </w:r>
             <w:r>
               <w:rPr>
@@ -3988,7 +4132,7 @@
               <w14:ligatures w14:val="standardContextual"/>
             </w:rPr>
           </w:pPr>
-          <w:hyperlink w:anchor="_Toc242906248" w:history="1">
+          <w:hyperlink w:anchor="_Toc242908844" w:history="1">
             <w:r>
               <w:rPr>
                 <w:rStyle w:val="Hyperlink"/>
@@ -4016,7 +4160,7 @@
                 <w:noProof/>
                 <w:webHidden/>
               </w:rPr>
-              <w:instrText xml:space="preserve"> PAGEREF _Toc242906248 \h </w:instrText>
+              <w:instrText xml:space="preserve"> PAGEREF _Toc242908844 \h </w:instrText>
             </w:r>
             <w:r>
               <w:rPr>
@@ -4063,7 +4207,7 @@
               <w14:ligatures w14:val="standardContextual"/>
             </w:rPr>
           </w:pPr>
-          <w:hyperlink w:anchor="_Toc242906249" w:history="1">
+          <w:hyperlink w:anchor="_Toc242908845" w:history="1">
             <w:r>
               <w:rPr>
                 <w:rStyle w:val="Hyperlink"/>
@@ -4090,7 +4234,7 @@
                 <w:noProof/>
                 <w:webHidden/>
               </w:rPr>
-              <w:instrText xml:space="preserve"> PAGEREF _Toc242906249 \h </w:instrText>
+              <w:instrText xml:space="preserve"> PAGEREF _Toc242908845 \h </w:instrText>
             </w:r>
             <w:r>
               <w:rPr>
@@ -4137,7 +4281,7 @@
               <w14:ligatures w14:val="standardContextual"/>
             </w:rPr>
           </w:pPr>
-          <w:hyperlink w:anchor="_Toc242906250" w:history="1">
+          <w:hyperlink w:anchor="_Toc242908846" w:history="1">
             <w:r>
               <w:rPr>
                 <w:rStyle w:val="Hyperlink"/>
@@ -4164,7 +4308,7 @@
                 <w:noProof/>
                 <w:webHidden/>
               </w:rPr>
-              <w:instrText xml:space="preserve"> PAGEREF _Toc242906250 \h </w:instrText>
+              <w:instrText xml:space="preserve"> PAGEREF _Toc242908846 \h </w:instrText>
             </w:r>
             <w:r>
               <w:rPr>
@@ -4211,7 +4355,7 @@
               <w14:ligatures w14:val="standardContextual"/>
             </w:rPr>
           </w:pPr>
-          <w:hyperlink w:anchor="_Toc242906251" w:history="1">
+          <w:hyperlink w:anchor="_Toc242908847" w:history="1">
             <w:r>
               <w:rPr>
                 <w:rStyle w:val="Hyperlink"/>
@@ -4239,7 +4383,7 @@
                 <w:noProof/>
                 <w:webHidden/>
               </w:rPr>
-              <w:instrText xml:space="preserve"> PAGEREF _Toc242906251 \h </w:instrText>
+              <w:instrText xml:space="preserve"> PAGEREF _Toc242908847 \h </w:instrText>
             </w:r>
             <w:r>
               <w:rPr>
@@ -4286,7 +4430,7 @@
               <w14:ligatures w14:val="standardContextual"/>
             </w:rPr>
           </w:pPr>
-          <w:hyperlink w:anchor="_Toc242906252" w:history="1">
+          <w:hyperlink w:anchor="_Toc242908848" w:history="1">
             <w:r>
               <w:rPr>
                 <w:rStyle w:val="Hyperlink"/>
@@ -4314,7 +4458,7 @@
                 <w:noProof/>
                 <w:webHidden/>
               </w:rPr>
-              <w:instrText xml:space="preserve"> PAGEREF _Toc242906252 \h </w:instrText>
+              <w:instrText xml:space="preserve"> PAGEREF _Toc242908848 \h </w:instrText>
             </w:r>
             <w:r>
               <w:rPr>
@@ -4358,7 +4502,7 @@
               <w14:ligatures w14:val="standardContextual"/>
             </w:rPr>
           </w:pPr>
-          <w:hyperlink w:anchor="_Toc242906253" w:history="1">
+          <w:hyperlink w:anchor="_Toc242908849" w:history="1">
             <w:r>
               <w:rPr>
                 <w:rStyle w:val="Hyperlink"/>
@@ -4381,7 +4525,7 @@
               <w:rPr>
                 <w:webHidden/>
               </w:rPr>
-              <w:instrText xml:space="preserve"> PAGEREF _Toc242906253 \h </w:instrText>
+              <w:instrText xml:space="preserve"> PAGEREF _Toc242908849 \h </w:instrText>
             </w:r>
             <w:r>
               <w:rPr>
@@ -4424,7 +4568,7 @@
               <w14:ligatures w14:val="standardContextual"/>
             </w:rPr>
           </w:pPr>
-          <w:hyperlink w:anchor="_Toc242906254" w:history="1">
+          <w:hyperlink w:anchor="_Toc242908850" w:history="1">
             <w:r>
               <w:rPr>
                 <w:rStyle w:val="Hyperlink"/>
@@ -4452,7 +4596,7 @@
                 <w:noProof/>
                 <w:webHidden/>
               </w:rPr>
-              <w:instrText xml:space="preserve"> PAGEREF _Toc242906254 \h </w:instrText>
+              <w:instrText xml:space="preserve"> PAGEREF _Toc242908850 \h </w:instrText>
             </w:r>
             <w:r>
               <w:rPr>
@@ -4499,7 +4643,7 @@
               <w14:ligatures w14:val="standardContextual"/>
             </w:rPr>
           </w:pPr>
-          <w:hyperlink w:anchor="_Toc242906255" w:history="1">
+          <w:hyperlink w:anchor="_Toc242908851" w:history="1">
             <w:r>
               <w:rPr>
                 <w:rStyle w:val="Hyperlink"/>
@@ -4527,7 +4671,7 @@
                 <w:noProof/>
                 <w:webHidden/>
               </w:rPr>
-              <w:instrText xml:space="preserve"> PAGEREF _Toc242906255 \h </w:instrText>
+              <w:instrText xml:space="preserve"> PAGEREF _Toc242908851 \h </w:instrText>
             </w:r>
             <w:r>
               <w:rPr>
@@ -4574,7 +4718,7 @@
               <w14:ligatures w14:val="standardContextual"/>
             </w:rPr>
           </w:pPr>
-          <w:hyperlink w:anchor="_Toc242906256" w:history="1">
+          <w:hyperlink w:anchor="_Toc242908852" w:history="1">
             <w:r>
               <w:rPr>
                 <w:rStyle w:val="Hyperlink"/>
@@ -4602,7 +4746,7 @@
                 <w:noProof/>
                 <w:webHidden/>
               </w:rPr>
-              <w:instrText xml:space="preserve"> PAGEREF _Toc242906256 \h </w:instrText>
+              <w:instrText xml:space="preserve"> PAGEREF _Toc242908852 \h </w:instrText>
             </w:r>
             <w:r>
               <w:rPr>
@@ -4649,7 +4793,7 @@
               <w14:ligatures w14:val="standardContextual"/>
             </w:rPr>
           </w:pPr>
-          <w:hyperlink w:anchor="_Toc242906257" w:history="1">
+          <w:hyperlink w:anchor="_Toc242908853" w:history="1">
             <w:r>
               <w:rPr>
                 <w:rStyle w:val="Hyperlink"/>
@@ -4677,7 +4821,7 @@
                 <w:noProof/>
                 <w:webHidden/>
               </w:rPr>
-              <w:instrText xml:space="preserve"> PAGEREF _Toc242906257 \h </w:instrText>
+              <w:instrText xml:space="preserve"> PAGEREF _Toc242908853 \h </w:instrText>
             </w:r>
             <w:r>
               <w:rPr>
@@ -4724,7 +4868,7 @@
               <w14:ligatures w14:val="standardContextual"/>
             </w:rPr>
           </w:pPr>
-          <w:hyperlink w:anchor="_Toc242906258" w:history="1">
+          <w:hyperlink w:anchor="_Toc242908854" w:history="1">
             <w:r>
               <w:rPr>
                 <w:rStyle w:val="Hyperlink"/>
@@ -4753,7 +4897,7 @@
                 <w:noProof/>
                 <w:webHidden/>
               </w:rPr>
-              <w:instrText xml:space="preserve"> PAGEREF _Toc242906258 \h </w:instrText>
+              <w:instrText xml:space="preserve"> PAGEREF _Toc242908854 \h </w:instrText>
             </w:r>
             <w:r>
               <w:rPr>
@@ -4800,7 +4944,7 @@
               <w14:ligatures w14:val="standardContextual"/>
             </w:rPr>
           </w:pPr>
-          <w:hyperlink w:anchor="_Toc242906259" w:history="1">
+          <w:hyperlink w:anchor="_Toc242908855" w:history="1">
             <w:r>
               <w:rPr>
                 <w:rStyle w:val="Hyperlink"/>
@@ -4828,7 +4972,7 @@
                 <w:noProof/>
                 <w:webHidden/>
               </w:rPr>
-              <w:instrText xml:space="preserve"> PAGEREF _Toc242906259 \h </w:instrText>
+              <w:instrText xml:space="preserve"> PAGEREF _Toc242908855 \h </w:instrText>
             </w:r>
             <w:r>
               <w:rPr>
@@ -4875,7 +5019,7 @@
               <w14:ligatures w14:val="standardContextual"/>
             </w:rPr>
           </w:pPr>
-          <w:hyperlink w:anchor="_Toc242906260" w:history="1">
+          <w:hyperlink w:anchor="_Toc242908856" w:history="1">
             <w:r>
               <w:rPr>
                 <w:rStyle w:val="Hyperlink"/>
@@ -4903,7 +5047,7 @@
                 <w:noProof/>
                 <w:webHidden/>
               </w:rPr>
-              <w:instrText xml:space="preserve"> PAGEREF _Toc242906260 \h </w:instrText>
+              <w:instrText xml:space="preserve"> PAGEREF _Toc242908856 \h </w:instrText>
             </w:r>
             <w:r>
               <w:rPr>
@@ -4950,7 +5094,7 @@
               <w14:ligatures w14:val="standardContextual"/>
             </w:rPr>
           </w:pPr>
-          <w:hyperlink w:anchor="_Toc242906261" w:history="1">
+          <w:hyperlink w:anchor="_Toc242908857" w:history="1">
             <w:r>
               <w:rPr>
                 <w:rStyle w:val="Hyperlink"/>
@@ -4978,7 +5122,7 @@
                 <w:noProof/>
                 <w:webHidden/>
               </w:rPr>
-              <w:instrText xml:space="preserve"> PAGEREF _Toc242906261 \h </w:instrText>
+              <w:instrText xml:space="preserve"> PAGEREF _Toc242908857 \h </w:instrText>
             </w:r>
             <w:r>
               <w:rPr>
@@ -5025,7 +5169,7 @@
               <w14:ligatures w14:val="standardContextual"/>
             </w:rPr>
           </w:pPr>
-          <w:hyperlink w:anchor="_Toc242906262" w:history="1">
+          <w:hyperlink w:anchor="_Toc242908858" w:history="1">
             <w:r>
               <w:rPr>
                 <w:rStyle w:val="Hyperlink"/>
@@ -5052,7 +5196,7 @@
                 <w:noProof/>
                 <w:webHidden/>
               </w:rPr>
-              <w:instrText xml:space="preserve"> PAGEREF _Toc242906262 \h </w:instrText>
+              <w:instrText xml:space="preserve"> PAGEREF _Toc242908858 \h </w:instrText>
             </w:r>
             <w:r>
               <w:rPr>
@@ -5096,7 +5240,7 @@
               <w14:ligatures w14:val="standardContextual"/>
             </w:rPr>
           </w:pPr>
-          <w:hyperlink w:anchor="_Toc242906263" w:history="1">
+          <w:hyperlink w:anchor="_Toc242908859" w:history="1">
             <w:r>
               <w:rPr>
                 <w:rStyle w:val="Hyperlink"/>
@@ -5119,7 +5263,7 @@
               <w:rPr>
                 <w:webHidden/>
               </w:rPr>
-              <w:instrText xml:space="preserve"> PAGEREF _Toc242906263 \h </w:instrText>
+              <w:instrText xml:space="preserve"> PAGEREF _Toc242908859 \h </w:instrText>
             </w:r>
             <w:r>
               <w:rPr>
@@ -5162,7 +5306,7 @@
               <w14:ligatures w14:val="standardContextual"/>
             </w:rPr>
           </w:pPr>
-          <w:hyperlink w:anchor="_Toc242906264" w:history="1">
+          <w:hyperlink w:anchor="_Toc242908860" w:history="1">
             <w:r>
               <w:rPr>
                 <w:rStyle w:val="Hyperlink"/>
@@ -5190,7 +5334,7 @@
                 <w:noProof/>
                 <w:webHidden/>
               </w:rPr>
-              <w:instrText xml:space="preserve"> PAGEREF _Toc242906264 \h </w:instrText>
+              <w:instrText xml:space="preserve"> PAGEREF _Toc242908860 \h </w:instrText>
             </w:r>
             <w:r>
               <w:rPr>
@@ -5237,7 +5381,7 @@
               <w14:ligatures w14:val="standardContextual"/>
             </w:rPr>
           </w:pPr>
-          <w:hyperlink w:anchor="_Toc242906265" w:history="1">
+          <w:hyperlink w:anchor="_Toc242908861" w:history="1">
             <w:r>
               <w:rPr>
                 <w:rStyle w:val="Hyperlink"/>
@@ -5264,7 +5408,7 @@
                 <w:noProof/>
                 <w:webHidden/>
               </w:rPr>
-              <w:instrText xml:space="preserve"> PAGEREF _Toc242906265 \h </w:instrText>
+              <w:instrText xml:space="preserve"> PAGEREF _Toc242908861 \h </w:instrText>
             </w:r>
             <w:r>
               <w:rPr>
@@ -5311,7 +5455,7 @@
               <w14:ligatures w14:val="standardContextual"/>
             </w:rPr>
           </w:pPr>
-          <w:hyperlink w:anchor="_Toc242906266" w:history="1">
+          <w:hyperlink w:anchor="_Toc242908862" w:history="1">
             <w:r>
               <w:rPr>
                 <w:rStyle w:val="Hyperlink"/>
@@ -5338,7 +5482,7 @@
                 <w:noProof/>
                 <w:webHidden/>
               </w:rPr>
-              <w:instrText xml:space="preserve"> PAGEREF _Toc242906266 \h </w:instrText>
+              <w:instrText xml:space="preserve"> PAGEREF _Toc242908862 \h </w:instrText>
             </w:r>
             <w:r>
               <w:rPr>
@@ -5385,7 +5529,7 @@
               <w14:ligatures w14:val="standardContextual"/>
             </w:rPr>
           </w:pPr>
-          <w:hyperlink w:anchor="_Toc242906267" w:history="1">
+          <w:hyperlink w:anchor="_Toc242908863" w:history="1">
             <w:r>
               <w:rPr>
                 <w:rStyle w:val="Hyperlink"/>
@@ -5412,7 +5556,7 @@
                 <w:noProof/>
                 <w:webHidden/>
               </w:rPr>
-              <w:instrText xml:space="preserve"> PAGEREF _Toc242906267 \h </w:instrText>
+              <w:instrText xml:space="preserve"> PAGEREF _Toc242908863 \h </w:instrText>
             </w:r>
             <w:r>
               <w:rPr>
@@ -5459,7 +5603,7 @@
               <w14:ligatures w14:val="standardContextual"/>
             </w:rPr>
           </w:pPr>
-          <w:hyperlink w:anchor="_Toc242906268" w:history="1">
+          <w:hyperlink w:anchor="_Toc242908864" w:history="1">
             <w:r>
               <w:rPr>
                 <w:rStyle w:val="Hyperlink"/>
@@ -5486,7 +5630,7 @@
                 <w:noProof/>
                 <w:webHidden/>
               </w:rPr>
-              <w:instrText xml:space="preserve"> PAGEREF _Toc242906268 \h </w:instrText>
+              <w:instrText xml:space="preserve"> PAGEREF _Toc242908864 \h </w:instrText>
             </w:r>
             <w:r>
               <w:rPr>
@@ -5533,7 +5677,7 @@
               <w14:ligatures w14:val="standardContextual"/>
             </w:rPr>
           </w:pPr>
-          <w:hyperlink w:anchor="_Toc242906269" w:history="1">
+          <w:hyperlink w:anchor="_Toc242908865" w:history="1">
             <w:r>
               <w:rPr>
                 <w:rStyle w:val="Hyperlink"/>
@@ -5560,7 +5704,7 @@
                 <w:noProof/>
                 <w:webHidden/>
               </w:rPr>
-              <w:instrText xml:space="preserve"> PAGEREF _Toc242906269 \h </w:instrText>
+              <w:instrText xml:space="preserve"> PAGEREF _Toc242908865 \h </w:instrText>
             </w:r>
             <w:r>
               <w:rPr>
@@ -5607,7 +5751,7 @@
               <w14:ligatures w14:val="standardContextual"/>
             </w:rPr>
           </w:pPr>
-          <w:hyperlink w:anchor="_Toc242906270" w:history="1">
+          <w:hyperlink w:anchor="_Toc242908866" w:history="1">
             <w:r>
               <w:rPr>
                 <w:rStyle w:val="Hyperlink"/>
@@ -5634,7 +5778,7 @@
                 <w:noProof/>
                 <w:webHidden/>
               </w:rPr>
-              <w:instrText xml:space="preserve"> PAGEREF _Toc242906270 \h </w:instrText>
+              <w:instrText xml:space="preserve"> PAGEREF _Toc242908866 \h </w:instrText>
             </w:r>
             <w:r>
               <w:rPr>
@@ -5678,7 +5822,7 @@
               <w14:ligatures w14:val="standardContextual"/>
             </w:rPr>
           </w:pPr>
-          <w:hyperlink w:anchor="_Toc242906271" w:history="1">
+          <w:hyperlink w:anchor="_Toc242908867" w:history="1">
             <w:r>
               <w:rPr>
                 <w:rStyle w:val="Hyperlink"/>
@@ -5701,7 +5845,7 @@
               <w:rPr>
                 <w:webHidden/>
               </w:rPr>
-              <w:instrText xml:space="preserve"> PAGEREF _Toc242906271 \h </w:instrText>
+              <w:instrText xml:space="preserve"> PAGEREF _Toc242908867 \h </w:instrText>
             </w:r>
             <w:r>
               <w:rPr>
@@ -5744,7 +5888,7 @@
               <w14:ligatures w14:val="standardContextual"/>
             </w:rPr>
           </w:pPr>
-          <w:hyperlink w:anchor="_Toc242906272" w:history="1">
+          <w:hyperlink w:anchor="_Toc242908868" w:history="1">
             <w:r>
               <w:rPr>
                 <w:rStyle w:val="Hyperlink"/>
@@ -5771,7 +5915,7 @@
                 <w:noProof/>
                 <w:webHidden/>
               </w:rPr>
-              <w:instrText xml:space="preserve"> PAGEREF _Toc242906272 \h </w:instrText>
+              <w:instrText xml:space="preserve"> PAGEREF _Toc242908868 \h </w:instrText>
             </w:r>
             <w:r>
               <w:rPr>
@@ -5818,7 +5962,7 @@
               <w14:ligatures w14:val="standardContextual"/>
             </w:rPr>
           </w:pPr>
-          <w:hyperlink w:anchor="_Toc242906273" w:history="1">
+          <w:hyperlink w:anchor="_Toc242908869" w:history="1">
             <w:r>
               <w:rPr>
                 <w:rStyle w:val="Hyperlink"/>
@@ -5845,7 +5989,7 @@
                 <w:noProof/>
                 <w:webHidden/>
               </w:rPr>
-              <w:instrText xml:space="preserve"> PAGEREF _Toc242906273 \h </w:instrText>
+              <w:instrText xml:space="preserve"> PAGEREF _Toc242908869 \h </w:instrText>
             </w:r>
             <w:r>
               <w:rPr>
@@ -5892,7 +6036,7 @@
               <w14:ligatures w14:val="standardContextual"/>
             </w:rPr>
           </w:pPr>
-          <w:hyperlink w:anchor="_Toc242906274" w:history="1">
+          <w:hyperlink w:anchor="_Toc242908870" w:history="1">
             <w:r>
               <w:rPr>
                 <w:rStyle w:val="Hyperlink"/>
@@ -5919,7 +6063,7 @@
                 <w:noProof/>
                 <w:webHidden/>
               </w:rPr>
-              <w:instrText xml:space="preserve"> PAGEREF _Toc242906274 \h </w:instrText>
+              <w:instrText xml:space="preserve"> PAGEREF _Toc242908870 \h </w:instrText>
             </w:r>
             <w:r>
               <w:rPr>
@@ -5966,7 +6110,7 @@
               <w14:ligatures w14:val="standardContextual"/>
             </w:rPr>
           </w:pPr>
-          <w:hyperlink w:anchor="_Toc242906275" w:history="1">
+          <w:hyperlink w:anchor="_Toc242908871" w:history="1">
             <w:r>
               <w:rPr>
                 <w:rStyle w:val="Hyperlink"/>
@@ -5993,7 +6137,7 @@
                 <w:noProof/>
                 <w:webHidden/>
               </w:rPr>
-              <w:instrText xml:space="preserve"> PAGEREF _Toc242906275 \h </w:instrText>
+              <w:instrText xml:space="preserve"> PAGEREF _Toc242908871 \h </w:instrText>
             </w:r>
             <w:r>
               <w:rPr>
@@ -6040,7 +6184,7 @@
               <w14:ligatures w14:val="standardContextual"/>
             </w:rPr>
           </w:pPr>
-          <w:hyperlink w:anchor="_Toc242906276" w:history="1">
+          <w:hyperlink w:anchor="_Toc242908872" w:history="1">
             <w:r>
               <w:rPr>
                 <w:rStyle w:val="Hyperlink"/>
@@ -6067,7 +6211,7 @@
                 <w:noProof/>
                 <w:webHidden/>
               </w:rPr>
-              <w:instrText xml:space="preserve"> PAGEREF _Toc242906276 \h </w:instrText>
+              <w:instrText xml:space="preserve"> PAGEREF _Toc242908872 \h </w:instrText>
             </w:r>
             <w:r>
               <w:rPr>
@@ -6114,7 +6258,7 @@
               <w14:ligatures w14:val="standardContextual"/>
             </w:rPr>
           </w:pPr>
-          <w:hyperlink w:anchor="_Toc242906277" w:history="1">
+          <w:hyperlink w:anchor="_Toc242908873" w:history="1">
             <w:r>
               <w:rPr>
                 <w:rStyle w:val="Hyperlink"/>
@@ -6141,7 +6285,7 @@
                 <w:noProof/>
                 <w:webHidden/>
               </w:rPr>
-              <w:instrText xml:space="preserve"> PAGEREF _Toc242906277 \h </w:instrText>
+              <w:instrText xml:space="preserve"> PAGEREF _Toc242908873 \h </w:instrText>
             </w:r>
             <w:r>
               <w:rPr>
@@ -6188,7 +6332,7 @@
               <w14:ligatures w14:val="standardContextual"/>
             </w:rPr>
           </w:pPr>
-          <w:hyperlink w:anchor="_Toc242906278" w:history="1">
+          <w:hyperlink w:anchor="_Toc242908874" w:history="1">
             <w:r>
               <w:rPr>
                 <w:rStyle w:val="Hyperlink"/>
@@ -6215,7 +6359,7 @@
                 <w:noProof/>
                 <w:webHidden/>
               </w:rPr>
-              <w:instrText xml:space="preserve"> PAGEREF _Toc242906278 \h </w:instrText>
+              <w:instrText xml:space="preserve"> PAGEREF _Toc242908874 \h </w:instrText>
             </w:r>
             <w:r>
               <w:rPr>
@@ -6262,7 +6406,7 @@
               <w14:ligatures w14:val="standardContextual"/>
             </w:rPr>
           </w:pPr>
-          <w:hyperlink w:anchor="_Toc242906279" w:history="1">
+          <w:hyperlink w:anchor="_Toc242908875" w:history="1">
             <w:r>
               <w:rPr>
                 <w:rStyle w:val="Hyperlink"/>
@@ -6289,7 +6433,7 @@
                 <w:noProof/>
                 <w:webHidden/>
               </w:rPr>
-              <w:instrText xml:space="preserve"> PAGEREF _Toc242906279 \h </w:instrText>
+              <w:instrText xml:space="preserve"> PAGEREF _Toc242908875 \h </w:instrText>
             </w:r>
             <w:r>
               <w:rPr>
@@ -6336,7 +6480,7 @@
               <w14:ligatures w14:val="standardContextual"/>
             </w:rPr>
           </w:pPr>
-          <w:hyperlink w:anchor="_Toc242906280" w:history="1">
+          <w:hyperlink w:anchor="_Toc242908876" w:history="1">
             <w:r>
               <w:rPr>
                 <w:rStyle w:val="Hyperlink"/>
@@ -6363,7 +6507,7 @@
                 <w:noProof/>
                 <w:webHidden/>
               </w:rPr>
-              <w:instrText xml:space="preserve"> PAGEREF _Toc242906280 \h </w:instrText>
+              <w:instrText xml:space="preserve"> PAGEREF _Toc242908876 \h </w:instrText>
             </w:r>
             <w:r>
               <w:rPr>
@@ -6410,7 +6554,7 @@
               <w14:ligatures w14:val="standardContextual"/>
             </w:rPr>
           </w:pPr>
-          <w:hyperlink w:anchor="_Toc242906281" w:history="1">
+          <w:hyperlink w:anchor="_Toc242908877" w:history="1">
             <w:r>
               <w:rPr>
                 <w:rStyle w:val="Hyperlink"/>
@@ -6437,7 +6581,7 @@
                 <w:noProof/>
                 <w:webHidden/>
               </w:rPr>
-              <w:instrText xml:space="preserve"> PAGEREF _Toc242906281 \h </w:instrText>
+              <w:instrText xml:space="preserve"> PAGEREF _Toc242908877 \h </w:instrText>
             </w:r>
             <w:r>
               <w:rPr>
@@ -6484,7 +6628,7 @@
               <w14:ligatures w14:val="standardContextual"/>
             </w:rPr>
           </w:pPr>
-          <w:hyperlink w:anchor="_Toc242906282" w:history="1">
+          <w:hyperlink w:anchor="_Toc242908878" w:history="1">
             <w:r>
               <w:rPr>
                 <w:rStyle w:val="Hyperlink"/>
@@ -6511,7 +6655,7 @@
                 <w:noProof/>
                 <w:webHidden/>
               </w:rPr>
-              <w:instrText xml:space="preserve"> PAGEREF _Toc242906282 \h </w:instrText>
+              <w:instrText xml:space="preserve"> PAGEREF _Toc242908878 \h </w:instrText>
             </w:r>
             <w:r>
               <w:rPr>
@@ -6558,7 +6702,7 @@
               <w14:ligatures w14:val="standardContextual"/>
             </w:rPr>
           </w:pPr>
-          <w:hyperlink w:anchor="_Toc242906283" w:history="1">
+          <w:hyperlink w:anchor="_Toc242908879" w:history="1">
             <w:r>
               <w:rPr>
                 <w:rStyle w:val="Hyperlink"/>
@@ -6585,7 +6729,7 @@
                 <w:noProof/>
                 <w:webHidden/>
               </w:rPr>
-              <w:instrText xml:space="preserve"> PAGEREF _Toc242906283 \h </w:instrText>
+              <w:instrText xml:space="preserve"> PAGEREF _Toc242908879 \h </w:instrText>
             </w:r>
             <w:r>
               <w:rPr>
@@ -6632,7 +6776,7 @@
               <w14:ligatures w14:val="standardContextual"/>
             </w:rPr>
           </w:pPr>
-          <w:hyperlink w:anchor="_Toc242906284" w:history="1">
+          <w:hyperlink w:anchor="_Toc242908880" w:history="1">
             <w:r>
               <w:rPr>
                 <w:rStyle w:val="Hyperlink"/>
@@ -6659,7 +6803,7 @@
                 <w:noProof/>
                 <w:webHidden/>
               </w:rPr>
-              <w:instrText xml:space="preserve"> PAGEREF _Toc242906284 \h </w:instrText>
+              <w:instrText xml:space="preserve"> PAGEREF _Toc242908880 \h </w:instrText>
             </w:r>
             <w:r>
               <w:rPr>
@@ -6706,7 +6850,7 @@
               <w14:ligatures w14:val="standardContextual"/>
             </w:rPr>
           </w:pPr>
-          <w:hyperlink w:anchor="_Toc242906285" w:history="1">
+          <w:hyperlink w:anchor="_Toc242908881" w:history="1">
             <w:r>
               <w:rPr>
                 <w:rStyle w:val="Hyperlink"/>
@@ -6733,7 +6877,7 @@
                 <w:noProof/>
                 <w:webHidden/>
               </w:rPr>
-              <w:instrText xml:space="preserve"> PAGEREF _Toc242906285 \h </w:instrText>
+              <w:instrText xml:space="preserve"> PAGEREF _Toc242908881 \h </w:instrText>
             </w:r>
             <w:r>
               <w:rPr>
@@ -6780,7 +6924,7 @@
               <w14:ligatures w14:val="standardContextual"/>
             </w:rPr>
           </w:pPr>
-          <w:hyperlink w:anchor="_Toc242906286" w:history="1">
+          <w:hyperlink w:anchor="_Toc242908882" w:history="1">
             <w:r>
               <w:rPr>
                 <w:rStyle w:val="Hyperlink"/>
@@ -6807,7 +6951,7 @@
                 <w:noProof/>
                 <w:webHidden/>
               </w:rPr>
-              <w:instrText xml:space="preserve"> PAGEREF _Toc242906286 \h </w:instrText>
+              <w:instrText xml:space="preserve"> PAGEREF _Toc242908882 \h </w:instrText>
             </w:r>
             <w:r>
               <w:rPr>
@@ -6851,7 +6995,7 @@
               <w14:ligatures w14:val="standardContextual"/>
             </w:rPr>
           </w:pPr>
-          <w:hyperlink w:anchor="_Toc242906287" w:history="1">
+          <w:hyperlink w:anchor="_Toc242908883" w:history="1">
             <w:r>
               <w:rPr>
                 <w:rStyle w:val="Hyperlink"/>
@@ -6874,7 +7018,7 @@
               <w:rPr>
                 <w:webHidden/>
               </w:rPr>
-              <w:instrText xml:space="preserve"> PAGEREF _Toc242906287 \h </w:instrText>
+              <w:instrText xml:space="preserve"> PAGEREF _Toc242908883 \h </w:instrText>
             </w:r>
             <w:r>
               <w:rPr>
@@ -6917,7 +7061,7 @@
               <w14:ligatures w14:val="standardContextual"/>
             </w:rPr>
           </w:pPr>
-          <w:hyperlink w:anchor="_Toc242906288" w:history="1">
+          <w:hyperlink w:anchor="_Toc242908884" w:history="1">
             <w:r>
               <w:rPr>
                 <w:rStyle w:val="Hyperlink"/>
@@ -6944,7 +7088,7 @@
                 <w:noProof/>
                 <w:webHidden/>
               </w:rPr>
-              <w:instrText xml:space="preserve"> PAGEREF _Toc242906288 \h </w:instrText>
+              <w:instrText xml:space="preserve"> PAGEREF _Toc242908884 \h </w:instrText>
             </w:r>
             <w:r>
               <w:rPr>
@@ -6991,7 +7135,7 @@
               <w14:ligatures w14:val="standardContextual"/>
             </w:rPr>
           </w:pPr>
-          <w:hyperlink w:anchor="_Toc242906289" w:history="1">
+          <w:hyperlink w:anchor="_Toc242908885" w:history="1">
             <w:r>
               <w:rPr>
                 <w:rStyle w:val="Hyperlink"/>
@@ -7018,7 +7162,7 @@
                 <w:noProof/>
                 <w:webHidden/>
               </w:rPr>
-              <w:instrText xml:space="preserve"> PAGEREF _Toc242906289 \h </w:instrText>
+              <w:instrText xml:space="preserve"> PAGEREF _Toc242908885 \h </w:instrText>
             </w:r>
             <w:r>
               <w:rPr>
@@ -7065,7 +7209,7 @@
               <w14:ligatures w14:val="standardContextual"/>
             </w:rPr>
           </w:pPr>
-          <w:hyperlink w:anchor="_Toc242906290" w:history="1">
+          <w:hyperlink w:anchor="_Toc242908886" w:history="1">
             <w:r>
               <w:rPr>
                 <w:rStyle w:val="Hyperlink"/>
@@ -7092,7 +7236,7 @@
                 <w:noProof/>
                 <w:webHidden/>
               </w:rPr>
-              <w:instrText xml:space="preserve"> PAGEREF _Toc242906290 \h </w:instrText>
+              <w:instrText xml:space="preserve"> PAGEREF _Toc242908886 \h </w:instrText>
             </w:r>
             <w:r>
               <w:rPr>
@@ -7136,11 +7280,592 @@
               <w14:ligatures w14:val="standardContextual"/>
             </w:rPr>
           </w:pPr>
-          <w:hyperlink w:anchor="_Toc242906291" w:history="1">
+          <w:hyperlink w:anchor="_Toc242908887" w:history="1">
             <w:r>
               <w:rPr>
                 <w:rStyle w:val="Hyperlink"/>
               </w:rPr>
+              <w:t>6. IMPLEMENTAÇÃO DO SISTEMA</w:t>
+            </w:r>
+            <w:r>
+              <w:rPr>
+                <w:webHidden/>
+              </w:rPr>
+              <w:tab/>
+            </w:r>
+            <w:r>
+              <w:rPr>
+                <w:webHidden/>
+              </w:rPr>
+              <w:fldChar w:fldCharType="begin"/>
+            </w:r>
+            <w:r>
+              <w:rPr>
+                <w:webHidden/>
+              </w:rPr>
+              <w:instrText xml:space="preserve"> PAGEREF _Toc242908887 \h </w:instrText>
+            </w:r>
+            <w:r>
+              <w:rPr>
+                <w:webHidden/>
+              </w:rPr>
+            </w:r>
+            <w:r>
+              <w:rPr>
+                <w:webHidden/>
+              </w:rPr>
+              <w:fldChar w:fldCharType="separate"/>
+            </w:r>
+            <w:r>
+              <w:rPr>
+                <w:webHidden/>
+              </w:rPr>
+              <w:t>51</w:t>
+            </w:r>
+            <w:r>
+              <w:rPr>
+                <w:webHidden/>
+              </w:rPr>
+              <w:fldChar w:fldCharType="end"/>
+            </w:r>
+          </w:hyperlink>
+        </w:p>
+        <w:p>
+          <w:pPr>
+            <w:pStyle w:val="Sumrio2"/>
+            <w:tabs>
+              <w:tab w:val="right" w:leader="dot" w:pos="9061"/>
+            </w:tabs>
+            <w:rPr>
+              <w:rFonts w:asciiTheme="minorHAnsi" w:eastAsiaTheme="minorEastAsia" w:hAnsiTheme="minorHAnsi"/>
+              <w:noProof/>
+              <w:kern w:val="2"/>
+              <w:sz w:val="24"/>
+              <w:szCs w:val="24"/>
+              <w:lang w:eastAsia="pt-BR"/>
+              <w14:ligatures w14:val="standardContextual"/>
+            </w:rPr>
+          </w:pPr>
+          <w:hyperlink w:anchor="_Toc242908888" w:history="1">
+            <w:r>
+              <w:rPr>
+                <w:rStyle w:val="Hyperlink"/>
+                <w:noProof/>
+              </w:rPr>
+              <w:t>6.1 Organização do Código</w:t>
+            </w:r>
+            <w:r>
+              <w:rPr>
+                <w:noProof/>
+                <w:webHidden/>
+              </w:rPr>
+              <w:tab/>
+            </w:r>
+            <w:r>
+              <w:rPr>
+                <w:noProof/>
+                <w:webHidden/>
+              </w:rPr>
+              <w:fldChar w:fldCharType="begin"/>
+            </w:r>
+            <w:r>
+              <w:rPr>
+                <w:noProof/>
+                <w:webHidden/>
+              </w:rPr>
+              <w:instrText xml:space="preserve"> PAGEREF _Toc242908888 \h </w:instrText>
+            </w:r>
+            <w:r>
+              <w:rPr>
+                <w:noProof/>
+                <w:webHidden/>
+              </w:rPr>
+            </w:r>
+            <w:r>
+              <w:rPr>
+                <w:noProof/>
+                <w:webHidden/>
+              </w:rPr>
+              <w:fldChar w:fldCharType="separate"/>
+            </w:r>
+            <w:r>
+              <w:rPr>
+                <w:noProof/>
+                <w:webHidden/>
+              </w:rPr>
+              <w:t>51</w:t>
+            </w:r>
+            <w:r>
+              <w:rPr>
+                <w:noProof/>
+                <w:webHidden/>
+              </w:rPr>
+              <w:fldChar w:fldCharType="end"/>
+            </w:r>
+          </w:hyperlink>
+        </w:p>
+        <w:p>
+          <w:pPr>
+            <w:pStyle w:val="Sumrio2"/>
+            <w:tabs>
+              <w:tab w:val="right" w:leader="dot" w:pos="9061"/>
+            </w:tabs>
+            <w:rPr>
+              <w:rFonts w:asciiTheme="minorHAnsi" w:eastAsiaTheme="minorEastAsia" w:hAnsiTheme="minorHAnsi"/>
+              <w:noProof/>
+              <w:kern w:val="2"/>
+              <w:sz w:val="24"/>
+              <w:szCs w:val="24"/>
+              <w:lang w:eastAsia="pt-BR"/>
+              <w14:ligatures w14:val="standardContextual"/>
+            </w:rPr>
+          </w:pPr>
+          <w:hyperlink w:anchor="_Toc242908889" w:history="1">
+            <w:r>
+              <w:rPr>
+                <w:rStyle w:val="Hyperlink"/>
+                <w:noProof/>
+              </w:rPr>
+              <w:t>6.2 Acesso ao Banco de Dados</w:t>
+            </w:r>
+            <w:r>
+              <w:rPr>
+                <w:noProof/>
+                <w:webHidden/>
+              </w:rPr>
+              <w:tab/>
+            </w:r>
+            <w:r>
+              <w:rPr>
+                <w:noProof/>
+                <w:webHidden/>
+              </w:rPr>
+              <w:fldChar w:fldCharType="begin"/>
+            </w:r>
+            <w:r>
+              <w:rPr>
+                <w:noProof/>
+                <w:webHidden/>
+              </w:rPr>
+              <w:instrText xml:space="preserve"> PAGEREF _Toc242908889 \h </w:instrText>
+            </w:r>
+            <w:r>
+              <w:rPr>
+                <w:noProof/>
+                <w:webHidden/>
+              </w:rPr>
+            </w:r>
+            <w:r>
+              <w:rPr>
+                <w:noProof/>
+                <w:webHidden/>
+              </w:rPr>
+              <w:fldChar w:fldCharType="separate"/>
+            </w:r>
+            <w:r>
+              <w:rPr>
+                <w:noProof/>
+                <w:webHidden/>
+              </w:rPr>
+              <w:t>51</w:t>
+            </w:r>
+            <w:r>
+              <w:rPr>
+                <w:noProof/>
+                <w:webHidden/>
+              </w:rPr>
+              <w:fldChar w:fldCharType="end"/>
+            </w:r>
+          </w:hyperlink>
+        </w:p>
+        <w:p>
+          <w:pPr>
+            <w:pStyle w:val="Sumrio2"/>
+            <w:tabs>
+              <w:tab w:val="right" w:leader="dot" w:pos="9061"/>
+            </w:tabs>
+            <w:rPr>
+              <w:rFonts w:asciiTheme="minorHAnsi" w:eastAsiaTheme="minorEastAsia" w:hAnsiTheme="minorHAnsi"/>
+              <w:noProof/>
+              <w:kern w:val="2"/>
+              <w:sz w:val="24"/>
+              <w:szCs w:val="24"/>
+              <w:lang w:eastAsia="pt-BR"/>
+              <w14:ligatures w14:val="standardContextual"/>
+            </w:rPr>
+          </w:pPr>
+          <w:hyperlink w:anchor="_Toc242908890" w:history="1">
+            <w:r>
+              <w:rPr>
+                <w:rStyle w:val="Hyperlink"/>
+                <w:noProof/>
+              </w:rPr>
+              <w:t>6.3 Acesso Administrativo</w:t>
+            </w:r>
+            <w:r>
+              <w:rPr>
+                <w:noProof/>
+                <w:webHidden/>
+              </w:rPr>
+              <w:tab/>
+            </w:r>
+            <w:r>
+              <w:rPr>
+                <w:noProof/>
+                <w:webHidden/>
+              </w:rPr>
+              <w:fldChar w:fldCharType="begin"/>
+            </w:r>
+            <w:r>
+              <w:rPr>
+                <w:noProof/>
+                <w:webHidden/>
+              </w:rPr>
+              <w:instrText xml:space="preserve"> PAGEREF _Toc242908890 \h </w:instrText>
+            </w:r>
+            <w:r>
+              <w:rPr>
+                <w:noProof/>
+                <w:webHidden/>
+              </w:rPr>
+            </w:r>
+            <w:r>
+              <w:rPr>
+                <w:noProof/>
+                <w:webHidden/>
+              </w:rPr>
+              <w:fldChar w:fldCharType="separate"/>
+            </w:r>
+            <w:r>
+              <w:rPr>
+                <w:noProof/>
+                <w:webHidden/>
+              </w:rPr>
+              <w:t>52</w:t>
+            </w:r>
+            <w:r>
+              <w:rPr>
+                <w:noProof/>
+                <w:webHidden/>
+              </w:rPr>
+              <w:fldChar w:fldCharType="end"/>
+            </w:r>
+          </w:hyperlink>
+        </w:p>
+        <w:p>
+          <w:pPr>
+            <w:pStyle w:val="Sumrio2"/>
+            <w:tabs>
+              <w:tab w:val="right" w:leader="dot" w:pos="9061"/>
+            </w:tabs>
+            <w:rPr>
+              <w:rFonts w:asciiTheme="minorHAnsi" w:eastAsiaTheme="minorEastAsia" w:hAnsiTheme="minorHAnsi"/>
+              <w:noProof/>
+              <w:kern w:val="2"/>
+              <w:sz w:val="24"/>
+              <w:szCs w:val="24"/>
+              <w:lang w:eastAsia="pt-BR"/>
+              <w14:ligatures w14:val="standardContextual"/>
+            </w:rPr>
+          </w:pPr>
+          <w:hyperlink w:anchor="_Toc242908891" w:history="1">
+            <w:r>
+              <w:rPr>
+                <w:rStyle w:val="Hyperlink"/>
+                <w:noProof/>
+              </w:rPr>
+              <w:t>6.4 Painel Administrativo e Cadastros</w:t>
+            </w:r>
+            <w:r>
+              <w:rPr>
+                <w:noProof/>
+                <w:webHidden/>
+              </w:rPr>
+              <w:tab/>
+            </w:r>
+            <w:r>
+              <w:rPr>
+                <w:noProof/>
+                <w:webHidden/>
+              </w:rPr>
+              <w:fldChar w:fldCharType="begin"/>
+            </w:r>
+            <w:r>
+              <w:rPr>
+                <w:noProof/>
+                <w:webHidden/>
+              </w:rPr>
+              <w:instrText xml:space="preserve"> PAGEREF _Toc242908891 \h </w:instrText>
+            </w:r>
+            <w:r>
+              <w:rPr>
+                <w:noProof/>
+                <w:webHidden/>
+              </w:rPr>
+            </w:r>
+            <w:r>
+              <w:rPr>
+                <w:noProof/>
+                <w:webHidden/>
+              </w:rPr>
+              <w:fldChar w:fldCharType="separate"/>
+            </w:r>
+            <w:r>
+              <w:rPr>
+                <w:noProof/>
+                <w:webHidden/>
+              </w:rPr>
+              <w:t>52</w:t>
+            </w:r>
+            <w:r>
+              <w:rPr>
+                <w:noProof/>
+                <w:webHidden/>
+              </w:rPr>
+              <w:fldChar w:fldCharType="end"/>
+            </w:r>
+          </w:hyperlink>
+        </w:p>
+        <w:p>
+          <w:pPr>
+            <w:pStyle w:val="Sumrio2"/>
+            <w:tabs>
+              <w:tab w:val="right" w:leader="dot" w:pos="9061"/>
+            </w:tabs>
+            <w:rPr>
+              <w:rFonts w:asciiTheme="minorHAnsi" w:eastAsiaTheme="minorEastAsia" w:hAnsiTheme="minorHAnsi"/>
+              <w:noProof/>
+              <w:kern w:val="2"/>
+              <w:sz w:val="24"/>
+              <w:szCs w:val="24"/>
+              <w:lang w:eastAsia="pt-BR"/>
+              <w14:ligatures w14:val="standardContextual"/>
+            </w:rPr>
+          </w:pPr>
+          <w:hyperlink w:anchor="_Toc242908892" w:history="1">
+            <w:r>
+              <w:rPr>
+                <w:rStyle w:val="Hyperlink"/>
+                <w:noProof/>
+              </w:rPr>
+              <w:t>6.5 Cálculo dos Indicadores</w:t>
+            </w:r>
+            <w:r>
+              <w:rPr>
+                <w:noProof/>
+                <w:webHidden/>
+              </w:rPr>
+              <w:tab/>
+            </w:r>
+            <w:r>
+              <w:rPr>
+                <w:noProof/>
+                <w:webHidden/>
+              </w:rPr>
+              <w:fldChar w:fldCharType="begin"/>
+            </w:r>
+            <w:r>
+              <w:rPr>
+                <w:noProof/>
+                <w:webHidden/>
+              </w:rPr>
+              <w:instrText xml:space="preserve"> PAGEREF _Toc242908892 \h </w:instrText>
+            </w:r>
+            <w:r>
+              <w:rPr>
+                <w:noProof/>
+                <w:webHidden/>
+              </w:rPr>
+            </w:r>
+            <w:r>
+              <w:rPr>
+                <w:noProof/>
+                <w:webHidden/>
+              </w:rPr>
+              <w:fldChar w:fldCharType="separate"/>
+            </w:r>
+            <w:r>
+              <w:rPr>
+                <w:noProof/>
+                <w:webHidden/>
+              </w:rPr>
+              <w:t>54</w:t>
+            </w:r>
+            <w:r>
+              <w:rPr>
+                <w:noProof/>
+                <w:webHidden/>
+              </w:rPr>
+              <w:fldChar w:fldCharType="end"/>
+            </w:r>
+          </w:hyperlink>
+        </w:p>
+        <w:p>
+          <w:pPr>
+            <w:pStyle w:val="Sumrio2"/>
+            <w:tabs>
+              <w:tab w:val="right" w:leader="dot" w:pos="9061"/>
+            </w:tabs>
+            <w:rPr>
+              <w:rFonts w:asciiTheme="minorHAnsi" w:eastAsiaTheme="minorEastAsia" w:hAnsiTheme="minorHAnsi"/>
+              <w:noProof/>
+              <w:kern w:val="2"/>
+              <w:sz w:val="24"/>
+              <w:szCs w:val="24"/>
+              <w:lang w:eastAsia="pt-BR"/>
+              <w14:ligatures w14:val="standardContextual"/>
+            </w:rPr>
+          </w:pPr>
+          <w:hyperlink w:anchor="_Toc242908893" w:history="1">
+            <w:r>
+              <w:rPr>
+                <w:rStyle w:val="Hyperlink"/>
+                <w:noProof/>
+              </w:rPr>
+              <w:t>6.6 Testes e Publicação</w:t>
+            </w:r>
+            <w:r>
+              <w:rPr>
+                <w:noProof/>
+                <w:webHidden/>
+              </w:rPr>
+              <w:tab/>
+            </w:r>
+            <w:r>
+              <w:rPr>
+                <w:noProof/>
+                <w:webHidden/>
+              </w:rPr>
+              <w:fldChar w:fldCharType="begin"/>
+            </w:r>
+            <w:r>
+              <w:rPr>
+                <w:noProof/>
+                <w:webHidden/>
+              </w:rPr>
+              <w:instrText xml:space="preserve"> PAGEREF _Toc242908893 \h </w:instrText>
+            </w:r>
+            <w:r>
+              <w:rPr>
+                <w:noProof/>
+                <w:webHidden/>
+              </w:rPr>
+            </w:r>
+            <w:r>
+              <w:rPr>
+                <w:noProof/>
+                <w:webHidden/>
+              </w:rPr>
+              <w:fldChar w:fldCharType="separate"/>
+            </w:r>
+            <w:r>
+              <w:rPr>
+                <w:noProof/>
+                <w:webHidden/>
+              </w:rPr>
+              <w:t>55</w:t>
+            </w:r>
+            <w:r>
+              <w:rPr>
+                <w:noProof/>
+                <w:webHidden/>
+              </w:rPr>
+              <w:fldChar w:fldCharType="end"/>
+            </w:r>
+          </w:hyperlink>
+        </w:p>
+        <w:p>
+          <w:pPr>
+            <w:pStyle w:val="Sumrio2"/>
+            <w:tabs>
+              <w:tab w:val="right" w:leader="dot" w:pos="9061"/>
+            </w:tabs>
+            <w:rPr>
+              <w:rFonts w:asciiTheme="minorHAnsi" w:eastAsiaTheme="minorEastAsia" w:hAnsiTheme="minorHAnsi"/>
+              <w:noProof/>
+              <w:kern w:val="2"/>
+              <w:sz w:val="24"/>
+              <w:szCs w:val="24"/>
+              <w:lang w:eastAsia="pt-BR"/>
+              <w14:ligatures w14:val="standardContextual"/>
+            </w:rPr>
+          </w:pPr>
+          <w:hyperlink w:anchor="_Toc242908894" w:history="1">
+            <w:r>
+              <w:rPr>
+                <w:rStyle w:val="Hyperlink"/>
+                <w:noProof/>
+              </w:rPr>
+              <w:t>6.7 Situação Atual da Implementação</w:t>
+            </w:r>
+            <w:r>
+              <w:rPr>
+                <w:noProof/>
+                <w:webHidden/>
+              </w:rPr>
+              <w:tab/>
+            </w:r>
+            <w:r>
+              <w:rPr>
+                <w:noProof/>
+                <w:webHidden/>
+              </w:rPr>
+              <w:fldChar w:fldCharType="begin"/>
+            </w:r>
+            <w:r>
+              <w:rPr>
+                <w:noProof/>
+                <w:webHidden/>
+              </w:rPr>
+              <w:instrText xml:space="preserve"> PAGEREF _Toc242908894 \h </w:instrText>
+            </w:r>
+            <w:r>
+              <w:rPr>
+                <w:noProof/>
+                <w:webHidden/>
+              </w:rPr>
+            </w:r>
+            <w:r>
+              <w:rPr>
+                <w:noProof/>
+                <w:webHidden/>
+              </w:rPr>
+              <w:fldChar w:fldCharType="separate"/>
+            </w:r>
+            <w:r>
+              <w:rPr>
+                <w:noProof/>
+                <w:webHidden/>
+              </w:rPr>
+              <w:t>55</w:t>
+            </w:r>
+            <w:r>
+              <w:rPr>
+                <w:noProof/>
+                <w:webHidden/>
+              </w:rPr>
+              <w:fldChar w:fldCharType="end"/>
+            </w:r>
+          </w:hyperlink>
+        </w:p>
+        <w:p>
+          <w:pPr>
+            <w:pStyle w:val="Sumrio1"/>
+            <w:rPr>
+              <w:rFonts w:asciiTheme="minorHAnsi" w:eastAsiaTheme="minorEastAsia" w:hAnsiTheme="minorHAnsi"/>
+              <w:b w:val="0"/>
+              <w:kern w:val="2"/>
+              <w:sz w:val="24"/>
+              <w:szCs w:val="24"/>
+              <w:lang w:eastAsia="pt-BR"/>
+              <w14:ligatures w14:val="standardContextual"/>
+            </w:rPr>
+          </w:pPr>
+          <w:hyperlink w:anchor="_Toc242908895" w:history="1">
+            <w:r>
+              <w:rPr>
+                <w:rStyle w:val="Hyperlink"/>
+              </w:rPr>
               <w:t>REFERÊNCIAS</w:t>
             </w:r>
             <w:r>
@@ -7159,7 +7884,7 @@
               <w:rPr>
                 <w:webHidden/>
               </w:rPr>
-              <w:instrText xml:space="preserve"> PAGEREF _Toc242906291 \h </w:instrText>
+              <w:instrText xml:space="preserve"> PAGEREF _Toc242908895 \h </w:instrText>
             </w:r>
             <w:r>
               <w:rPr>
@@ -7176,7 +7901,7 @@
               <w:rPr>
                 <w:webHidden/>
               </w:rPr>
-              <w:t>51</w:t>
+              <w:t>57</w:t>
             </w:r>
             <w:r>
               <w:rPr>
@@ -7223,7 +7948,7 @@
         <w:pStyle w:val="Ttulo1"/>
         <w:spacing w:after="100" w:afterAutospacing="1" w:line="360" w:lineRule="auto"/>
       </w:pPr>
-      <w:bookmarkStart w:id="0" w:name="_Toc242906245"/>
+      <w:bookmarkStart w:id="0" w:name="_Toc242908841"/>
       <w:r>
         <w:rPr>
           <w:sz w:val="24"/>
@@ -7241,7 +7966,7 @@
           <w:rFonts w:cs="Arial"/>
         </w:rPr>
       </w:pPr>
-      <w:bookmarkStart w:id="1" w:name="_Toc242906246"/>
+      <w:bookmarkStart w:id="1" w:name="_Toc242908842"/>
       <w:r>
         <w:rPr>
           <w:rFonts w:cs="Arial"/>
@@ -7339,7 +8064,7 @@
           <w:rFonts w:cs="Arial"/>
         </w:rPr>
       </w:pPr>
-      <w:bookmarkStart w:id="2" w:name="_Toc242906247"/>
+      <w:bookmarkStart w:id="2" w:name="_Toc242908843"/>
       <w:r>
         <w:rPr>
           <w:rFonts w:cs="Arial"/>
@@ -7377,7 +8102,7 @@
           <w:rFonts w:cs="Arial"/>
         </w:rPr>
       </w:pPr>
-      <w:bookmarkStart w:id="3" w:name="_Toc242906248"/>
+      <w:bookmarkStart w:id="3" w:name="_Toc242908844"/>
       <w:r>
         <w:rPr>
           <w:rFonts w:cs="Arial"/>
@@ -7392,7 +8117,7 @@
         <w:pStyle w:val="Ttulo3"/>
         <w:spacing w:before="100" w:beforeAutospacing="1" w:after="100" w:afterAutospacing="1" w:line="360" w:lineRule="auto"/>
       </w:pPr>
-      <w:bookmarkStart w:id="4" w:name="_Toc242906249"/>
+      <w:bookmarkStart w:id="4" w:name="_Toc242908845"/>
       <w:r>
         <w:t>1.3.1 Objetivo Geral</w:t>
       </w:r>
@@ -7427,7 +8152,7 @@
           <w:i/>
         </w:rPr>
       </w:pPr>
-      <w:bookmarkStart w:id="5" w:name="_Toc242906250"/>
+      <w:bookmarkStart w:id="5" w:name="_Toc242908846"/>
       <w:r>
         <w:t>1.3.2 Objetivos Específicos</w:t>
       </w:r>
@@ -7633,7 +8358,7 @@
           <w:rFonts w:cs="Arial"/>
         </w:rPr>
       </w:pPr>
-      <w:bookmarkStart w:id="6" w:name="_Toc242906251"/>
+      <w:bookmarkStart w:id="6" w:name="_Toc242908847"/>
       <w:r>
         <w:rPr>
           <w:rFonts w:cs="Arial"/>
@@ -7710,7 +8435,7 @@
           <w:rFonts w:cs="Arial"/>
         </w:rPr>
       </w:pPr>
-      <w:bookmarkStart w:id="7" w:name="_Toc242906252"/>
+      <w:bookmarkStart w:id="7" w:name="_Toc242908848"/>
       <w:r>
         <w:rPr>
           <w:rFonts w:cs="Arial"/>
@@ -7801,7 +8526,7 @@
         <w:rPr>
           <w:rFonts w:ascii="Arial" w:hAnsi="Arial" w:cs="Arial"/>
         </w:rPr>
-        <w:t>O quinto capítulo apresenta a modelagem do banco de dados, com as entidades e os relacionamentos utilizados pelo sistema.</w:t>
+        <w:t>O quinto capítulo apresenta a modelagem do sistema, com o banco de dados, o diagrama de classes e o diagrama de casos de uso.</w:t>
       </w:r>
     </w:p>
     <w:p>
@@ -7818,6 +8543,23 @@
         <w:rPr>
           <w:rFonts w:ascii="Arial" w:hAnsi="Arial" w:cs="Arial"/>
         </w:rPr>
+        <w:t>O sexto capítulo descreve a implementação do sistema, com a organização do código, as funcionalidades já desenvolvidas, a forma de verificação e de publicação e a situação atual do projeto.</w:t>
+      </w:r>
+    </w:p>
+    <w:p>
+      <w:pPr>
+        <w:pStyle w:val="NormalWeb"/>
+        <w:spacing w:line="360" w:lineRule="auto"/>
+        <w:ind w:firstLine="360"/>
+        <w:jc w:val="both"/>
+        <w:rPr>
+          <w:rFonts w:ascii="Arial" w:hAnsi="Arial" w:cs="Arial"/>
+        </w:rPr>
+      </w:pPr>
+      <w:r>
+        <w:rPr>
+          <w:rFonts w:ascii="Arial" w:hAnsi="Arial" w:cs="Arial"/>
+        </w:rPr>
         <w:t>Por fim, são apresentados os resultados obtidos, as considerações finais e as referências utilizadas.</w:t>
       </w:r>
     </w:p>
@@ -7862,7 +8604,7 @@
           <w:sz w:val="24"/>
         </w:rPr>
       </w:pPr>
-      <w:bookmarkStart w:id="8" w:name="_Toc242906253"/>
+      <w:bookmarkStart w:id="8" w:name="_Toc242908849"/>
       <w:r>
         <w:rPr>
           <w:sz w:val="24"/>
@@ -7880,7 +8622,7 @@
           <w:rFonts w:cs="Arial"/>
         </w:rPr>
       </w:pPr>
-      <w:bookmarkStart w:id="9" w:name="_Toc242906254"/>
+      <w:bookmarkStart w:id="9" w:name="_Toc242908850"/>
       <w:r>
         <w:rPr>
           <w:rFonts w:cs="Arial"/>
@@ -7990,7 +8732,7 @@
           <w:rFonts w:cs="Arial"/>
         </w:rPr>
       </w:pPr>
-      <w:bookmarkStart w:id="10" w:name="_Toc242906255"/>
+      <w:bookmarkStart w:id="10" w:name="_Toc242908851"/>
       <w:r>
         <w:rPr>
           <w:rFonts w:cs="Arial"/>
@@ -8126,7 +8868,7 @@
         <w:pStyle w:val="Legenda"/>
         <w:keepNext/>
       </w:pPr>
-      <w:bookmarkStart w:id="11" w:name="_Toc242906292"/>
+      <w:bookmarkStart w:id="11" w:name="_Toc242908896"/>
       <w:r>
         <w:lastRenderedPageBreak/>
         <w:t xml:space="preserve">Figura </w:t>
@@ -8167,7 +8909,7 @@
           <w:noProof/>
         </w:rPr>
         <w:drawing>
-          <wp:inline distT="0" distB="0" distL="0" distR="0" wp14:anchorId="057D97C3" wp14:editId="3E33C25F">
+          <wp:inline distT="0" distB="0" distL="0" distR="0" wp14:anchorId="44ED1852" wp14:editId="56CAD4E2">
             <wp:extent cx="5486400" cy="2022437"/>
             <wp:effectExtent l="0" t="0" r="0" b="0"/>
             <wp:docPr id="101" name="fig_gargalo"/>
@@ -8239,7 +8981,7 @@
           <w:rFonts w:cs="Arial"/>
         </w:rPr>
       </w:pPr>
-      <w:bookmarkStart w:id="12" w:name="_Toc242906256"/>
+      <w:bookmarkStart w:id="12" w:name="_Toc242908852"/>
       <w:r>
         <w:rPr>
           <w:rFonts w:cs="Arial"/>
@@ -8355,7 +9097,7 @@
         <w:pStyle w:val="Legenda"/>
         <w:keepNext/>
       </w:pPr>
-      <w:bookmarkStart w:id="13" w:name="_Toc242906293"/>
+      <w:bookmarkStart w:id="13" w:name="_Toc242908897"/>
       <w:r>
         <w:t xml:space="preserve">Figura </w:t>
       </w:r>
@@ -8395,7 +9137,7 @@
           <w:noProof/>
         </w:rPr>
         <w:drawing>
-          <wp:inline distT="0" distB="0" distL="0" distR="0" wp14:anchorId="62B488A2" wp14:editId="42EA8BB0">
+          <wp:inline distT="0" distB="0" distL="0" distR="0" wp14:anchorId="3E55CCCD" wp14:editId="7C9EA11F">
             <wp:extent cx="5486400" cy="2051249"/>
             <wp:effectExtent l="0" t="0" r="0" b="0"/>
             <wp:docPr id="102" name="fig_nivelamento"/>
@@ -8463,7 +9205,7 @@
           <w:rFonts w:cs="Arial"/>
         </w:rPr>
       </w:pPr>
-      <w:bookmarkStart w:id="14" w:name="_Toc242906257"/>
+      <w:bookmarkStart w:id="14" w:name="_Toc242908853"/>
       <w:r>
         <w:rPr>
           <w:rFonts w:cs="Arial"/>
@@ -8584,7 +9326,7 @@
           <w:lang w:val="en-US"/>
         </w:rPr>
       </w:pPr>
-      <w:bookmarkStart w:id="15" w:name="_Toc242906258"/>
+      <w:bookmarkStart w:id="15" w:name="_Toc242908854"/>
       <w:r>
         <w:rPr>
           <w:rFonts w:cs="Arial"/>
@@ -8794,7 +9536,7 @@
         <w:pStyle w:val="Legenda"/>
         <w:keepNext/>
       </w:pPr>
-      <w:bookmarkStart w:id="16" w:name="_Toc242906294"/>
+      <w:bookmarkStart w:id="16" w:name="_Toc242908898"/>
       <w:r>
         <w:t xml:space="preserve">Figura </w:t>
       </w:r>
@@ -8834,7 +9576,7 @@
           <w:noProof/>
         </w:rPr>
         <w:drawing>
-          <wp:inline distT="0" distB="0" distL="0" distR="0" wp14:anchorId="3AFDBACD" wp14:editId="32F41879">
+          <wp:inline distT="0" distB="0" distL="0" distR="0" wp14:anchorId="6C981B7E" wp14:editId="2263AD15">
             <wp:extent cx="5486400" cy="3543069"/>
             <wp:effectExtent l="0" t="0" r="0" b="0"/>
             <wp:docPr id="103" name="fig_mes"/>
@@ -8902,7 +9644,7 @@
           <w:rFonts w:cs="Arial"/>
         </w:rPr>
       </w:pPr>
-      <w:bookmarkStart w:id="17" w:name="_Toc242906259"/>
+      <w:bookmarkStart w:id="17" w:name="_Toc242908855"/>
       <w:r>
         <w:rPr>
           <w:rFonts w:cs="Arial"/>
@@ -9092,7 +9834,7 @@
           <w:rFonts w:cs="Arial"/>
         </w:rPr>
       </w:pPr>
-      <w:bookmarkStart w:id="18" w:name="_Toc242906260"/>
+      <w:bookmarkStart w:id="18" w:name="_Toc242908856"/>
       <w:r>
         <w:rPr>
           <w:rFonts w:cs="Arial"/>
@@ -9293,7 +10035,7 @@
         <w:pStyle w:val="Legenda"/>
         <w:keepNext/>
       </w:pPr>
-      <w:bookmarkStart w:id="19" w:name="_Toc242906295"/>
+      <w:bookmarkStart w:id="19" w:name="_Toc242908899"/>
       <w:r>
         <w:t xml:space="preserve">Figura </w:t>
       </w:r>
@@ -9333,7 +10075,7 @@
           <w:noProof/>
         </w:rPr>
         <w:drawing>
-          <wp:inline distT="0" distB="0" distL="0" distR="0" wp14:anchorId="595BB72B" wp14:editId="2E8EC4F7">
+          <wp:inline distT="0" distB="0" distL="0" distR="0" wp14:anchorId="64F3BF4A" wp14:editId="75FE70B7">
             <wp:extent cx="5486400" cy="1791916"/>
             <wp:effectExtent l="0" t="0" r="0" b="0"/>
             <wp:docPr id="104" name="fig_arq"/>
@@ -9402,7 +10144,7 @@
           <w:u w:val="single"/>
         </w:rPr>
       </w:pPr>
-      <w:bookmarkStart w:id="20" w:name="_Toc242906261"/>
+      <w:bookmarkStart w:id="20" w:name="_Toc242908857"/>
       <w:r>
         <w:rPr>
           <w:rFonts w:cs="Arial"/>
@@ -9516,7 +10258,7 @@
         <w:pStyle w:val="Ttulo2"/>
         <w:spacing w:line="360" w:lineRule="auto"/>
       </w:pPr>
-      <w:bookmarkStart w:id="21" w:name="_Toc242906262"/>
+      <w:bookmarkStart w:id="21" w:name="_Toc242908858"/>
       <w:r>
         <w:t>2.9 Considerações sobre a Utilização de Sistemas para Nivelamento de Processos</w:t>
       </w:r>
@@ -9654,7 +10396,7 @@
           <w:sz w:val="24"/>
         </w:rPr>
       </w:pPr>
-      <w:bookmarkStart w:id="22" w:name="_Toc242906263"/>
+      <w:bookmarkStart w:id="22" w:name="_Toc242908859"/>
       <w:r>
         <w:rPr>
           <w:sz w:val="24"/>
@@ -9673,7 +10415,7 @@
           <w:szCs w:val="24"/>
         </w:rPr>
       </w:pPr>
-      <w:bookmarkStart w:id="23" w:name="_Toc242906264"/>
+      <w:bookmarkStart w:id="23" w:name="_Toc242908860"/>
       <w:r>
         <w:rPr>
           <w:rFonts w:cs="Arial"/>
@@ -9779,7 +10521,7 @@
         <w:pStyle w:val="Ttulo2"/>
         <w:spacing w:line="360" w:lineRule="auto"/>
       </w:pPr>
-      <w:bookmarkStart w:id="24" w:name="_Toc242906265"/>
+      <w:bookmarkStart w:id="24" w:name="_Toc242908861"/>
       <w:r>
         <w:t>3.2 Métodos Utilizados</w:t>
       </w:r>
@@ -10049,7 +10791,7 @@
         <w:pStyle w:val="Ttulo2"/>
         <w:spacing w:before="100" w:beforeAutospacing="1" w:after="100" w:afterAutospacing="1" w:line="360" w:lineRule="auto"/>
       </w:pPr>
-      <w:bookmarkStart w:id="25" w:name="_Toc242906266"/>
+      <w:bookmarkStart w:id="25" w:name="_Toc242908862"/>
       <w:r>
         <w:t>3.3 Ferramentas e Tecnologias Utilizadas</w:t>
       </w:r>
@@ -10060,7 +10802,7 @@
         <w:pStyle w:val="Ttulo3"/>
         <w:spacing w:before="100" w:beforeAutospacing="1" w:after="100" w:afterAutospacing="1" w:line="360" w:lineRule="auto"/>
       </w:pPr>
-      <w:bookmarkStart w:id="26" w:name="_Toc242906267"/>
+      <w:bookmarkStart w:id="26" w:name="_Toc242908863"/>
       <w:r>
         <w:t>3.3.1 Linguagens de Programação</w:t>
       </w:r>
@@ -10283,7 +11025,7 @@
         <w:pStyle w:val="Ttulo3"/>
         <w:spacing w:line="360" w:lineRule="auto"/>
       </w:pPr>
-      <w:bookmarkStart w:id="27" w:name="_Toc242906268"/>
+      <w:bookmarkStart w:id="27" w:name="_Toc242908864"/>
       <w:r>
         <w:lastRenderedPageBreak/>
         <w:t>3.3.2 Framework</w:t>
@@ -10460,7 +11202,7 @@
         <w:pStyle w:val="Ttulo3"/>
         <w:spacing w:line="360" w:lineRule="auto"/>
       </w:pPr>
-      <w:bookmarkStart w:id="28" w:name="_Toc242906269"/>
+      <w:bookmarkStart w:id="28" w:name="_Toc242908865"/>
       <w:r>
         <w:t>3.3.3 Banco de Dados</w:t>
       </w:r>
@@ -10550,7 +11292,7 @@
       <w:pPr>
         <w:pStyle w:val="Ttulo2"/>
       </w:pPr>
-      <w:bookmarkStart w:id="29" w:name="_Toc242906270"/>
+      <w:bookmarkStart w:id="29" w:name="_Toc242908866"/>
       <w:r>
         <w:lastRenderedPageBreak/>
         <w:t>3.4 Etapas do Desenvolvimento</w:t>
@@ -10877,7 +11619,7 @@
           <w:sz w:val="24"/>
         </w:rPr>
       </w:pPr>
-      <w:bookmarkStart w:id="30" w:name="_Toc242906271"/>
+      <w:bookmarkStart w:id="30" w:name="_Toc242908867"/>
       <w:r>
         <w:rPr>
           <w:sz w:val="24"/>
@@ -10891,7 +11633,7 @@
       <w:pPr>
         <w:pStyle w:val="Ttulo2"/>
       </w:pPr>
-      <w:bookmarkStart w:id="31" w:name="_Toc242906272"/>
+      <w:bookmarkStart w:id="31" w:name="_Toc242908868"/>
       <w:r>
         <w:t>4.1 Descrição do Problema</w:t>
       </w:r>
@@ -11002,7 +11744,7 @@
         <w:pStyle w:val="Ttulo2"/>
         <w:spacing w:line="360" w:lineRule="auto"/>
       </w:pPr>
-      <w:bookmarkStart w:id="32" w:name="_Toc242906273"/>
+      <w:bookmarkStart w:id="32" w:name="_Toc242908869"/>
       <w:r>
         <w:lastRenderedPageBreak/>
         <w:t>4.2 Requisitos Funcionais</w:t>
@@ -11014,7 +11756,7 @@
         <w:pStyle w:val="Ttulo3"/>
         <w:spacing w:line="360" w:lineRule="auto"/>
       </w:pPr>
-      <w:bookmarkStart w:id="33" w:name="_Toc242906274"/>
+      <w:bookmarkStart w:id="33" w:name="_Toc242908870"/>
       <w:r>
         <w:t>4.2.1 Requisitos Funcionais da Tela de Login</w:t>
       </w:r>
@@ -11045,7 +11787,7 @@
         <w:pStyle w:val="Legenda"/>
         <w:keepNext/>
       </w:pPr>
-      <w:bookmarkStart w:id="34" w:name="_Toc242906303"/>
+      <w:bookmarkStart w:id="34" w:name="_Toc242908909"/>
       <w:r>
         <w:t xml:space="preserve">Tabela </w:t>
       </w:r>
@@ -11735,7 +12477,7 @@
         <w:pStyle w:val="Ttulo3"/>
         <w:spacing w:line="360" w:lineRule="auto"/>
       </w:pPr>
-      <w:bookmarkStart w:id="35" w:name="_Toc242906275"/>
+      <w:bookmarkStart w:id="35" w:name="_Toc242908871"/>
       <w:r>
         <w:lastRenderedPageBreak/>
         <w:t>4.2.2 Requisitos Funcionais da Tela de Cadastro de Setores</w:t>
@@ -11767,7 +12509,7 @@
         <w:pStyle w:val="Legenda"/>
         <w:keepNext/>
       </w:pPr>
-      <w:bookmarkStart w:id="36" w:name="_Toc242906304"/>
+      <w:bookmarkStart w:id="36" w:name="_Toc242908910"/>
       <w:r>
         <w:t xml:space="preserve">Tabela </w:t>
       </w:r>
@@ -12573,7 +13315,7 @@
         <w:pStyle w:val="Ttulo3"/>
         <w:spacing w:line="360" w:lineRule="auto"/>
       </w:pPr>
-      <w:bookmarkStart w:id="37" w:name="_Toc242906276"/>
+      <w:bookmarkStart w:id="37" w:name="_Toc242908872"/>
       <w:r>
         <w:lastRenderedPageBreak/>
         <w:t xml:space="preserve">4.2.3 Requisitos Funcionais da Tela de Cadastro de </w:t>
@@ -12608,7 +13350,7 @@
         <w:pStyle w:val="Legenda"/>
         <w:keepNext/>
       </w:pPr>
-      <w:bookmarkStart w:id="38" w:name="_Toc242906305"/>
+      <w:bookmarkStart w:id="38" w:name="_Toc242908911"/>
       <w:r>
         <w:t xml:space="preserve">Tabela </w:t>
       </w:r>
@@ -13414,7 +14156,7 @@
         <w:pStyle w:val="Ttulo3"/>
         <w:spacing w:line="360" w:lineRule="auto"/>
       </w:pPr>
-      <w:bookmarkStart w:id="39" w:name="_Toc242906277"/>
+      <w:bookmarkStart w:id="39" w:name="_Toc242908873"/>
       <w:r>
         <w:lastRenderedPageBreak/>
         <w:t>4.2.4 Requisitos Funcionais da Tela de Cadastro de Tarefas</w:t>
@@ -13446,7 +14188,7 @@
         <w:pStyle w:val="Legenda"/>
         <w:keepNext/>
       </w:pPr>
-      <w:bookmarkStart w:id="40" w:name="_Toc242906306"/>
+      <w:bookmarkStart w:id="40" w:name="_Toc242908912"/>
       <w:r>
         <w:t xml:space="preserve">Tabela </w:t>
       </w:r>
@@ -14368,7 +15110,7 @@
         <w:pStyle w:val="Ttulo3"/>
         <w:spacing w:line="360" w:lineRule="auto"/>
       </w:pPr>
-      <w:bookmarkStart w:id="41" w:name="_Toc242906278"/>
+      <w:bookmarkStart w:id="41" w:name="_Toc242908874"/>
       <w:r>
         <w:lastRenderedPageBreak/>
         <w:t>4.2.5 Requisitos Funcionais da Tela de Produtos e Ordens de Produção</w:t>
@@ -14400,7 +15142,7 @@
         <w:pStyle w:val="Legenda"/>
         <w:keepNext/>
       </w:pPr>
-      <w:bookmarkStart w:id="42" w:name="_Toc242906307"/>
+      <w:bookmarkStart w:id="42" w:name="_Toc242908913"/>
       <w:r>
         <w:t xml:space="preserve">Tabela </w:t>
       </w:r>
@@ -15206,7 +15948,7 @@
         <w:pStyle w:val="Ttulo3"/>
         <w:spacing w:line="360" w:lineRule="auto"/>
       </w:pPr>
-      <w:bookmarkStart w:id="43" w:name="_Toc242906279"/>
+      <w:bookmarkStart w:id="43" w:name="_Toc242908875"/>
       <w:r>
         <w:lastRenderedPageBreak/>
         <w:t>4.2.6 Requisitos Funcionais da Tela de Apontamento da Produção</w:t>
@@ -15238,7 +15980,7 @@
         <w:pStyle w:val="Legenda"/>
         <w:keepNext/>
       </w:pPr>
-      <w:bookmarkStart w:id="44" w:name="_Toc242906308"/>
+      <w:bookmarkStart w:id="44" w:name="_Toc242908914"/>
       <w:r>
         <w:t xml:space="preserve">Tabela </w:t>
       </w:r>
@@ -16160,7 +16902,7 @@
         <w:pStyle w:val="Ttulo3"/>
         <w:spacing w:line="360" w:lineRule="auto"/>
       </w:pPr>
-      <w:bookmarkStart w:id="45" w:name="_Toc242906280"/>
+      <w:bookmarkStart w:id="45" w:name="_Toc242908876"/>
       <w:r>
         <w:lastRenderedPageBreak/>
         <w:t>4.2.7 Requisitos Funcionais da Tela de Monitoramento da Produção</w:t>
@@ -16192,7 +16934,7 @@
         <w:pStyle w:val="Legenda"/>
         <w:keepNext/>
       </w:pPr>
-      <w:bookmarkStart w:id="46" w:name="_Toc242906309"/>
+      <w:bookmarkStart w:id="46" w:name="_Toc242908915"/>
       <w:r>
         <w:t xml:space="preserve">Tabela </w:t>
       </w:r>
@@ -16998,7 +17740,7 @@
         <w:pStyle w:val="Ttulo3"/>
         <w:spacing w:line="360" w:lineRule="auto"/>
       </w:pPr>
-      <w:bookmarkStart w:id="47" w:name="_Toc242906281"/>
+      <w:bookmarkStart w:id="47" w:name="_Toc242908877"/>
       <w:r>
         <w:lastRenderedPageBreak/>
         <w:t>4.2.8 Requisitos Funcionais dos Operadores</w:t>
@@ -17030,7 +17772,7 @@
         <w:pStyle w:val="Legenda"/>
         <w:keepNext/>
       </w:pPr>
-      <w:bookmarkStart w:id="48" w:name="_Toc242906310"/>
+      <w:bookmarkStart w:id="48" w:name="_Toc242908916"/>
       <w:r>
         <w:t xml:space="preserve">Tabela </w:t>
       </w:r>
@@ -17836,7 +18578,7 @@
         <w:pStyle w:val="Ttulo3"/>
         <w:spacing w:line="360" w:lineRule="auto"/>
       </w:pPr>
-      <w:bookmarkStart w:id="49" w:name="_Toc242906282"/>
+      <w:bookmarkStart w:id="49" w:name="_Toc242908878"/>
       <w:r>
         <w:lastRenderedPageBreak/>
         <w:t>4.2.9 Requisitos Funcionais dos Motivos de Pausa</w:t>
@@ -17868,7 +18610,7 @@
         <w:pStyle w:val="Legenda"/>
         <w:keepNext/>
       </w:pPr>
-      <w:bookmarkStart w:id="50" w:name="_Toc242906311"/>
+      <w:bookmarkStart w:id="50" w:name="_Toc242908917"/>
       <w:r>
         <w:t xml:space="preserve">Tabela </w:t>
       </w:r>
@@ -18557,7 +19299,7 @@
       <w:pPr>
         <w:pStyle w:val="Ttulo2"/>
       </w:pPr>
-      <w:bookmarkStart w:id="51" w:name="_Toc242906283"/>
+      <w:bookmarkStart w:id="51" w:name="_Toc242908879"/>
       <w:r>
         <w:lastRenderedPageBreak/>
         <w:t>4.3 Requisitos Não Funcionais</w:t>
@@ -18588,7 +19330,7 @@
       <w:pPr>
         <w:pStyle w:val="Ttulo3"/>
       </w:pPr>
-      <w:bookmarkStart w:id="52" w:name="_Toc242906284"/>
+      <w:bookmarkStart w:id="52" w:name="_Toc242908880"/>
       <w:r>
         <w:t>4.3.1 Requisitos Não Funcionais do Sistema</w:t>
       </w:r>
@@ -18619,7 +19361,7 @@
         <w:pStyle w:val="Legenda"/>
         <w:keepNext/>
       </w:pPr>
-      <w:bookmarkStart w:id="53" w:name="_Toc242906312"/>
+      <w:bookmarkStart w:id="53" w:name="_Toc242908918"/>
       <w:r>
         <w:t xml:space="preserve">Tabela </w:t>
       </w:r>
@@ -19795,7 +20537,7 @@
       <w:pPr>
         <w:pStyle w:val="Ttulo2"/>
       </w:pPr>
-      <w:bookmarkStart w:id="54" w:name="_Toc242906285"/>
+      <w:bookmarkStart w:id="54" w:name="_Toc242908881"/>
       <w:r>
         <w:lastRenderedPageBreak/>
         <w:t>4.4 Prototipagem</w:t>
@@ -20104,7 +20846,7 @@
         <w:pStyle w:val="Legenda"/>
         <w:keepNext/>
       </w:pPr>
-      <w:bookmarkStart w:id="55" w:name="_Toc242906296"/>
+      <w:bookmarkStart w:id="55" w:name="_Toc242908900"/>
       <w:r>
         <w:lastRenderedPageBreak/>
         <w:t xml:space="preserve">Figura </w:t>
@@ -20143,7 +20885,7 @@
           <w:noProof/>
         </w:rPr>
         <w:drawing>
-          <wp:inline distT="0" distB="0" distL="0" distR="0" wp14:anchorId="3626F120" wp14:editId="0EFD37B6">
+          <wp:inline distT="0" distB="0" distL="0" distR="0" wp14:anchorId="3D371FD5" wp14:editId="06CCF1E5">
             <wp:extent cx="5669280" cy="2894876"/>
             <wp:effectExtent l="0" t="0" r="0" b="0"/>
             <wp:docPr id="2" name="Picture 2"/>
@@ -20210,7 +20952,7 @@
         <w:pStyle w:val="Legenda"/>
         <w:keepNext/>
       </w:pPr>
-      <w:bookmarkStart w:id="56" w:name="_Toc242906297"/>
+      <w:bookmarkStart w:id="56" w:name="_Toc242908901"/>
       <w:r>
         <w:t xml:space="preserve">Figura </w:t>
       </w:r>
@@ -20254,7 +20996,7 @@
           <w:szCs w:val="18"/>
         </w:rPr>
         <w:drawing>
-          <wp:inline distT="0" distB="0" distL="0" distR="0" wp14:anchorId="234F07DA" wp14:editId="29ECFBA8">
+          <wp:inline distT="0" distB="0" distL="0" distR="0" wp14:anchorId="7F68848D" wp14:editId="67B2156C">
             <wp:extent cx="5669280" cy="2894876"/>
             <wp:effectExtent l="0" t="0" r="0" b="0"/>
             <wp:docPr id="1" name="Picture 3"/>
@@ -20347,7 +21089,7 @@
         <w:pStyle w:val="Legenda"/>
         <w:keepNext/>
       </w:pPr>
-      <w:bookmarkStart w:id="57" w:name="_Toc242906298"/>
+      <w:bookmarkStart w:id="57" w:name="_Toc242908902"/>
       <w:r>
         <w:t xml:space="preserve">Figura </w:t>
       </w:r>
@@ -20385,7 +21127,7 @@
           <w:noProof/>
         </w:rPr>
         <w:drawing>
-          <wp:inline distT="0" distB="0" distL="0" distR="0" wp14:anchorId="037F1E1F" wp14:editId="3EB346AE">
+          <wp:inline distT="0" distB="0" distL="0" distR="0" wp14:anchorId="35ECC858" wp14:editId="57CEB853">
             <wp:extent cx="5669280" cy="2894876"/>
             <wp:effectExtent l="0" t="0" r="0" b="0"/>
             <wp:docPr id="201" name="Imagem 201"/>
@@ -20452,7 +21194,7 @@
         <w:pStyle w:val="Legenda"/>
         <w:keepNext/>
       </w:pPr>
-      <w:bookmarkStart w:id="58" w:name="_Toc242906299"/>
+      <w:bookmarkStart w:id="58" w:name="_Toc242908903"/>
       <w:r>
         <w:t xml:space="preserve">Figura </w:t>
       </w:r>
@@ -20490,7 +21232,7 @@
           <w:noProof/>
         </w:rPr>
         <w:drawing>
-          <wp:inline distT="0" distB="0" distL="0" distR="0" wp14:anchorId="7EAB5C9F" wp14:editId="0F0D30AF">
+          <wp:inline distT="0" distB="0" distL="0" distR="0" wp14:anchorId="3082389F" wp14:editId="0EC2F7E4">
             <wp:extent cx="5669280" cy="2894876"/>
             <wp:effectExtent l="0" t="0" r="0" b="0"/>
             <wp:docPr id="202" name="Imagem 202"/>
@@ -20566,7 +21308,7 @@
       <w:pPr>
         <w:pStyle w:val="Ttulo2"/>
       </w:pPr>
-      <w:bookmarkStart w:id="59" w:name="_Toc242906286"/>
+      <w:bookmarkStart w:id="59" w:name="_Toc242908882"/>
       <w:r>
         <w:lastRenderedPageBreak/>
         <w:t>4.5 Possível Estrutura do Sistema</w:t>
@@ -20852,7 +21594,7 @@
           <w:sz w:val="24"/>
         </w:rPr>
       </w:pPr>
-      <w:bookmarkStart w:id="60" w:name="_Toc242906287"/>
+      <w:bookmarkStart w:id="60" w:name="_Toc242908883"/>
       <w:r>
         <w:rPr>
           <w:sz w:val="24"/>
@@ -20866,7 +21608,7 @@
       <w:pPr>
         <w:pStyle w:val="Ttulo2"/>
       </w:pPr>
-      <w:bookmarkStart w:id="61" w:name="_Toc242906288"/>
+      <w:bookmarkStart w:id="61" w:name="_Toc242908884"/>
       <w:r>
         <w:t xml:space="preserve">5.1 </w:t>
       </w:r>
@@ -21359,7 +22101,7 @@
         <w:pStyle w:val="Legenda"/>
         <w:keepNext/>
       </w:pPr>
-      <w:bookmarkStart w:id="62" w:name="_Toc242906300"/>
+      <w:bookmarkStart w:id="62" w:name="_Toc242908904"/>
       <w:r>
         <w:t xml:space="preserve">Figura </w:t>
       </w:r>
@@ -21396,7 +22138,7 @@
           <w:noProof/>
         </w:rPr>
         <w:drawing>
-          <wp:inline distT="0" distB="0" distL="0" distR="0" wp14:anchorId="081152DD" wp14:editId="1BA49EFC">
+          <wp:inline distT="0" distB="0" distL="0" distR="0" wp14:anchorId="68ACAE48" wp14:editId="43A6F2CC">
             <wp:extent cx="5281879" cy="6811702"/>
             <wp:effectExtent l="0" t="0" r="4445" b="1905"/>
             <wp:docPr id="4" name="Imagem 4"/>
@@ -21493,7 +22235,7 @@
       <w:pPr>
         <w:pStyle w:val="Ttulo2"/>
       </w:pPr>
-      <w:bookmarkStart w:id="63" w:name="_Toc242906289"/>
+      <w:bookmarkStart w:id="63" w:name="_Toc242908885"/>
       <w:r>
         <w:lastRenderedPageBreak/>
         <w:t>5.2 Diagrama de Classes</w:t>
@@ -21642,7 +22384,7 @@
         <w:pStyle w:val="Legenda"/>
         <w:keepNext/>
       </w:pPr>
-      <w:bookmarkStart w:id="64" w:name="_Toc242906301"/>
+      <w:bookmarkStart w:id="64" w:name="_Toc242908905"/>
       <w:r>
         <w:lastRenderedPageBreak/>
         <w:t xml:space="preserve">Figura </w:t>
@@ -21681,7 +22423,7 @@
           <w:noProof/>
         </w:rPr>
         <w:drawing>
-          <wp:inline distT="0" distB="0" distL="0" distR="0" wp14:anchorId="1573F3F4" wp14:editId="1C629948">
+          <wp:inline distT="0" distB="0" distL="0" distR="0" wp14:anchorId="76BD5280" wp14:editId="5812E2E6">
             <wp:extent cx="5730167" cy="7070453"/>
             <wp:effectExtent l="0" t="0" r="0" b="0"/>
             <wp:docPr id="203" name="Imagem 203"/>
@@ -21757,7 +22499,7 @@
       <w:pPr>
         <w:pStyle w:val="Ttulo2"/>
       </w:pPr>
-      <w:bookmarkStart w:id="65" w:name="_Toc242906290"/>
+      <w:bookmarkStart w:id="65" w:name="_Toc242908886"/>
       <w:r>
         <w:lastRenderedPageBreak/>
         <w:t>5.3 Diagrama de Casos de Uso</w:t>
@@ -21954,7 +22696,7 @@
         <w:pStyle w:val="Legenda"/>
         <w:keepNext/>
       </w:pPr>
-      <w:bookmarkStart w:id="66" w:name="_Toc242906302"/>
+      <w:bookmarkStart w:id="66" w:name="_Toc242908906"/>
       <w:r>
         <w:lastRenderedPageBreak/>
         <w:t xml:space="preserve">Figura </w:t>
@@ -21993,7 +22735,7 @@
           <w:noProof/>
         </w:rPr>
         <w:drawing>
-          <wp:inline distT="0" distB="0" distL="0" distR="0" wp14:anchorId="0D9F1722" wp14:editId="2B471AC4">
+          <wp:inline distT="0" distB="0" distL="0" distR="0" wp14:anchorId="679768B2" wp14:editId="36985805">
             <wp:extent cx="5730167" cy="5203986"/>
             <wp:effectExtent l="0" t="0" r="0" b="0"/>
             <wp:docPr id="204" name="Imagem 204"/>
@@ -22068,15 +22810,665 @@
     <w:p>
       <w:pPr>
         <w:pStyle w:val="Ttulo1"/>
+        <w:spacing w:line="360" w:lineRule="auto"/>
+        <w:rPr>
+          <w:sz w:val="24"/>
+        </w:rPr>
+      </w:pPr>
+      <w:bookmarkStart w:id="67" w:name="_Toc242908887"/>
+      <w:r>
+        <w:rPr>
+          <w:sz w:val="24"/>
+        </w:rPr>
+        <w:lastRenderedPageBreak/>
+        <w:t>6. IMPLEMENTAÇÃO DO SISTEMA</w:t>
+      </w:r>
+      <w:bookmarkEnd w:id="67"/>
+    </w:p>
+    <w:p>
+      <w:pPr>
+        <w:spacing w:before="100" w:beforeAutospacing="1" w:after="100" w:afterAutospacing="1" w:line="360" w:lineRule="auto"/>
+        <w:ind w:firstLine="708"/>
+        <w:jc w:val="both"/>
+        <w:rPr>
+          <w:rFonts w:cs="Arial"/>
+          <w:sz w:val="24"/>
+          <w:szCs w:val="24"/>
+        </w:rPr>
+      </w:pPr>
+      <w:r>
+        <w:rPr>
+          <w:sz w:val="24"/>
+          <w:szCs w:val="24"/>
+        </w:rPr>
+        <w:t>Este capítulo descreve a implementação do sistema até outubro de 2026, com a organização do código, o acesso ao banco de dados, o acesso administrativo, as telas já construídas, o cálculo dos indicadores e a forma de verificação e de publicação. As funcionalidades que ainda estão em desenvolvimento são indicadas na última seção.</w:t>
+      </w:r>
+    </w:p>
+    <w:p>
+      <w:pPr>
+        <w:pStyle w:val="Ttulo2"/>
+      </w:pPr>
+      <w:bookmarkStart w:id="68" w:name="_Toc242908888"/>
+      <w:r>
+        <w:t>6.1 Organização do Código</w:t>
+      </w:r>
+      <w:bookmarkEnd w:id="68"/>
+    </w:p>
+    <w:p>
+      <w:pPr>
+        <w:spacing w:before="100" w:beforeAutospacing="1" w:after="100" w:afterAutospacing="1" w:line="360" w:lineRule="auto"/>
+        <w:ind w:firstLine="708"/>
+        <w:jc w:val="both"/>
+        <w:rPr>
+          <w:rFonts w:cs="Arial"/>
+          <w:sz w:val="24"/>
+          <w:szCs w:val="24"/>
+        </w:rPr>
+      </w:pPr>
+      <w:r>
+        <w:rPr>
+          <w:sz w:val="24"/>
+          <w:szCs w:val="24"/>
+        </w:rPr>
+        <w:t>O sistema foi desenvolvido como uma única aplicação Next.js, que reúne as páginas da interface e as rotas da API. O código foi dividido em módulos de acordo com as funcionalidades: o módulo de acesso trata do login, dos usuários e do painel administrativo; os módulos de operadores e de setores tratam desses cadastros; e o módulo de indicadores reúne os cálculos utilizados no acompanhamento da produção.</w:t>
+      </w:r>
+    </w:p>
+    <w:p>
+      <w:pPr>
+        <w:spacing w:line="360" w:lineRule="auto"/>
+        <w:ind w:firstLine="708"/>
+        <w:jc w:val="both"/>
+        <w:rPr>
+          <w:sz w:val="24"/>
+          <w:szCs w:val="24"/>
+        </w:rPr>
+      </w:pPr>
+      <w:r>
+        <w:rPr>
+          <w:sz w:val="24"/>
+          <w:szCs w:val="24"/>
+        </w:rPr>
+        <w:t>Cada módulo é dividido em quatro camadas. A camada de domínio contém as regras de negócio e os cálculos, sem depender da interface nem do banco de dados. A camada de aplicação coordena as ações do sistema, como cadastrar um operador ou consultar os indicadores. A camada de infraestrutura realiza o acesso ao banco de dados, e a camada de apresentação contém as telas e o tratamento das requisições recebidas pela API. Essa separação permite testar as regras de negócio sem a interface e sem o banco e facilita a manutenção do código.</w:t>
+      </w:r>
+    </w:p>
+    <w:p>
+      <w:pPr>
+        <w:spacing w:line="360" w:lineRule="auto"/>
+        <w:ind w:firstLine="708"/>
+        <w:jc w:val="both"/>
+        <w:rPr>
+          <w:sz w:val="24"/>
+          <w:szCs w:val="24"/>
+        </w:rPr>
+      </w:pPr>
+      <w:r>
+        <w:rPr>
+          <w:sz w:val="24"/>
+          <w:szCs w:val="24"/>
+        </w:rPr>
+        <w:t>A interface não acessa o banco de dados diretamente. As telas se comunicam com o servidor por meio da API do sistema, e somente o servidor consulta e grava as informações.</w:t>
+      </w:r>
+    </w:p>
+    <w:p>
+      <w:pPr>
+        <w:pStyle w:val="Ttulo2"/>
+      </w:pPr>
+      <w:bookmarkStart w:id="69" w:name="_Toc242908889"/>
+      <w:r>
+        <w:t>6.2 Acesso ao Banco de Dados</w:t>
+      </w:r>
+      <w:bookmarkEnd w:id="69"/>
+    </w:p>
+    <w:p>
+      <w:pPr>
+        <w:spacing w:before="100" w:beforeAutospacing="1" w:after="100" w:afterAutospacing="1" w:line="360" w:lineRule="auto"/>
+        <w:ind w:firstLine="708"/>
+        <w:jc w:val="both"/>
+        <w:rPr>
+          <w:rFonts w:cs="Arial"/>
+          <w:sz w:val="24"/>
+          <w:szCs w:val="24"/>
+        </w:rPr>
+      </w:pPr>
+      <w:r>
+        <w:rPr>
+          <w:sz w:val="24"/>
+          <w:szCs w:val="24"/>
+        </w:rPr>
+        <w:t>O modelo de dados apresentado no capítulo 5 foi escrito no contrato do Prisma, a partir do qual são geradas as migrações que criam e alteram as tabelas do banco. As migrações ficam guardadas junto com o código, o que permite recriar o banco em qualquer ambiente e manter o histórico das alterações na sua estrutura. Até o momento foram criadas duas migrações: a primeira com as tabelas da produção e a segunda com a tabela de usuários.</w:t>
+      </w:r>
+    </w:p>
+    <w:p>
+      <w:pPr>
+        <w:spacing w:line="360" w:lineRule="auto"/>
+        <w:ind w:firstLine="708"/>
+        <w:jc w:val="both"/>
+        <w:rPr>
+          <w:sz w:val="24"/>
+          <w:szCs w:val="24"/>
+        </w:rPr>
+      </w:pPr>
+      <w:r>
+        <w:rPr>
+          <w:sz w:val="24"/>
+          <w:szCs w:val="24"/>
+        </w:rPr>
+        <w:lastRenderedPageBreak/>
+        <w:t>O banco de dados utilizado é o PostgreSQL, hospedado no serviço Neon. Além das chaves primárias e estrangeiras, o próprio banco garante algumas regras, como a matrícula única do operador, o nome único do setor, a baixa única por etapa de cada ordem e o motivo obrigatório em toda pausa. As regras que o banco não consegue garantir, como a soma das quantidades na baixa, ficam a cargo das validações do sistema.</w:t>
+      </w:r>
+    </w:p>
+    <w:p>
+      <w:pPr>
+        <w:pStyle w:val="Ttulo2"/>
+      </w:pPr>
+      <w:bookmarkStart w:id="70" w:name="_Toc242908890"/>
+      <w:r>
+        <w:t>6.3 Acesso Administrativo</w:t>
+      </w:r>
+      <w:bookmarkEnd w:id="70"/>
+    </w:p>
+    <w:p>
+      <w:pPr>
+        <w:spacing w:before="100" w:beforeAutospacing="1" w:after="100" w:afterAutospacing="1" w:line="360" w:lineRule="auto"/>
+        <w:ind w:firstLine="708"/>
+        <w:jc w:val="both"/>
+        <w:rPr>
+          <w:rFonts w:cs="Arial"/>
+          <w:sz w:val="24"/>
+          <w:szCs w:val="24"/>
+        </w:rPr>
+      </w:pPr>
+      <w:r>
+        <w:rPr>
+          <w:sz w:val="24"/>
+          <w:szCs w:val="24"/>
+        </w:rPr>
+        <w:t>O acesso à área administrativa é feito com matrícula e senha, por meio da biblioteca NextAuth. As senhas não são armazenadas diretamente: o banco guarda apenas o resultado do algoritmo Argon2id, que não permite recuperar a senha original. Após o login, a sessão dura 12 horas, e a cada requisição o sistema confere se a conta continua ativa e com o papel de administrador.</w:t>
+      </w:r>
+    </w:p>
+    <w:p>
+      <w:pPr>
+        <w:spacing w:line="360" w:lineRule="auto"/>
+        <w:ind w:firstLine="708"/>
+        <w:jc w:val="both"/>
+        <w:rPr>
+          <w:sz w:val="24"/>
+          <w:szCs w:val="24"/>
+        </w:rPr>
+      </w:pPr>
+      <w:r>
+        <w:rPr>
+          <w:sz w:val="24"/>
+          <w:szCs w:val="24"/>
+        </w:rPr>
+        <w:t>Não existe cadastro público de usuários. O primeiro administrador é criado por um comando executado no servidor, que só funciona enquanto não houver outro administrador ativo, e os demais usuários são criados por um administrador conectado. Os usuários do sistema são separados dos operadores, pois o operador apenas se identifica no apontamento da produção e não tem acesso à área administrativa.</w:t>
+      </w:r>
+    </w:p>
+    <w:p>
+      <w:pPr>
+        <w:pStyle w:val="Ttulo2"/>
+      </w:pPr>
+      <w:bookmarkStart w:id="71" w:name="_Toc242908891"/>
+      <w:r>
+        <w:t>6.4 Painel Administrativo e Cadastros</w:t>
+      </w:r>
+      <w:bookmarkEnd w:id="71"/>
+    </w:p>
+    <w:p>
+      <w:pPr>
+        <w:spacing w:before="100" w:beforeAutospacing="1" w:after="100" w:afterAutospacing="1" w:line="360" w:lineRule="auto"/>
+        <w:ind w:firstLine="708"/>
+        <w:jc w:val="both"/>
+        <w:rPr>
+          <w:rFonts w:cs="Arial"/>
+          <w:sz w:val="24"/>
+          <w:szCs w:val="24"/>
+        </w:rPr>
+      </w:pPr>
+      <w:r>
+        <w:rPr>
+          <w:sz w:val="24"/>
+          <w:szCs w:val="24"/>
+        </w:rPr>
+        <w:t>Após o login, o administrador acessa o painel apresentado na Figura 12. O menu lateral organiza os módulos em três grupos: Cadastros, Produção e Relatórios. Os módulos que ainda não foram implementados abrem uma página que informa que a funcionalidade será disponibilizada em uma próxima etapa.</w:t>
+      </w:r>
+    </w:p>
+    <w:p>
+      <w:pPr>
+        <w:pStyle w:val="Legenda"/>
+        <w:keepNext/>
+      </w:pPr>
+      <w:bookmarkStart w:id="72" w:name="_Toc242908907"/>
+      <w:r>
+        <w:lastRenderedPageBreak/>
+        <w:t xml:space="preserve">Figura </w:t>
+      </w:r>
+      <w:r>
+        <w:fldChar w:fldCharType="begin"/>
+      </w:r>
+      <w:r>
+        <w:instrText xml:space="preserve"> SEQ Figura \* ARABIC </w:instrText>
+      </w:r>
+      <w:r>
+        <w:fldChar w:fldCharType="separate"/>
+      </w:r>
+      <w:r>
+        <w:rPr>
+          <w:noProof/>
+        </w:rPr>
+        <w:t>12</w:t>
+      </w:r>
+      <w:r>
+        <w:fldChar w:fldCharType="end"/>
+      </w:r>
+      <w:r>
+        <w:t xml:space="preserve"> – Painel Administrativo com o Menu Lateral</w:t>
+      </w:r>
+      <w:bookmarkEnd w:id="72"/>
+    </w:p>
+    <w:p>
+      <w:pPr>
+        <w:keepNext/>
+        <w:spacing w:line="360" w:lineRule="auto"/>
+        <w:jc w:val="center"/>
+      </w:pPr>
+      <w:r>
+        <w:rPr>
+          <w:noProof/>
+        </w:rPr>
+        <w:drawing>
+          <wp:inline distT="0" distB="0" distL="0" distR="0" wp14:anchorId="0D758C1D" wp14:editId="718CF545">
+            <wp:extent cx="5730167" cy="3581354"/>
+            <wp:effectExtent l="0" t="0" r="0" b="0"/>
+            <wp:docPr id="205" name="Imagem 205"/>
+            <wp:cNvGraphicFramePr>
+              <a:graphicFrameLocks xmlns:a="http://schemas.openxmlformats.org/drawingml/2006/main" noChangeAspect="1"/>
+            </wp:cNvGraphicFramePr>
+            <a:graphic xmlns:a="http://schemas.openxmlformats.org/drawingml/2006/main">
+              <a:graphicData uri="http://schemas.openxmlformats.org/drawingml/2006/picture">
+                <pic:pic xmlns:pic="http://schemas.openxmlformats.org/drawingml/2006/picture">
+                  <pic:nvPicPr>
+                    <pic:cNvPr id="205" name="Imagem 205"/>
+                    <pic:cNvPicPr/>
+                  </pic:nvPicPr>
+                  <pic:blipFill>
+                    <a:blip r:embed="rId25"/>
+                    <a:stretch>
+                      <a:fillRect/>
+                    </a:stretch>
+                  </pic:blipFill>
+                  <pic:spPr>
+                    <a:xfrm>
+                      <a:off x="0" y="0"/>
+                      <a:ext cx="5730167" cy="3581354"/>
+                    </a:xfrm>
+                    <a:prstGeom prst="rect">
+                      <a:avLst/>
+                    </a:prstGeom>
+                  </pic:spPr>
+                </pic:pic>
+              </a:graphicData>
+            </a:graphic>
+          </wp:inline>
+        </w:drawing>
+      </w:r>
+    </w:p>
+    <w:p>
+      <w:pPr>
+        <w:jc w:val="center"/>
+        <w:rPr>
+          <w:sz w:val="20"/>
+          <w:szCs w:val="20"/>
+        </w:rPr>
+      </w:pPr>
+      <w:r>
+        <w:rPr>
+          <w:sz w:val="20"/>
+          <w:szCs w:val="20"/>
+        </w:rPr>
+        <w:t>Fonte: Próprio autor, acessado em 13 de outubro de 2026.</w:t>
+      </w:r>
+    </w:p>
+    <w:p>
+      <w:pPr>
+        <w:spacing w:before="100" w:beforeAutospacing="1" w:after="100" w:afterAutospacing="1" w:line="360" w:lineRule="auto"/>
+        <w:ind w:firstLine="708"/>
+        <w:jc w:val="both"/>
+        <w:rPr>
+          <w:rFonts w:cs="Arial"/>
+          <w:sz w:val="24"/>
+          <w:szCs w:val="24"/>
+        </w:rPr>
+      </w:pPr>
+      <w:r>
+        <w:rPr>
+          <w:sz w:val="24"/>
+          <w:szCs w:val="24"/>
+        </w:rPr>
+        <w:t>Os primeiros cadastros implementados foram os de operadores e de setores. A tela de operadores, apresentada na Figura 13, lista os registros com busca por nome ou matrícula, filtro por situação e ordenação pelas colunas, e permite incluir um novo operador. O sistema remove os espaços no início e no fim dos campos, exige o nome e a matrícula e não aceita matrícula repetida. A tela de setores segue o mesmo padrão e não aceita dois setores com o mesmo nome. Os registros exibidos nas figuras são fictícios.</w:t>
+      </w:r>
+    </w:p>
+    <w:p>
+      <w:pPr>
+        <w:pStyle w:val="Legenda"/>
+        <w:keepNext/>
+      </w:pPr>
+      <w:bookmarkStart w:id="73" w:name="_Toc242908908"/>
+      <w:r>
+        <w:lastRenderedPageBreak/>
+        <w:t xml:space="preserve">Figura </w:t>
+      </w:r>
+      <w:r>
+        <w:fldChar w:fldCharType="begin"/>
+      </w:r>
+      <w:r>
+        <w:instrText xml:space="preserve"> SEQ Figura \* ARABIC </w:instrText>
+      </w:r>
+      <w:r>
+        <w:fldChar w:fldCharType="separate"/>
+      </w:r>
+      <w:r>
+        <w:rPr>
+          <w:noProof/>
+        </w:rPr>
+        <w:t>13</w:t>
+      </w:r>
+      <w:r>
+        <w:fldChar w:fldCharType="end"/>
+      </w:r>
+      <w:r>
+        <w:t xml:space="preserve"> – Tela de Cadastro de Operadores</w:t>
+      </w:r>
+      <w:bookmarkEnd w:id="73"/>
+    </w:p>
+    <w:p>
+      <w:pPr>
+        <w:keepNext/>
+        <w:spacing w:line="360" w:lineRule="auto"/>
+        <w:jc w:val="center"/>
+      </w:pPr>
+      <w:r>
+        <w:rPr>
+          <w:noProof/>
+        </w:rPr>
+        <w:drawing>
+          <wp:inline distT="0" distB="0" distL="0" distR="0" wp14:anchorId="47AA55DF" wp14:editId="6CAD24F3">
+            <wp:extent cx="5730167" cy="3581354"/>
+            <wp:effectExtent l="0" t="0" r="0" b="0"/>
+            <wp:docPr id="206" name="Imagem 206"/>
+            <wp:cNvGraphicFramePr>
+              <a:graphicFrameLocks xmlns:a="http://schemas.openxmlformats.org/drawingml/2006/main" noChangeAspect="1"/>
+            </wp:cNvGraphicFramePr>
+            <a:graphic xmlns:a="http://schemas.openxmlformats.org/drawingml/2006/main">
+              <a:graphicData uri="http://schemas.openxmlformats.org/drawingml/2006/picture">
+                <pic:pic xmlns:pic="http://schemas.openxmlformats.org/drawingml/2006/picture">
+                  <pic:nvPicPr>
+                    <pic:cNvPr id="206" name="Imagem 206"/>
+                    <pic:cNvPicPr/>
+                  </pic:nvPicPr>
+                  <pic:blipFill>
+                    <a:blip r:embed="rId26"/>
+                    <a:stretch>
+                      <a:fillRect/>
+                    </a:stretch>
+                  </pic:blipFill>
+                  <pic:spPr>
+                    <a:xfrm>
+                      <a:off x="0" y="0"/>
+                      <a:ext cx="5730167" cy="3581354"/>
+                    </a:xfrm>
+                    <a:prstGeom prst="rect">
+                      <a:avLst/>
+                    </a:prstGeom>
+                  </pic:spPr>
+                </pic:pic>
+              </a:graphicData>
+            </a:graphic>
+          </wp:inline>
+        </w:drawing>
+      </w:r>
+    </w:p>
+    <w:p>
+      <w:pPr>
+        <w:jc w:val="center"/>
+        <w:rPr>
+          <w:sz w:val="20"/>
+          <w:szCs w:val="20"/>
+        </w:rPr>
+      </w:pPr>
+      <w:r>
+        <w:rPr>
+          <w:sz w:val="20"/>
+          <w:szCs w:val="20"/>
+        </w:rPr>
+        <w:t>Fonte: Próprio autor, acessado em 13 de outubro de 2026.</w:t>
+      </w:r>
+    </w:p>
+    <w:p>
+      <w:pPr>
+        <w:pStyle w:val="Ttulo2"/>
+      </w:pPr>
+      <w:bookmarkStart w:id="74" w:name="_Toc242908892"/>
+      <w:r>
+        <w:t>6.5 Cálculo dos Indicadores</w:t>
+      </w:r>
+      <w:bookmarkEnd w:id="74"/>
+    </w:p>
+    <w:p>
+      <w:pPr>
+        <w:spacing w:before="100" w:beforeAutospacing="1" w:after="100" w:afterAutospacing="1" w:line="360" w:lineRule="auto"/>
+        <w:ind w:firstLine="708"/>
+        <w:jc w:val="both"/>
+        <w:rPr>
+          <w:rFonts w:cs="Arial"/>
+          <w:sz w:val="24"/>
+          <w:szCs w:val="24"/>
+        </w:rPr>
+      </w:pPr>
+      <w:r>
+        <w:rPr>
+          <w:sz w:val="24"/>
+          <w:szCs w:val="24"/>
+        </w:rPr>
+        <w:t>Os indicadores foram implementados como funções independentes da interface e do banco de dados, o que permite conferir cada cálculo com exemplos feitos à mão. O tempo produtivo de uma execução é a soma dos intervalos entre o início ou a retomada e a pausa ou a finalização seguinte, e o tempo de pausa é a soma dos intervalos entre a pausa e a retomada. Uma execução ainda aberta não recebe horário de término presumido, e a ausência de registros não é tratada como tempo ocioso.</w:t>
+      </w:r>
+    </w:p>
+    <w:p>
+      <w:pPr>
+        <w:spacing w:line="360" w:lineRule="auto"/>
+        <w:ind w:firstLine="708"/>
+        <w:jc w:val="both"/>
+        <w:rPr>
+          <w:sz w:val="24"/>
+          <w:szCs w:val="24"/>
+        </w:rPr>
+      </w:pPr>
+      <w:r>
+        <w:rPr>
+          <w:sz w:val="24"/>
+          <w:szCs w:val="24"/>
+        </w:rPr>
+        <w:t>A partir das baixas, o sistema calcula a quantidade produzida em cada etapa e o tempo médio por unidade, obtido pela divisão do tempo produtivo pela quantidade boa. Esse tempo é comparado com o tempo padrão do produto na etapa, indicando a diferença em segundos e o percentual em relação ao padrão. Uma baixa cuja soma das quantidades não corresponde à quantidade da ordem, ou que possui quantidade negativa, não é considerada nos cálculos e aparece como inconsistência.</w:t>
+      </w:r>
+    </w:p>
+    <w:p>
+      <w:pPr>
+        <w:spacing w:line="360" w:lineRule="auto"/>
+        <w:ind w:firstLine="708"/>
+        <w:jc w:val="both"/>
+        <w:rPr>
+          <w:sz w:val="24"/>
+          <w:szCs w:val="24"/>
+        </w:rPr>
+      </w:pPr>
+      <w:r>
+        <w:rPr>
+          <w:sz w:val="24"/>
+          <w:szCs w:val="24"/>
+        </w:rPr>
+        <w:t xml:space="preserve">Para apoiar o nivelamento, o sistema calcula a carga pendente de cada etapa, que é a quantidade das ordens ainda sem baixa multiplicada pelo tempo padrão. </w:t>
+      </w:r>
+      <w:r>
+        <w:rPr>
+          <w:sz w:val="24"/>
+          <w:szCs w:val="24"/>
+        </w:rPr>
+        <w:lastRenderedPageBreak/>
+        <w:t>Como uma mesma etapa pode ser realizada em mais de um posto de trabalho, a carga da etapa é dividida em partes iguais entre os postos compatíveis, e cada posto recebe também o percentual que representa na carga total. Esse valor é uma estimativa: ele mostra onde o trabalho está concentrado, mas não comprova a existência de um gargalo, e a comparação entre os postos considera que eles têm disponibilidade semelhante.</w:t>
+      </w:r>
+    </w:p>
+    <w:p>
+      <w:pPr>
+        <w:spacing w:line="360" w:lineRule="auto"/>
+        <w:ind w:firstLine="708"/>
+        <w:jc w:val="both"/>
+        <w:rPr>
+          <w:sz w:val="24"/>
+          <w:szCs w:val="24"/>
+        </w:rPr>
+      </w:pPr>
+      <w:r>
+        <w:rPr>
+          <w:sz w:val="24"/>
+          <w:szCs w:val="24"/>
+        </w:rPr>
+        <w:t>Os indicadores são disponibilizados por uma rota da API acessível somente ao administrador, que recebe o período da consulta e devolve os resultados junto com avisos sobre dados ausentes, como etapas sem tempo padrão ou execuções ainda abertas.</w:t>
+      </w:r>
+    </w:p>
+    <w:p>
+      <w:pPr>
+        <w:pStyle w:val="Ttulo2"/>
+      </w:pPr>
+      <w:bookmarkStart w:id="75" w:name="_Toc242908893"/>
+      <w:r>
+        <w:t>6.6 Testes e Publicação</w:t>
+      </w:r>
+      <w:bookmarkEnd w:id="75"/>
+    </w:p>
+    <w:p>
+      <w:pPr>
+        <w:spacing w:before="100" w:beforeAutospacing="1" w:after="100" w:afterAutospacing="1" w:line="360" w:lineRule="auto"/>
+        <w:ind w:firstLine="708"/>
+        <w:jc w:val="both"/>
+        <w:rPr>
+          <w:rFonts w:cs="Arial"/>
+          <w:sz w:val="24"/>
+          <w:szCs w:val="24"/>
+        </w:rPr>
+      </w:pPr>
+      <w:r>
+        <w:rPr>
+          <w:sz w:val="24"/>
+          <w:szCs w:val="24"/>
+        </w:rPr>
+        <w:t>As regras de negócio e os cálculos são verificados por testes automatizados, executados com o executor de testes do próprio Node.js. Em 14 de outubro de 2026 o projeto possuía 88 testes, dos quais 82 são executados em toda verificação e 6, que dependem do sistema em funcionamento, são executados manualmente.</w:t>
+      </w:r>
+    </w:p>
+    <w:p>
+      <w:pPr>
+        <w:spacing w:line="360" w:lineRule="auto"/>
+        <w:ind w:firstLine="708"/>
+        <w:jc w:val="both"/>
+        <w:rPr>
+          <w:sz w:val="24"/>
+          <w:szCs w:val="24"/>
+        </w:rPr>
+      </w:pPr>
+      <w:r>
+        <w:rPr>
+          <w:sz w:val="24"/>
+          <w:szCs w:val="24"/>
+        </w:rPr>
+        <w:t>O código é mantido em um repositório no GitHub. Cada funcionalidade é desenvolvida em uma ramificação própria e só é incorporada à versão de desenvolvimento por meio de um pull request, após a conferência dos arquivos alterados. A cada pull request, uma verificação automática executa a análise do código, a conferência de tipos, os testes e a compilação do sistema, e a incorporação só é feita quando todas essas etapas são concluídas sem erros.</w:t>
+      </w:r>
+    </w:p>
+    <w:p>
+      <w:pPr>
+        <w:spacing w:line="360" w:lineRule="auto"/>
+        <w:ind w:firstLine="708"/>
+        <w:jc w:val="both"/>
+        <w:rPr>
+          <w:sz w:val="24"/>
+          <w:szCs w:val="24"/>
+        </w:rPr>
+      </w:pPr>
+      <w:r>
+        <w:rPr>
+          <w:sz w:val="24"/>
+          <w:szCs w:val="24"/>
+        </w:rPr>
+        <w:t>A versão de desenvolvimento é publicada automaticamente na plataforma Vercel a cada alteração, com o servidor localizado em São Paulo, o que permite acompanhar a evolução do sistema pelo navegador.</w:t>
+      </w:r>
+    </w:p>
+    <w:p>
+      <w:pPr>
+        <w:pStyle w:val="Ttulo2"/>
+      </w:pPr>
+      <w:bookmarkStart w:id="76" w:name="_Toc242908894"/>
+      <w:r>
+        <w:t>6.7 Situação Atual da Implementação</w:t>
+      </w:r>
+      <w:bookmarkEnd w:id="76"/>
+    </w:p>
+    <w:p>
+      <w:pPr>
+        <w:spacing w:before="100" w:beforeAutospacing="1" w:after="100" w:afterAutospacing="1" w:line="360" w:lineRule="auto"/>
+        <w:ind w:firstLine="708"/>
+        <w:jc w:val="both"/>
+        <w:rPr>
+          <w:rFonts w:cs="Arial"/>
+          <w:sz w:val="24"/>
+          <w:szCs w:val="24"/>
+        </w:rPr>
+      </w:pPr>
+      <w:r>
+        <w:rPr>
+          <w:sz w:val="24"/>
+          <w:szCs w:val="24"/>
+        </w:rPr>
+        <w:t xml:space="preserve">Até outubro de 2026 estão implementados o acesso administrativo, o painel com o menu, os cadastros de operadores e de setores, o banco de dados com todas as tabelas e a consulta dos indicadores pela API. Estão em desenvolvimento os demais cadastros, os roteiros, os planos e as ordens de produção, o apontamento da produção, incluindo a identificação por leitor de código, e o painel de indicadores. Por </w:t>
+      </w:r>
+      <w:r>
+        <w:rPr>
+          <w:sz w:val="24"/>
+          <w:szCs w:val="24"/>
+        </w:rPr>
+        <w:lastRenderedPageBreak/>
+        <w:t>isso, os resultados obtidos com o uso do sistema serão apresentados após a conclusão dessas funcionalidades.</w:t>
+      </w:r>
+    </w:p>
+    <w:p>
+      <w:pPr>
+        <w:spacing w:after="100" w:afterAutospacing="1"/>
+        <w:rPr>
+          <w:rFonts w:ascii="Times New Roman" w:hAnsi="Times New Roman" w:cs="Times New Roman"/>
+          <w:b/>
+          <w:sz w:val="24"/>
+          <w:szCs w:val="24"/>
+        </w:rPr>
+      </w:pPr>
+      <w:r>
+        <w:rPr>
+          <w:rFonts w:ascii="Times New Roman" w:hAnsi="Times New Roman" w:cs="Times New Roman"/>
+          <w:b/>
+          <w:sz w:val="24"/>
+          <w:szCs w:val="24"/>
+        </w:rPr>
+        <w:br w:type="page"/>
+      </w:r>
+    </w:p>
+    <w:p>
+      <w:pPr>
+        <w:pStyle w:val="Ttulo1"/>
         <w:spacing w:after="100" w:afterAutospacing="1"/>
         <w:jc w:val="center"/>
       </w:pPr>
-      <w:bookmarkStart w:id="67" w:name="_Toc242906291"/>
+      <w:bookmarkStart w:id="77" w:name="_Toc242908895"/>
       <w:r>
         <w:lastRenderedPageBreak/>
         <w:t>REFERÊNCIAS</w:t>
       </w:r>
-      <w:bookmarkEnd w:id="67"/>
+      <w:bookmarkEnd w:id="77"/>
     </w:p>
     <w:p/>
     <w:p>
@@ -22664,7 +24056,7 @@
       </w:r>
     </w:p>
     <w:sectPr>
-      <w:headerReference w:type="default" r:id="rId25"/>
+      <w:headerReference w:type="default" r:id="rId27"/>
       <w:pgSz w:w="11906" w:h="16838" w:code="9"/>
       <w:pgMar w:top="1701" w:right="1134" w:bottom="1134" w:left="1701" w:header="709" w:footer="709" w:gutter="0"/>
       <w:pgNumType w:start="11"/>
@@ -22779,7 +24171,7 @@
         <w:lang w:eastAsia="pt-BR"/>
       </w:rPr>
       <w:drawing>
-        <wp:inline distT="0" distB="0" distL="0" distR="0" wp14:anchorId="42991E72" wp14:editId="0731E225">
+        <wp:inline distT="0" distB="0" distL="0" distR="0" wp14:anchorId="18745E85" wp14:editId="435AC339">
           <wp:extent cx="1619048" cy="647619"/>
           <wp:effectExtent l="0" t="0" r="0" b="0"/>
           <wp:docPr id="5" name="Imagem 5" descr="Logotipo  O conteúdo gerado por IA pode estar incorreto."/>

</xml_diff>

<commit_message>
docs: atualiza o capítulo de implementação do TCC com o estado de outubro
</commit_message>
<xml_diff>
--- a/docs/tcc/TCC_Nivelamento_de_Processos.docx
+++ b/docs/tcc/TCC_Nivelamento_de_Processos.docx
@@ -1706,7 +1706,7 @@
       <w:r>
         <w:fldChar w:fldCharType="separate"/>
       </w:r>
-      <w:hyperlink w:anchor="_Toc242908896" w:history="1">
+      <w:hyperlink w:anchor="_Toc243992810" w:history="1">
         <w:r>
           <w:rPr>
             <w:rStyle w:val="Hyperlink"/>
@@ -1733,7 +1733,7 @@
             <w:noProof/>
             <w:webHidden/>
           </w:rPr>
-          <w:instrText xml:space="preserve"> PAGEREF _Toc242908896 \h </w:instrText>
+          <w:instrText xml:space="preserve"> PAGEREF _Toc243992810 \h </w:instrText>
         </w:r>
         <w:r>
           <w:rPr>
@@ -1778,7 +1778,7 @@
           <w14:ligatures w14:val="standardContextual"/>
         </w:rPr>
       </w:pPr>
-      <w:hyperlink w:anchor="_Toc242908897" w:history="1">
+      <w:hyperlink w:anchor="_Toc243992811" w:history="1">
         <w:r>
           <w:rPr>
             <w:rStyle w:val="Hyperlink"/>
@@ -1805,7 +1805,7 @@
             <w:noProof/>
             <w:webHidden/>
           </w:rPr>
-          <w:instrText xml:space="preserve"> PAGEREF _Toc242908897 \h </w:instrText>
+          <w:instrText xml:space="preserve"> PAGEREF _Toc243992811 \h </w:instrText>
         </w:r>
         <w:r>
           <w:rPr>
@@ -1850,7 +1850,7 @@
           <w14:ligatures w14:val="standardContextual"/>
         </w:rPr>
       </w:pPr>
-      <w:hyperlink w:anchor="_Toc242908898" w:history="1">
+      <w:hyperlink w:anchor="_Toc243992812" w:history="1">
         <w:r>
           <w:rPr>
             <w:rStyle w:val="Hyperlink"/>
@@ -1877,7 +1877,7 @@
             <w:noProof/>
             <w:webHidden/>
           </w:rPr>
-          <w:instrText xml:space="preserve"> PAGEREF _Toc242908898 \h </w:instrText>
+          <w:instrText xml:space="preserve"> PAGEREF _Toc243992812 \h </w:instrText>
         </w:r>
         <w:r>
           <w:rPr>
@@ -1922,7 +1922,7 @@
           <w14:ligatures w14:val="standardContextual"/>
         </w:rPr>
       </w:pPr>
-      <w:hyperlink w:anchor="_Toc242908899" w:history="1">
+      <w:hyperlink w:anchor="_Toc243992813" w:history="1">
         <w:r>
           <w:rPr>
             <w:rStyle w:val="Hyperlink"/>
@@ -1949,7 +1949,7 @@
             <w:noProof/>
             <w:webHidden/>
           </w:rPr>
-          <w:instrText xml:space="preserve"> PAGEREF _Toc242908899 \h </w:instrText>
+          <w:instrText xml:space="preserve"> PAGEREF _Toc243992813 \h </w:instrText>
         </w:r>
         <w:r>
           <w:rPr>
@@ -1994,7 +1994,7 @@
           <w14:ligatures w14:val="standardContextual"/>
         </w:rPr>
       </w:pPr>
-      <w:hyperlink w:anchor="_Toc242908900" w:history="1">
+      <w:hyperlink w:anchor="_Toc243992814" w:history="1">
         <w:r>
           <w:rPr>
             <w:rStyle w:val="Hyperlink"/>
@@ -2021,7 +2021,7 @@
             <w:noProof/>
             <w:webHidden/>
           </w:rPr>
-          <w:instrText xml:space="preserve"> PAGEREF _Toc242908900 \h </w:instrText>
+          <w:instrText xml:space="preserve"> PAGEREF _Toc243992814 \h </w:instrText>
         </w:r>
         <w:r>
           <w:rPr>
@@ -2066,7 +2066,7 @@
           <w14:ligatures w14:val="standardContextual"/>
         </w:rPr>
       </w:pPr>
-      <w:hyperlink w:anchor="_Toc242908901" w:history="1">
+      <w:hyperlink w:anchor="_Toc243992815" w:history="1">
         <w:r>
           <w:rPr>
             <w:rStyle w:val="Hyperlink"/>
@@ -2093,7 +2093,7 @@
             <w:noProof/>
             <w:webHidden/>
           </w:rPr>
-          <w:instrText xml:space="preserve"> PAGEREF _Toc242908901 \h </w:instrText>
+          <w:instrText xml:space="preserve"> PAGEREF _Toc243992815 \h </w:instrText>
         </w:r>
         <w:r>
           <w:rPr>
@@ -2138,7 +2138,7 @@
           <w14:ligatures w14:val="standardContextual"/>
         </w:rPr>
       </w:pPr>
-      <w:hyperlink w:anchor="_Toc242908902" w:history="1">
+      <w:hyperlink w:anchor="_Toc243992816" w:history="1">
         <w:r>
           <w:rPr>
             <w:rStyle w:val="Hyperlink"/>
@@ -2165,7 +2165,7 @@
             <w:noProof/>
             <w:webHidden/>
           </w:rPr>
-          <w:instrText xml:space="preserve"> PAGEREF _Toc242908902 \h </w:instrText>
+          <w:instrText xml:space="preserve"> PAGEREF _Toc243992816 \h </w:instrText>
         </w:r>
         <w:r>
           <w:rPr>
@@ -2210,7 +2210,7 @@
           <w14:ligatures w14:val="standardContextual"/>
         </w:rPr>
       </w:pPr>
-      <w:hyperlink w:anchor="_Toc242908903" w:history="1">
+      <w:hyperlink w:anchor="_Toc243992817" w:history="1">
         <w:r>
           <w:rPr>
             <w:rStyle w:val="Hyperlink"/>
@@ -2237,7 +2237,7 @@
             <w:noProof/>
             <w:webHidden/>
           </w:rPr>
-          <w:instrText xml:space="preserve"> PAGEREF _Toc242908903 \h </w:instrText>
+          <w:instrText xml:space="preserve"> PAGEREF _Toc243992817 \h </w:instrText>
         </w:r>
         <w:r>
           <w:rPr>
@@ -2282,7 +2282,7 @@
           <w14:ligatures w14:val="standardContextual"/>
         </w:rPr>
       </w:pPr>
-      <w:hyperlink w:anchor="_Toc242908904" w:history="1">
+      <w:hyperlink w:anchor="_Toc243992818" w:history="1">
         <w:r>
           <w:rPr>
             <w:rStyle w:val="Hyperlink"/>
@@ -2309,7 +2309,7 @@
             <w:noProof/>
             <w:webHidden/>
           </w:rPr>
-          <w:instrText xml:space="preserve"> PAGEREF _Toc242908904 \h </w:instrText>
+          <w:instrText xml:space="preserve"> PAGEREF _Toc243992818 \h </w:instrText>
         </w:r>
         <w:r>
           <w:rPr>
@@ -2354,7 +2354,7 @@
           <w14:ligatures w14:val="standardContextual"/>
         </w:rPr>
       </w:pPr>
-      <w:hyperlink w:anchor="_Toc242908905" w:history="1">
+      <w:hyperlink w:anchor="_Toc243992819" w:history="1">
         <w:r>
           <w:rPr>
             <w:rStyle w:val="Hyperlink"/>
@@ -2381,7 +2381,7 @@
             <w:noProof/>
             <w:webHidden/>
           </w:rPr>
-          <w:instrText xml:space="preserve"> PAGEREF _Toc242908905 \h </w:instrText>
+          <w:instrText xml:space="preserve"> PAGEREF _Toc243992819 \h </w:instrText>
         </w:r>
         <w:r>
           <w:rPr>
@@ -2426,7 +2426,7 @@
           <w14:ligatures w14:val="standardContextual"/>
         </w:rPr>
       </w:pPr>
-      <w:hyperlink w:anchor="_Toc242908906" w:history="1">
+      <w:hyperlink w:anchor="_Toc243992820" w:history="1">
         <w:r>
           <w:rPr>
             <w:rStyle w:val="Hyperlink"/>
@@ -2453,7 +2453,7 @@
             <w:noProof/>
             <w:webHidden/>
           </w:rPr>
-          <w:instrText xml:space="preserve"> PAGEREF _Toc242908906 \h </w:instrText>
+          <w:instrText xml:space="preserve"> PAGEREF _Toc243992820 \h </w:instrText>
         </w:r>
         <w:r>
           <w:rPr>
@@ -2498,7 +2498,7 @@
           <w14:ligatures w14:val="standardContextual"/>
         </w:rPr>
       </w:pPr>
-      <w:hyperlink w:anchor="_Toc242908907" w:history="1">
+      <w:hyperlink w:anchor="_Toc243992821" w:history="1">
         <w:r>
           <w:rPr>
             <w:rStyle w:val="Hyperlink"/>
@@ -2525,7 +2525,7 @@
             <w:noProof/>
             <w:webHidden/>
           </w:rPr>
-          <w:instrText xml:space="preserve"> PAGEREF _Toc242908907 \h </w:instrText>
+          <w:instrText xml:space="preserve"> PAGEREF _Toc243992821 \h </w:instrText>
         </w:r>
         <w:r>
           <w:rPr>
@@ -2570,7 +2570,7 @@
           <w14:ligatures w14:val="standardContextual"/>
         </w:rPr>
       </w:pPr>
-      <w:hyperlink w:anchor="_Toc242908908" w:history="1">
+      <w:hyperlink w:anchor="_Toc243992822" w:history="1">
         <w:r>
           <w:rPr>
             <w:rStyle w:val="Hyperlink"/>
@@ -2597,7 +2597,7 @@
             <w:noProof/>
             <w:webHidden/>
           </w:rPr>
-          <w:instrText xml:space="preserve"> PAGEREF _Toc242908908 \h </w:instrText>
+          <w:instrText xml:space="preserve"> PAGEREF _Toc243992822 \h </w:instrText>
         </w:r>
         <w:r>
           <w:rPr>
@@ -2634,40 +2634,6 @@
         <w:tabs>
           <w:tab w:val="right" w:leader="dot" w:pos="9061"/>
         </w:tabs>
-      </w:pPr>
-      <w:r>
-        <w:fldChar w:fldCharType="end"/>
-      </w:r>
-    </w:p>
-    <w:p>
-      <w:pPr>
-        <w:pageBreakBefore/>
-        <w:spacing w:line="360" w:lineRule="auto"/>
-        <w:jc w:val="center"/>
-        <w:rPr>
-          <w:rFonts w:cs="Arial"/>
-          <w:b/>
-          <w:sz w:val="24"/>
-          <w:szCs w:val="24"/>
-        </w:rPr>
-      </w:pPr>
-      <w:r>
-        <w:rPr>
-          <w:rFonts w:cs="Arial"/>
-          <w:b/>
-          <w:sz w:val="24"/>
-          <w:szCs w:val="24"/>
-        </w:rPr>
-        <w:lastRenderedPageBreak/>
-        <w:t>LISTA DE TABELAS</w:t>
-      </w:r>
-    </w:p>
-    <w:p>
-      <w:pPr>
-        <w:pStyle w:val="ndicedeilustraes"/>
-        <w:tabs>
-          <w:tab w:val="right" w:leader="dot" w:pos="9061"/>
-        </w:tabs>
         <w:rPr>
           <w:rFonts w:asciiTheme="minorHAnsi" w:eastAsiaTheme="minorEastAsia" w:hAnsiTheme="minorHAnsi"/>
           <w:noProof/>
@@ -2676,6 +2642,328 @@
           <w14:ligatures w14:val="standardContextual"/>
         </w:rPr>
       </w:pPr>
+      <w:hyperlink w:anchor="_Toc243992823" w:history="1">
+        <w:r>
+          <w:rPr>
+            <w:rStyle w:val="Hyperlink"/>
+            <w:noProof/>
+          </w:rPr>
+          <w:t>Figura 14 – Roteiro com Ordens e Etapas Travadas</w:t>
+        </w:r>
+        <w:r>
+          <w:rPr>
+            <w:noProof/>
+            <w:webHidden/>
+          </w:rPr>
+          <w:tab/>
+        </w:r>
+        <w:r>
+          <w:rPr>
+            <w:noProof/>
+            <w:webHidden/>
+          </w:rPr>
+          <w:fldChar w:fldCharType="begin"/>
+        </w:r>
+        <w:r>
+          <w:rPr>
+            <w:noProof/>
+            <w:webHidden/>
+          </w:rPr>
+          <w:instrText xml:space="preserve"> PAGEREF _Toc243992823 \h </w:instrText>
+        </w:r>
+        <w:r>
+          <w:rPr>
+            <w:noProof/>
+            <w:webHidden/>
+          </w:rPr>
+        </w:r>
+        <w:r>
+          <w:rPr>
+            <w:noProof/>
+            <w:webHidden/>
+          </w:rPr>
+          <w:fldChar w:fldCharType="separate"/>
+        </w:r>
+        <w:r>
+          <w:rPr>
+            <w:noProof/>
+            <w:webHidden/>
+          </w:rPr>
+          <w:t>55</w:t>
+        </w:r>
+        <w:r>
+          <w:rPr>
+            <w:noProof/>
+            <w:webHidden/>
+          </w:rPr>
+          <w:fldChar w:fldCharType="end"/>
+        </w:r>
+      </w:hyperlink>
+    </w:p>
+    <w:p>
+      <w:pPr>
+        <w:pStyle w:val="ndicedeilustraes"/>
+        <w:tabs>
+          <w:tab w:val="right" w:leader="dot" w:pos="9061"/>
+        </w:tabs>
+        <w:rPr>
+          <w:rFonts w:asciiTheme="minorHAnsi" w:eastAsiaTheme="minorEastAsia" w:hAnsiTheme="minorHAnsi"/>
+          <w:noProof/>
+          <w:kern w:val="2"/>
+          <w:lang w:eastAsia="pt-BR"/>
+          <w14:ligatures w14:val="standardContextual"/>
+        </w:rPr>
+      </w:pPr>
+      <w:hyperlink w:anchor="_Toc243992824" w:history="1">
+        <w:r>
+          <w:rPr>
+            <w:rStyle w:val="Hyperlink"/>
+            <w:noProof/>
+          </w:rPr>
+          <w:t>Figura 15 – Cadastro de Ordem de Produção</w:t>
+        </w:r>
+        <w:r>
+          <w:rPr>
+            <w:noProof/>
+            <w:webHidden/>
+          </w:rPr>
+          <w:tab/>
+        </w:r>
+        <w:r>
+          <w:rPr>
+            <w:noProof/>
+            <w:webHidden/>
+          </w:rPr>
+          <w:fldChar w:fldCharType="begin"/>
+        </w:r>
+        <w:r>
+          <w:rPr>
+            <w:noProof/>
+            <w:webHidden/>
+          </w:rPr>
+          <w:instrText xml:space="preserve"> PAGEREF _Toc243992824 \h </w:instrText>
+        </w:r>
+        <w:r>
+          <w:rPr>
+            <w:noProof/>
+            <w:webHidden/>
+          </w:rPr>
+        </w:r>
+        <w:r>
+          <w:rPr>
+            <w:noProof/>
+            <w:webHidden/>
+          </w:rPr>
+          <w:fldChar w:fldCharType="separate"/>
+        </w:r>
+        <w:r>
+          <w:rPr>
+            <w:noProof/>
+            <w:webHidden/>
+          </w:rPr>
+          <w:t>56</w:t>
+        </w:r>
+        <w:r>
+          <w:rPr>
+            <w:noProof/>
+            <w:webHidden/>
+          </w:rPr>
+          <w:fldChar w:fldCharType="end"/>
+        </w:r>
+      </w:hyperlink>
+    </w:p>
+    <w:p>
+      <w:pPr>
+        <w:pStyle w:val="ndicedeilustraes"/>
+        <w:tabs>
+          <w:tab w:val="right" w:leader="dot" w:pos="9061"/>
+        </w:tabs>
+        <w:rPr>
+          <w:rFonts w:asciiTheme="minorHAnsi" w:eastAsiaTheme="minorEastAsia" w:hAnsiTheme="minorHAnsi"/>
+          <w:noProof/>
+          <w:kern w:val="2"/>
+          <w:lang w:eastAsia="pt-BR"/>
+          <w14:ligatures w14:val="standardContextual"/>
+        </w:rPr>
+      </w:pPr>
+      <w:hyperlink w:anchor="_Toc243992825" w:history="1">
+        <w:r>
+          <w:rPr>
+            <w:rStyle w:val="Hyperlink"/>
+            <w:noProof/>
+          </w:rPr>
+          <w:t>Figura 16 – Ilha de Apontamento com Execução Pausada</w:t>
+        </w:r>
+        <w:r>
+          <w:rPr>
+            <w:noProof/>
+            <w:webHidden/>
+          </w:rPr>
+          <w:tab/>
+        </w:r>
+        <w:r>
+          <w:rPr>
+            <w:noProof/>
+            <w:webHidden/>
+          </w:rPr>
+          <w:fldChar w:fldCharType="begin"/>
+        </w:r>
+        <w:r>
+          <w:rPr>
+            <w:noProof/>
+            <w:webHidden/>
+          </w:rPr>
+          <w:instrText xml:space="preserve"> PAGEREF _Toc243992825 \h </w:instrText>
+        </w:r>
+        <w:r>
+          <w:rPr>
+            <w:noProof/>
+            <w:webHidden/>
+          </w:rPr>
+        </w:r>
+        <w:r>
+          <w:rPr>
+            <w:noProof/>
+            <w:webHidden/>
+          </w:rPr>
+          <w:fldChar w:fldCharType="separate"/>
+        </w:r>
+        <w:r>
+          <w:rPr>
+            <w:noProof/>
+            <w:webHidden/>
+          </w:rPr>
+          <w:t>57</w:t>
+        </w:r>
+        <w:r>
+          <w:rPr>
+            <w:noProof/>
+            <w:webHidden/>
+          </w:rPr>
+          <w:fldChar w:fldCharType="end"/>
+        </w:r>
+      </w:hyperlink>
+    </w:p>
+    <w:p>
+      <w:pPr>
+        <w:pStyle w:val="ndicedeilustraes"/>
+        <w:tabs>
+          <w:tab w:val="right" w:leader="dot" w:pos="9061"/>
+        </w:tabs>
+        <w:rPr>
+          <w:rFonts w:asciiTheme="minorHAnsi" w:eastAsiaTheme="minorEastAsia" w:hAnsiTheme="minorHAnsi"/>
+          <w:noProof/>
+          <w:kern w:val="2"/>
+          <w:lang w:eastAsia="pt-BR"/>
+          <w14:ligatures w14:val="standardContextual"/>
+        </w:rPr>
+      </w:pPr>
+      <w:hyperlink w:anchor="_Toc243992826" w:history="1">
+        <w:r>
+          <w:rPr>
+            <w:rStyle w:val="Hyperlink"/>
+            <w:noProof/>
+          </w:rPr>
+          <w:t>Figura 17 – Tela de Indicadores</w:t>
+        </w:r>
+        <w:r>
+          <w:rPr>
+            <w:noProof/>
+            <w:webHidden/>
+          </w:rPr>
+          <w:tab/>
+        </w:r>
+        <w:r>
+          <w:rPr>
+            <w:noProof/>
+            <w:webHidden/>
+          </w:rPr>
+          <w:fldChar w:fldCharType="begin"/>
+        </w:r>
+        <w:r>
+          <w:rPr>
+            <w:noProof/>
+            <w:webHidden/>
+          </w:rPr>
+          <w:instrText xml:space="preserve"> PAGEREF _Toc243992826 \h </w:instrText>
+        </w:r>
+        <w:r>
+          <w:rPr>
+            <w:noProof/>
+            <w:webHidden/>
+          </w:rPr>
+        </w:r>
+        <w:r>
+          <w:rPr>
+            <w:noProof/>
+            <w:webHidden/>
+          </w:rPr>
+          <w:fldChar w:fldCharType="separate"/>
+        </w:r>
+        <w:r>
+          <w:rPr>
+            <w:noProof/>
+            <w:webHidden/>
+          </w:rPr>
+          <w:t>59</w:t>
+        </w:r>
+        <w:r>
+          <w:rPr>
+            <w:noProof/>
+            <w:webHidden/>
+          </w:rPr>
+          <w:fldChar w:fldCharType="end"/>
+        </w:r>
+      </w:hyperlink>
+    </w:p>
+    <w:p>
+      <w:pPr>
+        <w:pStyle w:val="ndicedeilustraes"/>
+        <w:tabs>
+          <w:tab w:val="right" w:leader="dot" w:pos="9061"/>
+        </w:tabs>
+      </w:pPr>
+      <w:r>
+        <w:fldChar w:fldCharType="end"/>
+      </w:r>
+    </w:p>
+    <w:p>
+      <w:pPr>
+        <w:pageBreakBefore/>
+        <w:spacing w:line="360" w:lineRule="auto"/>
+        <w:jc w:val="center"/>
+        <w:rPr>
+          <w:rFonts w:cs="Arial"/>
+          <w:b/>
+          <w:sz w:val="24"/>
+          <w:szCs w:val="24"/>
+        </w:rPr>
+      </w:pPr>
+      <w:r>
+        <w:rPr>
+          <w:rFonts w:cs="Arial"/>
+          <w:b/>
+          <w:sz w:val="24"/>
+          <w:szCs w:val="24"/>
+        </w:rPr>
+        <w:lastRenderedPageBreak/>
+        <w:t>LISTA DE TABELAS</w:t>
+      </w:r>
+    </w:p>
+    <w:p>
+      <w:pPr>
+        <w:pStyle w:val="ndicedeilustraes"/>
+        <w:tabs>
+          <w:tab w:val="right" w:leader="dot" w:pos="9061"/>
+        </w:tabs>
+        <w:rPr>
+          <w:rFonts w:asciiTheme="minorHAnsi" w:eastAsiaTheme="minorEastAsia" w:hAnsiTheme="minorHAnsi"/>
+          <w:noProof/>
+          <w:kern w:val="2"/>
+          <w:lang w:eastAsia="pt-BR"/>
+          <w14:ligatures w14:val="standardContextual"/>
+        </w:rPr>
+      </w:pPr>
       <w:r>
         <w:fldChar w:fldCharType="begin"/>
       </w:r>
@@ -2685,7 +2973,7 @@
       <w:r>
         <w:fldChar w:fldCharType="separate"/>
       </w:r>
-      <w:hyperlink w:anchor="_Toc242908909" w:history="1">
+      <w:hyperlink w:anchor="_Toc243992827" w:history="1">
         <w:r>
           <w:rPr>
             <w:rStyle w:val="Hyperlink"/>
@@ -2712,7 +3000,7 @@
             <w:noProof/>
             <w:webHidden/>
           </w:rPr>
-          <w:instrText xml:space="preserve"> PAGEREF _Toc242908909 \h </w:instrText>
+          <w:instrText xml:space="preserve"> PAGEREF _Toc243992827 \h </w:instrText>
         </w:r>
         <w:r>
           <w:rPr>
@@ -2757,7 +3045,7 @@
           <w14:ligatures w14:val="standardContextual"/>
         </w:rPr>
       </w:pPr>
-      <w:hyperlink w:anchor="_Toc242908910" w:history="1">
+      <w:hyperlink w:anchor="_Toc243992828" w:history="1">
         <w:r>
           <w:rPr>
             <w:rStyle w:val="Hyperlink"/>
@@ -2784,7 +3072,7 @@
             <w:noProof/>
             <w:webHidden/>
           </w:rPr>
-          <w:instrText xml:space="preserve"> PAGEREF _Toc242908910 \h </w:instrText>
+          <w:instrText xml:space="preserve"> PAGEREF _Toc243992828 \h </w:instrText>
         </w:r>
         <w:r>
           <w:rPr>
@@ -2829,7 +3117,7 @@
           <w14:ligatures w14:val="standardContextual"/>
         </w:rPr>
       </w:pPr>
-      <w:hyperlink w:anchor="_Toc242908911" w:history="1">
+      <w:hyperlink w:anchor="_Toc243992829" w:history="1">
         <w:r>
           <w:rPr>
             <w:rStyle w:val="Hyperlink"/>
@@ -2856,7 +3144,7 @@
             <w:noProof/>
             <w:webHidden/>
           </w:rPr>
-          <w:instrText xml:space="preserve"> PAGEREF _Toc242908911 \h </w:instrText>
+          <w:instrText xml:space="preserve"> PAGEREF _Toc243992829 \h </w:instrText>
         </w:r>
         <w:r>
           <w:rPr>
@@ -2901,7 +3189,7 @@
           <w14:ligatures w14:val="standardContextual"/>
         </w:rPr>
       </w:pPr>
-      <w:hyperlink w:anchor="_Toc242908912" w:history="1">
+      <w:hyperlink w:anchor="_Toc243992830" w:history="1">
         <w:r>
           <w:rPr>
             <w:rStyle w:val="Hyperlink"/>
@@ -2928,7 +3216,7 @@
             <w:noProof/>
             <w:webHidden/>
           </w:rPr>
-          <w:instrText xml:space="preserve"> PAGEREF _Toc242908912 \h </w:instrText>
+          <w:instrText xml:space="preserve"> PAGEREF _Toc243992830 \h </w:instrText>
         </w:r>
         <w:r>
           <w:rPr>
@@ -2973,7 +3261,7 @@
           <w14:ligatures w14:val="standardContextual"/>
         </w:rPr>
       </w:pPr>
-      <w:hyperlink w:anchor="_Toc242908913" w:history="1">
+      <w:hyperlink w:anchor="_Toc243992831" w:history="1">
         <w:r>
           <w:rPr>
             <w:rStyle w:val="Hyperlink"/>
@@ -3000,7 +3288,7 @@
             <w:noProof/>
             <w:webHidden/>
           </w:rPr>
-          <w:instrText xml:space="preserve"> PAGEREF _Toc242908913 \h </w:instrText>
+          <w:instrText xml:space="preserve"> PAGEREF _Toc243992831 \h </w:instrText>
         </w:r>
         <w:r>
           <w:rPr>
@@ -3045,7 +3333,7 @@
           <w14:ligatures w14:val="standardContextual"/>
         </w:rPr>
       </w:pPr>
-      <w:hyperlink w:anchor="_Toc242908914" w:history="1">
+      <w:hyperlink w:anchor="_Toc243992832" w:history="1">
         <w:r>
           <w:rPr>
             <w:rStyle w:val="Hyperlink"/>
@@ -3072,7 +3360,7 @@
             <w:noProof/>
             <w:webHidden/>
           </w:rPr>
-          <w:instrText xml:space="preserve"> PAGEREF _Toc242908914 \h </w:instrText>
+          <w:instrText xml:space="preserve"> PAGEREF _Toc243992832 \h </w:instrText>
         </w:r>
         <w:r>
           <w:rPr>
@@ -3117,7 +3405,7 @@
           <w14:ligatures w14:val="standardContextual"/>
         </w:rPr>
       </w:pPr>
-      <w:hyperlink w:anchor="_Toc242908915" w:history="1">
+      <w:hyperlink w:anchor="_Toc243992833" w:history="1">
         <w:r>
           <w:rPr>
             <w:rStyle w:val="Hyperlink"/>
@@ -3144,7 +3432,7 @@
             <w:noProof/>
             <w:webHidden/>
           </w:rPr>
-          <w:instrText xml:space="preserve"> PAGEREF _Toc242908915 \h </w:instrText>
+          <w:instrText xml:space="preserve"> PAGEREF _Toc243992833 \h </w:instrText>
         </w:r>
         <w:r>
           <w:rPr>
@@ -3189,7 +3477,7 @@
           <w14:ligatures w14:val="standardContextual"/>
         </w:rPr>
       </w:pPr>
-      <w:hyperlink w:anchor="_Toc242908916" w:history="1">
+      <w:hyperlink w:anchor="_Toc243992834" w:history="1">
         <w:r>
           <w:rPr>
             <w:rStyle w:val="Hyperlink"/>
@@ -3216,7 +3504,7 @@
             <w:noProof/>
             <w:webHidden/>
           </w:rPr>
-          <w:instrText xml:space="preserve"> PAGEREF _Toc242908916 \h </w:instrText>
+          <w:instrText xml:space="preserve"> PAGEREF _Toc243992834 \h </w:instrText>
         </w:r>
         <w:r>
           <w:rPr>
@@ -3261,7 +3549,7 @@
           <w14:ligatures w14:val="standardContextual"/>
         </w:rPr>
       </w:pPr>
-      <w:hyperlink w:anchor="_Toc242908917" w:history="1">
+      <w:hyperlink w:anchor="_Toc243992835" w:history="1">
         <w:r>
           <w:rPr>
             <w:rStyle w:val="Hyperlink"/>
@@ -3288,7 +3576,7 @@
             <w:noProof/>
             <w:webHidden/>
           </w:rPr>
-          <w:instrText xml:space="preserve"> PAGEREF _Toc242908917 \h </w:instrText>
+          <w:instrText xml:space="preserve"> PAGEREF _Toc243992835 \h </w:instrText>
         </w:r>
         <w:r>
           <w:rPr>
@@ -3333,7 +3621,7 @@
           <w14:ligatures w14:val="standardContextual"/>
         </w:rPr>
       </w:pPr>
-      <w:hyperlink w:anchor="_Toc242908918" w:history="1">
+      <w:hyperlink w:anchor="_Toc243992836" w:history="1">
         <w:r>
           <w:rPr>
             <w:rStyle w:val="Hyperlink"/>
@@ -3360,7 +3648,7 @@
             <w:noProof/>
             <w:webHidden/>
           </w:rPr>
-          <w:instrText xml:space="preserve"> PAGEREF _Toc242908918 \h </w:instrText>
+          <w:instrText xml:space="preserve"> PAGEREF _Toc243992836 \h </w:instrText>
         </w:r>
         <w:r>
           <w:rPr>
@@ -3916,7 +4204,7 @@
             </w:rPr>
             <w:fldChar w:fldCharType="separate"/>
           </w:r>
-          <w:hyperlink w:anchor="_Toc242908841" w:history="1">
+          <w:hyperlink w:anchor="_Toc243992753" w:history="1">
             <w:r>
               <w:rPr>
                 <w:rStyle w:val="Hyperlink"/>
@@ -3939,7 +4227,7 @@
               <w:rPr>
                 <w:webHidden/>
               </w:rPr>
-              <w:instrText xml:space="preserve"> PAGEREF _Toc242908841 \h </w:instrText>
+              <w:instrText xml:space="preserve"> PAGEREF _Toc243992753 \h </w:instrText>
             </w:r>
             <w:r>
               <w:rPr>
@@ -3982,7 +4270,7 @@
               <w14:ligatures w14:val="standardContextual"/>
             </w:rPr>
           </w:pPr>
-          <w:hyperlink w:anchor="_Toc242908842" w:history="1">
+          <w:hyperlink w:anchor="_Toc243992754" w:history="1">
             <w:r>
               <w:rPr>
                 <w:rStyle w:val="Hyperlink"/>
@@ -4010,7 +4298,7 @@
                 <w:noProof/>
                 <w:webHidden/>
               </w:rPr>
-              <w:instrText xml:space="preserve"> PAGEREF _Toc242908842 \h </w:instrText>
+              <w:instrText xml:space="preserve"> PAGEREF _Toc243992754 \h </w:instrText>
             </w:r>
             <w:r>
               <w:rPr>
@@ -4057,7 +4345,7 @@
               <w14:ligatures w14:val="standardContextual"/>
             </w:rPr>
           </w:pPr>
-          <w:hyperlink w:anchor="_Toc242908843" w:history="1">
+          <w:hyperlink w:anchor="_Toc243992755" w:history="1">
             <w:r>
               <w:rPr>
                 <w:rStyle w:val="Hyperlink"/>
@@ -4085,7 +4373,7 @@
                 <w:noProof/>
                 <w:webHidden/>
               </w:rPr>
-              <w:instrText xml:space="preserve"> PAGEREF _Toc242908843 \h </w:instrText>
+              <w:instrText xml:space="preserve"> PAGEREF _Toc243992755 \h </w:instrText>
             </w:r>
             <w:r>
               <w:rPr>
@@ -4132,7 +4420,7 @@
               <w14:ligatures w14:val="standardContextual"/>
             </w:rPr>
           </w:pPr>
-          <w:hyperlink w:anchor="_Toc242908844" w:history="1">
+          <w:hyperlink w:anchor="_Toc243992756" w:history="1">
             <w:r>
               <w:rPr>
                 <w:rStyle w:val="Hyperlink"/>
@@ -4160,7 +4448,7 @@
                 <w:noProof/>
                 <w:webHidden/>
               </w:rPr>
-              <w:instrText xml:space="preserve"> PAGEREF _Toc242908844 \h </w:instrText>
+              <w:instrText xml:space="preserve"> PAGEREF _Toc243992756 \h </w:instrText>
             </w:r>
             <w:r>
               <w:rPr>
@@ -4207,7 +4495,7 @@
               <w14:ligatures w14:val="standardContextual"/>
             </w:rPr>
           </w:pPr>
-          <w:hyperlink w:anchor="_Toc242908845" w:history="1">
+          <w:hyperlink w:anchor="_Toc243992757" w:history="1">
             <w:r>
               <w:rPr>
                 <w:rStyle w:val="Hyperlink"/>
@@ -4234,7 +4522,7 @@
                 <w:noProof/>
                 <w:webHidden/>
               </w:rPr>
-              <w:instrText xml:space="preserve"> PAGEREF _Toc242908845 \h </w:instrText>
+              <w:instrText xml:space="preserve"> PAGEREF _Toc243992757 \h </w:instrText>
             </w:r>
             <w:r>
               <w:rPr>
@@ -4281,7 +4569,7 @@
               <w14:ligatures w14:val="standardContextual"/>
             </w:rPr>
           </w:pPr>
-          <w:hyperlink w:anchor="_Toc242908846" w:history="1">
+          <w:hyperlink w:anchor="_Toc243992758" w:history="1">
             <w:r>
               <w:rPr>
                 <w:rStyle w:val="Hyperlink"/>
@@ -4308,7 +4596,7 @@
                 <w:noProof/>
                 <w:webHidden/>
               </w:rPr>
-              <w:instrText xml:space="preserve"> PAGEREF _Toc242908846 \h </w:instrText>
+              <w:instrText xml:space="preserve"> PAGEREF _Toc243992758 \h </w:instrText>
             </w:r>
             <w:r>
               <w:rPr>
@@ -4355,7 +4643,7 @@
               <w14:ligatures w14:val="standardContextual"/>
             </w:rPr>
           </w:pPr>
-          <w:hyperlink w:anchor="_Toc242908847" w:history="1">
+          <w:hyperlink w:anchor="_Toc243992759" w:history="1">
             <w:r>
               <w:rPr>
                 <w:rStyle w:val="Hyperlink"/>
@@ -4383,7 +4671,7 @@
                 <w:noProof/>
                 <w:webHidden/>
               </w:rPr>
-              <w:instrText xml:space="preserve"> PAGEREF _Toc242908847 \h </w:instrText>
+              <w:instrText xml:space="preserve"> PAGEREF _Toc243992759 \h </w:instrText>
             </w:r>
             <w:r>
               <w:rPr>
@@ -4430,7 +4718,7 @@
               <w14:ligatures w14:val="standardContextual"/>
             </w:rPr>
           </w:pPr>
-          <w:hyperlink w:anchor="_Toc242908848" w:history="1">
+          <w:hyperlink w:anchor="_Toc243992760" w:history="1">
             <w:r>
               <w:rPr>
                 <w:rStyle w:val="Hyperlink"/>
@@ -4458,7 +4746,7 @@
                 <w:noProof/>
                 <w:webHidden/>
               </w:rPr>
-              <w:instrText xml:space="preserve"> PAGEREF _Toc242908848 \h </w:instrText>
+              <w:instrText xml:space="preserve"> PAGEREF _Toc243992760 \h </w:instrText>
             </w:r>
             <w:r>
               <w:rPr>
@@ -4502,7 +4790,7 @@
               <w14:ligatures w14:val="standardContextual"/>
             </w:rPr>
           </w:pPr>
-          <w:hyperlink w:anchor="_Toc242908849" w:history="1">
+          <w:hyperlink w:anchor="_Toc243992761" w:history="1">
             <w:r>
               <w:rPr>
                 <w:rStyle w:val="Hyperlink"/>
@@ -4525,7 +4813,7 @@
               <w:rPr>
                 <w:webHidden/>
               </w:rPr>
-              <w:instrText xml:space="preserve"> PAGEREF _Toc242908849 \h </w:instrText>
+              <w:instrText xml:space="preserve"> PAGEREF _Toc243992761 \h </w:instrText>
             </w:r>
             <w:r>
               <w:rPr>
@@ -4568,7 +4856,7 @@
               <w14:ligatures w14:val="standardContextual"/>
             </w:rPr>
           </w:pPr>
-          <w:hyperlink w:anchor="_Toc242908850" w:history="1">
+          <w:hyperlink w:anchor="_Toc243992762" w:history="1">
             <w:r>
               <w:rPr>
                 <w:rStyle w:val="Hyperlink"/>
@@ -4596,7 +4884,7 @@
                 <w:noProof/>
                 <w:webHidden/>
               </w:rPr>
-              <w:instrText xml:space="preserve"> PAGEREF _Toc242908850 \h </w:instrText>
+              <w:instrText xml:space="preserve"> PAGEREF _Toc243992762 \h </w:instrText>
             </w:r>
             <w:r>
               <w:rPr>
@@ -4643,7 +4931,7 @@
               <w14:ligatures w14:val="standardContextual"/>
             </w:rPr>
           </w:pPr>
-          <w:hyperlink w:anchor="_Toc242908851" w:history="1">
+          <w:hyperlink w:anchor="_Toc243992763" w:history="1">
             <w:r>
               <w:rPr>
                 <w:rStyle w:val="Hyperlink"/>
@@ -4671,7 +4959,7 @@
                 <w:noProof/>
                 <w:webHidden/>
               </w:rPr>
-              <w:instrText xml:space="preserve"> PAGEREF _Toc242908851 \h </w:instrText>
+              <w:instrText xml:space="preserve"> PAGEREF _Toc243992763 \h </w:instrText>
             </w:r>
             <w:r>
               <w:rPr>
@@ -4718,7 +5006,7 @@
               <w14:ligatures w14:val="standardContextual"/>
             </w:rPr>
           </w:pPr>
-          <w:hyperlink w:anchor="_Toc242908852" w:history="1">
+          <w:hyperlink w:anchor="_Toc243992764" w:history="1">
             <w:r>
               <w:rPr>
                 <w:rStyle w:val="Hyperlink"/>
@@ -4746,7 +5034,7 @@
                 <w:noProof/>
                 <w:webHidden/>
               </w:rPr>
-              <w:instrText xml:space="preserve"> PAGEREF _Toc242908852 \h </w:instrText>
+              <w:instrText xml:space="preserve"> PAGEREF _Toc243992764 \h </w:instrText>
             </w:r>
             <w:r>
               <w:rPr>
@@ -4793,7 +5081,7 @@
               <w14:ligatures w14:val="standardContextual"/>
             </w:rPr>
           </w:pPr>
-          <w:hyperlink w:anchor="_Toc242908853" w:history="1">
+          <w:hyperlink w:anchor="_Toc243992765" w:history="1">
             <w:r>
               <w:rPr>
                 <w:rStyle w:val="Hyperlink"/>
@@ -4821,7 +5109,7 @@
                 <w:noProof/>
                 <w:webHidden/>
               </w:rPr>
-              <w:instrText xml:space="preserve"> PAGEREF _Toc242908853 \h </w:instrText>
+              <w:instrText xml:space="preserve"> PAGEREF _Toc243992765 \h </w:instrText>
             </w:r>
             <w:r>
               <w:rPr>
@@ -4868,7 +5156,7 @@
               <w14:ligatures w14:val="standardContextual"/>
             </w:rPr>
           </w:pPr>
-          <w:hyperlink w:anchor="_Toc242908854" w:history="1">
+          <w:hyperlink w:anchor="_Toc243992766" w:history="1">
             <w:r>
               <w:rPr>
                 <w:rStyle w:val="Hyperlink"/>
@@ -4897,7 +5185,7 @@
                 <w:noProof/>
                 <w:webHidden/>
               </w:rPr>
-              <w:instrText xml:space="preserve"> PAGEREF _Toc242908854 \h </w:instrText>
+              <w:instrText xml:space="preserve"> PAGEREF _Toc243992766 \h </w:instrText>
             </w:r>
             <w:r>
               <w:rPr>
@@ -4944,7 +5232,7 @@
               <w14:ligatures w14:val="standardContextual"/>
             </w:rPr>
           </w:pPr>
-          <w:hyperlink w:anchor="_Toc242908855" w:history="1">
+          <w:hyperlink w:anchor="_Toc243992767" w:history="1">
             <w:r>
               <w:rPr>
                 <w:rStyle w:val="Hyperlink"/>
@@ -4972,7 +5260,7 @@
                 <w:noProof/>
                 <w:webHidden/>
               </w:rPr>
-              <w:instrText xml:space="preserve"> PAGEREF _Toc242908855 \h </w:instrText>
+              <w:instrText xml:space="preserve"> PAGEREF _Toc243992767 \h </w:instrText>
             </w:r>
             <w:r>
               <w:rPr>
@@ -5019,7 +5307,7 @@
               <w14:ligatures w14:val="standardContextual"/>
             </w:rPr>
           </w:pPr>
-          <w:hyperlink w:anchor="_Toc242908856" w:history="1">
+          <w:hyperlink w:anchor="_Toc243992768" w:history="1">
             <w:r>
               <w:rPr>
                 <w:rStyle w:val="Hyperlink"/>
@@ -5047,7 +5335,7 @@
                 <w:noProof/>
                 <w:webHidden/>
               </w:rPr>
-              <w:instrText xml:space="preserve"> PAGEREF _Toc242908856 \h </w:instrText>
+              <w:instrText xml:space="preserve"> PAGEREF _Toc243992768 \h </w:instrText>
             </w:r>
             <w:r>
               <w:rPr>
@@ -5094,7 +5382,7 @@
               <w14:ligatures w14:val="standardContextual"/>
             </w:rPr>
           </w:pPr>
-          <w:hyperlink w:anchor="_Toc242908857" w:history="1">
+          <w:hyperlink w:anchor="_Toc243992769" w:history="1">
             <w:r>
               <w:rPr>
                 <w:rStyle w:val="Hyperlink"/>
@@ -5122,7 +5410,7 @@
                 <w:noProof/>
                 <w:webHidden/>
               </w:rPr>
-              <w:instrText xml:space="preserve"> PAGEREF _Toc242908857 \h </w:instrText>
+              <w:instrText xml:space="preserve"> PAGEREF _Toc243992769 \h </w:instrText>
             </w:r>
             <w:r>
               <w:rPr>
@@ -5169,7 +5457,7 @@
               <w14:ligatures w14:val="standardContextual"/>
             </w:rPr>
           </w:pPr>
-          <w:hyperlink w:anchor="_Toc242908858" w:history="1">
+          <w:hyperlink w:anchor="_Toc243992770" w:history="1">
             <w:r>
               <w:rPr>
                 <w:rStyle w:val="Hyperlink"/>
@@ -5196,7 +5484,7 @@
                 <w:noProof/>
                 <w:webHidden/>
               </w:rPr>
-              <w:instrText xml:space="preserve"> PAGEREF _Toc242908858 \h </w:instrText>
+              <w:instrText xml:space="preserve"> PAGEREF _Toc243992770 \h </w:instrText>
             </w:r>
             <w:r>
               <w:rPr>
@@ -5240,7 +5528,7 @@
               <w14:ligatures w14:val="standardContextual"/>
             </w:rPr>
           </w:pPr>
-          <w:hyperlink w:anchor="_Toc242908859" w:history="1">
+          <w:hyperlink w:anchor="_Toc243992771" w:history="1">
             <w:r>
               <w:rPr>
                 <w:rStyle w:val="Hyperlink"/>
@@ -5263,7 +5551,7 @@
               <w:rPr>
                 <w:webHidden/>
               </w:rPr>
-              <w:instrText xml:space="preserve"> PAGEREF _Toc242908859 \h </w:instrText>
+              <w:instrText xml:space="preserve"> PAGEREF _Toc243992771 \h </w:instrText>
             </w:r>
             <w:r>
               <w:rPr>
@@ -5306,7 +5594,7 @@
               <w14:ligatures w14:val="standardContextual"/>
             </w:rPr>
           </w:pPr>
-          <w:hyperlink w:anchor="_Toc242908860" w:history="1">
+          <w:hyperlink w:anchor="_Toc243992772" w:history="1">
             <w:r>
               <w:rPr>
                 <w:rStyle w:val="Hyperlink"/>
@@ -5334,7 +5622,7 @@
                 <w:noProof/>
                 <w:webHidden/>
               </w:rPr>
-              <w:instrText xml:space="preserve"> PAGEREF _Toc242908860 \h </w:instrText>
+              <w:instrText xml:space="preserve"> PAGEREF _Toc243992772 \h </w:instrText>
             </w:r>
             <w:r>
               <w:rPr>
@@ -5381,7 +5669,7 @@
               <w14:ligatures w14:val="standardContextual"/>
             </w:rPr>
           </w:pPr>
-          <w:hyperlink w:anchor="_Toc242908861" w:history="1">
+          <w:hyperlink w:anchor="_Toc243992773" w:history="1">
             <w:r>
               <w:rPr>
                 <w:rStyle w:val="Hyperlink"/>
@@ -5408,7 +5696,7 @@
                 <w:noProof/>
                 <w:webHidden/>
               </w:rPr>
-              <w:instrText xml:space="preserve"> PAGEREF _Toc242908861 \h </w:instrText>
+              <w:instrText xml:space="preserve"> PAGEREF _Toc243992773 \h </w:instrText>
             </w:r>
             <w:r>
               <w:rPr>
@@ -5455,7 +5743,7 @@
               <w14:ligatures w14:val="standardContextual"/>
             </w:rPr>
           </w:pPr>
-          <w:hyperlink w:anchor="_Toc242908862" w:history="1">
+          <w:hyperlink w:anchor="_Toc243992774" w:history="1">
             <w:r>
               <w:rPr>
                 <w:rStyle w:val="Hyperlink"/>
@@ -5482,7 +5770,7 @@
                 <w:noProof/>
                 <w:webHidden/>
               </w:rPr>
-              <w:instrText xml:space="preserve"> PAGEREF _Toc242908862 \h </w:instrText>
+              <w:instrText xml:space="preserve"> PAGEREF _Toc243992774 \h </w:instrText>
             </w:r>
             <w:r>
               <w:rPr>
@@ -5529,7 +5817,7 @@
               <w14:ligatures w14:val="standardContextual"/>
             </w:rPr>
           </w:pPr>
-          <w:hyperlink w:anchor="_Toc242908863" w:history="1">
+          <w:hyperlink w:anchor="_Toc243992775" w:history="1">
             <w:r>
               <w:rPr>
                 <w:rStyle w:val="Hyperlink"/>
@@ -5556,7 +5844,7 @@
                 <w:noProof/>
                 <w:webHidden/>
               </w:rPr>
-              <w:instrText xml:space="preserve"> PAGEREF _Toc242908863 \h </w:instrText>
+              <w:instrText xml:space="preserve"> PAGEREF _Toc243992775 \h </w:instrText>
             </w:r>
             <w:r>
               <w:rPr>
@@ -5603,7 +5891,7 @@
               <w14:ligatures w14:val="standardContextual"/>
             </w:rPr>
           </w:pPr>
-          <w:hyperlink w:anchor="_Toc242908864" w:history="1">
+          <w:hyperlink w:anchor="_Toc243992776" w:history="1">
             <w:r>
               <w:rPr>
                 <w:rStyle w:val="Hyperlink"/>
@@ -5630,7 +5918,7 @@
                 <w:noProof/>
                 <w:webHidden/>
               </w:rPr>
-              <w:instrText xml:space="preserve"> PAGEREF _Toc242908864 \h </w:instrText>
+              <w:instrText xml:space="preserve"> PAGEREF _Toc243992776 \h </w:instrText>
             </w:r>
             <w:r>
               <w:rPr>
@@ -5677,7 +5965,7 @@
               <w14:ligatures w14:val="standardContextual"/>
             </w:rPr>
           </w:pPr>
-          <w:hyperlink w:anchor="_Toc242908865" w:history="1">
+          <w:hyperlink w:anchor="_Toc243992777" w:history="1">
             <w:r>
               <w:rPr>
                 <w:rStyle w:val="Hyperlink"/>
@@ -5704,7 +5992,7 @@
                 <w:noProof/>
                 <w:webHidden/>
               </w:rPr>
-              <w:instrText xml:space="preserve"> PAGEREF _Toc242908865 \h </w:instrText>
+              <w:instrText xml:space="preserve"> PAGEREF _Toc243992777 \h </w:instrText>
             </w:r>
             <w:r>
               <w:rPr>
@@ -5751,7 +6039,7 @@
               <w14:ligatures w14:val="standardContextual"/>
             </w:rPr>
           </w:pPr>
-          <w:hyperlink w:anchor="_Toc242908866" w:history="1">
+          <w:hyperlink w:anchor="_Toc243992778" w:history="1">
             <w:r>
               <w:rPr>
                 <w:rStyle w:val="Hyperlink"/>
@@ -5778,7 +6066,7 @@
                 <w:noProof/>
                 <w:webHidden/>
               </w:rPr>
-              <w:instrText xml:space="preserve"> PAGEREF _Toc242908866 \h </w:instrText>
+              <w:instrText xml:space="preserve"> PAGEREF _Toc243992778 \h </w:instrText>
             </w:r>
             <w:r>
               <w:rPr>
@@ -5822,7 +6110,7 @@
               <w14:ligatures w14:val="standardContextual"/>
             </w:rPr>
           </w:pPr>
-          <w:hyperlink w:anchor="_Toc242908867" w:history="1">
+          <w:hyperlink w:anchor="_Toc243992779" w:history="1">
             <w:r>
               <w:rPr>
                 <w:rStyle w:val="Hyperlink"/>
@@ -5845,7 +6133,7 @@
               <w:rPr>
                 <w:webHidden/>
               </w:rPr>
-              <w:instrText xml:space="preserve"> PAGEREF _Toc242908867 \h </w:instrText>
+              <w:instrText xml:space="preserve"> PAGEREF _Toc243992779 \h </w:instrText>
             </w:r>
             <w:r>
               <w:rPr>
@@ -5888,7 +6176,7 @@
               <w14:ligatures w14:val="standardContextual"/>
             </w:rPr>
           </w:pPr>
-          <w:hyperlink w:anchor="_Toc242908868" w:history="1">
+          <w:hyperlink w:anchor="_Toc243992780" w:history="1">
             <w:r>
               <w:rPr>
                 <w:rStyle w:val="Hyperlink"/>
@@ -5915,7 +6203,7 @@
                 <w:noProof/>
                 <w:webHidden/>
               </w:rPr>
-              <w:instrText xml:space="preserve"> PAGEREF _Toc242908868 \h </w:instrText>
+              <w:instrText xml:space="preserve"> PAGEREF _Toc243992780 \h </w:instrText>
             </w:r>
             <w:r>
               <w:rPr>
@@ -5962,7 +6250,7 @@
               <w14:ligatures w14:val="standardContextual"/>
             </w:rPr>
           </w:pPr>
-          <w:hyperlink w:anchor="_Toc242908869" w:history="1">
+          <w:hyperlink w:anchor="_Toc243992781" w:history="1">
             <w:r>
               <w:rPr>
                 <w:rStyle w:val="Hyperlink"/>
@@ -5989,7 +6277,7 @@
                 <w:noProof/>
                 <w:webHidden/>
               </w:rPr>
-              <w:instrText xml:space="preserve"> PAGEREF _Toc242908869 \h </w:instrText>
+              <w:instrText xml:space="preserve"> PAGEREF _Toc243992781 \h </w:instrText>
             </w:r>
             <w:r>
               <w:rPr>
@@ -6036,7 +6324,7 @@
               <w14:ligatures w14:val="standardContextual"/>
             </w:rPr>
           </w:pPr>
-          <w:hyperlink w:anchor="_Toc242908870" w:history="1">
+          <w:hyperlink w:anchor="_Toc243992782" w:history="1">
             <w:r>
               <w:rPr>
                 <w:rStyle w:val="Hyperlink"/>
@@ -6063,7 +6351,7 @@
                 <w:noProof/>
                 <w:webHidden/>
               </w:rPr>
-              <w:instrText xml:space="preserve"> PAGEREF _Toc242908870 \h </w:instrText>
+              <w:instrText xml:space="preserve"> PAGEREF _Toc243992782 \h </w:instrText>
             </w:r>
             <w:r>
               <w:rPr>
@@ -6110,7 +6398,7 @@
               <w14:ligatures w14:val="standardContextual"/>
             </w:rPr>
           </w:pPr>
-          <w:hyperlink w:anchor="_Toc242908871" w:history="1">
+          <w:hyperlink w:anchor="_Toc243992783" w:history="1">
             <w:r>
               <w:rPr>
                 <w:rStyle w:val="Hyperlink"/>
@@ -6137,7 +6425,7 @@
                 <w:noProof/>
                 <w:webHidden/>
               </w:rPr>
-              <w:instrText xml:space="preserve"> PAGEREF _Toc242908871 \h </w:instrText>
+              <w:instrText xml:space="preserve"> PAGEREF _Toc243992783 \h </w:instrText>
             </w:r>
             <w:r>
               <w:rPr>
@@ -6184,7 +6472,7 @@
               <w14:ligatures w14:val="standardContextual"/>
             </w:rPr>
           </w:pPr>
-          <w:hyperlink w:anchor="_Toc242908872" w:history="1">
+          <w:hyperlink w:anchor="_Toc243992784" w:history="1">
             <w:r>
               <w:rPr>
                 <w:rStyle w:val="Hyperlink"/>
@@ -6211,7 +6499,7 @@
                 <w:noProof/>
                 <w:webHidden/>
               </w:rPr>
-              <w:instrText xml:space="preserve"> PAGEREF _Toc242908872 \h </w:instrText>
+              <w:instrText xml:space="preserve"> PAGEREF _Toc243992784 \h </w:instrText>
             </w:r>
             <w:r>
               <w:rPr>
@@ -6258,7 +6546,7 @@
               <w14:ligatures w14:val="standardContextual"/>
             </w:rPr>
           </w:pPr>
-          <w:hyperlink w:anchor="_Toc242908873" w:history="1">
+          <w:hyperlink w:anchor="_Toc243992785" w:history="1">
             <w:r>
               <w:rPr>
                 <w:rStyle w:val="Hyperlink"/>
@@ -6285,7 +6573,7 @@
                 <w:noProof/>
                 <w:webHidden/>
               </w:rPr>
-              <w:instrText xml:space="preserve"> PAGEREF _Toc242908873 \h </w:instrText>
+              <w:instrText xml:space="preserve"> PAGEREF _Toc243992785 \h </w:instrText>
             </w:r>
             <w:r>
               <w:rPr>
@@ -6332,7 +6620,7 @@
               <w14:ligatures w14:val="standardContextual"/>
             </w:rPr>
           </w:pPr>
-          <w:hyperlink w:anchor="_Toc242908874" w:history="1">
+          <w:hyperlink w:anchor="_Toc243992786" w:history="1">
             <w:r>
               <w:rPr>
                 <w:rStyle w:val="Hyperlink"/>
@@ -6359,7 +6647,7 @@
                 <w:noProof/>
                 <w:webHidden/>
               </w:rPr>
-              <w:instrText xml:space="preserve"> PAGEREF _Toc242908874 \h </w:instrText>
+              <w:instrText xml:space="preserve"> PAGEREF _Toc243992786 \h </w:instrText>
             </w:r>
             <w:r>
               <w:rPr>
@@ -6406,7 +6694,7 @@
               <w14:ligatures w14:val="standardContextual"/>
             </w:rPr>
           </w:pPr>
-          <w:hyperlink w:anchor="_Toc242908875" w:history="1">
+          <w:hyperlink w:anchor="_Toc243992787" w:history="1">
             <w:r>
               <w:rPr>
                 <w:rStyle w:val="Hyperlink"/>
@@ -6433,7 +6721,7 @@
                 <w:noProof/>
                 <w:webHidden/>
               </w:rPr>
-              <w:instrText xml:space="preserve"> PAGEREF _Toc242908875 \h </w:instrText>
+              <w:instrText xml:space="preserve"> PAGEREF _Toc243992787 \h </w:instrText>
             </w:r>
             <w:r>
               <w:rPr>
@@ -6480,7 +6768,7 @@
               <w14:ligatures w14:val="standardContextual"/>
             </w:rPr>
           </w:pPr>
-          <w:hyperlink w:anchor="_Toc242908876" w:history="1">
+          <w:hyperlink w:anchor="_Toc243992788" w:history="1">
             <w:r>
               <w:rPr>
                 <w:rStyle w:val="Hyperlink"/>
@@ -6507,7 +6795,7 @@
                 <w:noProof/>
                 <w:webHidden/>
               </w:rPr>
-              <w:instrText xml:space="preserve"> PAGEREF _Toc242908876 \h </w:instrText>
+              <w:instrText xml:space="preserve"> PAGEREF _Toc243992788 \h </w:instrText>
             </w:r>
             <w:r>
               <w:rPr>
@@ -6554,7 +6842,7 @@
               <w14:ligatures w14:val="standardContextual"/>
             </w:rPr>
           </w:pPr>
-          <w:hyperlink w:anchor="_Toc242908877" w:history="1">
+          <w:hyperlink w:anchor="_Toc243992789" w:history="1">
             <w:r>
               <w:rPr>
                 <w:rStyle w:val="Hyperlink"/>
@@ -6581,7 +6869,7 @@
                 <w:noProof/>
                 <w:webHidden/>
               </w:rPr>
-              <w:instrText xml:space="preserve"> PAGEREF _Toc242908877 \h </w:instrText>
+              <w:instrText xml:space="preserve"> PAGEREF _Toc243992789 \h </w:instrText>
             </w:r>
             <w:r>
               <w:rPr>
@@ -6628,7 +6916,7 @@
               <w14:ligatures w14:val="standardContextual"/>
             </w:rPr>
           </w:pPr>
-          <w:hyperlink w:anchor="_Toc242908878" w:history="1">
+          <w:hyperlink w:anchor="_Toc243992790" w:history="1">
             <w:r>
               <w:rPr>
                 <w:rStyle w:val="Hyperlink"/>
@@ -6655,7 +6943,7 @@
                 <w:noProof/>
                 <w:webHidden/>
               </w:rPr>
-              <w:instrText xml:space="preserve"> PAGEREF _Toc242908878 \h </w:instrText>
+              <w:instrText xml:space="preserve"> PAGEREF _Toc243992790 \h </w:instrText>
             </w:r>
             <w:r>
               <w:rPr>
@@ -6702,7 +6990,7 @@
               <w14:ligatures w14:val="standardContextual"/>
             </w:rPr>
           </w:pPr>
-          <w:hyperlink w:anchor="_Toc242908879" w:history="1">
+          <w:hyperlink w:anchor="_Toc243992791" w:history="1">
             <w:r>
               <w:rPr>
                 <w:rStyle w:val="Hyperlink"/>
@@ -6729,7 +7017,7 @@
                 <w:noProof/>
                 <w:webHidden/>
               </w:rPr>
-              <w:instrText xml:space="preserve"> PAGEREF _Toc242908879 \h </w:instrText>
+              <w:instrText xml:space="preserve"> PAGEREF _Toc243992791 \h </w:instrText>
             </w:r>
             <w:r>
               <w:rPr>
@@ -6776,7 +7064,7 @@
               <w14:ligatures w14:val="standardContextual"/>
             </w:rPr>
           </w:pPr>
-          <w:hyperlink w:anchor="_Toc242908880" w:history="1">
+          <w:hyperlink w:anchor="_Toc243992792" w:history="1">
             <w:r>
               <w:rPr>
                 <w:rStyle w:val="Hyperlink"/>
@@ -6803,7 +7091,7 @@
                 <w:noProof/>
                 <w:webHidden/>
               </w:rPr>
-              <w:instrText xml:space="preserve"> PAGEREF _Toc242908880 \h </w:instrText>
+              <w:instrText xml:space="preserve"> PAGEREF _Toc243992792 \h </w:instrText>
             </w:r>
             <w:r>
               <w:rPr>
@@ -6850,7 +7138,7 @@
               <w14:ligatures w14:val="standardContextual"/>
             </w:rPr>
           </w:pPr>
-          <w:hyperlink w:anchor="_Toc242908881" w:history="1">
+          <w:hyperlink w:anchor="_Toc243992793" w:history="1">
             <w:r>
               <w:rPr>
                 <w:rStyle w:val="Hyperlink"/>
@@ -6877,7 +7165,7 @@
                 <w:noProof/>
                 <w:webHidden/>
               </w:rPr>
-              <w:instrText xml:space="preserve"> PAGEREF _Toc242908881 \h </w:instrText>
+              <w:instrText xml:space="preserve"> PAGEREF _Toc243992793 \h </w:instrText>
             </w:r>
             <w:r>
               <w:rPr>
@@ -6924,7 +7212,7 @@
               <w14:ligatures w14:val="standardContextual"/>
             </w:rPr>
           </w:pPr>
-          <w:hyperlink w:anchor="_Toc242908882" w:history="1">
+          <w:hyperlink w:anchor="_Toc243992794" w:history="1">
             <w:r>
               <w:rPr>
                 <w:rStyle w:val="Hyperlink"/>
@@ -6951,7 +7239,7 @@
                 <w:noProof/>
                 <w:webHidden/>
               </w:rPr>
-              <w:instrText xml:space="preserve"> PAGEREF _Toc242908882 \h </w:instrText>
+              <w:instrText xml:space="preserve"> PAGEREF _Toc243992794 \h </w:instrText>
             </w:r>
             <w:r>
               <w:rPr>
@@ -6995,7 +7283,7 @@
               <w14:ligatures w14:val="standardContextual"/>
             </w:rPr>
           </w:pPr>
-          <w:hyperlink w:anchor="_Toc242908883" w:history="1">
+          <w:hyperlink w:anchor="_Toc243992795" w:history="1">
             <w:r>
               <w:rPr>
                 <w:rStyle w:val="Hyperlink"/>
@@ -7018,7 +7306,7 @@
               <w:rPr>
                 <w:webHidden/>
               </w:rPr>
-              <w:instrText xml:space="preserve"> PAGEREF _Toc242908883 \h </w:instrText>
+              <w:instrText xml:space="preserve"> PAGEREF _Toc243992795 \h </w:instrText>
             </w:r>
             <w:r>
               <w:rPr>
@@ -7061,7 +7349,7 @@
               <w14:ligatures w14:val="standardContextual"/>
             </w:rPr>
           </w:pPr>
-          <w:hyperlink w:anchor="_Toc242908884" w:history="1">
+          <w:hyperlink w:anchor="_Toc243992796" w:history="1">
             <w:r>
               <w:rPr>
                 <w:rStyle w:val="Hyperlink"/>
@@ -7088,7 +7376,7 @@
                 <w:noProof/>
                 <w:webHidden/>
               </w:rPr>
-              <w:instrText xml:space="preserve"> PAGEREF _Toc242908884 \h </w:instrText>
+              <w:instrText xml:space="preserve"> PAGEREF _Toc243992796 \h </w:instrText>
             </w:r>
             <w:r>
               <w:rPr>
@@ -7135,7 +7423,7 @@
               <w14:ligatures w14:val="standardContextual"/>
             </w:rPr>
           </w:pPr>
-          <w:hyperlink w:anchor="_Toc242908885" w:history="1">
+          <w:hyperlink w:anchor="_Toc243992797" w:history="1">
             <w:r>
               <w:rPr>
                 <w:rStyle w:val="Hyperlink"/>
@@ -7162,7 +7450,7 @@
                 <w:noProof/>
                 <w:webHidden/>
               </w:rPr>
-              <w:instrText xml:space="preserve"> PAGEREF _Toc242908885 \h </w:instrText>
+              <w:instrText xml:space="preserve"> PAGEREF _Toc243992797 \h </w:instrText>
             </w:r>
             <w:r>
               <w:rPr>
@@ -7209,7 +7497,7 @@
               <w14:ligatures w14:val="standardContextual"/>
             </w:rPr>
           </w:pPr>
-          <w:hyperlink w:anchor="_Toc242908886" w:history="1">
+          <w:hyperlink w:anchor="_Toc243992798" w:history="1">
             <w:r>
               <w:rPr>
                 <w:rStyle w:val="Hyperlink"/>
@@ -7236,7 +7524,7 @@
                 <w:noProof/>
                 <w:webHidden/>
               </w:rPr>
-              <w:instrText xml:space="preserve"> PAGEREF _Toc242908886 \h </w:instrText>
+              <w:instrText xml:space="preserve"> PAGEREF _Toc243992798 \h </w:instrText>
             </w:r>
             <w:r>
               <w:rPr>
@@ -7280,7 +7568,7 @@
               <w14:ligatures w14:val="standardContextual"/>
             </w:rPr>
           </w:pPr>
-          <w:hyperlink w:anchor="_Toc242908887" w:history="1">
+          <w:hyperlink w:anchor="_Toc243992799" w:history="1">
             <w:r>
               <w:rPr>
                 <w:rStyle w:val="Hyperlink"/>
@@ -7303,7 +7591,7 @@
               <w:rPr>
                 <w:webHidden/>
               </w:rPr>
-              <w:instrText xml:space="preserve"> PAGEREF _Toc242908887 \h </w:instrText>
+              <w:instrText xml:space="preserve"> PAGEREF _Toc243992799 \h </w:instrText>
             </w:r>
             <w:r>
               <w:rPr>
@@ -7346,7 +7634,7 @@
               <w14:ligatures w14:val="standardContextual"/>
             </w:rPr>
           </w:pPr>
-          <w:hyperlink w:anchor="_Toc242908888" w:history="1">
+          <w:hyperlink w:anchor="_Toc243992800" w:history="1">
             <w:r>
               <w:rPr>
                 <w:rStyle w:val="Hyperlink"/>
@@ -7373,7 +7661,7 @@
                 <w:noProof/>
                 <w:webHidden/>
               </w:rPr>
-              <w:instrText xml:space="preserve"> PAGEREF _Toc242908888 \h </w:instrText>
+              <w:instrText xml:space="preserve"> PAGEREF _Toc243992800 \h </w:instrText>
             </w:r>
             <w:r>
               <w:rPr>
@@ -7420,7 +7708,7 @@
               <w14:ligatures w14:val="standardContextual"/>
             </w:rPr>
           </w:pPr>
-          <w:hyperlink w:anchor="_Toc242908889" w:history="1">
+          <w:hyperlink w:anchor="_Toc243992801" w:history="1">
             <w:r>
               <w:rPr>
                 <w:rStyle w:val="Hyperlink"/>
@@ -7447,7 +7735,7 @@
                 <w:noProof/>
                 <w:webHidden/>
               </w:rPr>
-              <w:instrText xml:space="preserve"> PAGEREF _Toc242908889 \h </w:instrText>
+              <w:instrText xml:space="preserve"> PAGEREF _Toc243992801 \h </w:instrText>
             </w:r>
             <w:r>
               <w:rPr>
@@ -7494,7 +7782,7 @@
               <w14:ligatures w14:val="standardContextual"/>
             </w:rPr>
           </w:pPr>
-          <w:hyperlink w:anchor="_Toc242908890" w:history="1">
+          <w:hyperlink w:anchor="_Toc243992802" w:history="1">
             <w:r>
               <w:rPr>
                 <w:rStyle w:val="Hyperlink"/>
@@ -7521,7 +7809,7 @@
                 <w:noProof/>
                 <w:webHidden/>
               </w:rPr>
-              <w:instrText xml:space="preserve"> PAGEREF _Toc242908890 \h </w:instrText>
+              <w:instrText xml:space="preserve"> PAGEREF _Toc243992802 \h </w:instrText>
             </w:r>
             <w:r>
               <w:rPr>
@@ -7568,7 +7856,7 @@
               <w14:ligatures w14:val="standardContextual"/>
             </w:rPr>
           </w:pPr>
-          <w:hyperlink w:anchor="_Toc242908891" w:history="1">
+          <w:hyperlink w:anchor="_Toc243992803" w:history="1">
             <w:r>
               <w:rPr>
                 <w:rStyle w:val="Hyperlink"/>
@@ -7595,7 +7883,7 @@
                 <w:noProof/>
                 <w:webHidden/>
               </w:rPr>
-              <w:instrText xml:space="preserve"> PAGEREF _Toc242908891 \h </w:instrText>
+              <w:instrText xml:space="preserve"> PAGEREF _Toc243992803 \h </w:instrText>
             </w:r>
             <w:r>
               <w:rPr>
@@ -7615,7 +7903,7 @@
                 <w:noProof/>
                 <w:webHidden/>
               </w:rPr>
-              <w:t>52</w:t>
+              <w:t>53</w:t>
             </w:r>
             <w:r>
               <w:rPr>
@@ -7642,13 +7930,13 @@
               <w14:ligatures w14:val="standardContextual"/>
             </w:rPr>
           </w:pPr>
-          <w:hyperlink w:anchor="_Toc242908892" w:history="1">
+          <w:hyperlink w:anchor="_Toc243992804" w:history="1">
             <w:r>
               <w:rPr>
                 <w:rStyle w:val="Hyperlink"/>
                 <w:noProof/>
               </w:rPr>
-              <w:t>6.5 Cálculo dos Indicadores</w:t>
+              <w:t>6.5 Roteiros, Planos e Ordens de Produção</w:t>
             </w:r>
             <w:r>
               <w:rPr>
@@ -7669,7 +7957,7 @@
                 <w:noProof/>
                 <w:webHidden/>
               </w:rPr>
-              <w:instrText xml:space="preserve"> PAGEREF _Toc242908892 \h </w:instrText>
+              <w:instrText xml:space="preserve"> PAGEREF _Toc243992804 \h </w:instrText>
             </w:r>
             <w:r>
               <w:rPr>
@@ -7716,13 +8004,13 @@
               <w14:ligatures w14:val="standardContextual"/>
             </w:rPr>
           </w:pPr>
-          <w:hyperlink w:anchor="_Toc242908893" w:history="1">
+          <w:hyperlink w:anchor="_Toc243992805" w:history="1">
             <w:r>
               <w:rPr>
                 <w:rStyle w:val="Hyperlink"/>
                 <w:noProof/>
               </w:rPr>
-              <w:t>6.6 Testes e Publicação</w:t>
+              <w:t>6.6 Ilha de Apontamento</w:t>
             </w:r>
             <w:r>
               <w:rPr>
@@ -7743,7 +8031,7 @@
                 <w:noProof/>
                 <w:webHidden/>
               </w:rPr>
-              <w:instrText xml:space="preserve"> PAGEREF _Toc242908893 \h </w:instrText>
+              <w:instrText xml:space="preserve"> PAGEREF _Toc243992805 \h </w:instrText>
             </w:r>
             <w:r>
               <w:rPr>
@@ -7763,7 +8051,7 @@
                 <w:noProof/>
                 <w:webHidden/>
               </w:rPr>
-              <w:t>55</w:t>
+              <w:t>56</w:t>
             </w:r>
             <w:r>
               <w:rPr>
@@ -7790,13 +8078,13 @@
               <w14:ligatures w14:val="standardContextual"/>
             </w:rPr>
           </w:pPr>
-          <w:hyperlink w:anchor="_Toc242908894" w:history="1">
+          <w:hyperlink w:anchor="_Toc243992806" w:history="1">
             <w:r>
               <w:rPr>
                 <w:rStyle w:val="Hyperlink"/>
                 <w:noProof/>
               </w:rPr>
-              <w:t>6.7 Situação Atual da Implementação</w:t>
+              <w:t>6.7 Indicadores</w:t>
             </w:r>
             <w:r>
               <w:rPr>
@@ -7817,7 +8105,7 @@
                 <w:noProof/>
                 <w:webHidden/>
               </w:rPr>
-              <w:instrText xml:space="preserve"> PAGEREF _Toc242908894 \h </w:instrText>
+              <w:instrText xml:space="preserve"> PAGEREF _Toc243992806 \h </w:instrText>
             </w:r>
             <w:r>
               <w:rPr>
@@ -7837,7 +8125,155 @@
                 <w:noProof/>
                 <w:webHidden/>
               </w:rPr>
-              <w:t>55</w:t>
+              <w:t>58</w:t>
+            </w:r>
+            <w:r>
+              <w:rPr>
+                <w:noProof/>
+                <w:webHidden/>
+              </w:rPr>
+              <w:fldChar w:fldCharType="end"/>
+            </w:r>
+          </w:hyperlink>
+        </w:p>
+        <w:p>
+          <w:pPr>
+            <w:pStyle w:val="Sumrio2"/>
+            <w:tabs>
+              <w:tab w:val="right" w:leader="dot" w:pos="9061"/>
+            </w:tabs>
+            <w:rPr>
+              <w:rFonts w:asciiTheme="minorHAnsi" w:eastAsiaTheme="minorEastAsia" w:hAnsiTheme="minorHAnsi"/>
+              <w:noProof/>
+              <w:kern w:val="2"/>
+              <w:sz w:val="24"/>
+              <w:szCs w:val="24"/>
+              <w:lang w:eastAsia="pt-BR"/>
+              <w14:ligatures w14:val="standardContextual"/>
+            </w:rPr>
+          </w:pPr>
+          <w:hyperlink w:anchor="_Toc243992807" w:history="1">
+            <w:r>
+              <w:rPr>
+                <w:rStyle w:val="Hyperlink"/>
+                <w:noProof/>
+              </w:rPr>
+              <w:t>6.8 Testes e Publicação</w:t>
+            </w:r>
+            <w:r>
+              <w:rPr>
+                <w:noProof/>
+                <w:webHidden/>
+              </w:rPr>
+              <w:tab/>
+            </w:r>
+            <w:r>
+              <w:rPr>
+                <w:noProof/>
+                <w:webHidden/>
+              </w:rPr>
+              <w:fldChar w:fldCharType="begin"/>
+            </w:r>
+            <w:r>
+              <w:rPr>
+                <w:noProof/>
+                <w:webHidden/>
+              </w:rPr>
+              <w:instrText xml:space="preserve"> PAGEREF _Toc243992807 \h </w:instrText>
+            </w:r>
+            <w:r>
+              <w:rPr>
+                <w:noProof/>
+                <w:webHidden/>
+              </w:rPr>
+            </w:r>
+            <w:r>
+              <w:rPr>
+                <w:noProof/>
+                <w:webHidden/>
+              </w:rPr>
+              <w:fldChar w:fldCharType="separate"/>
+            </w:r>
+            <w:r>
+              <w:rPr>
+                <w:noProof/>
+                <w:webHidden/>
+              </w:rPr>
+              <w:t>60</w:t>
+            </w:r>
+            <w:r>
+              <w:rPr>
+                <w:noProof/>
+                <w:webHidden/>
+              </w:rPr>
+              <w:fldChar w:fldCharType="end"/>
+            </w:r>
+          </w:hyperlink>
+        </w:p>
+        <w:p>
+          <w:pPr>
+            <w:pStyle w:val="Sumrio2"/>
+            <w:tabs>
+              <w:tab w:val="right" w:leader="dot" w:pos="9061"/>
+            </w:tabs>
+            <w:rPr>
+              <w:rFonts w:asciiTheme="minorHAnsi" w:eastAsiaTheme="minorEastAsia" w:hAnsiTheme="minorHAnsi"/>
+              <w:noProof/>
+              <w:kern w:val="2"/>
+              <w:sz w:val="24"/>
+              <w:szCs w:val="24"/>
+              <w:lang w:eastAsia="pt-BR"/>
+              <w14:ligatures w14:val="standardContextual"/>
+            </w:rPr>
+          </w:pPr>
+          <w:hyperlink w:anchor="_Toc243992808" w:history="1">
+            <w:r>
+              <w:rPr>
+                <w:rStyle w:val="Hyperlink"/>
+                <w:noProof/>
+              </w:rPr>
+              <w:t>6.9 Situação Atual da Implementação</w:t>
+            </w:r>
+            <w:r>
+              <w:rPr>
+                <w:noProof/>
+                <w:webHidden/>
+              </w:rPr>
+              <w:tab/>
+            </w:r>
+            <w:r>
+              <w:rPr>
+                <w:noProof/>
+                <w:webHidden/>
+              </w:rPr>
+              <w:fldChar w:fldCharType="begin"/>
+            </w:r>
+            <w:r>
+              <w:rPr>
+                <w:noProof/>
+                <w:webHidden/>
+              </w:rPr>
+              <w:instrText xml:space="preserve"> PAGEREF _Toc243992808 \h </w:instrText>
+            </w:r>
+            <w:r>
+              <w:rPr>
+                <w:noProof/>
+                <w:webHidden/>
+              </w:rPr>
+            </w:r>
+            <w:r>
+              <w:rPr>
+                <w:noProof/>
+                <w:webHidden/>
+              </w:rPr>
+              <w:fldChar w:fldCharType="separate"/>
+            </w:r>
+            <w:r>
+              <w:rPr>
+                <w:noProof/>
+                <w:webHidden/>
+              </w:rPr>
+              <w:t>60</w:t>
             </w:r>
             <w:r>
               <w:rPr>
@@ -7861,7 +8297,7 @@
               <w14:ligatures w14:val="standardContextual"/>
             </w:rPr>
           </w:pPr>
-          <w:hyperlink w:anchor="_Toc242908895" w:history="1">
+          <w:hyperlink w:anchor="_Toc243992809" w:history="1">
             <w:r>
               <w:rPr>
                 <w:rStyle w:val="Hyperlink"/>
@@ -7884,7 +8320,7 @@
               <w:rPr>
                 <w:webHidden/>
               </w:rPr>
-              <w:instrText xml:space="preserve"> PAGEREF _Toc242908895 \h </w:instrText>
+              <w:instrText xml:space="preserve"> PAGEREF _Toc243992809 \h </w:instrText>
             </w:r>
             <w:r>
               <w:rPr>
@@ -7901,7 +8337,7 @@
               <w:rPr>
                 <w:webHidden/>
               </w:rPr>
-              <w:t>57</w:t>
+              <w:t>62</w:t>
             </w:r>
             <w:r>
               <w:rPr>
@@ -7948,7 +8384,7 @@
         <w:pStyle w:val="Ttulo1"/>
         <w:spacing w:after="100" w:afterAutospacing="1" w:line="360" w:lineRule="auto"/>
       </w:pPr>
-      <w:bookmarkStart w:id="0" w:name="_Toc242908841"/>
+      <w:bookmarkStart w:id="0" w:name="_Toc243992753"/>
       <w:r>
         <w:rPr>
           <w:sz w:val="24"/>
@@ -7966,7 +8402,7 @@
           <w:rFonts w:cs="Arial"/>
         </w:rPr>
       </w:pPr>
-      <w:bookmarkStart w:id="1" w:name="_Toc242908842"/>
+      <w:bookmarkStart w:id="1" w:name="_Toc243992754"/>
       <w:r>
         <w:rPr>
           <w:rFonts w:cs="Arial"/>
@@ -8064,7 +8500,7 @@
           <w:rFonts w:cs="Arial"/>
         </w:rPr>
       </w:pPr>
-      <w:bookmarkStart w:id="2" w:name="_Toc242908843"/>
+      <w:bookmarkStart w:id="2" w:name="_Toc243992755"/>
       <w:r>
         <w:rPr>
           <w:rFonts w:cs="Arial"/>
@@ -8102,7 +8538,7 @@
           <w:rFonts w:cs="Arial"/>
         </w:rPr>
       </w:pPr>
-      <w:bookmarkStart w:id="3" w:name="_Toc242908844"/>
+      <w:bookmarkStart w:id="3" w:name="_Toc243992756"/>
       <w:r>
         <w:rPr>
           <w:rFonts w:cs="Arial"/>
@@ -8117,7 +8553,7 @@
         <w:pStyle w:val="Ttulo3"/>
         <w:spacing w:before="100" w:beforeAutospacing="1" w:after="100" w:afterAutospacing="1" w:line="360" w:lineRule="auto"/>
       </w:pPr>
-      <w:bookmarkStart w:id="4" w:name="_Toc242908845"/>
+      <w:bookmarkStart w:id="4" w:name="_Toc243992757"/>
       <w:r>
         <w:t>1.3.1 Objetivo Geral</w:t>
       </w:r>
@@ -8152,7 +8588,7 @@
           <w:i/>
         </w:rPr>
       </w:pPr>
-      <w:bookmarkStart w:id="5" w:name="_Toc242908846"/>
+      <w:bookmarkStart w:id="5" w:name="_Toc243992758"/>
       <w:r>
         <w:t>1.3.2 Objetivos Específicos</w:t>
       </w:r>
@@ -8358,7 +8794,7 @@
           <w:rFonts w:cs="Arial"/>
         </w:rPr>
       </w:pPr>
-      <w:bookmarkStart w:id="6" w:name="_Toc242908847"/>
+      <w:bookmarkStart w:id="6" w:name="_Toc243992759"/>
       <w:r>
         <w:rPr>
           <w:rFonts w:cs="Arial"/>
@@ -8435,7 +8871,7 @@
           <w:rFonts w:cs="Arial"/>
         </w:rPr>
       </w:pPr>
-      <w:bookmarkStart w:id="7" w:name="_Toc242908848"/>
+      <w:bookmarkStart w:id="7" w:name="_Toc243992760"/>
       <w:r>
         <w:rPr>
           <w:rFonts w:cs="Arial"/>
@@ -8604,7 +9040,7 @@
           <w:sz w:val="24"/>
         </w:rPr>
       </w:pPr>
-      <w:bookmarkStart w:id="8" w:name="_Toc242908849"/>
+      <w:bookmarkStart w:id="8" w:name="_Toc243992761"/>
       <w:r>
         <w:rPr>
           <w:sz w:val="24"/>
@@ -8622,7 +9058,7 @@
           <w:rFonts w:cs="Arial"/>
         </w:rPr>
       </w:pPr>
-      <w:bookmarkStart w:id="9" w:name="_Toc242908850"/>
+      <w:bookmarkStart w:id="9" w:name="_Toc243992762"/>
       <w:r>
         <w:rPr>
           <w:rFonts w:cs="Arial"/>
@@ -8732,7 +9168,7 @@
           <w:rFonts w:cs="Arial"/>
         </w:rPr>
       </w:pPr>
-      <w:bookmarkStart w:id="10" w:name="_Toc242908851"/>
+      <w:bookmarkStart w:id="10" w:name="_Toc243992763"/>
       <w:r>
         <w:rPr>
           <w:rFonts w:cs="Arial"/>
@@ -8868,7 +9304,7 @@
         <w:pStyle w:val="Legenda"/>
         <w:keepNext/>
       </w:pPr>
-      <w:bookmarkStart w:id="11" w:name="_Toc242908896"/>
+      <w:bookmarkStart w:id="11" w:name="_Toc243992810"/>
       <w:r>
         <w:lastRenderedPageBreak/>
         <w:t xml:space="preserve">Figura </w:t>
@@ -8909,7 +9345,7 @@
           <w:noProof/>
         </w:rPr>
         <w:drawing>
-          <wp:inline distT="0" distB="0" distL="0" distR="0" wp14:anchorId="44ED1852" wp14:editId="56CAD4E2">
+          <wp:inline distT="0" distB="0" distL="0" distR="0" wp14:anchorId="2BD4F817" wp14:editId="243E67B8">
             <wp:extent cx="5486400" cy="2022437"/>
             <wp:effectExtent l="0" t="0" r="0" b="0"/>
             <wp:docPr id="101" name="fig_gargalo"/>
@@ -8981,7 +9417,7 @@
           <w:rFonts w:cs="Arial"/>
         </w:rPr>
       </w:pPr>
-      <w:bookmarkStart w:id="12" w:name="_Toc242908852"/>
+      <w:bookmarkStart w:id="12" w:name="_Toc243992764"/>
       <w:r>
         <w:rPr>
           <w:rFonts w:cs="Arial"/>
@@ -9097,7 +9533,7 @@
         <w:pStyle w:val="Legenda"/>
         <w:keepNext/>
       </w:pPr>
-      <w:bookmarkStart w:id="13" w:name="_Toc242908897"/>
+      <w:bookmarkStart w:id="13" w:name="_Toc243992811"/>
       <w:r>
         <w:t xml:space="preserve">Figura </w:t>
       </w:r>
@@ -9137,7 +9573,7 @@
           <w:noProof/>
         </w:rPr>
         <w:drawing>
-          <wp:inline distT="0" distB="0" distL="0" distR="0" wp14:anchorId="3E55CCCD" wp14:editId="7C9EA11F">
+          <wp:inline distT="0" distB="0" distL="0" distR="0" wp14:anchorId="091DBDC3" wp14:editId="550592FE">
             <wp:extent cx="5486400" cy="2051249"/>
             <wp:effectExtent l="0" t="0" r="0" b="0"/>
             <wp:docPr id="102" name="fig_nivelamento"/>
@@ -9205,7 +9641,7 @@
           <w:rFonts w:cs="Arial"/>
         </w:rPr>
       </w:pPr>
-      <w:bookmarkStart w:id="14" w:name="_Toc242908853"/>
+      <w:bookmarkStart w:id="14" w:name="_Toc243992765"/>
       <w:r>
         <w:rPr>
           <w:rFonts w:cs="Arial"/>
@@ -9326,7 +9762,7 @@
           <w:lang w:val="en-US"/>
         </w:rPr>
       </w:pPr>
-      <w:bookmarkStart w:id="15" w:name="_Toc242908854"/>
+      <w:bookmarkStart w:id="15" w:name="_Toc243992766"/>
       <w:r>
         <w:rPr>
           <w:rFonts w:cs="Arial"/>
@@ -9536,7 +9972,7 @@
         <w:pStyle w:val="Legenda"/>
         <w:keepNext/>
       </w:pPr>
-      <w:bookmarkStart w:id="16" w:name="_Toc242908898"/>
+      <w:bookmarkStart w:id="16" w:name="_Toc243992812"/>
       <w:r>
         <w:t xml:space="preserve">Figura </w:t>
       </w:r>
@@ -9576,7 +10012,7 @@
           <w:noProof/>
         </w:rPr>
         <w:drawing>
-          <wp:inline distT="0" distB="0" distL="0" distR="0" wp14:anchorId="6C981B7E" wp14:editId="2263AD15">
+          <wp:inline distT="0" distB="0" distL="0" distR="0" wp14:anchorId="51E4FA1B" wp14:editId="585BC3DC">
             <wp:extent cx="5486400" cy="3543069"/>
             <wp:effectExtent l="0" t="0" r="0" b="0"/>
             <wp:docPr id="103" name="fig_mes"/>
@@ -9644,7 +10080,7 @@
           <w:rFonts w:cs="Arial"/>
         </w:rPr>
       </w:pPr>
-      <w:bookmarkStart w:id="17" w:name="_Toc242908855"/>
+      <w:bookmarkStart w:id="17" w:name="_Toc243992767"/>
       <w:r>
         <w:rPr>
           <w:rFonts w:cs="Arial"/>
@@ -9834,7 +10270,7 @@
           <w:rFonts w:cs="Arial"/>
         </w:rPr>
       </w:pPr>
-      <w:bookmarkStart w:id="18" w:name="_Toc242908856"/>
+      <w:bookmarkStart w:id="18" w:name="_Toc243992768"/>
       <w:r>
         <w:rPr>
           <w:rFonts w:cs="Arial"/>
@@ -10035,7 +10471,7 @@
         <w:pStyle w:val="Legenda"/>
         <w:keepNext/>
       </w:pPr>
-      <w:bookmarkStart w:id="19" w:name="_Toc242908899"/>
+      <w:bookmarkStart w:id="19" w:name="_Toc243992813"/>
       <w:r>
         <w:t xml:space="preserve">Figura </w:t>
       </w:r>
@@ -10075,7 +10511,7 @@
           <w:noProof/>
         </w:rPr>
         <w:drawing>
-          <wp:inline distT="0" distB="0" distL="0" distR="0" wp14:anchorId="64F3BF4A" wp14:editId="75FE70B7">
+          <wp:inline distT="0" distB="0" distL="0" distR="0" wp14:anchorId="5375B7E5" wp14:editId="661CB863">
             <wp:extent cx="5486400" cy="1791916"/>
             <wp:effectExtent l="0" t="0" r="0" b="0"/>
             <wp:docPr id="104" name="fig_arq"/>
@@ -10144,7 +10580,7 @@
           <w:u w:val="single"/>
         </w:rPr>
       </w:pPr>
-      <w:bookmarkStart w:id="20" w:name="_Toc242908857"/>
+      <w:bookmarkStart w:id="20" w:name="_Toc243992769"/>
       <w:r>
         <w:rPr>
           <w:rFonts w:cs="Arial"/>
@@ -10258,7 +10694,7 @@
         <w:pStyle w:val="Ttulo2"/>
         <w:spacing w:line="360" w:lineRule="auto"/>
       </w:pPr>
-      <w:bookmarkStart w:id="21" w:name="_Toc242908858"/>
+      <w:bookmarkStart w:id="21" w:name="_Toc243992770"/>
       <w:r>
         <w:t>2.9 Considerações sobre a Utilização de Sistemas para Nivelamento de Processos</w:t>
       </w:r>
@@ -10396,7 +10832,7 @@
           <w:sz w:val="24"/>
         </w:rPr>
       </w:pPr>
-      <w:bookmarkStart w:id="22" w:name="_Toc242908859"/>
+      <w:bookmarkStart w:id="22" w:name="_Toc243992771"/>
       <w:r>
         <w:rPr>
           <w:sz w:val="24"/>
@@ -10415,7 +10851,7 @@
           <w:szCs w:val="24"/>
         </w:rPr>
       </w:pPr>
-      <w:bookmarkStart w:id="23" w:name="_Toc242908860"/>
+      <w:bookmarkStart w:id="23" w:name="_Toc243992772"/>
       <w:r>
         <w:rPr>
           <w:rFonts w:cs="Arial"/>
@@ -10521,7 +10957,7 @@
         <w:pStyle w:val="Ttulo2"/>
         <w:spacing w:line="360" w:lineRule="auto"/>
       </w:pPr>
-      <w:bookmarkStart w:id="24" w:name="_Toc242908861"/>
+      <w:bookmarkStart w:id="24" w:name="_Toc243992773"/>
       <w:r>
         <w:t>3.2 Métodos Utilizados</w:t>
       </w:r>
@@ -10791,7 +11227,7 @@
         <w:pStyle w:val="Ttulo2"/>
         <w:spacing w:before="100" w:beforeAutospacing="1" w:after="100" w:afterAutospacing="1" w:line="360" w:lineRule="auto"/>
       </w:pPr>
-      <w:bookmarkStart w:id="25" w:name="_Toc242908862"/>
+      <w:bookmarkStart w:id="25" w:name="_Toc243992774"/>
       <w:r>
         <w:t>3.3 Ferramentas e Tecnologias Utilizadas</w:t>
       </w:r>
@@ -10802,7 +11238,7 @@
         <w:pStyle w:val="Ttulo3"/>
         <w:spacing w:before="100" w:beforeAutospacing="1" w:after="100" w:afterAutospacing="1" w:line="360" w:lineRule="auto"/>
       </w:pPr>
-      <w:bookmarkStart w:id="26" w:name="_Toc242908863"/>
+      <w:bookmarkStart w:id="26" w:name="_Toc243992775"/>
       <w:r>
         <w:t>3.3.1 Linguagens de Programação</w:t>
       </w:r>
@@ -11025,7 +11461,7 @@
         <w:pStyle w:val="Ttulo3"/>
         <w:spacing w:line="360" w:lineRule="auto"/>
       </w:pPr>
-      <w:bookmarkStart w:id="27" w:name="_Toc242908864"/>
+      <w:bookmarkStart w:id="27" w:name="_Toc243992776"/>
       <w:r>
         <w:lastRenderedPageBreak/>
         <w:t>3.3.2 Framework</w:t>
@@ -11202,7 +11638,7 @@
         <w:pStyle w:val="Ttulo3"/>
         <w:spacing w:line="360" w:lineRule="auto"/>
       </w:pPr>
-      <w:bookmarkStart w:id="28" w:name="_Toc242908865"/>
+      <w:bookmarkStart w:id="28" w:name="_Toc243992777"/>
       <w:r>
         <w:t>3.3.3 Banco de Dados</w:t>
       </w:r>
@@ -11292,7 +11728,7 @@
       <w:pPr>
         <w:pStyle w:val="Ttulo2"/>
       </w:pPr>
-      <w:bookmarkStart w:id="29" w:name="_Toc242908866"/>
+      <w:bookmarkStart w:id="29" w:name="_Toc243992778"/>
       <w:r>
         <w:lastRenderedPageBreak/>
         <w:t>3.4 Etapas do Desenvolvimento</w:t>
@@ -11619,7 +12055,7 @@
           <w:sz w:val="24"/>
         </w:rPr>
       </w:pPr>
-      <w:bookmarkStart w:id="30" w:name="_Toc242908867"/>
+      <w:bookmarkStart w:id="30" w:name="_Toc243992779"/>
       <w:r>
         <w:rPr>
           <w:sz w:val="24"/>
@@ -11633,7 +12069,7 @@
       <w:pPr>
         <w:pStyle w:val="Ttulo2"/>
       </w:pPr>
-      <w:bookmarkStart w:id="31" w:name="_Toc242908868"/>
+      <w:bookmarkStart w:id="31" w:name="_Toc243992780"/>
       <w:r>
         <w:t>4.1 Descrição do Problema</w:t>
       </w:r>
@@ -11744,7 +12180,7 @@
         <w:pStyle w:val="Ttulo2"/>
         <w:spacing w:line="360" w:lineRule="auto"/>
       </w:pPr>
-      <w:bookmarkStart w:id="32" w:name="_Toc242908869"/>
+      <w:bookmarkStart w:id="32" w:name="_Toc243992781"/>
       <w:r>
         <w:lastRenderedPageBreak/>
         <w:t>4.2 Requisitos Funcionais</w:t>
@@ -11756,7 +12192,7 @@
         <w:pStyle w:val="Ttulo3"/>
         <w:spacing w:line="360" w:lineRule="auto"/>
       </w:pPr>
-      <w:bookmarkStart w:id="33" w:name="_Toc242908870"/>
+      <w:bookmarkStart w:id="33" w:name="_Toc243992782"/>
       <w:r>
         <w:t>4.2.1 Requisitos Funcionais da Tela de Login</w:t>
       </w:r>
@@ -11787,7 +12223,7 @@
         <w:pStyle w:val="Legenda"/>
         <w:keepNext/>
       </w:pPr>
-      <w:bookmarkStart w:id="34" w:name="_Toc242908909"/>
+      <w:bookmarkStart w:id="34" w:name="_Toc243992827"/>
       <w:r>
         <w:t xml:space="preserve">Tabela </w:t>
       </w:r>
@@ -12477,7 +12913,7 @@
         <w:pStyle w:val="Ttulo3"/>
         <w:spacing w:line="360" w:lineRule="auto"/>
       </w:pPr>
-      <w:bookmarkStart w:id="35" w:name="_Toc242908871"/>
+      <w:bookmarkStart w:id="35" w:name="_Toc243992783"/>
       <w:r>
         <w:lastRenderedPageBreak/>
         <w:t>4.2.2 Requisitos Funcionais da Tela de Cadastro de Setores</w:t>
@@ -12509,7 +12945,7 @@
         <w:pStyle w:val="Legenda"/>
         <w:keepNext/>
       </w:pPr>
-      <w:bookmarkStart w:id="36" w:name="_Toc242908910"/>
+      <w:bookmarkStart w:id="36" w:name="_Toc243992828"/>
       <w:r>
         <w:t xml:space="preserve">Tabela </w:t>
       </w:r>
@@ -13315,7 +13751,7 @@
         <w:pStyle w:val="Ttulo3"/>
         <w:spacing w:line="360" w:lineRule="auto"/>
       </w:pPr>
-      <w:bookmarkStart w:id="37" w:name="_Toc242908872"/>
+      <w:bookmarkStart w:id="37" w:name="_Toc243992784"/>
       <w:r>
         <w:lastRenderedPageBreak/>
         <w:t xml:space="preserve">4.2.3 Requisitos Funcionais da Tela de Cadastro de </w:t>
@@ -13350,7 +13786,7 @@
         <w:pStyle w:val="Legenda"/>
         <w:keepNext/>
       </w:pPr>
-      <w:bookmarkStart w:id="38" w:name="_Toc242908911"/>
+      <w:bookmarkStart w:id="38" w:name="_Toc243992829"/>
       <w:r>
         <w:t xml:space="preserve">Tabela </w:t>
       </w:r>
@@ -14156,7 +14592,7 @@
         <w:pStyle w:val="Ttulo3"/>
         <w:spacing w:line="360" w:lineRule="auto"/>
       </w:pPr>
-      <w:bookmarkStart w:id="39" w:name="_Toc242908873"/>
+      <w:bookmarkStart w:id="39" w:name="_Toc243992785"/>
       <w:r>
         <w:lastRenderedPageBreak/>
         <w:t>4.2.4 Requisitos Funcionais da Tela de Cadastro de Tarefas</w:t>
@@ -14188,7 +14624,7 @@
         <w:pStyle w:val="Legenda"/>
         <w:keepNext/>
       </w:pPr>
-      <w:bookmarkStart w:id="40" w:name="_Toc242908912"/>
+      <w:bookmarkStart w:id="40" w:name="_Toc243992830"/>
       <w:r>
         <w:t xml:space="preserve">Tabela </w:t>
       </w:r>
@@ -15110,7 +15546,7 @@
         <w:pStyle w:val="Ttulo3"/>
         <w:spacing w:line="360" w:lineRule="auto"/>
       </w:pPr>
-      <w:bookmarkStart w:id="41" w:name="_Toc242908874"/>
+      <w:bookmarkStart w:id="41" w:name="_Toc243992786"/>
       <w:r>
         <w:lastRenderedPageBreak/>
         <w:t>4.2.5 Requisitos Funcionais da Tela de Produtos e Ordens de Produção</w:t>
@@ -15142,7 +15578,7 @@
         <w:pStyle w:val="Legenda"/>
         <w:keepNext/>
       </w:pPr>
-      <w:bookmarkStart w:id="42" w:name="_Toc242908913"/>
+      <w:bookmarkStart w:id="42" w:name="_Toc243992831"/>
       <w:r>
         <w:t xml:space="preserve">Tabela </w:t>
       </w:r>
@@ -15948,7 +16384,7 @@
         <w:pStyle w:val="Ttulo3"/>
         <w:spacing w:line="360" w:lineRule="auto"/>
       </w:pPr>
-      <w:bookmarkStart w:id="43" w:name="_Toc242908875"/>
+      <w:bookmarkStart w:id="43" w:name="_Toc243992787"/>
       <w:r>
         <w:lastRenderedPageBreak/>
         <w:t>4.2.6 Requisitos Funcionais da Tela de Apontamento da Produção</w:t>
@@ -15980,7 +16416,7 @@
         <w:pStyle w:val="Legenda"/>
         <w:keepNext/>
       </w:pPr>
-      <w:bookmarkStart w:id="44" w:name="_Toc242908914"/>
+      <w:bookmarkStart w:id="44" w:name="_Toc243992832"/>
       <w:r>
         <w:t xml:space="preserve">Tabela </w:t>
       </w:r>
@@ -16902,7 +17338,7 @@
         <w:pStyle w:val="Ttulo3"/>
         <w:spacing w:line="360" w:lineRule="auto"/>
       </w:pPr>
-      <w:bookmarkStart w:id="45" w:name="_Toc242908876"/>
+      <w:bookmarkStart w:id="45" w:name="_Toc243992788"/>
       <w:r>
         <w:lastRenderedPageBreak/>
         <w:t>4.2.7 Requisitos Funcionais da Tela de Monitoramento da Produção</w:t>
@@ -16934,7 +17370,7 @@
         <w:pStyle w:val="Legenda"/>
         <w:keepNext/>
       </w:pPr>
-      <w:bookmarkStart w:id="46" w:name="_Toc242908915"/>
+      <w:bookmarkStart w:id="46" w:name="_Toc243992833"/>
       <w:r>
         <w:t xml:space="preserve">Tabela </w:t>
       </w:r>
@@ -17740,7 +18176,7 @@
         <w:pStyle w:val="Ttulo3"/>
         <w:spacing w:line="360" w:lineRule="auto"/>
       </w:pPr>
-      <w:bookmarkStart w:id="47" w:name="_Toc242908877"/>
+      <w:bookmarkStart w:id="47" w:name="_Toc243992789"/>
       <w:r>
         <w:lastRenderedPageBreak/>
         <w:t>4.2.8 Requisitos Funcionais dos Operadores</w:t>
@@ -17772,7 +18208,7 @@
         <w:pStyle w:val="Legenda"/>
         <w:keepNext/>
       </w:pPr>
-      <w:bookmarkStart w:id="48" w:name="_Toc242908916"/>
+      <w:bookmarkStart w:id="48" w:name="_Toc243992834"/>
       <w:r>
         <w:t xml:space="preserve">Tabela </w:t>
       </w:r>
@@ -18578,7 +19014,7 @@
         <w:pStyle w:val="Ttulo3"/>
         <w:spacing w:line="360" w:lineRule="auto"/>
       </w:pPr>
-      <w:bookmarkStart w:id="49" w:name="_Toc242908878"/>
+      <w:bookmarkStart w:id="49" w:name="_Toc243992790"/>
       <w:r>
         <w:lastRenderedPageBreak/>
         <w:t>4.2.9 Requisitos Funcionais dos Motivos de Pausa</w:t>
@@ -18610,7 +19046,7 @@
         <w:pStyle w:val="Legenda"/>
         <w:keepNext/>
       </w:pPr>
-      <w:bookmarkStart w:id="50" w:name="_Toc242908917"/>
+      <w:bookmarkStart w:id="50" w:name="_Toc243992835"/>
       <w:r>
         <w:t xml:space="preserve">Tabela </w:t>
       </w:r>
@@ -19299,7 +19735,7 @@
       <w:pPr>
         <w:pStyle w:val="Ttulo2"/>
       </w:pPr>
-      <w:bookmarkStart w:id="51" w:name="_Toc242908879"/>
+      <w:bookmarkStart w:id="51" w:name="_Toc243992791"/>
       <w:r>
         <w:lastRenderedPageBreak/>
         <w:t>4.3 Requisitos Não Funcionais</w:t>
@@ -19330,7 +19766,7 @@
       <w:pPr>
         <w:pStyle w:val="Ttulo3"/>
       </w:pPr>
-      <w:bookmarkStart w:id="52" w:name="_Toc242908880"/>
+      <w:bookmarkStart w:id="52" w:name="_Toc243992792"/>
       <w:r>
         <w:t>4.3.1 Requisitos Não Funcionais do Sistema</w:t>
       </w:r>
@@ -19361,7 +19797,7 @@
         <w:pStyle w:val="Legenda"/>
         <w:keepNext/>
       </w:pPr>
-      <w:bookmarkStart w:id="53" w:name="_Toc242908918"/>
+      <w:bookmarkStart w:id="53" w:name="_Toc243992836"/>
       <w:r>
         <w:t xml:space="preserve">Tabela </w:t>
       </w:r>
@@ -20537,7 +20973,7 @@
       <w:pPr>
         <w:pStyle w:val="Ttulo2"/>
       </w:pPr>
-      <w:bookmarkStart w:id="54" w:name="_Toc242908881"/>
+      <w:bookmarkStart w:id="54" w:name="_Toc243992793"/>
       <w:r>
         <w:lastRenderedPageBreak/>
         <w:t>4.4 Prototipagem</w:t>
@@ -20846,7 +21282,7 @@
         <w:pStyle w:val="Legenda"/>
         <w:keepNext/>
       </w:pPr>
-      <w:bookmarkStart w:id="55" w:name="_Toc242908900"/>
+      <w:bookmarkStart w:id="55" w:name="_Toc243992814"/>
       <w:r>
         <w:lastRenderedPageBreak/>
         <w:t xml:space="preserve">Figura </w:t>
@@ -20885,7 +21321,7 @@
           <w:noProof/>
         </w:rPr>
         <w:drawing>
-          <wp:inline distT="0" distB="0" distL="0" distR="0" wp14:anchorId="3D371FD5" wp14:editId="06CCF1E5">
+          <wp:inline distT="0" distB="0" distL="0" distR="0" wp14:anchorId="76DA92E4" wp14:editId="3A42285E">
             <wp:extent cx="5669280" cy="2894876"/>
             <wp:effectExtent l="0" t="0" r="0" b="0"/>
             <wp:docPr id="2" name="Picture 2"/>
@@ -20952,7 +21388,7 @@
         <w:pStyle w:val="Legenda"/>
         <w:keepNext/>
       </w:pPr>
-      <w:bookmarkStart w:id="56" w:name="_Toc242908901"/>
+      <w:bookmarkStart w:id="56" w:name="_Toc243992815"/>
       <w:r>
         <w:t xml:space="preserve">Figura </w:t>
       </w:r>
@@ -20996,7 +21432,7 @@
           <w:szCs w:val="18"/>
         </w:rPr>
         <w:drawing>
-          <wp:inline distT="0" distB="0" distL="0" distR="0" wp14:anchorId="7F68848D" wp14:editId="67B2156C">
+          <wp:inline distT="0" distB="0" distL="0" distR="0" wp14:anchorId="17137B96" wp14:editId="6178F05F">
             <wp:extent cx="5669280" cy="2894876"/>
             <wp:effectExtent l="0" t="0" r="0" b="0"/>
             <wp:docPr id="1" name="Picture 3"/>
@@ -21089,7 +21525,7 @@
         <w:pStyle w:val="Legenda"/>
         <w:keepNext/>
       </w:pPr>
-      <w:bookmarkStart w:id="57" w:name="_Toc242908902"/>
+      <w:bookmarkStart w:id="57" w:name="_Toc243992816"/>
       <w:r>
         <w:t xml:space="preserve">Figura </w:t>
       </w:r>
@@ -21127,7 +21563,7 @@
           <w:noProof/>
         </w:rPr>
         <w:drawing>
-          <wp:inline distT="0" distB="0" distL="0" distR="0" wp14:anchorId="35ECC858" wp14:editId="57CEB853">
+          <wp:inline distT="0" distB="0" distL="0" distR="0" wp14:anchorId="77AA6644" wp14:editId="5F224546">
             <wp:extent cx="5669280" cy="2894876"/>
             <wp:effectExtent l="0" t="0" r="0" b="0"/>
             <wp:docPr id="201" name="Imagem 201"/>
@@ -21194,7 +21630,7 @@
         <w:pStyle w:val="Legenda"/>
         <w:keepNext/>
       </w:pPr>
-      <w:bookmarkStart w:id="58" w:name="_Toc242908903"/>
+      <w:bookmarkStart w:id="58" w:name="_Toc243992817"/>
       <w:r>
         <w:t xml:space="preserve">Figura </w:t>
       </w:r>
@@ -21232,7 +21668,7 @@
           <w:noProof/>
         </w:rPr>
         <w:drawing>
-          <wp:inline distT="0" distB="0" distL="0" distR="0" wp14:anchorId="3082389F" wp14:editId="0EC2F7E4">
+          <wp:inline distT="0" distB="0" distL="0" distR="0" wp14:anchorId="40C870F6" wp14:editId="64A261BC">
             <wp:extent cx="5669280" cy="2894876"/>
             <wp:effectExtent l="0" t="0" r="0" b="0"/>
             <wp:docPr id="202" name="Imagem 202"/>
@@ -21308,7 +21744,7 @@
       <w:pPr>
         <w:pStyle w:val="Ttulo2"/>
       </w:pPr>
-      <w:bookmarkStart w:id="59" w:name="_Toc242908882"/>
+      <w:bookmarkStart w:id="59" w:name="_Toc243992794"/>
       <w:r>
         <w:lastRenderedPageBreak/>
         <w:t>4.5 Possível Estrutura do Sistema</w:t>
@@ -21594,7 +22030,7 @@
           <w:sz w:val="24"/>
         </w:rPr>
       </w:pPr>
-      <w:bookmarkStart w:id="60" w:name="_Toc242908883"/>
+      <w:bookmarkStart w:id="60" w:name="_Toc243992795"/>
       <w:r>
         <w:rPr>
           <w:sz w:val="24"/>
@@ -21608,7 +22044,7 @@
       <w:pPr>
         <w:pStyle w:val="Ttulo2"/>
       </w:pPr>
-      <w:bookmarkStart w:id="61" w:name="_Toc242908884"/>
+      <w:bookmarkStart w:id="61" w:name="_Toc243992796"/>
       <w:r>
         <w:t xml:space="preserve">5.1 </w:t>
       </w:r>
@@ -22101,7 +22537,7 @@
         <w:pStyle w:val="Legenda"/>
         <w:keepNext/>
       </w:pPr>
-      <w:bookmarkStart w:id="62" w:name="_Toc242908904"/>
+      <w:bookmarkStart w:id="62" w:name="_Toc243992818"/>
       <w:r>
         <w:t xml:space="preserve">Figura </w:t>
       </w:r>
@@ -22138,7 +22574,7 @@
           <w:noProof/>
         </w:rPr>
         <w:drawing>
-          <wp:inline distT="0" distB="0" distL="0" distR="0" wp14:anchorId="68ACAE48" wp14:editId="43A6F2CC">
+          <wp:inline distT="0" distB="0" distL="0" distR="0" wp14:anchorId="448C575E" wp14:editId="57008478">
             <wp:extent cx="5281879" cy="6811702"/>
             <wp:effectExtent l="0" t="0" r="4445" b="1905"/>
             <wp:docPr id="4" name="Imagem 4"/>
@@ -22235,7 +22671,7 @@
       <w:pPr>
         <w:pStyle w:val="Ttulo2"/>
       </w:pPr>
-      <w:bookmarkStart w:id="63" w:name="_Toc242908885"/>
+      <w:bookmarkStart w:id="63" w:name="_Toc243992797"/>
       <w:r>
         <w:lastRenderedPageBreak/>
         <w:t>5.2 Diagrama de Classes</w:t>
@@ -22384,7 +22820,7 @@
         <w:pStyle w:val="Legenda"/>
         <w:keepNext/>
       </w:pPr>
-      <w:bookmarkStart w:id="64" w:name="_Toc242908905"/>
+      <w:bookmarkStart w:id="64" w:name="_Toc243992819"/>
       <w:r>
         <w:lastRenderedPageBreak/>
         <w:t xml:space="preserve">Figura </w:t>
@@ -22423,7 +22859,7 @@
           <w:noProof/>
         </w:rPr>
         <w:drawing>
-          <wp:inline distT="0" distB="0" distL="0" distR="0" wp14:anchorId="76BD5280" wp14:editId="5812E2E6">
+          <wp:inline distT="0" distB="0" distL="0" distR="0" wp14:anchorId="49E6C8D5" wp14:editId="35B37A08">
             <wp:extent cx="5730167" cy="7070453"/>
             <wp:effectExtent l="0" t="0" r="0" b="0"/>
             <wp:docPr id="203" name="Imagem 203"/>
@@ -22499,7 +22935,7 @@
       <w:pPr>
         <w:pStyle w:val="Ttulo2"/>
       </w:pPr>
-      <w:bookmarkStart w:id="65" w:name="_Toc242908886"/>
+      <w:bookmarkStart w:id="65" w:name="_Toc243992798"/>
       <w:r>
         <w:lastRenderedPageBreak/>
         <w:t>5.3 Diagrama de Casos de Uso</w:t>
@@ -22696,7 +23132,7 @@
         <w:pStyle w:val="Legenda"/>
         <w:keepNext/>
       </w:pPr>
-      <w:bookmarkStart w:id="66" w:name="_Toc242908906"/>
+      <w:bookmarkStart w:id="66" w:name="_Toc243992820"/>
       <w:r>
         <w:lastRenderedPageBreak/>
         <w:t xml:space="preserve">Figura </w:t>
@@ -22735,7 +23171,7 @@
           <w:noProof/>
         </w:rPr>
         <w:drawing>
-          <wp:inline distT="0" distB="0" distL="0" distR="0" wp14:anchorId="679768B2" wp14:editId="36985805">
+          <wp:inline distT="0" distB="0" distL="0" distR="0" wp14:anchorId="415D58E7" wp14:editId="35286126">
             <wp:extent cx="5730167" cy="5203986"/>
             <wp:effectExtent l="0" t="0" r="0" b="0"/>
             <wp:docPr id="204" name="Imagem 204"/>
@@ -22815,7 +23251,7 @@
           <w:sz w:val="24"/>
         </w:rPr>
       </w:pPr>
-      <w:bookmarkStart w:id="67" w:name="_Toc242908887"/>
+      <w:bookmarkStart w:id="67" w:name="_Toc243992799"/>
       <w:r>
         <w:rPr>
           <w:sz w:val="24"/>
@@ -22841,14 +23277,14 @@
           <w:sz w:val="24"/>
           <w:szCs w:val="24"/>
         </w:rPr>
-        <w:t>Este capítulo descreve a implementação do sistema até outubro de 2026, com a organização do código, o acesso ao banco de dados, o acesso administrativo, as telas já construídas, o cálculo dos indicadores e a forma de verificação e de publicação. As funcionalidades que ainda estão em desenvolvimento são indicadas na última seção.</w:t>
+        <w:t>Este capítulo descreve a implementação do sistema até o fim de outubro de 2026, com a organização do código, o acesso ao banco de dados, o acesso administrativo, os cadastros, o planejamento da produção, a ilha de apontamento, os indicadores e a forma de verificação e de publicação. As funcionalidades que ainda estão em desenvolvimento são indicadas na última seção.</w:t>
       </w:r>
     </w:p>
     <w:p>
       <w:pPr>
         <w:pStyle w:val="Ttulo2"/>
       </w:pPr>
-      <w:bookmarkStart w:id="68" w:name="_Toc242908888"/>
+      <w:bookmarkStart w:id="68" w:name="_Toc243992800"/>
       <w:r>
         <w:t>6.1 Organização do Código</w:t>
       </w:r>
@@ -22870,7 +23306,7 @@
           <w:sz w:val="24"/>
           <w:szCs w:val="24"/>
         </w:rPr>
-        <w:t>O sistema foi desenvolvido como uma única aplicação Next.js, que reúne as páginas da interface e as rotas da API. O código foi dividido em módulos de acordo com as funcionalidades: o módulo de acesso trata do login, dos usuários e do painel administrativo; os módulos de operadores e de setores tratam desses cadastros; e o módulo de indicadores reúne os cálculos utilizados no acompanhamento da produção.</w:t>
+        <w:t>O sistema foi desenvolvido como uma única aplicação Next.js, que reúne as páginas da interface e as rotas da API. O código foi dividido em módulos de acordo com as funcionalidades. O módulo de acesso trata do login, dos usuários e do painel administrativo. Há um módulo para cada cadastro: produtos, operações, setores, postos de trabalho, operadores e motivos de pausa. Os módulos de roteiros, de planos de produção e de ordens de produção tratam do planejamento. O módulo de execuções reúne o apontamento feito na ilha de produção, e o módulo de indicadores reúne os cálculos e a tela de acompanhamento da produção.</w:t>
       </w:r>
     </w:p>
     <w:p>
@@ -22888,7 +23324,7 @@
           <w:sz w:val="24"/>
           <w:szCs w:val="24"/>
         </w:rPr>
-        <w:t>Cada módulo é dividido em quatro camadas. A camada de domínio contém as regras de negócio e os cálculos, sem depender da interface nem do banco de dados. A camada de aplicação coordena as ações do sistema, como cadastrar um operador ou consultar os indicadores. A camada de infraestrutura realiza o acesso ao banco de dados, e a camada de apresentação contém as telas e o tratamento das requisições recebidas pela API. Essa separação permite testar as regras de negócio sem a interface e sem o banco e facilita a manutenção do código.</w:t>
+        <w:t>Cada módulo é dividido em quatro camadas. A camada de domínio contém as regras de negócio e os cálculos, sem depender da interface nem do banco de dados. A camada de aplicação coordena as ações do sistema, como cadastrar um operador ou registrar uma pausa. A camada de infraestrutura realiza o acesso ao banco de dados, e a camada de apresentação contém as telas e o tratamento das requisições recebidas pela API. Essa separação permite testar as regras de negócio sem a interface e sem o banco e facilita a manutenção do código.</w:t>
       </w:r>
     </w:p>
     <w:p>
@@ -22913,7 +23349,7 @@
       <w:pPr>
         <w:pStyle w:val="Ttulo2"/>
       </w:pPr>
-      <w:bookmarkStart w:id="69" w:name="_Toc242908889"/>
+      <w:bookmarkStart w:id="69" w:name="_Toc243992801"/>
       <w:r>
         <w:t>6.2 Acesso ao Banco de Dados</w:t>
       </w:r>
@@ -22935,7 +23371,107 @@
           <w:sz w:val="24"/>
           <w:szCs w:val="24"/>
         </w:rPr>
-        <w:t>O modelo de dados apresentado no capítulo 5 foi escrito no contrato do Prisma, a partir do qual são geradas as migrações que criam e alteram as tabelas do banco. As migrações ficam guardadas junto com o código, o que permite recriar o banco em qualquer ambiente e manter o histórico das alterações na sua estrutura. Até o momento foram criadas duas migrações: a primeira com as tabelas da produção e a segunda com a tabela de usuários.</w:t>
+        <w:t xml:space="preserve">O modelo de dados apresentado no capítulo 5 foi escrito no contrato do Prisma, a partir do qual são geradas as migrações que criam e alteram as tabelas do banco. As migrações ficam guardadas junto com o código, o que permite recriar o banco em qualquer ambiente e manter o histórico das alterações na sua estrutura. Até o fim de </w:t>
+      </w:r>
+      <w:r>
+        <w:rPr>
+          <w:sz w:val="24"/>
+          <w:szCs w:val="24"/>
+        </w:rPr>
+        <w:lastRenderedPageBreak/>
+        <w:t>outubro de 2026 foram criadas oito migrações. Além das tabelas iniciais e da tabela de usuários, elas acrescentaram:</w:t>
+      </w:r>
+    </w:p>
+    <w:p>
+      <w:pPr>
+        <w:pStyle w:val="PargrafodaLista"/>
+        <w:numPr>
+          <w:ilvl w:val="0"/>
+          <w:numId w:val="24"/>
+        </w:numPr>
+        <w:spacing w:before="100" w:beforeAutospacing="1" w:after="100" w:afterAutospacing="1" w:line="360" w:lineRule="auto"/>
+        <w:rPr>
+          <w:rFonts w:cs="Arial"/>
+          <w:sz w:val="24"/>
+          <w:szCs w:val="24"/>
+        </w:rPr>
+      </w:pPr>
+      <w:r>
+        <w:rPr>
+          <w:rFonts w:cs="Arial"/>
+          <w:sz w:val="24"/>
+          <w:szCs w:val="24"/>
+        </w:rPr>
+        <w:t>o código do setor;</w:t>
+      </w:r>
+    </w:p>
+    <w:p>
+      <w:pPr>
+        <w:pStyle w:val="PargrafodaLista"/>
+        <w:numPr>
+          <w:ilvl w:val="0"/>
+          <w:numId w:val="24"/>
+        </w:numPr>
+        <w:spacing w:before="100" w:beforeAutospacing="1" w:after="100" w:afterAutospacing="1" w:line="360" w:lineRule="auto"/>
+        <w:rPr>
+          <w:rFonts w:cs="Arial"/>
+          <w:sz w:val="24"/>
+          <w:szCs w:val="24"/>
+        </w:rPr>
+      </w:pPr>
+      <w:r>
+        <w:rPr>
+          <w:rFonts w:cs="Arial"/>
+          <w:sz w:val="24"/>
+          <w:szCs w:val="24"/>
+        </w:rPr>
+        <w:t>o setor principal e a função do operador;</w:t>
+      </w:r>
+    </w:p>
+    <w:p>
+      <w:pPr>
+        <w:pStyle w:val="PargrafodaLista"/>
+        <w:numPr>
+          <w:ilvl w:val="0"/>
+          <w:numId w:val="24"/>
+        </w:numPr>
+        <w:spacing w:before="100" w:beforeAutospacing="1" w:after="100" w:afterAutospacing="1" w:line="360" w:lineRule="auto"/>
+        <w:rPr>
+          <w:rFonts w:cs="Arial"/>
+          <w:sz w:val="24"/>
+          <w:szCs w:val="24"/>
+        </w:rPr>
+      </w:pPr>
+      <w:r>
+        <w:rPr>
+          <w:rFonts w:cs="Arial"/>
+          <w:sz w:val="24"/>
+          <w:szCs w:val="24"/>
+        </w:rPr>
+        <w:t>a indicação de cadastro ativo em operações, produtos e setores;</w:t>
+      </w:r>
+    </w:p>
+    <w:p>
+      <w:pPr>
+        <w:pStyle w:val="PargrafodaLista"/>
+        <w:numPr>
+          <w:ilvl w:val="0"/>
+          <w:numId w:val="24"/>
+        </w:numPr>
+        <w:spacing w:before="100" w:beforeAutospacing="1" w:after="100" w:afterAutospacing="1" w:line="360" w:lineRule="auto"/>
+        <w:rPr>
+          <w:rFonts w:cs="Arial"/>
+          <w:sz w:val="24"/>
+          <w:szCs w:val="24"/>
+        </w:rPr>
+      </w:pPr>
+      <w:r>
+        <w:rPr>
+          <w:rFonts w:cs="Arial"/>
+          <w:sz w:val="24"/>
+          <w:szCs w:val="24"/>
+        </w:rPr>
+        <w:t>uma regra que impede o mesmo operador de ter duas execuções abertas ao mesmo tempo.</w:t>
       </w:r>
     </w:p>
     <w:p>
@@ -22953,15 +23489,147 @@
           <w:sz w:val="24"/>
           <w:szCs w:val="24"/>
         </w:rPr>
-        <w:lastRenderedPageBreak/>
-        <w:t>O banco de dados utilizado é o PostgreSQL, hospedado no serviço Neon. Além das chaves primárias e estrangeiras, o próprio banco garante algumas regras, como a matrícula única do operador, o nome único do setor, a baixa única por etapa de cada ordem e o motivo obrigatório em toda pausa. As regras que o banco não consegue garantir, como a soma das quantidades na baixa, ficam a cargo das validações do sistema.</w:t>
+        <w:t>O banco de dados utilizado é o PostgreSQL, hospedado no serviço Neon. Além das chaves primárias e estrangeiras, o próprio banco garante várias regras:</w:t>
+      </w:r>
+    </w:p>
+    <w:p>
+      <w:pPr>
+        <w:pStyle w:val="PargrafodaLista"/>
+        <w:numPr>
+          <w:ilvl w:val="0"/>
+          <w:numId w:val="24"/>
+        </w:numPr>
+        <w:spacing w:before="100" w:beforeAutospacing="1" w:after="100" w:afterAutospacing="1" w:line="360" w:lineRule="auto"/>
+        <w:rPr>
+          <w:rFonts w:cs="Arial"/>
+          <w:sz w:val="24"/>
+          <w:szCs w:val="24"/>
+        </w:rPr>
+      </w:pPr>
+      <w:r>
+        <w:rPr>
+          <w:rFonts w:cs="Arial"/>
+          <w:sz w:val="24"/>
+          <w:szCs w:val="24"/>
+        </w:rPr>
+        <w:t>o código único do setor e a matrícula única do operador;</w:t>
+      </w:r>
+    </w:p>
+    <w:p>
+      <w:pPr>
+        <w:pStyle w:val="PargrafodaLista"/>
+        <w:numPr>
+          <w:ilvl w:val="0"/>
+          <w:numId w:val="24"/>
+        </w:numPr>
+        <w:spacing w:before="100" w:beforeAutospacing="1" w:after="100" w:afterAutospacing="1" w:line="360" w:lineRule="auto"/>
+        <w:rPr>
+          <w:rFonts w:cs="Arial"/>
+          <w:sz w:val="24"/>
+          <w:szCs w:val="24"/>
+        </w:rPr>
+      </w:pPr>
+      <w:r>
+        <w:rPr>
+          <w:rFonts w:cs="Arial"/>
+          <w:sz w:val="24"/>
+          <w:szCs w:val="24"/>
+        </w:rPr>
+        <w:t>um único roteiro vigente por produto;</w:t>
+      </w:r>
+    </w:p>
+    <w:p>
+      <w:pPr>
+        <w:pStyle w:val="PargrafodaLista"/>
+        <w:numPr>
+          <w:ilvl w:val="0"/>
+          <w:numId w:val="24"/>
+        </w:numPr>
+        <w:spacing w:before="100" w:beforeAutospacing="1" w:after="100" w:afterAutospacing="1" w:line="360" w:lineRule="auto"/>
+        <w:rPr>
+          <w:rFonts w:cs="Arial"/>
+          <w:sz w:val="24"/>
+          <w:szCs w:val="24"/>
+        </w:rPr>
+      </w:pPr>
+      <w:r>
+        <w:rPr>
+          <w:rFonts w:cs="Arial"/>
+          <w:sz w:val="24"/>
+          <w:szCs w:val="24"/>
+        </w:rPr>
+        <w:t>a baixa única por etapa de cada ordem;</w:t>
+      </w:r>
+    </w:p>
+    <w:p>
+      <w:pPr>
+        <w:pStyle w:val="PargrafodaLista"/>
+        <w:numPr>
+          <w:ilvl w:val="0"/>
+          <w:numId w:val="24"/>
+        </w:numPr>
+        <w:spacing w:before="100" w:beforeAutospacing="1" w:after="100" w:afterAutospacing="1" w:line="360" w:lineRule="auto"/>
+        <w:rPr>
+          <w:rFonts w:cs="Arial"/>
+          <w:sz w:val="24"/>
+          <w:szCs w:val="24"/>
+        </w:rPr>
+      </w:pPr>
+      <w:r>
+        <w:rPr>
+          <w:rFonts w:cs="Arial"/>
+          <w:sz w:val="24"/>
+          <w:szCs w:val="24"/>
+        </w:rPr>
+        <w:t>o motivo obrigatório em toda pausa;</w:t>
+      </w:r>
+    </w:p>
+    <w:p>
+      <w:pPr>
+        <w:pStyle w:val="PargrafodaLista"/>
+        <w:numPr>
+          <w:ilvl w:val="0"/>
+          <w:numId w:val="24"/>
+        </w:numPr>
+        <w:spacing w:before="100" w:beforeAutospacing="1" w:after="100" w:afterAutospacing="1" w:line="360" w:lineRule="auto"/>
+        <w:rPr>
+          <w:rFonts w:cs="Arial"/>
+          <w:sz w:val="24"/>
+          <w:szCs w:val="24"/>
+        </w:rPr>
+      </w:pPr>
+      <w:r>
+        <w:rPr>
+          <w:rFonts w:cs="Arial"/>
+          <w:sz w:val="24"/>
+          <w:szCs w:val="24"/>
+        </w:rPr>
+        <w:t>no máximo uma execução aberta por operador, mesmo quando dois pedidos chegam ao mesmo tempo.</w:t>
+      </w:r>
+    </w:p>
+    <w:p>
+      <w:pPr>
+        <w:spacing w:line="360" w:lineRule="auto"/>
+        <w:ind w:firstLine="708"/>
+        <w:jc w:val="both"/>
+        <w:rPr>
+          <w:sz w:val="24"/>
+          <w:szCs w:val="24"/>
+        </w:rPr>
+      </w:pPr>
+      <w:r>
+        <w:rPr>
+          <w:sz w:val="24"/>
+          <w:szCs w:val="24"/>
+        </w:rPr>
+        <w:t>As regras que o banco não consegue garantir, como a soma das quantidades na baixa, ficam a cargo das validações do sistema.</w:t>
       </w:r>
     </w:p>
     <w:p>
       <w:pPr>
         <w:pStyle w:val="Ttulo2"/>
       </w:pPr>
-      <w:bookmarkStart w:id="70" w:name="_Toc242908890"/>
+      <w:bookmarkStart w:id="70" w:name="_Toc243992802"/>
       <w:r>
         <w:t>6.3 Acesso Administrativo</w:t>
       </w:r>
@@ -23008,8 +23676,9 @@
       <w:pPr>
         <w:pStyle w:val="Ttulo2"/>
       </w:pPr>
-      <w:bookmarkStart w:id="71" w:name="_Toc242908891"/>
-      <w:r>
+      <w:bookmarkStart w:id="71" w:name="_Toc243992803"/>
+      <w:r>
+        <w:lastRenderedPageBreak/>
         <w:t>6.4 Painel Administrativo e Cadastros</w:t>
       </w:r>
       <w:bookmarkEnd w:id="71"/>
@@ -23030,7 +23699,7 @@
           <w:sz w:val="24"/>
           <w:szCs w:val="24"/>
         </w:rPr>
-        <w:t>Após o login, o administrador acessa o painel apresentado na Figura 12. O menu lateral organiza os módulos em três grupos: Cadastros, Produção e Relatórios. Os módulos que ainda não foram implementados abrem uma página que informa que a funcionalidade será disponibilizada em uma próxima etapa.</w:t>
+        <w:t>Após o login, o administrador acessa o painel apresentado na Figura 12. O menu lateral organiza os módulos em três grupos: Cadastros, Produção e Relatórios.</w:t>
       </w:r>
     </w:p>
     <w:p>
@@ -23038,9 +23707,8 @@
         <w:pStyle w:val="Legenda"/>
         <w:keepNext/>
       </w:pPr>
-      <w:bookmarkStart w:id="72" w:name="_Toc242908907"/>
-      <w:r>
-        <w:lastRenderedPageBreak/>
+      <w:bookmarkStart w:id="72" w:name="_Toc243992821"/>
+      <w:r>
         <w:t xml:space="preserve">Figura </w:t>
       </w:r>
       <w:r>
@@ -23077,10 +23745,10 @@
           <w:noProof/>
         </w:rPr>
         <w:drawing>
-          <wp:inline distT="0" distB="0" distL="0" distR="0" wp14:anchorId="0D758C1D" wp14:editId="718CF545">
-            <wp:extent cx="5730167" cy="3581354"/>
+          <wp:inline distT="0" distB="0" distL="0" distR="0" wp14:anchorId="6923B05D" wp14:editId="1931DD84">
+            <wp:extent cx="5730167" cy="3405868"/>
             <wp:effectExtent l="0" t="0" r="0" b="0"/>
-            <wp:docPr id="205" name="Imagem 205"/>
+            <wp:docPr id="912" name="Imagem 912"/>
             <wp:cNvGraphicFramePr>
               <a:graphicFrameLocks xmlns:a="http://schemas.openxmlformats.org/drawingml/2006/main" noChangeAspect="1"/>
             </wp:cNvGraphicFramePr>
@@ -23088,7 +23756,7 @@
               <a:graphicData uri="http://schemas.openxmlformats.org/drawingml/2006/picture">
                 <pic:pic xmlns:pic="http://schemas.openxmlformats.org/drawingml/2006/picture">
                   <pic:nvPicPr>
-                    <pic:cNvPr id="205" name="Imagem 205"/>
+                    <pic:cNvPr id="912" name="Imagem 912"/>
                     <pic:cNvPicPr/>
                   </pic:nvPicPr>
                   <pic:blipFill>
@@ -23100,7 +23768,7 @@
                   <pic:spPr>
                     <a:xfrm>
                       <a:off x="0" y="0"/>
-                      <a:ext cx="5730167" cy="3581354"/>
+                      <a:ext cx="5730167" cy="3405868"/>
                     </a:xfrm>
                     <a:prstGeom prst="rect">
                       <a:avLst/>
@@ -23126,26 +23794,51 @@
           <w:sz w:val="20"/>
           <w:szCs w:val="20"/>
         </w:rPr>
-        <w:t>Fonte: Próprio autor, acessado em 13 de outubro de 2026.</w:t>
-      </w:r>
-    </w:p>
-    <w:p>
-      <w:pPr>
-        <w:spacing w:before="100" w:beforeAutospacing="1" w:after="100" w:afterAutospacing="1" w:line="360" w:lineRule="auto"/>
+        <w:t>Fonte: Próprio autor, acessado em 27 de outubro de 2026.</w:t>
+      </w:r>
+    </w:p>
+    <w:p>
+      <w:pPr>
+        <w:spacing w:line="360" w:lineRule="auto"/>
         <w:ind w:firstLine="708"/>
         <w:jc w:val="both"/>
         <w:rPr>
-          <w:rFonts w:cs="Arial"/>
-          <w:sz w:val="24"/>
-          <w:szCs w:val="24"/>
-        </w:rPr>
-      </w:pPr>
-      <w:r>
-        <w:rPr>
-          <w:sz w:val="24"/>
-          <w:szCs w:val="24"/>
-        </w:rPr>
-        <w:t>Os primeiros cadastros implementados foram os de operadores e de setores. A tela de operadores, apresentada na Figura 13, lista os registros com busca por nome ou matrícula, filtro por situação e ordenação pelas colunas, e permite incluir um novo operador. O sistema remove os espaços no início e no fim dos campos, exige o nome e a matrícula e não aceita matrícula repetida. A tela de setores segue o mesmo padrão e não aceita dois setores com o mesmo nome. Os registros exibidos nas figuras são fictícios.</w:t>
+          <w:sz w:val="24"/>
+          <w:szCs w:val="24"/>
+        </w:rPr>
+      </w:pPr>
+      <w:r>
+        <w:rPr>
+          <w:sz w:val="24"/>
+          <w:szCs w:val="24"/>
+        </w:rPr>
+        <w:t>Os cadastros de produtos, operações, setores, postos de trabalho, operadores e motivos de pausa seguem o mesmo padrão. Cada tela lista os registros com busca, filtro por situação e ordenação pelas colunas, e permite incluir, editar, inativar e reativar um registro. Os cadastros não são excluídos, porque podem estar ligados a ordens e apontamentos já registrados. Um cadastro inativo deixa de aparecer nas escolhas novas, mas continua nos registros que já o utilizam. O sistema remove os espaços no início e no fim dos campos e não aceita códigos ou nomes repetidos.</w:t>
+      </w:r>
+    </w:p>
+    <w:p>
+      <w:pPr>
+        <w:spacing w:line="360" w:lineRule="auto"/>
+        <w:ind w:firstLine="708"/>
+        <w:jc w:val="both"/>
+        <w:rPr>
+          <w:sz w:val="24"/>
+          <w:szCs w:val="24"/>
+        </w:rPr>
+      </w:pPr>
+      <w:r>
+        <w:rPr>
+          <w:sz w:val="24"/>
+          <w:szCs w:val="24"/>
+        </w:rPr>
+        <w:t xml:space="preserve">Alguns identificadores são gerados pelo próprio sistema e não podem ser alterados. O código do setor é formado pelas três primeiras letras do nome e por uma sequência, como PES1. A matrícula do operador é formada pelas iniciais do nome e pelo código do setor principal, como AS-MON1. A tela de operadores, apresentada na Figura 13, também impede inativar um operador que tenha uma execução aberta, pois </w:t>
+      </w:r>
+      <w:r>
+        <w:rPr>
+          <w:sz w:val="24"/>
+          <w:szCs w:val="24"/>
+        </w:rPr>
+        <w:lastRenderedPageBreak/>
+        <w:t>a ilha de produção não aceita operador inativo e essa execução não poderia mais ser encerrada. Os registros exibidos nas figuras são fictícios.</w:t>
       </w:r>
     </w:p>
     <w:p>
@@ -23153,9 +23846,8 @@
         <w:pStyle w:val="Legenda"/>
         <w:keepNext/>
       </w:pPr>
-      <w:bookmarkStart w:id="73" w:name="_Toc242908908"/>
-      <w:r>
-        <w:lastRenderedPageBreak/>
+      <w:bookmarkStart w:id="73" w:name="_Toc243992822"/>
+      <w:r>
         <w:t xml:space="preserve">Figura </w:t>
       </w:r>
       <w:r>
@@ -23192,10 +23884,10 @@
           <w:noProof/>
         </w:rPr>
         <w:drawing>
-          <wp:inline distT="0" distB="0" distL="0" distR="0" wp14:anchorId="47AA55DF" wp14:editId="6CAD24F3">
+          <wp:inline distT="0" distB="0" distL="0" distR="0" wp14:anchorId="290BE2DA" wp14:editId="480A8D20">
             <wp:extent cx="5730167" cy="3581354"/>
             <wp:effectExtent l="0" t="0" r="0" b="0"/>
-            <wp:docPr id="206" name="Imagem 206"/>
+            <wp:docPr id="913" name="Imagem 913"/>
             <wp:cNvGraphicFramePr>
               <a:graphicFrameLocks xmlns:a="http://schemas.openxmlformats.org/drawingml/2006/main" noChangeAspect="1"/>
             </wp:cNvGraphicFramePr>
@@ -23203,7 +23895,7 @@
               <a:graphicData uri="http://schemas.openxmlformats.org/drawingml/2006/picture">
                 <pic:pic xmlns:pic="http://schemas.openxmlformats.org/drawingml/2006/picture">
                   <pic:nvPicPr>
-                    <pic:cNvPr id="206" name="Imagem 206"/>
+                    <pic:cNvPr id="913" name="Imagem 913"/>
                     <pic:cNvPicPr/>
                   </pic:nvPicPr>
                   <pic:blipFill>
@@ -23241,16 +23933,16 @@
           <w:sz w:val="20"/>
           <w:szCs w:val="20"/>
         </w:rPr>
-        <w:t>Fonte: Próprio autor, acessado em 13 de outubro de 2026.</w:t>
+        <w:t>Fonte: Próprio autor, acessado em 27 de outubro de 2026.</w:t>
       </w:r>
     </w:p>
     <w:p>
       <w:pPr>
         <w:pStyle w:val="Ttulo2"/>
       </w:pPr>
-      <w:bookmarkStart w:id="74" w:name="_Toc242908892"/>
-      <w:r>
-        <w:t>6.5 Cálculo dos Indicadores</w:t>
+      <w:bookmarkStart w:id="74" w:name="_Toc243992804"/>
+      <w:r>
+        <w:t>6.5 Roteiros, Planos e Ordens de Produção</w:t>
       </w:r>
       <w:bookmarkEnd w:id="74"/>
     </w:p>
@@ -23270,7 +23962,7 @@
           <w:sz w:val="24"/>
           <w:szCs w:val="24"/>
         </w:rPr>
-        <w:t>Os indicadores foram implementados como funções independentes da interface e do banco de dados, o que permite conferir cada cálculo com exemplos feitos à mão. O tempo produtivo de uma execução é a soma dos intervalos entre o início ou a retomada e a pausa ou a finalização seguinte, e o tempo de pausa é a soma dos intervalos entre a pausa e a retomada. Uma execução ainda aberta não recebe horário de término presumido, e a ausência de registros não é tratada como tempo ocioso.</w:t>
+        <w:t>O roteiro define a sequência de etapas para fabricar um produto. Na tela de roteiros, o administrador informa as etapas, cada uma ligada a uma operação, e os postos de trabalho em que cada etapa pode ser realizada. Também define os produtos que seguem o roteiro e o tempo padrão de cada produto em cada etapa, em segundos por unidade produzida. Cada produto possui um único roteiro vigente.</w:t>
       </w:r>
     </w:p>
     <w:p>
@@ -23288,7 +23980,103 @@
           <w:sz w:val="24"/>
           <w:szCs w:val="24"/>
         </w:rPr>
-        <w:t>A partir das baixas, o sistema calcula a quantidade produzida em cada etapa e o tempo médio por unidade, obtido pela divisão do tempo produtivo pela quantidade boa. Esse tempo é comparado com o tempo padrão do produto na etapa, indicando a diferença em segundos e o percentual em relação ao padrão. Uma baixa cuja soma das quantidades não corresponde à quantidade da ordem, ou que possui quantidade negativa, não é considerada nos cálculos e aparece como inconsistência.</w:t>
+        <w:t>Como a ordem de produção guarda a versão do roteiro escolhida na sua criação, um roteiro que já possui ordens tem as etapas travadas, conforme a Figura 14. Para alterar o processo, o administrador cria uma nova versão, que copia as etapas, os postos, os produtos e os tempos da versão anterior. Assim, as ordens antigas continuam na versão em que foram criadas.</w:t>
+      </w:r>
+    </w:p>
+    <w:p>
+      <w:pPr>
+        <w:pStyle w:val="Legenda"/>
+        <w:keepNext/>
+      </w:pPr>
+      <w:bookmarkStart w:id="75" w:name="_Toc243992823"/>
+      <w:r>
+        <w:lastRenderedPageBreak/>
+        <w:t xml:space="preserve">Figura </w:t>
+      </w:r>
+      <w:r>
+        <w:fldChar w:fldCharType="begin"/>
+      </w:r>
+      <w:r>
+        <w:instrText xml:space="preserve"> SEQ Figura \* ARABIC </w:instrText>
+      </w:r>
+      <w:r>
+        <w:fldChar w:fldCharType="separate"/>
+      </w:r>
+      <w:r>
+        <w:rPr>
+          <w:noProof/>
+        </w:rPr>
+        <w:t>14</w:t>
+      </w:r>
+      <w:r>
+        <w:fldChar w:fldCharType="end"/>
+      </w:r>
+      <w:r>
+        <w:t xml:space="preserve"> – Roteiro com Ordens e Etapas Travadas</w:t>
+      </w:r>
+      <w:bookmarkEnd w:id="75"/>
+    </w:p>
+    <w:p>
+      <w:pPr>
+        <w:keepNext/>
+        <w:spacing w:line="360" w:lineRule="auto"/>
+        <w:jc w:val="center"/>
+      </w:pPr>
+      <w:r>
+        <w:rPr>
+          <w:noProof/>
+        </w:rPr>
+        <w:drawing>
+          <wp:inline distT="0" distB="0" distL="0" distR="0" wp14:anchorId="57D4ECD9" wp14:editId="1E8F3413">
+            <wp:extent cx="5730167" cy="3581354"/>
+            <wp:effectExtent l="0" t="0" r="0" b="0"/>
+            <wp:docPr id="914" name="Imagem 914"/>
+            <wp:cNvGraphicFramePr>
+              <a:graphicFrameLocks xmlns:a="http://schemas.openxmlformats.org/drawingml/2006/main" noChangeAspect="1"/>
+            </wp:cNvGraphicFramePr>
+            <a:graphic xmlns:a="http://schemas.openxmlformats.org/drawingml/2006/main">
+              <a:graphicData uri="http://schemas.openxmlformats.org/drawingml/2006/picture">
+                <pic:pic xmlns:pic="http://schemas.openxmlformats.org/drawingml/2006/picture">
+                  <pic:nvPicPr>
+                    <pic:cNvPr id="914" name="Imagem 914"/>
+                    <pic:cNvPicPr/>
+                  </pic:nvPicPr>
+                  <pic:blipFill>
+                    <a:blip r:embed="rId27"/>
+                    <a:stretch>
+                      <a:fillRect/>
+                    </a:stretch>
+                  </pic:blipFill>
+                  <pic:spPr>
+                    <a:xfrm>
+                      <a:off x="0" y="0"/>
+                      <a:ext cx="5730167" cy="3581354"/>
+                    </a:xfrm>
+                    <a:prstGeom prst="rect">
+                      <a:avLst/>
+                    </a:prstGeom>
+                  </pic:spPr>
+                </pic:pic>
+              </a:graphicData>
+            </a:graphic>
+          </wp:inline>
+        </w:drawing>
+      </w:r>
+    </w:p>
+    <w:p>
+      <w:pPr>
+        <w:jc w:val="center"/>
+        <w:rPr>
+          <w:sz w:val="20"/>
+          <w:szCs w:val="20"/>
+        </w:rPr>
+      </w:pPr>
+      <w:r>
+        <w:rPr>
+          <w:sz w:val="20"/>
+          <w:szCs w:val="20"/>
+        </w:rPr>
+        <w:t>Fonte: Próprio autor, acessado em 22 de outubro de 2026.</w:t>
       </w:r>
     </w:p>
     <w:p>
@@ -23306,15 +24094,132 @@
           <w:sz w:val="24"/>
           <w:szCs w:val="24"/>
         </w:rPr>
-        <w:t xml:space="preserve">Para apoiar o nivelamento, o sistema calcula a carga pendente de cada etapa, que é a quantidade das ordens ainda sem baixa multiplicada pelo tempo padrão. </w:t>
-      </w:r>
-      <w:r>
-        <w:rPr>
-          <w:sz w:val="24"/>
-          <w:szCs w:val="24"/>
-        </w:rPr>
+        <w:t>O plano de produção agrupa as ordens de um período e possui código, descrição e datas opcionais de início e de fim. A ordem de produção, apresentada na Figura 15, registra o número, o plano, o produto, a versão do roteiro, a quantidade e a unidade. O sistema sugere o próximo número disponível e já seleciona a versão vigente do produto. Ao criar a ordem, o produto precisa estar ativo, e a versão do roteiro precisa estar ligada ao produto, ativa e com etapas. Depois que a ordem possui execuções, a quantidade e a unidade não podem mais ser alteradas, porque a baixa é conferida com elas.</w:t>
+      </w:r>
+    </w:p>
+    <w:p>
+      <w:pPr>
+        <w:pStyle w:val="Legenda"/>
+        <w:keepNext/>
+      </w:pPr>
+      <w:bookmarkStart w:id="76" w:name="_Toc243992824"/>
+      <w:r>
         <w:lastRenderedPageBreak/>
-        <w:t>Como uma mesma etapa pode ser realizada em mais de um posto de trabalho, a carga da etapa é dividida em partes iguais entre os postos compatíveis, e cada posto recebe também o percentual que representa na carga total. Esse valor é uma estimativa: ele mostra onde o trabalho está concentrado, mas não comprova a existência de um gargalo, e a comparação entre os postos considera que eles têm disponibilidade semelhante.</w:t>
+        <w:t xml:space="preserve">Figura </w:t>
+      </w:r>
+      <w:r>
+        <w:fldChar w:fldCharType="begin"/>
+      </w:r>
+      <w:r>
+        <w:instrText xml:space="preserve"> SEQ Figura \* ARABIC </w:instrText>
+      </w:r>
+      <w:r>
+        <w:fldChar w:fldCharType="separate"/>
+      </w:r>
+      <w:r>
+        <w:rPr>
+          <w:noProof/>
+        </w:rPr>
+        <w:t>15</w:t>
+      </w:r>
+      <w:r>
+        <w:fldChar w:fldCharType="end"/>
+      </w:r>
+      <w:r>
+        <w:t xml:space="preserve"> – Cadastro de Ordem de Produção</w:t>
+      </w:r>
+      <w:bookmarkEnd w:id="76"/>
+    </w:p>
+    <w:p>
+      <w:pPr>
+        <w:keepNext/>
+        <w:spacing w:line="360" w:lineRule="auto"/>
+        <w:jc w:val="center"/>
+      </w:pPr>
+      <w:r>
+        <w:rPr>
+          <w:noProof/>
+        </w:rPr>
+        <w:drawing>
+          <wp:inline distT="0" distB="0" distL="0" distR="0" wp14:anchorId="76CD7E50" wp14:editId="4473B2DB">
+            <wp:extent cx="5730167" cy="3581354"/>
+            <wp:effectExtent l="0" t="0" r="0" b="0"/>
+            <wp:docPr id="915" name="Imagem 915"/>
+            <wp:cNvGraphicFramePr>
+              <a:graphicFrameLocks xmlns:a="http://schemas.openxmlformats.org/drawingml/2006/main" noChangeAspect="1"/>
+            </wp:cNvGraphicFramePr>
+            <a:graphic xmlns:a="http://schemas.openxmlformats.org/drawingml/2006/main">
+              <a:graphicData uri="http://schemas.openxmlformats.org/drawingml/2006/picture">
+                <pic:pic xmlns:pic="http://schemas.openxmlformats.org/drawingml/2006/picture">
+                  <pic:nvPicPr>
+                    <pic:cNvPr id="915" name="Imagem 915"/>
+                    <pic:cNvPicPr/>
+                  </pic:nvPicPr>
+                  <pic:blipFill>
+                    <a:blip r:embed="rId28"/>
+                    <a:stretch>
+                      <a:fillRect/>
+                    </a:stretch>
+                  </pic:blipFill>
+                  <pic:spPr>
+                    <a:xfrm>
+                      <a:off x="0" y="0"/>
+                      <a:ext cx="5730167" cy="3581354"/>
+                    </a:xfrm>
+                    <a:prstGeom prst="rect">
+                      <a:avLst/>
+                    </a:prstGeom>
+                  </pic:spPr>
+                </pic:pic>
+              </a:graphicData>
+            </a:graphic>
+          </wp:inline>
+        </w:drawing>
+      </w:r>
+    </w:p>
+    <w:p>
+      <w:pPr>
+        <w:jc w:val="center"/>
+        <w:rPr>
+          <w:sz w:val="20"/>
+          <w:szCs w:val="20"/>
+        </w:rPr>
+      </w:pPr>
+      <w:r>
+        <w:rPr>
+          <w:sz w:val="20"/>
+          <w:szCs w:val="20"/>
+        </w:rPr>
+        <w:t>Fonte: Próprio autor, acessado em 25 de outubro de 2026.</w:t>
+      </w:r>
+    </w:p>
+    <w:p>
+      <w:pPr>
+        <w:pStyle w:val="Ttulo2"/>
+      </w:pPr>
+      <w:bookmarkStart w:id="77" w:name="_Toc243992805"/>
+      <w:r>
+        <w:t>6.6 Ilha de Apontamento</w:t>
+      </w:r>
+      <w:bookmarkEnd w:id="77"/>
+    </w:p>
+    <w:p>
+      <w:pPr>
+        <w:spacing w:before="100" w:beforeAutospacing="1" w:after="100" w:afterAutospacing="1" w:line="360" w:lineRule="auto"/>
+        <w:ind w:firstLine="708"/>
+        <w:jc w:val="both"/>
+        <w:rPr>
+          <w:rFonts w:cs="Arial"/>
+          <w:sz w:val="24"/>
+          <w:szCs w:val="24"/>
+        </w:rPr>
+      </w:pPr>
+      <w:r>
+        <w:rPr>
+          <w:sz w:val="24"/>
+          <w:szCs w:val="24"/>
+        </w:rPr>
+        <w:t>A ilha de apontamento é a tela usada no chão de fábrica para registrar a execução das etapas, apresentada na Figura 16. Ela fica separada da área administrativa e não utiliza o login do administrador. Cada computador da ilha é liberado uma única vez com uma chave do terminal, que fica guardada no servidor. Depois de liberado, o terminal acessa apenas as funções de apontamento. A troca da chave bloqueia todos os terminais, e cada terminal também pode ser bloqueado pelo próprio botão da tela.</w:t>
       </w:r>
     </w:p>
     <w:p>
@@ -23332,18 +24237,261 @@
           <w:sz w:val="24"/>
           <w:szCs w:val="24"/>
         </w:rPr>
-        <w:t>Os indicadores são disponibilizados por uma rota da API acessível somente ao administrador, que recebe o período da consulta e devolve os resultados junto com avisos sobre dados ausentes, como etapas sem tempo padrão ou execuções ainda abertas.</w:t>
+        <w:t>O operador se identifica pela matrícula, digitada ou lida por um leitor de código que funciona como teclado. Essa identificação serve apenas para associar o apontamento a quem o realizou e não dá acesso a outras partes do sistema. Também não é aceito operador inativo, e cada operador só pode agir sobre as próprias execuções.</w:t>
+      </w:r>
+    </w:p>
+    <w:p>
+      <w:pPr>
+        <w:spacing w:line="360" w:lineRule="auto"/>
+        <w:ind w:firstLine="708"/>
+        <w:jc w:val="both"/>
+        <w:rPr>
+          <w:sz w:val="24"/>
+          <w:szCs w:val="24"/>
+        </w:rPr>
+      </w:pPr>
+      <w:r>
+        <w:rPr>
+          <w:sz w:val="24"/>
+          <w:szCs w:val="24"/>
+        </w:rPr>
+        <w:t>Para iniciar, o operador escolhe a ordem, a etapa e o posto de trabalho. O sistema oferece apenas as ordens que possuem etapa sem baixa e os postos ativos em que a etapa pode ser realizada. Durante a execução, o operador pode:</w:t>
+      </w:r>
+    </w:p>
+    <w:p>
+      <w:pPr>
+        <w:pStyle w:val="PargrafodaLista"/>
+        <w:numPr>
+          <w:ilvl w:val="0"/>
+          <w:numId w:val="24"/>
+        </w:numPr>
+        <w:spacing w:before="100" w:beforeAutospacing="1" w:after="100" w:afterAutospacing="1" w:line="360" w:lineRule="auto"/>
+        <w:rPr>
+          <w:rFonts w:cs="Arial"/>
+          <w:sz w:val="24"/>
+          <w:szCs w:val="24"/>
+        </w:rPr>
+      </w:pPr>
+      <w:r>
+        <w:rPr>
+          <w:rFonts w:cs="Arial"/>
+          <w:sz w:val="24"/>
+          <w:szCs w:val="24"/>
+        </w:rPr>
+        <w:lastRenderedPageBreak/>
+        <w:t>pausar, informando um dos motivos de pausa ativos;</w:t>
+      </w:r>
+    </w:p>
+    <w:p>
+      <w:pPr>
+        <w:pStyle w:val="PargrafodaLista"/>
+        <w:numPr>
+          <w:ilvl w:val="0"/>
+          <w:numId w:val="24"/>
+        </w:numPr>
+        <w:spacing w:before="100" w:beforeAutospacing="1" w:after="100" w:afterAutospacing="1" w:line="360" w:lineRule="auto"/>
+        <w:rPr>
+          <w:rFonts w:cs="Arial"/>
+          <w:sz w:val="24"/>
+          <w:szCs w:val="24"/>
+        </w:rPr>
+      </w:pPr>
+      <w:r>
+        <w:rPr>
+          <w:rFonts w:cs="Arial"/>
+          <w:sz w:val="24"/>
+          <w:szCs w:val="24"/>
+        </w:rPr>
+        <w:t>retomar a execução pausada;</w:t>
+      </w:r>
+    </w:p>
+    <w:p>
+      <w:pPr>
+        <w:pStyle w:val="PargrafodaLista"/>
+        <w:numPr>
+          <w:ilvl w:val="0"/>
+          <w:numId w:val="24"/>
+        </w:numPr>
+        <w:spacing w:before="100" w:beforeAutospacing="1" w:after="100" w:afterAutospacing="1" w:line="360" w:lineRule="auto"/>
+        <w:rPr>
+          <w:rFonts w:cs="Arial"/>
+          <w:sz w:val="24"/>
+          <w:szCs w:val="24"/>
+        </w:rPr>
+      </w:pPr>
+      <w:r>
+        <w:rPr>
+          <w:rFonts w:cs="Arial"/>
+          <w:sz w:val="24"/>
+          <w:szCs w:val="24"/>
+        </w:rPr>
+        <w:t>trocar de operação, o que encerra a execução atual sem quantidades e inicia a nova ao mesmo tempo;</w:t>
+      </w:r>
+    </w:p>
+    <w:p>
+      <w:pPr>
+        <w:pStyle w:val="PargrafodaLista"/>
+        <w:numPr>
+          <w:ilvl w:val="0"/>
+          <w:numId w:val="24"/>
+        </w:numPr>
+        <w:spacing w:before="100" w:beforeAutospacing="1" w:after="100" w:afterAutospacing="1" w:line="360" w:lineRule="auto"/>
+        <w:rPr>
+          <w:rFonts w:cs="Arial"/>
+          <w:sz w:val="24"/>
+          <w:szCs w:val="24"/>
+        </w:rPr>
+      </w:pPr>
+      <w:r>
+        <w:rPr>
+          <w:rFonts w:cs="Arial"/>
+          <w:sz w:val="24"/>
+          <w:szCs w:val="24"/>
+        </w:rPr>
+        <w:t>dar a baixa, que conclui a etapa.</w:t>
+      </w:r>
+    </w:p>
+    <w:p>
+      <w:pPr>
+        <w:spacing w:line="360" w:lineRule="auto"/>
+        <w:ind w:firstLine="708"/>
+        <w:jc w:val="both"/>
+        <w:rPr>
+          <w:sz w:val="24"/>
+          <w:szCs w:val="24"/>
+        </w:rPr>
+      </w:pPr>
+      <w:r>
+        <w:rPr>
+          <w:sz w:val="24"/>
+          <w:szCs w:val="24"/>
+        </w:rPr>
+        <w:t>Na baixa, o operador informa as quantidades boa, de retrabalho e de refugo. O sistema só aceita a baixa quando a soma é igual à quantidade da ordem, já que não existe baixa parcial. Uma execução finalizada não pode ser retomada. Se duas ações chegarem ao mesmo tempo para a mesma execução, como dois toques no botão de pausa, apenas uma é registrada.</w:t>
+      </w:r>
+    </w:p>
+    <w:p>
+      <w:pPr>
+        <w:spacing w:line="360" w:lineRule="auto"/>
+        <w:ind w:firstLine="708"/>
+        <w:jc w:val="both"/>
+        <w:rPr>
+          <w:sz w:val="24"/>
+          <w:szCs w:val="24"/>
+        </w:rPr>
+      </w:pPr>
+      <w:r>
+        <w:rPr>
+          <w:sz w:val="24"/>
+          <w:szCs w:val="24"/>
+        </w:rPr>
+        <w:t>A tela mostra o tempo produtivo e o tempo de pausa da execução em andamento. Esses tempos são calculados com as mesmas funções usadas nos indicadores.</w:t>
+      </w:r>
+    </w:p>
+    <w:p>
+      <w:pPr>
+        <w:pStyle w:val="Legenda"/>
+        <w:keepNext/>
+      </w:pPr>
+      <w:bookmarkStart w:id="78" w:name="_Toc243992825"/>
+      <w:r>
+        <w:t xml:space="preserve">Figura </w:t>
+      </w:r>
+      <w:r>
+        <w:fldChar w:fldCharType="begin"/>
+      </w:r>
+      <w:r>
+        <w:instrText xml:space="preserve"> SEQ Figura \* ARABIC </w:instrText>
+      </w:r>
+      <w:r>
+        <w:fldChar w:fldCharType="separate"/>
+      </w:r>
+      <w:r>
+        <w:rPr>
+          <w:noProof/>
+        </w:rPr>
+        <w:t>16</w:t>
+      </w:r>
+      <w:r>
+        <w:fldChar w:fldCharType="end"/>
+      </w:r>
+      <w:r>
+        <w:t xml:space="preserve"> – Ilha de Apontamento com Execução Pausada</w:t>
+      </w:r>
+      <w:bookmarkEnd w:id="78"/>
+    </w:p>
+    <w:p>
+      <w:pPr>
+        <w:keepNext/>
+        <w:spacing w:line="360" w:lineRule="auto"/>
+        <w:jc w:val="center"/>
+      </w:pPr>
+      <w:r>
+        <w:rPr>
+          <w:noProof/>
+        </w:rPr>
+        <w:drawing>
+          <wp:inline distT="0" distB="0" distL="0" distR="0" wp14:anchorId="25A155B3" wp14:editId="39617B36">
+            <wp:extent cx="5730167" cy="3581354"/>
+            <wp:effectExtent l="0" t="0" r="0" b="0"/>
+            <wp:docPr id="916" name="Imagem 916"/>
+            <wp:cNvGraphicFramePr>
+              <a:graphicFrameLocks xmlns:a="http://schemas.openxmlformats.org/drawingml/2006/main" noChangeAspect="1"/>
+            </wp:cNvGraphicFramePr>
+            <a:graphic xmlns:a="http://schemas.openxmlformats.org/drawingml/2006/main">
+              <a:graphicData uri="http://schemas.openxmlformats.org/drawingml/2006/picture">
+                <pic:pic xmlns:pic="http://schemas.openxmlformats.org/drawingml/2006/picture">
+                  <pic:nvPicPr>
+                    <pic:cNvPr id="916" name="Imagem 916"/>
+                    <pic:cNvPicPr/>
+                  </pic:nvPicPr>
+                  <pic:blipFill>
+                    <a:blip r:embed="rId29"/>
+                    <a:stretch>
+                      <a:fillRect/>
+                    </a:stretch>
+                  </pic:blipFill>
+                  <pic:spPr>
+                    <a:xfrm>
+                      <a:off x="0" y="0"/>
+                      <a:ext cx="5730167" cy="3581354"/>
+                    </a:xfrm>
+                    <a:prstGeom prst="rect">
+                      <a:avLst/>
+                    </a:prstGeom>
+                  </pic:spPr>
+                </pic:pic>
+              </a:graphicData>
+            </a:graphic>
+          </wp:inline>
+        </w:drawing>
+      </w:r>
+    </w:p>
+    <w:p>
+      <w:pPr>
+        <w:jc w:val="center"/>
+        <w:rPr>
+          <w:sz w:val="20"/>
+          <w:szCs w:val="20"/>
+        </w:rPr>
+      </w:pPr>
+      <w:r>
+        <w:rPr>
+          <w:sz w:val="20"/>
+          <w:szCs w:val="20"/>
+        </w:rPr>
+        <w:t>Fonte: Próprio autor, acessado em 27 de outubro de 2026.</w:t>
       </w:r>
     </w:p>
     <w:p>
       <w:pPr>
         <w:pStyle w:val="Ttulo2"/>
       </w:pPr>
-      <w:bookmarkStart w:id="75" w:name="_Toc242908893"/>
-      <w:r>
-        <w:t>6.6 Testes e Publicação</w:t>
-      </w:r>
-      <w:bookmarkEnd w:id="75"/>
+      <w:bookmarkStart w:id="79" w:name="_Toc243992806"/>
+      <w:r>
+        <w:lastRenderedPageBreak/>
+        <w:t>6.7 Indicadores</w:t>
+      </w:r>
+      <w:bookmarkEnd w:id="79"/>
     </w:p>
     <w:p>
       <w:pPr>
@@ -23361,7 +24509,7 @@
           <w:sz w:val="24"/>
           <w:szCs w:val="24"/>
         </w:rPr>
-        <w:t>As regras de negócio e os cálculos são verificados por testes automatizados, executados com o executor de testes do próprio Node.js. Em 14 de outubro de 2026 o projeto possuía 88 testes, dos quais 82 são executados em toda verificação e 6, que dependem do sistema em funcionamento, são executados manualmente.</w:t>
+        <w:t>Os indicadores foram implementados como funções independentes da interface e do banco de dados, o que permite conferir cada cálculo com exemplos feitos à mão. O tempo produtivo de uma execução é a soma dos intervalos entre o início ou a retomada e a pausa ou a finalização seguinte, e o tempo de pausa é a soma dos intervalos entre a pausa e a retomada. Uma execução ainda aberta não recebe horário de término presumido, e a ausência de registros não é tratada como tempo ocioso.</w:t>
       </w:r>
     </w:p>
     <w:p>
@@ -23379,7 +24527,7 @@
           <w:sz w:val="24"/>
           <w:szCs w:val="24"/>
         </w:rPr>
-        <w:t>O código é mantido em um repositório no GitHub. Cada funcionalidade é desenvolvida em uma ramificação própria e só é incorporada à versão de desenvolvimento por meio de um pull request, após a conferência dos arquivos alterados. A cada pull request, uma verificação automática executa a análise do código, a conferência de tipos, os testes e a compilação do sistema, e a incorporação só é feita quando todas essas etapas são concluídas sem erros.</w:t>
+        <w:t>A partir das baixas, o sistema calcula a quantidade produzida em cada etapa e o tempo médio por unidade, obtido pela divisão do tempo produtivo pela quantidade boa. Esse tempo é comparado com o tempo padrão do produto na etapa, indicando a diferença em segundos e o percentual em relação ao padrão. Uma baixa cuja soma das quantidades não corresponde à quantidade da ordem, ou que possui quantidade negativa, não é considerada nos cálculos e aparece como inconsistência.</w:t>
       </w:r>
     </w:p>
     <w:p>
@@ -23397,18 +24545,307 @@
           <w:sz w:val="24"/>
           <w:szCs w:val="24"/>
         </w:rPr>
-        <w:t>A versão de desenvolvimento é publicada automaticamente na plataforma Vercel a cada alteração, com o servidor localizado em São Paulo, o que permite acompanhar a evolução do sistema pelo navegador.</w:t>
+        <w:t>Para apoiar o nivelamento, o sistema calcula a carga pendente de cada etapa, que é a quantidade das ordens ainda sem baixa multiplicada pelo tempo padrão. Como uma mesma etapa pode ser realizada em mais de um posto de trabalho, a carga da etapa é dividida em partes iguais entre os postos compatíveis, e cada posto recebe também o percentual que representa na carga total. Esse valor é uma estimativa: ele mostra onde o trabalho está concentrado, mas não comprova a existência de um gargalo, e a comparação entre os postos considera que eles têm disponibilidade semelhante.</w:t>
+      </w:r>
+    </w:p>
+    <w:p>
+      <w:pPr>
+        <w:spacing w:line="360" w:lineRule="auto"/>
+        <w:ind w:firstLine="708"/>
+        <w:jc w:val="both"/>
+        <w:rPr>
+          <w:sz w:val="24"/>
+          <w:szCs w:val="24"/>
+        </w:rPr>
+      </w:pPr>
+      <w:r>
+        <w:rPr>
+          <w:sz w:val="24"/>
+          <w:szCs w:val="24"/>
+        </w:rPr>
+        <w:t>Os indicadores são disponibilizados por uma rota da API acessível somente ao administrador e apresentados na tela de indicadores, mostrada na Figura 17. O administrador escolhe o período da consulta (hoje, os últimos 7 ou 30 dias, ou datas definidas por ele), e a tela apresenta:</w:t>
+      </w:r>
+    </w:p>
+    <w:p>
+      <w:pPr>
+        <w:pStyle w:val="PargrafodaLista"/>
+        <w:numPr>
+          <w:ilvl w:val="0"/>
+          <w:numId w:val="24"/>
+        </w:numPr>
+        <w:spacing w:before="100" w:beforeAutospacing="1" w:after="100" w:afterAutospacing="1" w:line="360" w:lineRule="auto"/>
+        <w:rPr>
+          <w:rFonts w:cs="Arial"/>
+          <w:sz w:val="24"/>
+          <w:szCs w:val="24"/>
+        </w:rPr>
+      </w:pPr>
+      <w:r>
+        <w:rPr>
+          <w:rFonts w:cs="Arial"/>
+          <w:sz w:val="24"/>
+          <w:szCs w:val="24"/>
+        </w:rPr>
+        <w:t>um resumo com as peças boas na última etapa, as ordens em andamento e os tempos produtivo e de pausa;</w:t>
+      </w:r>
+    </w:p>
+    <w:p>
+      <w:pPr>
+        <w:pStyle w:val="PargrafodaLista"/>
+        <w:numPr>
+          <w:ilvl w:val="0"/>
+          <w:numId w:val="24"/>
+        </w:numPr>
+        <w:spacing w:before="100" w:beforeAutospacing="1" w:after="100" w:afterAutospacing="1" w:line="360" w:lineRule="auto"/>
+        <w:rPr>
+          <w:rFonts w:cs="Arial"/>
+          <w:sz w:val="24"/>
+          <w:szCs w:val="24"/>
+        </w:rPr>
+      </w:pPr>
+      <w:r>
+        <w:rPr>
+          <w:rFonts w:cs="Arial"/>
+          <w:sz w:val="24"/>
+          <w:szCs w:val="24"/>
+        </w:rPr>
+        <w:t>a posição de cada ordem de produção;</w:t>
+      </w:r>
+    </w:p>
+    <w:p>
+      <w:pPr>
+        <w:pStyle w:val="PargrafodaLista"/>
+        <w:numPr>
+          <w:ilvl w:val="0"/>
+          <w:numId w:val="24"/>
+        </w:numPr>
+        <w:spacing w:before="100" w:beforeAutospacing="1" w:after="100" w:afterAutospacing="1" w:line="360" w:lineRule="auto"/>
+        <w:rPr>
+          <w:rFonts w:cs="Arial"/>
+          <w:sz w:val="24"/>
+          <w:szCs w:val="24"/>
+        </w:rPr>
+      </w:pPr>
+      <w:r>
+        <w:rPr>
+          <w:rFonts w:cs="Arial"/>
+          <w:sz w:val="24"/>
+          <w:szCs w:val="24"/>
+        </w:rPr>
+        <w:t>o tempo de cada dia, em colunas, comparado com o tempo padrão das peças que tiveram baixa naquele dia;</w:t>
+      </w:r>
+    </w:p>
+    <w:p>
+      <w:pPr>
+        <w:pStyle w:val="PargrafodaLista"/>
+        <w:numPr>
+          <w:ilvl w:val="0"/>
+          <w:numId w:val="24"/>
+        </w:numPr>
+        <w:spacing w:before="100" w:beforeAutospacing="1" w:after="100" w:afterAutospacing="1" w:line="360" w:lineRule="auto"/>
+        <w:rPr>
+          <w:rFonts w:cs="Arial"/>
+          <w:sz w:val="24"/>
+          <w:szCs w:val="24"/>
+        </w:rPr>
+      </w:pPr>
+      <w:r>
+        <w:rPr>
+          <w:rFonts w:cs="Arial"/>
+          <w:sz w:val="24"/>
+          <w:szCs w:val="24"/>
+        </w:rPr>
+        <w:lastRenderedPageBreak/>
+        <w:t>a qualidade da última etapa, em um gráfico de anel com as quantidades boa, de retrabalho e de refugo;</w:t>
+      </w:r>
+    </w:p>
+    <w:p>
+      <w:pPr>
+        <w:pStyle w:val="PargrafodaLista"/>
+        <w:numPr>
+          <w:ilvl w:val="0"/>
+          <w:numId w:val="24"/>
+        </w:numPr>
+        <w:spacing w:before="100" w:beforeAutospacing="1" w:after="100" w:afterAutospacing="1" w:line="360" w:lineRule="auto"/>
+        <w:rPr>
+          <w:rFonts w:cs="Arial"/>
+          <w:sz w:val="24"/>
+          <w:szCs w:val="24"/>
+        </w:rPr>
+      </w:pPr>
+      <w:r>
+        <w:rPr>
+          <w:rFonts w:cs="Arial"/>
+          <w:sz w:val="24"/>
+          <w:szCs w:val="24"/>
+        </w:rPr>
+        <w:t>a produção por etapa, os tempos por posto de trabalho e o tempo por unidade comparado ao tempo padrão;</w:t>
+      </w:r>
+    </w:p>
+    <w:p>
+      <w:pPr>
+        <w:pStyle w:val="PargrafodaLista"/>
+        <w:numPr>
+          <w:ilvl w:val="0"/>
+          <w:numId w:val="24"/>
+        </w:numPr>
+        <w:spacing w:before="100" w:beforeAutospacing="1" w:after="100" w:afterAutospacing="1" w:line="360" w:lineRule="auto"/>
+        <w:rPr>
+          <w:rFonts w:cs="Arial"/>
+          <w:sz w:val="24"/>
+          <w:szCs w:val="24"/>
+        </w:rPr>
+      </w:pPr>
+      <w:r>
+        <w:rPr>
+          <w:rFonts w:cs="Arial"/>
+          <w:sz w:val="24"/>
+          <w:szCs w:val="24"/>
+        </w:rPr>
+        <w:t>a carga pendente de cada posto.</w:t>
+      </w:r>
+    </w:p>
+    <w:p>
+      <w:pPr>
+        <w:spacing w:line="360" w:lineRule="auto"/>
+        <w:ind w:firstLine="708"/>
+        <w:jc w:val="both"/>
+        <w:rPr>
+          <w:sz w:val="24"/>
+          <w:szCs w:val="24"/>
+        </w:rPr>
+      </w:pPr>
+      <w:r>
+        <w:rPr>
+          <w:sz w:val="24"/>
+          <w:szCs w:val="24"/>
+        </w:rPr>
+        <w:t>Cada gráfico possui uma tabela equivalente, e a tela informa em texto os dados ausentes, como etapas sem tempo padrão ou execuções ainda abertas.</w:t>
+      </w:r>
+    </w:p>
+    <w:p>
+      <w:pPr>
+        <w:spacing w:line="360" w:lineRule="auto"/>
+        <w:ind w:firstLine="708"/>
+        <w:jc w:val="both"/>
+        <w:rPr>
+          <w:sz w:val="24"/>
+          <w:szCs w:val="24"/>
+        </w:rPr>
+      </w:pPr>
+      <w:r>
+        <w:rPr>
+          <w:sz w:val="24"/>
+          <w:szCs w:val="24"/>
+        </w:rPr>
+        <w:t>Os indicadores mostram apenas o que pode ser calculado a partir dos registros. Como o sistema não registra a jornada nem a disponibilidade de cada posto de trabalho, a tela não apresenta tempo ocioso. O tempo de pausa é exibido junto com o seu motivo, pois uma pausa não representa, necessariamente, uma perda. Além disso, o tempo registrado é o da execução da etapa e não deve ser usado para avaliar o desempenho individual de um operador.</w:t>
+      </w:r>
+    </w:p>
+    <w:p>
+      <w:pPr>
+        <w:pStyle w:val="Legenda"/>
+        <w:keepNext/>
+      </w:pPr>
+      <w:bookmarkStart w:id="80" w:name="_Toc243992826"/>
+      <w:r>
+        <w:t xml:space="preserve">Figura </w:t>
+      </w:r>
+      <w:r>
+        <w:fldChar w:fldCharType="begin"/>
+      </w:r>
+      <w:r>
+        <w:instrText xml:space="preserve"> SEQ Figura \* ARABIC </w:instrText>
+      </w:r>
+      <w:r>
+        <w:fldChar w:fldCharType="separate"/>
+      </w:r>
+      <w:r>
+        <w:rPr>
+          <w:noProof/>
+        </w:rPr>
+        <w:t>17</w:t>
+      </w:r>
+      <w:r>
+        <w:fldChar w:fldCharType="end"/>
+      </w:r>
+      <w:r>
+        <w:t xml:space="preserve"> – Tela de Indicadores</w:t>
+      </w:r>
+      <w:bookmarkEnd w:id="80"/>
+    </w:p>
+    <w:p>
+      <w:pPr>
+        <w:keepNext/>
+        <w:spacing w:line="360" w:lineRule="auto"/>
+        <w:jc w:val="center"/>
+      </w:pPr>
+      <w:r>
+        <w:rPr>
+          <w:noProof/>
+        </w:rPr>
+        <w:drawing>
+          <wp:inline distT="0" distB="0" distL="0" distR="0" wp14:anchorId="6BC08F85" wp14:editId="554ED767">
+            <wp:extent cx="4800000" cy="3741000"/>
+            <wp:effectExtent l="0" t="0" r="0" b="0"/>
+            <wp:docPr id="917" name="Imagem 917"/>
+            <wp:cNvGraphicFramePr>
+              <a:graphicFrameLocks xmlns:a="http://schemas.openxmlformats.org/drawingml/2006/main" noChangeAspect="1"/>
+            </wp:cNvGraphicFramePr>
+            <a:graphic xmlns:a="http://schemas.openxmlformats.org/drawingml/2006/main">
+              <a:graphicData uri="http://schemas.openxmlformats.org/drawingml/2006/picture">
+                <pic:pic xmlns:pic="http://schemas.openxmlformats.org/drawingml/2006/picture">
+                  <pic:nvPicPr>
+                    <pic:cNvPr id="917" name="Imagem 917"/>
+                    <pic:cNvPicPr/>
+                  </pic:nvPicPr>
+                  <pic:blipFill>
+                    <a:blip r:embed="rId30"/>
+                    <a:stretch>
+                      <a:fillRect/>
+                    </a:stretch>
+                  </pic:blipFill>
+                  <pic:spPr>
+                    <a:xfrm>
+                      <a:off x="0" y="0"/>
+                      <a:ext cx="4800000" cy="3741000"/>
+                    </a:xfrm>
+                    <a:prstGeom prst="rect">
+                      <a:avLst/>
+                    </a:prstGeom>
+                  </pic:spPr>
+                </pic:pic>
+              </a:graphicData>
+            </a:graphic>
+          </wp:inline>
+        </w:drawing>
+      </w:r>
+    </w:p>
+    <w:p>
+      <w:pPr>
+        <w:jc w:val="center"/>
+        <w:rPr>
+          <w:sz w:val="20"/>
+          <w:szCs w:val="20"/>
+        </w:rPr>
+      </w:pPr>
+      <w:r>
+        <w:rPr>
+          <w:sz w:val="20"/>
+          <w:szCs w:val="20"/>
+        </w:rPr>
+        <w:t>Fonte: Próprio autor, acessado em 27 de outubro de 2026.</w:t>
       </w:r>
     </w:p>
     <w:p>
       <w:pPr>
         <w:pStyle w:val="Ttulo2"/>
       </w:pPr>
-      <w:bookmarkStart w:id="76" w:name="_Toc242908894"/>
-      <w:r>
-        <w:t>6.7 Situação Atual da Implementação</w:t>
-      </w:r>
-      <w:bookmarkEnd w:id="76"/>
+      <w:bookmarkStart w:id="81" w:name="_Toc243992807"/>
+      <w:r>
+        <w:lastRenderedPageBreak/>
+        <w:t>6.8 Testes e Publicação</w:t>
+      </w:r>
+      <w:bookmarkEnd w:id="81"/>
     </w:p>
     <w:p>
       <w:pPr>
@@ -23426,15 +24863,306 @@
           <w:sz w:val="24"/>
           <w:szCs w:val="24"/>
         </w:rPr>
-        <w:t xml:space="preserve">Até outubro de 2026 estão implementados o acesso administrativo, o painel com o menu, os cadastros de operadores e de setores, o banco de dados com todas as tabelas e a consulta dos indicadores pela API. Estão em desenvolvimento os demais cadastros, os roteiros, os planos e as ordens de produção, o apontamento da produção, incluindo a identificação por leitor de código, e o painel de indicadores. Por </w:t>
-      </w:r>
-      <w:r>
-        <w:rPr>
+        <w:t>As regras de negócio e os cálculos são verificados por testes automatizados, executados com o executor de testes do próprio Node.js. No fim de outubro de 2026 o projeto possuía 241 testes, dos quais 234 são executados em toda verificação e 7, que dependem do sistema em funcionamento, são executados manualmente.</w:t>
+      </w:r>
+    </w:p>
+    <w:p>
+      <w:pPr>
+        <w:spacing w:line="360" w:lineRule="auto"/>
+        <w:ind w:firstLine="708"/>
+        <w:jc w:val="both"/>
+        <w:rPr>
+          <w:sz w:val="24"/>
+          <w:szCs w:val="24"/>
+        </w:rPr>
+      </w:pPr>
+      <w:r>
+        <w:rPr>
+          <w:sz w:val="24"/>
+          <w:szCs w:val="24"/>
+        </w:rPr>
+        <w:t>Além dos testes automatizados, cada funcionalidade foi verificada com o sistema compilado e um banco de dados de teste. Esse banco era criado a partir das migrações e preenchido com dados fictícios. Nessas verificações foram conferidas as telas, as mensagens de erro e as regras na API, inclusive o caso de dois pedidos enviados ao mesmo tempo.</w:t>
+      </w:r>
+    </w:p>
+    <w:p>
+      <w:pPr>
+        <w:spacing w:line="360" w:lineRule="auto"/>
+        <w:ind w:firstLine="708"/>
+        <w:jc w:val="both"/>
+        <w:rPr>
+          <w:sz w:val="24"/>
+          <w:szCs w:val="24"/>
+        </w:rPr>
+      </w:pPr>
+      <w:r>
+        <w:rPr>
+          <w:sz w:val="24"/>
+          <w:szCs w:val="24"/>
+        </w:rPr>
+        <w:t>O código é mantido em um repositório no GitHub. Cada funcionalidade é desenvolvida em uma ramificação própria e só é incorporada à versão de desenvolvimento por meio de um pull request, após a conferência dos arquivos alterados. A cada pull request, uma verificação automática executa a análise do código, a conferência de tipos, os testes e a compilação do sistema, e a incorporação só é feita quando todas essas etapas são concluídas sem erros.</w:t>
+      </w:r>
+    </w:p>
+    <w:p>
+      <w:pPr>
+        <w:spacing w:line="360" w:lineRule="auto"/>
+        <w:ind w:firstLine="708"/>
+        <w:jc w:val="both"/>
+        <w:rPr>
+          <w:sz w:val="24"/>
+          <w:szCs w:val="24"/>
+        </w:rPr>
+      </w:pPr>
+      <w:r>
+        <w:rPr>
+          <w:sz w:val="24"/>
+          <w:szCs w:val="24"/>
+        </w:rPr>
+        <w:t>A versão de desenvolvimento é publicada automaticamente na plataforma Vercel a cada alteração, com o servidor localizado em São Paulo, o que permite acompanhar a evolução do sistema pelo navegador.</w:t>
+      </w:r>
+    </w:p>
+    <w:p>
+      <w:pPr>
+        <w:pStyle w:val="Ttulo2"/>
+      </w:pPr>
+      <w:bookmarkStart w:id="82" w:name="_Toc243992808"/>
+      <w:r>
+        <w:t>6.9 Situação Atual da Implementação</w:t>
+      </w:r>
+      <w:bookmarkEnd w:id="82"/>
+    </w:p>
+    <w:p>
+      <w:pPr>
+        <w:spacing w:before="100" w:beforeAutospacing="1" w:after="100" w:afterAutospacing="1" w:line="360" w:lineRule="auto"/>
+        <w:ind w:firstLine="708"/>
+        <w:jc w:val="both"/>
+        <w:rPr>
+          <w:rFonts w:cs="Arial"/>
+          <w:sz w:val="24"/>
+          <w:szCs w:val="24"/>
+        </w:rPr>
+      </w:pPr>
+      <w:r>
+        <w:rPr>
+          <w:sz w:val="24"/>
+          <w:szCs w:val="24"/>
+        </w:rPr>
+        <w:t>Até o fim de outubro de 2026 estão implementados:</w:t>
+      </w:r>
+    </w:p>
+    <w:p>
+      <w:pPr>
+        <w:pStyle w:val="PargrafodaLista"/>
+        <w:numPr>
+          <w:ilvl w:val="0"/>
+          <w:numId w:val="24"/>
+        </w:numPr>
+        <w:spacing w:before="100" w:beforeAutospacing="1" w:after="100" w:afterAutospacing="1" w:line="360" w:lineRule="auto"/>
+        <w:rPr>
+          <w:rFonts w:cs="Arial"/>
+          <w:sz w:val="24"/>
+          <w:szCs w:val="24"/>
+        </w:rPr>
+      </w:pPr>
+      <w:r>
+        <w:rPr>
+          <w:rFonts w:cs="Arial"/>
+          <w:sz w:val="24"/>
+          <w:szCs w:val="24"/>
+        </w:rPr>
+        <w:t>o acesso administrativo e todos os cadastros;</w:t>
+      </w:r>
+    </w:p>
+    <w:p>
+      <w:pPr>
+        <w:pStyle w:val="PargrafodaLista"/>
+        <w:numPr>
+          <w:ilvl w:val="0"/>
+          <w:numId w:val="24"/>
+        </w:numPr>
+        <w:spacing w:before="100" w:beforeAutospacing="1" w:after="100" w:afterAutospacing="1" w:line="360" w:lineRule="auto"/>
+        <w:rPr>
+          <w:rFonts w:cs="Arial"/>
+          <w:sz w:val="24"/>
+          <w:szCs w:val="24"/>
+        </w:rPr>
+      </w:pPr>
+      <w:r>
+        <w:rPr>
+          <w:rFonts w:cs="Arial"/>
+          <w:sz w:val="24"/>
+          <w:szCs w:val="24"/>
+        </w:rPr>
+        <w:t>os roteiros, os planos e as ordens de produção;</w:t>
+      </w:r>
+    </w:p>
+    <w:p>
+      <w:pPr>
+        <w:pStyle w:val="PargrafodaLista"/>
+        <w:numPr>
+          <w:ilvl w:val="0"/>
+          <w:numId w:val="24"/>
+        </w:numPr>
+        <w:spacing w:before="100" w:beforeAutospacing="1" w:after="100" w:afterAutospacing="1" w:line="360" w:lineRule="auto"/>
+        <w:rPr>
+          <w:rFonts w:cs="Arial"/>
+          <w:sz w:val="24"/>
+          <w:szCs w:val="24"/>
+        </w:rPr>
+      </w:pPr>
+      <w:r>
+        <w:rPr>
+          <w:rFonts w:cs="Arial"/>
+          <w:sz w:val="24"/>
+          <w:szCs w:val="24"/>
+        </w:rPr>
+        <w:t>a ilha de apontamento, com início, pausa, retomada, troca de operação e baixa;</w:t>
+      </w:r>
+    </w:p>
+    <w:p>
+      <w:pPr>
+        <w:pStyle w:val="PargrafodaLista"/>
+        <w:numPr>
+          <w:ilvl w:val="0"/>
+          <w:numId w:val="24"/>
+        </w:numPr>
+        <w:spacing w:before="100" w:beforeAutospacing="1" w:after="100" w:afterAutospacing="1" w:line="360" w:lineRule="auto"/>
+        <w:rPr>
+          <w:rFonts w:cs="Arial"/>
+          <w:sz w:val="24"/>
+          <w:szCs w:val="24"/>
+        </w:rPr>
+      </w:pPr>
+      <w:r>
+        <w:rPr>
+          <w:rFonts w:cs="Arial"/>
+          <w:sz w:val="24"/>
+          <w:szCs w:val="24"/>
+        </w:rPr>
+        <w:t>a tela de indicadores.</w:t>
+      </w:r>
+    </w:p>
+    <w:p>
+      <w:pPr>
+        <w:spacing w:line="360" w:lineRule="auto"/>
+        <w:ind w:firstLine="708"/>
+        <w:jc w:val="both"/>
+        <w:rPr>
+          <w:sz w:val="24"/>
+          <w:szCs w:val="24"/>
+        </w:rPr>
+      </w:pPr>
+      <w:r>
+        <w:rPr>
+          <w:sz w:val="24"/>
+          <w:szCs w:val="24"/>
+        </w:rPr>
+        <w:t>O fluxo completo, do cadastro do produto até a baixa da última etapa e a consulta dos indicadores, foi executado no sistema publicado.</w:t>
+      </w:r>
+    </w:p>
+    <w:p>
+      <w:pPr>
+        <w:spacing w:line="360" w:lineRule="auto"/>
+        <w:ind w:firstLine="708"/>
+        <w:jc w:val="both"/>
+        <w:rPr>
+          <w:sz w:val="24"/>
+          <w:szCs w:val="24"/>
+        </w:rPr>
+      </w:pPr>
+      <w:r>
+        <w:rPr>
+          <w:sz w:val="24"/>
+          <w:szCs w:val="24"/>
+        </w:rPr>
+        <w:t>Ainda estão pendentes:</w:t>
+      </w:r>
+    </w:p>
+    <w:p>
+      <w:pPr>
+        <w:pStyle w:val="PargrafodaLista"/>
+        <w:numPr>
+          <w:ilvl w:val="0"/>
+          <w:numId w:val="24"/>
+        </w:numPr>
+        <w:spacing w:before="100" w:beforeAutospacing="1" w:after="100" w:afterAutospacing="1" w:line="360" w:lineRule="auto"/>
+        <w:rPr>
+          <w:rFonts w:cs="Arial"/>
+          <w:sz w:val="24"/>
+          <w:szCs w:val="24"/>
+        </w:rPr>
+      </w:pPr>
+      <w:r>
+        <w:rPr>
+          <w:rFonts w:cs="Arial"/>
           <w:sz w:val="24"/>
           <w:szCs w:val="24"/>
         </w:rPr>
         <w:lastRenderedPageBreak/>
-        <w:t>isso, os resultados obtidos com o uso do sistema serão apresentados após a conclusão dessas funcionalidades.</w:t>
+        <w:t>o teste da identificação com um leitor de código físico;</w:t>
+      </w:r>
+    </w:p>
+    <w:p>
+      <w:pPr>
+        <w:pStyle w:val="PargrafodaLista"/>
+        <w:numPr>
+          <w:ilvl w:val="0"/>
+          <w:numId w:val="24"/>
+        </w:numPr>
+        <w:spacing w:before="100" w:beforeAutospacing="1" w:after="100" w:afterAutospacing="1" w:line="360" w:lineRule="auto"/>
+        <w:rPr>
+          <w:rFonts w:cs="Arial"/>
+          <w:sz w:val="24"/>
+          <w:szCs w:val="24"/>
+        </w:rPr>
+      </w:pPr>
+      <w:r>
+        <w:rPr>
+          <w:rFonts w:cs="Arial"/>
+          <w:sz w:val="24"/>
+          <w:szCs w:val="24"/>
+        </w:rPr>
+        <w:t>a definição de quanto tempo a ilha deve esperar, sem uso, antes de limpar a identificação do operador;</w:t>
+      </w:r>
+    </w:p>
+    <w:p>
+      <w:pPr>
+        <w:pStyle w:val="PargrafodaLista"/>
+        <w:numPr>
+          <w:ilvl w:val="0"/>
+          <w:numId w:val="24"/>
+        </w:numPr>
+        <w:spacing w:before="100" w:beforeAutospacing="1" w:after="100" w:afterAutospacing="1" w:line="360" w:lineRule="auto"/>
+        <w:rPr>
+          <w:rFonts w:cs="Arial"/>
+          <w:sz w:val="24"/>
+          <w:szCs w:val="24"/>
+        </w:rPr>
+      </w:pPr>
+      <w:r>
+        <w:rPr>
+          <w:rFonts w:cs="Arial"/>
+          <w:sz w:val="24"/>
+          <w:szCs w:val="24"/>
+        </w:rPr>
+        <w:t>o acesso à ilha a partir do menu do painel.</w:t>
+      </w:r>
+    </w:p>
+    <w:p>
+      <w:pPr>
+        <w:spacing w:line="360" w:lineRule="auto"/>
+        <w:ind w:firstLine="708"/>
+        <w:jc w:val="both"/>
+        <w:rPr>
+          <w:sz w:val="24"/>
+          <w:szCs w:val="24"/>
+        </w:rPr>
+      </w:pPr>
+      <w:r>
+        <w:rPr>
+          <w:sz w:val="24"/>
+          <w:szCs w:val="24"/>
+        </w:rPr>
+        <w:t>Os testes funcionais com o registro das evidências e os resultados obtidos com o uso do sistema serão apresentados após a conclusão dessas etapas.</w:t>
       </w:r>
     </w:p>
     <w:p>
@@ -23463,12 +25191,12 @@
         <w:spacing w:after="100" w:afterAutospacing="1"/>
         <w:jc w:val="center"/>
       </w:pPr>
-      <w:bookmarkStart w:id="77" w:name="_Toc242908895"/>
+      <w:bookmarkStart w:id="83" w:name="_Toc243992809"/>
       <w:r>
         <w:lastRenderedPageBreak/>
         <w:t>REFERÊNCIAS</w:t>
       </w:r>
-      <w:bookmarkEnd w:id="77"/>
+      <w:bookmarkEnd w:id="83"/>
     </w:p>
     <w:p/>
     <w:p>
@@ -24056,7 +25784,7 @@
       </w:r>
     </w:p>
     <w:sectPr>
-      <w:headerReference w:type="default" r:id="rId27"/>
+      <w:headerReference w:type="default" r:id="rId31"/>
       <w:pgSz w:w="11906" w:h="16838" w:code="9"/>
       <w:pgMar w:top="1701" w:right="1134" w:bottom="1134" w:left="1701" w:header="709" w:footer="709" w:gutter="0"/>
       <w:pgNumType w:start="11"/>
@@ -24171,7 +25899,7 @@
         <w:lang w:eastAsia="pt-BR"/>
       </w:rPr>
       <w:drawing>
-        <wp:inline distT="0" distB="0" distL="0" distR="0" wp14:anchorId="18745E85" wp14:editId="435AC339">
+        <wp:inline distT="0" distB="0" distL="0" distR="0" wp14:anchorId="6DF6512A" wp14:editId="1D94A80E">
           <wp:extent cx="1619048" cy="647619"/>
           <wp:effectExtent l="0" t="0" r="0" b="0"/>
           <wp:docPr id="5" name="Imagem 5" descr="Logotipo  O conteúdo gerado por IA pode estar incorreto."/>

</xml_diff>

<commit_message>
docs: atualiza os capítulos 1 e 4 do TCC e a situação da implementação
</commit_message>
<xml_diff>
--- a/docs/tcc/TCC_Nivelamento_de_Processos.docx
+++ b/docs/tcc/TCC_Nivelamento_de_Processos.docx
@@ -1706,7 +1706,7 @@
       <w:r>
         <w:fldChar w:fldCharType="separate"/>
       </w:r>
-      <w:hyperlink w:anchor="_Toc243992810" w:history="1">
+      <w:hyperlink w:anchor="_Toc244071648" w:history="1">
         <w:r>
           <w:rPr>
             <w:rStyle w:val="Hyperlink"/>
@@ -1733,7 +1733,7 @@
             <w:noProof/>
             <w:webHidden/>
           </w:rPr>
-          <w:instrText xml:space="preserve"> PAGEREF _Toc243992810 \h </w:instrText>
+          <w:instrText xml:space="preserve"> PAGEREF _Toc244071648 \h </w:instrText>
         </w:r>
         <w:r>
           <w:rPr>
@@ -1778,7 +1778,7 @@
           <w14:ligatures w14:val="standardContextual"/>
         </w:rPr>
       </w:pPr>
-      <w:hyperlink w:anchor="_Toc243992811" w:history="1">
+      <w:hyperlink w:anchor="_Toc244071649" w:history="1">
         <w:r>
           <w:rPr>
             <w:rStyle w:val="Hyperlink"/>
@@ -1805,7 +1805,7 @@
             <w:noProof/>
             <w:webHidden/>
           </w:rPr>
-          <w:instrText xml:space="preserve"> PAGEREF _Toc243992811 \h </w:instrText>
+          <w:instrText xml:space="preserve"> PAGEREF _Toc244071649 \h </w:instrText>
         </w:r>
         <w:r>
           <w:rPr>
@@ -1850,7 +1850,7 @@
           <w14:ligatures w14:val="standardContextual"/>
         </w:rPr>
       </w:pPr>
-      <w:hyperlink w:anchor="_Toc243992812" w:history="1">
+      <w:hyperlink w:anchor="_Toc244071650" w:history="1">
         <w:r>
           <w:rPr>
             <w:rStyle w:val="Hyperlink"/>
@@ -1877,7 +1877,7 @@
             <w:noProof/>
             <w:webHidden/>
           </w:rPr>
-          <w:instrText xml:space="preserve"> PAGEREF _Toc243992812 \h </w:instrText>
+          <w:instrText xml:space="preserve"> PAGEREF _Toc244071650 \h </w:instrText>
         </w:r>
         <w:r>
           <w:rPr>
@@ -1922,7 +1922,7 @@
           <w14:ligatures w14:val="standardContextual"/>
         </w:rPr>
       </w:pPr>
-      <w:hyperlink w:anchor="_Toc243992813" w:history="1">
+      <w:hyperlink w:anchor="_Toc244071651" w:history="1">
         <w:r>
           <w:rPr>
             <w:rStyle w:val="Hyperlink"/>
@@ -1949,7 +1949,7 @@
             <w:noProof/>
             <w:webHidden/>
           </w:rPr>
-          <w:instrText xml:space="preserve"> PAGEREF _Toc243992813 \h </w:instrText>
+          <w:instrText xml:space="preserve"> PAGEREF _Toc244071651 \h </w:instrText>
         </w:r>
         <w:r>
           <w:rPr>
@@ -1994,7 +1994,7 @@
           <w14:ligatures w14:val="standardContextual"/>
         </w:rPr>
       </w:pPr>
-      <w:hyperlink w:anchor="_Toc243992814" w:history="1">
+      <w:hyperlink w:anchor="_Toc244071652" w:history="1">
         <w:r>
           <w:rPr>
             <w:rStyle w:val="Hyperlink"/>
@@ -2021,7 +2021,7 @@
             <w:noProof/>
             <w:webHidden/>
           </w:rPr>
-          <w:instrText xml:space="preserve"> PAGEREF _Toc243992814 \h </w:instrText>
+          <w:instrText xml:space="preserve"> PAGEREF _Toc244071652 \h </w:instrText>
         </w:r>
         <w:r>
           <w:rPr>
@@ -2066,7 +2066,7 @@
           <w14:ligatures w14:val="standardContextual"/>
         </w:rPr>
       </w:pPr>
-      <w:hyperlink w:anchor="_Toc243992815" w:history="1">
+      <w:hyperlink w:anchor="_Toc244071653" w:history="1">
         <w:r>
           <w:rPr>
             <w:rStyle w:val="Hyperlink"/>
@@ -2093,7 +2093,7 @@
             <w:noProof/>
             <w:webHidden/>
           </w:rPr>
-          <w:instrText xml:space="preserve"> PAGEREF _Toc243992815 \h </w:instrText>
+          <w:instrText xml:space="preserve"> PAGEREF _Toc244071653 \h </w:instrText>
         </w:r>
         <w:r>
           <w:rPr>
@@ -2138,7 +2138,7 @@
           <w14:ligatures w14:val="standardContextual"/>
         </w:rPr>
       </w:pPr>
-      <w:hyperlink w:anchor="_Toc243992816" w:history="1">
+      <w:hyperlink w:anchor="_Toc244071654" w:history="1">
         <w:r>
           <w:rPr>
             <w:rStyle w:val="Hyperlink"/>
@@ -2165,7 +2165,7 @@
             <w:noProof/>
             <w:webHidden/>
           </w:rPr>
-          <w:instrText xml:space="preserve"> PAGEREF _Toc243992816 \h </w:instrText>
+          <w:instrText xml:space="preserve"> PAGEREF _Toc244071654 \h </w:instrText>
         </w:r>
         <w:r>
           <w:rPr>
@@ -2210,7 +2210,7 @@
           <w14:ligatures w14:val="standardContextual"/>
         </w:rPr>
       </w:pPr>
-      <w:hyperlink w:anchor="_Toc243992817" w:history="1">
+      <w:hyperlink w:anchor="_Toc244071655" w:history="1">
         <w:r>
           <w:rPr>
             <w:rStyle w:val="Hyperlink"/>
@@ -2237,7 +2237,7 @@
             <w:noProof/>
             <w:webHidden/>
           </w:rPr>
-          <w:instrText xml:space="preserve"> PAGEREF _Toc243992817 \h </w:instrText>
+          <w:instrText xml:space="preserve"> PAGEREF _Toc244071655 \h </w:instrText>
         </w:r>
         <w:r>
           <w:rPr>
@@ -2282,7 +2282,7 @@
           <w14:ligatures w14:val="standardContextual"/>
         </w:rPr>
       </w:pPr>
-      <w:hyperlink w:anchor="_Toc243992818" w:history="1">
+      <w:hyperlink w:anchor="_Toc244071656" w:history="1">
         <w:r>
           <w:rPr>
             <w:rStyle w:val="Hyperlink"/>
@@ -2309,7 +2309,7 @@
             <w:noProof/>
             <w:webHidden/>
           </w:rPr>
-          <w:instrText xml:space="preserve"> PAGEREF _Toc243992818 \h </w:instrText>
+          <w:instrText xml:space="preserve"> PAGEREF _Toc244071656 \h </w:instrText>
         </w:r>
         <w:r>
           <w:rPr>
@@ -2354,7 +2354,7 @@
           <w14:ligatures w14:val="standardContextual"/>
         </w:rPr>
       </w:pPr>
-      <w:hyperlink w:anchor="_Toc243992819" w:history="1">
+      <w:hyperlink w:anchor="_Toc244071657" w:history="1">
         <w:r>
           <w:rPr>
             <w:rStyle w:val="Hyperlink"/>
@@ -2381,7 +2381,7 @@
             <w:noProof/>
             <w:webHidden/>
           </w:rPr>
-          <w:instrText xml:space="preserve"> PAGEREF _Toc243992819 \h </w:instrText>
+          <w:instrText xml:space="preserve"> PAGEREF _Toc244071657 \h </w:instrText>
         </w:r>
         <w:r>
           <w:rPr>
@@ -2426,7 +2426,7 @@
           <w14:ligatures w14:val="standardContextual"/>
         </w:rPr>
       </w:pPr>
-      <w:hyperlink w:anchor="_Toc243992820" w:history="1">
+      <w:hyperlink w:anchor="_Toc244071658" w:history="1">
         <w:r>
           <w:rPr>
             <w:rStyle w:val="Hyperlink"/>
@@ -2453,7 +2453,7 @@
             <w:noProof/>
             <w:webHidden/>
           </w:rPr>
-          <w:instrText xml:space="preserve"> PAGEREF _Toc243992820 \h </w:instrText>
+          <w:instrText xml:space="preserve"> PAGEREF _Toc244071658 \h </w:instrText>
         </w:r>
         <w:r>
           <w:rPr>
@@ -2498,7 +2498,7 @@
           <w14:ligatures w14:val="standardContextual"/>
         </w:rPr>
       </w:pPr>
-      <w:hyperlink w:anchor="_Toc243992821" w:history="1">
+      <w:hyperlink w:anchor="_Toc244071659" w:history="1">
         <w:r>
           <w:rPr>
             <w:rStyle w:val="Hyperlink"/>
@@ -2525,7 +2525,7 @@
             <w:noProof/>
             <w:webHidden/>
           </w:rPr>
-          <w:instrText xml:space="preserve"> PAGEREF _Toc243992821 \h </w:instrText>
+          <w:instrText xml:space="preserve"> PAGEREF _Toc244071659 \h </w:instrText>
         </w:r>
         <w:r>
           <w:rPr>
@@ -2570,7 +2570,7 @@
           <w14:ligatures w14:val="standardContextual"/>
         </w:rPr>
       </w:pPr>
-      <w:hyperlink w:anchor="_Toc243992822" w:history="1">
+      <w:hyperlink w:anchor="_Toc244071660" w:history="1">
         <w:r>
           <w:rPr>
             <w:rStyle w:val="Hyperlink"/>
@@ -2597,7 +2597,7 @@
             <w:noProof/>
             <w:webHidden/>
           </w:rPr>
-          <w:instrText xml:space="preserve"> PAGEREF _Toc243992822 \h </w:instrText>
+          <w:instrText xml:space="preserve"> PAGEREF _Toc244071660 \h </w:instrText>
         </w:r>
         <w:r>
           <w:rPr>
@@ -2642,7 +2642,7 @@
           <w14:ligatures w14:val="standardContextual"/>
         </w:rPr>
       </w:pPr>
-      <w:hyperlink w:anchor="_Toc243992823" w:history="1">
+      <w:hyperlink w:anchor="_Toc244071661" w:history="1">
         <w:r>
           <w:rPr>
             <w:rStyle w:val="Hyperlink"/>
@@ -2669,7 +2669,7 @@
             <w:noProof/>
             <w:webHidden/>
           </w:rPr>
-          <w:instrText xml:space="preserve"> PAGEREF _Toc243992823 \h </w:instrText>
+          <w:instrText xml:space="preserve"> PAGEREF _Toc244071661 \h </w:instrText>
         </w:r>
         <w:r>
           <w:rPr>
@@ -2714,7 +2714,7 @@
           <w14:ligatures w14:val="standardContextual"/>
         </w:rPr>
       </w:pPr>
-      <w:hyperlink w:anchor="_Toc243992824" w:history="1">
+      <w:hyperlink w:anchor="_Toc244071662" w:history="1">
         <w:r>
           <w:rPr>
             <w:rStyle w:val="Hyperlink"/>
@@ -2741,7 +2741,7 @@
             <w:noProof/>
             <w:webHidden/>
           </w:rPr>
-          <w:instrText xml:space="preserve"> PAGEREF _Toc243992824 \h </w:instrText>
+          <w:instrText xml:space="preserve"> PAGEREF _Toc244071662 \h </w:instrText>
         </w:r>
         <w:r>
           <w:rPr>
@@ -2786,7 +2786,7 @@
           <w14:ligatures w14:val="standardContextual"/>
         </w:rPr>
       </w:pPr>
-      <w:hyperlink w:anchor="_Toc243992825" w:history="1">
+      <w:hyperlink w:anchor="_Toc244071663" w:history="1">
         <w:r>
           <w:rPr>
             <w:rStyle w:val="Hyperlink"/>
@@ -2813,7 +2813,7 @@
             <w:noProof/>
             <w:webHidden/>
           </w:rPr>
-          <w:instrText xml:space="preserve"> PAGEREF _Toc243992825 \h </w:instrText>
+          <w:instrText xml:space="preserve"> PAGEREF _Toc244071663 \h </w:instrText>
         </w:r>
         <w:r>
           <w:rPr>
@@ -2858,7 +2858,7 @@
           <w14:ligatures w14:val="standardContextual"/>
         </w:rPr>
       </w:pPr>
-      <w:hyperlink w:anchor="_Toc243992826" w:history="1">
+      <w:hyperlink w:anchor="_Toc244071664" w:history="1">
         <w:r>
           <w:rPr>
             <w:rStyle w:val="Hyperlink"/>
@@ -2885,7 +2885,7 @@
             <w:noProof/>
             <w:webHidden/>
           </w:rPr>
-          <w:instrText xml:space="preserve"> PAGEREF _Toc243992826 \h </w:instrText>
+          <w:instrText xml:space="preserve"> PAGEREF _Toc244071664 \h </w:instrText>
         </w:r>
         <w:r>
           <w:rPr>
@@ -2973,7 +2973,7 @@
       <w:r>
         <w:fldChar w:fldCharType="separate"/>
       </w:r>
-      <w:hyperlink w:anchor="_Toc243992827" w:history="1">
+      <w:hyperlink w:anchor="_Toc244071665" w:history="1">
         <w:r>
           <w:rPr>
             <w:rStyle w:val="Hyperlink"/>
@@ -3000,7 +3000,7 @@
             <w:noProof/>
             <w:webHidden/>
           </w:rPr>
-          <w:instrText xml:space="preserve"> PAGEREF _Toc243992827 \h </w:instrText>
+          <w:instrText xml:space="preserve"> PAGEREF _Toc244071665 \h </w:instrText>
         </w:r>
         <w:r>
           <w:rPr>
@@ -3045,7 +3045,7 @@
           <w14:ligatures w14:val="standardContextual"/>
         </w:rPr>
       </w:pPr>
-      <w:hyperlink w:anchor="_Toc243992828" w:history="1">
+      <w:hyperlink w:anchor="_Toc244071666" w:history="1">
         <w:r>
           <w:rPr>
             <w:rStyle w:val="Hyperlink"/>
@@ -3072,7 +3072,7 @@
             <w:noProof/>
             <w:webHidden/>
           </w:rPr>
-          <w:instrText xml:space="preserve"> PAGEREF _Toc243992828 \h </w:instrText>
+          <w:instrText xml:space="preserve"> PAGEREF _Toc244071666 \h </w:instrText>
         </w:r>
         <w:r>
           <w:rPr>
@@ -3117,7 +3117,7 @@
           <w14:ligatures w14:val="standardContextual"/>
         </w:rPr>
       </w:pPr>
-      <w:hyperlink w:anchor="_Toc243992829" w:history="1">
+      <w:hyperlink w:anchor="_Toc244071667" w:history="1">
         <w:r>
           <w:rPr>
             <w:rStyle w:val="Hyperlink"/>
@@ -3144,7 +3144,7 @@
             <w:noProof/>
             <w:webHidden/>
           </w:rPr>
-          <w:instrText xml:space="preserve"> PAGEREF _Toc243992829 \h </w:instrText>
+          <w:instrText xml:space="preserve"> PAGEREF _Toc244071667 \h </w:instrText>
         </w:r>
         <w:r>
           <w:rPr>
@@ -3189,13 +3189,13 @@
           <w14:ligatures w14:val="standardContextual"/>
         </w:rPr>
       </w:pPr>
-      <w:hyperlink w:anchor="_Toc243992830" w:history="1">
+      <w:hyperlink w:anchor="_Toc244071668" w:history="1">
         <w:r>
           <w:rPr>
             <w:rStyle w:val="Hyperlink"/>
             <w:noProof/>
           </w:rPr>
-          <w:t>Tabela 4 – Requisitos da Tela de Cadastro de Tarefas</w:t>
+          <w:t>Tabela 4 – Requisitos da Tela de Cadastro de Operações</w:t>
         </w:r>
         <w:r>
           <w:rPr>
@@ -3216,7 +3216,7 @@
             <w:noProof/>
             <w:webHidden/>
           </w:rPr>
-          <w:instrText xml:space="preserve"> PAGEREF _Toc243992830 \h </w:instrText>
+          <w:instrText xml:space="preserve"> PAGEREF _Toc244071668 \h </w:instrText>
         </w:r>
         <w:r>
           <w:rPr>
@@ -3261,7 +3261,7 @@
           <w14:ligatures w14:val="standardContextual"/>
         </w:rPr>
       </w:pPr>
-      <w:hyperlink w:anchor="_Toc243992831" w:history="1">
+      <w:hyperlink w:anchor="_Toc244071669" w:history="1">
         <w:r>
           <w:rPr>
             <w:rStyle w:val="Hyperlink"/>
@@ -3288,7 +3288,7 @@
             <w:noProof/>
             <w:webHidden/>
           </w:rPr>
-          <w:instrText xml:space="preserve"> PAGEREF _Toc243992831 \h </w:instrText>
+          <w:instrText xml:space="preserve"> PAGEREF _Toc244071669 \h </w:instrText>
         </w:r>
         <w:r>
           <w:rPr>
@@ -3333,7 +3333,7 @@
           <w14:ligatures w14:val="standardContextual"/>
         </w:rPr>
       </w:pPr>
-      <w:hyperlink w:anchor="_Toc243992832" w:history="1">
+      <w:hyperlink w:anchor="_Toc244071670" w:history="1">
         <w:r>
           <w:rPr>
             <w:rStyle w:val="Hyperlink"/>
@@ -3360,7 +3360,7 @@
             <w:noProof/>
             <w:webHidden/>
           </w:rPr>
-          <w:instrText xml:space="preserve"> PAGEREF _Toc243992832 \h </w:instrText>
+          <w:instrText xml:space="preserve"> PAGEREF _Toc244071670 \h </w:instrText>
         </w:r>
         <w:r>
           <w:rPr>
@@ -3405,13 +3405,13 @@
           <w14:ligatures w14:val="standardContextual"/>
         </w:rPr>
       </w:pPr>
-      <w:hyperlink w:anchor="_Toc243992833" w:history="1">
+      <w:hyperlink w:anchor="_Toc244071671" w:history="1">
         <w:r>
           <w:rPr>
             <w:rStyle w:val="Hyperlink"/>
             <w:noProof/>
           </w:rPr>
-          <w:t>Tabela 7 – Requisitos da Tela de Monitoramento da Produção</w:t>
+          <w:t>Tabela 7 – Requisitos da Tela de Indicadores</w:t>
         </w:r>
         <w:r>
           <w:rPr>
@@ -3432,7 +3432,7 @@
             <w:noProof/>
             <w:webHidden/>
           </w:rPr>
-          <w:instrText xml:space="preserve"> PAGEREF _Toc243992833 \h </w:instrText>
+          <w:instrText xml:space="preserve"> PAGEREF _Toc244071671 \h </w:instrText>
         </w:r>
         <w:r>
           <w:rPr>
@@ -3477,7 +3477,7 @@
           <w14:ligatures w14:val="standardContextual"/>
         </w:rPr>
       </w:pPr>
-      <w:hyperlink w:anchor="_Toc243992834" w:history="1">
+      <w:hyperlink w:anchor="_Toc244071672" w:history="1">
         <w:r>
           <w:rPr>
             <w:rStyle w:val="Hyperlink"/>
@@ -3504,7 +3504,7 @@
             <w:noProof/>
             <w:webHidden/>
           </w:rPr>
-          <w:instrText xml:space="preserve"> PAGEREF _Toc243992834 \h </w:instrText>
+          <w:instrText xml:space="preserve"> PAGEREF _Toc244071672 \h </w:instrText>
         </w:r>
         <w:r>
           <w:rPr>
@@ -3549,7 +3549,7 @@
           <w14:ligatures w14:val="standardContextual"/>
         </w:rPr>
       </w:pPr>
-      <w:hyperlink w:anchor="_Toc243992835" w:history="1">
+      <w:hyperlink w:anchor="_Toc244071673" w:history="1">
         <w:r>
           <w:rPr>
             <w:rStyle w:val="Hyperlink"/>
@@ -3576,7 +3576,7 @@
             <w:noProof/>
             <w:webHidden/>
           </w:rPr>
-          <w:instrText xml:space="preserve"> PAGEREF _Toc243992835 \h </w:instrText>
+          <w:instrText xml:space="preserve"> PAGEREF _Toc244071673 \h </w:instrText>
         </w:r>
         <w:r>
           <w:rPr>
@@ -3621,7 +3621,7 @@
           <w14:ligatures w14:val="standardContextual"/>
         </w:rPr>
       </w:pPr>
-      <w:hyperlink w:anchor="_Toc243992836" w:history="1">
+      <w:hyperlink w:anchor="_Toc244071674" w:history="1">
         <w:r>
           <w:rPr>
             <w:rStyle w:val="Hyperlink"/>
@@ -3648,7 +3648,7 @@
             <w:noProof/>
             <w:webHidden/>
           </w:rPr>
-          <w:instrText xml:space="preserve"> PAGEREF _Toc243992836 \h </w:instrText>
+          <w:instrText xml:space="preserve"> PAGEREF _Toc244071674 \h </w:instrText>
         </w:r>
         <w:r>
           <w:rPr>
@@ -4204,7 +4204,7 @@
             </w:rPr>
             <w:fldChar w:fldCharType="separate"/>
           </w:r>
-          <w:hyperlink w:anchor="_Toc243992753" w:history="1">
+          <w:hyperlink w:anchor="_Toc244071591" w:history="1">
             <w:r>
               <w:rPr>
                 <w:rStyle w:val="Hyperlink"/>
@@ -4227,7 +4227,7 @@
               <w:rPr>
                 <w:webHidden/>
               </w:rPr>
-              <w:instrText xml:space="preserve"> PAGEREF _Toc243992753 \h </w:instrText>
+              <w:instrText xml:space="preserve"> PAGEREF _Toc244071591 \h </w:instrText>
             </w:r>
             <w:r>
               <w:rPr>
@@ -4270,7 +4270,7 @@
               <w14:ligatures w14:val="standardContextual"/>
             </w:rPr>
           </w:pPr>
-          <w:hyperlink w:anchor="_Toc243992754" w:history="1">
+          <w:hyperlink w:anchor="_Toc244071592" w:history="1">
             <w:r>
               <w:rPr>
                 <w:rStyle w:val="Hyperlink"/>
@@ -4298,7 +4298,7 @@
                 <w:noProof/>
                 <w:webHidden/>
               </w:rPr>
-              <w:instrText xml:space="preserve"> PAGEREF _Toc243992754 \h </w:instrText>
+              <w:instrText xml:space="preserve"> PAGEREF _Toc244071592 \h </w:instrText>
             </w:r>
             <w:r>
               <w:rPr>
@@ -4345,7 +4345,7 @@
               <w14:ligatures w14:val="standardContextual"/>
             </w:rPr>
           </w:pPr>
-          <w:hyperlink w:anchor="_Toc243992755" w:history="1">
+          <w:hyperlink w:anchor="_Toc244071593" w:history="1">
             <w:r>
               <w:rPr>
                 <w:rStyle w:val="Hyperlink"/>
@@ -4373,7 +4373,7 @@
                 <w:noProof/>
                 <w:webHidden/>
               </w:rPr>
-              <w:instrText xml:space="preserve"> PAGEREF _Toc243992755 \h </w:instrText>
+              <w:instrText xml:space="preserve"> PAGEREF _Toc244071593 \h </w:instrText>
             </w:r>
             <w:r>
               <w:rPr>
@@ -4420,7 +4420,7 @@
               <w14:ligatures w14:val="standardContextual"/>
             </w:rPr>
           </w:pPr>
-          <w:hyperlink w:anchor="_Toc243992756" w:history="1">
+          <w:hyperlink w:anchor="_Toc244071594" w:history="1">
             <w:r>
               <w:rPr>
                 <w:rStyle w:val="Hyperlink"/>
@@ -4448,7 +4448,7 @@
                 <w:noProof/>
                 <w:webHidden/>
               </w:rPr>
-              <w:instrText xml:space="preserve"> PAGEREF _Toc243992756 \h </w:instrText>
+              <w:instrText xml:space="preserve"> PAGEREF _Toc244071594 \h </w:instrText>
             </w:r>
             <w:r>
               <w:rPr>
@@ -4495,7 +4495,7 @@
               <w14:ligatures w14:val="standardContextual"/>
             </w:rPr>
           </w:pPr>
-          <w:hyperlink w:anchor="_Toc243992757" w:history="1">
+          <w:hyperlink w:anchor="_Toc244071595" w:history="1">
             <w:r>
               <w:rPr>
                 <w:rStyle w:val="Hyperlink"/>
@@ -4522,7 +4522,7 @@
                 <w:noProof/>
                 <w:webHidden/>
               </w:rPr>
-              <w:instrText xml:space="preserve"> PAGEREF _Toc243992757 \h </w:instrText>
+              <w:instrText xml:space="preserve"> PAGEREF _Toc244071595 \h </w:instrText>
             </w:r>
             <w:r>
               <w:rPr>
@@ -4569,7 +4569,7 @@
               <w14:ligatures w14:val="standardContextual"/>
             </w:rPr>
           </w:pPr>
-          <w:hyperlink w:anchor="_Toc243992758" w:history="1">
+          <w:hyperlink w:anchor="_Toc244071596" w:history="1">
             <w:r>
               <w:rPr>
                 <w:rStyle w:val="Hyperlink"/>
@@ -4596,7 +4596,7 @@
                 <w:noProof/>
                 <w:webHidden/>
               </w:rPr>
-              <w:instrText xml:space="preserve"> PAGEREF _Toc243992758 \h </w:instrText>
+              <w:instrText xml:space="preserve"> PAGEREF _Toc244071596 \h </w:instrText>
             </w:r>
             <w:r>
               <w:rPr>
@@ -4643,7 +4643,7 @@
               <w14:ligatures w14:val="standardContextual"/>
             </w:rPr>
           </w:pPr>
-          <w:hyperlink w:anchor="_Toc243992759" w:history="1">
+          <w:hyperlink w:anchor="_Toc244071597" w:history="1">
             <w:r>
               <w:rPr>
                 <w:rStyle w:val="Hyperlink"/>
@@ -4671,7 +4671,7 @@
                 <w:noProof/>
                 <w:webHidden/>
               </w:rPr>
-              <w:instrText xml:space="preserve"> PAGEREF _Toc243992759 \h </w:instrText>
+              <w:instrText xml:space="preserve"> PAGEREF _Toc244071597 \h </w:instrText>
             </w:r>
             <w:r>
               <w:rPr>
@@ -4718,7 +4718,7 @@
               <w14:ligatures w14:val="standardContextual"/>
             </w:rPr>
           </w:pPr>
-          <w:hyperlink w:anchor="_Toc243992760" w:history="1">
+          <w:hyperlink w:anchor="_Toc244071598" w:history="1">
             <w:r>
               <w:rPr>
                 <w:rStyle w:val="Hyperlink"/>
@@ -4746,7 +4746,7 @@
                 <w:noProof/>
                 <w:webHidden/>
               </w:rPr>
-              <w:instrText xml:space="preserve"> PAGEREF _Toc243992760 \h </w:instrText>
+              <w:instrText xml:space="preserve"> PAGEREF _Toc244071598 \h </w:instrText>
             </w:r>
             <w:r>
               <w:rPr>
@@ -4790,7 +4790,7 @@
               <w14:ligatures w14:val="standardContextual"/>
             </w:rPr>
           </w:pPr>
-          <w:hyperlink w:anchor="_Toc243992761" w:history="1">
+          <w:hyperlink w:anchor="_Toc244071599" w:history="1">
             <w:r>
               <w:rPr>
                 <w:rStyle w:val="Hyperlink"/>
@@ -4813,7 +4813,7 @@
               <w:rPr>
                 <w:webHidden/>
               </w:rPr>
-              <w:instrText xml:space="preserve"> PAGEREF _Toc243992761 \h </w:instrText>
+              <w:instrText xml:space="preserve"> PAGEREF _Toc244071599 \h </w:instrText>
             </w:r>
             <w:r>
               <w:rPr>
@@ -4856,7 +4856,7 @@
               <w14:ligatures w14:val="standardContextual"/>
             </w:rPr>
           </w:pPr>
-          <w:hyperlink w:anchor="_Toc243992762" w:history="1">
+          <w:hyperlink w:anchor="_Toc244071600" w:history="1">
             <w:r>
               <w:rPr>
                 <w:rStyle w:val="Hyperlink"/>
@@ -4884,7 +4884,7 @@
                 <w:noProof/>
                 <w:webHidden/>
               </w:rPr>
-              <w:instrText xml:space="preserve"> PAGEREF _Toc243992762 \h </w:instrText>
+              <w:instrText xml:space="preserve"> PAGEREF _Toc244071600 \h </w:instrText>
             </w:r>
             <w:r>
               <w:rPr>
@@ -4931,7 +4931,7 @@
               <w14:ligatures w14:val="standardContextual"/>
             </w:rPr>
           </w:pPr>
-          <w:hyperlink w:anchor="_Toc243992763" w:history="1">
+          <w:hyperlink w:anchor="_Toc244071601" w:history="1">
             <w:r>
               <w:rPr>
                 <w:rStyle w:val="Hyperlink"/>
@@ -4959,7 +4959,7 @@
                 <w:noProof/>
                 <w:webHidden/>
               </w:rPr>
-              <w:instrText xml:space="preserve"> PAGEREF _Toc243992763 \h </w:instrText>
+              <w:instrText xml:space="preserve"> PAGEREF _Toc244071601 \h </w:instrText>
             </w:r>
             <w:r>
               <w:rPr>
@@ -5006,7 +5006,7 @@
               <w14:ligatures w14:val="standardContextual"/>
             </w:rPr>
           </w:pPr>
-          <w:hyperlink w:anchor="_Toc243992764" w:history="1">
+          <w:hyperlink w:anchor="_Toc244071602" w:history="1">
             <w:r>
               <w:rPr>
                 <w:rStyle w:val="Hyperlink"/>
@@ -5034,7 +5034,7 @@
                 <w:noProof/>
                 <w:webHidden/>
               </w:rPr>
-              <w:instrText xml:space="preserve"> PAGEREF _Toc243992764 \h </w:instrText>
+              <w:instrText xml:space="preserve"> PAGEREF _Toc244071602 \h </w:instrText>
             </w:r>
             <w:r>
               <w:rPr>
@@ -5081,7 +5081,7 @@
               <w14:ligatures w14:val="standardContextual"/>
             </w:rPr>
           </w:pPr>
-          <w:hyperlink w:anchor="_Toc243992765" w:history="1">
+          <w:hyperlink w:anchor="_Toc244071603" w:history="1">
             <w:r>
               <w:rPr>
                 <w:rStyle w:val="Hyperlink"/>
@@ -5109,7 +5109,7 @@
                 <w:noProof/>
                 <w:webHidden/>
               </w:rPr>
-              <w:instrText xml:space="preserve"> PAGEREF _Toc243992765 \h </w:instrText>
+              <w:instrText xml:space="preserve"> PAGEREF _Toc244071603 \h </w:instrText>
             </w:r>
             <w:r>
               <w:rPr>
@@ -5156,7 +5156,7 @@
               <w14:ligatures w14:val="standardContextual"/>
             </w:rPr>
           </w:pPr>
-          <w:hyperlink w:anchor="_Toc243992766" w:history="1">
+          <w:hyperlink w:anchor="_Toc244071604" w:history="1">
             <w:r>
               <w:rPr>
                 <w:rStyle w:val="Hyperlink"/>
@@ -5185,7 +5185,7 @@
                 <w:noProof/>
                 <w:webHidden/>
               </w:rPr>
-              <w:instrText xml:space="preserve"> PAGEREF _Toc243992766 \h </w:instrText>
+              <w:instrText xml:space="preserve"> PAGEREF _Toc244071604 \h </w:instrText>
             </w:r>
             <w:r>
               <w:rPr>
@@ -5232,7 +5232,7 @@
               <w14:ligatures w14:val="standardContextual"/>
             </w:rPr>
           </w:pPr>
-          <w:hyperlink w:anchor="_Toc243992767" w:history="1">
+          <w:hyperlink w:anchor="_Toc244071605" w:history="1">
             <w:r>
               <w:rPr>
                 <w:rStyle w:val="Hyperlink"/>
@@ -5260,7 +5260,7 @@
                 <w:noProof/>
                 <w:webHidden/>
               </w:rPr>
-              <w:instrText xml:space="preserve"> PAGEREF _Toc243992767 \h </w:instrText>
+              <w:instrText xml:space="preserve"> PAGEREF _Toc244071605 \h </w:instrText>
             </w:r>
             <w:r>
               <w:rPr>
@@ -5307,7 +5307,7 @@
               <w14:ligatures w14:val="standardContextual"/>
             </w:rPr>
           </w:pPr>
-          <w:hyperlink w:anchor="_Toc243992768" w:history="1">
+          <w:hyperlink w:anchor="_Toc244071606" w:history="1">
             <w:r>
               <w:rPr>
                 <w:rStyle w:val="Hyperlink"/>
@@ -5335,7 +5335,7 @@
                 <w:noProof/>
                 <w:webHidden/>
               </w:rPr>
-              <w:instrText xml:space="preserve"> PAGEREF _Toc243992768 \h </w:instrText>
+              <w:instrText xml:space="preserve"> PAGEREF _Toc244071606 \h </w:instrText>
             </w:r>
             <w:r>
               <w:rPr>
@@ -5382,7 +5382,7 @@
               <w14:ligatures w14:val="standardContextual"/>
             </w:rPr>
           </w:pPr>
-          <w:hyperlink w:anchor="_Toc243992769" w:history="1">
+          <w:hyperlink w:anchor="_Toc244071607" w:history="1">
             <w:r>
               <w:rPr>
                 <w:rStyle w:val="Hyperlink"/>
@@ -5410,7 +5410,7 @@
                 <w:noProof/>
                 <w:webHidden/>
               </w:rPr>
-              <w:instrText xml:space="preserve"> PAGEREF _Toc243992769 \h </w:instrText>
+              <w:instrText xml:space="preserve"> PAGEREF _Toc244071607 \h </w:instrText>
             </w:r>
             <w:r>
               <w:rPr>
@@ -5457,7 +5457,7 @@
               <w14:ligatures w14:val="standardContextual"/>
             </w:rPr>
           </w:pPr>
-          <w:hyperlink w:anchor="_Toc243992770" w:history="1">
+          <w:hyperlink w:anchor="_Toc244071608" w:history="1">
             <w:r>
               <w:rPr>
                 <w:rStyle w:val="Hyperlink"/>
@@ -5484,7 +5484,7 @@
                 <w:noProof/>
                 <w:webHidden/>
               </w:rPr>
-              <w:instrText xml:space="preserve"> PAGEREF _Toc243992770 \h </w:instrText>
+              <w:instrText xml:space="preserve"> PAGEREF _Toc244071608 \h </w:instrText>
             </w:r>
             <w:r>
               <w:rPr>
@@ -5528,7 +5528,7 @@
               <w14:ligatures w14:val="standardContextual"/>
             </w:rPr>
           </w:pPr>
-          <w:hyperlink w:anchor="_Toc243992771" w:history="1">
+          <w:hyperlink w:anchor="_Toc244071609" w:history="1">
             <w:r>
               <w:rPr>
                 <w:rStyle w:val="Hyperlink"/>
@@ -5551,7 +5551,7 @@
               <w:rPr>
                 <w:webHidden/>
               </w:rPr>
-              <w:instrText xml:space="preserve"> PAGEREF _Toc243992771 \h </w:instrText>
+              <w:instrText xml:space="preserve"> PAGEREF _Toc244071609 \h </w:instrText>
             </w:r>
             <w:r>
               <w:rPr>
@@ -5594,7 +5594,7 @@
               <w14:ligatures w14:val="standardContextual"/>
             </w:rPr>
           </w:pPr>
-          <w:hyperlink w:anchor="_Toc243992772" w:history="1">
+          <w:hyperlink w:anchor="_Toc244071610" w:history="1">
             <w:r>
               <w:rPr>
                 <w:rStyle w:val="Hyperlink"/>
@@ -5622,7 +5622,7 @@
                 <w:noProof/>
                 <w:webHidden/>
               </w:rPr>
-              <w:instrText xml:space="preserve"> PAGEREF _Toc243992772 \h </w:instrText>
+              <w:instrText xml:space="preserve"> PAGEREF _Toc244071610 \h </w:instrText>
             </w:r>
             <w:r>
               <w:rPr>
@@ -5669,7 +5669,7 @@
               <w14:ligatures w14:val="standardContextual"/>
             </w:rPr>
           </w:pPr>
-          <w:hyperlink w:anchor="_Toc243992773" w:history="1">
+          <w:hyperlink w:anchor="_Toc244071611" w:history="1">
             <w:r>
               <w:rPr>
                 <w:rStyle w:val="Hyperlink"/>
@@ -5696,7 +5696,7 @@
                 <w:noProof/>
                 <w:webHidden/>
               </w:rPr>
-              <w:instrText xml:space="preserve"> PAGEREF _Toc243992773 \h </w:instrText>
+              <w:instrText xml:space="preserve"> PAGEREF _Toc244071611 \h </w:instrText>
             </w:r>
             <w:r>
               <w:rPr>
@@ -5743,7 +5743,7 @@
               <w14:ligatures w14:val="standardContextual"/>
             </w:rPr>
           </w:pPr>
-          <w:hyperlink w:anchor="_Toc243992774" w:history="1">
+          <w:hyperlink w:anchor="_Toc244071612" w:history="1">
             <w:r>
               <w:rPr>
                 <w:rStyle w:val="Hyperlink"/>
@@ -5770,7 +5770,7 @@
                 <w:noProof/>
                 <w:webHidden/>
               </w:rPr>
-              <w:instrText xml:space="preserve"> PAGEREF _Toc243992774 \h </w:instrText>
+              <w:instrText xml:space="preserve"> PAGEREF _Toc244071612 \h </w:instrText>
             </w:r>
             <w:r>
               <w:rPr>
@@ -5817,7 +5817,7 @@
               <w14:ligatures w14:val="standardContextual"/>
             </w:rPr>
           </w:pPr>
-          <w:hyperlink w:anchor="_Toc243992775" w:history="1">
+          <w:hyperlink w:anchor="_Toc244071613" w:history="1">
             <w:r>
               <w:rPr>
                 <w:rStyle w:val="Hyperlink"/>
@@ -5844,7 +5844,7 @@
                 <w:noProof/>
                 <w:webHidden/>
               </w:rPr>
-              <w:instrText xml:space="preserve"> PAGEREF _Toc243992775 \h </w:instrText>
+              <w:instrText xml:space="preserve"> PAGEREF _Toc244071613 \h </w:instrText>
             </w:r>
             <w:r>
               <w:rPr>
@@ -5891,7 +5891,7 @@
               <w14:ligatures w14:val="standardContextual"/>
             </w:rPr>
           </w:pPr>
-          <w:hyperlink w:anchor="_Toc243992776" w:history="1">
+          <w:hyperlink w:anchor="_Toc244071614" w:history="1">
             <w:r>
               <w:rPr>
                 <w:rStyle w:val="Hyperlink"/>
@@ -5918,7 +5918,7 @@
                 <w:noProof/>
                 <w:webHidden/>
               </w:rPr>
-              <w:instrText xml:space="preserve"> PAGEREF _Toc243992776 \h </w:instrText>
+              <w:instrText xml:space="preserve"> PAGEREF _Toc244071614 \h </w:instrText>
             </w:r>
             <w:r>
               <w:rPr>
@@ -5965,7 +5965,7 @@
               <w14:ligatures w14:val="standardContextual"/>
             </w:rPr>
           </w:pPr>
-          <w:hyperlink w:anchor="_Toc243992777" w:history="1">
+          <w:hyperlink w:anchor="_Toc244071615" w:history="1">
             <w:r>
               <w:rPr>
                 <w:rStyle w:val="Hyperlink"/>
@@ -5992,7 +5992,7 @@
                 <w:noProof/>
                 <w:webHidden/>
               </w:rPr>
-              <w:instrText xml:space="preserve"> PAGEREF _Toc243992777 \h </w:instrText>
+              <w:instrText xml:space="preserve"> PAGEREF _Toc244071615 \h </w:instrText>
             </w:r>
             <w:r>
               <w:rPr>
@@ -6039,7 +6039,7 @@
               <w14:ligatures w14:val="standardContextual"/>
             </w:rPr>
           </w:pPr>
-          <w:hyperlink w:anchor="_Toc243992778" w:history="1">
+          <w:hyperlink w:anchor="_Toc244071616" w:history="1">
             <w:r>
               <w:rPr>
                 <w:rStyle w:val="Hyperlink"/>
@@ -6066,7 +6066,7 @@
                 <w:noProof/>
                 <w:webHidden/>
               </w:rPr>
-              <w:instrText xml:space="preserve"> PAGEREF _Toc243992778 \h </w:instrText>
+              <w:instrText xml:space="preserve"> PAGEREF _Toc244071616 \h </w:instrText>
             </w:r>
             <w:r>
               <w:rPr>
@@ -6110,7 +6110,7 @@
               <w14:ligatures w14:val="standardContextual"/>
             </w:rPr>
           </w:pPr>
-          <w:hyperlink w:anchor="_Toc243992779" w:history="1">
+          <w:hyperlink w:anchor="_Toc244071617" w:history="1">
             <w:r>
               <w:rPr>
                 <w:rStyle w:val="Hyperlink"/>
@@ -6133,7 +6133,7 @@
               <w:rPr>
                 <w:webHidden/>
               </w:rPr>
-              <w:instrText xml:space="preserve"> PAGEREF _Toc243992779 \h </w:instrText>
+              <w:instrText xml:space="preserve"> PAGEREF _Toc244071617 \h </w:instrText>
             </w:r>
             <w:r>
               <w:rPr>
@@ -6176,7 +6176,7 @@
               <w14:ligatures w14:val="standardContextual"/>
             </w:rPr>
           </w:pPr>
-          <w:hyperlink w:anchor="_Toc243992780" w:history="1">
+          <w:hyperlink w:anchor="_Toc244071618" w:history="1">
             <w:r>
               <w:rPr>
                 <w:rStyle w:val="Hyperlink"/>
@@ -6203,7 +6203,7 @@
                 <w:noProof/>
                 <w:webHidden/>
               </w:rPr>
-              <w:instrText xml:space="preserve"> PAGEREF _Toc243992780 \h </w:instrText>
+              <w:instrText xml:space="preserve"> PAGEREF _Toc244071618 \h </w:instrText>
             </w:r>
             <w:r>
               <w:rPr>
@@ -6250,7 +6250,7 @@
               <w14:ligatures w14:val="standardContextual"/>
             </w:rPr>
           </w:pPr>
-          <w:hyperlink w:anchor="_Toc243992781" w:history="1">
+          <w:hyperlink w:anchor="_Toc244071619" w:history="1">
             <w:r>
               <w:rPr>
                 <w:rStyle w:val="Hyperlink"/>
@@ -6277,7 +6277,7 @@
                 <w:noProof/>
                 <w:webHidden/>
               </w:rPr>
-              <w:instrText xml:space="preserve"> PAGEREF _Toc243992781 \h </w:instrText>
+              <w:instrText xml:space="preserve"> PAGEREF _Toc244071619 \h </w:instrText>
             </w:r>
             <w:r>
               <w:rPr>
@@ -6324,7 +6324,7 @@
               <w14:ligatures w14:val="standardContextual"/>
             </w:rPr>
           </w:pPr>
-          <w:hyperlink w:anchor="_Toc243992782" w:history="1">
+          <w:hyperlink w:anchor="_Toc244071620" w:history="1">
             <w:r>
               <w:rPr>
                 <w:rStyle w:val="Hyperlink"/>
@@ -6351,7 +6351,7 @@
                 <w:noProof/>
                 <w:webHidden/>
               </w:rPr>
-              <w:instrText xml:space="preserve"> PAGEREF _Toc243992782 \h </w:instrText>
+              <w:instrText xml:space="preserve"> PAGEREF _Toc244071620 \h </w:instrText>
             </w:r>
             <w:r>
               <w:rPr>
@@ -6398,7 +6398,7 @@
               <w14:ligatures w14:val="standardContextual"/>
             </w:rPr>
           </w:pPr>
-          <w:hyperlink w:anchor="_Toc243992783" w:history="1">
+          <w:hyperlink w:anchor="_Toc244071621" w:history="1">
             <w:r>
               <w:rPr>
                 <w:rStyle w:val="Hyperlink"/>
@@ -6425,7 +6425,7 @@
                 <w:noProof/>
                 <w:webHidden/>
               </w:rPr>
-              <w:instrText xml:space="preserve"> PAGEREF _Toc243992783 \h </w:instrText>
+              <w:instrText xml:space="preserve"> PAGEREF _Toc244071621 \h </w:instrText>
             </w:r>
             <w:r>
               <w:rPr>
@@ -6472,7 +6472,7 @@
               <w14:ligatures w14:val="standardContextual"/>
             </w:rPr>
           </w:pPr>
-          <w:hyperlink w:anchor="_Toc243992784" w:history="1">
+          <w:hyperlink w:anchor="_Toc244071622" w:history="1">
             <w:r>
               <w:rPr>
                 <w:rStyle w:val="Hyperlink"/>
@@ -6499,7 +6499,7 @@
                 <w:noProof/>
                 <w:webHidden/>
               </w:rPr>
-              <w:instrText xml:space="preserve"> PAGEREF _Toc243992784 \h </w:instrText>
+              <w:instrText xml:space="preserve"> PAGEREF _Toc244071622 \h </w:instrText>
             </w:r>
             <w:r>
               <w:rPr>
@@ -6546,13 +6546,13 @@
               <w14:ligatures w14:val="standardContextual"/>
             </w:rPr>
           </w:pPr>
-          <w:hyperlink w:anchor="_Toc243992785" w:history="1">
+          <w:hyperlink w:anchor="_Toc244071623" w:history="1">
             <w:r>
               <w:rPr>
                 <w:rStyle w:val="Hyperlink"/>
                 <w:noProof/>
               </w:rPr>
-              <w:t>4.2.4 Requisitos Funcionais da Tela de Cadastro de Tarefas</w:t>
+              <w:t>4.2.4 Requisitos Funcionais da Tela de Cadastro de Operações</w:t>
             </w:r>
             <w:r>
               <w:rPr>
@@ -6573,7 +6573,7 @@
                 <w:noProof/>
                 <w:webHidden/>
               </w:rPr>
-              <w:instrText xml:space="preserve"> PAGEREF _Toc243992785 \h </w:instrText>
+              <w:instrText xml:space="preserve"> PAGEREF _Toc244071623 \h </w:instrText>
             </w:r>
             <w:r>
               <w:rPr>
@@ -6620,7 +6620,7 @@
               <w14:ligatures w14:val="standardContextual"/>
             </w:rPr>
           </w:pPr>
-          <w:hyperlink w:anchor="_Toc243992786" w:history="1">
+          <w:hyperlink w:anchor="_Toc244071624" w:history="1">
             <w:r>
               <w:rPr>
                 <w:rStyle w:val="Hyperlink"/>
@@ -6647,7 +6647,7 @@
                 <w:noProof/>
                 <w:webHidden/>
               </w:rPr>
-              <w:instrText xml:space="preserve"> PAGEREF _Toc243992786 \h </w:instrText>
+              <w:instrText xml:space="preserve"> PAGEREF _Toc244071624 \h </w:instrText>
             </w:r>
             <w:r>
               <w:rPr>
@@ -6694,7 +6694,7 @@
               <w14:ligatures w14:val="standardContextual"/>
             </w:rPr>
           </w:pPr>
-          <w:hyperlink w:anchor="_Toc243992787" w:history="1">
+          <w:hyperlink w:anchor="_Toc244071625" w:history="1">
             <w:r>
               <w:rPr>
                 <w:rStyle w:val="Hyperlink"/>
@@ -6721,7 +6721,7 @@
                 <w:noProof/>
                 <w:webHidden/>
               </w:rPr>
-              <w:instrText xml:space="preserve"> PAGEREF _Toc243992787 \h </w:instrText>
+              <w:instrText xml:space="preserve"> PAGEREF _Toc244071625 \h </w:instrText>
             </w:r>
             <w:r>
               <w:rPr>
@@ -6768,13 +6768,13 @@
               <w14:ligatures w14:val="standardContextual"/>
             </w:rPr>
           </w:pPr>
-          <w:hyperlink w:anchor="_Toc243992788" w:history="1">
+          <w:hyperlink w:anchor="_Toc244071626" w:history="1">
             <w:r>
               <w:rPr>
                 <w:rStyle w:val="Hyperlink"/>
                 <w:noProof/>
               </w:rPr>
-              <w:t>4.2.7 Requisitos Funcionais da Tela de Monitoramento da Produção</w:t>
+              <w:t>4.2.7 Requisitos Funcionais da Tela de Indicadores</w:t>
             </w:r>
             <w:r>
               <w:rPr>
@@ -6795,7 +6795,7 @@
                 <w:noProof/>
                 <w:webHidden/>
               </w:rPr>
-              <w:instrText xml:space="preserve"> PAGEREF _Toc243992788 \h </w:instrText>
+              <w:instrText xml:space="preserve"> PAGEREF _Toc244071626 \h </w:instrText>
             </w:r>
             <w:r>
               <w:rPr>
@@ -6842,7 +6842,7 @@
               <w14:ligatures w14:val="standardContextual"/>
             </w:rPr>
           </w:pPr>
-          <w:hyperlink w:anchor="_Toc243992789" w:history="1">
+          <w:hyperlink w:anchor="_Toc244071627" w:history="1">
             <w:r>
               <w:rPr>
                 <w:rStyle w:val="Hyperlink"/>
@@ -6869,7 +6869,7 @@
                 <w:noProof/>
                 <w:webHidden/>
               </w:rPr>
-              <w:instrText xml:space="preserve"> PAGEREF _Toc243992789 \h </w:instrText>
+              <w:instrText xml:space="preserve"> PAGEREF _Toc244071627 \h </w:instrText>
             </w:r>
             <w:r>
               <w:rPr>
@@ -6916,7 +6916,7 @@
               <w14:ligatures w14:val="standardContextual"/>
             </w:rPr>
           </w:pPr>
-          <w:hyperlink w:anchor="_Toc243992790" w:history="1">
+          <w:hyperlink w:anchor="_Toc244071628" w:history="1">
             <w:r>
               <w:rPr>
                 <w:rStyle w:val="Hyperlink"/>
@@ -6943,7 +6943,7 @@
                 <w:noProof/>
                 <w:webHidden/>
               </w:rPr>
-              <w:instrText xml:space="preserve"> PAGEREF _Toc243992790 \h </w:instrText>
+              <w:instrText xml:space="preserve"> PAGEREF _Toc244071628 \h </w:instrText>
             </w:r>
             <w:r>
               <w:rPr>
@@ -6990,7 +6990,7 @@
               <w14:ligatures w14:val="standardContextual"/>
             </w:rPr>
           </w:pPr>
-          <w:hyperlink w:anchor="_Toc243992791" w:history="1">
+          <w:hyperlink w:anchor="_Toc244071629" w:history="1">
             <w:r>
               <w:rPr>
                 <w:rStyle w:val="Hyperlink"/>
@@ -7017,7 +7017,7 @@
                 <w:noProof/>
                 <w:webHidden/>
               </w:rPr>
-              <w:instrText xml:space="preserve"> PAGEREF _Toc243992791 \h </w:instrText>
+              <w:instrText xml:space="preserve"> PAGEREF _Toc244071629 \h </w:instrText>
             </w:r>
             <w:r>
               <w:rPr>
@@ -7064,7 +7064,7 @@
               <w14:ligatures w14:val="standardContextual"/>
             </w:rPr>
           </w:pPr>
-          <w:hyperlink w:anchor="_Toc243992792" w:history="1">
+          <w:hyperlink w:anchor="_Toc244071630" w:history="1">
             <w:r>
               <w:rPr>
                 <w:rStyle w:val="Hyperlink"/>
@@ -7091,7 +7091,7 @@
                 <w:noProof/>
                 <w:webHidden/>
               </w:rPr>
-              <w:instrText xml:space="preserve"> PAGEREF _Toc243992792 \h </w:instrText>
+              <w:instrText xml:space="preserve"> PAGEREF _Toc244071630 \h </w:instrText>
             </w:r>
             <w:r>
               <w:rPr>
@@ -7138,7 +7138,7 @@
               <w14:ligatures w14:val="standardContextual"/>
             </w:rPr>
           </w:pPr>
-          <w:hyperlink w:anchor="_Toc243992793" w:history="1">
+          <w:hyperlink w:anchor="_Toc244071631" w:history="1">
             <w:r>
               <w:rPr>
                 <w:rStyle w:val="Hyperlink"/>
@@ -7165,7 +7165,7 @@
                 <w:noProof/>
                 <w:webHidden/>
               </w:rPr>
-              <w:instrText xml:space="preserve"> PAGEREF _Toc243992793 \h </w:instrText>
+              <w:instrText xml:space="preserve"> PAGEREF _Toc244071631 \h </w:instrText>
             </w:r>
             <w:r>
               <w:rPr>
@@ -7212,13 +7212,13 @@
               <w14:ligatures w14:val="standardContextual"/>
             </w:rPr>
           </w:pPr>
-          <w:hyperlink w:anchor="_Toc243992794" w:history="1">
+          <w:hyperlink w:anchor="_Toc244071632" w:history="1">
             <w:r>
               <w:rPr>
                 <w:rStyle w:val="Hyperlink"/>
                 <w:noProof/>
               </w:rPr>
-              <w:t>4.5 Possível Estrutura do Sistema</w:t>
+              <w:t>4.5 Estrutura do Sistema</w:t>
             </w:r>
             <w:r>
               <w:rPr>
@@ -7239,7 +7239,7 @@
                 <w:noProof/>
                 <w:webHidden/>
               </w:rPr>
-              <w:instrText xml:space="preserve"> PAGEREF _Toc243992794 \h </w:instrText>
+              <w:instrText xml:space="preserve"> PAGEREF _Toc244071632 \h </w:instrText>
             </w:r>
             <w:r>
               <w:rPr>
@@ -7283,7 +7283,7 @@
               <w14:ligatures w14:val="standardContextual"/>
             </w:rPr>
           </w:pPr>
-          <w:hyperlink w:anchor="_Toc243992795" w:history="1">
+          <w:hyperlink w:anchor="_Toc244071633" w:history="1">
             <w:r>
               <w:rPr>
                 <w:rStyle w:val="Hyperlink"/>
@@ -7306,7 +7306,7 @@
               <w:rPr>
                 <w:webHidden/>
               </w:rPr>
-              <w:instrText xml:space="preserve"> PAGEREF _Toc243992795 \h </w:instrText>
+              <w:instrText xml:space="preserve"> PAGEREF _Toc244071633 \h </w:instrText>
             </w:r>
             <w:r>
               <w:rPr>
@@ -7349,7 +7349,7 @@
               <w14:ligatures w14:val="standardContextual"/>
             </w:rPr>
           </w:pPr>
-          <w:hyperlink w:anchor="_Toc243992796" w:history="1">
+          <w:hyperlink w:anchor="_Toc244071634" w:history="1">
             <w:r>
               <w:rPr>
                 <w:rStyle w:val="Hyperlink"/>
@@ -7376,7 +7376,7 @@
                 <w:noProof/>
                 <w:webHidden/>
               </w:rPr>
-              <w:instrText xml:space="preserve"> PAGEREF _Toc243992796 \h </w:instrText>
+              <w:instrText xml:space="preserve"> PAGEREF _Toc244071634 \h </w:instrText>
             </w:r>
             <w:r>
               <w:rPr>
@@ -7423,7 +7423,7 @@
               <w14:ligatures w14:val="standardContextual"/>
             </w:rPr>
           </w:pPr>
-          <w:hyperlink w:anchor="_Toc243992797" w:history="1">
+          <w:hyperlink w:anchor="_Toc244071635" w:history="1">
             <w:r>
               <w:rPr>
                 <w:rStyle w:val="Hyperlink"/>
@@ -7450,7 +7450,7 @@
                 <w:noProof/>
                 <w:webHidden/>
               </w:rPr>
-              <w:instrText xml:space="preserve"> PAGEREF _Toc243992797 \h </w:instrText>
+              <w:instrText xml:space="preserve"> PAGEREF _Toc244071635 \h </w:instrText>
             </w:r>
             <w:r>
               <w:rPr>
@@ -7497,7 +7497,7 @@
               <w14:ligatures w14:val="standardContextual"/>
             </w:rPr>
           </w:pPr>
-          <w:hyperlink w:anchor="_Toc243992798" w:history="1">
+          <w:hyperlink w:anchor="_Toc244071636" w:history="1">
             <w:r>
               <w:rPr>
                 <w:rStyle w:val="Hyperlink"/>
@@ -7524,7 +7524,7 @@
                 <w:noProof/>
                 <w:webHidden/>
               </w:rPr>
-              <w:instrText xml:space="preserve"> PAGEREF _Toc243992798 \h </w:instrText>
+              <w:instrText xml:space="preserve"> PAGEREF _Toc244071636 \h </w:instrText>
             </w:r>
             <w:r>
               <w:rPr>
@@ -7568,7 +7568,7 @@
               <w14:ligatures w14:val="standardContextual"/>
             </w:rPr>
           </w:pPr>
-          <w:hyperlink w:anchor="_Toc243992799" w:history="1">
+          <w:hyperlink w:anchor="_Toc244071637" w:history="1">
             <w:r>
               <w:rPr>
                 <w:rStyle w:val="Hyperlink"/>
@@ -7591,7 +7591,7 @@
               <w:rPr>
                 <w:webHidden/>
               </w:rPr>
-              <w:instrText xml:space="preserve"> PAGEREF _Toc243992799 \h </w:instrText>
+              <w:instrText xml:space="preserve"> PAGEREF _Toc244071637 \h </w:instrText>
             </w:r>
             <w:r>
               <w:rPr>
@@ -7634,7 +7634,7 @@
               <w14:ligatures w14:val="standardContextual"/>
             </w:rPr>
           </w:pPr>
-          <w:hyperlink w:anchor="_Toc243992800" w:history="1">
+          <w:hyperlink w:anchor="_Toc244071638" w:history="1">
             <w:r>
               <w:rPr>
                 <w:rStyle w:val="Hyperlink"/>
@@ -7661,7 +7661,7 @@
                 <w:noProof/>
                 <w:webHidden/>
               </w:rPr>
-              <w:instrText xml:space="preserve"> PAGEREF _Toc243992800 \h </w:instrText>
+              <w:instrText xml:space="preserve"> PAGEREF _Toc244071638 \h </w:instrText>
             </w:r>
             <w:r>
               <w:rPr>
@@ -7708,7 +7708,7 @@
               <w14:ligatures w14:val="standardContextual"/>
             </w:rPr>
           </w:pPr>
-          <w:hyperlink w:anchor="_Toc243992801" w:history="1">
+          <w:hyperlink w:anchor="_Toc244071639" w:history="1">
             <w:r>
               <w:rPr>
                 <w:rStyle w:val="Hyperlink"/>
@@ -7735,7 +7735,7 @@
                 <w:noProof/>
                 <w:webHidden/>
               </w:rPr>
-              <w:instrText xml:space="preserve"> PAGEREF _Toc243992801 \h </w:instrText>
+              <w:instrText xml:space="preserve"> PAGEREF _Toc244071639 \h </w:instrText>
             </w:r>
             <w:r>
               <w:rPr>
@@ -7782,7 +7782,7 @@
               <w14:ligatures w14:val="standardContextual"/>
             </w:rPr>
           </w:pPr>
-          <w:hyperlink w:anchor="_Toc243992802" w:history="1">
+          <w:hyperlink w:anchor="_Toc244071640" w:history="1">
             <w:r>
               <w:rPr>
                 <w:rStyle w:val="Hyperlink"/>
@@ -7809,7 +7809,7 @@
                 <w:noProof/>
                 <w:webHidden/>
               </w:rPr>
-              <w:instrText xml:space="preserve"> PAGEREF _Toc243992802 \h </w:instrText>
+              <w:instrText xml:space="preserve"> PAGEREF _Toc244071640 \h </w:instrText>
             </w:r>
             <w:r>
               <w:rPr>
@@ -7856,7 +7856,7 @@
               <w14:ligatures w14:val="standardContextual"/>
             </w:rPr>
           </w:pPr>
-          <w:hyperlink w:anchor="_Toc243992803" w:history="1">
+          <w:hyperlink w:anchor="_Toc244071641" w:history="1">
             <w:r>
               <w:rPr>
                 <w:rStyle w:val="Hyperlink"/>
@@ -7883,7 +7883,7 @@
                 <w:noProof/>
                 <w:webHidden/>
               </w:rPr>
-              <w:instrText xml:space="preserve"> PAGEREF _Toc243992803 \h </w:instrText>
+              <w:instrText xml:space="preserve"> PAGEREF _Toc244071641 \h </w:instrText>
             </w:r>
             <w:r>
               <w:rPr>
@@ -7930,7 +7930,7 @@
               <w14:ligatures w14:val="standardContextual"/>
             </w:rPr>
           </w:pPr>
-          <w:hyperlink w:anchor="_Toc243992804" w:history="1">
+          <w:hyperlink w:anchor="_Toc244071642" w:history="1">
             <w:r>
               <w:rPr>
                 <w:rStyle w:val="Hyperlink"/>
@@ -7957,7 +7957,7 @@
                 <w:noProof/>
                 <w:webHidden/>
               </w:rPr>
-              <w:instrText xml:space="preserve"> PAGEREF _Toc243992804 \h </w:instrText>
+              <w:instrText xml:space="preserve"> PAGEREF _Toc244071642 \h </w:instrText>
             </w:r>
             <w:r>
               <w:rPr>
@@ -8004,7 +8004,7 @@
               <w14:ligatures w14:val="standardContextual"/>
             </w:rPr>
           </w:pPr>
-          <w:hyperlink w:anchor="_Toc243992805" w:history="1">
+          <w:hyperlink w:anchor="_Toc244071643" w:history="1">
             <w:r>
               <w:rPr>
                 <w:rStyle w:val="Hyperlink"/>
@@ -8031,7 +8031,7 @@
                 <w:noProof/>
                 <w:webHidden/>
               </w:rPr>
-              <w:instrText xml:space="preserve"> PAGEREF _Toc243992805 \h </w:instrText>
+              <w:instrText xml:space="preserve"> PAGEREF _Toc244071643 \h </w:instrText>
             </w:r>
             <w:r>
               <w:rPr>
@@ -8078,7 +8078,7 @@
               <w14:ligatures w14:val="standardContextual"/>
             </w:rPr>
           </w:pPr>
-          <w:hyperlink w:anchor="_Toc243992806" w:history="1">
+          <w:hyperlink w:anchor="_Toc244071644" w:history="1">
             <w:r>
               <w:rPr>
                 <w:rStyle w:val="Hyperlink"/>
@@ -8105,7 +8105,7 @@
                 <w:noProof/>
                 <w:webHidden/>
               </w:rPr>
-              <w:instrText xml:space="preserve"> PAGEREF _Toc243992806 \h </w:instrText>
+              <w:instrText xml:space="preserve"> PAGEREF _Toc244071644 \h </w:instrText>
             </w:r>
             <w:r>
               <w:rPr>
@@ -8152,7 +8152,7 @@
               <w14:ligatures w14:val="standardContextual"/>
             </w:rPr>
           </w:pPr>
-          <w:hyperlink w:anchor="_Toc243992807" w:history="1">
+          <w:hyperlink w:anchor="_Toc244071645" w:history="1">
             <w:r>
               <w:rPr>
                 <w:rStyle w:val="Hyperlink"/>
@@ -8179,7 +8179,7 @@
                 <w:noProof/>
                 <w:webHidden/>
               </w:rPr>
-              <w:instrText xml:space="preserve"> PAGEREF _Toc243992807 \h </w:instrText>
+              <w:instrText xml:space="preserve"> PAGEREF _Toc244071645 \h </w:instrText>
             </w:r>
             <w:r>
               <w:rPr>
@@ -8226,7 +8226,7 @@
               <w14:ligatures w14:val="standardContextual"/>
             </w:rPr>
           </w:pPr>
-          <w:hyperlink w:anchor="_Toc243992808" w:history="1">
+          <w:hyperlink w:anchor="_Toc244071646" w:history="1">
             <w:r>
               <w:rPr>
                 <w:rStyle w:val="Hyperlink"/>
@@ -8253,7 +8253,7 @@
                 <w:noProof/>
                 <w:webHidden/>
               </w:rPr>
-              <w:instrText xml:space="preserve"> PAGEREF _Toc243992808 \h </w:instrText>
+              <w:instrText xml:space="preserve"> PAGEREF _Toc244071646 \h </w:instrText>
             </w:r>
             <w:r>
               <w:rPr>
@@ -8297,7 +8297,7 @@
               <w14:ligatures w14:val="standardContextual"/>
             </w:rPr>
           </w:pPr>
-          <w:hyperlink w:anchor="_Toc243992809" w:history="1">
+          <w:hyperlink w:anchor="_Toc244071647" w:history="1">
             <w:r>
               <w:rPr>
                 <w:rStyle w:val="Hyperlink"/>
@@ -8320,7 +8320,7 @@
               <w:rPr>
                 <w:webHidden/>
               </w:rPr>
-              <w:instrText xml:space="preserve"> PAGEREF _Toc243992809 \h </w:instrText>
+              <w:instrText xml:space="preserve"> PAGEREF _Toc244071647 \h </w:instrText>
             </w:r>
             <w:r>
               <w:rPr>
@@ -8384,7 +8384,7 @@
         <w:pStyle w:val="Ttulo1"/>
         <w:spacing w:after="100" w:afterAutospacing="1" w:line="360" w:lineRule="auto"/>
       </w:pPr>
-      <w:bookmarkStart w:id="0" w:name="_Toc243992753"/>
+      <w:bookmarkStart w:id="0" w:name="_Toc244071591"/>
       <w:r>
         <w:rPr>
           <w:sz w:val="24"/>
@@ -8402,7 +8402,7 @@
           <w:rFonts w:cs="Arial"/>
         </w:rPr>
       </w:pPr>
-      <w:bookmarkStart w:id="1" w:name="_Toc243992754"/>
+      <w:bookmarkStart w:id="1" w:name="_Toc244071592"/>
       <w:r>
         <w:rPr>
           <w:rFonts w:cs="Arial"/>
@@ -8500,7 +8500,7 @@
           <w:rFonts w:cs="Arial"/>
         </w:rPr>
       </w:pPr>
-      <w:bookmarkStart w:id="2" w:name="_Toc243992755"/>
+      <w:bookmarkStart w:id="2" w:name="_Toc244071593"/>
       <w:r>
         <w:rPr>
           <w:rFonts w:cs="Arial"/>
@@ -8527,7 +8527,7 @@
           <w:szCs w:val="24"/>
         </w:rPr>
         <w:tab/>
-        <w:t>Diante desse contexto, surge a seguinte questão de pesquisa: como um sistema web pode auxiliar no gerenciamento e no nivelamento de processos em linhas de produção, contribuindo para a identificação de gargalos e para o aumento da eficiência produtiva?</w:t>
+        <w:t>Diante desse contexto, surge a seguinte questão de pesquisa: como um sistema web pode auxiliar no gerenciamento e no nivelamento de processos em linhas de produção, apoiando a identificação de gargalos e de desperdícios a partir dos registros da produção?</w:t>
       </w:r>
     </w:p>
     <w:p>
@@ -8538,7 +8538,7 @@
           <w:rFonts w:cs="Arial"/>
         </w:rPr>
       </w:pPr>
-      <w:bookmarkStart w:id="3" w:name="_Toc243992756"/>
+      <w:bookmarkStart w:id="3" w:name="_Toc244071594"/>
       <w:r>
         <w:rPr>
           <w:rFonts w:cs="Arial"/>
@@ -8553,7 +8553,7 @@
         <w:pStyle w:val="Ttulo3"/>
         <w:spacing w:before="100" w:beforeAutospacing="1" w:after="100" w:afterAutospacing="1" w:line="360" w:lineRule="auto"/>
       </w:pPr>
-      <w:bookmarkStart w:id="4" w:name="_Toc243992757"/>
+      <w:bookmarkStart w:id="4" w:name="_Toc244071595"/>
       <w:r>
         <w:t>1.3.1 Objetivo Geral</w:t>
       </w:r>
@@ -8588,7 +8588,7 @@
           <w:i/>
         </w:rPr>
       </w:pPr>
-      <w:bookmarkStart w:id="5" w:name="_Toc243992758"/>
+      <w:bookmarkStart w:id="5" w:name="_Toc244071596"/>
       <w:r>
         <w:t>1.3.2 Objetivos Específicos</w:t>
       </w:r>
@@ -8637,7 +8637,7 @@
           <w:sz w:val="24"/>
           <w:szCs w:val="24"/>
         </w:rPr>
-        <w:t>Permitir o cadastro e gerenciamento de produtos, roteiros, tarefas e postos de trabalho;</w:t>
+        <w:t>Permitir o cadastro e gerenciamento de produtos, operações, roteiros, setores, postos de trabalho e operadores;</w:t>
       </w:r>
     </w:p>
     <w:p>
@@ -8683,7 +8683,7 @@
           <w:sz w:val="24"/>
           <w:szCs w:val="24"/>
         </w:rPr>
-        <w:t>Demonstrar atividades que agregam e os que não agregam valor;</w:t>
+        <w:t>Registrar as quantidades boas, de retrabalho e de refugo em cada etapa;</w:t>
       </w:r>
     </w:p>
     <w:p>
@@ -8706,7 +8706,7 @@
           <w:sz w:val="24"/>
           <w:szCs w:val="24"/>
         </w:rPr>
-        <w:t>Registrar os tempos de execução e de pausa das atividades, mostrando onde ocorre desperdício de tempo;</w:t>
+        <w:t>Registrar os tempos de execução e de pausa das atividades, com o motivo de cada pausa;</w:t>
       </w:r>
     </w:p>
     <w:p>
@@ -8729,7 +8729,7 @@
           <w:sz w:val="24"/>
           <w:szCs w:val="24"/>
         </w:rPr>
-        <w:t xml:space="preserve">Auxiliar na distribuição equilibrada das atividades; </w:t>
+        <w:t xml:space="preserve">Estimar a carga pendente de cada posto de trabalho, auxiliando na distribuição equilibrada das atividades; </w:t>
       </w:r>
     </w:p>
     <w:p>
@@ -8794,7 +8794,7 @@
           <w:rFonts w:cs="Arial"/>
         </w:rPr>
       </w:pPr>
-      <w:bookmarkStart w:id="6" w:name="_Toc243992759"/>
+      <w:bookmarkStart w:id="6" w:name="_Toc244071597"/>
       <w:r>
         <w:rPr>
           <w:rFonts w:cs="Arial"/>
@@ -8838,7 +8838,7 @@
           <w:szCs w:val="24"/>
           <w:lang w:eastAsia="pt-BR"/>
         </w:rPr>
-        <w:t>Nesse sentido, o desenvolvimento de um sistema web pode oferecer maior praticidade no gerenciamento das etapas produtivas, além de facilitar a distribuição das tarefas e o acompanhamento do desempenho da produção. A ferramenta também poderá contribuir para a tomada de decisões, permitindo identificar gargalos, atrasos e oportunidades de melhoria.</w:t>
+        <w:t>Nesse sentido, o desenvolvimento de um sistema web pode oferecer maior praticidade no gerenciamento das etapas produtivas, além de facilitar a distribuição das atividades e o acompanhamento do desempenho da produção. A ferramenta também poderá contribuir para a tomada de decisões, reunindo informações que ajudam a identificar gargalos, atrasos e oportunidades de melhoria.</w:t>
       </w:r>
     </w:p>
     <w:p>
@@ -8871,7 +8871,7 @@
           <w:rFonts w:cs="Arial"/>
         </w:rPr>
       </w:pPr>
-      <w:bookmarkStart w:id="7" w:name="_Toc243992760"/>
+      <w:bookmarkStart w:id="7" w:name="_Toc244071598"/>
       <w:r>
         <w:rPr>
           <w:rFonts w:cs="Arial"/>
@@ -9040,7 +9040,7 @@
           <w:sz w:val="24"/>
         </w:rPr>
       </w:pPr>
-      <w:bookmarkStart w:id="8" w:name="_Toc243992761"/>
+      <w:bookmarkStart w:id="8" w:name="_Toc244071599"/>
       <w:r>
         <w:rPr>
           <w:sz w:val="24"/>
@@ -9058,7 +9058,7 @@
           <w:rFonts w:cs="Arial"/>
         </w:rPr>
       </w:pPr>
-      <w:bookmarkStart w:id="9" w:name="_Toc243992762"/>
+      <w:bookmarkStart w:id="9" w:name="_Toc244071600"/>
       <w:r>
         <w:rPr>
           <w:rFonts w:cs="Arial"/>
@@ -9168,7 +9168,7 @@
           <w:rFonts w:cs="Arial"/>
         </w:rPr>
       </w:pPr>
-      <w:bookmarkStart w:id="10" w:name="_Toc243992763"/>
+      <w:bookmarkStart w:id="10" w:name="_Toc244071601"/>
       <w:r>
         <w:rPr>
           <w:rFonts w:cs="Arial"/>
@@ -9304,7 +9304,7 @@
         <w:pStyle w:val="Legenda"/>
         <w:keepNext/>
       </w:pPr>
-      <w:bookmarkStart w:id="11" w:name="_Toc243992810"/>
+      <w:bookmarkStart w:id="11" w:name="_Toc244071648"/>
       <w:r>
         <w:lastRenderedPageBreak/>
         <w:t xml:space="preserve">Figura </w:t>
@@ -9345,7 +9345,7 @@
           <w:noProof/>
         </w:rPr>
         <w:drawing>
-          <wp:inline distT="0" distB="0" distL="0" distR="0" wp14:anchorId="2BD4F817" wp14:editId="243E67B8">
+          <wp:inline distT="0" distB="0" distL="0" distR="0" wp14:anchorId="1D6FCC6F" wp14:editId="650291DE">
             <wp:extent cx="5486400" cy="2022437"/>
             <wp:effectExtent l="0" t="0" r="0" b="0"/>
             <wp:docPr id="101" name="fig_gargalo"/>
@@ -9417,7 +9417,7 @@
           <w:rFonts w:cs="Arial"/>
         </w:rPr>
       </w:pPr>
-      <w:bookmarkStart w:id="12" w:name="_Toc243992764"/>
+      <w:bookmarkStart w:id="12" w:name="_Toc244071602"/>
       <w:r>
         <w:rPr>
           <w:rFonts w:cs="Arial"/>
@@ -9533,7 +9533,7 @@
         <w:pStyle w:val="Legenda"/>
         <w:keepNext/>
       </w:pPr>
-      <w:bookmarkStart w:id="13" w:name="_Toc243992811"/>
+      <w:bookmarkStart w:id="13" w:name="_Toc244071649"/>
       <w:r>
         <w:t xml:space="preserve">Figura </w:t>
       </w:r>
@@ -9573,7 +9573,7 @@
           <w:noProof/>
         </w:rPr>
         <w:drawing>
-          <wp:inline distT="0" distB="0" distL="0" distR="0" wp14:anchorId="091DBDC3" wp14:editId="550592FE">
+          <wp:inline distT="0" distB="0" distL="0" distR="0" wp14:anchorId="2EA2DFCB" wp14:editId="39704909">
             <wp:extent cx="5486400" cy="2051249"/>
             <wp:effectExtent l="0" t="0" r="0" b="0"/>
             <wp:docPr id="102" name="fig_nivelamento"/>
@@ -9641,7 +9641,7 @@
           <w:rFonts w:cs="Arial"/>
         </w:rPr>
       </w:pPr>
-      <w:bookmarkStart w:id="14" w:name="_Toc243992765"/>
+      <w:bookmarkStart w:id="14" w:name="_Toc244071603"/>
       <w:r>
         <w:rPr>
           <w:rFonts w:cs="Arial"/>
@@ -9762,7 +9762,7 @@
           <w:lang w:val="en-US"/>
         </w:rPr>
       </w:pPr>
-      <w:bookmarkStart w:id="15" w:name="_Toc243992766"/>
+      <w:bookmarkStart w:id="15" w:name="_Toc244071604"/>
       <w:r>
         <w:rPr>
           <w:rFonts w:cs="Arial"/>
@@ -9972,7 +9972,7 @@
         <w:pStyle w:val="Legenda"/>
         <w:keepNext/>
       </w:pPr>
-      <w:bookmarkStart w:id="16" w:name="_Toc243992812"/>
+      <w:bookmarkStart w:id="16" w:name="_Toc244071650"/>
       <w:r>
         <w:t xml:space="preserve">Figura </w:t>
       </w:r>
@@ -10012,7 +10012,7 @@
           <w:noProof/>
         </w:rPr>
         <w:drawing>
-          <wp:inline distT="0" distB="0" distL="0" distR="0" wp14:anchorId="51E4FA1B" wp14:editId="585BC3DC">
+          <wp:inline distT="0" distB="0" distL="0" distR="0" wp14:anchorId="23AEB364" wp14:editId="0024C3FF">
             <wp:extent cx="5486400" cy="3543069"/>
             <wp:effectExtent l="0" t="0" r="0" b="0"/>
             <wp:docPr id="103" name="fig_mes"/>
@@ -10080,7 +10080,7 @@
           <w:rFonts w:cs="Arial"/>
         </w:rPr>
       </w:pPr>
-      <w:bookmarkStart w:id="17" w:name="_Toc243992767"/>
+      <w:bookmarkStart w:id="17" w:name="_Toc244071605"/>
       <w:r>
         <w:rPr>
           <w:rFonts w:cs="Arial"/>
@@ -10270,7 +10270,7 @@
           <w:rFonts w:cs="Arial"/>
         </w:rPr>
       </w:pPr>
-      <w:bookmarkStart w:id="18" w:name="_Toc243992768"/>
+      <w:bookmarkStart w:id="18" w:name="_Toc244071606"/>
       <w:r>
         <w:rPr>
           <w:rFonts w:cs="Arial"/>
@@ -10471,7 +10471,7 @@
         <w:pStyle w:val="Legenda"/>
         <w:keepNext/>
       </w:pPr>
-      <w:bookmarkStart w:id="19" w:name="_Toc243992813"/>
+      <w:bookmarkStart w:id="19" w:name="_Toc244071651"/>
       <w:r>
         <w:t xml:space="preserve">Figura </w:t>
       </w:r>
@@ -10511,7 +10511,7 @@
           <w:noProof/>
         </w:rPr>
         <w:drawing>
-          <wp:inline distT="0" distB="0" distL="0" distR="0" wp14:anchorId="5375B7E5" wp14:editId="661CB863">
+          <wp:inline distT="0" distB="0" distL="0" distR="0" wp14:anchorId="1D7FB7C0" wp14:editId="47B8F760">
             <wp:extent cx="5486400" cy="1791916"/>
             <wp:effectExtent l="0" t="0" r="0" b="0"/>
             <wp:docPr id="104" name="fig_arq"/>
@@ -10580,7 +10580,7 @@
           <w:u w:val="single"/>
         </w:rPr>
       </w:pPr>
-      <w:bookmarkStart w:id="20" w:name="_Toc243992769"/>
+      <w:bookmarkStart w:id="20" w:name="_Toc244071607"/>
       <w:r>
         <w:rPr>
           <w:rFonts w:cs="Arial"/>
@@ -10694,7 +10694,7 @@
         <w:pStyle w:val="Ttulo2"/>
         <w:spacing w:line="360" w:lineRule="auto"/>
       </w:pPr>
-      <w:bookmarkStart w:id="21" w:name="_Toc243992770"/>
+      <w:bookmarkStart w:id="21" w:name="_Toc244071608"/>
       <w:r>
         <w:t>2.9 Considerações sobre a Utilização de Sistemas para Nivelamento de Processos</w:t>
       </w:r>
@@ -10832,7 +10832,7 @@
           <w:sz w:val="24"/>
         </w:rPr>
       </w:pPr>
-      <w:bookmarkStart w:id="22" w:name="_Toc243992771"/>
+      <w:bookmarkStart w:id="22" w:name="_Toc244071609"/>
       <w:r>
         <w:rPr>
           <w:sz w:val="24"/>
@@ -10851,7 +10851,7 @@
           <w:szCs w:val="24"/>
         </w:rPr>
       </w:pPr>
-      <w:bookmarkStart w:id="23" w:name="_Toc243992772"/>
+      <w:bookmarkStart w:id="23" w:name="_Toc244071610"/>
       <w:r>
         <w:rPr>
           <w:rFonts w:cs="Arial"/>
@@ -10957,7 +10957,7 @@
         <w:pStyle w:val="Ttulo2"/>
         <w:spacing w:line="360" w:lineRule="auto"/>
       </w:pPr>
-      <w:bookmarkStart w:id="24" w:name="_Toc243992773"/>
+      <w:bookmarkStart w:id="24" w:name="_Toc244071611"/>
       <w:r>
         <w:t>3.2 Métodos Utilizados</w:t>
       </w:r>
@@ -11227,7 +11227,7 @@
         <w:pStyle w:val="Ttulo2"/>
         <w:spacing w:before="100" w:beforeAutospacing="1" w:after="100" w:afterAutospacing="1" w:line="360" w:lineRule="auto"/>
       </w:pPr>
-      <w:bookmarkStart w:id="25" w:name="_Toc243992774"/>
+      <w:bookmarkStart w:id="25" w:name="_Toc244071612"/>
       <w:r>
         <w:t>3.3 Ferramentas e Tecnologias Utilizadas</w:t>
       </w:r>
@@ -11238,7 +11238,7 @@
         <w:pStyle w:val="Ttulo3"/>
         <w:spacing w:before="100" w:beforeAutospacing="1" w:after="100" w:afterAutospacing="1" w:line="360" w:lineRule="auto"/>
       </w:pPr>
-      <w:bookmarkStart w:id="26" w:name="_Toc243992775"/>
+      <w:bookmarkStart w:id="26" w:name="_Toc244071613"/>
       <w:r>
         <w:t>3.3.1 Linguagens de Programação</w:t>
       </w:r>
@@ -11461,7 +11461,7 @@
         <w:pStyle w:val="Ttulo3"/>
         <w:spacing w:line="360" w:lineRule="auto"/>
       </w:pPr>
-      <w:bookmarkStart w:id="27" w:name="_Toc243992776"/>
+      <w:bookmarkStart w:id="27" w:name="_Toc244071614"/>
       <w:r>
         <w:lastRenderedPageBreak/>
         <w:t>3.3.2 Framework</w:t>
@@ -11638,7 +11638,7 @@
         <w:pStyle w:val="Ttulo3"/>
         <w:spacing w:line="360" w:lineRule="auto"/>
       </w:pPr>
-      <w:bookmarkStart w:id="28" w:name="_Toc243992777"/>
+      <w:bookmarkStart w:id="28" w:name="_Toc244071615"/>
       <w:r>
         <w:t>3.3.3 Banco de Dados</w:t>
       </w:r>
@@ -11728,7 +11728,7 @@
       <w:pPr>
         <w:pStyle w:val="Ttulo2"/>
       </w:pPr>
-      <w:bookmarkStart w:id="29" w:name="_Toc243992778"/>
+      <w:bookmarkStart w:id="29" w:name="_Toc244071616"/>
       <w:r>
         <w:lastRenderedPageBreak/>
         <w:t>3.4 Etapas do Desenvolvimento</w:t>
@@ -12055,7 +12055,7 @@
           <w:sz w:val="24"/>
         </w:rPr>
       </w:pPr>
-      <w:bookmarkStart w:id="30" w:name="_Toc243992779"/>
+      <w:bookmarkStart w:id="30" w:name="_Toc244071617"/>
       <w:r>
         <w:rPr>
           <w:sz w:val="24"/>
@@ -12069,7 +12069,7 @@
       <w:pPr>
         <w:pStyle w:val="Ttulo2"/>
       </w:pPr>
-      <w:bookmarkStart w:id="31" w:name="_Toc243992780"/>
+      <w:bookmarkStart w:id="31" w:name="_Toc244071618"/>
       <w:r>
         <w:t>4.1 Descrição do Problema</w:t>
       </w:r>
@@ -12152,7 +12152,7 @@
           <w:sz w:val="24"/>
           <w:szCs w:val="24"/>
         </w:rPr>
-        <w:t>Dessa forma, surge a necessidade de desenvolver uma ferramenta capaz de organizar as informações de produção, monitorar as tarefas executadas e auxiliar no nivelamento dos processos.</w:t>
+        <w:t>Dessa forma, surge a necessidade de desenvolver uma ferramenta capaz de organizar as informações de produção, acompanhar as etapas executadas e auxiliar no nivelamento dos processos.</w:t>
       </w:r>
     </w:p>
     <w:p>
@@ -12180,7 +12180,7 @@
         <w:pStyle w:val="Ttulo2"/>
         <w:spacing w:line="360" w:lineRule="auto"/>
       </w:pPr>
-      <w:bookmarkStart w:id="32" w:name="_Toc243992781"/>
+      <w:bookmarkStart w:id="32" w:name="_Toc244071619"/>
       <w:r>
         <w:lastRenderedPageBreak/>
         <w:t>4.2 Requisitos Funcionais</w:t>
@@ -12192,7 +12192,7 @@
         <w:pStyle w:val="Ttulo3"/>
         <w:spacing w:line="360" w:lineRule="auto"/>
       </w:pPr>
-      <w:bookmarkStart w:id="33" w:name="_Toc243992782"/>
+      <w:bookmarkStart w:id="33" w:name="_Toc244071620"/>
       <w:r>
         <w:t>4.2.1 Requisitos Funcionais da Tela de Login</w:t>
       </w:r>
@@ -12223,7 +12223,7 @@
         <w:pStyle w:val="Legenda"/>
         <w:keepNext/>
       </w:pPr>
-      <w:bookmarkStart w:id="34" w:name="_Toc243992827"/>
+      <w:bookmarkStart w:id="34" w:name="_Toc244071665"/>
       <w:r>
         <w:t xml:space="preserve">Tabela </w:t>
       </w:r>
@@ -12913,7 +12913,7 @@
         <w:pStyle w:val="Ttulo3"/>
         <w:spacing w:line="360" w:lineRule="auto"/>
       </w:pPr>
-      <w:bookmarkStart w:id="35" w:name="_Toc243992783"/>
+      <w:bookmarkStart w:id="35" w:name="_Toc244071621"/>
       <w:r>
         <w:lastRenderedPageBreak/>
         <w:t>4.2.2 Requisitos Funcionais da Tela de Cadastro de Setores</w:t>
@@ -12937,7 +12937,7 @@
           <w:sz w:val="24"/>
           <w:szCs w:val="24"/>
         </w:rPr>
-        <w:t>A tabela abaixo apresenta os requisitos funcionais relacionados ao gerenciamento dos setores produtivos do sistema, permitindo o cadastro, consulta, edição e exclusão dos setores que organizam os postos de trabalho da linha de produção.</w:t>
+        <w:t>A tabela abaixo apresenta os requisitos funcionais relacionados ao gerenciamento dos setores produtivos do sistema, permitindo o cadastro, consulta, edição e inativação dos setores que organizam os postos de trabalho da linha de produção.</w:t>
       </w:r>
     </w:p>
     <w:p>
@@ -12945,7 +12945,7 @@
         <w:pStyle w:val="Legenda"/>
         <w:keepNext/>
       </w:pPr>
-      <w:bookmarkStart w:id="36" w:name="_Toc243992828"/>
+      <w:bookmarkStart w:id="36" w:name="_Toc244071666"/>
       <w:r>
         <w:t xml:space="preserve">Tabela </w:t>
       </w:r>
@@ -13227,7 +13227,7 @@
                 <w:sz w:val="24"/>
                 <w:szCs w:val="24"/>
               </w:rPr>
-              <w:t>O sistema deve permitir o cadastro de setores produtivos.</w:t>
+              <w:t>O sistema deve permitir o cadastro de setores produtivos, gerando automaticamente um código único para cada setor.</w:t>
             </w:r>
           </w:p>
         </w:tc>
@@ -13539,7 +13539,7 @@
                 <w:sz w:val="24"/>
                 <w:szCs w:val="24"/>
               </w:rPr>
-              <w:t>Excluir Setor</w:t>
+              <w:t>Inativar Setor</w:t>
             </w:r>
           </w:p>
         </w:tc>
@@ -13575,7 +13575,7 @@
                 <w:sz w:val="24"/>
                 <w:szCs w:val="24"/>
               </w:rPr>
-              <w:t>O sistema deve permitir excluir setores cadastrados.</w:t>
+              <w:t>O sistema deve permitir inativar setores, mantendo os postos e operadores já ligados a eles.</w:t>
             </w:r>
           </w:p>
         </w:tc>
@@ -13691,7 +13691,7 @@
                 <w:sz w:val="24"/>
                 <w:szCs w:val="24"/>
               </w:rPr>
-              <w:t>O sistema deve permitir que o usuário associe postos de trabalho ao setor.</w:t>
+              <w:t>O sistema deve permitir que cada posto de trabalho seja associado a um setor.</w:t>
             </w:r>
           </w:p>
         </w:tc>
@@ -13723,7 +13723,7 @@
           <w:sz w:val="20"/>
           <w:szCs w:val="20"/>
         </w:rPr>
-        <w:t>Próprio autor, acessado em 06 de outubro de 2026.</w:t>
+        <w:t>Próprio autor, acessado em 27 de outubro de 2026.</w:t>
       </w:r>
     </w:p>
     <w:p>
@@ -13751,7 +13751,7 @@
         <w:pStyle w:val="Ttulo3"/>
         <w:spacing w:line="360" w:lineRule="auto"/>
       </w:pPr>
-      <w:bookmarkStart w:id="37" w:name="_Toc243992784"/>
+      <w:bookmarkStart w:id="37" w:name="_Toc244071622"/>
       <w:r>
         <w:lastRenderedPageBreak/>
         <w:t xml:space="preserve">4.2.3 Requisitos Funcionais da Tela de Cadastro de </w:t>
@@ -13786,7 +13786,7 @@
         <w:pStyle w:val="Legenda"/>
         <w:keepNext/>
       </w:pPr>
-      <w:bookmarkStart w:id="38" w:name="_Toc243992829"/>
+      <w:bookmarkStart w:id="38" w:name="_Toc244071667"/>
       <w:r>
         <w:t xml:space="preserve">Tabela </w:t>
       </w:r>
@@ -14380,7 +14380,7 @@
                 <w:sz w:val="24"/>
                 <w:szCs w:val="24"/>
               </w:rPr>
-              <w:t>Excluir Posto de Trabalho</w:t>
+              <w:t>Inativar Posto de Trabalho</w:t>
             </w:r>
           </w:p>
         </w:tc>
@@ -14416,7 +14416,7 @@
                 <w:sz w:val="24"/>
                 <w:szCs w:val="24"/>
               </w:rPr>
-              <w:t>O sistema deve permitir remover ou inativar postos de trabalho cadastrados.</w:t>
+              <w:t>O sistema deve permitir inativar postos de trabalho, mantendo o histórico das execuções já registradas.</w:t>
             </w:r>
           </w:p>
         </w:tc>
@@ -14496,7 +14496,7 @@
                 <w:sz w:val="24"/>
                 <w:szCs w:val="24"/>
               </w:rPr>
-              <w:t>Associar Tarefas</w:t>
+              <w:t>Associar Etapas</w:t>
             </w:r>
           </w:p>
         </w:tc>
@@ -14564,7 +14564,7 @@
           <w:sz w:val="20"/>
           <w:szCs w:val="20"/>
         </w:rPr>
-        <w:t>Próprio autor, acessado em 06 de outubro de 2026.</w:t>
+        <w:t>Próprio autor, acessado em 27 de outubro de 2026.</w:t>
       </w:r>
     </w:p>
     <w:p>
@@ -14592,10 +14592,10 @@
         <w:pStyle w:val="Ttulo3"/>
         <w:spacing w:line="360" w:lineRule="auto"/>
       </w:pPr>
-      <w:bookmarkStart w:id="39" w:name="_Toc243992785"/>
+      <w:bookmarkStart w:id="39" w:name="_Toc244071623"/>
       <w:r>
         <w:lastRenderedPageBreak/>
-        <w:t>4.2.4 Requisitos Funcionais da Tela de Cadastro de Tarefas</w:t>
+        <w:t>4.2.4 Requisitos Funcionais da Tela de Cadastro de Operações</w:t>
       </w:r>
       <w:bookmarkEnd w:id="39"/>
     </w:p>
@@ -14616,7 +14616,7 @@
           <w:sz w:val="24"/>
           <w:szCs w:val="24"/>
         </w:rPr>
-        <w:t>A tabela abaixo apresenta os requisitos funcionais relacionados ao gerenciamento das tarefas e etapas produtivas do sistema. Cada tarefa corresponde a uma operação, que passa a ser uma etapa quando é incluída no roteiro de produção de um produto.</w:t>
+        <w:t>A tabela abaixo apresenta os requisitos funcionais relacionados ao gerenciamento das operações do processo produtivo. Cada operação passa a ser uma etapa quando é incluída no roteiro de produção de um produto.</w:t>
       </w:r>
     </w:p>
     <w:p>
@@ -14624,7 +14624,7 @@
         <w:pStyle w:val="Legenda"/>
         <w:keepNext/>
       </w:pPr>
-      <w:bookmarkStart w:id="40" w:name="_Toc243992830"/>
+      <w:bookmarkStart w:id="40" w:name="_Toc244071668"/>
       <w:r>
         <w:t xml:space="preserve">Tabela </w:t>
       </w:r>
@@ -14647,7 +14647,7 @@
         <w:fldChar w:fldCharType="end"/>
       </w:r>
       <w:r>
-        <w:t xml:space="preserve"> – Requisitos da Tela de Cadastro de Tarefas</w:t>
+        <w:t xml:space="preserve"> – Requisitos da Tela de Cadastro de Operações</w:t>
       </w:r>
       <w:bookmarkEnd w:id="40"/>
     </w:p>
@@ -14870,7 +14870,7 @@
                 <w:sz w:val="24"/>
                 <w:szCs w:val="24"/>
               </w:rPr>
-              <w:t>Cadastrar Tarefa</w:t>
+              <w:t>Cadastrar Operação</w:t>
             </w:r>
           </w:p>
         </w:tc>
@@ -14906,7 +14906,7 @@
                 <w:sz w:val="24"/>
                 <w:szCs w:val="24"/>
               </w:rPr>
-              <w:t>O sistema deve permitir cadastrar as tarefas (operações) do processo produtivo.</w:t>
+              <w:t>O sistema deve permitir cadastrar as operações do processo produtivo.</w:t>
             </w:r>
           </w:p>
         </w:tc>
@@ -14986,7 +14986,7 @@
                 <w:sz w:val="24"/>
                 <w:szCs w:val="24"/>
               </w:rPr>
-              <w:t>Editar Tarefa</w:t>
+              <w:t>Editar Operação</w:t>
             </w:r>
           </w:p>
         </w:tc>
@@ -15022,7 +15022,7 @@
                 <w:sz w:val="24"/>
                 <w:szCs w:val="24"/>
               </w:rPr>
-              <w:t>O sistema deve permitir alterar informações das tarefas cadastradas.</w:t>
+              <w:t>O sistema deve permitir alterar informações das operações cadastradas.</w:t>
             </w:r>
           </w:p>
         </w:tc>
@@ -15102,7 +15102,7 @@
                 <w:sz w:val="24"/>
                 <w:szCs w:val="24"/>
               </w:rPr>
-              <w:t>Consultar Tarefa</w:t>
+              <w:t>Consultar Operação</w:t>
             </w:r>
           </w:p>
         </w:tc>
@@ -15138,7 +15138,7 @@
                 <w:sz w:val="24"/>
                 <w:szCs w:val="24"/>
               </w:rPr>
-              <w:t>O sistema deve permitir visualizar as tarefas cadastradas.</w:t>
+              <w:t>O sistema deve permitir visualizar as operações cadastradas.</w:t>
             </w:r>
           </w:p>
         </w:tc>
@@ -15218,7 +15218,7 @@
                 <w:sz w:val="24"/>
                 <w:szCs w:val="24"/>
               </w:rPr>
-              <w:t>Excluir Tarefa</w:t>
+              <w:t>Inativar Operação</w:t>
             </w:r>
           </w:p>
         </w:tc>
@@ -15254,7 +15254,7 @@
                 <w:sz w:val="24"/>
                 <w:szCs w:val="24"/>
               </w:rPr>
-              <w:t>O sistema deve permitir excluir tarefas do sistema.</w:t>
+              <w:t>O sistema deve permitir inativar operações, mantendo as etapas de roteiro que já as utilizam.</w:t>
             </w:r>
           </w:p>
         </w:tc>
@@ -15450,7 +15450,7 @@
                 <w:sz w:val="24"/>
                 <w:szCs w:val="24"/>
               </w:rPr>
-              <w:t>Associar Tarefa ao Roteiro</w:t>
+              <w:t>Associar Operação ao Roteiro</w:t>
             </w:r>
           </w:p>
         </w:tc>
@@ -15486,7 +15486,7 @@
                 <w:sz w:val="24"/>
                 <w:szCs w:val="24"/>
               </w:rPr>
-              <w:t>O sistema deve permitir vincular tarefas a um roteiro de produção, definindo a ordem das etapas.</w:t>
+              <w:t>O sistema deve permitir vincular operações a um roteiro de produção, definindo a ordem das etapas.</w:t>
             </w:r>
           </w:p>
         </w:tc>
@@ -15518,7 +15518,7 @@
           <w:sz w:val="20"/>
           <w:szCs w:val="20"/>
         </w:rPr>
-        <w:t>Próprio autor, acessado em 06 de outubro de 2026.</w:t>
+        <w:t>Próprio autor, acessado em 27 de outubro de 2026.</w:t>
       </w:r>
     </w:p>
     <w:p>
@@ -15546,7 +15546,7 @@
         <w:pStyle w:val="Ttulo3"/>
         <w:spacing w:line="360" w:lineRule="auto"/>
       </w:pPr>
-      <w:bookmarkStart w:id="41" w:name="_Toc243992786"/>
+      <w:bookmarkStart w:id="41" w:name="_Toc244071624"/>
       <w:r>
         <w:lastRenderedPageBreak/>
         <w:t>4.2.5 Requisitos Funcionais da Tela de Produtos e Ordens de Produção</w:t>
@@ -15578,7 +15578,7 @@
         <w:pStyle w:val="Legenda"/>
         <w:keepNext/>
       </w:pPr>
-      <w:bookmarkStart w:id="42" w:name="_Toc243992831"/>
+      <w:bookmarkStart w:id="42" w:name="_Toc244071669"/>
       <w:r>
         <w:t xml:space="preserve">Tabela </w:t>
       </w:r>
@@ -16092,7 +16092,7 @@
                 <w:sz w:val="24"/>
                 <w:szCs w:val="24"/>
               </w:rPr>
-              <w:t>O sistema deve permitir cadastrar ordens de produção com número, produto, roteiro, quantidade e unidade.</w:t>
+              <w:t>O sistema deve permitir cadastrar ordens de produção com número, plano, produto, versão do roteiro, quantidade e unidade, mantendo a versão do roteiro escolhida.</w:t>
             </w:r>
           </w:p>
         </w:tc>
@@ -16356,7 +16356,7 @@
           <w:sz w:val="20"/>
           <w:szCs w:val="20"/>
         </w:rPr>
-        <w:t>Próprio autor, acessado em 06 de outubro de 2026.</w:t>
+        <w:t>Próprio autor, acessado em 27 de outubro de 2026.</w:t>
       </w:r>
     </w:p>
     <w:p>
@@ -16384,7 +16384,7 @@
         <w:pStyle w:val="Ttulo3"/>
         <w:spacing w:line="360" w:lineRule="auto"/>
       </w:pPr>
-      <w:bookmarkStart w:id="43" w:name="_Toc243992787"/>
+      <w:bookmarkStart w:id="43" w:name="_Toc244071625"/>
       <w:r>
         <w:lastRenderedPageBreak/>
         <w:t>4.2.6 Requisitos Funcionais da Tela de Apontamento da Produção</w:t>
@@ -16416,7 +16416,7 @@
         <w:pStyle w:val="Legenda"/>
         <w:keepNext/>
       </w:pPr>
-      <w:bookmarkStart w:id="44" w:name="_Toc243992832"/>
+      <w:bookmarkStart w:id="44" w:name="_Toc244071670"/>
       <w:r>
         <w:t xml:space="preserve">Tabela </w:t>
       </w:r>
@@ -16662,7 +16662,7 @@
                 <w:sz w:val="24"/>
                 <w:szCs w:val="24"/>
               </w:rPr>
-              <w:t>Identificar Ordem de Produção</w:t>
+              <w:t>Identificar Operador e Ordem</w:t>
             </w:r>
           </w:p>
         </w:tc>
@@ -16698,7 +16698,7 @@
                 <w:sz w:val="24"/>
                 <w:szCs w:val="24"/>
               </w:rPr>
-              <w:t>O sistema deve permitir localizar a ordem de produção pelo seu número.</w:t>
+              <w:t>O sistema deve permitir identificar o operador pela matrícula, digitada ou lida por um leitor de código, e localizar a ordem de produção pelo número.</w:t>
             </w:r>
           </w:p>
         </w:tc>
@@ -17310,7 +17310,7 @@
           <w:sz w:val="20"/>
           <w:szCs w:val="20"/>
         </w:rPr>
-        <w:t>Próprio autor, acessado em 06 de outubro de 2026.</w:t>
+        <w:t>Próprio autor, acessado em 27 de outubro de 2026.</w:t>
       </w:r>
     </w:p>
     <w:p>
@@ -17338,10 +17338,10 @@
         <w:pStyle w:val="Ttulo3"/>
         <w:spacing w:line="360" w:lineRule="auto"/>
       </w:pPr>
-      <w:bookmarkStart w:id="45" w:name="_Toc243992788"/>
+      <w:bookmarkStart w:id="45" w:name="_Toc244071626"/>
       <w:r>
         <w:lastRenderedPageBreak/>
-        <w:t>4.2.7 Requisitos Funcionais da Tela de Monitoramento da Produção</w:t>
+        <w:t>4.2.7 Requisitos Funcionais da Tela de Indicadores</w:t>
       </w:r>
       <w:bookmarkEnd w:id="45"/>
     </w:p>
@@ -17362,7 +17362,7 @@
           <w:sz w:val="24"/>
           <w:szCs w:val="24"/>
         </w:rPr>
-        <w:t>A tabela apresentada abaixo contém os requisitos funcionais relacionados ao acompanhamento e monitoramento das atividades produtivas.</w:t>
+        <w:t>A tabela apresentada abaixo contém os requisitos funcionais relacionados à tela de indicadores, utilizada no acompanhamento das atividades produtivas.</w:t>
       </w:r>
     </w:p>
     <w:p>
@@ -17370,7 +17370,7 @@
         <w:pStyle w:val="Legenda"/>
         <w:keepNext/>
       </w:pPr>
-      <w:bookmarkStart w:id="46" w:name="_Toc243992833"/>
+      <w:bookmarkStart w:id="46" w:name="_Toc244071671"/>
       <w:r>
         <w:t xml:space="preserve">Tabela </w:t>
       </w:r>
@@ -17393,7 +17393,7 @@
         <w:fldChar w:fldCharType="end"/>
       </w:r>
       <w:r>
-        <w:t xml:space="preserve"> – Requisitos da Tela de Monitoramento da Produção</w:t>
+        <w:t xml:space="preserve"> – Requisitos da Tela de Indicadores</w:t>
       </w:r>
       <w:bookmarkEnd w:id="46"/>
     </w:p>
@@ -17732,7 +17732,7 @@
                 <w:sz w:val="24"/>
                 <w:szCs w:val="24"/>
               </w:rPr>
-              <w:t>Identificar Gargalos</w:t>
+              <w:t>Apoiar a Identificação de Gargalos</w:t>
             </w:r>
           </w:p>
         </w:tc>
@@ -17768,7 +17768,7 @@
                 <w:sz w:val="24"/>
                 <w:szCs w:val="24"/>
               </w:rPr>
-              <w:t>O sistema deve apresentar informações que permitam identificar gargalos produtivos nas linhas de produção.</w:t>
+              <w:t>O sistema deve apresentar informações que apoiem a identificação de gargalos, como a carga pendente de cada posto de trabalho e as etapas com tempo acima do padrão.</w:t>
             </w:r>
           </w:p>
         </w:tc>
@@ -17884,7 +17884,7 @@
                 <w:sz w:val="24"/>
                 <w:szCs w:val="24"/>
               </w:rPr>
-              <w:t>O sistema deve apresentar indicadores de desempenho da produção, como quantidade produzida, tempo produtivo e tempo de pausa por etapa e por posto de trabalho.</w:t>
+              <w:t>O sistema deve apresentar indicadores de desempenho da produção, como quantidade produzida, quantidades de retrabalho e de refugo, tempo produtivo e tempo de pausa por etapa e por posto de trabalho.</w:t>
             </w:r>
           </w:p>
         </w:tc>
@@ -18000,7 +18000,7 @@
                 <w:sz w:val="24"/>
                 <w:szCs w:val="24"/>
               </w:rPr>
-              <w:t>O sistema deve permitir gerar relatórios relacionados às atividades produtivas.</w:t>
+              <w:t>O sistema deve permitir exportar os indicadores do período em planilha e imprimir o relatório.</w:t>
             </w:r>
           </w:p>
         </w:tc>
@@ -18080,7 +18080,7 @@
                 <w:sz w:val="24"/>
                 <w:szCs w:val="24"/>
               </w:rPr>
-              <w:t>Distribuir Atividades</w:t>
+              <w:t>Estimar a Carga por Posto</w:t>
             </w:r>
           </w:p>
         </w:tc>
@@ -18116,7 +18116,7 @@
                 <w:sz w:val="24"/>
                 <w:szCs w:val="24"/>
               </w:rPr>
-              <w:t>O sistema deve auxiliar na distribuição equilibrada das atividades entre os postos de trabalho.</w:t>
+              <w:t>O sistema deve estimar a carga pendente de cada posto de trabalho, auxiliando na distribuição equilibrada das atividades.</w:t>
             </w:r>
           </w:p>
         </w:tc>
@@ -18148,7 +18148,7 @@
           <w:sz w:val="20"/>
           <w:szCs w:val="20"/>
         </w:rPr>
-        <w:t>Próprio autor, acessado em 06 de outubro de 2026.</w:t>
+        <w:t>Próprio autor, acessado em 27 de outubro de 2026.</w:t>
       </w:r>
     </w:p>
     <w:p>
@@ -18176,7 +18176,7 @@
         <w:pStyle w:val="Ttulo3"/>
         <w:spacing w:line="360" w:lineRule="auto"/>
       </w:pPr>
-      <w:bookmarkStart w:id="47" w:name="_Toc243992789"/>
+      <w:bookmarkStart w:id="47" w:name="_Toc244071627"/>
       <w:r>
         <w:lastRenderedPageBreak/>
         <w:t>4.2.8 Requisitos Funcionais dos Operadores</w:t>
@@ -18208,7 +18208,7 @@
         <w:pStyle w:val="Legenda"/>
         <w:keepNext/>
       </w:pPr>
-      <w:bookmarkStart w:id="48" w:name="_Toc243992834"/>
+      <w:bookmarkStart w:id="48" w:name="_Toc244071672"/>
       <w:r>
         <w:t xml:space="preserve">Tabela </w:t>
       </w:r>
@@ -18490,7 +18490,7 @@
                 <w:sz w:val="24"/>
                 <w:szCs w:val="24"/>
               </w:rPr>
-              <w:t>O sistema deve permitir cadastrar operadores informando nome e matrícula.</w:t>
+              <w:t>O sistema deve permitir cadastrar operadores informando nome, setor principal e função, com a matrícula gerada automaticamente pelo sistema.</w:t>
             </w:r>
           </w:p>
         </w:tc>
@@ -18986,7 +18986,7 @@
           <w:sz w:val="20"/>
           <w:szCs w:val="20"/>
         </w:rPr>
-        <w:t>Próprio autor, acessado em 14 de outubro de 2026.</w:t>
+        <w:t>Próprio autor, acessado em 27 de outubro de 2026.</w:t>
       </w:r>
     </w:p>
     <w:p>
@@ -19014,7 +19014,7 @@
         <w:pStyle w:val="Ttulo3"/>
         <w:spacing w:line="360" w:lineRule="auto"/>
       </w:pPr>
-      <w:bookmarkStart w:id="49" w:name="_Toc243992790"/>
+      <w:bookmarkStart w:id="49" w:name="_Toc244071628"/>
       <w:r>
         <w:lastRenderedPageBreak/>
         <w:t>4.2.9 Requisitos Funcionais dos Motivos de Pausa</w:t>
@@ -19046,7 +19046,7 @@
         <w:pStyle w:val="Legenda"/>
         <w:keepNext/>
       </w:pPr>
-      <w:bookmarkStart w:id="50" w:name="_Toc243992835"/>
+      <w:bookmarkStart w:id="50" w:name="_Toc244071673"/>
       <w:r>
         <w:t xml:space="preserve">Tabela </w:t>
       </w:r>
@@ -19735,7 +19735,7 @@
       <w:pPr>
         <w:pStyle w:val="Ttulo2"/>
       </w:pPr>
-      <w:bookmarkStart w:id="51" w:name="_Toc243992791"/>
+      <w:bookmarkStart w:id="51" w:name="_Toc244071629"/>
       <w:r>
         <w:lastRenderedPageBreak/>
         <w:t>4.3 Requisitos Não Funcionais</w:t>
@@ -19766,7 +19766,7 @@
       <w:pPr>
         <w:pStyle w:val="Ttulo3"/>
       </w:pPr>
-      <w:bookmarkStart w:id="52" w:name="_Toc243992792"/>
+      <w:bookmarkStart w:id="52" w:name="_Toc244071630"/>
       <w:r>
         <w:t>4.3.1 Requisitos Não Funcionais do Sistema</w:t>
       </w:r>
@@ -19797,7 +19797,7 @@
         <w:pStyle w:val="Legenda"/>
         <w:keepNext/>
       </w:pPr>
-      <w:bookmarkStart w:id="53" w:name="_Toc243992836"/>
+      <w:bookmarkStart w:id="53" w:name="_Toc244071674"/>
       <w:r>
         <w:t xml:space="preserve">Tabela </w:t>
       </w:r>
@@ -20973,7 +20973,7 @@
       <w:pPr>
         <w:pStyle w:val="Ttulo2"/>
       </w:pPr>
-      <w:bookmarkStart w:id="54" w:name="_Toc243992793"/>
+      <w:bookmarkStart w:id="54" w:name="_Toc244071631"/>
       <w:r>
         <w:lastRenderedPageBreak/>
         <w:t>4.4 Prototipagem</w:t>
@@ -21144,7 +21144,7 @@
           <w:sz w:val="24"/>
           <w:szCs w:val="24"/>
         </w:rPr>
-        <w:t>cadastro de produtos, tarefas e roteiros;</w:t>
+        <w:t>cadastro de produtos, operações e roteiros;</w:t>
       </w:r>
     </w:p>
     <w:p>
@@ -21282,7 +21282,7 @@
         <w:pStyle w:val="Legenda"/>
         <w:keepNext/>
       </w:pPr>
-      <w:bookmarkStart w:id="55" w:name="_Toc243992814"/>
+      <w:bookmarkStart w:id="55" w:name="_Toc244071652"/>
       <w:r>
         <w:lastRenderedPageBreak/>
         <w:t xml:space="preserve">Figura </w:t>
@@ -21321,7 +21321,7 @@
           <w:noProof/>
         </w:rPr>
         <w:drawing>
-          <wp:inline distT="0" distB="0" distL="0" distR="0" wp14:anchorId="76DA92E4" wp14:editId="3A42285E">
+          <wp:inline distT="0" distB="0" distL="0" distR="0" wp14:anchorId="1DF6EFB3" wp14:editId="255666FE">
             <wp:extent cx="5669280" cy="2894876"/>
             <wp:effectExtent l="0" t="0" r="0" b="0"/>
             <wp:docPr id="2" name="Picture 2"/>
@@ -21388,7 +21388,7 @@
         <w:pStyle w:val="Legenda"/>
         <w:keepNext/>
       </w:pPr>
-      <w:bookmarkStart w:id="56" w:name="_Toc243992815"/>
+      <w:bookmarkStart w:id="56" w:name="_Toc244071653"/>
       <w:r>
         <w:t xml:space="preserve">Figura </w:t>
       </w:r>
@@ -21432,7 +21432,7 @@
           <w:szCs w:val="18"/>
         </w:rPr>
         <w:drawing>
-          <wp:inline distT="0" distB="0" distL="0" distR="0" wp14:anchorId="17137B96" wp14:editId="6178F05F">
+          <wp:inline distT="0" distB="0" distL="0" distR="0" wp14:anchorId="7EB9E441" wp14:editId="3C76847B">
             <wp:extent cx="5669280" cy="2894876"/>
             <wp:effectExtent l="0" t="0" r="0" b="0"/>
             <wp:docPr id="1" name="Picture 3"/>
@@ -21525,7 +21525,7 @@
         <w:pStyle w:val="Legenda"/>
         <w:keepNext/>
       </w:pPr>
-      <w:bookmarkStart w:id="57" w:name="_Toc243992816"/>
+      <w:bookmarkStart w:id="57" w:name="_Toc244071654"/>
       <w:r>
         <w:t xml:space="preserve">Figura </w:t>
       </w:r>
@@ -21563,7 +21563,7 @@
           <w:noProof/>
         </w:rPr>
         <w:drawing>
-          <wp:inline distT="0" distB="0" distL="0" distR="0" wp14:anchorId="77AA6644" wp14:editId="5F224546">
+          <wp:inline distT="0" distB="0" distL="0" distR="0" wp14:anchorId="29C527B2" wp14:editId="0B90964F">
             <wp:extent cx="5669280" cy="2894876"/>
             <wp:effectExtent l="0" t="0" r="0" b="0"/>
             <wp:docPr id="201" name="Imagem 201"/>
@@ -21630,7 +21630,7 @@
         <w:pStyle w:val="Legenda"/>
         <w:keepNext/>
       </w:pPr>
-      <w:bookmarkStart w:id="58" w:name="_Toc243992817"/>
+      <w:bookmarkStart w:id="58" w:name="_Toc244071655"/>
       <w:r>
         <w:t xml:space="preserve">Figura </w:t>
       </w:r>
@@ -21668,7 +21668,7 @@
           <w:noProof/>
         </w:rPr>
         <w:drawing>
-          <wp:inline distT="0" distB="0" distL="0" distR="0" wp14:anchorId="40C870F6" wp14:editId="64A261BC">
+          <wp:inline distT="0" distB="0" distL="0" distR="0" wp14:anchorId="44E3027B" wp14:editId="53E301D9">
             <wp:extent cx="5669280" cy="2894876"/>
             <wp:effectExtent l="0" t="0" r="0" b="0"/>
             <wp:docPr id="202" name="Imagem 202"/>
@@ -21744,10 +21744,10 @@
       <w:pPr>
         <w:pStyle w:val="Ttulo2"/>
       </w:pPr>
-      <w:bookmarkStart w:id="59" w:name="_Toc243992794"/>
+      <w:bookmarkStart w:id="59" w:name="_Toc244071632"/>
       <w:r>
         <w:lastRenderedPageBreak/>
-        <w:t>4.5 Possível Estrutura do Sistema</w:t>
+        <w:t>4.5 Estrutura do Sistema</w:t>
       </w:r>
       <w:bookmarkEnd w:id="59"/>
     </w:p>
@@ -21810,7 +21810,7 @@
           <w:sz w:val="24"/>
           <w:szCs w:val="24"/>
         </w:rPr>
-        <w:t>módulo de autenticação;</w:t>
+        <w:t>módulo de acesso, com autenticação e usuários;</w:t>
       </w:r>
     </w:p>
     <w:p>
@@ -21833,7 +21833,7 @@
           <w:sz w:val="24"/>
           <w:szCs w:val="24"/>
         </w:rPr>
-        <w:t>módulo de gerenciamento de usuários;</w:t>
+        <w:t>módulos de cadastro: produtos, operações, setores, postos de trabalho, operadores e motivos de pausa;</w:t>
       </w:r>
     </w:p>
     <w:p>
@@ -21856,7 +21856,7 @@
           <w:sz w:val="24"/>
           <w:szCs w:val="24"/>
         </w:rPr>
-        <w:t>módulo de setores e postos de trabalho;</w:t>
+        <w:t>módulo de roteiros;</w:t>
       </w:r>
     </w:p>
     <w:p>
@@ -21879,7 +21879,7 @@
           <w:sz w:val="24"/>
           <w:szCs w:val="24"/>
         </w:rPr>
-        <w:t>módulo de produtos, tarefas e roteiros;</w:t>
+        <w:t>módulos de planos e de ordens de produção;</w:t>
       </w:r>
     </w:p>
     <w:p>
@@ -21902,7 +21902,7 @@
           <w:sz w:val="24"/>
           <w:szCs w:val="24"/>
         </w:rPr>
-        <w:t>módulo de ordens de produção;</w:t>
+        <w:t>módulo de apontamento da produção (ilha);</w:t>
       </w:r>
     </w:p>
     <w:p>
@@ -21925,53 +21925,7 @@
           <w:sz w:val="24"/>
           <w:szCs w:val="24"/>
         </w:rPr>
-        <w:t>módulo de apontamento da produção;</w:t>
-      </w:r>
-    </w:p>
-    <w:p>
-      <w:pPr>
-        <w:numPr>
-          <w:ilvl w:val="0"/>
-          <w:numId w:val="22"/>
-        </w:numPr>
-        <w:spacing w:before="100" w:beforeAutospacing="1" w:after="100" w:afterAutospacing="1" w:line="360" w:lineRule="auto"/>
-        <w:jc w:val="both"/>
-        <w:rPr>
-          <w:rFonts w:cs="Arial"/>
-          <w:sz w:val="24"/>
-          <w:szCs w:val="24"/>
-        </w:rPr>
-      </w:pPr>
-      <w:r>
-        <w:rPr>
-          <w:rFonts w:cs="Arial"/>
-          <w:sz w:val="24"/>
-          <w:szCs w:val="24"/>
-        </w:rPr>
-        <w:t>módulo de indicadores de desempenho e relatórios;</w:t>
-      </w:r>
-    </w:p>
-    <w:p>
-      <w:pPr>
-        <w:numPr>
-          <w:ilvl w:val="0"/>
-          <w:numId w:val="22"/>
-        </w:numPr>
-        <w:spacing w:before="100" w:beforeAutospacing="1" w:after="100" w:afterAutospacing="1" w:line="360" w:lineRule="auto"/>
-        <w:jc w:val="both"/>
-        <w:rPr>
-          <w:rFonts w:cs="Arial"/>
-          <w:sz w:val="24"/>
-          <w:szCs w:val="24"/>
-        </w:rPr>
-      </w:pPr>
-      <w:r>
-        <w:rPr>
-          <w:rFonts w:cs="Arial"/>
-          <w:sz w:val="24"/>
-          <w:szCs w:val="24"/>
-        </w:rPr>
-        <w:t>módulo de monitoramento.</w:t>
+        <w:t>módulo de indicadores.</w:t>
       </w:r>
     </w:p>
     <w:p>
@@ -22030,7 +21984,7 @@
           <w:sz w:val="24"/>
         </w:rPr>
       </w:pPr>
-      <w:bookmarkStart w:id="60" w:name="_Toc243992795"/>
+      <w:bookmarkStart w:id="60" w:name="_Toc244071633"/>
       <w:r>
         <w:rPr>
           <w:sz w:val="24"/>
@@ -22044,7 +21998,7 @@
       <w:pPr>
         <w:pStyle w:val="Ttulo2"/>
       </w:pPr>
-      <w:bookmarkStart w:id="61" w:name="_Toc243992796"/>
+      <w:bookmarkStart w:id="61" w:name="_Toc244071634"/>
       <w:r>
         <w:t xml:space="preserve">5.1 </w:t>
       </w:r>
@@ -22537,7 +22491,7 @@
         <w:pStyle w:val="Legenda"/>
         <w:keepNext/>
       </w:pPr>
-      <w:bookmarkStart w:id="62" w:name="_Toc243992818"/>
+      <w:bookmarkStart w:id="62" w:name="_Toc244071656"/>
       <w:r>
         <w:t xml:space="preserve">Figura </w:t>
       </w:r>
@@ -22574,7 +22528,7 @@
           <w:noProof/>
         </w:rPr>
         <w:drawing>
-          <wp:inline distT="0" distB="0" distL="0" distR="0" wp14:anchorId="448C575E" wp14:editId="57008478">
+          <wp:inline distT="0" distB="0" distL="0" distR="0" wp14:anchorId="46CAC184" wp14:editId="6B6EBD11">
             <wp:extent cx="5281879" cy="6811702"/>
             <wp:effectExtent l="0" t="0" r="4445" b="1905"/>
             <wp:docPr id="4" name="Imagem 4"/>
@@ -22671,7 +22625,7 @@
       <w:pPr>
         <w:pStyle w:val="Ttulo2"/>
       </w:pPr>
-      <w:bookmarkStart w:id="63" w:name="_Toc243992797"/>
+      <w:bookmarkStart w:id="63" w:name="_Toc244071635"/>
       <w:r>
         <w:lastRenderedPageBreak/>
         <w:t>5.2 Diagrama de Classes</w:t>
@@ -22820,7 +22774,7 @@
         <w:pStyle w:val="Legenda"/>
         <w:keepNext/>
       </w:pPr>
-      <w:bookmarkStart w:id="64" w:name="_Toc243992819"/>
+      <w:bookmarkStart w:id="64" w:name="_Toc244071657"/>
       <w:r>
         <w:lastRenderedPageBreak/>
         <w:t xml:space="preserve">Figura </w:t>
@@ -22859,7 +22813,7 @@
           <w:noProof/>
         </w:rPr>
         <w:drawing>
-          <wp:inline distT="0" distB="0" distL="0" distR="0" wp14:anchorId="49E6C8D5" wp14:editId="35B37A08">
+          <wp:inline distT="0" distB="0" distL="0" distR="0" wp14:anchorId="12582665" wp14:editId="5AC5B5D9">
             <wp:extent cx="5730167" cy="7070453"/>
             <wp:effectExtent l="0" t="0" r="0" b="0"/>
             <wp:docPr id="203" name="Imagem 203"/>
@@ -22935,7 +22889,7 @@
       <w:pPr>
         <w:pStyle w:val="Ttulo2"/>
       </w:pPr>
-      <w:bookmarkStart w:id="65" w:name="_Toc243992798"/>
+      <w:bookmarkStart w:id="65" w:name="_Toc244071636"/>
       <w:r>
         <w:lastRenderedPageBreak/>
         <w:t>5.3 Diagrama de Casos de Uso</w:t>
@@ -23132,7 +23086,7 @@
         <w:pStyle w:val="Legenda"/>
         <w:keepNext/>
       </w:pPr>
-      <w:bookmarkStart w:id="66" w:name="_Toc243992820"/>
+      <w:bookmarkStart w:id="66" w:name="_Toc244071658"/>
       <w:r>
         <w:lastRenderedPageBreak/>
         <w:t xml:space="preserve">Figura </w:t>
@@ -23171,7 +23125,7 @@
           <w:noProof/>
         </w:rPr>
         <w:drawing>
-          <wp:inline distT="0" distB="0" distL="0" distR="0" wp14:anchorId="415D58E7" wp14:editId="35286126">
+          <wp:inline distT="0" distB="0" distL="0" distR="0" wp14:anchorId="6DDE38C5" wp14:editId="0134CFD6">
             <wp:extent cx="5730167" cy="5203986"/>
             <wp:effectExtent l="0" t="0" r="0" b="0"/>
             <wp:docPr id="204" name="Imagem 204"/>
@@ -23251,7 +23205,7 @@
           <w:sz w:val="24"/>
         </w:rPr>
       </w:pPr>
-      <w:bookmarkStart w:id="67" w:name="_Toc243992799"/>
+      <w:bookmarkStart w:id="67" w:name="_Toc244071637"/>
       <w:r>
         <w:rPr>
           <w:sz w:val="24"/>
@@ -23284,7 +23238,7 @@
       <w:pPr>
         <w:pStyle w:val="Ttulo2"/>
       </w:pPr>
-      <w:bookmarkStart w:id="68" w:name="_Toc243992800"/>
+      <w:bookmarkStart w:id="68" w:name="_Toc244071638"/>
       <w:r>
         <w:t>6.1 Organização do Código</w:t>
       </w:r>
@@ -23349,7 +23303,7 @@
       <w:pPr>
         <w:pStyle w:val="Ttulo2"/>
       </w:pPr>
-      <w:bookmarkStart w:id="69" w:name="_Toc243992801"/>
+      <w:bookmarkStart w:id="69" w:name="_Toc244071639"/>
       <w:r>
         <w:t>6.2 Acesso ao Banco de Dados</w:t>
       </w:r>
@@ -23629,7 +23583,7 @@
       <w:pPr>
         <w:pStyle w:val="Ttulo2"/>
       </w:pPr>
-      <w:bookmarkStart w:id="70" w:name="_Toc243992802"/>
+      <w:bookmarkStart w:id="70" w:name="_Toc244071640"/>
       <w:r>
         <w:t>6.3 Acesso Administrativo</w:t>
       </w:r>
@@ -23676,7 +23630,7 @@
       <w:pPr>
         <w:pStyle w:val="Ttulo2"/>
       </w:pPr>
-      <w:bookmarkStart w:id="71" w:name="_Toc243992803"/>
+      <w:bookmarkStart w:id="71" w:name="_Toc244071641"/>
       <w:r>
         <w:lastRenderedPageBreak/>
         <w:t>6.4 Painel Administrativo e Cadastros</w:t>
@@ -23707,7 +23661,7 @@
         <w:pStyle w:val="Legenda"/>
         <w:keepNext/>
       </w:pPr>
-      <w:bookmarkStart w:id="72" w:name="_Toc243992821"/>
+      <w:bookmarkStart w:id="72" w:name="_Toc244071659"/>
       <w:r>
         <w:t xml:space="preserve">Figura </w:t>
       </w:r>
@@ -23745,7 +23699,7 @@
           <w:noProof/>
         </w:rPr>
         <w:drawing>
-          <wp:inline distT="0" distB="0" distL="0" distR="0" wp14:anchorId="6923B05D" wp14:editId="1931DD84">
+          <wp:inline distT="0" distB="0" distL="0" distR="0" wp14:anchorId="6215F85E" wp14:editId="7FE60DC1">
             <wp:extent cx="5730167" cy="3405868"/>
             <wp:effectExtent l="0" t="0" r="0" b="0"/>
             <wp:docPr id="912" name="Imagem 912"/>
@@ -23846,7 +23800,7 @@
         <w:pStyle w:val="Legenda"/>
         <w:keepNext/>
       </w:pPr>
-      <w:bookmarkStart w:id="73" w:name="_Toc243992822"/>
+      <w:bookmarkStart w:id="73" w:name="_Toc244071660"/>
       <w:r>
         <w:t xml:space="preserve">Figura </w:t>
       </w:r>
@@ -23884,7 +23838,7 @@
           <w:noProof/>
         </w:rPr>
         <w:drawing>
-          <wp:inline distT="0" distB="0" distL="0" distR="0" wp14:anchorId="290BE2DA" wp14:editId="480A8D20">
+          <wp:inline distT="0" distB="0" distL="0" distR="0" wp14:anchorId="37AAA817" wp14:editId="28FF4150">
             <wp:extent cx="5730167" cy="3581354"/>
             <wp:effectExtent l="0" t="0" r="0" b="0"/>
             <wp:docPr id="913" name="Imagem 913"/>
@@ -23940,7 +23894,7 @@
       <w:pPr>
         <w:pStyle w:val="Ttulo2"/>
       </w:pPr>
-      <w:bookmarkStart w:id="74" w:name="_Toc243992804"/>
+      <w:bookmarkStart w:id="74" w:name="_Toc244071642"/>
       <w:r>
         <w:t>6.5 Roteiros, Planos e Ordens de Produção</w:t>
       </w:r>
@@ -23988,7 +23942,7 @@
         <w:pStyle w:val="Legenda"/>
         <w:keepNext/>
       </w:pPr>
-      <w:bookmarkStart w:id="75" w:name="_Toc243992823"/>
+      <w:bookmarkStart w:id="75" w:name="_Toc244071661"/>
       <w:r>
         <w:lastRenderedPageBreak/>
         <w:t xml:space="preserve">Figura </w:t>
@@ -24027,7 +23981,7 @@
           <w:noProof/>
         </w:rPr>
         <w:drawing>
-          <wp:inline distT="0" distB="0" distL="0" distR="0" wp14:anchorId="57D4ECD9" wp14:editId="1E8F3413">
+          <wp:inline distT="0" distB="0" distL="0" distR="0" wp14:anchorId="6379746D" wp14:editId="457455AF">
             <wp:extent cx="5730167" cy="3581354"/>
             <wp:effectExtent l="0" t="0" r="0" b="0"/>
             <wp:docPr id="914" name="Imagem 914"/>
@@ -24102,7 +24056,7 @@
         <w:pStyle w:val="Legenda"/>
         <w:keepNext/>
       </w:pPr>
-      <w:bookmarkStart w:id="76" w:name="_Toc243992824"/>
+      <w:bookmarkStart w:id="76" w:name="_Toc244071662"/>
       <w:r>
         <w:lastRenderedPageBreak/>
         <w:t xml:space="preserve">Figura </w:t>
@@ -24141,7 +24095,7 @@
           <w:noProof/>
         </w:rPr>
         <w:drawing>
-          <wp:inline distT="0" distB="0" distL="0" distR="0" wp14:anchorId="76CD7E50" wp14:editId="4473B2DB">
+          <wp:inline distT="0" distB="0" distL="0" distR="0" wp14:anchorId="1B07FD7B" wp14:editId="1C942889">
             <wp:extent cx="5730167" cy="3581354"/>
             <wp:effectExtent l="0" t="0" r="0" b="0"/>
             <wp:docPr id="915" name="Imagem 915"/>
@@ -24197,7 +24151,7 @@
       <w:pPr>
         <w:pStyle w:val="Ttulo2"/>
       </w:pPr>
-      <w:bookmarkStart w:id="77" w:name="_Toc243992805"/>
+      <w:bookmarkStart w:id="77" w:name="_Toc244071643"/>
       <w:r>
         <w:t>6.6 Ilha de Apontamento</w:t>
       </w:r>
@@ -24392,7 +24346,7 @@
         <w:pStyle w:val="Legenda"/>
         <w:keepNext/>
       </w:pPr>
-      <w:bookmarkStart w:id="78" w:name="_Toc243992825"/>
+      <w:bookmarkStart w:id="78" w:name="_Toc244071663"/>
       <w:r>
         <w:t xml:space="preserve">Figura </w:t>
       </w:r>
@@ -24430,7 +24384,7 @@
           <w:noProof/>
         </w:rPr>
         <w:drawing>
-          <wp:inline distT="0" distB="0" distL="0" distR="0" wp14:anchorId="25A155B3" wp14:editId="39617B36">
+          <wp:inline distT="0" distB="0" distL="0" distR="0" wp14:anchorId="7AE3C2DE" wp14:editId="0EB7BA35">
             <wp:extent cx="5730167" cy="3581354"/>
             <wp:effectExtent l="0" t="0" r="0" b="0"/>
             <wp:docPr id="916" name="Imagem 916"/>
@@ -24486,7 +24440,7 @@
       <w:pPr>
         <w:pStyle w:val="Ttulo2"/>
       </w:pPr>
-      <w:bookmarkStart w:id="79" w:name="_Toc243992806"/>
+      <w:bookmarkStart w:id="79" w:name="_Toc244071644"/>
       <w:r>
         <w:lastRenderedPageBreak/>
         <w:t>6.7 Indicadores</w:t>
@@ -24738,6 +24692,24 @@
           <w:sz w:val="24"/>
           <w:szCs w:val="24"/>
         </w:rPr>
+        <w:t>A tela também permite baixar os indicadores do período em uma planilha e imprimir o relatório, com as mesmas informações apresentadas na tela.</w:t>
+      </w:r>
+    </w:p>
+    <w:p>
+      <w:pPr>
+        <w:spacing w:line="360" w:lineRule="auto"/>
+        <w:ind w:firstLine="708"/>
+        <w:jc w:val="both"/>
+        <w:rPr>
+          <w:sz w:val="24"/>
+          <w:szCs w:val="24"/>
+        </w:rPr>
+      </w:pPr>
+      <w:r>
+        <w:rPr>
+          <w:sz w:val="24"/>
+          <w:szCs w:val="24"/>
+        </w:rPr>
         <w:t>Os indicadores mostram apenas o que pode ser calculado a partir dos registros. Como o sistema não registra a jornada nem a disponibilidade de cada posto de trabalho, a tela não apresenta tempo ocioso. O tempo de pausa é exibido junto com o seu motivo, pois uma pausa não representa, necessariamente, uma perda. Além disso, o tempo registrado é o da execução da etapa e não deve ser usado para avaliar o desempenho individual de um operador.</w:t>
       </w:r>
     </w:p>
@@ -24746,7 +24718,7 @@
         <w:pStyle w:val="Legenda"/>
         <w:keepNext/>
       </w:pPr>
-      <w:bookmarkStart w:id="80" w:name="_Toc243992826"/>
+      <w:bookmarkStart w:id="80" w:name="_Toc244071664"/>
       <w:r>
         <w:t xml:space="preserve">Figura </w:t>
       </w:r>
@@ -24784,7 +24756,7 @@
           <w:noProof/>
         </w:rPr>
         <w:drawing>
-          <wp:inline distT="0" distB="0" distL="0" distR="0" wp14:anchorId="6BC08F85" wp14:editId="554ED767">
+          <wp:inline distT="0" distB="0" distL="0" distR="0" wp14:anchorId="396F4AF6" wp14:editId="7D9B92AF">
             <wp:extent cx="4800000" cy="3741000"/>
             <wp:effectExtent l="0" t="0" r="0" b="0"/>
             <wp:docPr id="917" name="Imagem 917"/>
@@ -24840,7 +24812,7 @@
       <w:pPr>
         <w:pStyle w:val="Ttulo2"/>
       </w:pPr>
-      <w:bookmarkStart w:id="81" w:name="_Toc243992807"/>
+      <w:bookmarkStart w:id="81" w:name="_Toc244071645"/>
       <w:r>
         <w:lastRenderedPageBreak/>
         <w:t>6.8 Testes e Publicação</w:t>
@@ -24863,7 +24835,7 @@
           <w:sz w:val="24"/>
           <w:szCs w:val="24"/>
         </w:rPr>
-        <w:t>As regras de negócio e os cálculos são verificados por testes automatizados, executados com o executor de testes do próprio Node.js. No fim de outubro de 2026 o projeto possuía 241 testes, dos quais 234 são executados em toda verificação e 7, que dependem do sistema em funcionamento, são executados manualmente.</w:t>
+        <w:t>As regras de negócio e os cálculos são verificados por testes automatizados, executados com o executor de testes do próprio Node.js. No fim de outubro de 2026 o projeto possuía 243 testes, dos quais 236 são executados em toda verificação e 7, que dependem do sistema em funcionamento, são executados manualmente.</w:t>
       </w:r>
     </w:p>
     <w:p>
@@ -24924,7 +24896,7 @@
       <w:pPr>
         <w:pStyle w:val="Ttulo2"/>
       </w:pPr>
-      <w:bookmarkStart w:id="82" w:name="_Toc243992808"/>
+      <w:bookmarkStart w:id="82" w:name="_Toc244071646"/>
       <w:r>
         <w:t>6.9 Situação Atual da Implementação</w:t>
       </w:r>
@@ -25038,7 +25010,7 @@
           <w:sz w:val="24"/>
           <w:szCs w:val="24"/>
         </w:rPr>
-        <w:t>a tela de indicadores.</w:t>
+        <w:t>a tela de indicadores, com a exportação em planilha e a impressão do relatório.</w:t>
       </w:r>
     </w:p>
     <w:p>
@@ -25074,6 +25046,7 @@
           <w:sz w:val="24"/>
           <w:szCs w:val="24"/>
         </w:rPr>
+        <w:lastRenderedPageBreak/>
         <w:t>Ainda estão pendentes:</w:t>
       </w:r>
     </w:p>
@@ -25097,7 +25070,6 @@
           <w:sz w:val="24"/>
           <w:szCs w:val="24"/>
         </w:rPr>
-        <w:lastRenderedPageBreak/>
         <w:t>o teste da identificação com um leitor de código físico;</w:t>
       </w:r>
     </w:p>
@@ -25191,7 +25163,7 @@
         <w:spacing w:after="100" w:afterAutospacing="1"/>
         <w:jc w:val="center"/>
       </w:pPr>
-      <w:bookmarkStart w:id="83" w:name="_Toc243992809"/>
+      <w:bookmarkStart w:id="83" w:name="_Toc244071647"/>
       <w:r>
         <w:lastRenderedPageBreak/>
         <w:t>REFERÊNCIAS</w:t>
@@ -25899,7 +25871,7 @@
         <w:lang w:eastAsia="pt-BR"/>
       </w:rPr>
       <w:drawing>
-        <wp:inline distT="0" distB="0" distL="0" distR="0" wp14:anchorId="6DF6512A" wp14:editId="1D94A80E">
+        <wp:inline distT="0" distB="0" distL="0" distR="0" wp14:anchorId="60ACA2AD" wp14:editId="59E9AC13">
           <wp:extent cx="1619048" cy="647619"/>
           <wp:effectExtent l="0" t="0" r="0" b="0"/>
           <wp:docPr id="5" name="Imagem 5" descr="Logotipo  O conteúdo gerado por IA pode estar incorreto."/>

</xml_diff>

<commit_message>
docs: atualiza os capítulos 3 e 5 do TCC e os diagramas de classes e de casos de uso
</commit_message>
<xml_diff>
--- a/docs/tcc/TCC_Nivelamento_de_Processos.docx
+++ b/docs/tcc/TCC_Nivelamento_de_Processos.docx
@@ -1706,7 +1706,7 @@
       <w:r>
         <w:fldChar w:fldCharType="separate"/>
       </w:r>
-      <w:hyperlink w:anchor="_Toc244071648" w:history="1">
+      <w:hyperlink w:anchor="_Toc244091473" w:history="1">
         <w:r>
           <w:rPr>
             <w:rStyle w:val="Hyperlink"/>
@@ -1733,7 +1733,7 @@
             <w:noProof/>
             <w:webHidden/>
           </w:rPr>
-          <w:instrText xml:space="preserve"> PAGEREF _Toc244071648 \h </w:instrText>
+          <w:instrText xml:space="preserve"> PAGEREF _Toc244091473 \h </w:instrText>
         </w:r>
         <w:r>
           <w:rPr>
@@ -1778,7 +1778,7 @@
           <w14:ligatures w14:val="standardContextual"/>
         </w:rPr>
       </w:pPr>
-      <w:hyperlink w:anchor="_Toc244071649" w:history="1">
+      <w:hyperlink w:anchor="_Toc244091474" w:history="1">
         <w:r>
           <w:rPr>
             <w:rStyle w:val="Hyperlink"/>
@@ -1805,7 +1805,7 @@
             <w:noProof/>
             <w:webHidden/>
           </w:rPr>
-          <w:instrText xml:space="preserve"> PAGEREF _Toc244071649 \h </w:instrText>
+          <w:instrText xml:space="preserve"> PAGEREF _Toc244091474 \h </w:instrText>
         </w:r>
         <w:r>
           <w:rPr>
@@ -1850,7 +1850,7 @@
           <w14:ligatures w14:val="standardContextual"/>
         </w:rPr>
       </w:pPr>
-      <w:hyperlink w:anchor="_Toc244071650" w:history="1">
+      <w:hyperlink w:anchor="_Toc244091475" w:history="1">
         <w:r>
           <w:rPr>
             <w:rStyle w:val="Hyperlink"/>
@@ -1877,7 +1877,7 @@
             <w:noProof/>
             <w:webHidden/>
           </w:rPr>
-          <w:instrText xml:space="preserve"> PAGEREF _Toc244071650 \h </w:instrText>
+          <w:instrText xml:space="preserve"> PAGEREF _Toc244091475 \h </w:instrText>
         </w:r>
         <w:r>
           <w:rPr>
@@ -1922,7 +1922,7 @@
           <w14:ligatures w14:val="standardContextual"/>
         </w:rPr>
       </w:pPr>
-      <w:hyperlink w:anchor="_Toc244071651" w:history="1">
+      <w:hyperlink w:anchor="_Toc244091476" w:history="1">
         <w:r>
           <w:rPr>
             <w:rStyle w:val="Hyperlink"/>
@@ -1949,7 +1949,7 @@
             <w:noProof/>
             <w:webHidden/>
           </w:rPr>
-          <w:instrText xml:space="preserve"> PAGEREF _Toc244071651 \h </w:instrText>
+          <w:instrText xml:space="preserve"> PAGEREF _Toc244091476 \h </w:instrText>
         </w:r>
         <w:r>
           <w:rPr>
@@ -1994,7 +1994,7 @@
           <w14:ligatures w14:val="standardContextual"/>
         </w:rPr>
       </w:pPr>
-      <w:hyperlink w:anchor="_Toc244071652" w:history="1">
+      <w:hyperlink w:anchor="_Toc244091477" w:history="1">
         <w:r>
           <w:rPr>
             <w:rStyle w:val="Hyperlink"/>
@@ -2021,7 +2021,7 @@
             <w:noProof/>
             <w:webHidden/>
           </w:rPr>
-          <w:instrText xml:space="preserve"> PAGEREF _Toc244071652 \h </w:instrText>
+          <w:instrText xml:space="preserve"> PAGEREF _Toc244091477 \h </w:instrText>
         </w:r>
         <w:r>
           <w:rPr>
@@ -2066,7 +2066,7 @@
           <w14:ligatures w14:val="standardContextual"/>
         </w:rPr>
       </w:pPr>
-      <w:hyperlink w:anchor="_Toc244071653" w:history="1">
+      <w:hyperlink w:anchor="_Toc244091478" w:history="1">
         <w:r>
           <w:rPr>
             <w:rStyle w:val="Hyperlink"/>
@@ -2093,7 +2093,7 @@
             <w:noProof/>
             <w:webHidden/>
           </w:rPr>
-          <w:instrText xml:space="preserve"> PAGEREF _Toc244071653 \h </w:instrText>
+          <w:instrText xml:space="preserve"> PAGEREF _Toc244091478 \h </w:instrText>
         </w:r>
         <w:r>
           <w:rPr>
@@ -2138,7 +2138,7 @@
           <w14:ligatures w14:val="standardContextual"/>
         </w:rPr>
       </w:pPr>
-      <w:hyperlink w:anchor="_Toc244071654" w:history="1">
+      <w:hyperlink w:anchor="_Toc244091479" w:history="1">
         <w:r>
           <w:rPr>
             <w:rStyle w:val="Hyperlink"/>
@@ -2165,7 +2165,7 @@
             <w:noProof/>
             <w:webHidden/>
           </w:rPr>
-          <w:instrText xml:space="preserve"> PAGEREF _Toc244071654 \h </w:instrText>
+          <w:instrText xml:space="preserve"> PAGEREF _Toc244091479 \h </w:instrText>
         </w:r>
         <w:r>
           <w:rPr>
@@ -2210,7 +2210,7 @@
           <w14:ligatures w14:val="standardContextual"/>
         </w:rPr>
       </w:pPr>
-      <w:hyperlink w:anchor="_Toc244071655" w:history="1">
+      <w:hyperlink w:anchor="_Toc244091480" w:history="1">
         <w:r>
           <w:rPr>
             <w:rStyle w:val="Hyperlink"/>
@@ -2237,7 +2237,7 @@
             <w:noProof/>
             <w:webHidden/>
           </w:rPr>
-          <w:instrText xml:space="preserve"> PAGEREF _Toc244071655 \h </w:instrText>
+          <w:instrText xml:space="preserve"> PAGEREF _Toc244091480 \h </w:instrText>
         </w:r>
         <w:r>
           <w:rPr>
@@ -2282,7 +2282,7 @@
           <w14:ligatures w14:val="standardContextual"/>
         </w:rPr>
       </w:pPr>
-      <w:hyperlink w:anchor="_Toc244071656" w:history="1">
+      <w:hyperlink w:anchor="_Toc244091481" w:history="1">
         <w:r>
           <w:rPr>
             <w:rStyle w:val="Hyperlink"/>
@@ -2309,7 +2309,7 @@
             <w:noProof/>
             <w:webHidden/>
           </w:rPr>
-          <w:instrText xml:space="preserve"> PAGEREF _Toc244071656 \h </w:instrText>
+          <w:instrText xml:space="preserve"> PAGEREF _Toc244091481 \h </w:instrText>
         </w:r>
         <w:r>
           <w:rPr>
@@ -2354,7 +2354,7 @@
           <w14:ligatures w14:val="standardContextual"/>
         </w:rPr>
       </w:pPr>
-      <w:hyperlink w:anchor="_Toc244071657" w:history="1">
+      <w:hyperlink w:anchor="_Toc244091482" w:history="1">
         <w:r>
           <w:rPr>
             <w:rStyle w:val="Hyperlink"/>
@@ -2381,7 +2381,7 @@
             <w:noProof/>
             <w:webHidden/>
           </w:rPr>
-          <w:instrText xml:space="preserve"> PAGEREF _Toc244071657 \h </w:instrText>
+          <w:instrText xml:space="preserve"> PAGEREF _Toc244091482 \h </w:instrText>
         </w:r>
         <w:r>
           <w:rPr>
@@ -2426,7 +2426,7 @@
           <w14:ligatures w14:val="standardContextual"/>
         </w:rPr>
       </w:pPr>
-      <w:hyperlink w:anchor="_Toc244071658" w:history="1">
+      <w:hyperlink w:anchor="_Toc244091483" w:history="1">
         <w:r>
           <w:rPr>
             <w:rStyle w:val="Hyperlink"/>
@@ -2453,7 +2453,7 @@
             <w:noProof/>
             <w:webHidden/>
           </w:rPr>
-          <w:instrText xml:space="preserve"> PAGEREF _Toc244071658 \h </w:instrText>
+          <w:instrText xml:space="preserve"> PAGEREF _Toc244091483 \h </w:instrText>
         </w:r>
         <w:r>
           <w:rPr>
@@ -2498,7 +2498,7 @@
           <w14:ligatures w14:val="standardContextual"/>
         </w:rPr>
       </w:pPr>
-      <w:hyperlink w:anchor="_Toc244071659" w:history="1">
+      <w:hyperlink w:anchor="_Toc244091484" w:history="1">
         <w:r>
           <w:rPr>
             <w:rStyle w:val="Hyperlink"/>
@@ -2525,7 +2525,7 @@
             <w:noProof/>
             <w:webHidden/>
           </w:rPr>
-          <w:instrText xml:space="preserve"> PAGEREF _Toc244071659 \h </w:instrText>
+          <w:instrText xml:space="preserve"> PAGEREF _Toc244091484 \h </w:instrText>
         </w:r>
         <w:r>
           <w:rPr>
@@ -2570,7 +2570,7 @@
           <w14:ligatures w14:val="standardContextual"/>
         </w:rPr>
       </w:pPr>
-      <w:hyperlink w:anchor="_Toc244071660" w:history="1">
+      <w:hyperlink w:anchor="_Toc244091485" w:history="1">
         <w:r>
           <w:rPr>
             <w:rStyle w:val="Hyperlink"/>
@@ -2597,7 +2597,7 @@
             <w:noProof/>
             <w:webHidden/>
           </w:rPr>
-          <w:instrText xml:space="preserve"> PAGEREF _Toc244071660 \h </w:instrText>
+          <w:instrText xml:space="preserve"> PAGEREF _Toc244091485 \h </w:instrText>
         </w:r>
         <w:r>
           <w:rPr>
@@ -2642,7 +2642,7 @@
           <w14:ligatures w14:val="standardContextual"/>
         </w:rPr>
       </w:pPr>
-      <w:hyperlink w:anchor="_Toc244071661" w:history="1">
+      <w:hyperlink w:anchor="_Toc244091486" w:history="1">
         <w:r>
           <w:rPr>
             <w:rStyle w:val="Hyperlink"/>
@@ -2669,7 +2669,7 @@
             <w:noProof/>
             <w:webHidden/>
           </w:rPr>
-          <w:instrText xml:space="preserve"> PAGEREF _Toc244071661 \h </w:instrText>
+          <w:instrText xml:space="preserve"> PAGEREF _Toc244091486 \h </w:instrText>
         </w:r>
         <w:r>
           <w:rPr>
@@ -2714,7 +2714,7 @@
           <w14:ligatures w14:val="standardContextual"/>
         </w:rPr>
       </w:pPr>
-      <w:hyperlink w:anchor="_Toc244071662" w:history="1">
+      <w:hyperlink w:anchor="_Toc244091487" w:history="1">
         <w:r>
           <w:rPr>
             <w:rStyle w:val="Hyperlink"/>
@@ -2741,7 +2741,7 @@
             <w:noProof/>
             <w:webHidden/>
           </w:rPr>
-          <w:instrText xml:space="preserve"> PAGEREF _Toc244071662 \h </w:instrText>
+          <w:instrText xml:space="preserve"> PAGEREF _Toc244091487 \h </w:instrText>
         </w:r>
         <w:r>
           <w:rPr>
@@ -2786,7 +2786,7 @@
           <w14:ligatures w14:val="standardContextual"/>
         </w:rPr>
       </w:pPr>
-      <w:hyperlink w:anchor="_Toc244071663" w:history="1">
+      <w:hyperlink w:anchor="_Toc244091488" w:history="1">
         <w:r>
           <w:rPr>
             <w:rStyle w:val="Hyperlink"/>
@@ -2813,7 +2813,7 @@
             <w:noProof/>
             <w:webHidden/>
           </w:rPr>
-          <w:instrText xml:space="preserve"> PAGEREF _Toc244071663 \h </w:instrText>
+          <w:instrText xml:space="preserve"> PAGEREF _Toc244091488 \h </w:instrText>
         </w:r>
         <w:r>
           <w:rPr>
@@ -2858,7 +2858,7 @@
           <w14:ligatures w14:val="standardContextual"/>
         </w:rPr>
       </w:pPr>
-      <w:hyperlink w:anchor="_Toc244071664" w:history="1">
+      <w:hyperlink w:anchor="_Toc244091489" w:history="1">
         <w:r>
           <w:rPr>
             <w:rStyle w:val="Hyperlink"/>
@@ -2885,7 +2885,7 @@
             <w:noProof/>
             <w:webHidden/>
           </w:rPr>
-          <w:instrText xml:space="preserve"> PAGEREF _Toc244071664 \h </w:instrText>
+          <w:instrText xml:space="preserve"> PAGEREF _Toc244091489 \h </w:instrText>
         </w:r>
         <w:r>
           <w:rPr>
@@ -2973,7 +2973,7 @@
       <w:r>
         <w:fldChar w:fldCharType="separate"/>
       </w:r>
-      <w:hyperlink w:anchor="_Toc244071665" w:history="1">
+      <w:hyperlink w:anchor="_Toc244091490" w:history="1">
         <w:r>
           <w:rPr>
             <w:rStyle w:val="Hyperlink"/>
@@ -3000,7 +3000,7 @@
             <w:noProof/>
             <w:webHidden/>
           </w:rPr>
-          <w:instrText xml:space="preserve"> PAGEREF _Toc244071665 \h </w:instrText>
+          <w:instrText xml:space="preserve"> PAGEREF _Toc244091490 \h </w:instrText>
         </w:r>
         <w:r>
           <w:rPr>
@@ -3045,7 +3045,7 @@
           <w14:ligatures w14:val="standardContextual"/>
         </w:rPr>
       </w:pPr>
-      <w:hyperlink w:anchor="_Toc244071666" w:history="1">
+      <w:hyperlink w:anchor="_Toc244091491" w:history="1">
         <w:r>
           <w:rPr>
             <w:rStyle w:val="Hyperlink"/>
@@ -3072,7 +3072,7 @@
             <w:noProof/>
             <w:webHidden/>
           </w:rPr>
-          <w:instrText xml:space="preserve"> PAGEREF _Toc244071666 \h </w:instrText>
+          <w:instrText xml:space="preserve"> PAGEREF _Toc244091491 \h </w:instrText>
         </w:r>
         <w:r>
           <w:rPr>
@@ -3117,7 +3117,7 @@
           <w14:ligatures w14:val="standardContextual"/>
         </w:rPr>
       </w:pPr>
-      <w:hyperlink w:anchor="_Toc244071667" w:history="1">
+      <w:hyperlink w:anchor="_Toc244091492" w:history="1">
         <w:r>
           <w:rPr>
             <w:rStyle w:val="Hyperlink"/>
@@ -3144,7 +3144,7 @@
             <w:noProof/>
             <w:webHidden/>
           </w:rPr>
-          <w:instrText xml:space="preserve"> PAGEREF _Toc244071667 \h </w:instrText>
+          <w:instrText xml:space="preserve"> PAGEREF _Toc244091492 \h </w:instrText>
         </w:r>
         <w:r>
           <w:rPr>
@@ -3189,7 +3189,7 @@
           <w14:ligatures w14:val="standardContextual"/>
         </w:rPr>
       </w:pPr>
-      <w:hyperlink w:anchor="_Toc244071668" w:history="1">
+      <w:hyperlink w:anchor="_Toc244091493" w:history="1">
         <w:r>
           <w:rPr>
             <w:rStyle w:val="Hyperlink"/>
@@ -3216,7 +3216,7 @@
             <w:noProof/>
             <w:webHidden/>
           </w:rPr>
-          <w:instrText xml:space="preserve"> PAGEREF _Toc244071668 \h </w:instrText>
+          <w:instrText xml:space="preserve"> PAGEREF _Toc244091493 \h </w:instrText>
         </w:r>
         <w:r>
           <w:rPr>
@@ -3261,7 +3261,7 @@
           <w14:ligatures w14:val="standardContextual"/>
         </w:rPr>
       </w:pPr>
-      <w:hyperlink w:anchor="_Toc244071669" w:history="1">
+      <w:hyperlink w:anchor="_Toc244091494" w:history="1">
         <w:r>
           <w:rPr>
             <w:rStyle w:val="Hyperlink"/>
@@ -3288,7 +3288,7 @@
             <w:noProof/>
             <w:webHidden/>
           </w:rPr>
-          <w:instrText xml:space="preserve"> PAGEREF _Toc244071669 \h </w:instrText>
+          <w:instrText xml:space="preserve"> PAGEREF _Toc244091494 \h </w:instrText>
         </w:r>
         <w:r>
           <w:rPr>
@@ -3333,7 +3333,7 @@
           <w14:ligatures w14:val="standardContextual"/>
         </w:rPr>
       </w:pPr>
-      <w:hyperlink w:anchor="_Toc244071670" w:history="1">
+      <w:hyperlink w:anchor="_Toc244091495" w:history="1">
         <w:r>
           <w:rPr>
             <w:rStyle w:val="Hyperlink"/>
@@ -3360,7 +3360,7 @@
             <w:noProof/>
             <w:webHidden/>
           </w:rPr>
-          <w:instrText xml:space="preserve"> PAGEREF _Toc244071670 \h </w:instrText>
+          <w:instrText xml:space="preserve"> PAGEREF _Toc244091495 \h </w:instrText>
         </w:r>
         <w:r>
           <w:rPr>
@@ -3405,7 +3405,7 @@
           <w14:ligatures w14:val="standardContextual"/>
         </w:rPr>
       </w:pPr>
-      <w:hyperlink w:anchor="_Toc244071671" w:history="1">
+      <w:hyperlink w:anchor="_Toc244091496" w:history="1">
         <w:r>
           <w:rPr>
             <w:rStyle w:val="Hyperlink"/>
@@ -3432,7 +3432,7 @@
             <w:noProof/>
             <w:webHidden/>
           </w:rPr>
-          <w:instrText xml:space="preserve"> PAGEREF _Toc244071671 \h </w:instrText>
+          <w:instrText xml:space="preserve"> PAGEREF _Toc244091496 \h </w:instrText>
         </w:r>
         <w:r>
           <w:rPr>
@@ -3477,7 +3477,7 @@
           <w14:ligatures w14:val="standardContextual"/>
         </w:rPr>
       </w:pPr>
-      <w:hyperlink w:anchor="_Toc244071672" w:history="1">
+      <w:hyperlink w:anchor="_Toc244091497" w:history="1">
         <w:r>
           <w:rPr>
             <w:rStyle w:val="Hyperlink"/>
@@ -3504,7 +3504,7 @@
             <w:noProof/>
             <w:webHidden/>
           </w:rPr>
-          <w:instrText xml:space="preserve"> PAGEREF _Toc244071672 \h </w:instrText>
+          <w:instrText xml:space="preserve"> PAGEREF _Toc244091497 \h </w:instrText>
         </w:r>
         <w:r>
           <w:rPr>
@@ -3549,7 +3549,7 @@
           <w14:ligatures w14:val="standardContextual"/>
         </w:rPr>
       </w:pPr>
-      <w:hyperlink w:anchor="_Toc244071673" w:history="1">
+      <w:hyperlink w:anchor="_Toc244091498" w:history="1">
         <w:r>
           <w:rPr>
             <w:rStyle w:val="Hyperlink"/>
@@ -3576,7 +3576,7 @@
             <w:noProof/>
             <w:webHidden/>
           </w:rPr>
-          <w:instrText xml:space="preserve"> PAGEREF _Toc244071673 \h </w:instrText>
+          <w:instrText xml:space="preserve"> PAGEREF _Toc244091498 \h </w:instrText>
         </w:r>
         <w:r>
           <w:rPr>
@@ -3621,7 +3621,7 @@
           <w14:ligatures w14:val="standardContextual"/>
         </w:rPr>
       </w:pPr>
-      <w:hyperlink w:anchor="_Toc244071674" w:history="1">
+      <w:hyperlink w:anchor="_Toc244091499" w:history="1">
         <w:r>
           <w:rPr>
             <w:rStyle w:val="Hyperlink"/>
@@ -3648,7 +3648,7 @@
             <w:noProof/>
             <w:webHidden/>
           </w:rPr>
-          <w:instrText xml:space="preserve"> PAGEREF _Toc244071674 \h </w:instrText>
+          <w:instrText xml:space="preserve"> PAGEREF _Toc244091499 \h </w:instrText>
         </w:r>
         <w:r>
           <w:rPr>
@@ -4204,7 +4204,7 @@
             </w:rPr>
             <w:fldChar w:fldCharType="separate"/>
           </w:r>
-          <w:hyperlink w:anchor="_Toc244071591" w:history="1">
+          <w:hyperlink w:anchor="_Toc244091416" w:history="1">
             <w:r>
               <w:rPr>
                 <w:rStyle w:val="Hyperlink"/>
@@ -4227,7 +4227,7 @@
               <w:rPr>
                 <w:webHidden/>
               </w:rPr>
-              <w:instrText xml:space="preserve"> PAGEREF _Toc244071591 \h </w:instrText>
+              <w:instrText xml:space="preserve"> PAGEREF _Toc244091416 \h </w:instrText>
             </w:r>
             <w:r>
               <w:rPr>
@@ -4270,7 +4270,7 @@
               <w14:ligatures w14:val="standardContextual"/>
             </w:rPr>
           </w:pPr>
-          <w:hyperlink w:anchor="_Toc244071592" w:history="1">
+          <w:hyperlink w:anchor="_Toc244091417" w:history="1">
             <w:r>
               <w:rPr>
                 <w:rStyle w:val="Hyperlink"/>
@@ -4298,7 +4298,7 @@
                 <w:noProof/>
                 <w:webHidden/>
               </w:rPr>
-              <w:instrText xml:space="preserve"> PAGEREF _Toc244071592 \h </w:instrText>
+              <w:instrText xml:space="preserve"> PAGEREF _Toc244091417 \h </w:instrText>
             </w:r>
             <w:r>
               <w:rPr>
@@ -4345,7 +4345,7 @@
               <w14:ligatures w14:val="standardContextual"/>
             </w:rPr>
           </w:pPr>
-          <w:hyperlink w:anchor="_Toc244071593" w:history="1">
+          <w:hyperlink w:anchor="_Toc244091418" w:history="1">
             <w:r>
               <w:rPr>
                 <w:rStyle w:val="Hyperlink"/>
@@ -4373,7 +4373,7 @@
                 <w:noProof/>
                 <w:webHidden/>
               </w:rPr>
-              <w:instrText xml:space="preserve"> PAGEREF _Toc244071593 \h </w:instrText>
+              <w:instrText xml:space="preserve"> PAGEREF _Toc244091418 \h </w:instrText>
             </w:r>
             <w:r>
               <w:rPr>
@@ -4420,7 +4420,7 @@
               <w14:ligatures w14:val="standardContextual"/>
             </w:rPr>
           </w:pPr>
-          <w:hyperlink w:anchor="_Toc244071594" w:history="1">
+          <w:hyperlink w:anchor="_Toc244091419" w:history="1">
             <w:r>
               <w:rPr>
                 <w:rStyle w:val="Hyperlink"/>
@@ -4448,7 +4448,7 @@
                 <w:noProof/>
                 <w:webHidden/>
               </w:rPr>
-              <w:instrText xml:space="preserve"> PAGEREF _Toc244071594 \h </w:instrText>
+              <w:instrText xml:space="preserve"> PAGEREF _Toc244091419 \h </w:instrText>
             </w:r>
             <w:r>
               <w:rPr>
@@ -4495,7 +4495,7 @@
               <w14:ligatures w14:val="standardContextual"/>
             </w:rPr>
           </w:pPr>
-          <w:hyperlink w:anchor="_Toc244071595" w:history="1">
+          <w:hyperlink w:anchor="_Toc244091420" w:history="1">
             <w:r>
               <w:rPr>
                 <w:rStyle w:val="Hyperlink"/>
@@ -4522,7 +4522,7 @@
                 <w:noProof/>
                 <w:webHidden/>
               </w:rPr>
-              <w:instrText xml:space="preserve"> PAGEREF _Toc244071595 \h </w:instrText>
+              <w:instrText xml:space="preserve"> PAGEREF _Toc244091420 \h </w:instrText>
             </w:r>
             <w:r>
               <w:rPr>
@@ -4569,7 +4569,7 @@
               <w14:ligatures w14:val="standardContextual"/>
             </w:rPr>
           </w:pPr>
-          <w:hyperlink w:anchor="_Toc244071596" w:history="1">
+          <w:hyperlink w:anchor="_Toc244091421" w:history="1">
             <w:r>
               <w:rPr>
                 <w:rStyle w:val="Hyperlink"/>
@@ -4596,7 +4596,7 @@
                 <w:noProof/>
                 <w:webHidden/>
               </w:rPr>
-              <w:instrText xml:space="preserve"> PAGEREF _Toc244071596 \h </w:instrText>
+              <w:instrText xml:space="preserve"> PAGEREF _Toc244091421 \h </w:instrText>
             </w:r>
             <w:r>
               <w:rPr>
@@ -4643,7 +4643,7 @@
               <w14:ligatures w14:val="standardContextual"/>
             </w:rPr>
           </w:pPr>
-          <w:hyperlink w:anchor="_Toc244071597" w:history="1">
+          <w:hyperlink w:anchor="_Toc244091422" w:history="1">
             <w:r>
               <w:rPr>
                 <w:rStyle w:val="Hyperlink"/>
@@ -4671,7 +4671,7 @@
                 <w:noProof/>
                 <w:webHidden/>
               </w:rPr>
-              <w:instrText xml:space="preserve"> PAGEREF _Toc244071597 \h </w:instrText>
+              <w:instrText xml:space="preserve"> PAGEREF _Toc244091422 \h </w:instrText>
             </w:r>
             <w:r>
               <w:rPr>
@@ -4718,7 +4718,7 @@
               <w14:ligatures w14:val="standardContextual"/>
             </w:rPr>
           </w:pPr>
-          <w:hyperlink w:anchor="_Toc244071598" w:history="1">
+          <w:hyperlink w:anchor="_Toc244091423" w:history="1">
             <w:r>
               <w:rPr>
                 <w:rStyle w:val="Hyperlink"/>
@@ -4746,7 +4746,7 @@
                 <w:noProof/>
                 <w:webHidden/>
               </w:rPr>
-              <w:instrText xml:space="preserve"> PAGEREF _Toc244071598 \h </w:instrText>
+              <w:instrText xml:space="preserve"> PAGEREF _Toc244091423 \h </w:instrText>
             </w:r>
             <w:r>
               <w:rPr>
@@ -4790,7 +4790,7 @@
               <w14:ligatures w14:val="standardContextual"/>
             </w:rPr>
           </w:pPr>
-          <w:hyperlink w:anchor="_Toc244071599" w:history="1">
+          <w:hyperlink w:anchor="_Toc244091424" w:history="1">
             <w:r>
               <w:rPr>
                 <w:rStyle w:val="Hyperlink"/>
@@ -4813,7 +4813,7 @@
               <w:rPr>
                 <w:webHidden/>
               </w:rPr>
-              <w:instrText xml:space="preserve"> PAGEREF _Toc244071599 \h </w:instrText>
+              <w:instrText xml:space="preserve"> PAGEREF _Toc244091424 \h </w:instrText>
             </w:r>
             <w:r>
               <w:rPr>
@@ -4856,7 +4856,7 @@
               <w14:ligatures w14:val="standardContextual"/>
             </w:rPr>
           </w:pPr>
-          <w:hyperlink w:anchor="_Toc244071600" w:history="1">
+          <w:hyperlink w:anchor="_Toc244091425" w:history="1">
             <w:r>
               <w:rPr>
                 <w:rStyle w:val="Hyperlink"/>
@@ -4884,7 +4884,7 @@
                 <w:noProof/>
                 <w:webHidden/>
               </w:rPr>
-              <w:instrText xml:space="preserve"> PAGEREF _Toc244071600 \h </w:instrText>
+              <w:instrText xml:space="preserve"> PAGEREF _Toc244091425 \h </w:instrText>
             </w:r>
             <w:r>
               <w:rPr>
@@ -4931,7 +4931,7 @@
               <w14:ligatures w14:val="standardContextual"/>
             </w:rPr>
           </w:pPr>
-          <w:hyperlink w:anchor="_Toc244071601" w:history="1">
+          <w:hyperlink w:anchor="_Toc244091426" w:history="1">
             <w:r>
               <w:rPr>
                 <w:rStyle w:val="Hyperlink"/>
@@ -4959,7 +4959,7 @@
                 <w:noProof/>
                 <w:webHidden/>
               </w:rPr>
-              <w:instrText xml:space="preserve"> PAGEREF _Toc244071601 \h </w:instrText>
+              <w:instrText xml:space="preserve"> PAGEREF _Toc244091426 \h </w:instrText>
             </w:r>
             <w:r>
               <w:rPr>
@@ -5006,7 +5006,7 @@
               <w14:ligatures w14:val="standardContextual"/>
             </w:rPr>
           </w:pPr>
-          <w:hyperlink w:anchor="_Toc244071602" w:history="1">
+          <w:hyperlink w:anchor="_Toc244091427" w:history="1">
             <w:r>
               <w:rPr>
                 <w:rStyle w:val="Hyperlink"/>
@@ -5034,7 +5034,7 @@
                 <w:noProof/>
                 <w:webHidden/>
               </w:rPr>
-              <w:instrText xml:space="preserve"> PAGEREF _Toc244071602 \h </w:instrText>
+              <w:instrText xml:space="preserve"> PAGEREF _Toc244091427 \h </w:instrText>
             </w:r>
             <w:r>
               <w:rPr>
@@ -5081,7 +5081,7 @@
               <w14:ligatures w14:val="standardContextual"/>
             </w:rPr>
           </w:pPr>
-          <w:hyperlink w:anchor="_Toc244071603" w:history="1">
+          <w:hyperlink w:anchor="_Toc244091428" w:history="1">
             <w:r>
               <w:rPr>
                 <w:rStyle w:val="Hyperlink"/>
@@ -5109,7 +5109,7 @@
                 <w:noProof/>
                 <w:webHidden/>
               </w:rPr>
-              <w:instrText xml:space="preserve"> PAGEREF _Toc244071603 \h </w:instrText>
+              <w:instrText xml:space="preserve"> PAGEREF _Toc244091428 \h </w:instrText>
             </w:r>
             <w:r>
               <w:rPr>
@@ -5156,7 +5156,7 @@
               <w14:ligatures w14:val="standardContextual"/>
             </w:rPr>
           </w:pPr>
-          <w:hyperlink w:anchor="_Toc244071604" w:history="1">
+          <w:hyperlink w:anchor="_Toc244091429" w:history="1">
             <w:r>
               <w:rPr>
                 <w:rStyle w:val="Hyperlink"/>
@@ -5185,7 +5185,7 @@
                 <w:noProof/>
                 <w:webHidden/>
               </w:rPr>
-              <w:instrText xml:space="preserve"> PAGEREF _Toc244071604 \h </w:instrText>
+              <w:instrText xml:space="preserve"> PAGEREF _Toc244091429 \h </w:instrText>
             </w:r>
             <w:r>
               <w:rPr>
@@ -5232,7 +5232,7 @@
               <w14:ligatures w14:val="standardContextual"/>
             </w:rPr>
           </w:pPr>
-          <w:hyperlink w:anchor="_Toc244071605" w:history="1">
+          <w:hyperlink w:anchor="_Toc244091430" w:history="1">
             <w:r>
               <w:rPr>
                 <w:rStyle w:val="Hyperlink"/>
@@ -5260,7 +5260,7 @@
                 <w:noProof/>
                 <w:webHidden/>
               </w:rPr>
-              <w:instrText xml:space="preserve"> PAGEREF _Toc244071605 \h </w:instrText>
+              <w:instrText xml:space="preserve"> PAGEREF _Toc244091430 \h </w:instrText>
             </w:r>
             <w:r>
               <w:rPr>
@@ -5307,7 +5307,7 @@
               <w14:ligatures w14:val="standardContextual"/>
             </w:rPr>
           </w:pPr>
-          <w:hyperlink w:anchor="_Toc244071606" w:history="1">
+          <w:hyperlink w:anchor="_Toc244091431" w:history="1">
             <w:r>
               <w:rPr>
                 <w:rStyle w:val="Hyperlink"/>
@@ -5335,7 +5335,7 @@
                 <w:noProof/>
                 <w:webHidden/>
               </w:rPr>
-              <w:instrText xml:space="preserve"> PAGEREF _Toc244071606 \h </w:instrText>
+              <w:instrText xml:space="preserve"> PAGEREF _Toc244091431 \h </w:instrText>
             </w:r>
             <w:r>
               <w:rPr>
@@ -5382,7 +5382,7 @@
               <w14:ligatures w14:val="standardContextual"/>
             </w:rPr>
           </w:pPr>
-          <w:hyperlink w:anchor="_Toc244071607" w:history="1">
+          <w:hyperlink w:anchor="_Toc244091432" w:history="1">
             <w:r>
               <w:rPr>
                 <w:rStyle w:val="Hyperlink"/>
@@ -5410,7 +5410,7 @@
                 <w:noProof/>
                 <w:webHidden/>
               </w:rPr>
-              <w:instrText xml:space="preserve"> PAGEREF _Toc244071607 \h </w:instrText>
+              <w:instrText xml:space="preserve"> PAGEREF _Toc244091432 \h </w:instrText>
             </w:r>
             <w:r>
               <w:rPr>
@@ -5457,7 +5457,7 @@
               <w14:ligatures w14:val="standardContextual"/>
             </w:rPr>
           </w:pPr>
-          <w:hyperlink w:anchor="_Toc244071608" w:history="1">
+          <w:hyperlink w:anchor="_Toc244091433" w:history="1">
             <w:r>
               <w:rPr>
                 <w:rStyle w:val="Hyperlink"/>
@@ -5484,7 +5484,7 @@
                 <w:noProof/>
                 <w:webHidden/>
               </w:rPr>
-              <w:instrText xml:space="preserve"> PAGEREF _Toc244071608 \h </w:instrText>
+              <w:instrText xml:space="preserve"> PAGEREF _Toc244091433 \h </w:instrText>
             </w:r>
             <w:r>
               <w:rPr>
@@ -5528,7 +5528,7 @@
               <w14:ligatures w14:val="standardContextual"/>
             </w:rPr>
           </w:pPr>
-          <w:hyperlink w:anchor="_Toc244071609" w:history="1">
+          <w:hyperlink w:anchor="_Toc244091434" w:history="1">
             <w:r>
               <w:rPr>
                 <w:rStyle w:val="Hyperlink"/>
@@ -5551,7 +5551,7 @@
               <w:rPr>
                 <w:webHidden/>
               </w:rPr>
-              <w:instrText xml:space="preserve"> PAGEREF _Toc244071609 \h </w:instrText>
+              <w:instrText xml:space="preserve"> PAGEREF _Toc244091434 \h </w:instrText>
             </w:r>
             <w:r>
               <w:rPr>
@@ -5594,7 +5594,7 @@
               <w14:ligatures w14:val="standardContextual"/>
             </w:rPr>
           </w:pPr>
-          <w:hyperlink w:anchor="_Toc244071610" w:history="1">
+          <w:hyperlink w:anchor="_Toc244091435" w:history="1">
             <w:r>
               <w:rPr>
                 <w:rStyle w:val="Hyperlink"/>
@@ -5622,7 +5622,7 @@
                 <w:noProof/>
                 <w:webHidden/>
               </w:rPr>
-              <w:instrText xml:space="preserve"> PAGEREF _Toc244071610 \h </w:instrText>
+              <w:instrText xml:space="preserve"> PAGEREF _Toc244091435 \h </w:instrText>
             </w:r>
             <w:r>
               <w:rPr>
@@ -5669,7 +5669,7 @@
               <w14:ligatures w14:val="standardContextual"/>
             </w:rPr>
           </w:pPr>
-          <w:hyperlink w:anchor="_Toc244071611" w:history="1">
+          <w:hyperlink w:anchor="_Toc244091436" w:history="1">
             <w:r>
               <w:rPr>
                 <w:rStyle w:val="Hyperlink"/>
@@ -5696,7 +5696,7 @@
                 <w:noProof/>
                 <w:webHidden/>
               </w:rPr>
-              <w:instrText xml:space="preserve"> PAGEREF _Toc244071611 \h </w:instrText>
+              <w:instrText xml:space="preserve"> PAGEREF _Toc244091436 \h </w:instrText>
             </w:r>
             <w:r>
               <w:rPr>
@@ -5743,7 +5743,7 @@
               <w14:ligatures w14:val="standardContextual"/>
             </w:rPr>
           </w:pPr>
-          <w:hyperlink w:anchor="_Toc244071612" w:history="1">
+          <w:hyperlink w:anchor="_Toc244091437" w:history="1">
             <w:r>
               <w:rPr>
                 <w:rStyle w:val="Hyperlink"/>
@@ -5770,7 +5770,7 @@
                 <w:noProof/>
                 <w:webHidden/>
               </w:rPr>
-              <w:instrText xml:space="preserve"> PAGEREF _Toc244071612 \h </w:instrText>
+              <w:instrText xml:space="preserve"> PAGEREF _Toc244091437 \h </w:instrText>
             </w:r>
             <w:r>
               <w:rPr>
@@ -5817,7 +5817,7 @@
               <w14:ligatures w14:val="standardContextual"/>
             </w:rPr>
           </w:pPr>
-          <w:hyperlink w:anchor="_Toc244071613" w:history="1">
+          <w:hyperlink w:anchor="_Toc244091438" w:history="1">
             <w:r>
               <w:rPr>
                 <w:rStyle w:val="Hyperlink"/>
@@ -5844,7 +5844,7 @@
                 <w:noProof/>
                 <w:webHidden/>
               </w:rPr>
-              <w:instrText xml:space="preserve"> PAGEREF _Toc244071613 \h </w:instrText>
+              <w:instrText xml:space="preserve"> PAGEREF _Toc244091438 \h </w:instrText>
             </w:r>
             <w:r>
               <w:rPr>
@@ -5891,7 +5891,7 @@
               <w14:ligatures w14:val="standardContextual"/>
             </w:rPr>
           </w:pPr>
-          <w:hyperlink w:anchor="_Toc244071614" w:history="1">
+          <w:hyperlink w:anchor="_Toc244091439" w:history="1">
             <w:r>
               <w:rPr>
                 <w:rStyle w:val="Hyperlink"/>
@@ -5918,7 +5918,7 @@
                 <w:noProof/>
                 <w:webHidden/>
               </w:rPr>
-              <w:instrText xml:space="preserve"> PAGEREF _Toc244071614 \h </w:instrText>
+              <w:instrText xml:space="preserve"> PAGEREF _Toc244091439 \h </w:instrText>
             </w:r>
             <w:r>
               <w:rPr>
@@ -5965,7 +5965,7 @@
               <w14:ligatures w14:val="standardContextual"/>
             </w:rPr>
           </w:pPr>
-          <w:hyperlink w:anchor="_Toc244071615" w:history="1">
+          <w:hyperlink w:anchor="_Toc244091440" w:history="1">
             <w:r>
               <w:rPr>
                 <w:rStyle w:val="Hyperlink"/>
@@ -5992,7 +5992,7 @@
                 <w:noProof/>
                 <w:webHidden/>
               </w:rPr>
-              <w:instrText xml:space="preserve"> PAGEREF _Toc244071615 \h </w:instrText>
+              <w:instrText xml:space="preserve"> PAGEREF _Toc244091440 \h </w:instrText>
             </w:r>
             <w:r>
               <w:rPr>
@@ -6039,7 +6039,7 @@
               <w14:ligatures w14:val="standardContextual"/>
             </w:rPr>
           </w:pPr>
-          <w:hyperlink w:anchor="_Toc244071616" w:history="1">
+          <w:hyperlink w:anchor="_Toc244091441" w:history="1">
             <w:r>
               <w:rPr>
                 <w:rStyle w:val="Hyperlink"/>
@@ -6066,7 +6066,7 @@
                 <w:noProof/>
                 <w:webHidden/>
               </w:rPr>
-              <w:instrText xml:space="preserve"> PAGEREF _Toc244071616 \h </w:instrText>
+              <w:instrText xml:space="preserve"> PAGEREF _Toc244091441 \h </w:instrText>
             </w:r>
             <w:r>
               <w:rPr>
@@ -6110,7 +6110,7 @@
               <w14:ligatures w14:val="standardContextual"/>
             </w:rPr>
           </w:pPr>
-          <w:hyperlink w:anchor="_Toc244071617" w:history="1">
+          <w:hyperlink w:anchor="_Toc244091442" w:history="1">
             <w:r>
               <w:rPr>
                 <w:rStyle w:val="Hyperlink"/>
@@ -6133,7 +6133,7 @@
               <w:rPr>
                 <w:webHidden/>
               </w:rPr>
-              <w:instrText xml:space="preserve"> PAGEREF _Toc244071617 \h </w:instrText>
+              <w:instrText xml:space="preserve"> PAGEREF _Toc244091442 \h </w:instrText>
             </w:r>
             <w:r>
               <w:rPr>
@@ -6176,7 +6176,7 @@
               <w14:ligatures w14:val="standardContextual"/>
             </w:rPr>
           </w:pPr>
-          <w:hyperlink w:anchor="_Toc244071618" w:history="1">
+          <w:hyperlink w:anchor="_Toc244091443" w:history="1">
             <w:r>
               <w:rPr>
                 <w:rStyle w:val="Hyperlink"/>
@@ -6203,7 +6203,7 @@
                 <w:noProof/>
                 <w:webHidden/>
               </w:rPr>
-              <w:instrText xml:space="preserve"> PAGEREF _Toc244071618 \h </w:instrText>
+              <w:instrText xml:space="preserve"> PAGEREF _Toc244091443 \h </w:instrText>
             </w:r>
             <w:r>
               <w:rPr>
@@ -6250,7 +6250,7 @@
               <w14:ligatures w14:val="standardContextual"/>
             </w:rPr>
           </w:pPr>
-          <w:hyperlink w:anchor="_Toc244071619" w:history="1">
+          <w:hyperlink w:anchor="_Toc244091444" w:history="1">
             <w:r>
               <w:rPr>
                 <w:rStyle w:val="Hyperlink"/>
@@ -6277,7 +6277,7 @@
                 <w:noProof/>
                 <w:webHidden/>
               </w:rPr>
-              <w:instrText xml:space="preserve"> PAGEREF _Toc244071619 \h </w:instrText>
+              <w:instrText xml:space="preserve"> PAGEREF _Toc244091444 \h </w:instrText>
             </w:r>
             <w:r>
               <w:rPr>
@@ -6324,7 +6324,7 @@
               <w14:ligatures w14:val="standardContextual"/>
             </w:rPr>
           </w:pPr>
-          <w:hyperlink w:anchor="_Toc244071620" w:history="1">
+          <w:hyperlink w:anchor="_Toc244091445" w:history="1">
             <w:r>
               <w:rPr>
                 <w:rStyle w:val="Hyperlink"/>
@@ -6351,7 +6351,7 @@
                 <w:noProof/>
                 <w:webHidden/>
               </w:rPr>
-              <w:instrText xml:space="preserve"> PAGEREF _Toc244071620 \h </w:instrText>
+              <w:instrText xml:space="preserve"> PAGEREF _Toc244091445 \h </w:instrText>
             </w:r>
             <w:r>
               <w:rPr>
@@ -6398,7 +6398,7 @@
               <w14:ligatures w14:val="standardContextual"/>
             </w:rPr>
           </w:pPr>
-          <w:hyperlink w:anchor="_Toc244071621" w:history="1">
+          <w:hyperlink w:anchor="_Toc244091446" w:history="1">
             <w:r>
               <w:rPr>
                 <w:rStyle w:val="Hyperlink"/>
@@ -6425,7 +6425,7 @@
                 <w:noProof/>
                 <w:webHidden/>
               </w:rPr>
-              <w:instrText xml:space="preserve"> PAGEREF _Toc244071621 \h </w:instrText>
+              <w:instrText xml:space="preserve"> PAGEREF _Toc244091446 \h </w:instrText>
             </w:r>
             <w:r>
               <w:rPr>
@@ -6472,7 +6472,7 @@
               <w14:ligatures w14:val="standardContextual"/>
             </w:rPr>
           </w:pPr>
-          <w:hyperlink w:anchor="_Toc244071622" w:history="1">
+          <w:hyperlink w:anchor="_Toc244091447" w:history="1">
             <w:r>
               <w:rPr>
                 <w:rStyle w:val="Hyperlink"/>
@@ -6499,7 +6499,7 @@
                 <w:noProof/>
                 <w:webHidden/>
               </w:rPr>
-              <w:instrText xml:space="preserve"> PAGEREF _Toc244071622 \h </w:instrText>
+              <w:instrText xml:space="preserve"> PAGEREF _Toc244091447 \h </w:instrText>
             </w:r>
             <w:r>
               <w:rPr>
@@ -6546,7 +6546,7 @@
               <w14:ligatures w14:val="standardContextual"/>
             </w:rPr>
           </w:pPr>
-          <w:hyperlink w:anchor="_Toc244071623" w:history="1">
+          <w:hyperlink w:anchor="_Toc244091448" w:history="1">
             <w:r>
               <w:rPr>
                 <w:rStyle w:val="Hyperlink"/>
@@ -6573,7 +6573,7 @@
                 <w:noProof/>
                 <w:webHidden/>
               </w:rPr>
-              <w:instrText xml:space="preserve"> PAGEREF _Toc244071623 \h </w:instrText>
+              <w:instrText xml:space="preserve"> PAGEREF _Toc244091448 \h </w:instrText>
             </w:r>
             <w:r>
               <w:rPr>
@@ -6620,7 +6620,7 @@
               <w14:ligatures w14:val="standardContextual"/>
             </w:rPr>
           </w:pPr>
-          <w:hyperlink w:anchor="_Toc244071624" w:history="1">
+          <w:hyperlink w:anchor="_Toc244091449" w:history="1">
             <w:r>
               <w:rPr>
                 <w:rStyle w:val="Hyperlink"/>
@@ -6647,7 +6647,7 @@
                 <w:noProof/>
                 <w:webHidden/>
               </w:rPr>
-              <w:instrText xml:space="preserve"> PAGEREF _Toc244071624 \h </w:instrText>
+              <w:instrText xml:space="preserve"> PAGEREF _Toc244091449 \h </w:instrText>
             </w:r>
             <w:r>
               <w:rPr>
@@ -6694,7 +6694,7 @@
               <w14:ligatures w14:val="standardContextual"/>
             </w:rPr>
           </w:pPr>
-          <w:hyperlink w:anchor="_Toc244071625" w:history="1">
+          <w:hyperlink w:anchor="_Toc244091450" w:history="1">
             <w:r>
               <w:rPr>
                 <w:rStyle w:val="Hyperlink"/>
@@ -6721,7 +6721,7 @@
                 <w:noProof/>
                 <w:webHidden/>
               </w:rPr>
-              <w:instrText xml:space="preserve"> PAGEREF _Toc244071625 \h </w:instrText>
+              <w:instrText xml:space="preserve"> PAGEREF _Toc244091450 \h </w:instrText>
             </w:r>
             <w:r>
               <w:rPr>
@@ -6768,7 +6768,7 @@
               <w14:ligatures w14:val="standardContextual"/>
             </w:rPr>
           </w:pPr>
-          <w:hyperlink w:anchor="_Toc244071626" w:history="1">
+          <w:hyperlink w:anchor="_Toc244091451" w:history="1">
             <w:r>
               <w:rPr>
                 <w:rStyle w:val="Hyperlink"/>
@@ -6795,7 +6795,7 @@
                 <w:noProof/>
                 <w:webHidden/>
               </w:rPr>
-              <w:instrText xml:space="preserve"> PAGEREF _Toc244071626 \h </w:instrText>
+              <w:instrText xml:space="preserve"> PAGEREF _Toc244091451 \h </w:instrText>
             </w:r>
             <w:r>
               <w:rPr>
@@ -6842,7 +6842,7 @@
               <w14:ligatures w14:val="standardContextual"/>
             </w:rPr>
           </w:pPr>
-          <w:hyperlink w:anchor="_Toc244071627" w:history="1">
+          <w:hyperlink w:anchor="_Toc244091452" w:history="1">
             <w:r>
               <w:rPr>
                 <w:rStyle w:val="Hyperlink"/>
@@ -6869,7 +6869,7 @@
                 <w:noProof/>
                 <w:webHidden/>
               </w:rPr>
-              <w:instrText xml:space="preserve"> PAGEREF _Toc244071627 \h </w:instrText>
+              <w:instrText xml:space="preserve"> PAGEREF _Toc244091452 \h </w:instrText>
             </w:r>
             <w:r>
               <w:rPr>
@@ -6916,7 +6916,7 @@
               <w14:ligatures w14:val="standardContextual"/>
             </w:rPr>
           </w:pPr>
-          <w:hyperlink w:anchor="_Toc244071628" w:history="1">
+          <w:hyperlink w:anchor="_Toc244091453" w:history="1">
             <w:r>
               <w:rPr>
                 <w:rStyle w:val="Hyperlink"/>
@@ -6943,7 +6943,7 @@
                 <w:noProof/>
                 <w:webHidden/>
               </w:rPr>
-              <w:instrText xml:space="preserve"> PAGEREF _Toc244071628 \h </w:instrText>
+              <w:instrText xml:space="preserve"> PAGEREF _Toc244091453 \h </w:instrText>
             </w:r>
             <w:r>
               <w:rPr>
@@ -6990,7 +6990,7 @@
               <w14:ligatures w14:val="standardContextual"/>
             </w:rPr>
           </w:pPr>
-          <w:hyperlink w:anchor="_Toc244071629" w:history="1">
+          <w:hyperlink w:anchor="_Toc244091454" w:history="1">
             <w:r>
               <w:rPr>
                 <w:rStyle w:val="Hyperlink"/>
@@ -7017,7 +7017,7 @@
                 <w:noProof/>
                 <w:webHidden/>
               </w:rPr>
-              <w:instrText xml:space="preserve"> PAGEREF _Toc244071629 \h </w:instrText>
+              <w:instrText xml:space="preserve"> PAGEREF _Toc244091454 \h </w:instrText>
             </w:r>
             <w:r>
               <w:rPr>
@@ -7064,7 +7064,7 @@
               <w14:ligatures w14:val="standardContextual"/>
             </w:rPr>
           </w:pPr>
-          <w:hyperlink w:anchor="_Toc244071630" w:history="1">
+          <w:hyperlink w:anchor="_Toc244091455" w:history="1">
             <w:r>
               <w:rPr>
                 <w:rStyle w:val="Hyperlink"/>
@@ -7091,7 +7091,7 @@
                 <w:noProof/>
                 <w:webHidden/>
               </w:rPr>
-              <w:instrText xml:space="preserve"> PAGEREF _Toc244071630 \h </w:instrText>
+              <w:instrText xml:space="preserve"> PAGEREF _Toc244091455 \h </w:instrText>
             </w:r>
             <w:r>
               <w:rPr>
@@ -7138,7 +7138,7 @@
               <w14:ligatures w14:val="standardContextual"/>
             </w:rPr>
           </w:pPr>
-          <w:hyperlink w:anchor="_Toc244071631" w:history="1">
+          <w:hyperlink w:anchor="_Toc244091456" w:history="1">
             <w:r>
               <w:rPr>
                 <w:rStyle w:val="Hyperlink"/>
@@ -7165,7 +7165,7 @@
                 <w:noProof/>
                 <w:webHidden/>
               </w:rPr>
-              <w:instrText xml:space="preserve"> PAGEREF _Toc244071631 \h </w:instrText>
+              <w:instrText xml:space="preserve"> PAGEREF _Toc244091456 \h </w:instrText>
             </w:r>
             <w:r>
               <w:rPr>
@@ -7212,7 +7212,7 @@
               <w14:ligatures w14:val="standardContextual"/>
             </w:rPr>
           </w:pPr>
-          <w:hyperlink w:anchor="_Toc244071632" w:history="1">
+          <w:hyperlink w:anchor="_Toc244091457" w:history="1">
             <w:r>
               <w:rPr>
                 <w:rStyle w:val="Hyperlink"/>
@@ -7239,7 +7239,7 @@
                 <w:noProof/>
                 <w:webHidden/>
               </w:rPr>
-              <w:instrText xml:space="preserve"> PAGEREF _Toc244071632 \h </w:instrText>
+              <w:instrText xml:space="preserve"> PAGEREF _Toc244091457 \h </w:instrText>
             </w:r>
             <w:r>
               <w:rPr>
@@ -7283,7 +7283,7 @@
               <w14:ligatures w14:val="standardContextual"/>
             </w:rPr>
           </w:pPr>
-          <w:hyperlink w:anchor="_Toc244071633" w:history="1">
+          <w:hyperlink w:anchor="_Toc244091458" w:history="1">
             <w:r>
               <w:rPr>
                 <w:rStyle w:val="Hyperlink"/>
@@ -7306,7 +7306,7 @@
               <w:rPr>
                 <w:webHidden/>
               </w:rPr>
-              <w:instrText xml:space="preserve"> PAGEREF _Toc244071633 \h </w:instrText>
+              <w:instrText xml:space="preserve"> PAGEREF _Toc244091458 \h </w:instrText>
             </w:r>
             <w:r>
               <w:rPr>
@@ -7349,7 +7349,7 @@
               <w14:ligatures w14:val="standardContextual"/>
             </w:rPr>
           </w:pPr>
-          <w:hyperlink w:anchor="_Toc244071634" w:history="1">
+          <w:hyperlink w:anchor="_Toc244091459" w:history="1">
             <w:r>
               <w:rPr>
                 <w:rStyle w:val="Hyperlink"/>
@@ -7376,7 +7376,7 @@
                 <w:noProof/>
                 <w:webHidden/>
               </w:rPr>
-              <w:instrText xml:space="preserve"> PAGEREF _Toc244071634 \h </w:instrText>
+              <w:instrText xml:space="preserve"> PAGEREF _Toc244091459 \h </w:instrText>
             </w:r>
             <w:r>
               <w:rPr>
@@ -7423,7 +7423,7 @@
               <w14:ligatures w14:val="standardContextual"/>
             </w:rPr>
           </w:pPr>
-          <w:hyperlink w:anchor="_Toc244071635" w:history="1">
+          <w:hyperlink w:anchor="_Toc244091460" w:history="1">
             <w:r>
               <w:rPr>
                 <w:rStyle w:val="Hyperlink"/>
@@ -7450,7 +7450,7 @@
                 <w:noProof/>
                 <w:webHidden/>
               </w:rPr>
-              <w:instrText xml:space="preserve"> PAGEREF _Toc244071635 \h </w:instrText>
+              <w:instrText xml:space="preserve"> PAGEREF _Toc244091460 \h </w:instrText>
             </w:r>
             <w:r>
               <w:rPr>
@@ -7497,7 +7497,7 @@
               <w14:ligatures w14:val="standardContextual"/>
             </w:rPr>
           </w:pPr>
-          <w:hyperlink w:anchor="_Toc244071636" w:history="1">
+          <w:hyperlink w:anchor="_Toc244091461" w:history="1">
             <w:r>
               <w:rPr>
                 <w:rStyle w:val="Hyperlink"/>
@@ -7524,7 +7524,7 @@
                 <w:noProof/>
                 <w:webHidden/>
               </w:rPr>
-              <w:instrText xml:space="preserve"> PAGEREF _Toc244071636 \h </w:instrText>
+              <w:instrText xml:space="preserve"> PAGEREF _Toc244091461 \h </w:instrText>
             </w:r>
             <w:r>
               <w:rPr>
@@ -7568,7 +7568,7 @@
               <w14:ligatures w14:val="standardContextual"/>
             </w:rPr>
           </w:pPr>
-          <w:hyperlink w:anchor="_Toc244071637" w:history="1">
+          <w:hyperlink w:anchor="_Toc244091462" w:history="1">
             <w:r>
               <w:rPr>
                 <w:rStyle w:val="Hyperlink"/>
@@ -7591,7 +7591,7 @@
               <w:rPr>
                 <w:webHidden/>
               </w:rPr>
-              <w:instrText xml:space="preserve"> PAGEREF _Toc244071637 \h </w:instrText>
+              <w:instrText xml:space="preserve"> PAGEREF _Toc244091462 \h </w:instrText>
             </w:r>
             <w:r>
               <w:rPr>
@@ -7634,7 +7634,7 @@
               <w14:ligatures w14:val="standardContextual"/>
             </w:rPr>
           </w:pPr>
-          <w:hyperlink w:anchor="_Toc244071638" w:history="1">
+          <w:hyperlink w:anchor="_Toc244091463" w:history="1">
             <w:r>
               <w:rPr>
                 <w:rStyle w:val="Hyperlink"/>
@@ -7661,7 +7661,7 @@
                 <w:noProof/>
                 <w:webHidden/>
               </w:rPr>
-              <w:instrText xml:space="preserve"> PAGEREF _Toc244071638 \h </w:instrText>
+              <w:instrText xml:space="preserve"> PAGEREF _Toc244091463 \h </w:instrText>
             </w:r>
             <w:r>
               <w:rPr>
@@ -7708,7 +7708,7 @@
               <w14:ligatures w14:val="standardContextual"/>
             </w:rPr>
           </w:pPr>
-          <w:hyperlink w:anchor="_Toc244071639" w:history="1">
+          <w:hyperlink w:anchor="_Toc244091464" w:history="1">
             <w:r>
               <w:rPr>
                 <w:rStyle w:val="Hyperlink"/>
@@ -7735,7 +7735,7 @@
                 <w:noProof/>
                 <w:webHidden/>
               </w:rPr>
-              <w:instrText xml:space="preserve"> PAGEREF _Toc244071639 \h </w:instrText>
+              <w:instrText xml:space="preserve"> PAGEREF _Toc244091464 \h </w:instrText>
             </w:r>
             <w:r>
               <w:rPr>
@@ -7782,7 +7782,7 @@
               <w14:ligatures w14:val="standardContextual"/>
             </w:rPr>
           </w:pPr>
-          <w:hyperlink w:anchor="_Toc244071640" w:history="1">
+          <w:hyperlink w:anchor="_Toc244091465" w:history="1">
             <w:r>
               <w:rPr>
                 <w:rStyle w:val="Hyperlink"/>
@@ -7809,7 +7809,7 @@
                 <w:noProof/>
                 <w:webHidden/>
               </w:rPr>
-              <w:instrText xml:space="preserve"> PAGEREF _Toc244071640 \h </w:instrText>
+              <w:instrText xml:space="preserve"> PAGEREF _Toc244091465 \h </w:instrText>
             </w:r>
             <w:r>
               <w:rPr>
@@ -7856,7 +7856,7 @@
               <w14:ligatures w14:val="standardContextual"/>
             </w:rPr>
           </w:pPr>
-          <w:hyperlink w:anchor="_Toc244071641" w:history="1">
+          <w:hyperlink w:anchor="_Toc244091466" w:history="1">
             <w:r>
               <w:rPr>
                 <w:rStyle w:val="Hyperlink"/>
@@ -7883,7 +7883,7 @@
                 <w:noProof/>
                 <w:webHidden/>
               </w:rPr>
-              <w:instrText xml:space="preserve"> PAGEREF _Toc244071641 \h </w:instrText>
+              <w:instrText xml:space="preserve"> PAGEREF _Toc244091466 \h </w:instrText>
             </w:r>
             <w:r>
               <w:rPr>
@@ -7930,7 +7930,7 @@
               <w14:ligatures w14:val="standardContextual"/>
             </w:rPr>
           </w:pPr>
-          <w:hyperlink w:anchor="_Toc244071642" w:history="1">
+          <w:hyperlink w:anchor="_Toc244091467" w:history="1">
             <w:r>
               <w:rPr>
                 <w:rStyle w:val="Hyperlink"/>
@@ -7957,7 +7957,7 @@
                 <w:noProof/>
                 <w:webHidden/>
               </w:rPr>
-              <w:instrText xml:space="preserve"> PAGEREF _Toc244071642 \h </w:instrText>
+              <w:instrText xml:space="preserve"> PAGEREF _Toc244091467 \h </w:instrText>
             </w:r>
             <w:r>
               <w:rPr>
@@ -8004,7 +8004,7 @@
               <w14:ligatures w14:val="standardContextual"/>
             </w:rPr>
           </w:pPr>
-          <w:hyperlink w:anchor="_Toc244071643" w:history="1">
+          <w:hyperlink w:anchor="_Toc244091468" w:history="1">
             <w:r>
               <w:rPr>
                 <w:rStyle w:val="Hyperlink"/>
@@ -8031,7 +8031,7 @@
                 <w:noProof/>
                 <w:webHidden/>
               </w:rPr>
-              <w:instrText xml:space="preserve"> PAGEREF _Toc244071643 \h </w:instrText>
+              <w:instrText xml:space="preserve"> PAGEREF _Toc244091468 \h </w:instrText>
             </w:r>
             <w:r>
               <w:rPr>
@@ -8078,7 +8078,7 @@
               <w14:ligatures w14:val="standardContextual"/>
             </w:rPr>
           </w:pPr>
-          <w:hyperlink w:anchor="_Toc244071644" w:history="1">
+          <w:hyperlink w:anchor="_Toc244091469" w:history="1">
             <w:r>
               <w:rPr>
                 <w:rStyle w:val="Hyperlink"/>
@@ -8105,7 +8105,7 @@
                 <w:noProof/>
                 <w:webHidden/>
               </w:rPr>
-              <w:instrText xml:space="preserve"> PAGEREF _Toc244071644 \h </w:instrText>
+              <w:instrText xml:space="preserve"> PAGEREF _Toc244091469 \h </w:instrText>
             </w:r>
             <w:r>
               <w:rPr>
@@ -8152,7 +8152,7 @@
               <w14:ligatures w14:val="standardContextual"/>
             </w:rPr>
           </w:pPr>
-          <w:hyperlink w:anchor="_Toc244071645" w:history="1">
+          <w:hyperlink w:anchor="_Toc244091470" w:history="1">
             <w:r>
               <w:rPr>
                 <w:rStyle w:val="Hyperlink"/>
@@ -8179,7 +8179,7 @@
                 <w:noProof/>
                 <w:webHidden/>
               </w:rPr>
-              <w:instrText xml:space="preserve"> PAGEREF _Toc244071645 \h </w:instrText>
+              <w:instrText xml:space="preserve"> PAGEREF _Toc244091470 \h </w:instrText>
             </w:r>
             <w:r>
               <w:rPr>
@@ -8226,7 +8226,7 @@
               <w14:ligatures w14:val="standardContextual"/>
             </w:rPr>
           </w:pPr>
-          <w:hyperlink w:anchor="_Toc244071646" w:history="1">
+          <w:hyperlink w:anchor="_Toc244091471" w:history="1">
             <w:r>
               <w:rPr>
                 <w:rStyle w:val="Hyperlink"/>
@@ -8253,7 +8253,7 @@
                 <w:noProof/>
                 <w:webHidden/>
               </w:rPr>
-              <w:instrText xml:space="preserve"> PAGEREF _Toc244071646 \h </w:instrText>
+              <w:instrText xml:space="preserve"> PAGEREF _Toc244091471 \h </w:instrText>
             </w:r>
             <w:r>
               <w:rPr>
@@ -8297,7 +8297,7 @@
               <w14:ligatures w14:val="standardContextual"/>
             </w:rPr>
           </w:pPr>
-          <w:hyperlink w:anchor="_Toc244071647" w:history="1">
+          <w:hyperlink w:anchor="_Toc244091472" w:history="1">
             <w:r>
               <w:rPr>
                 <w:rStyle w:val="Hyperlink"/>
@@ -8320,7 +8320,7 @@
               <w:rPr>
                 <w:webHidden/>
               </w:rPr>
-              <w:instrText xml:space="preserve"> PAGEREF _Toc244071647 \h </w:instrText>
+              <w:instrText xml:space="preserve"> PAGEREF _Toc244091472 \h </w:instrText>
             </w:r>
             <w:r>
               <w:rPr>
@@ -8384,7 +8384,7 @@
         <w:pStyle w:val="Ttulo1"/>
         <w:spacing w:after="100" w:afterAutospacing="1" w:line="360" w:lineRule="auto"/>
       </w:pPr>
-      <w:bookmarkStart w:id="0" w:name="_Toc244071591"/>
+      <w:bookmarkStart w:id="0" w:name="_Toc244091416"/>
       <w:r>
         <w:rPr>
           <w:sz w:val="24"/>
@@ -8402,7 +8402,7 @@
           <w:rFonts w:cs="Arial"/>
         </w:rPr>
       </w:pPr>
-      <w:bookmarkStart w:id="1" w:name="_Toc244071592"/>
+      <w:bookmarkStart w:id="1" w:name="_Toc244091417"/>
       <w:r>
         <w:rPr>
           <w:rFonts w:cs="Arial"/>
@@ -8500,7 +8500,7 @@
           <w:rFonts w:cs="Arial"/>
         </w:rPr>
       </w:pPr>
-      <w:bookmarkStart w:id="2" w:name="_Toc244071593"/>
+      <w:bookmarkStart w:id="2" w:name="_Toc244091418"/>
       <w:r>
         <w:rPr>
           <w:rFonts w:cs="Arial"/>
@@ -8538,7 +8538,7 @@
           <w:rFonts w:cs="Arial"/>
         </w:rPr>
       </w:pPr>
-      <w:bookmarkStart w:id="3" w:name="_Toc244071594"/>
+      <w:bookmarkStart w:id="3" w:name="_Toc244091419"/>
       <w:r>
         <w:rPr>
           <w:rFonts w:cs="Arial"/>
@@ -8553,7 +8553,7 @@
         <w:pStyle w:val="Ttulo3"/>
         <w:spacing w:before="100" w:beforeAutospacing="1" w:after="100" w:afterAutospacing="1" w:line="360" w:lineRule="auto"/>
       </w:pPr>
-      <w:bookmarkStart w:id="4" w:name="_Toc244071595"/>
+      <w:bookmarkStart w:id="4" w:name="_Toc244091420"/>
       <w:r>
         <w:t>1.3.1 Objetivo Geral</w:t>
       </w:r>
@@ -8588,7 +8588,7 @@
           <w:i/>
         </w:rPr>
       </w:pPr>
-      <w:bookmarkStart w:id="5" w:name="_Toc244071596"/>
+      <w:bookmarkStart w:id="5" w:name="_Toc244091421"/>
       <w:r>
         <w:t>1.3.2 Objetivos Específicos</w:t>
       </w:r>
@@ -8794,7 +8794,7 @@
           <w:rFonts w:cs="Arial"/>
         </w:rPr>
       </w:pPr>
-      <w:bookmarkStart w:id="6" w:name="_Toc244071597"/>
+      <w:bookmarkStart w:id="6" w:name="_Toc244091422"/>
       <w:r>
         <w:rPr>
           <w:rFonts w:cs="Arial"/>
@@ -8871,7 +8871,7 @@
           <w:rFonts w:cs="Arial"/>
         </w:rPr>
       </w:pPr>
-      <w:bookmarkStart w:id="7" w:name="_Toc244071598"/>
+      <w:bookmarkStart w:id="7" w:name="_Toc244091423"/>
       <w:r>
         <w:rPr>
           <w:rFonts w:cs="Arial"/>
@@ -9040,7 +9040,7 @@
           <w:sz w:val="24"/>
         </w:rPr>
       </w:pPr>
-      <w:bookmarkStart w:id="8" w:name="_Toc244071599"/>
+      <w:bookmarkStart w:id="8" w:name="_Toc244091424"/>
       <w:r>
         <w:rPr>
           <w:sz w:val="24"/>
@@ -9058,7 +9058,7 @@
           <w:rFonts w:cs="Arial"/>
         </w:rPr>
       </w:pPr>
-      <w:bookmarkStart w:id="9" w:name="_Toc244071600"/>
+      <w:bookmarkStart w:id="9" w:name="_Toc244091425"/>
       <w:r>
         <w:rPr>
           <w:rFonts w:cs="Arial"/>
@@ -9168,7 +9168,7 @@
           <w:rFonts w:cs="Arial"/>
         </w:rPr>
       </w:pPr>
-      <w:bookmarkStart w:id="10" w:name="_Toc244071601"/>
+      <w:bookmarkStart w:id="10" w:name="_Toc244091426"/>
       <w:r>
         <w:rPr>
           <w:rFonts w:cs="Arial"/>
@@ -9304,7 +9304,7 @@
         <w:pStyle w:val="Legenda"/>
         <w:keepNext/>
       </w:pPr>
-      <w:bookmarkStart w:id="11" w:name="_Toc244071648"/>
+      <w:bookmarkStart w:id="11" w:name="_Toc244091473"/>
       <w:r>
         <w:lastRenderedPageBreak/>
         <w:t xml:space="preserve">Figura </w:t>
@@ -9417,7 +9417,7 @@
           <w:rFonts w:cs="Arial"/>
         </w:rPr>
       </w:pPr>
-      <w:bookmarkStart w:id="12" w:name="_Toc244071602"/>
+      <w:bookmarkStart w:id="12" w:name="_Toc244091427"/>
       <w:r>
         <w:rPr>
           <w:rFonts w:cs="Arial"/>
@@ -9533,7 +9533,7 @@
         <w:pStyle w:val="Legenda"/>
         <w:keepNext/>
       </w:pPr>
-      <w:bookmarkStart w:id="13" w:name="_Toc244071649"/>
+      <w:bookmarkStart w:id="13" w:name="_Toc244091474"/>
       <w:r>
         <w:t xml:space="preserve">Figura </w:t>
       </w:r>
@@ -9641,7 +9641,7 @@
           <w:rFonts w:cs="Arial"/>
         </w:rPr>
       </w:pPr>
-      <w:bookmarkStart w:id="14" w:name="_Toc244071603"/>
+      <w:bookmarkStart w:id="14" w:name="_Toc244091428"/>
       <w:r>
         <w:rPr>
           <w:rFonts w:cs="Arial"/>
@@ -9762,7 +9762,7 @@
           <w:lang w:val="en-US"/>
         </w:rPr>
       </w:pPr>
-      <w:bookmarkStart w:id="15" w:name="_Toc244071604"/>
+      <w:bookmarkStart w:id="15" w:name="_Toc244091429"/>
       <w:r>
         <w:rPr>
           <w:rFonts w:cs="Arial"/>
@@ -9972,7 +9972,7 @@
         <w:pStyle w:val="Legenda"/>
         <w:keepNext/>
       </w:pPr>
-      <w:bookmarkStart w:id="16" w:name="_Toc244071650"/>
+      <w:bookmarkStart w:id="16" w:name="_Toc244091475"/>
       <w:r>
         <w:t xml:space="preserve">Figura </w:t>
       </w:r>
@@ -10080,7 +10080,7 @@
           <w:rFonts w:cs="Arial"/>
         </w:rPr>
       </w:pPr>
-      <w:bookmarkStart w:id="17" w:name="_Toc244071605"/>
+      <w:bookmarkStart w:id="17" w:name="_Toc244091430"/>
       <w:r>
         <w:rPr>
           <w:rFonts w:cs="Arial"/>
@@ -10270,7 +10270,7 @@
           <w:rFonts w:cs="Arial"/>
         </w:rPr>
       </w:pPr>
-      <w:bookmarkStart w:id="18" w:name="_Toc244071606"/>
+      <w:bookmarkStart w:id="18" w:name="_Toc244091431"/>
       <w:r>
         <w:rPr>
           <w:rFonts w:cs="Arial"/>
@@ -10471,7 +10471,7 @@
         <w:pStyle w:val="Legenda"/>
         <w:keepNext/>
       </w:pPr>
-      <w:bookmarkStart w:id="19" w:name="_Toc244071651"/>
+      <w:bookmarkStart w:id="19" w:name="_Toc244091476"/>
       <w:r>
         <w:t xml:space="preserve">Figura </w:t>
       </w:r>
@@ -10580,7 +10580,7 @@
           <w:u w:val="single"/>
         </w:rPr>
       </w:pPr>
-      <w:bookmarkStart w:id="20" w:name="_Toc244071607"/>
+      <w:bookmarkStart w:id="20" w:name="_Toc244091432"/>
       <w:r>
         <w:rPr>
           <w:rFonts w:cs="Arial"/>
@@ -10694,7 +10694,7 @@
         <w:pStyle w:val="Ttulo2"/>
         <w:spacing w:line="360" w:lineRule="auto"/>
       </w:pPr>
-      <w:bookmarkStart w:id="21" w:name="_Toc244071608"/>
+      <w:bookmarkStart w:id="21" w:name="_Toc244091433"/>
       <w:r>
         <w:t>2.9 Considerações sobre a Utilização de Sistemas para Nivelamento de Processos</w:t>
       </w:r>
@@ -10832,7 +10832,7 @@
           <w:sz w:val="24"/>
         </w:rPr>
       </w:pPr>
-      <w:bookmarkStart w:id="22" w:name="_Toc244071609"/>
+      <w:bookmarkStart w:id="22" w:name="_Toc244091434"/>
       <w:r>
         <w:rPr>
           <w:sz w:val="24"/>
@@ -10851,7 +10851,7 @@
           <w:szCs w:val="24"/>
         </w:rPr>
       </w:pPr>
-      <w:bookmarkStart w:id="23" w:name="_Toc244071610"/>
+      <w:bookmarkStart w:id="23" w:name="_Toc244091435"/>
       <w:r>
         <w:rPr>
           <w:rFonts w:cs="Arial"/>
@@ -10918,7 +10918,7 @@
           <w:sz w:val="24"/>
           <w:szCs w:val="24"/>
         </w:rPr>
-        <w:t xml:space="preserve">Além disso, a pesquisa apresenta caráter experimental, uma vez que será desenvolvido e testado um sistema web com a finalidade de verificar sua utilidade no gerenciamento das atividades produtivas. </w:t>
+        <w:t xml:space="preserve">Além disso, a pesquisa apresenta caráter experimental, uma vez que foi desenvolvido um sistema web, que será testado com a finalidade de verificar sua utilidade no gerenciamento das atividades produtivas. </w:t>
       </w:r>
     </w:p>
     <w:p>
@@ -10938,7 +10938,7 @@
           <w:sz w:val="24"/>
           <w:szCs w:val="24"/>
         </w:rPr>
-        <w:t>Esta validação experimental envolverá a utilização do sistema em um ambiente controlado, com dados de teste, e, quando possível, em um setor piloto, visando confrontar as informações geradas com as práticas atuais de gestão. O objetivo é verificar se os dados de produção e de tempo registrados ajudam a identificar gargalos produtivos e a apoiar a tomada de decisão, evidenciando como a ferramenta digital pode contribuir para o nivelamento dos processos.</w:t>
+        <w:t>Esta validação experimental envolverá a utilização do sistema em um ambiente controlado, com dados de teste, e, quando possível, em um setor piloto, visando confrontar as informações geradas com as práticas atuais de gestão. O objetivo é verificar se os dados de produção e de tempo registrados apoiam a identificação de gargalos produtivos e a tomada de decisão, evidenciando como a ferramenta digital pode contribuir para o nivelamento dos processos.</w:t>
       </w:r>
     </w:p>
     <w:p>
@@ -10957,7 +10957,7 @@
         <w:pStyle w:val="Ttulo2"/>
         <w:spacing w:line="360" w:lineRule="auto"/>
       </w:pPr>
-      <w:bookmarkStart w:id="24" w:name="_Toc244071611"/>
+      <w:bookmarkStart w:id="24" w:name="_Toc244091436"/>
       <w:r>
         <w:t>3.2 Métodos Utilizados</w:t>
       </w:r>
@@ -11208,7 +11208,7 @@
           <w:sz w:val="24"/>
           <w:szCs w:val="24"/>
         </w:rPr>
-        <w:t>Essa metodologia permitirá estruturar o projeto de forma organizada, facilitando o acompanhamento de cada fase e contribuindo para a construção de uma aplicação mais eficiente e alinhada às necessidades do ambiente industrial.</w:t>
+        <w:t>Essa metodologia permitiu estruturar o projeto de forma organizada, facilitando o acompanhamento de cada fase e contribuindo para a construção de uma aplicação mais eficiente e alinhada às necessidades do ambiente industrial.</w:t>
       </w:r>
     </w:p>
     <w:p>
@@ -11227,7 +11227,7 @@
         <w:pStyle w:val="Ttulo2"/>
         <w:spacing w:before="100" w:beforeAutospacing="1" w:after="100" w:afterAutospacing="1" w:line="360" w:lineRule="auto"/>
       </w:pPr>
-      <w:bookmarkStart w:id="25" w:name="_Toc244071612"/>
+      <w:bookmarkStart w:id="25" w:name="_Toc244091437"/>
       <w:r>
         <w:t>3.3 Ferramentas e Tecnologias Utilizadas</w:t>
       </w:r>
@@ -11238,7 +11238,7 @@
         <w:pStyle w:val="Ttulo3"/>
         <w:spacing w:before="100" w:beforeAutospacing="1" w:after="100" w:afterAutospacing="1" w:line="360" w:lineRule="auto"/>
       </w:pPr>
-      <w:bookmarkStart w:id="26" w:name="_Toc244071613"/>
+      <w:bookmarkStart w:id="26" w:name="_Toc244091438"/>
       <w:r>
         <w:t>3.3.1 Linguagens de Programação</w:t>
       </w:r>
@@ -11281,7 +11281,7 @@
           <w:sz w:val="24"/>
           <w:szCs w:val="24"/>
         </w:rPr>
-        <w:t>No front-end, responsável pela interface do sistema, foram utilizadas:</w:t>
+        <w:t>No front-end, responsável pela interface do sistema, foram utilizados:</w:t>
       </w:r>
     </w:p>
     <w:p>
@@ -11303,7 +11303,7 @@
           <w:sz w:val="24"/>
           <w:szCs w:val="24"/>
         </w:rPr>
-        <w:t>Next.js;</w:t>
+        <w:t>TypeScript, com a sintaxe JSX do React para descrever as telas;</w:t>
       </w:r>
     </w:p>
     <w:p>
@@ -11325,51 +11325,7 @@
           <w:sz w:val="24"/>
           <w:szCs w:val="24"/>
         </w:rPr>
-        <w:t>React;</w:t>
-      </w:r>
-    </w:p>
-    <w:p>
-      <w:pPr>
-        <w:numPr>
-          <w:ilvl w:val="0"/>
-          <w:numId w:val="14"/>
-        </w:numPr>
-        <w:spacing w:before="100" w:beforeAutospacing="1" w:after="100" w:afterAutospacing="1" w:line="360" w:lineRule="auto"/>
-        <w:rPr>
-          <w:rFonts w:cs="Arial"/>
-          <w:sz w:val="24"/>
-          <w:szCs w:val="24"/>
-        </w:rPr>
-      </w:pPr>
-      <w:r>
-        <w:rPr>
-          <w:rFonts w:cs="Arial"/>
-          <w:sz w:val="24"/>
-          <w:szCs w:val="24"/>
-        </w:rPr>
-        <w:t>TypeScript;</w:t>
-      </w:r>
-    </w:p>
-    <w:p>
-      <w:pPr>
-        <w:numPr>
-          <w:ilvl w:val="0"/>
-          <w:numId w:val="14"/>
-        </w:numPr>
-        <w:spacing w:before="100" w:beforeAutospacing="1" w:after="100" w:afterAutospacing="1" w:line="360" w:lineRule="auto"/>
-        <w:rPr>
-          <w:rFonts w:cs="Arial"/>
-          <w:sz w:val="24"/>
-          <w:szCs w:val="24"/>
-        </w:rPr>
-      </w:pPr>
-      <w:r>
-        <w:rPr>
-          <w:rFonts w:cs="Arial"/>
-          <w:sz w:val="24"/>
-          <w:szCs w:val="24"/>
-        </w:rPr>
-        <w:t>Tailwind CSS.</w:t>
+        <w:t>CSS, aplicado por meio das classes do Tailwind CSS.</w:t>
       </w:r>
     </w:p>
     <w:p>
@@ -11461,7 +11417,7 @@
         <w:pStyle w:val="Ttulo3"/>
         <w:spacing w:line="360" w:lineRule="auto"/>
       </w:pPr>
-      <w:bookmarkStart w:id="27" w:name="_Toc244071614"/>
+      <w:bookmarkStart w:id="27" w:name="_Toc244091439"/>
       <w:r>
         <w:lastRenderedPageBreak/>
         <w:t>3.3.2 Framework</w:t>
@@ -11488,7 +11444,7 @@
           <w:sz w:val="24"/>
           <w:szCs w:val="24"/>
         </w:rPr>
-        <w:t>Com o objetivo de tornar o desenvolvimento mais organizado, produtivo e padronizado, poderão ser utilizados frameworks e bibliotecas.</w:t>
+        <w:t>Com o objetivo de tornar o desenvolvimento mais organizado, produtivo e padronizado, foram utilizados frameworks e bibliotecas.</w:t>
       </w:r>
     </w:p>
     <w:p>
@@ -11507,7 +11463,7 @@
           <w:sz w:val="24"/>
           <w:szCs w:val="24"/>
         </w:rPr>
-        <w:t>Entre as principais ferramentas previstas para o projeto, destacam-se:</w:t>
+        <w:t>Entre as principais ferramentas utilizadas no projeto, destacam-se:</w:t>
       </w:r>
     </w:p>
     <w:p>
@@ -11619,7 +11575,7 @@
           <w:sz w:val="24"/>
           <w:szCs w:val="24"/>
         </w:rPr>
-        <w:t>Essas ferramentas contribuem para acelerar o desenvolvimento e melhorar a organização do código, facilitando a manutenção do código e melhorar a experiência do usuário.</w:t>
+        <w:t>Essas ferramentas contribuem para acelerar o desenvolvimento e melhorar a organização do código, facilitando a manutenção e melhorando a experiência do usuário.</w:t>
       </w:r>
     </w:p>
     <w:p>
@@ -11638,7 +11594,7 @@
         <w:pStyle w:val="Ttulo3"/>
         <w:spacing w:line="360" w:lineRule="auto"/>
       </w:pPr>
-      <w:bookmarkStart w:id="28" w:name="_Toc244071615"/>
+      <w:bookmarkStart w:id="28" w:name="_Toc244091440"/>
       <w:r>
         <w:t>3.3.3 Banco de Dados</w:t>
       </w:r>
@@ -11661,7 +11617,7 @@
           <w:sz w:val="24"/>
           <w:szCs w:val="24"/>
         </w:rPr>
-        <w:t>O sistema precisará armazenar informações sobre produtos, roteiros de produção, ordens de produção, setores, postos de trabalho, operadores e os registros de execução de cada etapa produtiva.</w:t>
+        <w:t>O sistema armazena informações sobre produtos, operações, roteiros de produção, planos e ordens de produção, setores, postos de trabalho, operadores, motivos de pausa e os registros de execução de cada etapa produtiva.</w:t>
       </w:r>
     </w:p>
     <w:p>
@@ -11701,7 +11657,7 @@
           <w:sz w:val="24"/>
           <w:szCs w:val="24"/>
         </w:rPr>
-        <w:t>O banco de dados será responsável por armazenar, organizar e recuperar as informações necessárias para o funcionamento do sistema, garantindo maior segurança, integridade e confiabilidade dos dados.</w:t>
+        <w:t>O banco de dados é responsável por armazenar, organizar e recuperar as informações necessárias para o funcionamento do sistema, garantindo maior segurança, integridade e confiabilidade dos dados.</w:t>
       </w:r>
     </w:p>
     <w:p>
@@ -11728,7 +11684,7 @@
       <w:pPr>
         <w:pStyle w:val="Ttulo2"/>
       </w:pPr>
-      <w:bookmarkStart w:id="29" w:name="_Toc244071616"/>
+      <w:bookmarkStart w:id="29" w:name="_Toc244091441"/>
       <w:r>
         <w:lastRenderedPageBreak/>
         <w:t>3.4 Etapas do Desenvolvimento</w:t>
@@ -11751,7 +11707,7 @@
           <w:sz w:val="24"/>
           <w:szCs w:val="24"/>
         </w:rPr>
-        <w:t>O desenvolvimento do sistema será dividido nas seguintes etapas:</w:t>
+        <w:t>O desenvolvimento do sistema foi organizado nas seguintes etapas:</w:t>
       </w:r>
     </w:p>
     <w:p>
@@ -12024,7 +11980,7 @@
           <w:sz w:val="24"/>
           <w:szCs w:val="24"/>
         </w:rPr>
-        <w:t>Essas etapas permitirão o desenvolvimento organizado da aplicação, facilitando a implementação de funcionalidades e a validação dos resultados obtidos.</w:t>
+        <w:t>Essas etapas permitem o desenvolvimento organizado da aplicação, facilitando a implementação de funcionalidades e a validação dos resultados obtidos.</w:t>
       </w:r>
     </w:p>
     <w:p>
@@ -12055,7 +12011,7 @@
           <w:sz w:val="24"/>
         </w:rPr>
       </w:pPr>
-      <w:bookmarkStart w:id="30" w:name="_Toc244071617"/>
+      <w:bookmarkStart w:id="30" w:name="_Toc244091442"/>
       <w:r>
         <w:rPr>
           <w:sz w:val="24"/>
@@ -12069,7 +12025,7 @@
       <w:pPr>
         <w:pStyle w:val="Ttulo2"/>
       </w:pPr>
-      <w:bookmarkStart w:id="31" w:name="_Toc244071618"/>
+      <w:bookmarkStart w:id="31" w:name="_Toc244091443"/>
       <w:r>
         <w:t>4.1 Descrição do Problema</w:t>
       </w:r>
@@ -12180,7 +12136,7 @@
         <w:pStyle w:val="Ttulo2"/>
         <w:spacing w:line="360" w:lineRule="auto"/>
       </w:pPr>
-      <w:bookmarkStart w:id="32" w:name="_Toc244071619"/>
+      <w:bookmarkStart w:id="32" w:name="_Toc244091444"/>
       <w:r>
         <w:lastRenderedPageBreak/>
         <w:t>4.2 Requisitos Funcionais</w:t>
@@ -12192,7 +12148,7 @@
         <w:pStyle w:val="Ttulo3"/>
         <w:spacing w:line="360" w:lineRule="auto"/>
       </w:pPr>
-      <w:bookmarkStart w:id="33" w:name="_Toc244071620"/>
+      <w:bookmarkStart w:id="33" w:name="_Toc244091445"/>
       <w:r>
         <w:t>4.2.1 Requisitos Funcionais da Tela de Login</w:t>
       </w:r>
@@ -12223,7 +12179,7 @@
         <w:pStyle w:val="Legenda"/>
         <w:keepNext/>
       </w:pPr>
-      <w:bookmarkStart w:id="34" w:name="_Toc244071665"/>
+      <w:bookmarkStart w:id="34" w:name="_Toc244091490"/>
       <w:r>
         <w:t xml:space="preserve">Tabela </w:t>
       </w:r>
@@ -12913,7 +12869,7 @@
         <w:pStyle w:val="Ttulo3"/>
         <w:spacing w:line="360" w:lineRule="auto"/>
       </w:pPr>
-      <w:bookmarkStart w:id="35" w:name="_Toc244071621"/>
+      <w:bookmarkStart w:id="35" w:name="_Toc244091446"/>
       <w:r>
         <w:lastRenderedPageBreak/>
         <w:t>4.2.2 Requisitos Funcionais da Tela de Cadastro de Setores</w:t>
@@ -12945,7 +12901,7 @@
         <w:pStyle w:val="Legenda"/>
         <w:keepNext/>
       </w:pPr>
-      <w:bookmarkStart w:id="36" w:name="_Toc244071666"/>
+      <w:bookmarkStart w:id="36" w:name="_Toc244091491"/>
       <w:r>
         <w:t xml:space="preserve">Tabela </w:t>
       </w:r>
@@ -13751,7 +13707,7 @@
         <w:pStyle w:val="Ttulo3"/>
         <w:spacing w:line="360" w:lineRule="auto"/>
       </w:pPr>
-      <w:bookmarkStart w:id="37" w:name="_Toc244071622"/>
+      <w:bookmarkStart w:id="37" w:name="_Toc244091447"/>
       <w:r>
         <w:lastRenderedPageBreak/>
         <w:t xml:space="preserve">4.2.3 Requisitos Funcionais da Tela de Cadastro de </w:t>
@@ -13786,7 +13742,7 @@
         <w:pStyle w:val="Legenda"/>
         <w:keepNext/>
       </w:pPr>
-      <w:bookmarkStart w:id="38" w:name="_Toc244071667"/>
+      <w:bookmarkStart w:id="38" w:name="_Toc244091492"/>
       <w:r>
         <w:t xml:space="preserve">Tabela </w:t>
       </w:r>
@@ -14592,7 +14548,7 @@
         <w:pStyle w:val="Ttulo3"/>
         <w:spacing w:line="360" w:lineRule="auto"/>
       </w:pPr>
-      <w:bookmarkStart w:id="39" w:name="_Toc244071623"/>
+      <w:bookmarkStart w:id="39" w:name="_Toc244091448"/>
       <w:r>
         <w:lastRenderedPageBreak/>
         <w:t>4.2.4 Requisitos Funcionais da Tela de Cadastro de Operações</w:t>
@@ -14624,7 +14580,7 @@
         <w:pStyle w:val="Legenda"/>
         <w:keepNext/>
       </w:pPr>
-      <w:bookmarkStart w:id="40" w:name="_Toc244071668"/>
+      <w:bookmarkStart w:id="40" w:name="_Toc244091493"/>
       <w:r>
         <w:t xml:space="preserve">Tabela </w:t>
       </w:r>
@@ -15546,7 +15502,7 @@
         <w:pStyle w:val="Ttulo3"/>
         <w:spacing w:line="360" w:lineRule="auto"/>
       </w:pPr>
-      <w:bookmarkStart w:id="41" w:name="_Toc244071624"/>
+      <w:bookmarkStart w:id="41" w:name="_Toc244091449"/>
       <w:r>
         <w:lastRenderedPageBreak/>
         <w:t>4.2.5 Requisitos Funcionais da Tela de Produtos e Ordens de Produção</w:t>
@@ -15578,7 +15534,7 @@
         <w:pStyle w:val="Legenda"/>
         <w:keepNext/>
       </w:pPr>
-      <w:bookmarkStart w:id="42" w:name="_Toc244071669"/>
+      <w:bookmarkStart w:id="42" w:name="_Toc244091494"/>
       <w:r>
         <w:t xml:space="preserve">Tabela </w:t>
       </w:r>
@@ -16384,7 +16340,7 @@
         <w:pStyle w:val="Ttulo3"/>
         <w:spacing w:line="360" w:lineRule="auto"/>
       </w:pPr>
-      <w:bookmarkStart w:id="43" w:name="_Toc244071625"/>
+      <w:bookmarkStart w:id="43" w:name="_Toc244091450"/>
       <w:r>
         <w:lastRenderedPageBreak/>
         <w:t>4.2.6 Requisitos Funcionais da Tela de Apontamento da Produção</w:t>
@@ -16416,7 +16372,7 @@
         <w:pStyle w:val="Legenda"/>
         <w:keepNext/>
       </w:pPr>
-      <w:bookmarkStart w:id="44" w:name="_Toc244071670"/>
+      <w:bookmarkStart w:id="44" w:name="_Toc244091495"/>
       <w:r>
         <w:t xml:space="preserve">Tabela </w:t>
       </w:r>
@@ -17338,7 +17294,7 @@
         <w:pStyle w:val="Ttulo3"/>
         <w:spacing w:line="360" w:lineRule="auto"/>
       </w:pPr>
-      <w:bookmarkStart w:id="45" w:name="_Toc244071626"/>
+      <w:bookmarkStart w:id="45" w:name="_Toc244091451"/>
       <w:r>
         <w:lastRenderedPageBreak/>
         <w:t>4.2.7 Requisitos Funcionais da Tela de Indicadores</w:t>
@@ -17370,7 +17326,7 @@
         <w:pStyle w:val="Legenda"/>
         <w:keepNext/>
       </w:pPr>
-      <w:bookmarkStart w:id="46" w:name="_Toc244071671"/>
+      <w:bookmarkStart w:id="46" w:name="_Toc244091496"/>
       <w:r>
         <w:t xml:space="preserve">Tabela </w:t>
       </w:r>
@@ -18176,7 +18132,7 @@
         <w:pStyle w:val="Ttulo3"/>
         <w:spacing w:line="360" w:lineRule="auto"/>
       </w:pPr>
-      <w:bookmarkStart w:id="47" w:name="_Toc244071627"/>
+      <w:bookmarkStart w:id="47" w:name="_Toc244091452"/>
       <w:r>
         <w:lastRenderedPageBreak/>
         <w:t>4.2.8 Requisitos Funcionais dos Operadores</w:t>
@@ -18208,7 +18164,7 @@
         <w:pStyle w:val="Legenda"/>
         <w:keepNext/>
       </w:pPr>
-      <w:bookmarkStart w:id="48" w:name="_Toc244071672"/>
+      <w:bookmarkStart w:id="48" w:name="_Toc244091497"/>
       <w:r>
         <w:t xml:space="preserve">Tabela </w:t>
       </w:r>
@@ -19014,7 +18970,7 @@
         <w:pStyle w:val="Ttulo3"/>
         <w:spacing w:line="360" w:lineRule="auto"/>
       </w:pPr>
-      <w:bookmarkStart w:id="49" w:name="_Toc244071628"/>
+      <w:bookmarkStart w:id="49" w:name="_Toc244091453"/>
       <w:r>
         <w:lastRenderedPageBreak/>
         <w:t>4.2.9 Requisitos Funcionais dos Motivos de Pausa</w:t>
@@ -19046,7 +19002,7 @@
         <w:pStyle w:val="Legenda"/>
         <w:keepNext/>
       </w:pPr>
-      <w:bookmarkStart w:id="50" w:name="_Toc244071673"/>
+      <w:bookmarkStart w:id="50" w:name="_Toc244091498"/>
       <w:r>
         <w:t xml:space="preserve">Tabela </w:t>
       </w:r>
@@ -19735,7 +19691,7 @@
       <w:pPr>
         <w:pStyle w:val="Ttulo2"/>
       </w:pPr>
-      <w:bookmarkStart w:id="51" w:name="_Toc244071629"/>
+      <w:bookmarkStart w:id="51" w:name="_Toc244091454"/>
       <w:r>
         <w:lastRenderedPageBreak/>
         <w:t>4.3 Requisitos Não Funcionais</w:t>
@@ -19766,7 +19722,7 @@
       <w:pPr>
         <w:pStyle w:val="Ttulo3"/>
       </w:pPr>
-      <w:bookmarkStart w:id="52" w:name="_Toc244071630"/>
+      <w:bookmarkStart w:id="52" w:name="_Toc244091455"/>
       <w:r>
         <w:t>4.3.1 Requisitos Não Funcionais do Sistema</w:t>
       </w:r>
@@ -19797,7 +19753,7 @@
         <w:pStyle w:val="Legenda"/>
         <w:keepNext/>
       </w:pPr>
-      <w:bookmarkStart w:id="53" w:name="_Toc244071674"/>
+      <w:bookmarkStart w:id="53" w:name="_Toc244091499"/>
       <w:r>
         <w:t xml:space="preserve">Tabela </w:t>
       </w:r>
@@ -20973,7 +20929,7 @@
       <w:pPr>
         <w:pStyle w:val="Ttulo2"/>
       </w:pPr>
-      <w:bookmarkStart w:id="54" w:name="_Toc244071631"/>
+      <w:bookmarkStart w:id="54" w:name="_Toc244091456"/>
       <w:r>
         <w:lastRenderedPageBreak/>
         <w:t>4.4 Prototipagem</w:t>
@@ -21282,7 +21238,7 @@
         <w:pStyle w:val="Legenda"/>
         <w:keepNext/>
       </w:pPr>
-      <w:bookmarkStart w:id="55" w:name="_Toc244071652"/>
+      <w:bookmarkStart w:id="55" w:name="_Toc244091477"/>
       <w:r>
         <w:lastRenderedPageBreak/>
         <w:t xml:space="preserve">Figura </w:t>
@@ -21388,7 +21344,7 @@
         <w:pStyle w:val="Legenda"/>
         <w:keepNext/>
       </w:pPr>
-      <w:bookmarkStart w:id="56" w:name="_Toc244071653"/>
+      <w:bookmarkStart w:id="56" w:name="_Toc244091478"/>
       <w:r>
         <w:t xml:space="preserve">Figura </w:t>
       </w:r>
@@ -21525,7 +21481,7 @@
         <w:pStyle w:val="Legenda"/>
         <w:keepNext/>
       </w:pPr>
-      <w:bookmarkStart w:id="57" w:name="_Toc244071654"/>
+      <w:bookmarkStart w:id="57" w:name="_Toc244091479"/>
       <w:r>
         <w:t xml:space="preserve">Figura </w:t>
       </w:r>
@@ -21630,7 +21586,7 @@
         <w:pStyle w:val="Legenda"/>
         <w:keepNext/>
       </w:pPr>
-      <w:bookmarkStart w:id="58" w:name="_Toc244071655"/>
+      <w:bookmarkStart w:id="58" w:name="_Toc244091480"/>
       <w:r>
         <w:t xml:space="preserve">Figura </w:t>
       </w:r>
@@ -21744,7 +21700,7 @@
       <w:pPr>
         <w:pStyle w:val="Ttulo2"/>
       </w:pPr>
-      <w:bookmarkStart w:id="59" w:name="_Toc244071632"/>
+      <w:bookmarkStart w:id="59" w:name="_Toc244091457"/>
       <w:r>
         <w:lastRenderedPageBreak/>
         <w:t>4.5 Estrutura do Sistema</w:t>
@@ -21984,7 +21940,7 @@
           <w:sz w:val="24"/>
         </w:rPr>
       </w:pPr>
-      <w:bookmarkStart w:id="60" w:name="_Toc244071633"/>
+      <w:bookmarkStart w:id="60" w:name="_Toc244091458"/>
       <w:r>
         <w:rPr>
           <w:sz w:val="24"/>
@@ -21998,7 +21954,7 @@
       <w:pPr>
         <w:pStyle w:val="Ttulo2"/>
       </w:pPr>
-      <w:bookmarkStart w:id="61" w:name="_Toc244071634"/>
+      <w:bookmarkStart w:id="61" w:name="_Toc244091459"/>
       <w:r>
         <w:t xml:space="preserve">5.1 </w:t>
       </w:r>
@@ -22297,7 +22253,7 @@
           <w:sz w:val="24"/>
           <w:szCs w:val="24"/>
         </w:rPr>
-        <w:t xml:space="preserve"> indica em quais postos cada etapa do roteiro pode ser realizada.</w:t>
+        <w:t xml:space="preserve"> indica em quais postos cada etapa do roteiro pode ser realizada. Cada setor recebe um código gerado automaticamente pelo sistema.</w:t>
       </w:r>
     </w:p>
     <w:p>
@@ -22331,7 +22287,7 @@
           <w:sz w:val="24"/>
           <w:szCs w:val="24"/>
         </w:rPr>
-        <w:t xml:space="preserve"> é responsável pelo cadastro dos colaboradores que realizam os apontamentos. Já a tabela </w:t>
+        <w:t xml:space="preserve"> é responsável pelo cadastro dos colaboradores que realizam os apontamentos, com a matrícula, a função e o setor principal de cada um. Já a tabela </w:t>
       </w:r>
       <w:r>
         <w:rPr>
@@ -22433,7 +22389,15 @@
           <w:sz w:val="24"/>
           <w:szCs w:val="24"/>
         </w:rPr>
-        <w:t xml:space="preserve">Todas as tabelas utilizam identificadores do tipo UUID como chave primária, e a maior parte delas registra as datas de criação e de atualização dos dados. O próprio banco de dados garante algumas regras, como a baixa única por etapa de cada ordem e o motivo obrigatório em toda pausa. A tabela </w:t>
+        <w:t xml:space="preserve">Todas as tabelas utilizam identificadores do tipo UUID como chave primária, e a maior parte delas registra as datas de criação e de atualização dos dados. O próprio banco de dados garante algumas regras, como a baixa única por etapa de cada ordem, o motivo obrigatório em toda pausa e a existência de no máximo uma execução aberta por operador. Os cadastros possuem o campo ativo, que permite </w:t>
+      </w:r>
+      <w:r>
+        <w:rPr>
+          <w:sz w:val="24"/>
+          <w:szCs w:val="24"/>
+        </w:rPr>
+        <w:lastRenderedPageBreak/>
+        <w:t xml:space="preserve">inativar um registro sem apagar o histórico ligado a ele. A tabela </w:t>
       </w:r>
       <w:r>
         <w:rPr>
@@ -22479,7 +22443,6 @@
           <w:sz w:val="24"/>
           <w:szCs w:val="24"/>
         </w:rPr>
-        <w:lastRenderedPageBreak/>
         <w:t>Dessa forma, a modelagem do banco de dados torna-se uma parte fundamental do sistema, pois fornece a base necessária para armazenamento, consulta e gerenciamento das informações utilizadas no ambiente industrial, contribuindo para maior eficiência, rastreabilidade e apoio à tomada de decisões</w:t>
       </w:r>
       <w:r>
@@ -22491,7 +22454,7 @@
         <w:pStyle w:val="Legenda"/>
         <w:keepNext/>
       </w:pPr>
-      <w:bookmarkStart w:id="62" w:name="_Toc244071656"/>
+      <w:bookmarkStart w:id="62" w:name="_Toc244091481"/>
       <w:r>
         <w:t xml:space="preserve">Figura </w:t>
       </w:r>
@@ -22528,8 +22491,8 @@
           <w:noProof/>
         </w:rPr>
         <w:drawing>
-          <wp:inline distT="0" distB="0" distL="0" distR="0" wp14:anchorId="46CAC184" wp14:editId="6B6EBD11">
-            <wp:extent cx="5281879" cy="6811702"/>
+          <wp:inline distT="0" distB="0" distL="0" distR="0" wp14:anchorId="46CAC184" wp14:editId="563EB587">
+            <wp:extent cx="5730167" cy="4316142"/>
             <wp:effectExtent l="0" t="0" r="4445" b="1905"/>
             <wp:docPr id="4" name="Imagem 4"/>
             <wp:cNvGraphicFramePr>
@@ -22560,7 +22523,7 @@
                   <pic:spPr bwMode="auto">
                     <a:xfrm>
                       <a:off x="0" y="0"/>
-                      <a:ext cx="5281879" cy="6811702"/>
+                      <a:ext cx="5730167" cy="4316142"/>
                     </a:xfrm>
                     <a:prstGeom prst="rect">
                       <a:avLst/>
@@ -22598,7 +22561,7 @@
           <w:sz w:val="20"/>
           <w:szCs w:val="20"/>
         </w:rPr>
-        <w:t>acessado em 06 de outubro de 2026.</w:t>
+        <w:t>acessado em 28 de outubro de 2026.</w:t>
       </w:r>
     </w:p>
     <w:p>
@@ -22625,7 +22588,7 @@
       <w:pPr>
         <w:pStyle w:val="Ttulo2"/>
       </w:pPr>
-      <w:bookmarkStart w:id="63" w:name="_Toc244071635"/>
+      <w:bookmarkStart w:id="63" w:name="_Toc244091460"/>
       <w:r>
         <w:lastRenderedPageBreak/>
         <w:t>5.2 Diagrama de Classes</w:t>
@@ -22774,7 +22737,7 @@
         <w:pStyle w:val="Legenda"/>
         <w:keepNext/>
       </w:pPr>
-      <w:bookmarkStart w:id="64" w:name="_Toc244071657"/>
+      <w:bookmarkStart w:id="64" w:name="_Toc244091482"/>
       <w:r>
         <w:lastRenderedPageBreak/>
         <w:t xml:space="preserve">Figura </w:t>
@@ -22862,7 +22825,7 @@
           <w:sz w:val="20"/>
           <w:szCs w:val="20"/>
         </w:rPr>
-        <w:t>Fonte: Próprio autor, acessado em 13 de outubro de 2026.</w:t>
+        <w:t>Fonte: Próprio autor, acessado em 28 de outubro de 2026.</w:t>
       </w:r>
     </w:p>
     <w:p>
@@ -22889,7 +22852,7 @@
       <w:pPr>
         <w:pStyle w:val="Ttulo2"/>
       </w:pPr>
-      <w:bookmarkStart w:id="65" w:name="_Toc244071636"/>
+      <w:bookmarkStart w:id="65" w:name="_Toc244091461"/>
       <w:r>
         <w:lastRenderedPageBreak/>
         <w:t>5.3 Diagrama de Casos de Uso</w:t>
@@ -22996,7 +22959,7 @@
           <w:sz w:val="24"/>
           <w:szCs w:val="24"/>
         </w:rPr>
-        <w:t xml:space="preserve"> reúnem as operações de cadastro, consulta, edição e exclusão ou inativação do registro correspondente. Todos os casos de uso do Administrador exigem que ele esteja autenticado no sistema.</w:t>
+        <w:t xml:space="preserve"> reúnem as operações de cadastro, consulta, edição e, nos cadastros, inativação do registro correspondente. Todos os casos de uso do Administrador exigem que ele esteja autenticado no sistema.</w:t>
       </w:r>
     </w:p>
     <w:p>
@@ -23086,7 +23049,7 @@
         <w:pStyle w:val="Legenda"/>
         <w:keepNext/>
       </w:pPr>
-      <w:bookmarkStart w:id="66" w:name="_Toc244071658"/>
+      <w:bookmarkStart w:id="66" w:name="_Toc244091483"/>
       <w:r>
         <w:lastRenderedPageBreak/>
         <w:t xml:space="preserve">Figura </w:t>
@@ -23126,7 +23089,7 @@
         </w:rPr>
         <w:drawing>
           <wp:inline distT="0" distB="0" distL="0" distR="0" wp14:anchorId="6DDE38C5" wp14:editId="0134CFD6">
-            <wp:extent cx="5730167" cy="5203986"/>
+            <wp:extent cx="5730167" cy="5229958"/>
             <wp:effectExtent l="0" t="0" r="0" b="0"/>
             <wp:docPr id="204" name="Imagem 204"/>
             <wp:cNvGraphicFramePr>
@@ -23148,7 +23111,7 @@
                   <pic:spPr>
                     <a:xfrm>
                       <a:off x="0" y="0"/>
-                      <a:ext cx="5730167" cy="5203986"/>
+                      <a:ext cx="5730167" cy="5229958"/>
                     </a:xfrm>
                     <a:prstGeom prst="rect">
                       <a:avLst/>
@@ -23174,7 +23137,7 @@
           <w:sz w:val="20"/>
           <w:szCs w:val="20"/>
         </w:rPr>
-        <w:t>Fonte: Próprio autor, acessado em 14 de outubro de 2026.</w:t>
+        <w:t>Fonte: Próprio autor, acessado em 28 de outubro de 2026.</w:t>
       </w:r>
     </w:p>
     <w:p>
@@ -23205,7 +23168,7 @@
           <w:sz w:val="24"/>
         </w:rPr>
       </w:pPr>
-      <w:bookmarkStart w:id="67" w:name="_Toc244071637"/>
+      <w:bookmarkStart w:id="67" w:name="_Toc244091462"/>
       <w:r>
         <w:rPr>
           <w:sz w:val="24"/>
@@ -23238,7 +23201,7 @@
       <w:pPr>
         <w:pStyle w:val="Ttulo2"/>
       </w:pPr>
-      <w:bookmarkStart w:id="68" w:name="_Toc244071638"/>
+      <w:bookmarkStart w:id="68" w:name="_Toc244091463"/>
       <w:r>
         <w:t>6.1 Organização do Código</w:t>
       </w:r>
@@ -23303,7 +23266,7 @@
       <w:pPr>
         <w:pStyle w:val="Ttulo2"/>
       </w:pPr>
-      <w:bookmarkStart w:id="69" w:name="_Toc244071639"/>
+      <w:bookmarkStart w:id="69" w:name="_Toc244091464"/>
       <w:r>
         <w:t>6.2 Acesso ao Banco de Dados</w:t>
       </w:r>
@@ -23583,7 +23546,7 @@
       <w:pPr>
         <w:pStyle w:val="Ttulo2"/>
       </w:pPr>
-      <w:bookmarkStart w:id="70" w:name="_Toc244071640"/>
+      <w:bookmarkStart w:id="70" w:name="_Toc244091465"/>
       <w:r>
         <w:t>6.3 Acesso Administrativo</w:t>
       </w:r>
@@ -23630,7 +23593,7 @@
       <w:pPr>
         <w:pStyle w:val="Ttulo2"/>
       </w:pPr>
-      <w:bookmarkStart w:id="71" w:name="_Toc244071641"/>
+      <w:bookmarkStart w:id="71" w:name="_Toc244091466"/>
       <w:r>
         <w:lastRenderedPageBreak/>
         <w:t>6.4 Painel Administrativo e Cadastros</w:t>
@@ -23661,7 +23624,7 @@
         <w:pStyle w:val="Legenda"/>
         <w:keepNext/>
       </w:pPr>
-      <w:bookmarkStart w:id="72" w:name="_Toc244071659"/>
+      <w:bookmarkStart w:id="72" w:name="_Toc244091484"/>
       <w:r>
         <w:t xml:space="preserve">Figura </w:t>
       </w:r>
@@ -23800,7 +23763,7 @@
         <w:pStyle w:val="Legenda"/>
         <w:keepNext/>
       </w:pPr>
-      <w:bookmarkStart w:id="73" w:name="_Toc244071660"/>
+      <w:bookmarkStart w:id="73" w:name="_Toc244091485"/>
       <w:r>
         <w:t xml:space="preserve">Figura </w:t>
       </w:r>
@@ -23894,7 +23857,7 @@
       <w:pPr>
         <w:pStyle w:val="Ttulo2"/>
       </w:pPr>
-      <w:bookmarkStart w:id="74" w:name="_Toc244071642"/>
+      <w:bookmarkStart w:id="74" w:name="_Toc244091467"/>
       <w:r>
         <w:t>6.5 Roteiros, Planos e Ordens de Produção</w:t>
       </w:r>
@@ -23942,7 +23905,7 @@
         <w:pStyle w:val="Legenda"/>
         <w:keepNext/>
       </w:pPr>
-      <w:bookmarkStart w:id="75" w:name="_Toc244071661"/>
+      <w:bookmarkStart w:id="75" w:name="_Toc244091486"/>
       <w:r>
         <w:lastRenderedPageBreak/>
         <w:t xml:space="preserve">Figura </w:t>
@@ -24056,7 +24019,7 @@
         <w:pStyle w:val="Legenda"/>
         <w:keepNext/>
       </w:pPr>
-      <w:bookmarkStart w:id="76" w:name="_Toc244071662"/>
+      <w:bookmarkStart w:id="76" w:name="_Toc244091487"/>
       <w:r>
         <w:lastRenderedPageBreak/>
         <w:t xml:space="preserve">Figura </w:t>
@@ -24151,7 +24114,7 @@
       <w:pPr>
         <w:pStyle w:val="Ttulo2"/>
       </w:pPr>
-      <w:bookmarkStart w:id="77" w:name="_Toc244071643"/>
+      <w:bookmarkStart w:id="77" w:name="_Toc244091468"/>
       <w:r>
         <w:t>6.6 Ilha de Apontamento</w:t>
       </w:r>
@@ -24346,7 +24309,7 @@
         <w:pStyle w:val="Legenda"/>
         <w:keepNext/>
       </w:pPr>
-      <w:bookmarkStart w:id="78" w:name="_Toc244071663"/>
+      <w:bookmarkStart w:id="78" w:name="_Toc244091488"/>
       <w:r>
         <w:t xml:space="preserve">Figura </w:t>
       </w:r>
@@ -24440,7 +24403,7 @@
       <w:pPr>
         <w:pStyle w:val="Ttulo2"/>
       </w:pPr>
-      <w:bookmarkStart w:id="79" w:name="_Toc244071644"/>
+      <w:bookmarkStart w:id="79" w:name="_Toc244091469"/>
       <w:r>
         <w:lastRenderedPageBreak/>
         <w:t>6.7 Indicadores</w:t>
@@ -24718,7 +24681,7 @@
         <w:pStyle w:val="Legenda"/>
         <w:keepNext/>
       </w:pPr>
-      <w:bookmarkStart w:id="80" w:name="_Toc244071664"/>
+      <w:bookmarkStart w:id="80" w:name="_Toc244091489"/>
       <w:r>
         <w:t xml:space="preserve">Figura </w:t>
       </w:r>
@@ -24812,7 +24775,7 @@
       <w:pPr>
         <w:pStyle w:val="Ttulo2"/>
       </w:pPr>
-      <w:bookmarkStart w:id="81" w:name="_Toc244071645"/>
+      <w:bookmarkStart w:id="81" w:name="_Toc244091470"/>
       <w:r>
         <w:lastRenderedPageBreak/>
         <w:t>6.8 Testes e Publicação</w:t>
@@ -24896,7 +24859,7 @@
       <w:pPr>
         <w:pStyle w:val="Ttulo2"/>
       </w:pPr>
-      <w:bookmarkStart w:id="82" w:name="_Toc244071646"/>
+      <w:bookmarkStart w:id="82" w:name="_Toc244091471"/>
       <w:r>
         <w:t>6.9 Situação Atual da Implementação</w:t>
       </w:r>
@@ -25163,7 +25126,7 @@
         <w:spacing w:after="100" w:afterAutospacing="1"/>
         <w:jc w:val="center"/>
       </w:pPr>
-      <w:bookmarkStart w:id="83" w:name="_Toc244071647"/>
+      <w:bookmarkStart w:id="83" w:name="_Toc244091472"/>
       <w:r>
         <w:lastRenderedPageBreak/>
         <w:t>REFERÊNCIAS</w:t>

</xml_diff>